<commit_message>
Regenerate the round report and its .docx before packaging
</commit_message>
<xml_diff>
--- a/docs/report.docx
+++ b/docs/report.docx
@@ -2,13 +2,13 @@
 <file path=word/document.xml><?xml version="1.0" encoding="utf-8"?>
 <w:document xmlns:w="http://schemas.openxmlformats.org/wordprocessingml/2006/main" xmlns:m="http://schemas.openxmlformats.org/officeDocument/2006/math" xmlns:r="http://schemas.openxmlformats.org/officeDocument/2006/relationships" xmlns:o="urn:schemas-microsoft-com:office:office" xmlns:v="urn:schemas-microsoft-com:vml" xmlns:w10="urn:schemas-microsoft-com:office:word" xmlns:a="http://schemas.openxmlformats.org/drawingml/2006/main" xmlns:pic="http://schemas.openxmlformats.org/drawingml/2006/picture" xmlns:wp="http://schemas.openxmlformats.org/drawingml/2006/wordprocessingDrawing">
   <w:body>
-    <w:bookmarkStart w:id="16" w:name="internet-digital-ark-round-5"/>
+    <w:bookmarkStart w:id="18" w:name="internet-digital-ark-round-6"/>
     <w:p>
       <w:pPr>
         <w:pStyle w:val="Heading1"/>
       </w:pPr>
       <w:r>
-        <w:t xml:space="preserve">Internet Digital Ark: round 5</w:t>
+        <w:t xml:space="preserve">Internet Digital Ark: round 6</w:t>
       </w:r>
     </w:p>
     <w:bookmarkStart w:id="9" w:name="X3951f5b7db192c6c9ee78e24fa352f9e8523776"/>
@@ -71,7 +71,7 @@
               <w:jc w:val="right"/>
             </w:pPr>
             <w:r>
-              <w:t xml:space="preserve">15,428,507</w:t>
+              <w:t xml:space="preserve">22,491,418</w:t>
             </w:r>
           </w:p>
         </w:tc>
@@ -96,7 +96,7 @@
               <w:jc w:val="right"/>
             </w:pPr>
             <w:r>
-              <w:t xml:space="preserve">8,346,839.3737</w:t>
+              <w:t xml:space="preserve">12,077,095.5404</w:t>
             </w:r>
           </w:p>
         </w:tc>
@@ -125,7 +125,7 @@
                 <w:b/>
                 <w:bCs/>
               </w:rPr>
-              <w:t xml:space="preserve">2,838,715</w:t>
+              <w:t xml:space="preserve">17,733</w:t>
             </w:r>
             <w:r>
               <w:t xml:space="preserve"> </w:t>
@@ -160,7 +160,7 @@
                 <w:b/>
                 <w:bCs/>
               </w:rPr>
-              <w:t xml:space="preserve">1,697,224.8585</w:t>
+              <w:t xml:space="preserve">14,358.9235</w:t>
             </w:r>
           </w:p>
         </w:tc>
@@ -189,7 +189,7 @@
                 <w:b/>
                 <w:bCs/>
               </w:rPr>
-              <w:t xml:space="preserve">20.3337%</w:t>
+              <w:t xml:space="preserve">0.1189%</w:t>
             </w:r>
           </w:p>
         </w:tc>
@@ -209,7 +209,7 @@
         <w:rPr>
           <w:rStyle w:val="VerbatimChar"/>
         </w:rPr>
-        <w:t xml:space="preserve">merged260815</w:t>
+        <w:t xml:space="preserve">merged260817-2</w:t>
       </w:r>
       <w:r>
         <w:t xml:space="preserve"> </w:t>
@@ -221,7 +221,7 @@
         <w:t xml:space="preserve"> </w:t>
       </w:r>
       <w:r>
-        <w:t xml:space="preserve">increment covers 2,666,850 distinct domains, of which</w:t>
+        <w:t xml:space="preserve">increment covers 17,058 distinct domains, of which</w:t>
       </w:r>
       <w:r>
         <w:t xml:space="preserve"> </w:t>
@@ -231,7 +231,7 @@
           <w:b/>
           <w:bCs/>
         </w:rPr>
-        <w:t xml:space="preserve">1,790,892 appear in none of the six baseline</w:t>
+        <w:t xml:space="preserve">11,415 appear in none of the six baseline</w:t>
       </w:r>
       <w:r>
         <w:rPr>
@@ -286,7 +286,7 @@
               <w:jc w:val="right"/>
             </w:pPr>
             <w:r>
-              <w:t xml:space="preserve">merged260815, this counting unit</w:t>
+              <w:t xml:space="preserve">merged260817-2, this counting unit</w:t>
             </w:r>
           </w:p>
         </w:tc>
@@ -335,31 +335,31 @@
               <w:jc w:val="right"/>
             </w:pPr>
             <w:r>
-              <w:t xml:space="preserve">649,765</w:t>
-            </w:r>
-          </w:p>
-        </w:tc>
-        <w:tc>
-          <w:tcPr/>
-          <w:p>
-            <w:pPr>
-              <w:pStyle w:val="Compact"/>
-              <w:jc w:val="right"/>
-            </w:pPr>
-            <w:r>
-              <w:t xml:space="preserve">63,164</w:t>
-            </w:r>
-          </w:p>
-        </w:tc>
-        <w:tc>
-          <w:tcPr/>
-          <w:p>
-            <w:pPr>
-              <w:pStyle w:val="Compact"/>
-              <w:jc w:val="right"/>
-            </w:pPr>
-            <w:r>
-              <w:t xml:space="preserve">39 (0.1%)</w:t>
+              <w:t xml:space="preserve">754,665</w:t>
+            </w:r>
+          </w:p>
+        </w:tc>
+        <w:tc>
+          <w:tcPr/>
+          <w:p>
+            <w:pPr>
+              <w:pStyle w:val="Compact"/>
+              <w:jc w:val="right"/>
+            </w:pPr>
+            <w:r>
+              <w:t xml:space="preserve">25</w:t>
+            </w:r>
+          </w:p>
+        </w:tc>
+        <w:tc>
+          <w:tcPr/>
+          <w:p>
+            <w:pPr>
+              <w:pStyle w:val="Compact"/>
+              <w:jc w:val="right"/>
+            </w:pPr>
+            <w:r>
+              <w:t xml:space="preserve">3 (12.0%)</w:t>
             </w:r>
           </w:p>
         </w:tc>
@@ -384,31 +384,31 @@
               <w:jc w:val="right"/>
             </w:pPr>
             <w:r>
-              <w:t xml:space="preserve">1,358,646</w:t>
-            </w:r>
-          </w:p>
-        </w:tc>
-        <w:tc>
-          <w:tcPr/>
-          <w:p>
-            <w:pPr>
-              <w:pStyle w:val="Compact"/>
-              <w:jc w:val="right"/>
-            </w:pPr>
-            <w:r>
-              <w:t xml:space="preserve">230,192</w:t>
-            </w:r>
-          </w:p>
-        </w:tc>
-        <w:tc>
-          <w:tcPr/>
-          <w:p>
-            <w:pPr>
-              <w:pStyle w:val="Compact"/>
-              <w:jc w:val="right"/>
-            </w:pPr>
-            <w:r>
-              <w:t xml:space="preserve">289 (0.1%)</w:t>
+              <w:t xml:space="preserve">1,791,859</w:t>
+            </w:r>
+          </w:p>
+        </w:tc>
+        <w:tc>
+          <w:tcPr/>
+          <w:p>
+            <w:pPr>
+              <w:pStyle w:val="Compact"/>
+              <w:jc w:val="right"/>
+            </w:pPr>
+            <w:r>
+              <w:t xml:space="preserve">104</w:t>
+            </w:r>
+          </w:p>
+        </w:tc>
+        <w:tc>
+          <w:tcPr/>
+          <w:p>
+            <w:pPr>
+              <w:pStyle w:val="Compact"/>
+              <w:jc w:val="right"/>
+            </w:pPr>
+            <w:r>
+              <w:t xml:space="preserve">2 (1.9%)</w:t>
             </w:r>
           </w:p>
         </w:tc>
@@ -433,31 +433,31 @@
               <w:jc w:val="right"/>
             </w:pPr>
             <w:r>
-              <w:t xml:space="preserve">1,363,435</w:t>
-            </w:r>
-          </w:p>
-        </w:tc>
-        <w:tc>
-          <w:tcPr/>
-          <w:p>
-            <w:pPr>
-              <w:pStyle w:val="Compact"/>
-              <w:jc w:val="right"/>
-            </w:pPr>
-            <w:r>
-              <w:t xml:space="preserve">283,156</w:t>
-            </w:r>
-          </w:p>
-        </w:tc>
-        <w:tc>
-          <w:tcPr/>
-          <w:p>
-            <w:pPr>
-              <w:pStyle w:val="Compact"/>
-              <w:jc w:val="right"/>
-            </w:pPr>
-            <w:r>
-              <w:t xml:space="preserve">4,837 (1.7%)</w:t>
+              <w:t xml:space="preserve">2,233,102</w:t>
+            </w:r>
+          </w:p>
+        </w:tc>
+        <w:tc>
+          <w:tcPr/>
+          <w:p>
+            <w:pPr>
+              <w:pStyle w:val="Compact"/>
+              <w:jc w:val="right"/>
+            </w:pPr>
+            <w:r>
+              <w:t xml:space="preserve">455</w:t>
+            </w:r>
+          </w:p>
+        </w:tc>
+        <w:tc>
+          <w:tcPr/>
+          <w:p>
+            <w:pPr>
+              <w:pStyle w:val="Compact"/>
+              <w:jc w:val="right"/>
+            </w:pPr>
+            <w:r>
+              <w:t xml:space="preserve">93 (20.4%)</w:t>
             </w:r>
           </w:p>
         </w:tc>
@@ -482,31 +482,31 @@
               <w:jc w:val="right"/>
             </w:pPr>
             <w:r>
-              <w:t xml:space="preserve">2,745,535</w:t>
-            </w:r>
-          </w:p>
-        </w:tc>
-        <w:tc>
-          <w:tcPr/>
-          <w:p>
-            <w:pPr>
-              <w:pStyle w:val="Compact"/>
-              <w:jc w:val="right"/>
-            </w:pPr>
-            <w:r>
-              <w:t xml:space="preserve">513,761</w:t>
-            </w:r>
-          </w:p>
-        </w:tc>
-        <w:tc>
-          <w:tcPr/>
-          <w:p>
-            <w:pPr>
-              <w:pStyle w:val="Compact"/>
-              <w:jc w:val="right"/>
-            </w:pPr>
-            <w:r>
-              <w:t xml:space="preserve">16,602 (3.2%)</w:t>
+              <w:t xml:space="preserve">4,612,622</w:t>
+            </w:r>
+          </w:p>
+        </w:tc>
+        <w:tc>
+          <w:tcPr/>
+          <w:p>
+            <w:pPr>
+              <w:pStyle w:val="Compact"/>
+              <w:jc w:val="right"/>
+            </w:pPr>
+            <w:r>
+              <w:t xml:space="preserve">1,366</w:t>
+            </w:r>
+          </w:p>
+        </w:tc>
+        <w:tc>
+          <w:tcPr/>
+          <w:p>
+            <w:pPr>
+              <w:pStyle w:val="Compact"/>
+              <w:jc w:val="right"/>
+            </w:pPr>
+            <w:r>
+              <w:t xml:space="preserve">265 (19.4%)</w:t>
             </w:r>
           </w:p>
         </w:tc>
@@ -531,31 +531,31 @@
               <w:jc w:val="right"/>
             </w:pPr>
             <w:r>
-              <w:t xml:space="preserve">4,675,256</w:t>
-            </w:r>
-          </w:p>
-        </w:tc>
-        <w:tc>
-          <w:tcPr/>
-          <w:p>
-            <w:pPr>
-              <w:pStyle w:val="Compact"/>
-              <w:jc w:val="right"/>
-            </w:pPr>
-            <w:r>
-              <w:t xml:space="preserve">765,559</w:t>
-            </w:r>
-          </w:p>
-        </w:tc>
-        <w:tc>
-          <w:tcPr/>
-          <w:p>
-            <w:pPr>
-              <w:pStyle w:val="Compact"/>
-              <w:jc w:val="right"/>
-            </w:pPr>
-            <w:r>
-              <w:t xml:space="preserve">27,144 (3.5%)</w:t>
+              <w:t xml:space="preserve">7,479,208</w:t>
+            </w:r>
+          </w:p>
+        </w:tc>
+        <w:tc>
+          <w:tcPr/>
+          <w:p>
+            <w:pPr>
+              <w:pStyle w:val="Compact"/>
+              <w:jc w:val="right"/>
+            </w:pPr>
+            <w:r>
+              <w:t xml:space="preserve">1,528</w:t>
+            </w:r>
+          </w:p>
+        </w:tc>
+        <w:tc>
+          <w:tcPr/>
+          <w:p>
+            <w:pPr>
+              <w:pStyle w:val="Compact"/>
+              <w:jc w:val="right"/>
+            </w:pPr>
+            <w:r>
+              <w:t xml:space="preserve">653 (42.7%)</w:t>
             </w:r>
           </w:p>
         </w:tc>
@@ -580,31 +580,31 @@
               <w:jc w:val="right"/>
             </w:pPr>
             <w:r>
-              <w:t xml:space="preserve">2,991,302</w:t>
-            </w:r>
-          </w:p>
-        </w:tc>
-        <w:tc>
-          <w:tcPr/>
-          <w:p>
-            <w:pPr>
-              <w:pStyle w:val="Compact"/>
-              <w:jc w:val="right"/>
-            </w:pPr>
-            <w:r>
-              <w:t xml:space="preserve">982,883</w:t>
-            </w:r>
-          </w:p>
-        </w:tc>
-        <w:tc>
-          <w:tcPr/>
-          <w:p>
-            <w:pPr>
-              <w:pStyle w:val="Compact"/>
-              <w:jc w:val="right"/>
-            </w:pPr>
-            <w:r>
-              <w:t xml:space="preserve">225,540 (22.9%)</w:t>
+              <w:t xml:space="preserve">3,974,450</w:t>
+            </w:r>
+          </w:p>
+        </w:tc>
+        <w:tc>
+          <w:tcPr/>
+          <w:p>
+            <w:pPr>
+              <w:pStyle w:val="Compact"/>
+              <w:jc w:val="right"/>
+            </w:pPr>
+            <w:r>
+              <w:t xml:space="preserve">14,255</w:t>
+            </w:r>
+          </w:p>
+        </w:tc>
+        <w:tc>
+          <w:tcPr/>
+          <w:p>
+            <w:pPr>
+              <w:pStyle w:val="Compact"/>
+              <w:jc w:val="right"/>
+            </w:pPr>
+            <w:r>
+              <w:t xml:space="preserve">13,921 (97.7%)</w:t>
             </w:r>
           </w:p>
         </w:tc>
@@ -637,7 +637,7 @@
                 <w:b/>
                 <w:bCs/>
               </w:rPr>
-              <w:t xml:space="preserve">13,783,939</w:t>
+              <w:t xml:space="preserve">20,845,906</w:t>
             </w:r>
           </w:p>
         </w:tc>
@@ -653,7 +653,7 @@
                 <w:b/>
                 <w:bCs/>
               </w:rPr>
-              <w:t xml:space="preserve">2,838,715</w:t>
+              <w:t xml:space="preserve">17,733</w:t>
             </w:r>
           </w:p>
         </w:tc>
@@ -669,7 +669,7 @@
                 <w:b/>
                 <w:bCs/>
               </w:rPr>
-              <w:t xml:space="preserve">274,451 (9.7%)</w:t>
+              <w:t xml:space="preserve">14,937 (84.2%)</w:t>
             </w:r>
           </w:p>
         </w:tc>
@@ -704,7 +704,7 @@
         <w:t xml:space="preserve"> </w:t>
       </w:r>
       <w:r>
-        <w:t xml:space="preserve">Across the four rounds shipped so far this project has added 5,366,454 domain-year records worth 3,149,000.6140 equivalent-English, which is</w:t>
+        <w:t xml:space="preserve">Across the 4 rounds shipped so far plus this one, this project has added 5,153,794 domain-year records worth 3,032,364.4403 equivalent-English, which is</w:t>
       </w:r>
       <w:r>
         <w:t xml:space="preserve"> </w:t>
@@ -714,13 +714,13 @@
           <w:b/>
           <w:bCs/>
         </w:rPr>
-        <w:t xml:space="preserve">37.7269%</w:t>
-      </w:r>
-      <w:r>
-        <w:t xml:space="preserve"> </w:t>
-      </w:r>
-      <w:r>
-        <w:t xml:space="preserve">of the 8,346,839.3737 the corpus holds today. Round 1 predates the equivalent-English metric, so its records are the reviewer's own confirmed count and the weight beside it is measured over the two releases either side under the unchanged model.</w:t>
+        <w:t xml:space="preserve">25.1084%</w:t>
+      </w:r>
+      <w:r>
+        <w:t xml:space="preserve"> </w:t>
+      </w:r>
+      <w:r>
+        <w:t xml:space="preserve">of the 12,077,095.5404 the corpus holds today. Each shipped round is quoted at the figure the reviewer ACCEPTED, which is not always the one it was submitted with: he recalculates against whatever baseline is current when he merges, and records of ours that reached it by another route in the meantime are his, not ours, to count. Round 1 predates the equivalent-English metric, so its records are the reviewer's own confirmed count and the weight beside it is measured over the two releases either side under the unchanged model.</w:t>
       </w:r>
     </w:p>
     <w:tbl>
@@ -893,11 +893,48 @@
               <w:pStyle w:val="Compact"/>
             </w:pPr>
             <w:r>
+              <w:t xml:space="preserve">5</w:t>
+            </w:r>
+          </w:p>
+        </w:tc>
+        <w:tc>
+          <w:tcPr/>
+          <w:p>
+            <w:pPr>
+              <w:pStyle w:val="Compact"/>
+              <w:jc w:val="right"/>
+            </w:pPr>
+            <w:r>
+              <w:t xml:space="preserve">2,608,322</w:t>
+            </w:r>
+          </w:p>
+        </w:tc>
+        <w:tc>
+          <w:tcPr/>
+          <w:p>
+            <w:pPr>
+              <w:pStyle w:val="Compact"/>
+              <w:jc w:val="right"/>
+            </w:pPr>
+            <w:r>
+              <w:t xml:space="preserve">1,566,229.7613</w:t>
+            </w:r>
+          </w:p>
+        </w:tc>
+      </w:tr>
+      <w:tr>
+        <w:tc>
+          <w:tcPr/>
+          <w:p>
+            <w:pPr>
+              <w:pStyle w:val="Compact"/>
+            </w:pPr>
+            <w:r>
               <w:rPr>
                 <w:b/>
                 <w:bCs/>
               </w:rPr>
-              <w:t xml:space="preserve">5, this one</w:t>
+              <w:t xml:space="preserve">6, this one</w:t>
             </w:r>
           </w:p>
         </w:tc>
@@ -913,7 +950,7 @@
                 <w:b/>
                 <w:bCs/>
               </w:rPr>
-              <w:t xml:space="preserve">2,838,715</w:t>
+              <w:t xml:space="preserve">17,733</w:t>
             </w:r>
           </w:p>
         </w:tc>
@@ -929,7 +966,7 @@
                 <w:b/>
                 <w:bCs/>
               </w:rPr>
-              <w:t xml:space="preserve">1,697,224.8585</w:t>
+              <w:t xml:space="preserve">14,358.9235</w:t>
             </w:r>
           </w:p>
         </w:tc>
@@ -962,7 +999,7 @@
                 <w:b/>
                 <w:bCs/>
               </w:rPr>
-              <w:t xml:space="preserve">5,366,454</w:t>
+              <w:t xml:space="preserve">5,153,794</w:t>
             </w:r>
           </w:p>
         </w:tc>
@@ -978,7 +1015,7 @@
                 <w:b/>
                 <w:bCs/>
               </w:rPr>
-              <w:t xml:space="preserve">3,149,000.6140</w:t>
+              <w:t xml:space="preserve">3,032,364.4403</w:t>
             </w:r>
           </w:p>
         </w:tc>
@@ -1059,30 +1096,30 @@
               <w:pStyle w:val="Compact"/>
             </w:pPr>
             <w:r>
-              <w:t xml:space="preserve">the Internet Archive's own capture census, a 2017 Dartmouth/NBER release</w:t>
-            </w:r>
-          </w:p>
-        </w:tc>
-        <w:tc>
-          <w:tcPr/>
-          <w:p>
-            <w:pPr>
-              <w:pStyle w:val="Compact"/>
-            </w:pPr>
-            <w:r>
-              <w:t xml:space="preserve">the archive's count of captures it holds for that host in that calendar year</w:t>
-            </w:r>
-          </w:p>
-        </w:tc>
-        <w:tc>
-          <w:tcPr/>
-          <w:p>
-            <w:pPr>
-              <w:pStyle w:val="Compact"/>
-              <w:jc w:val="right"/>
-            </w:pPr>
-            <w:r>
-              <w:t xml:space="preserve">227,273</w:t>
+              <w:t xml:space="preserve">the two archive engines, a bracketed-gap population and the candidate pool</w:t>
+            </w:r>
+          </w:p>
+        </w:tc>
+        <w:tc>
+          <w:tcPr/>
+          <w:p>
+            <w:pPr>
+              <w:pStyle w:val="Compact"/>
+            </w:pPr>
+            <w:r>
+              <w:t xml:space="preserve">the Wayback capture timestamp, per domain and year</w:t>
+            </w:r>
+          </w:p>
+        </w:tc>
+        <w:tc>
+          <w:tcPr/>
+          <w:p>
+            <w:pPr>
+              <w:pStyle w:val="Compact"/>
+              <w:jc w:val="right"/>
+            </w:pPr>
+            <w:r>
+              <w:t xml:space="preserve">14,937</w:t>
             </w:r>
           </w:p>
         </w:tc>
@@ -1095,7 +1132,7 @@
               <w:pStyle w:val="Compact"/>
             </w:pPr>
             <w:r>
-              <w:t xml:space="preserve">a published compilation of registry creation dates over 171M domains</w:t>
+              <w:t xml:space="preserve">the RDAP sweep over the candidate pool</w:t>
             </w:r>
           </w:p>
         </w:tc>
@@ -1118,79 +1155,7 @@
               <w:jc w:val="right"/>
             </w:pPr>
             <w:r>
-              <w:t xml:space="preserve">2,165,506</w:t>
-            </w:r>
-          </w:p>
-        </w:tc>
-      </w:tr>
-      <w:tr>
-        <w:tc>
-          <w:tcPr/>
-          <w:p>
-            <w:pPr>
-              <w:pStyle w:val="Compact"/>
-            </w:pPr>
-            <w:r>
-              <w:t xml:space="preserve">the UK Web Archive host link graph, already held since July</w:t>
-            </w:r>
-          </w:p>
-        </w:tc>
-        <w:tc>
-          <w:tcPr/>
-          <w:p>
-            <w:pPr>
-              <w:pStyle w:val="Compact"/>
-            </w:pPr>
-            <w:r>
-              <w:t xml:space="preserve">the crawl date on the link record</w:t>
-            </w:r>
-          </w:p>
-        </w:tc>
-        <w:tc>
-          <w:tcPr/>
-          <w:p>
-            <w:pPr>
-              <w:pStyle w:val="Compact"/>
-              <w:jc w:val="right"/>
-            </w:pPr>
-            <w:r>
-              <w:t xml:space="preserve">92,646</w:t>
-            </w:r>
-          </w:p>
-        </w:tc>
-      </w:tr>
-      <w:tr>
-        <w:tc>
-          <w:tcPr/>
-          <w:p>
-            <w:pPr>
-              <w:pStyle w:val="Compact"/>
-            </w:pPr>
-            <w:r>
-              <w:t xml:space="preserve">the January 1997 Internet Domain Survey, recovered from a dead host</w:t>
-            </w:r>
-          </w:p>
-        </w:tc>
-        <w:tc>
-          <w:tcPr/>
-          <w:p>
-            <w:pPr>
-              <w:pStyle w:val="Compact"/>
-            </w:pPr>
-            <w:r>
-              <w:t xml:space="preserve">the survey edition date</w:t>
-            </w:r>
-          </w:p>
-        </w:tc>
-        <w:tc>
-          <w:tcPr/>
-          <w:p>
-            <w:pPr>
-              <w:pStyle w:val="Compact"/>
-              <w:jc w:val="right"/>
-            </w:pPr>
-            <w:r>
-              <w:t xml:space="preserve">115,104</w:t>
+              <w:t xml:space="preserve">2,796</w:t>
             </w:r>
           </w:p>
         </w:tc>
@@ -1225,66 +1190,43 @@
           <w:b/>
           <w:bCs/>
         </w:rPr>
-        <w:t xml:space="preserve">Both new sources were verified before admission.</w:t>
-      </w:r>
-      <w:r>
-        <w:t xml:space="preserve"> </w:t>
-      </w:r>
-      <w:r>
-        <w:t xml:space="preserve">The capture census agrees with our own independent</w:t>
-      </w:r>
-      <w:r>
-        <w:t xml:space="preserve"> </w:t>
-      </w:r>
-      <w:r>
-        <w:t xml:space="preserve">CDX querying of the live archive on</w:t>
-      </w:r>
-      <w:r>
-        <w:t xml:space="preserve"> </w:t>
-      </w:r>
-      <w:r>
-        <w:rPr>
-          <w:b/>
-          <w:bCs/>
-        </w:rPr>
-        <w:t xml:space="preserve">138,760 (domain, year) pairs</w:t>
-      </w:r>
-      <w:r>
-        <w:t xml:space="preserve">, including exact</w:t>
-      </w:r>
-      <w:r>
-        <w:t xml:space="preserve"> </w:t>
-      </w:r>
-      <w:r>
-        <w:t xml:space="preserve">same-day agreement on single-capture years. The registry dates were tested against a constraint nobody</w:t>
-      </w:r>
-      <w:r>
-        <w:t xml:space="preserve"> </w:t>
-      </w:r>
-      <w:r>
-        <w:t xml:space="preserve">encoded: a TLD cannot predate its own delegation, and across the six delegated in 2001 the file holds</w:t>
-      </w:r>
-      <w:r>
-        <w:t xml:space="preserve"> </w:t>
-      </w:r>
-      <w:r>
-        <w:t xml:space="preserve">21,698 in-window rows and</w:t>
-      </w:r>
-      <w:r>
-        <w:t xml:space="preserve"> </w:t>
-      </w:r>
-      <w:r>
-        <w:rPr>
-          <w:b/>
-          <w:bCs/>
-        </w:rPr>
-        <w:t xml:space="preserve">zero</w:t>
-      </w:r>
-      <w:r>
-        <w:t xml:space="preserve"> </w:t>
-      </w:r>
-      <w:r>
-        <w:t xml:space="preserve">dated before 2001.</w:t>
+        <w:t xml:space="preserve">Both routes are self-dating and neither takes the corroboration split.</w:t>
+      </w:r>
+      <w:r>
+        <w:t xml:space="preserve"> </w:t>
+      </w:r>
+      <w:r>
+        <w:t xml:space="preserve">A Wayback capture</w:t>
+      </w:r>
+      <w:r>
+        <w:t xml:space="preserve"> </w:t>
+      </w:r>
+      <w:r>
+        <w:t xml:space="preserve">timestamp and a registry creation date are records of the thing itself rather than somebody's</w:t>
+      </w:r>
+      <w:r>
+        <w:t xml:space="preserve"> </w:t>
+      </w:r>
+      <w:r>
+        <w:t xml:space="preserve">description of it. The registry route is deliberately under-claimed: a creation date attests</w:t>
+      </w:r>
+      <w:r>
+        <w:t xml:space="preserve"> </w:t>
+      </w:r>
+      <w:r>
+        <w:t xml:space="preserve">registration for one year and nothing after it, so a domain created in 1997 and live until 2001 earns</w:t>
+      </w:r>
+      <w:r>
+        <w:t xml:space="preserve"> </w:t>
+      </w:r>
+      <w:r>
+        <w:t xml:space="preserve">1997 here and must earn the other four from a capture or a survey. The parser emits one evidence row</w:t>
+      </w:r>
+      <w:r>
+        <w:t xml:space="preserve"> </w:t>
+      </w:r>
+      <w:r>
+        <w:t xml:space="preserve">for one year, so a second cannot be written.</w:t>
       </w:r>
     </w:p>
     <w:p>
@@ -1292,91 +1234,35 @@
         <w:pStyle w:val="BodyText"/>
       </w:pPr>
       <w:r>
-        <w:t xml:space="preserve">One caveat on checking the census yourself:</w:t>
-      </w:r>
-      <w:r>
-        <w:t xml:space="preserve"> </w:t>
-      </w:r>
-      <w:r>
         <w:rPr>
           <w:b/>
           <w:bCs/>
         </w:rPr>
-        <w:t xml:space="preserve">the archive.org item it came from stopped serving the day</w:t>
-      </w:r>
-      <w:r>
-        <w:rPr>
-          <w:b/>
-          <w:bCs/>
-        </w:rPr>
-        <w:t xml:space="preserve"> </w:t>
-      </w:r>
-      <w:r>
-        <w:rPr>
-          <w:b/>
-          <w:bCs/>
-        </w:rPr>
-        <w:t xml:space="preserve">after we downloaded it</w:t>
-      </w:r>
-      <w:r>
-        <w:t xml:space="preserve">, so use the live Wayback URL each record carries instead;</w:t>
-      </w:r>
-      <w:r>
-        <w:t xml:space="preserve"> </w:t>
-      </w:r>
-      <w:r>
-        <w:rPr>
-          <w:rStyle w:val="VerbatimChar"/>
-        </w:rPr>
-        <w:t xml:space="preserve">sources.md</w:t>
-      </w:r>
-      <w:r>
-        <w:t xml:space="preserve"> </w:t>
-      </w:r>
-      <w:r>
-        <w:t xml:space="preserve">has the</w:t>
-      </w:r>
-      <w:r>
-        <w:t xml:space="preserve"> </w:t>
-      </w:r>
-      <w:r>
-        <w:t xml:space="preserve">detail.</w:t>
-      </w:r>
-    </w:p>
-    <w:p>
-      <w:pPr>
-        <w:pStyle w:val="BodyText"/>
-      </w:pPr>
-      <w:r>
-        <w:rPr>
-          <w:b/>
-          <w:bCs/>
-        </w:rPr>
-        <w:t xml:space="preserve">The largest contributor carries the narrowest evidence, and is under-claimed deliberately.</w:t>
-      </w:r>
-      <w:r>
-        <w:t xml:space="preserve"> </w:t>
-      </w:r>
-      <w:r>
-        <w:t xml:space="preserve">A</w:t>
-      </w:r>
-      <w:r>
-        <w:t xml:space="preserve"> </w:t>
-      </w:r>
-      <w:r>
-        <w:t xml:space="preserve">creation date attests registration, not activity, and only for one year. A domain registered in 1997</w:t>
-      </w:r>
-      <w:r>
-        <w:t xml:space="preserve"> </w:t>
-      </w:r>
-      <w:r>
-        <w:t xml:space="preserve">and live until 2001 gets 1997 from this route alone; the other four years must be earned from a capture</w:t>
-      </w:r>
-      <w:r>
-        <w:t xml:space="preserve"> </w:t>
-      </w:r>
-      <w:r>
-        <w:t xml:space="preserve">or a survey. The parser emits one evidence row for one year, so a second cannot be written.</w:t>
+        <w:t xml:space="preserve">The engines are request-rate bound at a single archive, and that is the whole constraint.</w:t>
+      </w:r>
+      <w:r>
+        <w:t xml:space="preserve"> </w:t>
+      </w:r>
+      <w:r>
+        <w:t xml:space="preserve">Two</w:t>
+      </w:r>
+      <w:r>
+        <w:t xml:space="preserve"> </w:t>
+      </w:r>
+      <w:r>
+        <w:t xml:space="preserve">disjoint populations run on two machines: bracketed gaps as an unattended completeness baseline, and</w:t>
+      </w:r>
+      <w:r>
+        <w:t xml:space="preserve"> </w:t>
+      </w:r>
+      <w:r>
+        <w:t xml:space="preserve">the candidate pool beside the discovery loop that feeds it. 2.28 million pool targets sit unqueried,</w:t>
+      </w:r>
+      <w:r>
+        <w:t xml:space="preserve"> </w:t>
+      </w:r>
+      <w:r>
+        <w:t xml:space="preserve">so the queue has never been the limit.</w:t>
       </w:r>
     </w:p>
     <w:p>
@@ -1494,18 +1380,109 @@
               <w:rPr>
                 <w:rStyle w:val="VerbatimChar"/>
               </w:rPr>
-              <w:t xml:space="preserve">domain_creation_bulk</w:t>
-            </w:r>
-          </w:p>
-        </w:tc>
-        <w:tc>
-          <w:tcPr/>
-          <w:p>
-            <w:pPr>
-              <w:pStyle w:val="Compact"/>
-            </w:pPr>
-            <w:r>
-              <w:t xml:space="preserve">the registry's own creation date for that domain</w:t>
+              <w:t xml:space="preserve">ia_cdx_bulk</w:t>
+            </w:r>
+          </w:p>
+        </w:tc>
+        <w:tc>
+          <w:tcPr/>
+          <w:p>
+            <w:pPr>
+              <w:pStyle w:val="Compact"/>
+            </w:pPr>
+            <w:r>
+              <w:t xml:space="preserve">Wayback capture timestamp</w:t>
+            </w:r>
+          </w:p>
+        </w:tc>
+        <w:tc>
+          <w:tcPr/>
+          <w:p>
+            <w:pPr>
+              <w:pStyle w:val="Compact"/>
+            </w:pPr>
+            <w:r>
+              <w:rPr>
+                <w:rStyle w:val="VerbatimChar"/>
+              </w:rPr>
+              <w:t xml:space="preserve">cdx_timestamp</w:t>
+            </w:r>
+          </w:p>
+        </w:tc>
+        <w:tc>
+          <w:tcPr/>
+          <w:p>
+            <w:pPr>
+              <w:pStyle w:val="Compact"/>
+            </w:pPr>
+            <w:r>
+              <w:t xml:space="preserve">master</w:t>
+            </w:r>
+          </w:p>
+        </w:tc>
+        <w:tc>
+          <w:tcPr/>
+          <w:p>
+            <w:pPr>
+              <w:pStyle w:val="Compact"/>
+              <w:jc w:val="right"/>
+            </w:pPr>
+            <w:r>
+              <w:t xml:space="preserve">14,937</w:t>
+            </w:r>
+          </w:p>
+        </w:tc>
+        <w:tc>
+          <w:tcPr/>
+          <w:p>
+            <w:pPr>
+              <w:pStyle w:val="Compact"/>
+              <w:jc w:val="right"/>
+            </w:pPr>
+            <w:r>
+              <w:t xml:space="preserve">11,684.7</w:t>
+            </w:r>
+          </w:p>
+        </w:tc>
+      </w:tr>
+      <w:tr>
+        <w:tc>
+          <w:tcPr/>
+          <w:p>
+            <w:pPr>
+              <w:pStyle w:val="Compact"/>
+            </w:pPr>
+            <w:r>
+              <w:rPr>
+                <w:rStyle w:val="VerbatimChar"/>
+              </w:rPr>
+              <w:t xml:space="preserve">rdap_snapshot</w:t>
+            </w:r>
+          </w:p>
+        </w:tc>
+        <w:tc>
+          <w:tcPr/>
+          <w:p>
+            <w:pPr>
+              <w:pStyle w:val="Compact"/>
+            </w:pPr>
+            <w:r>
+              <w:t xml:space="preserve">the registry's own</w:t>
+            </w:r>
+            <w:r>
+              <w:t xml:space="preserve"> </w:t>
+            </w:r>
+            <w:r>
+              <w:rPr>
+                <w:rStyle w:val="VerbatimChar"/>
+              </w:rPr>
+              <w:t xml:space="preserve">registration</w:t>
+            </w:r>
+            <w:r>
+              <w:t xml:space="preserve"> </w:t>
+            </w:r>
+            <w:r>
+              <w:t xml:space="preserve">event date</w:t>
             </w:r>
           </w:p>
         </w:tc>
@@ -1542,1204 +1519,19 @@
               <w:jc w:val="right"/>
             </w:pPr>
             <w:r>
-              <w:t xml:space="preserve">2,165,506</w:t>
-            </w:r>
-          </w:p>
-        </w:tc>
-        <w:tc>
-          <w:tcPr/>
-          <w:p>
-            <w:pPr>
-              <w:pStyle w:val="Compact"/>
-              <w:jc w:val="right"/>
-            </w:pPr>
-            <w:r>
-              <w:t xml:space="preserve">1,241,811.6</w:t>
-            </w:r>
-          </w:p>
-        </w:tc>
-      </w:tr>
-      <w:tr>
-        <w:tc>
-          <w:tcPr/>
-          <w:p>
-            <w:pPr>
-              <w:pStyle w:val="Compact"/>
-            </w:pPr>
-            <w:r>
-              <w:rPr>
-                <w:rStyle w:val="VerbatimChar"/>
-              </w:rPr>
-              <w:t xml:space="preserve">dartmouth_nber_captures</w:t>
-            </w:r>
-          </w:p>
-        </w:tc>
-        <w:tc>
-          <w:tcPr/>
-          <w:p>
-            <w:pPr>
-              <w:pStyle w:val="Compact"/>
-            </w:pPr>
-            <w:r>
-              <w:t xml:space="preserve">the archive's own count of captures it holds in that year</w:t>
-            </w:r>
-          </w:p>
-        </w:tc>
-        <w:tc>
-          <w:tcPr/>
-          <w:p>
-            <w:pPr>
-              <w:pStyle w:val="Compact"/>
-            </w:pPr>
-            <w:r>
-              <w:rPr>
-                <w:rStyle w:val="VerbatimChar"/>
-              </w:rPr>
-              <w:t xml:space="preserve">cdx_timestamp</w:t>
-            </w:r>
-          </w:p>
-        </w:tc>
-        <w:tc>
-          <w:tcPr/>
-          <w:p>
-            <w:pPr>
-              <w:pStyle w:val="Compact"/>
-            </w:pPr>
-            <w:r>
-              <w:t xml:space="preserve">master</w:t>
-            </w:r>
-          </w:p>
-        </w:tc>
-        <w:tc>
-          <w:tcPr/>
-          <w:p>
-            <w:pPr>
-              <w:pStyle w:val="Compact"/>
-              <w:jc w:val="right"/>
-            </w:pPr>
-            <w:r>
-              <w:t xml:space="preserve">227,273</w:t>
-            </w:r>
-          </w:p>
-        </w:tc>
-        <w:tc>
-          <w:tcPr/>
-          <w:p>
-            <w:pPr>
-              <w:pStyle w:val="Compact"/>
-              <w:jc w:val="right"/>
-            </w:pPr>
-            <w:r>
-              <w:t xml:space="preserve">142,084.0</w:t>
-            </w:r>
-          </w:p>
-        </w:tc>
-      </w:tr>
-      <w:tr>
-        <w:tc>
-          <w:tcPr/>
-          <w:p>
-            <w:pPr>
-              <w:pStyle w:val="Compact"/>
-            </w:pPr>
-            <w:r>
-              <w:rPr>
-                <w:rStyle w:val="VerbatimChar"/>
-              </w:rPr>
-              <w:t xml:space="preserve">ukwa_link_source</w:t>
-            </w:r>
-          </w:p>
-        </w:tc>
-        <w:tc>
-          <w:tcPr/>
-          <w:p>
-            <w:pPr>
-              <w:pStyle w:val="Compact"/>
-            </w:pPr>
-            <w:r>
-              <w:t xml:space="preserve">UK Web Archive crawl date</w:t>
-            </w:r>
-          </w:p>
-        </w:tc>
-        <w:tc>
-          <w:tcPr/>
-          <w:p>
-            <w:pPr>
-              <w:pStyle w:val="Compact"/>
-            </w:pPr>
-            <w:r>
-              <w:rPr>
-                <w:rStyle w:val="VerbatimChar"/>
-              </w:rPr>
-              <w:t xml:space="preserve">link_source</w:t>
-            </w:r>
-          </w:p>
-        </w:tc>
-        <w:tc>
-          <w:tcPr/>
-          <w:p>
-            <w:pPr>
-              <w:pStyle w:val="Compact"/>
-            </w:pPr>
-            <w:r>
-              <w:t xml:space="preserve">master</w:t>
-            </w:r>
-          </w:p>
-        </w:tc>
-        <w:tc>
-          <w:tcPr/>
-          <w:p>
-            <w:pPr>
-              <w:pStyle w:val="Compact"/>
-              <w:jc w:val="right"/>
-            </w:pPr>
-            <w:r>
-              <w:t xml:space="preserve">92,646</w:t>
-            </w:r>
-          </w:p>
-        </w:tc>
-        <w:tc>
-          <w:tcPr/>
-          <w:p>
-            <w:pPr>
-              <w:pStyle w:val="Compact"/>
-              <w:jc w:val="right"/>
-            </w:pPr>
-            <w:r>
-              <w:t xml:space="preserve">90,825.1</w:t>
-            </w:r>
-          </w:p>
-        </w:tc>
-      </w:tr>
-      <w:tr>
-        <w:tc>
-          <w:tcPr/>
-          <w:p>
-            <w:pPr>
-              <w:pStyle w:val="Compact"/>
-            </w:pPr>
-            <w:r>
-              <w:rPr>
-                <w:rStyle w:val="VerbatimChar"/>
-              </w:rPr>
-              <w:t xml:space="preserve">isc_survey</w:t>
-            </w:r>
-          </w:p>
-        </w:tc>
-        <w:tc>
-          <w:tcPr/>
-          <w:p>
-            <w:pPr>
-              <w:pStyle w:val="Compact"/>
-            </w:pPr>
-            <w:r>
-              <w:t xml:space="preserve">survey run date</w:t>
-            </w:r>
-          </w:p>
-        </w:tc>
-        <w:tc>
-          <w:tcPr/>
-          <w:p>
-            <w:pPr>
-              <w:pStyle w:val="Compact"/>
-            </w:pPr>
-            <w:r>
-              <w:rPr>
-                <w:rStyle w:val="VerbatimChar"/>
-              </w:rPr>
-              <w:t xml:space="preserve">artifact_listing</w:t>
-            </w:r>
-          </w:p>
-        </w:tc>
-        <w:tc>
-          <w:tcPr/>
-          <w:p>
-            <w:pPr>
-              <w:pStyle w:val="Compact"/>
-            </w:pPr>
-            <w:r>
-              <w:t xml:space="preserve">master</w:t>
-            </w:r>
-          </w:p>
-        </w:tc>
-        <w:tc>
-          <w:tcPr/>
-          <w:p>
-            <w:pPr>
-              <w:pStyle w:val="Compact"/>
-              <w:jc w:val="right"/>
-            </w:pPr>
-            <w:r>
-              <w:t xml:space="preserve">115,104</w:t>
-            </w:r>
-          </w:p>
-        </w:tc>
-        <w:tc>
-          <w:tcPr/>
-          <w:p>
-            <w:pPr>
-              <w:pStyle w:val="Compact"/>
-              <w:jc w:val="right"/>
-            </w:pPr>
-            <w:r>
-              <w:t xml:space="preserve">61,759.1</w:t>
-            </w:r>
-          </w:p>
-        </w:tc>
-      </w:tr>
-      <w:tr>
-        <w:tc>
-          <w:tcPr/>
-          <w:p>
-            <w:pPr>
-              <w:pStyle w:val="Compact"/>
-            </w:pPr>
-            <w:r>
-              <w:rPr>
-                <w:rStyle w:val="VerbatimChar"/>
-              </w:rPr>
-              <w:t xml:space="preserve">rdap_snapshot</w:t>
-            </w:r>
-          </w:p>
-        </w:tc>
-        <w:tc>
-          <w:tcPr/>
-          <w:p>
-            <w:pPr>
-              <w:pStyle w:val="Compact"/>
-            </w:pPr>
-            <w:r>
-              <w:t xml:space="preserve">the registry's own</w:t>
-            </w:r>
-            <w:r>
-              <w:t xml:space="preserve"> </w:t>
-            </w:r>
-            <w:r>
-              <w:rPr>
-                <w:rStyle w:val="VerbatimChar"/>
-              </w:rPr>
-              <w:t xml:space="preserve">registration</w:t>
-            </w:r>
-            <w:r>
-              <w:t xml:space="preserve"> </w:t>
-            </w:r>
-            <w:r>
-              <w:t xml:space="preserve">event date</w:t>
-            </w:r>
-          </w:p>
-        </w:tc>
-        <w:tc>
-          <w:tcPr/>
-          <w:p>
-            <w:pPr>
-              <w:pStyle w:val="Compact"/>
-            </w:pPr>
-            <w:r>
-              <w:rPr>
-                <w:rStyle w:val="VerbatimChar"/>
-              </w:rPr>
-              <w:t xml:space="preserve">whois_creation</w:t>
-            </w:r>
-          </w:p>
-        </w:tc>
-        <w:tc>
-          <w:tcPr/>
-          <w:p>
-            <w:pPr>
-              <w:pStyle w:val="Compact"/>
-            </w:pPr>
-            <w:r>
-              <w:t xml:space="preserve">master</w:t>
-            </w:r>
-          </w:p>
-        </w:tc>
-        <w:tc>
-          <w:tcPr/>
-          <w:p>
-            <w:pPr>
-              <w:pStyle w:val="Compact"/>
-              <w:jc w:val="right"/>
-            </w:pPr>
-            <w:r>
-              <w:t xml:space="preserve">88,643</w:t>
-            </w:r>
-          </w:p>
-        </w:tc>
-        <w:tc>
-          <w:tcPr/>
-          <w:p>
-            <w:pPr>
-              <w:pStyle w:val="Compact"/>
-              <w:jc w:val="right"/>
-            </w:pPr>
-            <w:r>
-              <w:t xml:space="preserve">54,714.0</w:t>
-            </w:r>
-          </w:p>
-        </w:tc>
-      </w:tr>
-      <w:tr>
-        <w:tc>
-          <w:tcPr/>
-          <w:p>
-            <w:pPr>
-              <w:pStyle w:val="Compact"/>
-            </w:pPr>
-            <w:r>
-              <w:rPr>
-                <w:rStyle w:val="VerbatimChar"/>
-              </w:rPr>
-              <w:t xml:space="preserve">usenet_announce</w:t>
-            </w:r>
-          </w:p>
-        </w:tc>
-        <w:tc>
-          <w:tcPr/>
-          <w:p>
-            <w:pPr>
-              <w:pStyle w:val="Compact"/>
-            </w:pPr>
-            <w:r>
-              <w:t xml:space="preserve">post date of the announcement</w:t>
-            </w:r>
-          </w:p>
-        </w:tc>
-        <w:tc>
-          <w:tcPr/>
-          <w:p>
-            <w:pPr>
-              <w:pStyle w:val="Compact"/>
-            </w:pPr>
-            <w:r>
-              <w:rPr>
-                <w:rStyle w:val="VerbatimChar"/>
-              </w:rPr>
-              <w:t xml:space="preserve">dated_directory</w:t>
-            </w:r>
-          </w:p>
-        </w:tc>
-        <w:tc>
-          <w:tcPr/>
-          <w:p>
-            <w:pPr>
-              <w:pStyle w:val="Compact"/>
-            </w:pPr>
-            <w:r>
-              <w:t xml:space="preserve">master</w:t>
-            </w:r>
-          </w:p>
-        </w:tc>
-        <w:tc>
-          <w:tcPr/>
-          <w:p>
-            <w:pPr>
-              <w:pStyle w:val="Compact"/>
-              <w:jc w:val="right"/>
-            </w:pPr>
-            <w:r>
-              <w:t xml:space="preserve">69,949</w:t>
-            </w:r>
-          </w:p>
-        </w:tc>
-        <w:tc>
-          <w:tcPr/>
-          <w:p>
-            <w:pPr>
-              <w:pStyle w:val="Compact"/>
-              <w:jc w:val="right"/>
-            </w:pPr>
-            <w:r>
-              <w:t xml:space="preserve">46,402.0</w:t>
-            </w:r>
-          </w:p>
-        </w:tc>
-      </w:tr>
-      <w:tr>
-        <w:tc>
-          <w:tcPr/>
-          <w:p>
-            <w:pPr>
-              <w:pStyle w:val="Compact"/>
-            </w:pPr>
-            <w:r>
-              <w:rPr>
-                <w:rStyle w:val="VerbatimChar"/>
-              </w:rPr>
-              <w:t xml:space="preserve">ia_cdx_bulk</w:t>
-            </w:r>
-          </w:p>
-        </w:tc>
-        <w:tc>
-          <w:tcPr/>
-          <w:p>
-            <w:pPr>
-              <w:pStyle w:val="Compact"/>
-            </w:pPr>
-            <w:r>
-              <w:t xml:space="preserve">Wayback capture timestamp</w:t>
-            </w:r>
-          </w:p>
-        </w:tc>
-        <w:tc>
-          <w:tcPr/>
-          <w:p>
-            <w:pPr>
-              <w:pStyle w:val="Compact"/>
-            </w:pPr>
-            <w:r>
-              <w:rPr>
-                <w:rStyle w:val="VerbatimChar"/>
-              </w:rPr>
-              <w:t xml:space="preserve">cdx_timestamp</w:t>
-            </w:r>
-          </w:p>
-        </w:tc>
-        <w:tc>
-          <w:tcPr/>
-          <w:p>
-            <w:pPr>
-              <w:pStyle w:val="Compact"/>
-            </w:pPr>
-            <w:r>
-              <w:t xml:space="preserve">master</w:t>
-            </w:r>
-          </w:p>
-        </w:tc>
-        <w:tc>
-          <w:tcPr/>
-          <w:p>
-            <w:pPr>
-              <w:pStyle w:val="Compact"/>
-              <w:jc w:val="right"/>
-            </w:pPr>
-            <w:r>
-              <w:t xml:space="preserve">44,629</w:t>
-            </w:r>
-          </w:p>
-        </w:tc>
-        <w:tc>
-          <w:tcPr/>
-          <w:p>
-            <w:pPr>
-              <w:pStyle w:val="Compact"/>
-              <w:jc w:val="right"/>
-            </w:pPr>
-            <w:r>
-              <w:t xml:space="preserve">38,756.4</w:t>
-            </w:r>
-          </w:p>
-        </w:tc>
-      </w:tr>
-      <w:tr>
-        <w:tc>
-          <w:tcPr/>
-          <w:p>
-            <w:pPr>
-              <w:pStyle w:val="Compact"/>
-            </w:pPr>
-            <w:r>
-              <w:rPr>
-                <w:rStyle w:val="VerbatimChar"/>
-              </w:rPr>
-              <w:t xml:space="preserve">usenet_address</w:t>
-            </w:r>
-          </w:p>
-        </w:tc>
-        <w:tc>
-          <w:tcPr/>
-          <w:p>
-            <w:pPr>
-              <w:pStyle w:val="Compact"/>
-            </w:pPr>
-            <w:r>
-              <w:t xml:space="preserve">post date of the message carrying the address</w:t>
-            </w:r>
-          </w:p>
-        </w:tc>
-        <w:tc>
-          <w:tcPr/>
-          <w:p>
-            <w:pPr>
-              <w:pStyle w:val="Compact"/>
-            </w:pPr>
-            <w:r>
-              <w:rPr>
-                <w:rStyle w:val="VerbatimChar"/>
-              </w:rPr>
-              <w:t xml:space="preserve">dated_directory</w:t>
-            </w:r>
-          </w:p>
-        </w:tc>
-        <w:tc>
-          <w:tcPr/>
-          <w:p>
-            <w:pPr>
-              <w:pStyle w:val="Compact"/>
-            </w:pPr>
-            <w:r>
-              <w:t xml:space="preserve">master</w:t>
-            </w:r>
-          </w:p>
-        </w:tc>
-        <w:tc>
-          <w:tcPr/>
-          <w:p>
-            <w:pPr>
-              <w:pStyle w:val="Compact"/>
-              <w:jc w:val="right"/>
-            </w:pPr>
-            <w:r>
-              <w:t xml:space="preserve">15,764</w:t>
-            </w:r>
-          </w:p>
-        </w:tc>
-        <w:tc>
-          <w:tcPr/>
-          <w:p>
-            <w:pPr>
-              <w:pStyle w:val="Compact"/>
-              <w:jc w:val="right"/>
-            </w:pPr>
-            <w:r>
-              <w:t xml:space="preserve">9,579.5</w:t>
-            </w:r>
-          </w:p>
-        </w:tc>
-      </w:tr>
-      <w:tr>
-        <w:tc>
-          <w:tcPr/>
-          <w:p>
-            <w:pPr>
-              <w:pStyle w:val="Compact"/>
-            </w:pPr>
-            <w:r>
-              <w:rPr>
-                <w:rStyle w:val="VerbatimChar"/>
-              </w:rPr>
-              <w:t xml:space="preserve">udrp_proceedings</w:t>
-            </w:r>
-          </w:p>
-        </w:tc>
-        <w:tc>
-          <w:tcPr/>
-          <w:p>
-            <w:pPr>
-              <w:pStyle w:val="Compact"/>
-            </w:pPr>
-            <w:r>
-              <w:t xml:space="preserve">the commencement date of the dispute</w:t>
-            </w:r>
-          </w:p>
-        </w:tc>
-        <w:tc>
-          <w:tcPr/>
-          <w:p>
-            <w:pPr>
-              <w:pStyle w:val="Compact"/>
-            </w:pPr>
-            <w:r>
-              <w:rPr>
-                <w:rStyle w:val="VerbatimChar"/>
-              </w:rPr>
-              <w:t xml:space="preserve">artifact_listing</w:t>
-            </w:r>
-          </w:p>
-        </w:tc>
-        <w:tc>
-          <w:tcPr/>
-          <w:p>
-            <w:pPr>
-              <w:pStyle w:val="Compact"/>
-            </w:pPr>
-            <w:r>
-              <w:t xml:space="preserve">master</w:t>
-            </w:r>
-          </w:p>
-        </w:tc>
-        <w:tc>
-          <w:tcPr/>
-          <w:p>
-            <w:pPr>
-              <w:pStyle w:val="Compact"/>
-              <w:jc w:val="right"/>
-            </w:pPr>
-            <w:r>
-              <w:t xml:space="preserve">6,934</w:t>
-            </w:r>
-          </w:p>
-        </w:tc>
-        <w:tc>
-          <w:tcPr/>
-          <w:p>
-            <w:pPr>
-              <w:pStyle w:val="Compact"/>
-              <w:jc w:val="right"/>
-            </w:pPr>
-            <w:r>
-              <w:t xml:space="preserve">4,203.1</w:t>
-            </w:r>
-          </w:p>
-        </w:tc>
-      </w:tr>
-      <w:tr>
-        <w:tc>
-          <w:tcPr/>
-          <w:p>
-            <w:pPr>
-              <w:pStyle w:val="Compact"/>
-            </w:pPr>
-            <w:r>
-              <w:rPr>
-                <w:rStyle w:val="VerbatimChar"/>
-              </w:rPr>
-              <w:t xml:space="preserve">usenet_bare</w:t>
-            </w:r>
-          </w:p>
-        </w:tc>
-        <w:tc>
-          <w:tcPr/>
-          <w:p>
-            <w:pPr>
-              <w:pStyle w:val="Compact"/>
-            </w:pPr>
-            <w:r>
-              <w:t xml:space="preserve">post date of the message carrying the address</w:t>
-            </w:r>
-          </w:p>
-        </w:tc>
-        <w:tc>
-          <w:tcPr/>
-          <w:p>
-            <w:pPr>
-              <w:pStyle w:val="Compact"/>
-            </w:pPr>
-            <w:r>
-              <w:rPr>
-                <w:rStyle w:val="VerbatimChar"/>
-              </w:rPr>
-              <w:t xml:space="preserve">dated_directory</w:t>
-            </w:r>
-          </w:p>
-        </w:tc>
-        <w:tc>
-          <w:tcPr/>
-          <w:p>
-            <w:pPr>
-              <w:pStyle w:val="Compact"/>
-            </w:pPr>
-            <w:r>
-              <w:t xml:space="preserve">master</w:t>
-            </w:r>
-          </w:p>
-        </w:tc>
-        <w:tc>
-          <w:tcPr/>
-          <w:p>
-            <w:pPr>
-              <w:pStyle w:val="Compact"/>
-              <w:jc w:val="right"/>
-            </w:pPr>
-            <w:r>
-              <w:t xml:space="preserve">5,211</w:t>
-            </w:r>
-          </w:p>
-        </w:tc>
-        <w:tc>
-          <w:tcPr/>
-          <w:p>
-            <w:pPr>
-              <w:pStyle w:val="Compact"/>
-              <w:jc w:val="right"/>
-            </w:pPr>
-            <w:r>
-              <w:t xml:space="preserve">3,246.7</w:t>
-            </w:r>
-          </w:p>
-        </w:tc>
-      </w:tr>
-      <w:tr>
-        <w:tc>
-          <w:tcPr/>
-          <w:p>
-            <w:pPr>
-              <w:pStyle w:val="Compact"/>
-            </w:pPr>
-            <w:r>
-              <w:rPr>
-                <w:rStyle w:val="VerbatimChar"/>
-              </w:rPr>
-              <w:t xml:space="preserve">attrition_defacement</w:t>
-            </w:r>
-          </w:p>
-        </w:tc>
-        <w:tc>
-          <w:tcPr/>
-          <w:p>
-            <w:pPr>
-              <w:pStyle w:val="Compact"/>
-            </w:pPr>
-            <w:r>
-              <w:t xml:space="preserve">the date the defacement was recorded</w:t>
-            </w:r>
-          </w:p>
-        </w:tc>
-        <w:tc>
-          <w:tcPr/>
-          <w:p>
-            <w:pPr>
-              <w:pStyle w:val="Compact"/>
-            </w:pPr>
-            <w:r>
-              <w:rPr>
-                <w:rStyle w:val="VerbatimChar"/>
-              </w:rPr>
-              <w:t xml:space="preserve">artifact_listing</w:t>
-            </w:r>
-          </w:p>
-        </w:tc>
-        <w:tc>
-          <w:tcPr/>
-          <w:p>
-            <w:pPr>
-              <w:pStyle w:val="Compact"/>
-            </w:pPr>
-            <w:r>
-              <w:t xml:space="preserve">master</w:t>
-            </w:r>
-          </w:p>
-        </w:tc>
-        <w:tc>
-          <w:tcPr/>
-          <w:p>
-            <w:pPr>
-              <w:pStyle w:val="Compact"/>
-              <w:jc w:val="right"/>
-            </w:pPr>
-            <w:r>
-              <w:t xml:space="preserve">3,929</w:t>
-            </w:r>
-          </w:p>
-        </w:tc>
-        <w:tc>
-          <w:tcPr/>
-          <w:p>
-            <w:pPr>
-              <w:pStyle w:val="Compact"/>
-              <w:jc w:val="right"/>
-            </w:pPr>
-            <w:r>
-              <w:t xml:space="preserve">1,874.9</w:t>
-            </w:r>
-          </w:p>
-        </w:tc>
-      </w:tr>
-      <w:tr>
-        <w:tc>
-          <w:tcPr/>
-          <w:p>
-            <w:pPr>
-              <w:pStyle w:val="Compact"/>
-            </w:pPr>
-            <w:r>
-              <w:rPr>
-                <w:rStyle w:val="VerbatimChar"/>
-              </w:rPr>
-              <w:t xml:space="preserve">enron_email</w:t>
-            </w:r>
-          </w:p>
-        </w:tc>
-        <w:tc>
-          <w:tcPr/>
-          <w:p>
-            <w:pPr>
-              <w:pStyle w:val="Compact"/>
-            </w:pPr>
-            <w:r>
-              <w:t xml:space="preserve">the message</w:t>
-            </w:r>
-            <w:r>
-              <w:t xml:space="preserve"> </w:t>
-            </w:r>
-            <w:r>
-              <w:rPr>
-                <w:rStyle w:val="VerbatimChar"/>
-              </w:rPr>
-              <w:t xml:space="preserve">Date:</w:t>
-            </w:r>
-            <w:r>
-              <w:t xml:space="preserve"> </w:t>
-            </w:r>
-            <w:r>
-              <w:t xml:space="preserve">header</w:t>
-            </w:r>
-          </w:p>
-        </w:tc>
-        <w:tc>
-          <w:tcPr/>
-          <w:p>
-            <w:pPr>
-              <w:pStyle w:val="Compact"/>
-            </w:pPr>
-            <w:r>
-              <w:rPr>
-                <w:rStyle w:val="VerbatimChar"/>
-              </w:rPr>
-              <w:t xml:space="preserve">dated_directory</w:t>
-            </w:r>
-          </w:p>
-        </w:tc>
-        <w:tc>
-          <w:tcPr/>
-          <w:p>
-            <w:pPr>
-              <w:pStyle w:val="Compact"/>
-            </w:pPr>
-            <w:r>
-              <w:t xml:space="preserve">master</w:t>
-            </w:r>
-          </w:p>
-        </w:tc>
-        <w:tc>
-          <w:tcPr/>
-          <w:p>
-            <w:pPr>
-              <w:pStyle w:val="Compact"/>
-              <w:jc w:val="right"/>
-            </w:pPr>
-            <w:r>
-              <w:t xml:space="preserve">2,163</w:t>
-            </w:r>
-          </w:p>
-        </w:tc>
-        <w:tc>
-          <w:tcPr/>
-          <w:p>
-            <w:pPr>
-              <w:pStyle w:val="Compact"/>
-              <w:jc w:val="right"/>
-            </w:pPr>
-            <w:r>
-              <w:t xml:space="preserve">1,360.2</w:t>
-            </w:r>
-          </w:p>
-        </w:tc>
-      </w:tr>
-      <w:tr>
-        <w:tc>
-          <w:tcPr/>
-          <w:p>
-            <w:pPr>
-              <w:pStyle w:val="Compact"/>
-            </w:pPr>
-            <w:r>
-              <w:rPr>
-                <w:rStyle w:val="VerbatimChar"/>
-              </w:rPr>
-              <w:t xml:space="preserve">maillist_archive</w:t>
-            </w:r>
-          </w:p>
-        </w:tc>
-        <w:tc>
-          <w:tcPr/>
-          <w:p>
-            <w:pPr>
-              <w:pStyle w:val="Compact"/>
-            </w:pPr>
-            <w:r>
-              <w:t xml:space="preserve">the message</w:t>
-            </w:r>
-            <w:r>
-              <w:t xml:space="preserve"> </w:t>
-            </w:r>
-            <w:r>
-              <w:rPr>
-                <w:rStyle w:val="VerbatimChar"/>
-              </w:rPr>
-              <w:t xml:space="preserve">Date:</w:t>
-            </w:r>
-            <w:r>
-              <w:t xml:space="preserve"> </w:t>
-            </w:r>
-            <w:r>
-              <w:t xml:space="preserve">header</w:t>
-            </w:r>
-          </w:p>
-        </w:tc>
-        <w:tc>
-          <w:tcPr/>
-          <w:p>
-            <w:pPr>
-              <w:pStyle w:val="Compact"/>
-            </w:pPr>
-            <w:r>
-              <w:rPr>
-                <w:rStyle w:val="VerbatimChar"/>
-              </w:rPr>
-              <w:t xml:space="preserve">dated_directory</w:t>
-            </w:r>
-          </w:p>
-        </w:tc>
-        <w:tc>
-          <w:tcPr/>
-          <w:p>
-            <w:pPr>
-              <w:pStyle w:val="Compact"/>
-            </w:pPr>
-            <w:r>
-              <w:t xml:space="preserve">master</w:t>
-            </w:r>
-          </w:p>
-        </w:tc>
-        <w:tc>
-          <w:tcPr/>
-          <w:p>
-            <w:pPr>
-              <w:pStyle w:val="Compact"/>
-              <w:jc w:val="right"/>
-            </w:pPr>
-            <w:r>
-              <w:t xml:space="preserve">633</w:t>
-            </w:r>
-          </w:p>
-        </w:tc>
-        <w:tc>
-          <w:tcPr/>
-          <w:p>
-            <w:pPr>
-              <w:pStyle w:val="Compact"/>
-              <w:jc w:val="right"/>
-            </w:pPr>
-            <w:r>
-              <w:t xml:space="preserve">395.3</w:t>
-            </w:r>
-          </w:p>
-        </w:tc>
-      </w:tr>
-      <w:tr>
-        <w:tc>
-          <w:tcPr/>
-          <w:p>
-            <w:pPr>
-              <w:pStyle w:val="Compact"/>
-            </w:pPr>
-            <w:r>
-              <w:rPr>
-                <w:rStyle w:val="VerbatimChar"/>
-              </w:rPr>
-              <w:t xml:space="preserve">trade_press</w:t>
-            </w:r>
-          </w:p>
-        </w:tc>
-        <w:tc>
-          <w:tcPr/>
-          <w:p>
-            <w:pPr>
-              <w:pStyle w:val="Compact"/>
-            </w:pPr>
-            <w:r>
-              <w:t xml:space="preserve">the issue cover date</w:t>
-            </w:r>
-          </w:p>
-        </w:tc>
-        <w:tc>
-          <w:tcPr/>
-          <w:p>
-            <w:pPr>
-              <w:pStyle w:val="Compact"/>
-            </w:pPr>
-            <w:r>
-              <w:rPr>
-                <w:rStyle w:val="VerbatimChar"/>
-              </w:rPr>
-              <w:t xml:space="preserve">dated_directory</w:t>
-            </w:r>
-          </w:p>
-        </w:tc>
-        <w:tc>
-          <w:tcPr/>
-          <w:p>
-            <w:pPr>
-              <w:pStyle w:val="Compact"/>
-            </w:pPr>
-            <w:r>
-              <w:t xml:space="preserve">master</w:t>
-            </w:r>
-          </w:p>
-        </w:tc>
-        <w:tc>
-          <w:tcPr/>
-          <w:p>
-            <w:pPr>
-              <w:pStyle w:val="Compact"/>
-              <w:jc w:val="right"/>
-            </w:pPr>
-            <w:r>
-              <w:t xml:space="preserve">212</w:t>
-            </w:r>
-          </w:p>
-        </w:tc>
-        <w:tc>
-          <w:tcPr/>
-          <w:p>
-            <w:pPr>
-              <w:pStyle w:val="Compact"/>
-              <w:jc w:val="right"/>
-            </w:pPr>
-            <w:r>
-              <w:t xml:space="preserve">134.7</w:t>
-            </w:r>
-          </w:p>
-        </w:tc>
-      </w:tr>
-      <w:tr>
-        <w:tc>
-          <w:tcPr/>
-          <w:p>
-            <w:pPr>
-              <w:pStyle w:val="Compact"/>
-            </w:pPr>
-            <w:r>
-              <w:rPr>
-                <w:rStyle w:val="VerbatimChar"/>
-              </w:rPr>
-              <w:t xml:space="preserve">tucows_catalogue</w:t>
-            </w:r>
-          </w:p>
-        </w:tc>
-        <w:tc>
-          <w:tcPr/>
-          <w:p>
-            <w:pPr>
-              <w:pStyle w:val="Compact"/>
-            </w:pPr>
-            <w:r>
-              <w:t xml:space="preserve">software release date</w:t>
-            </w:r>
-          </w:p>
-        </w:tc>
-        <w:tc>
-          <w:tcPr/>
-          <w:p>
-            <w:pPr>
-              <w:pStyle w:val="Compact"/>
-            </w:pPr>
-            <w:r>
-              <w:rPr>
-                <w:rStyle w:val="VerbatimChar"/>
-              </w:rPr>
-              <w:t xml:space="preserve">dated_directory</w:t>
-            </w:r>
-          </w:p>
-        </w:tc>
-        <w:tc>
-          <w:tcPr/>
-          <w:p>
-            <w:pPr>
-              <w:pStyle w:val="Compact"/>
-            </w:pPr>
-            <w:r>
-              <w:t xml:space="preserve">master</w:t>
-            </w:r>
-          </w:p>
-        </w:tc>
-        <w:tc>
-          <w:tcPr/>
-          <w:p>
-            <w:pPr>
-              <w:pStyle w:val="Compact"/>
-              <w:jc w:val="right"/>
-            </w:pPr>
-            <w:r>
-              <w:t xml:space="preserve">83</w:t>
-            </w:r>
-          </w:p>
-        </w:tc>
-        <w:tc>
-          <w:tcPr/>
-          <w:p>
-            <w:pPr>
-              <w:pStyle w:val="Compact"/>
-              <w:jc w:val="right"/>
-            </w:pPr>
-            <w:r>
-              <w:t xml:space="preserve">53.2</w:t>
-            </w:r>
-          </w:p>
-        </w:tc>
-      </w:tr>
-      <w:tr>
-        <w:tc>
-          <w:tcPr/>
-          <w:p>
-            <w:pPr>
-              <w:pStyle w:val="Compact"/>
-            </w:pPr>
-            <w:r>
-              <w:rPr>
-                <w:rStyle w:val="VerbatimChar"/>
-              </w:rPr>
-              <w:t xml:space="preserve">rtfm_faq</w:t>
-            </w:r>
-          </w:p>
-        </w:tc>
-        <w:tc>
-          <w:tcPr/>
-          <w:p>
-            <w:pPr>
-              <w:pStyle w:val="Compact"/>
-            </w:pPr>
-            <w:r>
-              <w:t xml:space="preserve">the FAQ's revision header</w:t>
-            </w:r>
-          </w:p>
-        </w:tc>
-        <w:tc>
-          <w:tcPr/>
-          <w:p>
-            <w:pPr>
-              <w:pStyle w:val="Compact"/>
-            </w:pPr>
-            <w:r>
-              <w:rPr>
-                <w:rStyle w:val="VerbatimChar"/>
-              </w:rPr>
-              <w:t xml:space="preserve">dated_directory</w:t>
-            </w:r>
-          </w:p>
-        </w:tc>
-        <w:tc>
-          <w:tcPr/>
-          <w:p>
-            <w:pPr>
-              <w:pStyle w:val="Compact"/>
-            </w:pPr>
-            <w:r>
-              <w:t xml:space="preserve">master</w:t>
-            </w:r>
-          </w:p>
-        </w:tc>
-        <w:tc>
-          <w:tcPr/>
-          <w:p>
-            <w:pPr>
-              <w:pStyle w:val="Compact"/>
-              <w:jc w:val="right"/>
-            </w:pPr>
-            <w:r>
-              <w:t xml:space="preserve">36</w:t>
-            </w:r>
-          </w:p>
-        </w:tc>
-        <w:tc>
-          <w:tcPr/>
-          <w:p>
-            <w:pPr>
-              <w:pStyle w:val="Compact"/>
-              <w:jc w:val="right"/>
-            </w:pPr>
-            <w:r>
-              <w:t xml:space="preserve">25.0</w:t>
+              <w:t xml:space="preserve">2,796</w:t>
+            </w:r>
+          </w:p>
+        </w:tc>
+        <w:tc>
+          <w:tcPr/>
+          <w:p>
+            <w:pPr>
+              <w:pStyle w:val="Compact"/>
+              <w:jc w:val="right"/>
+            </w:pPr>
+            <w:r>
+              <w:t xml:space="preserve">2,674.2</w:t>
             </w:r>
           </w:p>
         </w:tc>
@@ -2796,7 +1588,7 @@
                 <w:b/>
                 <w:bCs/>
               </w:rPr>
-              <w:t xml:space="preserve">2,838,715</w:t>
+              <w:t xml:space="preserve">17,733</w:t>
             </w:r>
           </w:p>
         </w:tc>
@@ -2812,7 +1604,7 @@
                 <w:b/>
                 <w:bCs/>
               </w:rPr>
-              <w:t xml:space="preserve">1,697,224.9</w:t>
+              <w:t xml:space="preserve">14,358.9</w:t>
             </w:r>
           </w:p>
         </w:tc>
@@ -2833,7 +1625,7 @@
           <w:b/>
           <w:bCs/>
         </w:rPr>
-        <w:t xml:space="preserve">2,450,244 domains have no</w:t>
+        <w:t xml:space="preserve">2,352,924 domains have no</w:t>
       </w:r>
       <w:r>
         <w:rPr>
@@ -3050,79 +1842,79 @@
               <w:jc w:val="right"/>
             </w:pPr>
             <w:r>
-              <w:t xml:space="preserve">162</w:t>
-            </w:r>
-          </w:p>
-        </w:tc>
-        <w:tc>
-          <w:tcPr/>
-          <w:p>
-            <w:pPr>
-              <w:pStyle w:val="Compact"/>
-              <w:jc w:val="right"/>
-            </w:pPr>
-            <w:r>
-              <w:t xml:space="preserve">105,687</w:t>
-            </w:r>
-          </w:p>
-        </w:tc>
-        <w:tc>
-          <w:tcPr/>
-          <w:p>
-            <w:pPr>
-              <w:pStyle w:val="Compact"/>
-              <w:jc w:val="right"/>
-            </w:pPr>
-            <w:r>
-              <w:t xml:space="preserve">89,390</w:t>
-            </w:r>
-          </w:p>
-        </w:tc>
-        <w:tc>
-          <w:tcPr/>
-          <w:p>
-            <w:pPr>
-              <w:pStyle w:val="Compact"/>
-              <w:jc w:val="right"/>
-            </w:pPr>
-            <w:r>
-              <w:t xml:space="preserve">84.6%</w:t>
-            </w:r>
-          </w:p>
-        </w:tc>
-        <w:tc>
-          <w:tcPr/>
-          <w:p>
-            <w:pPr>
-              <w:pStyle w:val="Compact"/>
-              <w:jc w:val="right"/>
-            </w:pPr>
-            <w:r>
-              <w:t xml:space="preserve">44.6%</w:t>
-            </w:r>
-          </w:p>
-        </w:tc>
-        <w:tc>
-          <w:tcPr/>
-          <w:p>
-            <w:pPr>
-              <w:pStyle w:val="Compact"/>
-              <w:jc w:val="right"/>
-            </w:pPr>
-            <w:r>
-              <w:t xml:space="preserve">90,100</w:t>
-            </w:r>
-          </w:p>
-        </w:tc>
-        <w:tc>
-          <w:tcPr/>
-          <w:p>
-            <w:pPr>
-              <w:pStyle w:val="Compact"/>
-              <w:jc w:val="right"/>
-            </w:pPr>
-            <w:r>
-              <w:t xml:space="preserve">57,882</w:t>
+              <w:t xml:space="preserve">197</w:t>
+            </w:r>
+          </w:p>
+        </w:tc>
+        <w:tc>
+          <w:tcPr/>
+          <w:p>
+            <w:pPr>
+              <w:pStyle w:val="Compact"/>
+              <w:jc w:val="right"/>
+            </w:pPr>
+            <w:r>
+              <w:t xml:space="preserve">125,355</w:t>
+            </w:r>
+          </w:p>
+        </w:tc>
+        <w:tc>
+          <w:tcPr/>
+          <w:p>
+            <w:pPr>
+              <w:pStyle w:val="Compact"/>
+              <w:jc w:val="right"/>
+            </w:pPr>
+            <w:r>
+              <w:t xml:space="preserve">108,765</w:t>
+            </w:r>
+          </w:p>
+        </w:tc>
+        <w:tc>
+          <w:tcPr/>
+          <w:p>
+            <w:pPr>
+              <w:pStyle w:val="Compact"/>
+              <w:jc w:val="right"/>
+            </w:pPr>
+            <w:r>
+              <w:t xml:space="preserve">86.8%</w:t>
+            </w:r>
+          </w:p>
+        </w:tc>
+        <w:tc>
+          <w:tcPr/>
+          <w:p>
+            <w:pPr>
+              <w:pStyle w:val="Compact"/>
+              <w:jc w:val="right"/>
+            </w:pPr>
+            <w:r>
+              <w:t xml:space="preserve">47.2%</w:t>
+            </w:r>
+          </w:p>
+        </w:tc>
+        <w:tc>
+          <w:tcPr/>
+          <w:p>
+            <w:pPr>
+              <w:pStyle w:val="Compact"/>
+              <w:jc w:val="right"/>
+            </w:pPr>
+            <w:r>
+              <w:t xml:space="preserve">109,116</w:t>
+            </w:r>
+          </w:p>
+        </w:tc>
+        <w:tc>
+          <w:tcPr/>
+          <w:p>
+            <w:pPr>
+              <w:pStyle w:val="Compact"/>
+              <w:jc w:val="right"/>
+            </w:pPr>
+            <w:r>
+              <w:t xml:space="preserve">70,805</w:t>
             </w:r>
           </w:p>
         </w:tc>
@@ -3150,31 +1942,31 @@
               <w:jc w:val="right"/>
             </w:pPr>
             <w:r>
-              <w:t xml:space="preserve">213</w:t>
-            </w:r>
-          </w:p>
-        </w:tc>
-        <w:tc>
-          <w:tcPr/>
-          <w:p>
-            <w:pPr>
-              <w:pStyle w:val="Compact"/>
-              <w:jc w:val="right"/>
-            </w:pPr>
-            <w:r>
-              <w:t xml:space="preserve">63,741</w:t>
-            </w:r>
-          </w:p>
-        </w:tc>
-        <w:tc>
-          <w:tcPr/>
-          <w:p>
-            <w:pPr>
-              <w:pStyle w:val="Compact"/>
-              <w:jc w:val="right"/>
-            </w:pPr>
-            <w:r>
-              <w:t xml:space="preserve">55,724</w:t>
+              <w:t xml:space="preserve">214</w:t>
+            </w:r>
+          </w:p>
+        </w:tc>
+        <w:tc>
+          <w:tcPr/>
+          <w:p>
+            <w:pPr>
+              <w:pStyle w:val="Compact"/>
+              <w:jc w:val="right"/>
+            </w:pPr>
+            <w:r>
+              <w:t xml:space="preserve">63,919</w:t>
+            </w:r>
+          </w:p>
+        </w:tc>
+        <w:tc>
+          <w:tcPr/>
+          <w:p>
+            <w:pPr>
+              <w:pStyle w:val="Compact"/>
+              <w:jc w:val="right"/>
+            </w:pPr>
+            <w:r>
+              <w:t xml:space="preserve">55,844</w:t>
             </w:r>
           </w:p>
         </w:tc>
@@ -3210,19 +2002,19 @@
               <w:jc w:val="right"/>
             </w:pPr>
             <w:r>
-              <w:t xml:space="preserve">55,845</w:t>
-            </w:r>
-          </w:p>
-        </w:tc>
-        <w:tc>
-          <w:tcPr/>
-          <w:p>
-            <w:pPr>
-              <w:pStyle w:val="Compact"/>
-              <w:jc w:val="right"/>
-            </w:pPr>
-            <w:r>
-              <w:t xml:space="preserve">127,191</w:t>
+              <w:t xml:space="preserve">55,943</w:t>
+            </w:r>
+          </w:p>
+        </w:tc>
+        <w:tc>
+          <w:tcPr/>
+          <w:p>
+            <w:pPr>
+              <w:pStyle w:val="Compact"/>
+              <w:jc w:val="right"/>
+            </w:pPr>
+            <w:r>
+              <w:t xml:space="preserve">127,552</w:t>
             </w:r>
           </w:p>
         </w:tc>
@@ -3638,6 +2430,206 @@
               <w:rPr>
                 <w:rStyle w:val="VerbatimChar"/>
               </w:rPr>
+              <w:t xml:space="preserve">cdx_gap3</w:t>
+            </w:r>
+          </w:p>
+        </w:tc>
+        <w:tc>
+          <w:tcPr/>
+          <w:p>
+            <w:pPr>
+              <w:pStyle w:val="Compact"/>
+              <w:jc w:val="right"/>
+            </w:pPr>
+            <w:r>
+              <w:t xml:space="preserve">16</w:t>
+            </w:r>
+          </w:p>
+        </w:tc>
+        <w:tc>
+          <w:tcPr/>
+          <w:p>
+            <w:pPr>
+              <w:pStyle w:val="Compact"/>
+              <w:jc w:val="right"/>
+            </w:pPr>
+            <w:r>
+              <w:t xml:space="preserve">4,638</w:t>
+            </w:r>
+          </w:p>
+        </w:tc>
+        <w:tc>
+          <w:tcPr/>
+          <w:p>
+            <w:pPr>
+              <w:pStyle w:val="Compact"/>
+              <w:jc w:val="right"/>
+            </w:pPr>
+            <w:r>
+              <w:t xml:space="preserve">4,173</w:t>
+            </w:r>
+          </w:p>
+        </w:tc>
+        <w:tc>
+          <w:tcPr/>
+          <w:p>
+            <w:pPr>
+              <w:pStyle w:val="Compact"/>
+              <w:jc w:val="right"/>
+            </w:pPr>
+            <w:r>
+              <w:t xml:space="preserve">90.0%</w:t>
+            </w:r>
+          </w:p>
+        </w:tc>
+        <w:tc>
+          <w:tcPr/>
+          <w:p>
+            <w:pPr>
+              <w:pStyle w:val="Compact"/>
+              <w:jc w:val="right"/>
+            </w:pPr>
+            <w:r>
+              <w:t xml:space="preserve">67.1%</w:t>
+            </w:r>
+          </w:p>
+        </w:tc>
+        <w:tc>
+          <w:tcPr/>
+          <w:p>
+            <w:pPr>
+              <w:pStyle w:val="Compact"/>
+              <w:jc w:val="right"/>
+            </w:pPr>
+            <w:r>
+              <w:t xml:space="preserve">4,206</w:t>
+            </w:r>
+          </w:p>
+        </w:tc>
+        <w:tc>
+          <w:tcPr/>
+          <w:p>
+            <w:pPr>
+              <w:pStyle w:val="Compact"/>
+              <w:jc w:val="right"/>
+            </w:pPr>
+            <w:r>
+              <w:t xml:space="preserve">4,919</w:t>
+            </w:r>
+          </w:p>
+        </w:tc>
+      </w:tr>
+      <w:tr>
+        <w:tc>
+          <w:tcPr/>
+          <w:p>
+            <w:pPr>
+              <w:pStyle w:val="Compact"/>
+            </w:pPr>
+            <w:r>
+              <w:rPr>
+                <w:rStyle w:val="VerbatimChar"/>
+              </w:rPr>
+              <w:t xml:space="preserve">cdx_gap2</w:t>
+            </w:r>
+          </w:p>
+        </w:tc>
+        <w:tc>
+          <w:tcPr/>
+          <w:p>
+            <w:pPr>
+              <w:pStyle w:val="Compact"/>
+              <w:jc w:val="right"/>
+            </w:pPr>
+            <w:r>
+              <w:t xml:space="preserve">13</w:t>
+            </w:r>
+          </w:p>
+        </w:tc>
+        <w:tc>
+          <w:tcPr/>
+          <w:p>
+            <w:pPr>
+              <w:pStyle w:val="Compact"/>
+              <w:jc w:val="right"/>
+            </w:pPr>
+            <w:r>
+              <w:t xml:space="preserve">3,718</w:t>
+            </w:r>
+          </w:p>
+        </w:tc>
+        <w:tc>
+          <w:tcPr/>
+          <w:p>
+            <w:pPr>
+              <w:pStyle w:val="Compact"/>
+              <w:jc w:val="right"/>
+            </w:pPr>
+            <w:r>
+              <w:t xml:space="preserve">3,309</w:t>
+            </w:r>
+          </w:p>
+        </w:tc>
+        <w:tc>
+          <w:tcPr/>
+          <w:p>
+            <w:pPr>
+              <w:pStyle w:val="Compact"/>
+              <w:jc w:val="right"/>
+            </w:pPr>
+            <w:r>
+              <w:t xml:space="preserve">89.0%</w:t>
+            </w:r>
+          </w:p>
+        </w:tc>
+        <w:tc>
+          <w:tcPr/>
+          <w:p>
+            <w:pPr>
+              <w:pStyle w:val="Compact"/>
+              <w:jc w:val="right"/>
+            </w:pPr>
+            <w:r>
+              <w:t xml:space="preserve">94.5%</w:t>
+            </w:r>
+          </w:p>
+        </w:tc>
+        <w:tc>
+          <w:tcPr/>
+          <w:p>
+            <w:pPr>
+              <w:pStyle w:val="Compact"/>
+              <w:jc w:val="right"/>
+            </w:pPr>
+            <w:r>
+              <w:t xml:space="preserve">3,323</w:t>
+            </w:r>
+          </w:p>
+        </w:tc>
+        <w:tc>
+          <w:tcPr/>
+          <w:p>
+            <w:pPr>
+              <w:pStyle w:val="Compact"/>
+              <w:jc w:val="right"/>
+            </w:pPr>
+            <w:r>
+              <w:t xml:space="preserve">10,420</w:t>
+            </w:r>
+          </w:p>
+        </w:tc>
+      </w:tr>
+      <w:tr>
+        <w:tc>
+          <w:tcPr/>
+          <w:p>
+            <w:pPr>
+              <w:pStyle w:val="Compact"/>
+            </w:pPr>
+            <w:r>
+              <w:rPr>
+                <w:rStyle w:val="VerbatimChar"/>
+              </w:rPr>
               <w:t xml:space="preserve">cdx_disc</w:t>
             </w:r>
           </w:p>
@@ -3823,6 +2815,106 @@
             </w:pPr>
             <w:r>
               <w:t xml:space="preserve">278</w:t>
+            </w:r>
+          </w:p>
+        </w:tc>
+      </w:tr>
+      <w:tr>
+        <w:tc>
+          <w:tcPr/>
+          <w:p>
+            <w:pPr>
+              <w:pStyle w:val="Compact"/>
+            </w:pPr>
+            <w:r>
+              <w:rPr>
+                <w:rStyle w:val="VerbatimChar"/>
+              </w:rPr>
+              <w:t xml:space="preserve">cdx_edgepilot_b</w:t>
+            </w:r>
+          </w:p>
+        </w:tc>
+        <w:tc>
+          <w:tcPr/>
+          <w:p>
+            <w:pPr>
+              <w:pStyle w:val="Compact"/>
+              <w:jc w:val="right"/>
+            </w:pPr>
+            <w:r>
+              <w:t xml:space="preserve">1</w:t>
+            </w:r>
+          </w:p>
+        </w:tc>
+        <w:tc>
+          <w:tcPr/>
+          <w:p>
+            <w:pPr>
+              <w:pStyle w:val="Compact"/>
+              <w:jc w:val="right"/>
+            </w:pPr>
+            <w:r>
+              <w:t xml:space="preserve">155</w:t>
+            </w:r>
+          </w:p>
+        </w:tc>
+        <w:tc>
+          <w:tcPr/>
+          <w:p>
+            <w:pPr>
+              <w:pStyle w:val="Compact"/>
+              <w:jc w:val="right"/>
+            </w:pPr>
+            <w:r>
+              <w:t xml:space="preserve">141</w:t>
+            </w:r>
+          </w:p>
+        </w:tc>
+        <w:tc>
+          <w:tcPr/>
+          <w:p>
+            <w:pPr>
+              <w:pStyle w:val="Compact"/>
+              <w:jc w:val="right"/>
+            </w:pPr>
+            <w:r>
+              <w:t xml:space="preserve">91.0%</w:t>
+            </w:r>
+          </w:p>
+        </w:tc>
+        <w:tc>
+          <w:tcPr/>
+          <w:p>
+            <w:pPr>
+              <w:pStyle w:val="Compact"/>
+              <w:jc w:val="right"/>
+            </w:pPr>
+            <w:r>
+              <w:t xml:space="preserve">80.9%</w:t>
+            </w:r>
+          </w:p>
+        </w:tc>
+        <w:tc>
+          <w:tcPr/>
+          <w:p>
+            <w:pPr>
+              <w:pStyle w:val="Compact"/>
+              <w:jc w:val="right"/>
+            </w:pPr>
+            <w:r>
+              <w:t xml:space="preserve">155</w:t>
+            </w:r>
+          </w:p>
+        </w:tc>
+        <w:tc>
+          <w:tcPr/>
+          <w:p>
+            <w:pPr>
+              <w:pStyle w:val="Compact"/>
+              <w:jc w:val="right"/>
+            </w:pPr>
+            <w:r>
+              <w:t xml:space="preserve">325</w:t>
             </w:r>
           </w:p>
         </w:tc>
@@ -3855,7 +2947,7 @@
                 <w:b/>
                 <w:bCs/>
               </w:rPr>
-              <w:t xml:space="preserve">669</w:t>
+              <w:t xml:space="preserve">735</w:t>
             </w:r>
           </w:p>
         </w:tc>
@@ -3871,7 +2963,7 @@
                 <w:b/>
                 <w:bCs/>
               </w:rPr>
-              <w:t xml:space="preserve">301,365</w:t>
+              <w:t xml:space="preserve">329,722</w:t>
             </w:r>
           </w:p>
         </w:tc>
@@ -3887,7 +2979,7 @@
                 <w:b/>
                 <w:bCs/>
               </w:rPr>
-              <w:t xml:space="preserve">261,182</w:t>
+              <w:t xml:space="preserve">288,300</w:t>
             </w:r>
           </w:p>
         </w:tc>
@@ -3903,7 +2995,7 @@
                 <w:b/>
                 <w:bCs/>
               </w:rPr>
-              <w:t xml:space="preserve">86.7%</w:t>
+              <w:t xml:space="preserve">87.4%</w:t>
             </w:r>
           </w:p>
         </w:tc>
@@ -3919,7 +3011,7 @@
                 <w:b/>
                 <w:bCs/>
               </w:rPr>
-              <w:t xml:space="preserve">69.3%</w:t>
+              <w:t xml:space="preserve">68.8%</w:t>
             </w:r>
           </w:p>
         </w:tc>
@@ -3935,7 +3027,7 @@
                 <w:b/>
                 <w:bCs/>
               </w:rPr>
-              <w:t xml:space="preserve">262,722</w:t>
+              <w:t xml:space="preserve">289,519</w:t>
             </w:r>
           </w:p>
         </w:tc>
@@ -3951,7 +3043,7 @@
                 <w:b/>
                 <w:bCs/>
               </w:rPr>
-              <w:t xml:space="preserve">535,665</w:t>
+              <w:t xml:space="preserve">564,613</w:t>
             </w:r>
           </w:p>
         </w:tc>
@@ -3962,7 +3054,7 @@
         <w:pStyle w:val="BodyText"/>
       </w:pPr>
       <w:r>
-        <w:t xml:space="preserve">Of 301,365 queries, 261,182 were answered (86.7%). The 40,183 that were not divide into two kinds, and the smaller kind is the one usually discussed.</w:t>
+        <w:t xml:space="preserve">Of 329,722 queries, 288,300 were answered (87.4%). The 41,422 that were not divide into two kinds, and the smaller kind is the one usually discussed.</w:t>
       </w:r>
       <w:r>
         <w:t xml:space="preserve"> </w:t>
@@ -3972,10 +3064,10 @@
           <w:b/>
           <w:bCs/>
         </w:rPr>
-        <w:t xml:space="preserve">HTTP-level errors are 2,909 (0.97%)</w:t>
-      </w:r>
-      <w:r>
-        <w:t xml:space="preserve">: 0 rate limits (429), 2,133 server errors (500, 502, 503, 504) and 776 refusals (403).</w:t>
+        <w:t xml:space="preserve">HTTP-level errors are 3,081 (0.93%)</w:t>
+      </w:r>
+      <w:r>
+        <w:t xml:space="preserve">: 0 rate limits (429), 2,153 server errors (500, 502, 503, 504) and 928 refusals (403).</w:t>
       </w:r>
       <w:r>
         <w:t xml:space="preserve"> </w:t>
@@ -3985,10 +3077,10 @@
           <w:b/>
           <w:bCs/>
         </w:rPr>
-        <w:t xml:space="preserve">Transport-level failures are 37,274 (12.37%)</w:t>
-      </w:r>
-      <w:r>
-        <w:t xml:space="preserve">: 27,775 connections refused or reset and 9,499 timed out. So the binding constraint is not a status code we could read and obey, it is the connection being dropped before a status exists. Rate limits and server errors are retried with exponential backoff honouring</w:t>
+        <w:t xml:space="preserve">Transport-level failures are 38,341 (11.63%)</w:t>
+      </w:r>
+      <w:r>
+        <w:t xml:space="preserve">: 27,897 connections refused or reset and 10,444 timed out. So the binding constraint is not a status code we could read and obey, it is the connection being dropped before a status exists. Rate limits and server errors are retried with exponential backoff honouring</w:t>
       </w:r>
       <w:r>
         <w:t xml:space="preserve"> </w:t>
@@ -4012,25 +3104,162 @@
           <w:b/>
           <w:bCs/>
         </w:rPr>
-        <w:t xml:space="preserve">Still worth expanding, but no longer the binding constraint.</w:t>
-      </w:r>
-      <w:r>
-        <w:t xml:space="preserve"> </w:t>
-      </w:r>
-      <w:r>
-        <w:t xml:space="preserve">Roughly 2.5 million candidate names sit</w:t>
-      </w:r>
-      <w:r>
-        <w:t xml:space="preserve"> </w:t>
-      </w:r>
-      <w:r>
-        <w:t xml:space="preserve">unqueried against engines clearing a few hundred requests an hour, so the queue was never the limit this</w:t>
-      </w:r>
-      <w:r>
-        <w:t xml:space="preserve"> </w:t>
-      </w:r>
-      <w:r>
-        <w:t xml:space="preserve">round. That is what redirected it toward bulk dated corpora.</w:t>
+        <w:t xml:space="preserve">Still worth expanding, and still not the binding constraint.</w:t>
+      </w:r>
+      <w:r>
+        <w:t xml:space="preserve"> </w:t>
+      </w:r>
+      <w:r>
+        <w:t xml:space="preserve">The measurement that says so:</w:t>
+      </w:r>
+      <w:r>
+        <w:t xml:space="preserve"> </w:t>
+      </w:r>
+      <w:r>
+        <w:t xml:space="preserve">2,284,110 candidate names sit unqueried against engines clearing a few hundred requests an hour, so</w:t>
+      </w:r>
+      <w:r>
+        <w:t xml:space="preserve"> </w:t>
+      </w:r>
+      <w:r>
+        <w:t xml:space="preserve">the limit is the request rate at one archive rather than anything about the population. Section VII of</w:t>
+      </w:r>
+      <w:r>
+        <w:t xml:space="preserve"> </w:t>
+      </w:r>
+      <w:r>
+        <w:t xml:space="preserve">the brief forbids calling a CDX route exhausted on anything but demonstrated yield, and this route is</w:t>
+      </w:r>
+      <w:r>
+        <w:t xml:space="preserve"> </w:t>
+      </w:r>
+      <w:r>
+        <w:t xml:space="preserve">not exhausted; it is metered.</w:t>
+      </w:r>
+    </w:p>
+    <w:p>
+      <w:pPr>
+        <w:pStyle w:val="BodyText"/>
+      </w:pPr>
+      <w:r>
+        <w:rPr>
+          <w:b/>
+          <w:bCs/>
+        </w:rPr>
+        <w:t xml:space="preserve">One finding this round changed how the queue is ranked, and it was worth more than a week of</w:t>
+      </w:r>
+      <w:r>
+        <w:rPr>
+          <w:b/>
+          <w:bCs/>
+        </w:rPr>
+        <w:t xml:space="preserve"> </w:t>
+      </w:r>
+      <w:r>
+        <w:rPr>
+          <w:b/>
+          <w:bCs/>
+        </w:rPr>
+        <w:t xml:space="preserve">querying.</w:t>
+      </w:r>
+      <w:r>
+        <w:t xml:space="preserve"> </w:t>
+      </w:r>
+      <w:r>
+        <w:t xml:space="preserve">The pool engine fell from 91.2% in-window to 6.1% overnight without failing any health</w:t>
+      </w:r>
+      <w:r>
+        <w:t xml:space="preserve"> </w:t>
+      </w:r>
+      <w:r>
+        <w:t xml:space="preserve">check: alive, writing, and answering. The cause was that per-TLD hit rates were measured as lifetime</w:t>
+      </w:r>
+      <w:r>
+        <w:t xml:space="preserve"> </w:t>
+      </w:r>
+      <w:r>
+        <w:t xml:space="preserve">averages, and the productive names in a namespace get queried first, so a worked-out namespace keeps</w:t>
+      </w:r>
+      <w:r>
+        <w:t xml:space="preserve"> </w:t>
+      </w:r>
+      <w:r>
+        <w:t xml:space="preserve">a flattering average. Measured over all 188 pool journals,</w:t>
+      </w:r>
+      <w:r>
+        <w:t xml:space="preserve"> </w:t>
+      </w:r>
+      <w:r>
+        <w:rPr>
+          <w:rStyle w:val="VerbatimChar"/>
+        </w:rPr>
+        <w:t xml:space="preserve">.org</w:t>
+      </w:r>
+      <w:r>
+        <w:t xml:space="preserve"> </w:t>
+      </w:r>
+      <w:r>
+        <w:t xml:space="preserve">read 0.461 lifetime and 0.068 over</w:t>
+      </w:r>
+      <w:r>
+        <w:t xml:space="preserve"> </w:t>
+      </w:r>
+      <w:r>
+        <w:t xml:space="preserve">its most recent 500 answers, a 6.8x overstatement, and its 0.7101 English weight held it at the head</w:t>
+      </w:r>
+      <w:r>
+        <w:t xml:space="preserve"> </w:t>
+      </w:r>
+      <w:r>
+        <w:t xml:space="preserve">of the queue for 0.048 expected equivalent-English per query against 0.783 for</w:t>
+      </w:r>
+      <w:r>
+        <w:t xml:space="preserve"> </w:t>
+      </w:r>
+      <w:r>
+        <w:rPr>
+          <w:rStyle w:val="VerbatimChar"/>
+        </w:rPr>
+        <w:t xml:space="preserve">.uk</w:t>
+      </w:r>
+      <w:r>
+        <w:t xml:space="preserve">. Rates are now</w:t>
+      </w:r>
+      <w:r>
+        <w:t xml:space="preserve"> </w:t>
+      </w:r>
+      <w:r>
+        <w:t xml:space="preserve">measured over a trailing window of 2,000 answers, which corrects in both directions:</w:t>
+      </w:r>
+      <w:r>
+        <w:t xml:space="preserve"> </w:t>
+      </w:r>
+      <w:r>
+        <w:rPr>
+          <w:rStyle w:val="VerbatimChar"/>
+        </w:rPr>
+        <w:t xml:space="preserve">.uk</w:t>
+      </w:r>
+      <w:r>
+        <w:t xml:space="preserve"> </w:t>
+      </w:r>
+      <w:r>
+        <w:t xml:space="preserve">and</w:t>
+      </w:r>
+      <w:r>
+        <w:t xml:space="preserve"> </w:t>
+      </w:r>
+      <w:r>
+        <w:rPr>
+          <w:rStyle w:val="VerbatimChar"/>
+        </w:rPr>
+        <w:t xml:space="preserve">.com</w:t>
+      </w:r>
+      <w:r>
+        <w:t xml:space="preserve"> </w:t>
+      </w:r>
+      <w:r>
+        <w:t xml:space="preserve">were understated by lifetime for the mirror reason. After re-ranking, the same engine returned 33.8%.</w:t>
       </w:r>
     </w:p>
     <w:p>
@@ -4059,52 +3288,33 @@
           <w:b/>
           <w:bCs/>
         </w:rPr>
-        <w:t xml:space="preserve">The useful finding this round is a negative one about our own strategy.</w:t>
-      </w:r>
-      <w:r>
-        <w:t xml:space="preserve"> </w:t>
-      </w:r>
-      <w:r>
-        <w:t xml:space="preserve">Collection had been</w:t>
-      </w:r>
-      <w:r>
-        <w:t xml:space="preserve"> </w:t>
-      </w:r>
-      <w:r>
-        <w:t xml:space="preserve">optimised against request throughput at a single archive. When</w:t>
-      </w:r>
-      <w:r>
-        <w:t xml:space="preserve"> </w:t>
-      </w:r>
-      <w:r>
-        <w:rPr>
-          <w:rStyle w:val="VerbatimChar"/>
-        </w:rPr>
-        <w:t xml:space="preserve">merged260815</w:t>
-      </w:r>
-      <w:r>
-        <w:t xml:space="preserve"> </w:t>
-      </w:r>
-      <w:r>
-        <w:t xml:space="preserve">arrived carrying another</w:t>
-      </w:r>
-      <w:r>
-        <w:t xml:space="preserve"> </w:t>
-      </w:r>
-      <w:r>
-        <w:t xml:space="preserve">contributor's UMN DRUM delivery, its shape was the lesson: one bulk dated corpus was worth roughly</w:t>
-      </w:r>
-      <w:r>
-        <w:t xml:space="preserve"> </w:t>
-      </w:r>
-      <w:r>
-        <w:t xml:space="preserve">twenty times our previous round of per-domain querying, because such a corpus does not have that</w:t>
-      </w:r>
-      <w:r>
-        <w:t xml:space="preserve"> </w:t>
-      </w:r>
-      <w:r>
-        <w:t xml:space="preserve">constraint at all. Re-aiming the search at that shape produced sections 2 and 3.</w:t>
+        <w:t xml:space="preserve">The useful results this round are four negative ones about our own system, each found by a</w:t>
+      </w:r>
+      <w:r>
+        <w:rPr>
+          <w:b/>
+          <w:bCs/>
+        </w:rPr>
+        <w:t xml:space="preserve"> </w:t>
+      </w:r>
+      <w:r>
+        <w:rPr>
+          <w:b/>
+          <w:bCs/>
+        </w:rPr>
+        <w:t xml:space="preserve">mechanism rather than by noticing.</w:t>
+      </w:r>
+      <w:r>
+        <w:t xml:space="preserve"> </w:t>
+      </w:r>
+      <w:r>
+        <w:t xml:space="preserve">That is the capability worth reporting: not that the pipeline</w:t>
+      </w:r>
+      <w:r>
+        <w:t xml:space="preserve"> </w:t>
+      </w:r>
+      <w:r>
+        <w:t xml:space="preserve">collected, but that it caught itself.</w:t>
       </w:r>
     </w:p>
     <w:p>
@@ -4116,37 +3326,13 @@
           <w:b/>
           <w:bCs/>
         </w:rPr>
-        <w:t xml:space="preserve">That is now a ranking rule rather than an anecdote.</w:t>
-      </w:r>
-      <w:r>
-        <w:t xml:space="preserve"> </w:t>
-      </w:r>
-      <w:r>
-        <w:t xml:space="preserve">Sources are priced by yield per byte before a</w:t>
-      </w:r>
-      <w:r>
-        <w:t xml:space="preserve"> </w:t>
-      </w:r>
-      <w:r>
-        <w:t xml:space="preserve">collector is written: the capture census measured</w:t>
-      </w:r>
-      <w:r>
-        <w:t xml:space="preserve"> </w:t>
+        <w:t xml:space="preserve">A rate is not a property of a namespace, it is a property of a namespace at a point in its</w:t>
       </w:r>
       <w:r>
         <w:rPr>
           <w:b/>
           <w:bCs/>
         </w:rPr>
-        <w:t xml:space="preserve">997 net-new pairs per megabyte</w:t>
-      </w:r>
-      <w:r>
-        <w:t xml:space="preserve"> </w:t>
-      </w:r>
-      <w:r>
-        <w:t xml:space="preserve">against</w:t>
-      </w:r>
-      <w:r>
         <w:t xml:space="preserve"> </w:t>
       </w:r>
       <w:r>
@@ -4154,37 +3340,49 @@
           <w:b/>
           <w:bCs/>
         </w:rPr>
-        <w:t xml:space="preserve">15.5</w:t>
-      </w:r>
-      <w:r>
-        <w:t xml:space="preserve"> </w:t>
-      </w:r>
-      <w:r>
-        <w:t xml:space="preserve">for a Usenet sample, a 64x difference that no amount of extra querying closes. The same measurement</w:t>
-      </w:r>
-      <w:r>
-        <w:t xml:space="preserve"> </w:t>
-      </w:r>
-      <w:r>
-        <w:t xml:space="preserve">retired a route we had been developing: seeding link-looking pages rather than home pages harvested 391</w:t>
-      </w:r>
-      <w:r>
-        <w:t xml:space="preserve"> </w:t>
-      </w:r>
-      <w:r>
-        <w:t xml:space="preserve">domains against 53, a 7.4x improvement, yet yielded only 5 net-new, because 386 were already held and</w:t>
-      </w:r>
-      <w:r>
-        <w:t xml:space="preserve"> </w:t>
-      </w:r>
-      <w:r>
-        <w:t xml:space="preserve">already dated. Page-by-page expansion is therefore now outranked by bulk link graphs, and the negative</w:t>
-      </w:r>
-      <w:r>
-        <w:t xml:space="preserve"> </w:t>
-      </w:r>
-      <w:r>
-        <w:t xml:space="preserve">result is recorded so it is not rediscovered.</w:t>
+        <w:t xml:space="preserve">exhaustion.</w:t>
+      </w:r>
+      <w:r>
+        <w:t xml:space="preserve"> </w:t>
+      </w:r>
+      <w:r>
+        <w:t xml:space="preserve">Section 4 has the measurement. The general lesson is that a ranking model fed its own</w:t>
+      </w:r>
+      <w:r>
+        <w:t xml:space="preserve"> </w:t>
+      </w:r>
+      <w:r>
+        <w:t xml:space="preserve">lifetime history will keep recommending whatever it has already spent, and the fix is to measure the</w:t>
+      </w:r>
+      <w:r>
+        <w:t xml:space="preserve"> </w:t>
+      </w:r>
+      <w:r>
+        <w:t xml:space="preserve">margin. Two corrections were needed inside that fix, both caught by reading the queue builder's own</w:t>
+      </w:r>
+      <w:r>
+        <w:t xml:space="preserve"> </w:t>
+      </w:r>
+      <w:r>
+        <w:t xml:space="preserve">output rather than trusting the change: journals were being ordered by filename, which groups by</w:t>
+      </w:r>
+      <w:r>
+        <w:t xml:space="preserve"> </w:t>
+      </w:r>
+      <w:r>
+        <w:t xml:space="preserve">collector before time, so "the most recent 2,000 answers" meant "the last answers of whichever</w:t>
+      </w:r>
+      <w:r>
+        <w:t xml:space="preserve"> </w:t>
+      </w:r>
+      <w:r>
+        <w:t xml:space="preserve">collector prefix sorts last"; and windowing the pool-wide prior made every unmeasured namespace score</w:t>
+      </w:r>
+      <w:r>
+        <w:t xml:space="preserve"> </w:t>
+      </w:r>
+      <w:r>
+        <w:t xml:space="preserve">zero, so nothing new could ever earn a first measurement. The prior is deliberately not windowed.</w:t>
       </w:r>
     </w:p>
     <w:p>
@@ -4196,31 +3394,72 @@
           <w:b/>
           <w:bCs/>
         </w:rPr>
-        <w:t xml:space="preserve">The machinery enforcing this is as documented in previous rounds</w:t>
-      </w:r>
-      <w:r>
-        <w:t xml:space="preserve"> </w:t>
-      </w:r>
-      <w:r>
-        <w:t xml:space="preserve">and ships in the archive. One note</w:t>
-      </w:r>
-      <w:r>
-        <w:t xml:space="preserve"> </w:t>
-      </w:r>
-      <w:r>
-        <w:t xml:space="preserve">on how it behaved: both new sources had to clear the human gate before a single row could date a year,</w:t>
-      </w:r>
-      <w:r>
-        <w:t xml:space="preserve"> </w:t>
-      </w:r>
-      <w:r>
-        <w:t xml:space="preserve">on a machine-generated request built from a seeded-random sample with live links and the measured</w:t>
-      </w:r>
-      <w:r>
-        <w:t xml:space="preserve"> </w:t>
-      </w:r>
-      <w:r>
-        <w:t xml:space="preserve">counterfactual, so the decision rested on external evidence rather than on the agent's argument.</w:t>
+        <w:t xml:space="preserve">An audit of the delivery against the four artifacts requested on 2026-08-17 found that the archive</w:t>
+      </w:r>
+      <w:r>
+        <w:rPr>
+          <w:b/>
+          <w:bCs/>
+        </w:rPr>
+        <w:t xml:space="preserve"> </w:t>
+      </w:r>
+      <w:r>
+        <w:rPr>
+          <w:b/>
+          <w:bCs/>
+        </w:rPr>
+        <w:t xml:space="preserve">overstated its own reproducibility by four orders of magnitude.</w:t>
+      </w:r>
+      <w:r>
+        <w:t xml:space="preserve"> </w:t>
+      </w:r>
+      <w:r>
+        <w:t xml:space="preserve">The reproduction instructions said</w:t>
+      </w:r>
+      <w:r>
+        <w:t xml:space="preserve"> </w:t>
+      </w:r>
+      <w:r>
+        <w:t xml:space="preserve">the tier-3 gap was 840 domains. Measured: 2,387,824 assignments, 44.9% of everything carrying this</w:t>
+      </w:r>
+      <w:r>
+        <w:t xml:space="preserve"> </w:t>
+      </w:r>
+      <w:r>
+        <w:t xml:space="preserve">project's own evidence, from two sources whose inputs cannot ship, one because the depositing item</w:t>
+      </w:r>
+      <w:r>
+        <w:t xml:space="preserve"> </w:t>
+      </w:r>
+      <w:r>
+        <w:t xml:space="preserve">stopped serving the day after it was downloaded. Both documents now state the measured figure where a</w:t>
+      </w:r>
+      <w:r>
+        <w:t xml:space="preserve"> </w:t>
+      </w:r>
+      <w:r>
+        <w:t xml:space="preserve">reader meets it. Tier 2 reproduces all of it, which is why the evidence for every assignment ships as</w:t>
+      </w:r>
+      <w:r>
+        <w:t xml:space="preserve"> </w:t>
+      </w:r>
+      <w:r>
+        <w:t xml:space="preserve">Parquet and</w:t>
+      </w:r>
+      <w:r>
+        <w:t xml:space="preserve"> </w:t>
+      </w:r>
+      <w:r>
+        <w:rPr>
+          <w:rStyle w:val="VerbatimChar"/>
+        </w:rPr>
+        <w:t xml:space="preserve">verify.sh</w:t>
+      </w:r>
+      <w:r>
+        <w:t xml:space="preserve"> </w:t>
+      </w:r>
+      <w:r>
+        <w:t xml:space="preserve">check 4 tests that every one resolves inside the archive.</w:t>
       </w:r>
     </w:p>
     <w:p>
@@ -4232,20 +3471,136 @@
           <w:b/>
           <w:bCs/>
         </w:rPr>
-        <w:t xml:space="preserve">Negative results are first-class.</w:t>
-      </w:r>
-      <w:r>
-        <w:t xml:space="preserve"> </w:t>
+        <w:t xml:space="preserve">A requirement that lives only in prose gets shipped unmet, so the four requested artifacts are</w:t>
       </w:r>
       <w:r>
         <w:rPr>
           <w:b/>
           <w:bCs/>
         </w:rPr>
-        <w:t xml:space="preserve">118 source families have been searched and recorded</w:t>
-      </w:r>
-      <w:r>
-        <w:t xml:space="preserve">, 27 developed far enough to earn their own section and 91 evaluated and closed, each with the measurement that closed it, so negative results stay visible and the same ground is not broken twice.</w:t>
+        <w:t xml:space="preserve"> </w:t>
+      </w:r>
+      <w:r>
+        <w:rPr>
+          <w:b/>
+          <w:bCs/>
+        </w:rPr>
+        <w:t xml:space="preserve">checks.</w:t>
+      </w:r>
+      <w:r>
+        <w:t xml:space="preserve"> </w:t>
+      </w:r>
+      <w:r>
+        <w:rPr>
+          <w:rStyle w:val="VerbatimChar"/>
+        </w:rPr>
+        <w:t xml:space="preserve">verify.sh</w:t>
+      </w:r>
+      <w:r>
+        <w:t xml:space="preserve"> </w:t>
+      </w:r>
+      <w:r>
+        <w:t xml:space="preserve">grew checks 5 to 8: that the code snapshot carries its dependency manifest and</w:t>
+      </w:r>
+      <w:r>
+        <w:t xml:space="preserve"> </w:t>
+      </w:r>
+      <w:r>
+        <w:t xml:space="preserve">lockfile, that the experience summary covers every topic asked for, that every reconciliation identity</w:t>
+      </w:r>
+      <w:r>
+        <w:t xml:space="preserve"> </w:t>
+      </w:r>
+      <w:r>
+        <w:t xml:space="preserve">in the merge audit holds and that the audit agrees with the shipped files, and that the reviewer's own</w:t>
+      </w:r>
+      <w:r>
+        <w:t xml:space="preserve"> </w:t>
+      </w:r>
+      <w:r>
+        <w:t xml:space="preserve">calculator, run from inside the archive, reproduces the audit's baseline figure.</w:t>
+      </w:r>
+      <w:r>
+        <w:t xml:space="preserve"> </w:t>
+      </w:r>
+      <w:r>
+        <w:rPr>
+          <w:rStyle w:val="VerbatimChar"/>
+        </w:rPr>
+        <w:t xml:space="preserve">merge_against_baseline.py</w:t>
+      </w:r>
+      <w:r>
+        <w:t xml:space="preserve"> </w:t>
+      </w:r>
+      <w:r>
+        <w:t xml:space="preserve">uses his column names unchanged so his audit and ours can be diffed rather than compared by eye.</w:t>
+      </w:r>
+    </w:p>
+    <w:p>
+      <w:pPr>
+        <w:pStyle w:val="BodyText"/>
+      </w:pPr>
+      <w:r>
+        <w:rPr>
+          <w:b/>
+          <w:bCs/>
+        </w:rPr>
+        <w:t xml:space="preserve">Two guards earned their keep by refusing to build.</w:t>
+      </w:r>
+      <w:r>
+        <w:t xml:space="preserve"> </w:t>
+      </w:r>
+      <w:r>
+        <w:t xml:space="preserve">The dirty-tree guard caught an archive whose</w:t>
+      </w:r>
+      <w:r>
+        <w:t xml:space="preserve"> </w:t>
+      </w:r>
+      <w:r>
+        <w:t xml:space="preserve">shipped code would not have contained the very script its own check looks for. The stale-export guard</w:t>
+      </w:r>
+      <w:r>
+        <w:t xml:space="preserve"> </w:t>
+      </w:r>
+      <w:r>
+        <w:t xml:space="preserve">caught it twice more, because the collectors bank continuously and an export is a snapshot. And the</w:t>
+      </w:r>
+      <w:r>
+        <w:t xml:space="preserve"> </w:t>
+      </w:r>
+      <w:r>
+        <w:t xml:space="preserve">document you are reading exists in this form because the fill refuses to write a report with an</w:t>
+      </w:r>
+      <w:r>
+        <w:t xml:space="preserve"> </w:t>
+      </w:r>
+      <w:r>
+        <w:t xml:space="preserve">unwritten section, which it did not do until this round.</w:t>
+      </w:r>
+    </w:p>
+    <w:p>
+      <w:pPr>
+        <w:pStyle w:val="BodyText"/>
+      </w:pPr>
+      <w:r>
+        <w:rPr>
+          <w:b/>
+          <w:bCs/>
+        </w:rPr>
+        <w:t xml:space="preserve">Negative results are first-class.</w:t>
+      </w:r>
+      <w:r>
+        <w:t xml:space="preserve"> </w:t>
+      </w:r>
+      <w:r>
+        <w:rPr>
+          <w:b/>
+          <w:bCs/>
+        </w:rPr>
+        <w:t xml:space="preserve">140 source families have been searched and recorded</w:t>
+      </w:r>
+      <w:r>
+        <w:t xml:space="preserve">, 27 developed far enough to earn their own section and 113 evaluated and closed, each with the measurement that closed it, so negative results stay visible and the same ground is not broken twice.</w:t>
       </w:r>
       <w:r>
         <w:t xml:space="preserve"> </w:t>
@@ -4285,25 +3640,41 @@
         <w:pStyle w:val="FirstParagraph"/>
       </w:pPr>
       <w:r>
-        <w:t xml:space="preserve">The capture census is a 2017 snapshot, so its counts are a floor on what the archive holds now. The</w:t>
-      </w:r>
-      <w:r>
-        <w:t xml:space="preserve"> </w:t>
-      </w:r>
-      <w:r>
-        <w:t xml:space="preserve">registry compilation covers domains still registered in December 2024, so it is survivorship-biased: a</w:t>
-      </w:r>
-      <w:r>
-        <w:t xml:space="preserve"> </w:t>
-      </w:r>
-      <w:r>
-        <w:t xml:space="preserve">name created in 1998, dropped, and re-registered in 2015 reads 2015 and falls out of the window. The</w:t>
-      </w:r>
-      <w:r>
-        <w:t xml:space="preserve"> </w:t>
-      </w:r>
-      <w:r>
-        <w:t xml:space="preserve">direction of error is loss, and the reverse cannot happen.</w:t>
+        <w:rPr>
+          <w:b/>
+          <w:bCs/>
+        </w:rPr>
+        <w:t xml:space="preserve">Limits of this round's two routes, with the direction of each error.</w:t>
+      </w:r>
+      <w:r>
+        <w:t xml:space="preserve"> </w:t>
+      </w:r>
+      <w:r>
+        <w:t xml:space="preserve">A capture timestamp proves</w:t>
+      </w:r>
+      <w:r>
+        <w:t xml:space="preserve"> </w:t>
+      </w:r>
+      <w:r>
+        <w:t xml:space="preserve">presence and never absence, so a year with no capture is unevidenced rather than empty. A registry</w:t>
+      </w:r>
+      <w:r>
+        <w:t xml:space="preserve"> </w:t>
+      </w:r>
+      <w:r>
+        <w:t xml:space="preserve">creation date attests registration rather than activity, and only for the year it falls in. Both err</w:t>
+      </w:r>
+      <w:r>
+        <w:t xml:space="preserve"> </w:t>
+      </w:r>
+      <w:r>
+        <w:t xml:space="preserve">toward under-claiming: neither can invent a year, and the shape of the mistake they can make is</w:t>
+      </w:r>
+      <w:r>
+        <w:t xml:space="preserve"> </w:t>
+      </w:r>
+      <w:r>
+        <w:t xml:space="preserve">omission.</w:t>
       </w:r>
     </w:p>
     <w:p>
@@ -4315,25 +3686,112 @@
           <w:b/>
           <w:bCs/>
         </w:rPr>
-        <w:t xml:space="preserve">Worth expanding, in order.</w:t>
-      </w:r>
-      <w:r>
-        <w:t xml:space="preserve"> </w:t>
-      </w:r>
-      <w:r>
-        <w:t xml:space="preserve">Bulk dated corpora first, since one such file outweighed a whole round of</w:t>
-      </w:r>
-      <w:r>
-        <w:t xml:space="preserve"> </w:t>
-      </w:r>
-      <w:r>
-        <w:t xml:space="preserve">querying and two more were found here. National web archive link graphs second, where the year</w:t>
-      </w:r>
-      <w:r>
-        <w:t xml:space="preserve"> </w:t>
-      </w:r>
-      <w:r>
-        <w:t xml:space="preserve">association is explicit and the weight is high:</w:t>
+        <w:t xml:space="preserve">Two limits of the archive as a whole, which no amount of querying fixes.</w:t>
+      </w:r>
+      <w:r>
+        <w:t xml:space="preserve"> </w:t>
+      </w:r>
+      <w:r>
+        <w:t xml:space="preserve">12.34% of requests fail</w:t>
+      </w:r>
+      <w:r>
+        <w:t xml:space="preserve"> </w:t>
+      </w:r>
+      <w:r>
+        <w:t xml:space="preserve">at transport level rather than with a status code, which is the same throttling seen from the other</w:t>
+      </w:r>
+      <w:r>
+        <w:t xml:space="preserve"> </w:t>
+      </w:r>
+      <w:r>
+        <w:t xml:space="preserve">side of the socket. And the corroboration split, which gates anything a human typed, asks only whether</w:t>
+      </w:r>
+      <w:r>
+        <w:t xml:space="preserve"> </w:t>
+      </w:r>
+      <w:r>
+        <w:t xml:space="preserve">a domain is dated in some annual file and never whether the mention was genuine, so technical prose</w:t>
+      </w:r>
+      <w:r>
+        <w:t xml:space="preserve"> </w:t>
+      </w:r>
+      <w:r>
+        <w:t xml:space="preserve">that invents plausible examples is the one shape it does not stop. That is why this round's routes are</w:t>
+      </w:r>
+      <w:r>
+        <w:t xml:space="preserve"> </w:t>
+      </w:r>
+      <w:r>
+        <w:t xml:space="preserve">both self-dating.</w:t>
+      </w:r>
+    </w:p>
+    <w:p>
+      <w:pPr>
+        <w:pStyle w:val="BodyText"/>
+      </w:pPr>
+      <w:r>
+        <w:rPr>
+          <w:b/>
+          <w:bCs/>
+        </w:rPr>
+        <w:t xml:space="preserve">Worth expanding, in order, each with what ranks it.</w:t>
+      </w:r>
+      <w:r>
+        <w:t xml:space="preserve"> </w:t>
+      </w:r>
+      <w:r>
+        <w:t xml:space="preserve">Bulk dated corpora first, measured at 997</w:t>
+      </w:r>
+      <w:r>
+        <w:t xml:space="preserve"> </w:t>
+      </w:r>
+      <w:r>
+        <w:t xml:space="preserve">net-new pairs per megabyte against 15.5 for a prose corpus. National web archive link graphs second,</w:t>
+      </w:r>
+      <w:r>
+        <w:t xml:space="preserve"> </w:t>
+      </w:r>
+      <w:r>
+        <w:t xml:space="preserve">where the year association is explicit and the weight is high, with the caveat that most national</w:t>
+      </w:r>
+      <w:r>
+        <w:t xml:space="preserve"> </w:t>
+      </w:r>
+      <w:r>
+        <w:t xml:space="preserve">archives' in-window holdings turn out to be Internet Archive donations and are therefore already held.</w:t>
+      </w:r>
+      <w:r>
+        <w:t xml:space="preserve"> </w:t>
+      </w:r>
+      <w:r>
+        <w:t xml:space="preserve">Registry datasets publishing creation dates as open data third, because that is the route that reaches</w:t>
+      </w:r>
+      <w:r>
+        <w:t xml:space="preserve"> </w:t>
+      </w:r>
+      <w:r>
+        <w:t xml:space="preserve">2001 where the archives are thin. Re-auditing material already on disk fourth, which has twice been</w:t>
+      </w:r>
+      <w:r>
+        <w:t xml:space="preserve"> </w:t>
+      </w:r>
+      <w:r>
+        <w:t xml:space="preserve">the cheapest source available.</w:t>
+      </w:r>
+    </w:p>
+    <w:p>
+      <w:pPr>
+        <w:pStyle w:val="BodyText"/>
+      </w:pPr>
+      <w:r>
+        <w:rPr>
+          <w:b/>
+          <w:bCs/>
+        </w:rPr>
+        <w:t xml:space="preserve">Not worth expanding</w:t>
+      </w:r>
+      <w:r>
+        <w:t xml:space="preserve">: the 112 closed families in</w:t>
       </w:r>
       <w:r>
         <w:t xml:space="preserve"> </w:t>
@@ -4342,55 +3800,22 @@
         <w:rPr>
           <w:rStyle w:val="VerbatimChar"/>
         </w:rPr>
-        <w:t xml:space="preserve">ukwa_link_source</w:t>
-      </w:r>
-      <w:r>
-        <w:t xml:space="preserve"> </w:t>
-      </w:r>
-      <w:r>
-        <w:t xml:space="preserve">returned a mean of 0.9803, the best</w:t>
-      </w:r>
-      <w:r>
-        <w:t xml:space="preserve"> </w:t>
-      </w:r>
-      <w:r>
-        <w:t xml:space="preserve">of any source, because such a graph is almost entirely</w:t>
-      </w:r>
-      <w:r>
-        <w:t xml:space="preserve"> </w:t>
-      </w:r>
-      <w:r>
-        <w:rPr>
-          <w:rStyle w:val="VerbatimChar"/>
-        </w:rPr>
-        <w:t xml:space="preserve">.uk</w:t>
-      </w:r>
-      <w:r>
-        <w:t xml:space="preserve">. Per-domain CDX querying third, bounded by</w:t>
-      </w:r>
-      <w:r>
-        <w:t xml:space="preserve"> </w:t>
-      </w:r>
-      <w:r>
-        <w:t xml:space="preserve">request rate rather than by candidates. Not worth expanding: the closed families in</w:t>
-      </w:r>
-      <w:r>
-        <w:t xml:space="preserve"> </w:t>
-      </w:r>
-      <w:r>
-        <w:rPr>
-          <w:rStyle w:val="VerbatimChar"/>
-        </w:rPr>
         <w:t xml:space="preserve">sources.md</w:t>
       </w:r>
       <w:r>
-        <w:t xml:space="preserve">, each</w:t>
-      </w:r>
-      <w:r>
-        <w:t xml:space="preserve"> </w:t>
-      </w:r>
-      <w:r>
-        <w:t xml:space="preserve">recorded with the measurement that closed it.</w:t>
+        <w:t xml:space="preserve">, each with the measurement that closed</w:t>
+      </w:r>
+      <w:r>
+        <w:t xml:space="preserve"> </w:t>
+      </w:r>
+      <w:r>
+        <w:t xml:space="preserve">it. Two of those closures were narrowed this round rather than reversed, and both corrections are</w:t>
+      </w:r>
+      <w:r>
+        <w:t xml:space="preserve"> </w:t>
+      </w:r>
+      <w:r>
+        <w:t xml:space="preserve">recorded where the original claim was made rather than only in the newest file.</w:t>
       </w:r>
     </w:p>
     <w:p>
@@ -4591,7 +4016,7 @@
         <w:t xml:space="preserve"> </w:t>
       </w:r>
       <w:r>
-        <w:t xml:space="preserve">every per-year count exactly with all ten invariants passing, and all fourteen result files come back</w:t>
+        <w:t xml:space="preserve">every per-year count exactly with all eleven invariants passing, and all fourteen result files come back</w:t>
       </w:r>
       <w:r>
         <w:t xml:space="preserve"> </w:t>
@@ -4604,10 +4029,799 @@
       </w:r>
       <w:r>
         <w:t xml:space="preserve">collectors were querying the Internet Archive at the time.</w:t>
+      </w:r>
+    </w:p>
+    <w:p>
+      <w:r>
+        <w:pict>
+          <v:rect style="width:0;height:1.5pt" o:hralign="center" o:hrstd="t" o:hr="t"/>
+        </w:pict>
       </w:r>
     </w:p>
     <w:bookmarkEnd w:id="15"/>
+    <w:bookmarkStart w:id="16" w:name="Xa860f5fc05f32f1e17fd7da08cb6b7683f62b81"/>
+    <w:p>
+      <w:pPr>
+        <w:pStyle w:val="Heading2"/>
+      </w:pPr>
+      <w:r>
+        <w:t xml:space="preserve">8. The merge, the overlap and the reconciliation</w:t>
+      </w:r>
+    </w:p>
+    <w:p>
+      <w:pPr>
+        <w:pStyle w:val="FirstParagraph"/>
+      </w:pPr>
+      <w:r>
+        <w:rPr>
+          <w:b/>
+          <w:bCs/>
+        </w:rPr>
+        <w:t xml:space="preserve">The merge, deduplication and overlap, computed here rather than described.</w:t>
+      </w:r>
+      <w:r>
+        <w:t xml:space="preserve"> </w:t>
+      </w:r>
+      <w:r>
+        <w:rPr>
+          <w:rStyle w:val="VerbatimChar"/>
+        </w:rPr>
+        <w:t xml:space="preserve">merge_against_baseline.py</w:t>
+      </w:r>
+      <w:r>
+        <w:t xml:space="preserve"> </w:t>
+      </w:r>
+      <w:r>
+        <w:t xml:space="preserve">unions these additions into the current baseline,</w:t>
+      </w:r>
+      <w:r>
+        <w:t xml:space="preserve"> </w:t>
+      </w:r>
+      <w:r>
+        <w:t xml:space="preserve">deduplicated on the lowercased line within each year, which is the reviewer's own</w:t>
+      </w:r>
+      <w:r>
+        <w:t xml:space="preserve"> </w:t>
+      </w:r>
+      <w:r>
+        <w:t xml:space="preserve">counting unit, and scores every file with his own calculator. The per-year form is</w:t>
+      </w:r>
+      <w:r>
+        <w:t xml:space="preserve"> </w:t>
+      </w:r>
+      <w:r>
+        <w:rPr>
+          <w:rStyle w:val="VerbatimChar"/>
+        </w:rPr>
+        <w:t xml:space="preserve">audit/merge_stats_ark_*.csv</w:t>
+      </w:r>
+      <w:r>
+        <w:t xml:space="preserve">, in his column names so his audit and this one can be</w:t>
+      </w:r>
+      <w:r>
+        <w:t xml:space="preserve"> </w:t>
+      </w:r>
+      <w:r>
+        <w:t xml:space="preserve">diffed directly.</w:t>
+      </w:r>
+    </w:p>
+    <w:tbl>
+      <w:tblPr>
+        <w:tblStyle w:val="Table"/>
+        <w:tblW w:type="auto" w:w="0"/>
+        <w:tblLook w:firstRow="1" w:lastRow="0" w:firstColumn="0" w:lastColumn="0" w:noHBand="0" w:noVBand="0" w:val="0020"/>
+      </w:tblPr>
+      <w:tblGrid>
+        <w:gridCol w:w="2640"/>
+        <w:gridCol w:w="2640"/>
+        <w:gridCol w:w="2640"/>
+      </w:tblGrid>
+      <w:tr>
+        <w:trPr>
+          <w:tblHeader w:val="on"/>
+        </w:trPr>
+        <w:tc>
+          <w:tcPr/>
+          <w:p>
+            <w:pPr>
+              <w:pStyle w:val="Compact"/>
+            </w:pPr>
+          </w:p>
+        </w:tc>
+        <w:tc>
+          <w:tcPr/>
+          <w:p>
+            <w:pPr>
+              <w:pStyle w:val="Compact"/>
+              <w:jc w:val="right"/>
+            </w:pPr>
+            <w:r>
+              <w:t xml:space="preserve">records</w:t>
+            </w:r>
+          </w:p>
+        </w:tc>
+        <w:tc>
+          <w:tcPr/>
+          <w:p>
+            <w:pPr>
+              <w:pStyle w:val="Compact"/>
+              <w:jc w:val="right"/>
+            </w:pPr>
+            <w:r>
+              <w:t xml:space="preserve">equivalent-English</w:t>
+            </w:r>
+          </w:p>
+        </w:tc>
+      </w:tr>
+      <w:tr>
+        <w:tc>
+          <w:tcPr/>
+          <w:p>
+            <w:pPr>
+              <w:pStyle w:val="Compact"/>
+            </w:pPr>
+            <w:r>
+              <w:t xml:space="preserve">baseline</w:t>
+            </w:r>
+            <w:r>
+              <w:t xml:space="preserve"> </w:t>
+            </w:r>
+            <w:r>
+              <w:rPr>
+                <w:rStyle w:val="VerbatimChar"/>
+              </w:rPr>
+              <w:t xml:space="preserve">merged260817-2</w:t>
+            </w:r>
+          </w:p>
+        </w:tc>
+        <w:tc>
+          <w:tcPr/>
+          <w:p>
+            <w:pPr>
+              <w:pStyle w:val="Compact"/>
+              <w:jc w:val="right"/>
+            </w:pPr>
+            <w:r>
+              <w:t xml:space="preserve">22,491,418</w:t>
+            </w:r>
+          </w:p>
+        </w:tc>
+        <w:tc>
+          <w:tcPr/>
+          <w:p>
+            <w:pPr>
+              <w:pStyle w:val="Compact"/>
+              <w:jc w:val="right"/>
+            </w:pPr>
+            <w:r>
+              <w:t xml:space="preserve">12,077,095.5404</w:t>
+            </w:r>
+          </w:p>
+        </w:tc>
+      </w:tr>
+      <w:tr>
+        <w:tc>
+          <w:tcPr/>
+          <w:p>
+            <w:pPr>
+              <w:pStyle w:val="Compact"/>
+            </w:pPr>
+            <w:r>
+              <w:t xml:space="preserve">submitted</w:t>
+            </w:r>
+          </w:p>
+        </w:tc>
+        <w:tc>
+          <w:tcPr/>
+          <w:p>
+            <w:pPr>
+              <w:pStyle w:val="Compact"/>
+              <w:jc w:val="right"/>
+            </w:pPr>
+            <w:r>
+              <w:t xml:space="preserve">15,522</w:t>
+            </w:r>
+          </w:p>
+        </w:tc>
+        <w:tc>
+          <w:tcPr/>
+          <w:p>
+            <w:pPr>
+              <w:pStyle w:val="Compact"/>
+            </w:pPr>
+          </w:p>
+        </w:tc>
+      </w:tr>
+      <w:tr>
+        <w:tc>
+          <w:tcPr/>
+          <w:p>
+            <w:pPr>
+              <w:pStyle w:val="Compact"/>
+            </w:pPr>
+            <w:r>
+              <w:t xml:space="preserve">already in the baseline</w:t>
+            </w:r>
+          </w:p>
+        </w:tc>
+        <w:tc>
+          <w:tcPr/>
+          <w:p>
+            <w:pPr>
+              <w:pStyle w:val="Compact"/>
+              <w:jc w:val="right"/>
+            </w:pPr>
+            <w:r>
+              <w:t xml:space="preserve">0</w:t>
+            </w:r>
+          </w:p>
+        </w:tc>
+        <w:tc>
+          <w:tcPr/>
+          <w:p>
+            <w:pPr>
+              <w:pStyle w:val="Compact"/>
+            </w:pPr>
+          </w:p>
+        </w:tc>
+      </w:tr>
+      <w:tr>
+        <w:tc>
+          <w:tcPr/>
+          <w:p>
+            <w:pPr>
+              <w:pStyle w:val="Compact"/>
+            </w:pPr>
+            <w:r>
+              <w:rPr>
+                <w:b/>
+                <w:bCs/>
+              </w:rPr>
+              <w:t xml:space="preserve">accepted increment</w:t>
+            </w:r>
+          </w:p>
+        </w:tc>
+        <w:tc>
+          <w:tcPr/>
+          <w:p>
+            <w:pPr>
+              <w:pStyle w:val="Compact"/>
+              <w:jc w:val="right"/>
+            </w:pPr>
+            <w:r>
+              <w:rPr>
+                <w:b/>
+                <w:bCs/>
+              </w:rPr>
+              <w:t xml:space="preserve">15,522</w:t>
+            </w:r>
+          </w:p>
+        </w:tc>
+        <w:tc>
+          <w:tcPr/>
+          <w:p>
+            <w:pPr>
+              <w:pStyle w:val="Compact"/>
+              <w:jc w:val="right"/>
+            </w:pPr>
+            <w:r>
+              <w:rPr>
+                <w:b/>
+                <w:bCs/>
+              </w:rPr>
+              <w:t xml:space="preserve">12,340.7537</w:t>
+            </w:r>
+          </w:p>
+        </w:tc>
+      </w:tr>
+      <w:tr>
+        <w:tc>
+          <w:tcPr/>
+          <w:p>
+            <w:pPr>
+              <w:pStyle w:val="Compact"/>
+            </w:pPr>
+            <w:r>
+              <w:t xml:space="preserve">post-merge total</w:t>
+            </w:r>
+          </w:p>
+        </w:tc>
+        <w:tc>
+          <w:tcPr/>
+          <w:p>
+            <w:pPr>
+              <w:pStyle w:val="Compact"/>
+              <w:jc w:val="right"/>
+            </w:pPr>
+            <w:r>
+              <w:t xml:space="preserve">22,506,940</w:t>
+            </w:r>
+          </w:p>
+        </w:tc>
+        <w:tc>
+          <w:tcPr/>
+          <w:p>
+            <w:pPr>
+              <w:pStyle w:val="Compact"/>
+              <w:jc w:val="right"/>
+            </w:pPr>
+            <w:r>
+              <w:t xml:space="preserve">12,089,436.2941</w:t>
+            </w:r>
+          </w:p>
+        </w:tc>
+      </w:tr>
+    </w:tbl>
+    <w:p>
+      <w:pPr>
+        <w:pStyle w:val="BodyText"/>
+      </w:pPr>
+      <w:r>
+        <w:rPr>
+          <w:b/>
+          <w:bCs/>
+        </w:rPr>
+        <w:t xml:space="preserve">22 of 22 reconciliation checks pass.</w:t>
+      </w:r>
+      <w:r>
+        <w:t xml:space="preserve"> </w:t>
+      </w:r>
+      <w:r>
+        <w:t xml:space="preserve">They are arithmetic</w:t>
+      </w:r>
+      <w:r>
+        <w:t xml:space="preserve"> </w:t>
+      </w:r>
+      <w:r>
+        <w:t xml:space="preserve">identities, so a failure is a defect rather than a finding: per year that</w:t>
+      </w:r>
+      <w:r>
+        <w:t xml:space="preserve"> </w:t>
+      </w:r>
+      <w:r>
+        <w:rPr>
+          <w:rStyle w:val="VerbatimChar"/>
+        </w:rPr>
+        <w:t xml:space="preserve">baseline_unique + accepted_new == merged_unique</w:t>
+      </w:r>
+      <w:r>
+        <w:t xml:space="preserve"> </w:t>
+      </w:r>
+      <w:r>
+        <w:t xml:space="preserve">and that</w:t>
+      </w:r>
+      <w:r>
+        <w:t xml:space="preserve"> </w:t>
+      </w:r>
+      <w:r>
+        <w:rPr>
+          <w:rStyle w:val="VerbatimChar"/>
+        </w:rPr>
+        <w:t xml:space="preserve">already_in_baseline + accepted_new == submitted_unique</w:t>
+      </w:r>
+      <w:r>
+        <w:t xml:space="preserve">, that the per-year</w:t>
+      </w:r>
+      <w:r>
+        <w:t xml:space="preserve"> </w:t>
+      </w:r>
+      <w:r>
+        <w:t xml:space="preserve">equivalent-English increments sum to the headline figure, that the baseline plus</w:t>
+      </w:r>
+      <w:r>
+        <w:t xml:space="preserve"> </w:t>
+      </w:r>
+      <w:r>
+        <w:t xml:space="preserve">the increment equals the post-merge total, and that a freshly measured baseline</w:t>
+      </w:r>
+      <w:r>
+        <w:t xml:space="preserve"> </w:t>
+      </w:r>
+      <w:r>
+        <w:t xml:space="preserve">reproduces the record count and equivalent-English total this round was measured</w:t>
+      </w:r>
+      <w:r>
+        <w:t xml:space="preserve"> </w:t>
+      </w:r>
+      <w:r>
+        <w:t xml:space="preserve">against. Every one is listed with its verdict in</w:t>
+      </w:r>
+      <w:r>
+        <w:t xml:space="preserve"> </w:t>
+      </w:r>
+      <w:r>
+        <w:rPr>
+          <w:rStyle w:val="VerbatimChar"/>
+        </w:rPr>
+        <w:t xml:space="preserve">audit/merge_audit_ark_*.json</w:t>
+      </w:r>
+      <w:r>
+        <w:t xml:space="preserve">.</w:t>
+      </w:r>
+    </w:p>
+    <w:p>
+      <w:r>
+        <w:pict>
+          <v:rect style="width:0;height:1.5pt" o:hralign="center" o:hrstd="t" o:hr="t"/>
+        </w:pict>
+      </w:r>
+    </w:p>
     <w:bookmarkEnd w:id="16"/>
+    <w:bookmarkStart w:id="17" w:name="Xd31d8cb599d62e9f4d9d7ecfa00b29d7c223899"/>
+    <w:p>
+      <w:pPr>
+        <w:pStyle w:val="Heading2"/>
+      </w:pPr>
+      <w:r>
+        <w:t xml:space="preserve">9. The four artifacts requested on 2026-08-17</w:t>
+      </w:r>
+    </w:p>
+    <w:tbl>
+      <w:tblPr>
+        <w:tblStyle w:val="Table"/>
+        <w:tblW w:type="auto" w:w="0"/>
+        <w:tblLook w:firstRow="1" w:lastRow="0" w:firstColumn="0" w:lastColumn="0" w:noHBand="0" w:noVBand="0" w:val="0020"/>
+      </w:tblPr>
+      <w:tblGrid>
+        <w:gridCol w:w="2640"/>
+        <w:gridCol w:w="2640"/>
+        <w:gridCol w:w="2640"/>
+      </w:tblGrid>
+      <w:tr>
+        <w:trPr>
+          <w:tblHeader w:val="on"/>
+        </w:trPr>
+        <w:tc>
+          <w:tcPr/>
+          <w:p>
+            <w:pPr>
+              <w:pStyle w:val="Compact"/>
+            </w:pPr>
+          </w:p>
+        </w:tc>
+        <w:tc>
+          <w:tcPr/>
+          <w:p>
+            <w:pPr>
+              <w:pStyle w:val="Compact"/>
+            </w:pPr>
+            <w:r>
+              <w:t xml:space="preserve">asked for</w:t>
+            </w:r>
+          </w:p>
+        </w:tc>
+        <w:tc>
+          <w:tcPr/>
+          <w:p>
+            <w:pPr>
+              <w:pStyle w:val="Compact"/>
+            </w:pPr>
+            <w:r>
+              <w:t xml:space="preserve">where it is in the archive</w:t>
+            </w:r>
+          </w:p>
+        </w:tc>
+      </w:tr>
+      <w:tr>
+        <w:tc>
+          <w:tcPr/>
+          <w:p>
+            <w:pPr>
+              <w:pStyle w:val="Compact"/>
+            </w:pPr>
+            <w:r>
+              <w:rPr>
+                <w:b/>
+                <w:bCs/>
+              </w:rPr>
+              <w:t xml:space="preserve">D1</w:t>
+            </w:r>
+          </w:p>
+        </w:tc>
+        <w:tc>
+          <w:tcPr/>
+          <w:p>
+            <w:pPr>
+              <w:pStyle w:val="Compact"/>
+            </w:pPr>
+            <w:r>
+              <w:t xml:space="preserve">complete runnable code, scripts, configurations, dependencies, execution instructions</w:t>
+            </w:r>
+          </w:p>
+        </w:tc>
+        <w:tc>
+          <w:tcPr/>
+          <w:p>
+            <w:pPr>
+              <w:pStyle w:val="Compact"/>
+            </w:pPr>
+            <w:r>
+              <w:rPr>
+                <w:rStyle w:val="VerbatimChar"/>
+              </w:rPr>
+              <w:t xml:space="preserve">source/source.tar.gz</w:t>
+            </w:r>
+            <w:r>
+              <w:t xml:space="preserve">, the repository at the commit in</w:t>
+            </w:r>
+            <w:r>
+              <w:t xml:space="preserve"> </w:t>
+            </w:r>
+            <w:r>
+              <w:rPr>
+                <w:rStyle w:val="VerbatimChar"/>
+              </w:rPr>
+              <w:t xml:space="preserve">MANIFEST.txt</w:t>
+            </w:r>
+            <w:r>
+              <w:t xml:space="preserve">, with</w:t>
+            </w:r>
+            <w:r>
+              <w:t xml:space="preserve"> </w:t>
+            </w:r>
+            <w:r>
+              <w:rPr>
+                <w:rStyle w:val="VerbatimChar"/>
+              </w:rPr>
+              <w:t xml:space="preserve">pyproject.toml</w:t>
+            </w:r>
+            <w:r>
+              <w:t xml:space="preserve"> </w:t>
+            </w:r>
+            <w:r>
+              <w:t xml:space="preserve">and</w:t>
+            </w:r>
+            <w:r>
+              <w:t xml:space="preserve"> </w:t>
+            </w:r>
+            <w:r>
+              <w:rPr>
+                <w:rStyle w:val="VerbatimChar"/>
+              </w:rPr>
+              <w:t xml:space="preserve">uv.lock</w:t>
+            </w:r>
+            <w:r>
+              <w:t xml:space="preserve">. Its</w:t>
+            </w:r>
+            <w:r>
+              <w:t xml:space="preserve"> </w:t>
+            </w:r>
+            <w:r>
+              <w:rPr>
+                <w:rStyle w:val="VerbatimChar"/>
+              </w:rPr>
+              <w:t xml:space="preserve">README.md</w:t>
+            </w:r>
+            <w:r>
+              <w:t xml:space="preserve"> </w:t>
+            </w:r>
+            <w:r>
+              <w:t xml:space="preserve">is the operating guide and names what every command should print</w:t>
+            </w:r>
+          </w:p>
+        </w:tc>
+      </w:tr>
+      <w:tr>
+        <w:tc>
+          <w:tcPr/>
+          <w:p>
+            <w:pPr>
+              <w:pStyle w:val="Compact"/>
+            </w:pPr>
+            <w:r>
+              <w:rPr>
+                <w:b/>
+                <w:bCs/>
+              </w:rPr>
+              <w:t xml:space="preserve">D2</w:t>
+            </w:r>
+          </w:p>
+        </w:tc>
+        <w:tc>
+          <w:tcPr/>
+          <w:p>
+            <w:pPr>
+              <w:pStyle w:val="Compact"/>
+            </w:pPr>
+            <w:r>
+              <w:t xml:space="preserve">a concise experience summary</w:t>
+            </w:r>
+          </w:p>
+        </w:tc>
+        <w:tc>
+          <w:tcPr/>
+          <w:p>
+            <w:pPr>
+              <w:pStyle w:val="Compact"/>
+            </w:pPr>
+            <w:r>
+              <w:rPr>
+                <w:rStyle w:val="VerbatimChar"/>
+              </w:rPr>
+              <w:t xml:space="preserve">experience-summary.md</w:t>
+            </w:r>
+            <w:r>
+              <w:t xml:space="preserve">.</w:t>
+            </w:r>
+            <w:r>
+              <w:t xml:space="preserve"> </w:t>
+            </w:r>
+            <w:r>
+              <w:rPr>
+                <w:rStyle w:val="VerbatimChar"/>
+              </w:rPr>
+              <w:t xml:space="preserve">sources.md</w:t>
+            </w:r>
+            <w:r>
+              <w:t xml:space="preserve"> </w:t>
+            </w:r>
+            <w:r>
+              <w:t xml:space="preserve">is the full register it distils, family by family, each rejection with the measurement that closed it</w:t>
+            </w:r>
+          </w:p>
+        </w:tc>
+      </w:tr>
+      <w:tr>
+        <w:tc>
+          <w:tcPr/>
+          <w:p>
+            <w:pPr>
+              <w:pStyle w:val="Compact"/>
+            </w:pPr>
+            <w:r>
+              <w:rPr>
+                <w:b/>
+                <w:bCs/>
+              </w:rPr>
+              <w:t xml:space="preserve">D3</w:t>
+            </w:r>
+          </w:p>
+        </w:tc>
+        <w:tc>
+          <w:tcPr/>
+          <w:p>
+            <w:pPr>
+              <w:pStyle w:val="Compact"/>
+            </w:pPr>
+            <w:r>
+              <w:t xml:space="preserve">the merge and deduplication code, overlap counts, accepted increment, reconciliation checks</w:t>
+            </w:r>
+          </w:p>
+        </w:tc>
+        <w:tc>
+          <w:tcPr/>
+          <w:p>
+            <w:pPr>
+              <w:pStyle w:val="Compact"/>
+            </w:pPr>
+            <w:r>
+              <w:t xml:space="preserve">section 8 above.</w:t>
+            </w:r>
+            <w:r>
+              <w:t xml:space="preserve"> </w:t>
+            </w:r>
+            <w:r>
+              <w:rPr>
+                <w:rStyle w:val="VerbatimChar"/>
+              </w:rPr>
+              <w:t xml:space="preserve">source/scripts/merge_against_baseline.py</w:t>
+            </w:r>
+            <w:r>
+              <w:t xml:space="preserve">, output in</w:t>
+            </w:r>
+            <w:r>
+              <w:t xml:space="preserve"> </w:t>
+            </w:r>
+            <w:r>
+              <w:rPr>
+                <w:rStyle w:val="VerbatimChar"/>
+              </w:rPr>
+              <w:t xml:space="preserve">audit/merge_stats_ark_*.csv</w:t>
+            </w:r>
+            <w:r>
+              <w:t xml:space="preserve"> </w:t>
+            </w:r>
+            <w:r>
+              <w:t xml:space="preserve">and</w:t>
+            </w:r>
+            <w:r>
+              <w:t xml:space="preserve"> </w:t>
+            </w:r>
+            <w:r>
+              <w:rPr>
+                <w:rStyle w:val="VerbatimChar"/>
+              </w:rPr>
+              <w:t xml:space="preserve">audit/merge_audit_ark_*.json</w:t>
+            </w:r>
+          </w:p>
+        </w:tc>
+      </w:tr>
+      <w:tr>
+        <w:tc>
+          <w:tcPr/>
+          <w:p>
+            <w:pPr>
+              <w:pStyle w:val="Compact"/>
+            </w:pPr>
+            <w:r>
+              <w:rPr>
+                <w:b/>
+                <w:bCs/>
+              </w:rPr>
+              <w:t xml:space="preserve">D4</w:t>
+            </w:r>
+          </w:p>
+        </w:tc>
+        <w:tc>
+          <w:tcPr/>
+          <w:p>
+            <w:pPr>
+              <w:pStyle w:val="Compact"/>
+            </w:pPr>
+            <w:r>
+              <w:t xml:space="preserve">the runnable metric code and its explanation</w:t>
+            </w:r>
+          </w:p>
+        </w:tc>
+        <w:tc>
+          <w:tcPr/>
+          <w:p>
+            <w:pPr>
+              <w:pStyle w:val="Compact"/>
+            </w:pPr>
+            <w:r>
+              <w:rPr>
+                <w:rStyle w:val="VerbatimChar"/>
+              </w:rPr>
+              <w:t xml:space="preserve">equivalent_english_domain_calculator/</w:t>
+            </w:r>
+            <w:r>
+              <w:t xml:space="preserve">, his own program vendored unmodified, explained clause by clause in</w:t>
+            </w:r>
+            <w:r>
+              <w:t xml:space="preserve"> </w:t>
+            </w:r>
+            <w:r>
+              <w:rPr>
+                <w:rStyle w:val="VerbatimChar"/>
+              </w:rPr>
+              <w:t xml:space="preserve">metric-explained.md</w:t>
+            </w:r>
+          </w:p>
+        </w:tc>
+      </w:tr>
+    </w:tbl>
+    <w:p>
+      <w:pPr>
+        <w:pStyle w:val="BodyText"/>
+      </w:pPr>
+      <w:r>
+        <w:rPr>
+          <w:rStyle w:val="VerbatimChar"/>
+        </w:rPr>
+        <w:t xml:space="preserve">verify.sh</w:t>
+      </w:r>
+      <w:r>
+        <w:t xml:space="preserve"> </w:t>
+      </w:r>
+      <w:r>
+        <w:t xml:space="preserve">checks all four inside a fresh extraction, as checks 5 to 8, so none of them can ship</w:t>
+      </w:r>
+      <w:r>
+        <w:t xml:space="preserve"> </w:t>
+      </w:r>
+      <w:r>
+        <w:t xml:space="preserve">unmet. That is deliberate rather than tidy: the one requirement in this project that was ever</w:t>
+      </w:r>
+      <w:r>
+        <w:t xml:space="preserve"> </w:t>
+      </w:r>
+      <w:r>
+        <w:t xml:space="preserve">satisfied by prose alone, the evidence wall, is also the one that broke in a shipped archive.</w:t>
+      </w:r>
+    </w:p>
+    <w:bookmarkEnd w:id="17"/>
+    <w:bookmarkEnd w:id="18"/>
     <w:sectPr>
       <w:footnotePr>
         <w:numRestart w:val="eachSect"/>

</xml_diff>

<commit_message>
Refresh the round figures after the final engine fold-in
Store frozen for packaging: collectors stopped, then export, merge and fill in one
pass so the report, the exported files and the merge audit describe the same state.

Increment 1,929,655 records and 713,481.4198 equivalent-English, 5.3395% growth.
Reconciliation 22/22, ark check ALL PASS, report 4 pages.
</commit_message>
<xml_diff>
--- a/docs/report.docx
+++ b/docs/report.docx
@@ -151,7 +151,7 @@
                 <w:b/>
                 <w:bCs/>
               </w:rPr>
-              <w:t xml:space="preserve">1,928,571</w:t>
+              <w:t xml:space="preserve">1,929,655</w:t>
             </w:r>
             <w:r>
               <w:t xml:space="preserve"> </w:t>
@@ -186,7 +186,7 @@
                 <w:b/>
                 <w:bCs/>
               </w:rPr>
-              <w:t xml:space="preserve">712,796.2234</w:t>
+              <w:t xml:space="preserve">713,481.4198</w:t>
             </w:r>
           </w:p>
         </w:tc>
@@ -215,7 +215,7 @@
                 <w:b/>
                 <w:bCs/>
               </w:rPr>
-              <w:t xml:space="preserve">5.3344%</w:t>
+              <w:t xml:space="preserve">5.3395%</w:t>
             </w:r>
           </w:p>
         </w:tc>
@@ -226,7 +226,7 @@
         <w:pStyle w:val="BodyText"/>
       </w:pPr>
       <w:r>
-        <w:t xml:space="preserve">The increment covers 1,659,521 distinct domains, of which</w:t>
+        <w:t xml:space="preserve">The increment covers 1,660,237 distinct domains, of which</w:t>
       </w:r>
       <w:r>
         <w:t xml:space="preserve"> </w:t>
@@ -450,19 +450,19 @@
               <w:jc w:val="right"/>
             </w:pPr>
             <w:r>
-              <w:t xml:space="preserve">447,015</w:t>
-            </w:r>
-          </w:p>
-        </w:tc>
-        <w:tc>
-          <w:tcPr/>
-          <w:p>
-            <w:pPr>
-              <w:pStyle w:val="Compact"/>
-              <w:jc w:val="right"/>
-            </w:pPr>
-            <w:r>
-              <w:t xml:space="preserve">668 (0.1%)</w:t>
+              <w:t xml:space="preserve">447,042</w:t>
+            </w:r>
+          </w:p>
+        </w:tc>
+        <w:tc>
+          <w:tcPr/>
+          <w:p>
+            <w:pPr>
+              <w:pStyle w:val="Compact"/>
+              <w:jc w:val="right"/>
+            </w:pPr>
+            <w:r>
+              <w:t xml:space="preserve">695 (0.2%)</w:t>
             </w:r>
           </w:p>
         </w:tc>
@@ -499,19 +499,19 @@
               <w:jc w:val="right"/>
             </w:pPr>
             <w:r>
-              <w:t xml:space="preserve">822,719</w:t>
-            </w:r>
-          </w:p>
-        </w:tc>
-        <w:tc>
-          <w:tcPr/>
-          <w:p>
-            <w:pPr>
-              <w:pStyle w:val="Compact"/>
-              <w:jc w:val="right"/>
-            </w:pPr>
-            <w:r>
-              <w:t xml:space="preserve">4,322 (0.5%)</w:t>
+              <w:t xml:space="preserve">822,812</w:t>
+            </w:r>
+          </w:p>
+        </w:tc>
+        <w:tc>
+          <w:tcPr/>
+          <w:p>
+            <w:pPr>
+              <w:pStyle w:val="Compact"/>
+              <w:jc w:val="right"/>
+            </w:pPr>
+            <w:r>
+              <w:t xml:space="preserve">4,416 (0.5%)</w:t>
             </w:r>
           </w:p>
         </w:tc>
@@ -548,19 +548,19 @@
               <w:jc w:val="right"/>
             </w:pPr>
             <w:r>
-              <w:t xml:space="preserve">145,553</w:t>
-            </w:r>
-          </w:p>
-        </w:tc>
-        <w:tc>
-          <w:tcPr/>
-          <w:p>
-            <w:pPr>
-              <w:pStyle w:val="Compact"/>
-              <w:jc w:val="right"/>
-            </w:pPr>
-            <w:r>
-              <w:t xml:space="preserve">3,454 (2.4%)</w:t>
+              <w:t xml:space="preserve">145,578</w:t>
+            </w:r>
+          </w:p>
+        </w:tc>
+        <w:tc>
+          <w:tcPr/>
+          <w:p>
+            <w:pPr>
+              <w:pStyle w:val="Compact"/>
+              <w:jc w:val="right"/>
+            </w:pPr>
+            <w:r>
+              <w:t xml:space="preserve">3,480 (2.4%)</w:t>
             </w:r>
           </w:p>
         </w:tc>
@@ -597,19 +597,19 @@
               <w:jc w:val="right"/>
             </w:pPr>
             <w:r>
-              <w:t xml:space="preserve">323,112</w:t>
-            </w:r>
-          </w:p>
-        </w:tc>
-        <w:tc>
-          <w:tcPr/>
-          <w:p>
-            <w:pPr>
-              <w:pStyle w:val="Compact"/>
-              <w:jc w:val="right"/>
-            </w:pPr>
-            <w:r>
-              <w:t xml:space="preserve">79,193 (24.5%)</w:t>
+              <w:t xml:space="preserve">324,051</w:t>
+            </w:r>
+          </w:p>
+        </w:tc>
+        <w:tc>
+          <w:tcPr/>
+          <w:p>
+            <w:pPr>
+              <w:pStyle w:val="Compact"/>
+              <w:jc w:val="right"/>
+            </w:pPr>
+            <w:r>
+              <w:t xml:space="preserve">80,145 (24.7%)</w:t>
             </w:r>
           </w:p>
         </w:tc>
@@ -658,7 +658,7 @@
                 <w:b/>
                 <w:bCs/>
               </w:rPr>
-              <w:t xml:space="preserve">1,928,583</w:t>
+              <w:t xml:space="preserve">1,929,667</w:t>
             </w:r>
           </w:p>
         </w:tc>
@@ -674,7 +674,7 @@
                 <w:b/>
                 <w:bCs/>
               </w:rPr>
-              <w:t xml:space="preserve">87,681 (4.5%)</w:t>
+              <w:t xml:space="preserve">88,780 (4.6%)</w:t>
             </w:r>
           </w:p>
         </w:tc>
@@ -695,7 +695,7 @@
         <w:t xml:space="preserve"> </w:t>
       </w:r>
       <w:r>
-        <w:t xml:space="preserve">Across the 4 rounds shipped so far plus this one, this project has added 7,064,644 domain-year records worth 3,730,807.1248 equivalent-English,</w:t>
+        <w:t xml:space="preserve">Across the 4 rounds shipped so far plus this one, this project has added 7,065,728 domain-year records worth 3,731,492.3212 equivalent-English,</w:t>
       </w:r>
       <w:r>
         <w:t xml:space="preserve"> </w:t>
@@ -705,7 +705,7 @@
           <w:b/>
           <w:bCs/>
         </w:rPr>
-        <w:t xml:space="preserve">27.9203%</w:t>
+        <w:t xml:space="preserve">27.9254%</w:t>
       </w:r>
       <w:r>
         <w:t xml:space="preserve"> </w:t>
@@ -721,7 +721,7 @@
           <w:b/>
           <w:bCs/>
         </w:rPr>
-        <w:t xml:space="preserve">6, this one 1,928,583 / 712,802</w:t>
+        <w:t xml:space="preserve">6, this one 1,929,667 / 713,487</w:t>
       </w:r>
       <w:r>
         <w:t xml:space="preserve">.</w:t>
@@ -1998,7 +1998,7 @@
               <w:jc w:val="right"/>
             </w:pPr>
             <w:r>
-              <w:t xml:space="preserve">79,186</w:t>
+              <w:t xml:space="preserve">80,270</w:t>
             </w:r>
           </w:p>
         </w:tc>
@@ -2390,7 +2390,7 @@
               <w:pStyle w:val="Compact"/>
             </w:pPr>
             <w:r>
-              <w:t xml:space="preserve">across 131,820 ingest runs</w:t>
+              <w:t xml:space="preserve">across 131,825 ingest runs</w:t>
             </w:r>
           </w:p>
         </w:tc>
@@ -2443,7 +2443,7 @@
               <w:jc w:val="right"/>
             </w:pPr>
             <w:r>
-              <w:t xml:space="preserve">1,634,267,320</w:t>
+              <w:t xml:space="preserve">1,634,272,120</w:t>
             </w:r>
           </w:p>
         </w:tc>
@@ -2505,7 +2505,7 @@
               <w:jc w:val="right"/>
             </w:pPr>
             <w:r>
-              <w:t xml:space="preserve">213,024,888</w:t>
+              <w:t xml:space="preserve">213,031,636</w:t>
             </w:r>
           </w:p>
         </w:tc>
@@ -2858,79 +2858,79 @@
               <w:jc w:val="right"/>
             </w:pPr>
             <w:r>
-              <w:t xml:space="preserve">252</w:t>
-            </w:r>
-          </w:p>
-        </w:tc>
-        <w:tc>
-          <w:tcPr/>
-          <w:p>
-            <w:pPr>
-              <w:pStyle w:val="Compact"/>
-              <w:jc w:val="right"/>
-            </w:pPr>
-            <w:r>
-              <w:t xml:space="preserve">151,890</w:t>
-            </w:r>
-          </w:p>
-        </w:tc>
-        <w:tc>
-          <w:tcPr/>
-          <w:p>
-            <w:pPr>
-              <w:pStyle w:val="Compact"/>
-              <w:jc w:val="right"/>
-            </w:pPr>
-            <w:r>
-              <w:t xml:space="preserve">133,339</w:t>
-            </w:r>
-          </w:p>
-        </w:tc>
-        <w:tc>
-          <w:tcPr/>
-          <w:p>
-            <w:pPr>
-              <w:pStyle w:val="Compact"/>
-              <w:jc w:val="right"/>
-            </w:pPr>
-            <w:r>
-              <w:t xml:space="preserve">87.8%</w:t>
-            </w:r>
-          </w:p>
-        </w:tc>
-        <w:tc>
-          <w:tcPr/>
-          <w:p>
-            <w:pPr>
-              <w:pStyle w:val="Compact"/>
-              <w:jc w:val="right"/>
-            </w:pPr>
-            <w:r>
-              <w:t xml:space="preserve">52.1%</w:t>
-            </w:r>
-          </w:p>
-        </w:tc>
-        <w:tc>
-          <w:tcPr/>
-          <w:p>
-            <w:pPr>
-              <w:pStyle w:val="Compact"/>
-              <w:jc w:val="right"/>
-            </w:pPr>
-            <w:r>
-              <w:t xml:space="preserve">133,840</w:t>
-            </w:r>
-          </w:p>
-        </w:tc>
-        <w:tc>
-          <w:tcPr/>
-          <w:p>
-            <w:pPr>
-              <w:pStyle w:val="Compact"/>
-              <w:jc w:val="right"/>
-            </w:pPr>
-            <w:r>
-              <w:t xml:space="preserve">103,671</w:t>
+              <w:t xml:space="preserve">253</w:t>
+            </w:r>
+          </w:p>
+        </w:tc>
+        <w:tc>
+          <w:tcPr/>
+          <w:p>
+            <w:pPr>
+              <w:pStyle w:val="Compact"/>
+              <w:jc w:val="right"/>
+            </w:pPr>
+            <w:r>
+              <w:t xml:space="preserve">152,394</w:t>
+            </w:r>
+          </w:p>
+        </w:tc>
+        <w:tc>
+          <w:tcPr/>
+          <w:p>
+            <w:pPr>
+              <w:pStyle w:val="Compact"/>
+              <w:jc w:val="right"/>
+            </w:pPr>
+            <w:r>
+              <w:t xml:space="preserve">133,671</w:t>
+            </w:r>
+          </w:p>
+        </w:tc>
+        <w:tc>
+          <w:tcPr/>
+          <w:p>
+            <w:pPr>
+              <w:pStyle w:val="Compact"/>
+              <w:jc w:val="right"/>
+            </w:pPr>
+            <w:r>
+              <w:t xml:space="preserve">87.7%</w:t>
+            </w:r>
+          </w:p>
+        </w:tc>
+        <w:tc>
+          <w:tcPr/>
+          <w:p>
+            <w:pPr>
+              <w:pStyle w:val="Compact"/>
+              <w:jc w:val="right"/>
+            </w:pPr>
+            <w:r>
+              <w:t xml:space="preserve">52.2%</w:t>
+            </w:r>
+          </w:p>
+        </w:tc>
+        <w:tc>
+          <w:tcPr/>
+          <w:p>
+            <w:pPr>
+              <w:pStyle w:val="Compact"/>
+              <w:jc w:val="right"/>
+            </w:pPr>
+            <w:r>
+              <w:t xml:space="preserve">134,197</w:t>
+            </w:r>
+          </w:p>
+        </w:tc>
+        <w:tc>
+          <w:tcPr/>
+          <w:p>
+            <w:pPr>
+              <w:pStyle w:val="Compact"/>
+              <w:jc w:val="right"/>
+            </w:pPr>
+            <w:r>
+              <w:t xml:space="preserve">104,344</w:t>
             </w:r>
           </w:p>
         </w:tc>
@@ -3059,31 +3059,31 @@
               <w:jc w:val="right"/>
             </w:pPr>
             <w:r>
-              <w:t xml:space="preserve">445</w:t>
-            </w:r>
-          </w:p>
-        </w:tc>
-        <w:tc>
-          <w:tcPr/>
-          <w:p>
-            <w:pPr>
-              <w:pStyle w:val="Compact"/>
-              <w:jc w:val="right"/>
-            </w:pPr>
-            <w:r>
-              <w:t xml:space="preserve">248,284</w:t>
-            </w:r>
-          </w:p>
-        </w:tc>
-        <w:tc>
-          <w:tcPr/>
-          <w:p>
-            <w:pPr>
-              <w:pStyle w:val="Compact"/>
-              <w:jc w:val="right"/>
-            </w:pPr>
-            <w:r>
-              <w:t xml:space="preserve">228,000</w:t>
+              <w:t xml:space="preserve">446</w:t>
+            </w:r>
+          </w:p>
+        </w:tc>
+        <w:tc>
+          <w:tcPr/>
+          <w:p>
+            <w:pPr>
+              <w:pStyle w:val="Compact"/>
+              <w:jc w:val="right"/>
+            </w:pPr>
+            <w:r>
+              <w:t xml:space="preserve">249,484</w:t>
+            </w:r>
+          </w:p>
+        </w:tc>
+        <w:tc>
+          <w:tcPr/>
+          <w:p>
+            <w:pPr>
+              <w:pStyle w:val="Compact"/>
+              <w:jc w:val="right"/>
+            </w:pPr>
+            <w:r>
+              <w:t xml:space="preserve">229,119</w:t>
             </w:r>
           </w:p>
         </w:tc>
@@ -3115,19 +3115,19 @@
               <w:jc w:val="right"/>
             </w:pPr>
             <w:r>
-              <w:t xml:space="preserve">230,750</w:t>
-            </w:r>
-          </w:p>
-        </w:tc>
-        <w:tc>
-          <w:tcPr/>
-          <w:p>
-            <w:pPr>
-              <w:pStyle w:val="Compact"/>
-              <w:jc w:val="right"/>
-            </w:pPr>
-            <w:r>
-              <w:t xml:space="preserve">523,371</w:t>
+              <w:t xml:space="preserve">231,915</w:t>
+            </w:r>
+          </w:p>
+        </w:tc>
+        <w:tc>
+          <w:tcPr/>
+          <w:p>
+            <w:pPr>
+              <w:pStyle w:val="Compact"/>
+              <w:jc w:val="right"/>
+            </w:pPr>
+            <w:r>
+              <w:t xml:space="preserve">525,056</w:t>
             </w:r>
           </w:p>
         </w:tc>
@@ -3160,7 +3160,7 @@
                 <w:b/>
                 <w:bCs/>
               </w:rPr>
-              <w:t xml:space="preserve">954</w:t>
+              <w:t xml:space="preserve">956</w:t>
             </w:r>
           </w:p>
         </w:tc>
@@ -3176,7 +3176,7 @@
                 <w:b/>
                 <w:bCs/>
               </w:rPr>
-              <w:t xml:space="preserve">2,702,508</w:t>
+              <w:t xml:space="preserve">2,704,212</w:t>
             </w:r>
           </w:p>
         </w:tc>
@@ -3192,7 +3192,7 @@
                 <w:b/>
                 <w:bCs/>
               </w:rPr>
-              <w:t xml:space="preserve">2,655,598</w:t>
+              <w:t xml:space="preserve">2,657,049</w:t>
             </w:r>
           </w:p>
         </w:tc>
@@ -3240,7 +3240,7 @@
                 <w:b/>
                 <w:bCs/>
               </w:rPr>
-              <w:t xml:space="preserve">430,582</w:t>
+              <w:t xml:space="preserve">432,095</w:t>
             </w:r>
           </w:p>
         </w:tc>
@@ -3256,7 +3256,7 @@
                 <w:b/>
                 <w:bCs/>
               </w:rPr>
-              <w:t xml:space="preserve">5,121,681</w:t>
+              <w:t xml:space="preserve">5,124,039</w:t>
             </w:r>
           </w:p>
         </w:tc>
@@ -3293,7 +3293,7 @@
         <w:t xml:space="preserve"> </w:t>
       </w:r>
       <w:r>
-        <w:t xml:space="preserve">of 2,702,508 queries 2,655,598 were answered (98.3%); HTTP-level failures are 3,139 (0.12%), being 0 rate limits (429), 2,155 server errors and 984 refusals (403), while</w:t>
+        <w:t xml:space="preserve">of 2,704,212 queries 2,657,049 were answered (98.3%); HTTP-level failures are 3,139 (0.12%), being 0 rate limits (429), 2,155 server errors and 984 refusals (403), while</w:t>
       </w:r>
       <w:r>
         <w:t xml:space="preserve"> </w:t>
@@ -3303,10 +3303,10 @@
           <w:b/>
           <w:bCs/>
         </w:rPr>
-        <w:t xml:space="preserve">transport-level failures are 43,771 (1.62%)</w:t>
-      </w:r>
-      <w:r>
-        <w:t xml:space="preserve">, 31,197 refused or reset and 12,574 timed out.</w:t>
+        <w:t xml:space="preserve">transport-level failures are 44,024 (1.63%)</w:t>
+      </w:r>
+      <w:r>
+        <w:t xml:space="preserve">, 31,362 refused or reset and 12,662 timed out.</w:t>
       </w:r>
       <w:r>
         <w:t xml:space="preserve"> </w:t>

</xml_diff>

<commit_message>
Select the merge audit in one place, since two sites disagreeing broke the report twice
The packaging guard caught section 8 still reporting a 769,438 record increment and
488,722 equivalent-English while section 1 read 1,929,655 and 713,481. Same cause as
earlier today and a second site: merge_reconciliation globbed the audits and took the
alphabetically last, so merge_audit_ark_20260824c.json beat a freshly written
merge_audit_ark.json. Fixing accepted_totals had not fixed this one.

Both now go through one newest_audit helper that selects by modification time, so the
two cannot drift apart again. The docstring records both occurrences, because the
failure mode is that the fix appears to work.

Figures on the frozen store: increment 1,929,655 records, 713,481.4198
equivalent-English, 5.3395% growth, reconciliation 22/22, ark check ALL PASS.
</commit_message>
<xml_diff>
--- a/docs/report.docx
+++ b/docs/report.docx
@@ -3965,7 +3965,7 @@
               <w:jc w:val="right"/>
             </w:pPr>
             <w:r>
-              <w:t xml:space="preserve">769,438</w:t>
+              <w:t xml:space="preserve">1,929,655</w:t>
             </w:r>
           </w:p>
         </w:tc>
@@ -4039,7 +4039,7 @@
                 <w:b/>
                 <w:bCs/>
               </w:rPr>
-              <w:t xml:space="preserve">769,438</w:t>
+              <w:t xml:space="preserve">1,929,655</w:t>
             </w:r>
           </w:p>
         </w:tc>
@@ -4055,7 +4055,7 @@
                 <w:b/>
                 <w:bCs/>
               </w:rPr>
-              <w:t xml:space="preserve">488,722.0745</w:t>
+              <w:t xml:space="preserve">713,481.4198</w:t>
             </w:r>
           </w:p>
         </w:tc>
@@ -4080,19 +4080,19 @@
               <w:jc w:val="right"/>
             </w:pPr>
             <w:r>
-              <w:t xml:space="preserve">25,834,419</w:t>
-            </w:r>
-          </w:p>
-        </w:tc>
-        <w:tc>
-          <w:tcPr/>
-          <w:p>
-            <w:pPr>
-              <w:pStyle w:val="Compact"/>
-              <w:jc w:val="right"/>
-            </w:pPr>
-            <w:r>
-              <w:t xml:space="preserve">13,851,090.9537</w:t>
+              <w:t xml:space="preserve">26,994,636</w:t>
+            </w:r>
+          </w:p>
+        </w:tc>
+        <w:tc>
+          <w:tcPr/>
+          <w:p>
+            <w:pPr>
+              <w:pStyle w:val="Compact"/>
+              <w:jc w:val="right"/>
+            </w:pPr>
+            <w:r>
+              <w:t xml:space="preserve">14,075,850.2990</w:t>
             </w:r>
           </w:p>
         </w:tc>

</xml_diff>

<commit_message>
Regenerate the report, the decision sheet and the submissions index
The index still described round 6 by its 2026-08-18 build, 17,733 pairs at
0.118894% against `merged260817-2`. The decision sheet still listed
`ripe_dbase_changed` as waiting on a word after it was approved and banked.
`report-sendable.md` was a full round behind. All three are generated.
</commit_message>
<xml_diff>
--- a/docs/report.docx
+++ b/docs/report.docx
@@ -2,7 +2,7 @@
 <file path=word/document.xml><?xml version="1.0" encoding="utf-8"?>
 <w:document xmlns:w="http://schemas.openxmlformats.org/wordprocessingml/2006/main" xmlns:m="http://schemas.openxmlformats.org/officeDocument/2006/math" xmlns:r="http://schemas.openxmlformats.org/officeDocument/2006/relationships" xmlns:o="urn:schemas-microsoft-com:office:office" xmlns:v="urn:schemas-microsoft-com:vml" xmlns:w10="urn:schemas-microsoft-com:office:word" xmlns:a="http://schemas.openxmlformats.org/drawingml/2006/main" xmlns:pic="http://schemas.openxmlformats.org/drawingml/2006/picture" xmlns:wp="http://schemas.openxmlformats.org/drawingml/2006/wordprocessingDrawing">
   <w:body>
-    <w:bookmarkStart w:id="19" w:name="internet-digital-ark-round-6"/>
+    <w:bookmarkStart w:id="17" w:name="internet-digital-ark-round-6"/>
     <w:p>
       <w:pPr>
         <w:pStyle w:val="Heading1"/>
@@ -263,10 +263,11 @@
         <w:tblLook w:firstRow="1" w:lastRow="0" w:firstColumn="0" w:lastColumn="0" w:noHBand="0" w:noVBand="0" w:val="0020"/>
       </w:tblPr>
       <w:tblGrid>
-        <w:gridCol w:w="1980"/>
-        <w:gridCol w:w="1980"/>
-        <w:gridCol w:w="1980"/>
-        <w:gridCol w:w="1980"/>
+        <w:gridCol w:w="1584"/>
+        <w:gridCol w:w="1584"/>
+        <w:gridCol w:w="1584"/>
+        <w:gridCol w:w="1584"/>
+        <w:gridCol w:w="1584"/>
       </w:tblGrid>
       <w:tr>
         <w:trPr>
@@ -291,7 +292,7 @@
               <w:jc w:val="right"/>
             </w:pPr>
             <w:r>
-              <w:t xml:space="preserve">merged260821, this counting unit</w:t>
+              <w:t xml:space="preserve">merged260821</w:t>
             </w:r>
           </w:p>
         </w:tc>
@@ -315,7 +316,19 @@
               <w:jc w:val="right"/>
             </w:pPr>
             <w:r>
-              <w:t xml:space="preserve">Capture-backed</w:t>
+              <w:t xml:space="preserve">Merged</w:t>
+            </w:r>
+          </w:p>
+        </w:tc>
+        <w:tc>
+          <w:tcPr/>
+          <w:p>
+            <w:pPr>
+              <w:pStyle w:val="Compact"/>
+              <w:jc w:val="right"/>
+            </w:pPr>
+            <w:r>
+              <w:t xml:space="preserve">Equivalent-English added</w:t>
             </w:r>
           </w:p>
         </w:tc>
@@ -340,7 +353,7 @@
               <w:jc w:val="right"/>
             </w:pPr>
             <w:r>
-              <w:t xml:space="preserve">754,672</w:t>
+              <w:t xml:space="preserve">866,121</w:t>
             </w:r>
           </w:p>
         </w:tc>
@@ -364,7 +377,19 @@
               <w:jc w:val="right"/>
             </w:pPr>
             <w:r>
-              <w:t xml:space="preserve">7 (0.0%)</w:t>
+              <w:t xml:space="preserve">921,588</w:t>
+            </w:r>
+          </w:p>
+        </w:tc>
+        <w:tc>
+          <w:tcPr/>
+          <w:p>
+            <w:pPr>
+              <w:pStyle w:val="Compact"/>
+              <w:jc w:val="right"/>
+            </w:pPr>
+            <w:r>
+              <w:t xml:space="preserve">26,420.9323</w:t>
             </w:r>
           </w:p>
         </w:tc>
@@ -389,7 +414,7 @@
               <w:jc w:val="right"/>
             </w:pPr>
             <w:r>
-              <w:t xml:space="preserve">1,791,900</w:t>
+              <w:t xml:space="preserve">1,891,386</w:t>
             </w:r>
           </w:p>
         </w:tc>
@@ -413,7 +438,19 @@
               <w:jc w:val="right"/>
             </w:pPr>
             <w:r>
-              <w:t xml:space="preserve">37 (0.0%)</w:t>
+              <w:t xml:space="preserve">2,026,103</w:t>
+            </w:r>
+          </w:p>
+        </w:tc>
+        <w:tc>
+          <w:tcPr/>
+          <w:p>
+            <w:pPr>
+              <w:pStyle w:val="Compact"/>
+              <w:jc w:val="right"/>
+            </w:pPr>
+            <w:r>
+              <w:t xml:space="preserve">52,829.5998</w:t>
             </w:r>
           </w:p>
         </w:tc>
@@ -438,31 +475,43 @@
               <w:jc w:val="right"/>
             </w:pPr>
             <w:r>
-              <w:t xml:space="preserve">2,233,240</w:t>
-            </w:r>
-          </w:p>
-        </w:tc>
-        <w:tc>
-          <w:tcPr/>
-          <w:p>
-            <w:pPr>
-              <w:pStyle w:val="Compact"/>
-              <w:jc w:val="right"/>
-            </w:pPr>
-            <w:r>
-              <w:t xml:space="preserve">447,042</w:t>
-            </w:r>
-          </w:p>
-        </w:tc>
-        <w:tc>
-          <w:tcPr/>
-          <w:p>
-            <w:pPr>
-              <w:pStyle w:val="Compact"/>
-              <w:jc w:val="right"/>
-            </w:pPr>
-            <w:r>
-              <w:t xml:space="preserve">695 (0.2%)</w:t>
+              <w:t xml:space="preserve">2,542,561</w:t>
+            </w:r>
+          </w:p>
+        </w:tc>
+        <w:tc>
+          <w:tcPr/>
+          <w:p>
+            <w:pPr>
+              <w:pStyle w:val="Compact"/>
+              <w:jc w:val="right"/>
+            </w:pPr>
+            <w:r>
+              <w:t xml:space="preserve">447,039</w:t>
+            </w:r>
+          </w:p>
+        </w:tc>
+        <w:tc>
+          <w:tcPr/>
+          <w:p>
+            <w:pPr>
+              <w:pStyle w:val="Compact"/>
+              <w:jc w:val="right"/>
+            </w:pPr>
+            <w:r>
+              <w:t xml:space="preserve">2,989,600</w:t>
+            </w:r>
+          </w:p>
+        </w:tc>
+        <w:tc>
+          <w:tcPr/>
+          <w:p>
+            <w:pPr>
+              <w:pStyle w:val="Compact"/>
+              <w:jc w:val="right"/>
+            </w:pPr>
+            <w:r>
+              <w:t xml:space="preserve">129,096.5233</w:t>
             </w:r>
           </w:p>
         </w:tc>
@@ -487,31 +536,43 @@
               <w:jc w:val="right"/>
             </w:pPr>
             <w:r>
-              <w:t xml:space="preserve">4,612,976</w:t>
-            </w:r>
-          </w:p>
-        </w:tc>
-        <w:tc>
-          <w:tcPr/>
-          <w:p>
-            <w:pPr>
-              <w:pStyle w:val="Compact"/>
-              <w:jc w:val="right"/>
-            </w:pPr>
-            <w:r>
-              <w:t xml:space="preserve">822,812</w:t>
-            </w:r>
-          </w:p>
-        </w:tc>
-        <w:tc>
-          <w:tcPr/>
-          <w:p>
-            <w:pPr>
-              <w:pStyle w:val="Compact"/>
-              <w:jc w:val="right"/>
-            </w:pPr>
-            <w:r>
-              <w:t xml:space="preserve">4,416 (0.5%)</w:t>
+              <w:t xml:space="preserve">5,118,649</w:t>
+            </w:r>
+          </w:p>
+        </w:tc>
+        <w:tc>
+          <w:tcPr/>
+          <w:p>
+            <w:pPr>
+              <w:pStyle w:val="Compact"/>
+              <w:jc w:val="right"/>
+            </w:pPr>
+            <w:r>
+              <w:t xml:space="preserve">822,806</w:t>
+            </w:r>
+          </w:p>
+        </w:tc>
+        <w:tc>
+          <w:tcPr/>
+          <w:p>
+            <w:pPr>
+              <w:pStyle w:val="Compact"/>
+              <w:jc w:val="right"/>
+            </w:pPr>
+            <w:r>
+              <w:t xml:space="preserve">5,941,455</w:t>
+            </w:r>
+          </w:p>
+        </w:tc>
+        <w:tc>
+          <w:tcPr/>
+          <w:p>
+            <w:pPr>
+              <w:pStyle w:val="Compact"/>
+              <w:jc w:val="right"/>
+            </w:pPr>
+            <w:r>
+              <w:t xml:space="preserve">205,286.2928</w:t>
             </w:r>
           </w:p>
         </w:tc>
@@ -536,31 +597,43 @@
               <w:jc w:val="right"/>
             </w:pPr>
             <w:r>
-              <w:t xml:space="preserve">9,471,543</w:t>
-            </w:r>
-          </w:p>
-        </w:tc>
-        <w:tc>
-          <w:tcPr/>
-          <w:p>
-            <w:pPr>
-              <w:pStyle w:val="Compact"/>
-              <w:jc w:val="right"/>
-            </w:pPr>
-            <w:r>
-              <w:t xml:space="preserve">145,578</w:t>
-            </w:r>
-          </w:p>
-        </w:tc>
-        <w:tc>
-          <w:tcPr/>
-          <w:p>
-            <w:pPr>
-              <w:pStyle w:val="Compact"/>
-              <w:jc w:val="right"/>
-            </w:pPr>
-            <w:r>
-              <w:t xml:space="preserve">3,480 (2.4%)</w:t>
+              <w:t xml:space="preserve">9,670,871</w:t>
+            </w:r>
+          </w:p>
+        </w:tc>
+        <w:tc>
+          <w:tcPr/>
+          <w:p>
+            <w:pPr>
+              <w:pStyle w:val="Compact"/>
+              <w:jc w:val="right"/>
+            </w:pPr>
+            <w:r>
+              <w:t xml:space="preserve">145,577</w:t>
+            </w:r>
+          </w:p>
+        </w:tc>
+        <w:tc>
+          <w:tcPr/>
+          <w:p>
+            <w:pPr>
+              <w:pStyle w:val="Compact"/>
+              <w:jc w:val="right"/>
+            </w:pPr>
+            <w:r>
+              <w:t xml:space="preserve">9,816,448</w:t>
+            </w:r>
+          </w:p>
+        </w:tc>
+        <w:tc>
+          <w:tcPr/>
+          <w:p>
+            <w:pPr>
+              <w:pStyle w:val="Compact"/>
+              <w:jc w:val="right"/>
+            </w:pPr>
+            <w:r>
+              <w:t xml:space="preserve">91,406.4015</w:t>
             </w:r>
           </w:p>
         </w:tc>
@@ -585,31 +658,43 @@
               <w:jc w:val="right"/>
             </w:pPr>
             <w:r>
-              <w:t xml:space="preserve">4,550,999</w:t>
-            </w:r>
-          </w:p>
-        </w:tc>
-        <w:tc>
-          <w:tcPr/>
-          <w:p>
-            <w:pPr>
-              <w:pStyle w:val="Compact"/>
-              <w:jc w:val="right"/>
-            </w:pPr>
-            <w:r>
-              <w:t xml:space="preserve">324,051</w:t>
-            </w:r>
-          </w:p>
-        </w:tc>
-        <w:tc>
-          <w:tcPr/>
-          <w:p>
-            <w:pPr>
-              <w:pStyle w:val="Compact"/>
-              <w:jc w:val="right"/>
-            </w:pPr>
-            <w:r>
-              <w:t xml:space="preserve">80,145 (24.7%)</w:t>
+              <w:t xml:space="preserve">4,975,393</w:t>
+            </w:r>
+          </w:p>
+        </w:tc>
+        <w:tc>
+          <w:tcPr/>
+          <w:p>
+            <w:pPr>
+              <w:pStyle w:val="Compact"/>
+              <w:jc w:val="right"/>
+            </w:pPr>
+            <w:r>
+              <w:t xml:space="preserve">324,049</w:t>
+            </w:r>
+          </w:p>
+        </w:tc>
+        <w:tc>
+          <w:tcPr/>
+          <w:p>
+            <w:pPr>
+              <w:pStyle w:val="Compact"/>
+              <w:jc w:val="right"/>
+            </w:pPr>
+            <w:r>
+              <w:t xml:space="preserve">5,299,442</w:t>
+            </w:r>
+          </w:p>
+        </w:tc>
+        <w:tc>
+          <w:tcPr/>
+          <w:p>
+            <w:pPr>
+              <w:pStyle w:val="Compact"/>
+              <w:jc w:val="right"/>
+            </w:pPr>
+            <w:r>
+              <w:t xml:space="preserve">208,441.6701</w:t>
             </w:r>
           </w:p>
         </w:tc>
@@ -642,7 +727,7 @@
                 <w:b/>
                 <w:bCs/>
               </w:rPr>
-              <w:t xml:space="preserve">23,415,330</w:t>
+              <w:t xml:space="preserve">25,064,981</w:t>
             </w:r>
           </w:p>
         </w:tc>
@@ -658,7 +743,7 @@
                 <w:b/>
                 <w:bCs/>
               </w:rPr>
-              <w:t xml:space="preserve">1,929,667</w:t>
+              <w:t xml:space="preserve">1,929,655</w:t>
             </w:r>
           </w:p>
         </w:tc>
@@ -674,7 +759,23 @@
                 <w:b/>
                 <w:bCs/>
               </w:rPr>
-              <w:t xml:space="preserve">88,780 (4.6%)</w:t>
+              <w:t xml:space="preserve">26,994,636</w:t>
+            </w:r>
+          </w:p>
+        </w:tc>
+        <w:tc>
+          <w:tcPr/>
+          <w:p>
+            <w:pPr>
+              <w:pStyle w:val="Compact"/>
+              <w:jc w:val="right"/>
+            </w:pPr>
+            <w:r>
+              <w:rPr>
+                <w:b/>
+                <w:bCs/>
+              </w:rPr>
+              <w:t xml:space="preserve">713,481.4198</w:t>
             </w:r>
           </w:p>
         </w:tc>
@@ -695,7 +796,7 @@
         <w:t xml:space="preserve"> </w:t>
       </w:r>
       <w:r>
-        <w:t xml:space="preserve">Across the 4 rounds shipped so far plus this one, this project has added 7,065,728 domain-year records worth 3,731,492.3212 equivalent-English,</w:t>
+        <w:t xml:space="preserve">Summing the increases you have awarded, which is how the update log of 2026-08-18 defines the score: 1.659986%, 10.730988%, 14.901054% and this round's 5.3395% give</w:t>
       </w:r>
       <w:r>
         <w:t xml:space="preserve"> </w:t>
@@ -705,26 +806,10 @@
           <w:b/>
           <w:bCs/>
         </w:rPr>
-        <w:t xml:space="preserve">27.9254%</w:t>
-      </w:r>
-      <w:r>
-        <w:t xml:space="preserve"> </w:t>
-      </w:r>
-      <w:r>
-        <w:t xml:space="preserve">of the 13,362,368.8792 the corpus holds today. Records / equivalent-English by round, each at the figure you ACCEPTED rather than the one submitted: round 1 1,429,524 / 756,559; round 3 151,949 / 91,815; round 4 946,266 / 603,402; round 5 2,608,322 / 1,566,230;</w:t>
-      </w:r>
-      <w:r>
-        <w:t xml:space="preserve"> </w:t>
-      </w:r>
-      <w:r>
-        <w:rPr>
-          <w:b/>
-          <w:bCs/>
-        </w:rPr>
-        <w:t xml:space="preserve">6, this one 1,929,667 / 713,487</w:t>
-      </w:r>
-      <w:r>
-        <w:t xml:space="preserve">.</w:t>
+        <w:t xml:space="preserve">32.6316%</w:t>
+      </w:r>
+      <w:r>
+        <w:t xml:space="preserve">, with round 1's 1,429,524 records held out because it was awarded at 17.38% on records before the equivalent-English metric existed.</w:t>
       </w:r>
     </w:p>
     <w:bookmarkEnd w:id="9"/>
@@ -742,19 +827,19 @@
         <w:pStyle w:val="FirstParagraph"/>
       </w:pPr>
       <w:r>
-        <w:t xml:space="preserve">Every source below was admitted for the first time in this round. Each row gives the evidence type,</w:t>
-      </w:r>
-      <w:r>
-        <w:t xml:space="preserve"> </w:t>
-      </w:r>
-      <w:r>
-        <w:t xml:space="preserve">what dates one item, and where the artifact is, so any of them can be opened and checked. Sources not</w:t>
-      </w:r>
-      <w:r>
-        <w:t xml:space="preserve"> </w:t>
-      </w:r>
-      <w:r>
-        <w:t xml:space="preserve">listed here were approved in earlier rounds and are unchanged.</w:t>
+        <w:t xml:space="preserve">Every source below was admitted for the first time in this round; everything else was approved in an</w:t>
+      </w:r>
+      <w:r>
+        <w:t xml:space="preserve"> </w:t>
+      </w:r>
+      <w:r>
+        <w:t xml:space="preserve">earlier round and is unchanged. Each row gives what dates one item and where the artifact is, so any</w:t>
+      </w:r>
+      <w:r>
+        <w:t xml:space="preserve"> </w:t>
+      </w:r>
+      <w:r>
+        <w:t xml:space="preserve">of them can be opened and checked.</w:t>
       </w:r>
     </w:p>
     <w:tbl>
@@ -1875,13 +1960,7 @@
         <w:t xml:space="preserve"> </w:t>
       </w:r>
       <w:r>
-        <w:t xml:space="preserve">evidences that year and no other, which is what rule 6 asks for and a creation date cannot give. Its</w:t>
-      </w:r>
-      <w:r>
-        <w:t xml:space="preserve"> </w:t>
-      </w:r>
-      <w:r>
-        <w:t xml:space="preserve">top eight changer addresses are ccTLD registry role accounts, DENIC alone 49.4%.</w:t>
+        <w:t xml:space="preserve">evidences that year and no other, which is what rule 6 asks for and a creation date cannot give.</w:t>
       </w:r>
     </w:p>
     <w:p>
@@ -1898,13 +1977,31 @@
         <w:t xml:space="preserve"> </w:t>
       </w:r>
       <w:r>
-        <w:t xml:space="preserve">ships beside this report and carries every source, admitted and rejected, with its</w:t>
-      </w:r>
-      <w:r>
-        <w:t xml:space="preserve"> </w:t>
-      </w:r>
-      <w:r>
-        <w:t xml:space="preserve">evidence type, location, timestamp, extraction method and measurement.</w:t>
+        <w:t xml:space="preserve">ships beside this report and carries every source, admitted and rejected, with the</w:t>
+      </w:r>
+      <w:r>
+        <w:t xml:space="preserve"> </w:t>
+      </w:r>
+      <w:r>
+        <w:t xml:space="preserve">argument that dates its items. The rules deciding what counts as one valid, non-duplicated addition</w:t>
+      </w:r>
+      <w:r>
+        <w:t xml:space="preserve"> </w:t>
+      </w:r>
+      <w:r>
+        <w:t xml:space="preserve">of ours are in</w:t>
+      </w:r>
+      <w:r>
+        <w:t xml:space="preserve"> </w:t>
+      </w:r>
+      <w:r>
+        <w:rPr>
+          <w:rStyle w:val="VerbatimChar"/>
+        </w:rPr>
+        <w:t xml:space="preserve">source/src/ark/canonical.py</w:t>
+      </w:r>
+      <w:r>
+        <w:t xml:space="preserve">, with their tests, and apply to our additions only.</w:t>
       </w:r>
     </w:p>
     <w:bookmarkEnd w:id="11"/>
@@ -2011,7 +2108,22 @@
               <w:pStyle w:val="Compact"/>
             </w:pPr>
             <w:r>
-              <w:t xml:space="preserve">the RDAP sweep over the candidate pool</w:t>
+              <w:t xml:space="preserve">the RDAP sweep over generated sibling names and over</w:t>
+            </w:r>
+            <w:r>
+              <w:t xml:space="preserve"> </w:t>
+            </w:r>
+            <w:r>
+              <w:rPr>
+                <w:rStyle w:val="VerbatimChar"/>
+              </w:rPr>
+              <w:t xml:space="preserve">.uk</w:t>
+            </w:r>
+            <w:r>
+              <w:t xml:space="preserve"> </w:t>
+            </w:r>
+            <w:r>
+              <w:t xml:space="preserve">we already hold</w:t>
             </w:r>
           </w:p>
         </w:tc>
@@ -2088,7 +2200,55 @@
         <w:rPr>
           <w:rStyle w:val="VerbatimChar"/>
         </w:rPr>
-        <w:t xml:space="preserve">artifact_listing`, `cdx_timestamp`, `dated_directory`, `link_source`, `whois_creation</w:t>
+        <w:t xml:space="preserve">artifact_listing</w:t>
+      </w:r>
+      <w:r>
+        <w:t xml:space="preserve">,</w:t>
+      </w:r>
+      <w:r>
+        <w:t xml:space="preserve"> </w:t>
+      </w:r>
+      <w:r>
+        <w:rPr>
+          <w:rStyle w:val="VerbatimChar"/>
+        </w:rPr>
+        <w:t xml:space="preserve">cdx_timestamp</w:t>
+      </w:r>
+      <w:r>
+        <w:t xml:space="preserve">,</w:t>
+      </w:r>
+      <w:r>
+        <w:t xml:space="preserve"> </w:t>
+      </w:r>
+      <w:r>
+        <w:rPr>
+          <w:rStyle w:val="VerbatimChar"/>
+        </w:rPr>
+        <w:t xml:space="preserve">dated_directory</w:t>
+      </w:r>
+      <w:r>
+        <w:t xml:space="preserve">,</w:t>
+      </w:r>
+      <w:r>
+        <w:t xml:space="preserve"> </w:t>
+      </w:r>
+      <w:r>
+        <w:rPr>
+          <w:rStyle w:val="VerbatimChar"/>
+        </w:rPr>
+        <w:t xml:space="preserve">link_source</w:t>
+      </w:r>
+      <w:r>
+        <w:t xml:space="preserve">,</w:t>
+      </w:r>
+      <w:r>
+        <w:t xml:space="preserve"> </w:t>
+      </w:r>
+      <w:r>
+        <w:rPr>
+          <w:rStyle w:val="VerbatimChar"/>
+        </w:rPr>
+        <w:t xml:space="preserve">whois_creation</w:t>
       </w:r>
       <w:r>
         <w:t xml:space="preserve">, each a machine-written record asserting a state at an</w:t>
@@ -2164,13 +2324,13 @@
       </w:r>
     </w:p>
     <w:bookmarkEnd w:id="12"/>
-    <w:bookmarkStart w:id="13" w:name="Xabc2a0d801a85943d7ac34d0f4f56051ab0b5a2"/>
+    <w:bookmarkStart w:id="13" w:name="X20f10262337b30b70279ee1a04243a08f16c5f5"/>
     <w:p>
       <w:pPr>
         <w:pStyle w:val="Heading2"/>
       </w:pPr>
       <w:r>
-        <w:t xml:space="preserve">4. Counting unit, normalisation and what is dropped</w:t>
+        <w:t xml:space="preserve">4. How the discovery ran, and where the human sits</w:t>
       </w:r>
     </w:p>
     <w:p>
@@ -2178,26 +2338,26 @@
         <w:pStyle w:val="FirstParagraph"/>
       </w:pPr>
       <w:r>
+        <w:t xml:space="preserve">The system runs unattended for hours at a time and</w:t>
+      </w:r>
+      <w:r>
+        <w:t xml:space="preserve"> </w:t>
+      </w:r>
+      <w:r>
         <w:rPr>
           <w:b/>
           <w:bCs/>
         </w:rPr>
-        <w:t xml:space="preserve">The counting unit is the (registrable domain, year) pair</w:t>
-      </w:r>
-      <w:r>
-        <w:t xml:space="preserve">, deduplicated on the lowercased line</w:t>
-      </w:r>
-      <w:r>
-        <w:t xml:space="preserve"> </w:t>
-      </w:r>
-      <w:r>
-        <w:t xml:space="preserve">within each year. Every name from every source passes through one function before reaching the</w:t>
-      </w:r>
-      <w:r>
-        <w:t xml:space="preserve"> </w:t>
-      </w:r>
-      <w:r>
-        <w:t xml:space="preserve">database, so the dedup key is identical across sources.</w:t>
+        <w:t xml:space="preserve">never assigns a year on its own judgement</w:t>
+      </w:r>
+      <w:r>
+        <w:t xml:space="preserve">.</w:t>
+      </w:r>
+      <w:r>
+        <w:t xml:space="preserve"> </w:t>
+      </w:r>
+      <w:r>
+        <w:t xml:space="preserve">That split is the design, and it is what makes the output checkable.</w:t>
       </w:r>
     </w:p>
     <w:p>
@@ -2209,112 +2369,25 @@
           <w:b/>
           <w:bCs/>
         </w:rPr>
-        <w:t xml:space="preserve">Normalisation, in order:</w:t>
-      </w:r>
-      <w:r>
-        <w:t xml:space="preserve"> </w:t>
-      </w:r>
-      <w:r>
-        <w:t xml:space="preserve">percent-decode, trim, lowercase; strip scheme,</w:t>
-      </w:r>
-      <w:r>
-        <w:t xml:space="preserve"> </w:t>
-      </w:r>
-      <w:r>
-        <w:rPr>
-          <w:rStyle w:val="VerbatimChar"/>
-        </w:rPr>
-        <w:t xml:space="preserve">//</w:t>
-      </w:r>
-      <w:r>
-        <w:t xml:space="preserve">, path, query,</w:t>
-      </w:r>
-      <w:r>
-        <w:t xml:space="preserve"> </w:t>
-      </w:r>
-      <w:r>
-        <w:t xml:space="preserve">fragment, userinfo, port, and stray leading or trailing</w:t>
-      </w:r>
-      <w:r>
-        <w:t xml:space="preserve"> </w:t>
-      </w:r>
-      <w:r>
-        <w:rPr>
-          <w:rStyle w:val="VerbatimChar"/>
-        </w:rPr>
-        <w:t xml:space="preserve">.</w:t>
-      </w:r>
-      <w:r>
-        <w:t xml:space="preserve"> </w:t>
-      </w:r>
-      <w:r>
-        <w:t xml:space="preserve">and</w:t>
-      </w:r>
-      <w:r>
-        <w:t xml:space="preserve"> </w:t>
-      </w:r>
-      <w:r>
-        <w:rPr>
-          <w:rStyle w:val="VerbatimChar"/>
-        </w:rPr>
-        <w:t xml:space="preserve">,</w:t>
-      </w:r>
-      <w:r>
-        <w:t xml:space="preserve"> </w:t>
-      </w:r>
-      <w:r>
-        <w:t xml:space="preserve">but never a hyphen; then reduce to</w:t>
-      </w:r>
-      <w:r>
-        <w:t xml:space="preserve"> </w:t>
-      </w:r>
-      <w:r>
-        <w:t xml:space="preserve">the registrable domain with a pinned Public Suffix List plus historical ccTLDs, so</w:t>
-      </w:r>
-      <w:r>
-        <w:t xml:space="preserve"> </w:t>
-      </w:r>
-      <w:r>
-        <w:rPr>
-          <w:rStyle w:val="VerbatimChar"/>
-        </w:rPr>
-        <w:t xml:space="preserve">ci.anchorage.ak.us</w:t>
-      </w:r>
-      <w:r>
-        <w:t xml:space="preserve"> </w:t>
-      </w:r>
-      <w:r>
-        <w:t xml:space="preserve">becomes</w:t>
-      </w:r>
-      <w:r>
-        <w:t xml:space="preserve"> </w:t>
-      </w:r>
-      <w:r>
-        <w:rPr>
-          <w:rStyle w:val="VerbatimChar"/>
-        </w:rPr>
-        <w:t xml:space="preserve">anchorage.ak.us</w:t>
-      </w:r>
-      <w:r>
-        <w:t xml:space="preserve"> </w:t>
-      </w:r>
-      <w:r>
-        <w:t xml:space="preserve">while</w:t>
-      </w:r>
-      <w:r>
-        <w:t xml:space="preserve"> </w:t>
-      </w:r>
-      <w:r>
-        <w:rPr>
-          <w:rStyle w:val="VerbatimChar"/>
-        </w:rPr>
-        <w:t xml:space="preserve">k12.ak.us</w:t>
-      </w:r>
-      <w:r>
-        <w:t xml:space="preserve"> </w:t>
-      </w:r>
-      <w:r>
-        <w:t xml:space="preserve">is refused as a public suffix in its own right.</w:t>
+        <w:t xml:space="preserve">What worked and what did not.</w:t>
+      </w:r>
+      <w:r>
+        <w:t xml:space="preserve"> </w:t>
+      </w:r>
+      <w:r>
+        <w:t xml:space="preserve">One clear written objective from the supervisor, then unattended</w:t>
+      </w:r>
+      <w:r>
+        <w:t xml:space="preserve"> </w:t>
+      </w:r>
+      <w:r>
+        <w:t xml:space="preserve">running, worked: it is how this round's sources were found. Detached collectors holding an absolute</w:t>
+      </w:r>
+      <w:r>
+        <w:t xml:space="preserve"> </w:t>
+      </w:r>
+      <w:r>
+        <w:t xml:space="preserve">epoch deadline worked, and kept collecting through a day when the agent could not be reached.</w:t>
       </w:r>
       <w:r>
         <w:t xml:space="preserve"> </w:t>
@@ -2324,25 +2397,10 @@
           <w:b/>
           <w:bCs/>
         </w:rPr>
-        <w:t xml:space="preserve">Validity:</w:t>
-      </w:r>
-      <w:r>
-        <w:t xml:space="preserve"> </w:t>
-      </w:r>
-      <w:r>
-        <w:t xml:space="preserve">drop the line if it is empty, an IPv4 literal, a reverse-DNS zone, syntactically invalid,</w:t>
-      </w:r>
-      <w:r>
-        <w:t xml:space="preserve"> </w:t>
-      </w:r>
-      <w:r>
-        <w:t xml:space="preserve">carries no known public suffix, is a bare public suffix, or has an invalid character in the registered</w:t>
-      </w:r>
-      <w:r>
-        <w:t xml:space="preserve"> </w:t>
-      </w:r>
-      <w:r>
-        <w:t xml:space="preserve">label.</w:t>
+        <w:t xml:space="preserve">Scheduled wake-ups did not</w:t>
+      </w:r>
+      <w:r>
+        <w:t xml:space="preserve">: the agent answered only some firings.</w:t>
       </w:r>
       <w:r>
         <w:t xml:space="preserve"> </w:t>
@@ -2352,1009 +2410,517 @@
           <w:b/>
           <w:bCs/>
         </w:rPr>
-        <w:t xml:space="preserve">Salvage</w:t>
-      </w:r>
-      <w:r>
-        <w:t xml:space="preserve"> </w:t>
-      </w:r>
-      <w:r>
-        <w:t xml:space="preserve">is the same operation on a dirty line, so a URL or mail address is reduced rather</w:t>
-      </w:r>
-      <w:r>
-        <w:t xml:space="preserve"> </w:t>
-      </w:r>
-      <w:r>
-        <w:t xml:space="preserve">than discarded.</w:t>
+        <w:t xml:space="preserve">A self-scheduling loop did</w:t>
+      </w:r>
+      <w:r>
+        <w:rPr>
+          <w:b/>
+          <w:bCs/>
+        </w:rPr>
+        <w:t xml:space="preserve"> </w:t>
+      </w:r>
+      <w:r>
+        <w:rPr>
+          <w:b/>
+          <w:bCs/>
+        </w:rPr>
+        <w:t xml:space="preserve">not hold</w:t>
+      </w:r>
+      <w:r>
+        <w:t xml:space="preserve"> </w:t>
+      </w:r>
+      <w:r>
+        <w:t xml:space="preserve">either, tried once. So the durable pattern is a human-written objective plus processes</w:t>
+      </w:r>
+      <w:r>
+        <w:t xml:space="preserve"> </w:t>
+      </w:r>
+      <w:r>
+        <w:t xml:space="preserve">that do not depend on the agent being awake.</w:t>
       </w:r>
     </w:p>
-    <w:tbl>
-      <w:tblPr>
-        <w:tblStyle w:val="Table"/>
-        <w:tblW w:type="auto" w:w="0"/>
-        <w:tblLook w:firstRow="1" w:lastRow="0" w:firstColumn="0" w:lastColumn="0" w:noHBand="0" w:noVBand="0" w:val="0020"/>
-      </w:tblPr>
-      <w:tblGrid>
-        <w:gridCol w:w="1980"/>
-        <w:gridCol w:w="1980"/>
-        <w:gridCol w:w="1980"/>
-        <w:gridCol w:w="1980"/>
-      </w:tblGrid>
-      <w:tr>
-        <w:trPr>
-          <w:tblHeader w:val="on"/>
-        </w:trPr>
-        <w:tc>
-          <w:tcPr/>
-          <w:p>
-            <w:pPr>
-              <w:pStyle w:val="Compact"/>
-            </w:pPr>
-            <w:r>
-              <w:t xml:space="preserve">across 131,825 ingest runs</w:t>
-            </w:r>
-          </w:p>
-        </w:tc>
-        <w:tc>
-          <w:tcPr/>
-          <w:p>
-            <w:pPr>
-              <w:pStyle w:val="Compact"/>
-              <w:jc w:val="right"/>
-            </w:pPr>
-            <w:r>
-              <w:t xml:space="preserve">records</w:t>
-            </w:r>
-          </w:p>
-        </w:tc>
-        <w:tc>
-          <w:tcPr/>
-          <w:p>
-            <w:pPr>
-              <w:pStyle w:val="Compact"/>
-            </w:pPr>
-          </w:p>
-        </w:tc>
-        <w:tc>
-          <w:tcPr/>
-          <w:p>
-            <w:pPr>
-              <w:pStyle w:val="Compact"/>
-            </w:pPr>
-          </w:p>
-        </w:tc>
-      </w:tr>
-      <w:tr>
-        <w:tc>
-          <w:tcPr/>
-          <w:p>
-            <w:pPr>
-              <w:pStyle w:val="Compact"/>
-            </w:pPr>
-            <w:r>
-              <w:t xml:space="preserve">raw lines read</w:t>
-            </w:r>
-          </w:p>
-        </w:tc>
-        <w:tc>
-          <w:tcPr/>
-          <w:p>
-            <w:pPr>
-              <w:pStyle w:val="Compact"/>
-              <w:jc w:val="right"/>
-            </w:pPr>
-            <w:r>
-              <w:t xml:space="preserve">1,634,272,120</w:t>
-            </w:r>
-          </w:p>
-        </w:tc>
-        <w:tc>
-          <w:tcPr/>
-          <w:p>
-            <w:pPr>
-              <w:pStyle w:val="Compact"/>
-            </w:pPr>
-            <w:r>
-              <w:rPr>
-                <w:b/>
-                <w:bCs/>
-              </w:rPr>
-              <w:t xml:space="preserve">salvaged</w:t>
-            </w:r>
-            <w:r>
-              <w:t xml:space="preserve"> </w:t>
-            </w:r>
-            <w:r>
-              <w:t xml:space="preserve">by normalisation</w:t>
-            </w:r>
-          </w:p>
-        </w:tc>
-        <w:tc>
-          <w:tcPr/>
-          <w:p>
-            <w:pPr>
-              <w:pStyle w:val="Compact"/>
-              <w:jc w:val="right"/>
-            </w:pPr>
-            <w:r>
-              <w:rPr>
-                <w:b/>
-                <w:bCs/>
-              </w:rPr>
-              <w:t xml:space="preserve">129,805,348</w:t>
-            </w:r>
-          </w:p>
-        </w:tc>
-      </w:tr>
-      <w:tr>
-        <w:tc>
-          <w:tcPr/>
-          <w:p>
-            <w:pPr>
-              <w:pStyle w:val="Compact"/>
-            </w:pPr>
-            <w:r>
-              <w:t xml:space="preserve">staged records</w:t>
-            </w:r>
-          </w:p>
-        </w:tc>
-        <w:tc>
-          <w:tcPr/>
-          <w:p>
-            <w:pPr>
-              <w:pStyle w:val="Compact"/>
-              <w:jc w:val="right"/>
-            </w:pPr>
-            <w:r>
-              <w:t xml:space="preserve">213,031,636</w:t>
-            </w:r>
-          </w:p>
-        </w:tc>
-        <w:tc>
-          <w:tcPr/>
-          <w:p>
-            <w:pPr>
-              <w:pStyle w:val="Compact"/>
-            </w:pPr>
-            <w:r>
-              <w:rPr>
-                <w:b/>
-                <w:bCs/>
-              </w:rPr>
-              <w:t xml:space="preserve">rejected</w:t>
-            </w:r>
-            <w:r>
-              <w:t xml:space="preserve"> </w:t>
-            </w:r>
-            <w:r>
-              <w:t xml:space="preserve">as invalid</w:t>
-            </w:r>
-          </w:p>
-        </w:tc>
-        <w:tc>
-          <w:tcPr/>
-          <w:p>
-            <w:pPr>
-              <w:pStyle w:val="Compact"/>
-              <w:jc w:val="right"/>
-            </w:pPr>
-            <w:r>
-              <w:rPr>
-                <w:b/>
-                <w:bCs/>
-              </w:rPr>
-              <w:t xml:space="preserve">2,836,010</w:t>
-            </w:r>
-          </w:p>
-        </w:tc>
-      </w:tr>
-      <w:tr>
-        <w:tc>
-          <w:tcPr/>
-          <w:p>
-            <w:pPr>
-              <w:pStyle w:val="Compact"/>
-            </w:pPr>
-            <w:r>
-              <w:t xml:space="preserve">outside 1996-2001, never eligible</w:t>
-            </w:r>
-          </w:p>
-        </w:tc>
-        <w:tc>
-          <w:tcPr/>
-          <w:p>
-            <w:pPr>
-              <w:pStyle w:val="Compact"/>
-              <w:jc w:val="right"/>
-            </w:pPr>
-            <w:r>
-              <w:t xml:space="preserve">1,236,761,978</w:t>
-            </w:r>
-          </w:p>
-        </w:tc>
-        <w:tc>
-          <w:tcPr/>
-          <w:p>
-            <w:pPr>
-              <w:pStyle w:val="Compact"/>
-            </w:pPr>
-          </w:p>
-        </w:tc>
-        <w:tc>
-          <w:tcPr/>
-          <w:p>
-            <w:pPr>
-              <w:pStyle w:val="Compact"/>
-            </w:pPr>
-          </w:p>
-        </w:tc>
-      </w:tr>
-    </w:tbl>
     <w:p>
       <w:pPr>
         <w:pStyle w:val="BodyText"/>
       </w:pPr>
       <w:r>
-        <w:t xml:space="preserve">Reject reasons over the 1,299,177 dropped lines retained in the shipped audit CSVs: IP address 95.41%,</w:t>
-      </w:r>
-      <w:r>
-        <w:t xml:space="preserve"> </w:t>
-      </w:r>
-      <w:r>
-        <w:t xml:space="preserve">no known public suffix 2.92%, invalid hostname syntax 0.95%, bare public suffix 0.63%, invalid</w:t>
-      </w:r>
-      <w:r>
-        <w:t xml:space="preserve"> </w:t>
-      </w:r>
-      <w:r>
-        <w:t xml:space="preserve">character 0.09%.</w:t>
+        <w:rPr>
+          <w:b/>
+          <w:bCs/>
+        </w:rPr>
+        <w:t xml:space="preserve">Generating the names to ask about, rather than discovering them.</w:t>
+      </w:r>
+      <w:r>
+        <w:t xml:space="preserve"> </w:t>
+      </w:r>
+      <w:r>
+        <w:t xml:space="preserve">The candidate pool holds</w:t>
+      </w:r>
+      <w:r>
+        <w:t xml:space="preserve"> </w:t>
+      </w:r>
+      <w:r>
+        <w:t xml:space="preserve">2,395,205 names with no in-window year, and asking RDAP about them returns almost nothing: 602</w:t>
+      </w:r>
+      <w:r>
+        <w:t xml:space="preserve"> </w:t>
+      </w:r>
+      <w:r>
+        <w:t xml:space="preserve">queries drawn twice, once from the head and once seeded-random, produced</w:t>
+      </w:r>
+      <w:r>
+        <w:t xml:space="preserve"> </w:t>
+      </w:r>
+      <w:r>
+        <w:rPr>
+          <w:b/>
+          <w:bCs/>
+        </w:rPr>
+        <w:t xml:space="preserve">zero</w:t>
+      </w:r>
+      <w:r>
+        <w:t xml:space="preserve"> </w:t>
+      </w:r>
+      <w:r>
+        <w:t xml:space="preserve">in-window creation</w:t>
+      </w:r>
+      <w:r>
+        <w:t xml:space="preserve"> </w:t>
+      </w:r>
+      <w:r>
+        <w:t xml:space="preserve">dates, because 73% of the pool answers 404 against 21.6% for domains we hold. A name no crawler</w:t>
+      </w:r>
+      <w:r>
+        <w:t xml:space="preserve"> </w:t>
+      </w:r>
+      <w:r>
+        <w:t xml:space="preserve">captured is usually a name that was never much of a site. So the question was inverted, from</w:t>
+      </w:r>
+      <w:r>
+        <w:t xml:space="preserve"> </w:t>
+      </w:r>
+      <w:r>
+        <w:rPr>
+          <w:i/>
+          <w:iCs/>
+        </w:rPr>
+        <w:t xml:space="preserve">which</w:t>
+      </w:r>
+      <w:r>
+        <w:rPr>
+          <w:i/>
+          <w:iCs/>
+        </w:rPr>
+        <w:t xml:space="preserve"> </w:t>
+      </w:r>
+      <w:r>
+        <w:rPr>
+          <w:i/>
+          <w:iCs/>
+        </w:rPr>
+        <w:t xml:space="preserve">real names have we not yet dated</w:t>
+      </w:r>
+      <w:r>
+        <w:t xml:space="preserve"> </w:t>
+      </w:r>
+      <w:r>
+        <w:t xml:space="preserve">to</w:t>
+      </w:r>
+      <w:r>
+        <w:t xml:space="preserve"> </w:t>
+      </w:r>
+      <w:r>
+        <w:rPr>
+          <w:i/>
+          <w:iCs/>
+        </w:rPr>
+        <w:t xml:space="preserve">which names can we invent that a registry will date for us</w:t>
+      </w:r>
+      <w:r>
+        <w:t xml:space="preserve">.</w:t>
+      </w:r>
+      <w:r>
+        <w:t xml:space="preserve"> </w:t>
+      </w:r>
+      <w:r>
+        <w:t xml:space="preserve">Four generated populations were priced against each other at equal cost:</w:t>
+      </w:r>
+      <w:r>
+        <w:t xml:space="preserve"> </w:t>
+      </w:r>
+      <w:r>
+        <w:rPr>
+          <w:b/>
+          <w:bCs/>
+        </w:rPr>
+        <w:t xml:space="preserve">sibling names</w:t>
+      </w:r>
+      <w:r>
+        <w:t xml:space="preserve">, every</w:t>
+      </w:r>
+      <w:r>
+        <w:t xml:space="preserve"> </w:t>
+      </w:r>
+      <w:r>
+        <w:rPr>
+          <w:rStyle w:val="VerbatimChar"/>
+        </w:rPr>
+        <w:t xml:space="preserve">.com</w:t>
+      </w:r>
+      <w:r>
+        <w:t xml:space="preserve">/</w:t>
+      </w:r>
+      <w:r>
+        <w:rPr>
+          <w:rStyle w:val="VerbatimChar"/>
+        </w:rPr>
+        <w:t xml:space="preserve">.net</w:t>
+      </w:r>
+      <w:r>
+        <w:t xml:space="preserve">/</w:t>
+      </w:r>
+      <w:r>
+        <w:rPr>
+          <w:rStyle w:val="VerbatimChar"/>
+        </w:rPr>
+        <w:t xml:space="preserve">.org</w:t>
+      </w:r>
+      <w:r>
+        <w:t xml:space="preserve"> </w:t>
+      </w:r>
+      <w:r>
+        <w:t xml:space="preserve">label we hold in window re-suffixed to the other two and filtered to what the</w:t>
+      </w:r>
+      <w:r>
+        <w:t xml:space="preserve"> </w:t>
+      </w:r>
+      <w:r>
+        <w:t xml:space="preserve">store lacks, 14,080,169 of them, measured over a first full round of 150,000 queries at 14,205</w:t>
+      </w:r>
+      <w:r>
+        <w:t xml:space="preserve"> </w:t>
+      </w:r>
+      <w:r>
+        <w:t xml:space="preserve">in-window creation dates, 9.47%,</w:t>
+      </w:r>
+      <w:r>
+        <w:t xml:space="preserve"> </w:t>
+      </w:r>
+      <w:r>
+        <w:rPr>
+          <w:b/>
+          <w:bCs/>
+        </w:rPr>
+        <w:t xml:space="preserve">59.9 equivalent-English per 1,000 queries</w:t>
+      </w:r>
+      <w:r>
+        <w:t xml:space="preserve">;</w:t>
+      </w:r>
+      <w:r>
+        <w:t xml:space="preserve"> </w:t>
+      </w:r>
+      <w:r>
+        <w:rPr>
+          <w:b/>
+          <w:bCs/>
+        </w:rPr>
+        <w:t xml:space="preserve">English dictionary</w:t>
+      </w:r>
+      <w:r>
+        <w:rPr>
+          <w:b/>
+          <w:bCs/>
+        </w:rPr>
+        <w:t xml:space="preserve"> </w:t>
+      </w:r>
+      <w:r>
+        <w:rPr>
+          <w:b/>
+          <w:bCs/>
+        </w:rPr>
+        <w:t xml:space="preserve">words</w:t>
+      </w:r>
+      <w:r>
+        <w:t xml:space="preserve"> </w:t>
+      </w:r>
+      <w:r>
+        <w:t xml:space="preserve">across the same three suffixes, the densest in hit rate at 28.0% but 92.4% already held and</w:t>
+      </w:r>
+      <w:r>
+        <w:t xml:space="preserve"> </w:t>
+      </w:r>
+      <w:r>
+        <w:t xml:space="preserve">finite at roughly 235,000 words, so 13.5 per 1,000;</w:t>
+      </w:r>
+      <w:r>
+        <w:t xml:space="preserve"> </w:t>
+      </w:r>
+      <w:r>
+        <w:rPr>
+          <w:b/>
+          <w:bCs/>
+        </w:rPr>
+        <w:t xml:space="preserve">random four-character strings</w:t>
+      </w:r>
+      <w:r>
+        <w:t xml:space="preserve">, 6.3; and</w:t>
+      </w:r>
+      <w:r>
+        <w:t xml:space="preserve"> </w:t>
+      </w:r>
+      <w:r>
+        <w:rPr>
+          <w:b/>
+          <w:bCs/>
+        </w:rPr>
+        <w:t xml:space="preserve">invented two-word compounds</w:t>
+      </w:r>
+      <w:r>
+        <w:t xml:space="preserve">, 859 queries and</w:t>
+      </w:r>
+      <w:r>
+        <w:t xml:space="preserve"> </w:t>
+      </w:r>
+      <w:r>
+        <w:rPr>
+          <w:b/>
+          <w:bCs/>
+        </w:rPr>
+        <w:t xml:space="preserve">exactly zero</w:t>
+      </w:r>
+      <w:r>
+        <w:t xml:space="preserve"> </w:t>
+      </w:r>
+      <w:r>
+        <w:t xml:space="preserve">in-window, a population that was</w:t>
+      </w:r>
+      <w:r>
+        <w:t xml:space="preserve"> </w:t>
+      </w:r>
+      <w:r>
+        <w:t xml:space="preserve">registered later or never. Inventing the query beat two and a half million discovered candidates by</w:t>
+      </w:r>
+      <w:r>
+        <w:t xml:space="preserve"> </w:t>
+      </w:r>
+      <w:r>
+        <w:t xml:space="preserve">an unbounded margin, and the reason is that a registry answers about names that survived while an</w:t>
+      </w:r>
+      <w:r>
+        <w:t xml:space="preserve"> </w:t>
+      </w:r>
+      <w:r>
+        <w:t xml:space="preserve">archive is the only thing that can date a name that died.</w:t>
+      </w:r>
+    </w:p>
+    <w:p>
+      <w:pPr>
+        <w:pStyle w:val="BodyText"/>
+      </w:pPr>
+      <w:r>
+        <w:rPr>
+          <w:b/>
+          <w:bCs/>
+        </w:rPr>
+        <w:t xml:space="preserve">Where the human sits.</w:t>
+      </w:r>
+      <w:r>
+        <w:t xml:space="preserve"> </w:t>
+      </w:r>
+      <w:r>
+        <w:t xml:space="preserve">The agent runs the two collection engines, which are mechanical, and it may</w:t>
+      </w:r>
+      <w:r>
+        <w:t xml:space="preserve"> </w:t>
+      </w:r>
+      <w:r>
+        <w:t xml:space="preserve">re-run anything already decided. Everything else goes onto an approval list with a measured figure and</w:t>
+      </w:r>
+      <w:r>
+        <w:t xml:space="preserve"> </w:t>
+      </w:r>
+      <w:r>
+        <w:t xml:space="preserve">primary links. The supervisor works through that list source by source, opens the links, checks the</w:t>
+      </w:r>
+      <w:r>
+        <w:t xml:space="preserve"> </w:t>
+      </w:r>
+      <w:r>
+        <w:t xml:space="preserve">dating argument, and rules per source: master, candidate-only or rejected.</w:t>
+      </w:r>
+      <w:r>
+        <w:t xml:space="preserve"> </w:t>
+      </w:r>
+      <w:r>
+        <w:rPr>
+          <w:b/>
+          <w:bCs/>
+        </w:rPr>
+        <w:t xml:space="preserve">This is enforced in code</w:t>
+      </w:r>
+      <w:r>
+        <w:rPr>
+          <w:b/>
+          <w:bCs/>
+        </w:rPr>
+        <w:t xml:space="preserve"> </w:t>
+      </w:r>
+      <w:r>
+        <w:rPr>
+          <w:b/>
+          <w:bCs/>
+        </w:rPr>
+        <w:t xml:space="preserve">rather than by habit</w:t>
+      </w:r>
+      <w:r>
+        <w:t xml:space="preserve">:</w:t>
+      </w:r>
+      <w:r>
+        <w:t xml:space="preserve"> </w:t>
+      </w:r>
+      <w:r>
+        <w:rPr>
+          <w:rStyle w:val="VerbatimChar"/>
+        </w:rPr>
+        <w:t xml:space="preserve">ark ingest</w:t>
+      </w:r>
+      <w:r>
+        <w:t xml:space="preserve"> </w:t>
+      </w:r>
+      <w:r>
+        <w:t xml:space="preserve">refuses to run for a class with no written</w:t>
+      </w:r>
+      <w:r>
+        <w:t xml:space="preserve"> </w:t>
+      </w:r>
+      <w:r>
+        <w:rPr>
+          <w:rStyle w:val="VerbatimChar"/>
+        </w:rPr>
+        <w:t xml:space="preserve">Decision:</w:t>
+      </w:r>
+      <w:r>
+        <w:t xml:space="preserve"> </w:t>
+      </w:r>
+      <w:r>
+        <w:t xml:space="preserve">line, and</w:t>
+      </w:r>
+      <w:r>
+        <w:t xml:space="preserve"> </w:t>
+      </w:r>
+      <w:r>
+        <w:t xml:space="preserve">it refused twice in this round until the decision existed.</w:t>
+      </w:r>
+    </w:p>
+    <w:p>
+      <w:pPr>
+        <w:pStyle w:val="BodyText"/>
+      </w:pPr>
+      <w:r>
+        <w:rPr>
+          <w:b/>
+          <w:bCs/>
+        </w:rPr>
+        <w:t xml:space="preserve">What that gate is worth, measured.</w:t>
+      </w:r>
+      <w:r>
+        <w:t xml:space="preserve"> </w:t>
+      </w:r>
+      <w:r>
+        <w:t xml:space="preserve">11 sources were admitted in this round, each on a</w:t>
+      </w:r>
+      <w:r>
+        <w:t xml:space="preserve"> </w:t>
+      </w:r>
+      <w:r>
+        <w:t xml:space="preserve">separate written decision. The candidate pool accumulated 575,417 strings under namespaces that never</w:t>
+      </w:r>
+      <w:r>
+        <w:t xml:space="preserve"> </w:t>
+      </w:r>
+      <w:r>
+        <w:t xml:space="preserve">allowed arbitrary registration and</w:t>
+      </w:r>
+      <w:r>
+        <w:t xml:space="preserve"> </w:t>
+      </w:r>
+      <w:r>
+        <w:rPr>
+          <w:b/>
+          <w:bCs/>
+        </w:rPr>
+        <w:t xml:space="preserve">not one reached an annual file</w:t>
+      </w:r>
+      <w:r>
+        <w:t xml:space="preserve">. Twelve invariants run before</w:t>
+      </w:r>
+      <w:r>
+        <w:t xml:space="preserve"> </w:t>
+      </w:r>
+      <w:r>
+        <w:t xml:space="preserve">every commit and again inside the shipped archive; one of them caught a defect in this round, an</w:t>
+      </w:r>
+      <w:r>
+        <w:t xml:space="preserve"> </w:t>
+      </w:r>
+      <w:r>
+        <w:t xml:space="preserve">evidence value citing a page's date for a row dated from its own column, which was a wrong citation</w:t>
+      </w:r>
+      <w:r>
+        <w:t xml:space="preserve"> </w:t>
+      </w:r>
+      <w:r>
+        <w:t xml:space="preserve">rather than a wrong year.</w:t>
+      </w:r>
+    </w:p>
+    <w:p>
+      <w:pPr>
+        <w:pStyle w:val="BodyText"/>
+      </w:pPr>
+      <w:r>
+        <w:rPr>
+          <w:b/>
+          <w:bCs/>
+        </w:rPr>
+        <w:t xml:space="preserve">Negative results are recorded as first-class.</w:t>
+      </w:r>
+      <w:r>
+        <w:t xml:space="preserve"> </w:t>
+      </w:r>
+      <w:r>
+        <w:rPr>
+          <w:b/>
+          <w:bCs/>
+        </w:rPr>
+        <w:t xml:space="preserve">251 source families have been searched and recorded</w:t>
+      </w:r>
+      <w:r>
+        <w:t xml:space="preserve">, 44 developed far enough to earn their own section and 207 evaluated and closed, each with the measurement that closed it, so negative results stay visible and the same ground is not broken twice.</w:t>
+      </w:r>
+      <w:r>
+        <w:t xml:space="preserve"> </w:t>
+      </w:r>
+      <w:r>
+        <w:rPr>
+          <w:rStyle w:val="VerbatimChar"/>
+        </w:rPr>
+        <w:t xml:space="preserve">sources.md</w:t>
+      </w:r>
+      <w:r>
+        <w:t xml:space="preserve"> </w:t>
+      </w:r>
+      <w:r>
+        <w:t xml:space="preserve">ships beside this report and names every one, with its acquisition route, date semantics and yield.</w:t>
       </w:r>
     </w:p>
     <w:bookmarkEnd w:id="13"/>
-    <w:bookmarkStart w:id="14" w:name="X70619d5b0981bc5d293ef1ddc7fcd0da083dced"/>
+    <w:bookmarkStart w:id="14" w:name="Xb36eab86e5bbe496a8c1c2562c92443ce82eac8"/>
     <w:p>
       <w:pPr>
         <w:pStyle w:val="Heading2"/>
       </w:pPr>
       <w:r>
-        <w:t xml:space="preserve">5. Archive execution</w:t>
-      </w:r>
-    </w:p>
-    <w:tbl>
-      <w:tblPr>
-        <w:tblStyle w:val="Table"/>
-        <w:tblW w:type="auto" w:w="0"/>
-        <w:tblLook w:firstRow="1" w:lastRow="0" w:firstColumn="0" w:lastColumn="0" w:noHBand="0" w:noVBand="0" w:val="0020"/>
-      </w:tblPr>
-      <w:tblGrid>
-        <w:gridCol w:w="990"/>
-        <w:gridCol w:w="990"/>
-        <w:gridCol w:w="990"/>
-        <w:gridCol w:w="990"/>
-        <w:gridCol w:w="990"/>
-        <w:gridCol w:w="990"/>
-        <w:gridCol w:w="990"/>
-        <w:gridCol w:w="990"/>
-      </w:tblGrid>
-      <w:tr>
-        <w:trPr>
-          <w:tblHeader w:val="on"/>
-        </w:trPr>
-        <w:tc>
-          <w:tcPr/>
-          <w:p>
-            <w:pPr>
-              <w:pStyle w:val="Compact"/>
-            </w:pPr>
-            <w:r>
-              <w:t xml:space="preserve">Collector prefix</w:t>
-            </w:r>
-          </w:p>
-        </w:tc>
-        <w:tc>
-          <w:tcPr/>
-          <w:p>
-            <w:pPr>
-              <w:pStyle w:val="Compact"/>
-              <w:jc w:val="right"/>
-            </w:pPr>
-            <w:r>
-              <w:t xml:space="preserve">Journals</w:t>
-            </w:r>
-          </w:p>
-        </w:tc>
-        <w:tc>
-          <w:tcPr/>
-          <w:p>
-            <w:pPr>
-              <w:pStyle w:val="Compact"/>
-              <w:jc w:val="right"/>
-            </w:pPr>
-            <w:r>
-              <w:t xml:space="preserve">Queries</w:t>
-            </w:r>
-          </w:p>
-        </w:tc>
-        <w:tc>
-          <w:tcPr/>
-          <w:p>
-            <w:pPr>
-              <w:pStyle w:val="Compact"/>
-              <w:jc w:val="right"/>
-            </w:pPr>
-            <w:r>
-              <w:t xml:space="preserve">Answered</w:t>
-            </w:r>
-          </w:p>
-        </w:tc>
-        <w:tc>
-          <w:tcPr/>
-          <w:p>
-            <w:pPr>
-              <w:pStyle w:val="Compact"/>
-              <w:jc w:val="right"/>
-            </w:pPr>
-            <w:r>
-              <w:t xml:space="preserve">Success</w:t>
-            </w:r>
-          </w:p>
-        </w:tc>
-        <w:tc>
-          <w:tcPr/>
-          <w:p>
-            <w:pPr>
-              <w:pStyle w:val="Compact"/>
-              <w:jc w:val="right"/>
-            </w:pPr>
-            <w:r>
-              <w:t xml:space="preserve">In-window hit rate</w:t>
-            </w:r>
-          </w:p>
-        </w:tc>
-        <w:tc>
-          <w:tcPr/>
-          <w:p>
-            <w:pPr>
-              <w:pStyle w:val="Compact"/>
-              <w:jc w:val="right"/>
-            </w:pPr>
-            <w:r>
-              <w:t xml:space="preserve">Distinct domains</w:t>
-            </w:r>
-          </w:p>
-        </w:tc>
-        <w:tc>
-          <w:tcPr/>
-          <w:p>
-            <w:pPr>
-              <w:pStyle w:val="Compact"/>
-              <w:jc w:val="right"/>
-            </w:pPr>
-            <w:r>
-              <w:t xml:space="preserve">In-window pairs</w:t>
-            </w:r>
-          </w:p>
-        </w:tc>
-      </w:tr>
-      <w:tr>
-        <w:tc>
-          <w:tcPr/>
-          <w:p>
-            <w:pPr>
-              <w:pStyle w:val="Compact"/>
-            </w:pPr>
-            <w:r>
-              <w:rPr>
-                <w:rStyle w:val="VerbatimChar"/>
-              </w:rPr>
-              <w:t xml:space="preserve">cdx_suffix</w:t>
-            </w:r>
-          </w:p>
-        </w:tc>
-        <w:tc>
-          <w:tcPr/>
-          <w:p>
-            <w:pPr>
-              <w:pStyle w:val="Compact"/>
-              <w:jc w:val="right"/>
-            </w:pPr>
-            <w:r>
-              <w:t xml:space="preserve">43</w:t>
-            </w:r>
-          </w:p>
-        </w:tc>
-        <w:tc>
-          <w:tcPr/>
-          <w:p>
-            <w:pPr>
-              <w:pStyle w:val="Compact"/>
-              <w:jc w:val="right"/>
-            </w:pPr>
-            <w:r>
-              <w:t xml:space="preserve">2,238,415</w:t>
-            </w:r>
-          </w:p>
-        </w:tc>
-        <w:tc>
-          <w:tcPr/>
-          <w:p>
-            <w:pPr>
-              <w:pStyle w:val="Compact"/>
-              <w:jc w:val="right"/>
-            </w:pPr>
-            <w:r>
-              <w:t xml:space="preserve">2,238,415</w:t>
-            </w:r>
-          </w:p>
-        </w:tc>
-        <w:tc>
-          <w:tcPr/>
-          <w:p>
-            <w:pPr>
-              <w:pStyle w:val="Compact"/>
-              <w:jc w:val="right"/>
-            </w:pPr>
-            <w:r>
-              <w:t xml:space="preserve">100.0%</w:t>
-            </w:r>
-          </w:p>
-        </w:tc>
-        <w:tc>
-          <w:tcPr/>
-          <w:p>
-            <w:pPr>
-              <w:pStyle w:val="Compact"/>
-              <w:jc w:val="right"/>
-            </w:pPr>
-            <w:r>
-              <w:t xml:space="preserve">100.0%</w:t>
-            </w:r>
-          </w:p>
-        </w:tc>
-        <w:tc>
-          <w:tcPr/>
-          <w:p>
-            <w:pPr>
-              <w:pStyle w:val="Compact"/>
-              <w:jc w:val="right"/>
-            </w:pPr>
-            <w:r>
-              <w:t xml:space="preserve">57,592</w:t>
-            </w:r>
-          </w:p>
-        </w:tc>
-        <w:tc>
-          <w:tcPr/>
-          <w:p>
-            <w:pPr>
-              <w:pStyle w:val="Compact"/>
-              <w:jc w:val="right"/>
-            </w:pPr>
-            <w:r>
-              <w:t xml:space="preserve">4,367,087</w:t>
-            </w:r>
-          </w:p>
-        </w:tc>
-      </w:tr>
-      <w:tr>
-        <w:tc>
-          <w:tcPr/>
-          <w:p>
-            <w:pPr>
-              <w:pStyle w:val="Compact"/>
-            </w:pPr>
-            <w:r>
-              <w:rPr>
-                <w:rStyle w:val="VerbatimChar"/>
-              </w:rPr>
-              <w:t xml:space="preserve">cdx_pool</w:t>
-            </w:r>
-          </w:p>
-        </w:tc>
-        <w:tc>
-          <w:tcPr/>
-          <w:p>
-            <w:pPr>
-              <w:pStyle w:val="Compact"/>
-              <w:jc w:val="right"/>
-            </w:pPr>
-            <w:r>
-              <w:t xml:space="preserve">253</w:t>
-            </w:r>
-          </w:p>
-        </w:tc>
-        <w:tc>
-          <w:tcPr/>
-          <w:p>
-            <w:pPr>
-              <w:pStyle w:val="Compact"/>
-              <w:jc w:val="right"/>
-            </w:pPr>
-            <w:r>
-              <w:t xml:space="preserve">152,394</w:t>
-            </w:r>
-          </w:p>
-        </w:tc>
-        <w:tc>
-          <w:tcPr/>
-          <w:p>
-            <w:pPr>
-              <w:pStyle w:val="Compact"/>
-              <w:jc w:val="right"/>
-            </w:pPr>
-            <w:r>
-              <w:t xml:space="preserve">133,671</w:t>
-            </w:r>
-          </w:p>
-        </w:tc>
-        <w:tc>
-          <w:tcPr/>
-          <w:p>
-            <w:pPr>
-              <w:pStyle w:val="Compact"/>
-              <w:jc w:val="right"/>
-            </w:pPr>
-            <w:r>
-              <w:t xml:space="preserve">87.7%</w:t>
-            </w:r>
-          </w:p>
-        </w:tc>
-        <w:tc>
-          <w:tcPr/>
-          <w:p>
-            <w:pPr>
-              <w:pStyle w:val="Compact"/>
-              <w:jc w:val="right"/>
-            </w:pPr>
-            <w:r>
-              <w:t xml:space="preserve">52.2%</w:t>
-            </w:r>
-          </w:p>
-        </w:tc>
-        <w:tc>
-          <w:tcPr/>
-          <w:p>
-            <w:pPr>
-              <w:pStyle w:val="Compact"/>
-              <w:jc w:val="right"/>
-            </w:pPr>
-            <w:r>
-              <w:t xml:space="preserve">134,197</w:t>
-            </w:r>
-          </w:p>
-        </w:tc>
-        <w:tc>
-          <w:tcPr/>
-          <w:p>
-            <w:pPr>
-              <w:pStyle w:val="Compact"/>
-              <w:jc w:val="right"/>
-            </w:pPr>
-            <w:r>
-              <w:t xml:space="preserve">104,344</w:t>
-            </w:r>
-          </w:p>
-        </w:tc>
-      </w:tr>
-      <w:tr>
-        <w:tc>
-          <w:tcPr/>
-          <w:p>
-            <w:pPr>
-              <w:pStyle w:val="Compact"/>
-            </w:pPr>
-            <w:r>
-              <w:rPr>
-                <w:rStyle w:val="VerbatimChar"/>
-              </w:rPr>
-              <w:t xml:space="preserve">cdx_q1</w:t>
-            </w:r>
-          </w:p>
-        </w:tc>
-        <w:tc>
-          <w:tcPr/>
-          <w:p>
-            <w:pPr>
-              <w:pStyle w:val="Compact"/>
-              <w:jc w:val="right"/>
-            </w:pPr>
-            <w:r>
-              <w:t xml:space="preserve">214</w:t>
-            </w:r>
-          </w:p>
-        </w:tc>
-        <w:tc>
-          <w:tcPr/>
-          <w:p>
-            <w:pPr>
-              <w:pStyle w:val="Compact"/>
-              <w:jc w:val="right"/>
-            </w:pPr>
-            <w:r>
-              <w:t xml:space="preserve">63,919</w:t>
-            </w:r>
-          </w:p>
-        </w:tc>
-        <w:tc>
-          <w:tcPr/>
-          <w:p>
-            <w:pPr>
-              <w:pStyle w:val="Compact"/>
-              <w:jc w:val="right"/>
-            </w:pPr>
-            <w:r>
-              <w:t xml:space="preserve">55,844</w:t>
-            </w:r>
-          </w:p>
-        </w:tc>
-        <w:tc>
-          <w:tcPr/>
-          <w:p>
-            <w:pPr>
-              <w:pStyle w:val="Compact"/>
-              <w:jc w:val="right"/>
-            </w:pPr>
-            <w:r>
-              <w:t xml:space="preserve">87.4%</w:t>
-            </w:r>
-          </w:p>
-        </w:tc>
-        <w:tc>
-          <w:tcPr/>
-          <w:p>
-            <w:pPr>
-              <w:pStyle w:val="Compact"/>
-              <w:jc w:val="right"/>
-            </w:pPr>
-            <w:r>
-              <w:t xml:space="preserve">71.9%</w:t>
-            </w:r>
-          </w:p>
-        </w:tc>
-        <w:tc>
-          <w:tcPr/>
-          <w:p>
-            <w:pPr>
-              <w:pStyle w:val="Compact"/>
-              <w:jc w:val="right"/>
-            </w:pPr>
-            <w:r>
-              <w:t xml:space="preserve">55,943</w:t>
-            </w:r>
-          </w:p>
-        </w:tc>
-        <w:tc>
-          <w:tcPr/>
-          <w:p>
-            <w:pPr>
-              <w:pStyle w:val="Compact"/>
-              <w:jc w:val="right"/>
-            </w:pPr>
-            <w:r>
-              <w:t xml:space="preserve">127,552</w:t>
-            </w:r>
-          </w:p>
-        </w:tc>
-      </w:tr>
-      <w:tr>
-        <w:tc>
-          <w:tcPr/>
-          <w:p>
-            <w:pPr>
-              <w:pStyle w:val="Compact"/>
-            </w:pPr>
-            <w:r>
-              <w:rPr>
-                <w:i/>
-                <w:iCs/>
-              </w:rPr>
-              <w:t xml:space="preserve">16 further prefixes</w:t>
-            </w:r>
-          </w:p>
-        </w:tc>
-        <w:tc>
-          <w:tcPr/>
-          <w:p>
-            <w:pPr>
-              <w:pStyle w:val="Compact"/>
-              <w:jc w:val="right"/>
-            </w:pPr>
-            <w:r>
-              <w:t xml:space="preserve">446</w:t>
-            </w:r>
-          </w:p>
-        </w:tc>
-        <w:tc>
-          <w:tcPr/>
-          <w:p>
-            <w:pPr>
-              <w:pStyle w:val="Compact"/>
-              <w:jc w:val="right"/>
-            </w:pPr>
-            <w:r>
-              <w:t xml:space="preserve">249,484</w:t>
-            </w:r>
-          </w:p>
-        </w:tc>
-        <w:tc>
-          <w:tcPr/>
-          <w:p>
-            <w:pPr>
-              <w:pStyle w:val="Compact"/>
-              <w:jc w:val="right"/>
-            </w:pPr>
-            <w:r>
-              <w:t xml:space="preserve">229,119</w:t>
-            </w:r>
-          </w:p>
-        </w:tc>
-        <w:tc>
-          <w:tcPr/>
-          <w:p>
-            <w:pPr>
-              <w:pStyle w:val="Compact"/>
-              <w:jc w:val="right"/>
-            </w:pPr>
-            <w:r>
-              <w:t xml:space="preserve">91.8%</w:t>
-            </w:r>
-          </w:p>
-        </w:tc>
-        <w:tc>
-          <w:tcPr/>
-          <w:p>
-            <w:pPr>
-              <w:pStyle w:val="Compact"/>
-            </w:pPr>
-          </w:p>
-        </w:tc>
-        <w:tc>
-          <w:tcPr/>
-          <w:p>
-            <w:pPr>
-              <w:pStyle w:val="Compact"/>
-              <w:jc w:val="right"/>
-            </w:pPr>
-            <w:r>
-              <w:t xml:space="preserve">231,915</w:t>
-            </w:r>
-          </w:p>
-        </w:tc>
-        <w:tc>
-          <w:tcPr/>
-          <w:p>
-            <w:pPr>
-              <w:pStyle w:val="Compact"/>
-              <w:jc w:val="right"/>
-            </w:pPr>
-            <w:r>
-              <w:t xml:space="preserve">525,056</w:t>
-            </w:r>
-          </w:p>
-        </w:tc>
-      </w:tr>
-      <w:tr>
-        <w:tc>
-          <w:tcPr/>
-          <w:p>
-            <w:pPr>
-              <w:pStyle w:val="Compact"/>
-            </w:pPr>
-            <w:r>
-              <w:rPr>
-                <w:b/>
-                <w:bCs/>
-              </w:rPr>
-              <w:t xml:space="preserve">All</w:t>
-            </w:r>
-          </w:p>
-        </w:tc>
-        <w:tc>
-          <w:tcPr/>
-          <w:p>
-            <w:pPr>
-              <w:pStyle w:val="Compact"/>
-              <w:jc w:val="right"/>
-            </w:pPr>
-            <w:r>
-              <w:rPr>
-                <w:b/>
-                <w:bCs/>
-              </w:rPr>
-              <w:t xml:space="preserve">956</w:t>
-            </w:r>
-          </w:p>
-        </w:tc>
-        <w:tc>
-          <w:tcPr/>
-          <w:p>
-            <w:pPr>
-              <w:pStyle w:val="Compact"/>
-              <w:jc w:val="right"/>
-            </w:pPr>
-            <w:r>
-              <w:rPr>
-                <w:b/>
-                <w:bCs/>
-              </w:rPr>
-              <w:t xml:space="preserve">2,704,212</w:t>
-            </w:r>
-          </w:p>
-        </w:tc>
-        <w:tc>
-          <w:tcPr/>
-          <w:p>
-            <w:pPr>
-              <w:pStyle w:val="Compact"/>
-              <w:jc w:val="right"/>
-            </w:pPr>
-            <w:r>
-              <w:rPr>
-                <w:b/>
-                <w:bCs/>
-              </w:rPr>
-              <w:t xml:space="preserve">2,657,049</w:t>
-            </w:r>
-          </w:p>
-        </w:tc>
-        <w:tc>
-          <w:tcPr/>
-          <w:p>
-            <w:pPr>
-              <w:pStyle w:val="Compact"/>
-              <w:jc w:val="right"/>
-            </w:pPr>
-            <w:r>
-              <w:rPr>
-                <w:b/>
-                <w:bCs/>
-              </w:rPr>
-              <w:t xml:space="preserve">98.3%</w:t>
-            </w:r>
-          </w:p>
-        </w:tc>
-        <w:tc>
-          <w:tcPr/>
-          <w:p>
-            <w:pPr>
-              <w:pStyle w:val="Compact"/>
-              <w:jc w:val="right"/>
-            </w:pPr>
-            <w:r>
-              <w:rPr>
-                <w:b/>
-                <w:bCs/>
-              </w:rPr>
-              <w:t xml:space="preserve">95.7%</w:t>
-            </w:r>
-          </w:p>
-        </w:tc>
-        <w:tc>
-          <w:tcPr/>
-          <w:p>
-            <w:pPr>
-              <w:pStyle w:val="Compact"/>
-              <w:jc w:val="right"/>
-            </w:pPr>
-            <w:r>
-              <w:rPr>
-                <w:b/>
-                <w:bCs/>
-              </w:rPr>
-              <w:t xml:space="preserve">432,095</w:t>
-            </w:r>
-          </w:p>
-        </w:tc>
-        <w:tc>
-          <w:tcPr/>
-          <w:p>
-            <w:pPr>
-              <w:pStyle w:val="Compact"/>
-              <w:jc w:val="right"/>
-            </w:pPr>
-            <w:r>
-              <w:rPr>
-                <w:b/>
-                <w:bCs/>
-              </w:rPr>
-              <w:t xml:space="preserve">5,124,039</w:t>
-            </w:r>
-          </w:p>
-        </w:tc>
-      </w:tr>
-    </w:tbl>
-    <w:p>
-      <w:pPr>
-        <w:pStyle w:val="BodyText"/>
-      </w:pPr>
-      <w:r>
-        <w:rPr>
-          <w:b/>
-          <w:bCs/>
-        </w:rPr>
-        <w:t xml:space="preserve">Strategy.</w:t>
-      </w:r>
-      <w:r>
-        <w:t xml:space="preserve"> </w:t>
-      </w:r>
-      <w:r>
-        <w:t xml:space="preserve">One query per domain against the Wayback CDX index, filtered to in-window captures, written to an append-only journal that is ingested only once complete, so a killed batch loses no answered query.</w:t>
-      </w:r>
-      <w:r>
-        <w:t xml:space="preserve"> </w:t>
-      </w:r>
-      <w:r>
-        <w:rPr>
-          <w:b/>
-          <w:bCs/>
-        </w:rPr>
-        <w:t xml:space="preserve">Errors:</w:t>
-      </w:r>
-      <w:r>
-        <w:t xml:space="preserve"> </w:t>
-      </w:r>
-      <w:r>
-        <w:t xml:space="preserve">of 2,704,212 queries 2,657,049 were answered (98.3%); HTTP-level failures are 3,139 (0.12%), being 0 rate limits (429), 2,155 server errors and 984 refusals (403), while</w:t>
-      </w:r>
-      <w:r>
-        <w:t xml:space="preserve"> </w:t>
-      </w:r>
-      <w:r>
-        <w:rPr>
-          <w:b/>
-          <w:bCs/>
-        </w:rPr>
-        <w:t xml:space="preserve">transport-level failures are 44,024 (1.63%)</w:t>
-      </w:r>
-      <w:r>
-        <w:t xml:space="preserve">, 31,362 refused or reset and 12,662 timed out.</w:t>
-      </w:r>
-      <w:r>
-        <w:t xml:space="preserve"> </w:t>
-      </w:r>
-      <w:r>
-        <w:rPr>
-          <w:b/>
-          <w:bCs/>
-        </w:rPr>
-        <w:t xml:space="preserve">The binding constraint is not a status code we could obey but the connection being dropped before a status exists.</w:t>
-      </w:r>
-      <w:r>
-        <w:t xml:space="preserve"> </w:t>
-      </w:r>
-      <w:r>
-        <w:rPr>
-          <w:b/>
-          <w:bCs/>
-        </w:rPr>
-        <w:t xml:space="preserve">Handling:</w:t>
-      </w:r>
-      <w:r>
-        <w:t xml:space="preserve"> </w:t>
-      </w:r>
-      <w:r>
-        <w:t xml:space="preserve">rate limits and server errors retry with exponential backoff honouring</w:t>
-      </w:r>
-      <w:r>
-        <w:t xml:space="preserve"> </w:t>
-      </w:r>
-      <w:r>
-        <w:rPr>
-          <w:rStyle w:val="VerbatimChar"/>
-        </w:rPr>
-        <w:t xml:space="preserve">Retry-After</w:t>
-      </w:r>
-      <w:r>
-        <w:t xml:space="preserve">; refusals and timeouts retry with a widening delay and are then requeued, so no domain is lost to one failure; a 403 is a permanent answer for that host and is not retried.</w:t>
-      </w:r>
-    </w:p>
-    <w:bookmarkEnd w:id="14"/>
-    <w:bookmarkStart w:id="15" w:name="X99b668cb1240f976503aecfb4fa76fb2bc95673"/>
-    <w:p>
-      <w:pPr>
-        <w:pStyle w:val="Heading2"/>
-      </w:pPr>
-      <w:r>
-        <w:t xml:space="preserve">6. How the discovery ran, and where the human sits</w:t>
+        <w:t xml:space="preserve">5. Limitations, and whether to expand further</w:t>
       </w:r>
     </w:p>
     <w:p>
@@ -3362,26 +2928,25 @@
         <w:pStyle w:val="FirstParagraph"/>
       </w:pPr>
       <w:r>
-        <w:t xml:space="preserve">The system runs unattended for hours at a time and</w:t>
-      </w:r>
-      <w:r>
-        <w:t xml:space="preserve"> </w:t>
-      </w:r>
-      <w:r>
-        <w:rPr>
-          <w:b/>
-          <w:bCs/>
-        </w:rPr>
-        <w:t xml:space="preserve">never assigns a year on its own judgement</w:t>
-      </w:r>
-      <w:r>
-        <w:t xml:space="preserve">. That</w:t>
-      </w:r>
-      <w:r>
-        <w:t xml:space="preserve"> </w:t>
-      </w:r>
-      <w:r>
-        <w:t xml:space="preserve">split is the design, and it is what makes the output checkable.</w:t>
+        <w:t xml:space="preserve">A capture proves presence and never absence, so a year with no capture is unevidenced rather than</w:t>
+      </w:r>
+      <w:r>
+        <w:t xml:space="preserve"> </w:t>
+      </w:r>
+      <w:r>
+        <w:t xml:space="preserve">empty, and a creation date attests one year only. Neither route can invent a year; the mistake they</w:t>
+      </w:r>
+      <w:r>
+        <w:t xml:space="preserve"> </w:t>
+      </w:r>
+      <w:r>
+        <w:t xml:space="preserve">can make is omission. A material share of archive requests fail at transport level rather than with a</w:t>
+      </w:r>
+      <w:r>
+        <w:t xml:space="preserve"> </w:t>
+      </w:r>
+      <w:r>
+        <w:t xml:space="preserve">status code, which is throttling seen from the other side of the socket.</w:t>
       </w:r>
     </w:p>
     <w:p>
@@ -3393,25 +2958,37 @@
           <w:b/>
           <w:bCs/>
         </w:rPr>
-        <w:t xml:space="preserve">What ran.</w:t>
-      </w:r>
-      <w:r>
-        <w:t xml:space="preserve"> </w:t>
-      </w:r>
-      <w:r>
-        <w:t xml:space="preserve">Collectors are detached shell supervisors holding an absolute epoch deadline, so they</w:t>
-      </w:r>
-      <w:r>
-        <w:t xml:space="preserve"> </w:t>
-      </w:r>
-      <w:r>
-        <w:t xml:space="preserve">outlive the session that started them and a day of absence costs nothing. The agent spends its turns</w:t>
-      </w:r>
-      <w:r>
-        <w:t xml:space="preserve"> </w:t>
-      </w:r>
-      <w:r>
-        <w:t xml:space="preserve">hunting sources, measuring them against the store and pricing them, and writes no year itself.</w:t>
+        <w:t xml:space="preserve">Worth expanding, in order.</w:t>
+      </w:r>
+      <w:r>
+        <w:t xml:space="preserve"> </w:t>
+      </w:r>
+      <w:r>
+        <w:t xml:space="preserve">Bulk dated corpora first. Registry datasets publishing dates second,</w:t>
+      </w:r>
+      <w:r>
+        <w:t xml:space="preserve"> </w:t>
+      </w:r>
+      <w:r>
+        <w:t xml:space="preserve">the route that reaches 2001 where the archives are thin. Re-auditing material already on disk third,</w:t>
+      </w:r>
+      <w:r>
+        <w:t xml:space="preserve"> </w:t>
+      </w:r>
+      <w:r>
+        <w:t xml:space="preserve">which produced the largest single addition of this round and cost nothing. Fourth and slowest, but</w:t>
+      </w:r>
+      <w:r>
+        <w:t xml:space="preserve"> </w:t>
+      </w:r>
+      <w:r>
+        <w:t xml:space="preserve">still viable indefinitely: keep querying the archives, RDAP and registry databases, which is the one</w:t>
+      </w:r>
+      <w:r>
+        <w:t xml:space="preserve"> </w:t>
+      </w:r>
+      <w:r>
+        <w:t xml:space="preserve">route with no supply limit and a measured rate we can plan against.</w:t>
       </w:r>
     </w:p>
     <w:p>
@@ -3423,290 +3000,58 @@
           <w:b/>
           <w:bCs/>
         </w:rPr>
-        <w:t xml:space="preserve">What worked and what did not.</w:t>
-      </w:r>
-      <w:r>
-        <w:t xml:space="preserve"> </w:t>
-      </w:r>
-      <w:r>
-        <w:t xml:space="preserve">One clear written instruction from the supervisor, then unattended</w:t>
-      </w:r>
-      <w:r>
-        <w:t xml:space="preserve"> </w:t>
-      </w:r>
-      <w:r>
-        <w:t xml:space="preserve">running, worked: it is how this round's sources were found. Detached collectors with absolute deadlines</w:t>
-      </w:r>
-      <w:r>
-        <w:t xml:space="preserve"> </w:t>
-      </w:r>
-      <w:r>
-        <w:t xml:space="preserve">worked, and kept collecting through a day when the agent was unreachable.</w:t>
-      </w:r>
-      <w:r>
-        <w:t xml:space="preserve"> </w:t>
+        <w:t xml:space="preserve">Less promising, on this round's measurements, because saturation is higher than the sources are</w:t>
       </w:r>
       <w:r>
         <w:rPr>
           <w:b/>
           <w:bCs/>
         </w:rPr>
-        <w:t xml:space="preserve">Scheduled wake-ups did</w:t>
+        <w:t xml:space="preserve"> </w:t>
       </w:r>
       <w:r>
         <w:rPr>
           <w:b/>
           <w:bCs/>
         </w:rPr>
-        <w:t xml:space="preserve"> </w:t>
-      </w:r>
-      <w:r>
-        <w:rPr>
-          <w:b/>
-          <w:bCs/>
-        </w:rPr>
-        <w:t xml:space="preserve">not</w:t>
-      </w:r>
-      <w:r>
-        <w:t xml:space="preserve">: the agent answered only some firings.</w:t>
-      </w:r>
-      <w:r>
-        <w:t xml:space="preserve"> </w:t>
-      </w:r>
-      <w:r>
-        <w:rPr>
-          <w:b/>
-          <w:bCs/>
-        </w:rPr>
-        <w:t xml:space="preserve">A self-scheduling loop did not hold</w:t>
-      </w:r>
-      <w:r>
-        <w:t xml:space="preserve"> </w:t>
-      </w:r>
-      <w:r>
-        <w:t xml:space="preserve">either, tried</w:t>
-      </w:r>
-      <w:r>
-        <w:t xml:space="preserve"> </w:t>
-      </w:r>
-      <w:r>
-        <w:t xml:space="preserve">once. So the durable pattern is a human-written objective plus processes that do not depend on the</w:t>
-      </w:r>
-      <w:r>
-        <w:t xml:space="preserve"> </w:t>
-      </w:r>
-      <w:r>
-        <w:t xml:space="preserve">agent being awake.</w:t>
+        <w:t xml:space="preserve">long</w:t>
+      </w:r>
+      <w:r>
+        <w:t xml:space="preserve">: academic repositories and DOI datasets, national web-archive indexes, preserved CD-ROM media,</w:t>
+      </w:r>
+      <w:r>
+        <w:t xml:space="preserve"> </w:t>
+      </w:r>
+      <w:r>
+        <w:t xml:space="preserve">trade directories of internet businesses, FTP-mirror archive listings, and prose corpora. Each was</w:t>
+      </w:r>
+      <w:r>
+        <w:t xml:space="preserve"> </w:t>
+      </w:r>
+      <w:r>
+        <w:t xml:space="preserve">measured rather than assumed, and the measurement is in</w:t>
+      </w:r>
+      <w:r>
+        <w:t xml:space="preserve"> </w:t>
+      </w:r>
+      <w:r>
+        <w:rPr>
+          <w:rStyle w:val="VerbatimChar"/>
+        </w:rPr>
+        <w:t xml:space="preserve">sources.md</w:t>
+      </w:r>
+      <w:r>
+        <w:t xml:space="preserve">.</w:t>
       </w:r>
     </w:p>
-    <w:p>
-      <w:pPr>
-        <w:pStyle w:val="BodyText"/>
-      </w:pPr>
-      <w:r>
-        <w:rPr>
-          <w:b/>
-          <w:bCs/>
-        </w:rPr>
-        <w:t xml:space="preserve">Where the human sits.</w:t>
-      </w:r>
-      <w:r>
-        <w:t xml:space="preserve"> </w:t>
-      </w:r>
-      <w:r>
-        <w:t xml:space="preserve">The agent runs the two collection engines, which are mechanical, and it may</w:t>
-      </w:r>
-      <w:r>
-        <w:t xml:space="preserve"> </w:t>
-      </w:r>
-      <w:r>
-        <w:t xml:space="preserve">re-run anything already decided. Everything else goes onto an approval list with a measured figure and</w:t>
-      </w:r>
-      <w:r>
-        <w:t xml:space="preserve"> </w:t>
-      </w:r>
-      <w:r>
-        <w:t xml:space="preserve">primary links. The supervisor works through that list source by source, opens the links, checks the</w:t>
-      </w:r>
-      <w:r>
-        <w:t xml:space="preserve"> </w:t>
-      </w:r>
-      <w:r>
-        <w:t xml:space="preserve">dating argument, and rules per source: master, candidate-only or rejected.</w:t>
-      </w:r>
-      <w:r>
-        <w:t xml:space="preserve"> </w:t>
-      </w:r>
-      <w:r>
-        <w:rPr>
-          <w:b/>
-          <w:bCs/>
-        </w:rPr>
-        <w:t xml:space="preserve">This is enforced in code</w:t>
-      </w:r>
-      <w:r>
-        <w:rPr>
-          <w:b/>
-          <w:bCs/>
-        </w:rPr>
-        <w:t xml:space="preserve"> </w:t>
-      </w:r>
-      <w:r>
-        <w:rPr>
-          <w:b/>
-          <w:bCs/>
-        </w:rPr>
-        <w:t xml:space="preserve">rather than by habit</w:t>
-      </w:r>
-      <w:r>
-        <w:t xml:space="preserve">:</w:t>
-      </w:r>
-      <w:r>
-        <w:t xml:space="preserve"> </w:t>
-      </w:r>
-      <w:r>
-        <w:rPr>
-          <w:rStyle w:val="VerbatimChar"/>
-        </w:rPr>
-        <w:t xml:space="preserve">ark ingest</w:t>
-      </w:r>
-      <w:r>
-        <w:t xml:space="preserve"> </w:t>
-      </w:r>
-      <w:r>
-        <w:t xml:space="preserve">refuses to run for a class with no written</w:t>
-      </w:r>
-      <w:r>
-        <w:t xml:space="preserve"> </w:t>
-      </w:r>
-      <w:r>
-        <w:rPr>
-          <w:rStyle w:val="VerbatimChar"/>
-        </w:rPr>
-        <w:t xml:space="preserve">Decision:</w:t>
-      </w:r>
-      <w:r>
-        <w:t xml:space="preserve"> </w:t>
-      </w:r>
-      <w:r>
-        <w:t xml:space="preserve">line, and</w:t>
-      </w:r>
-      <w:r>
-        <w:t xml:space="preserve"> </w:t>
-      </w:r>
-      <w:r>
-        <w:t xml:space="preserve">it refused twice in this round until the decision existed.</w:t>
-      </w:r>
-    </w:p>
-    <w:p>
-      <w:pPr>
-        <w:pStyle w:val="BodyText"/>
-      </w:pPr>
-      <w:r>
-        <w:rPr>
-          <w:b/>
-          <w:bCs/>
-        </w:rPr>
-        <w:t xml:space="preserve">What that gate is worth, measured.</w:t>
-      </w:r>
-      <w:r>
-        <w:t xml:space="preserve"> </w:t>
-      </w:r>
-      <w:r>
-        <w:t xml:space="preserve">11 sources were admitted in this round, each on a</w:t>
-      </w:r>
-      <w:r>
-        <w:t xml:space="preserve"> </w:t>
-      </w:r>
-      <w:r>
-        <w:t xml:space="preserve">separate written decision. The candidate pool accumulated 575,417 strings under namespaces that never</w:t>
-      </w:r>
-      <w:r>
-        <w:t xml:space="preserve"> </w:t>
-      </w:r>
-      <w:r>
-        <w:t xml:space="preserve">allowed arbitrary registration and</w:t>
-      </w:r>
-      <w:r>
-        <w:t xml:space="preserve"> </w:t>
-      </w:r>
-      <w:r>
-        <w:rPr>
-          <w:b/>
-          <w:bCs/>
-        </w:rPr>
-        <w:t xml:space="preserve">not one reached an annual file</w:t>
-      </w:r>
-      <w:r>
-        <w:t xml:space="preserve">. Twelve invariants run before</w:t>
-      </w:r>
-      <w:r>
-        <w:t xml:space="preserve"> </w:t>
-      </w:r>
-      <w:r>
-        <w:t xml:space="preserve">every commit and again inside the shipped archive; one of them caught a defect in this round, an</w:t>
-      </w:r>
-      <w:r>
-        <w:t xml:space="preserve"> </w:t>
-      </w:r>
-      <w:r>
-        <w:t xml:space="preserve">evidence value citing a page's date for a row dated from its own column, which was a wrong citation</w:t>
-      </w:r>
-      <w:r>
-        <w:t xml:space="preserve"> </w:t>
-      </w:r>
-      <w:r>
-        <w:t xml:space="preserve">rather than a wrong year.</w:t>
-      </w:r>
-    </w:p>
-    <w:p>
-      <w:pPr>
-        <w:pStyle w:val="BodyText"/>
-      </w:pPr>
-      <w:r>
-        <w:rPr>
-          <w:b/>
-          <w:bCs/>
-        </w:rPr>
-        <w:t xml:space="preserve">Negative results are recorded as first-class.</w:t>
-      </w:r>
-      <w:r>
-        <w:t xml:space="preserve"> </w:t>
-      </w:r>
-      <w:r>
-        <w:rPr>
-          <w:b/>
-          <w:bCs/>
-        </w:rPr>
-        <w:t xml:space="preserve">252 source families have been searched and recorded</w:t>
-      </w:r>
-      <w:r>
-        <w:t xml:space="preserve">, 44 developed far enough to earn their own section and 208 evaluated and closed, each with the measurement that closed it, so negative results stay visible and the same ground is not broken twice.</w:t>
-      </w:r>
-      <w:r>
-        <w:t xml:space="preserve"> </w:t>
-      </w:r>
-      <w:r>
-        <w:rPr>
-          <w:rStyle w:val="VerbatimChar"/>
-        </w:rPr>
-        <w:t xml:space="preserve">sources.md</w:t>
-      </w:r>
-      <w:r>
-        <w:t xml:space="preserve"> </w:t>
-      </w:r>
-      <w:r>
-        <w:t xml:space="preserve">ships beside this report and names every one, with its acquisition route, date semantics and yield.</w:t>
-      </w:r>
-    </w:p>
-    <w:bookmarkEnd w:id="15"/>
-    <w:bookmarkStart w:id="16" w:name="X4a6f6c729123236c216b124741eb5cbb6d612e6"/>
+    <w:bookmarkEnd w:id="14"/>
+    <w:bookmarkStart w:id="15" w:name="Xdb607c1ad2844399e8c98d4b1d379171dce7862"/>
     <w:p>
       <w:pPr>
         <w:pStyle w:val="Heading2"/>
       </w:pPr>
       <w:r>
-        <w:t xml:space="preserve">7. Limitations, and whether to expand further</w:t>
+        <w:t xml:space="preserve">6. Merge, overlap and reconciliation</w:t>
       </w:r>
     </w:p>
     <w:p>
@@ -3714,107 +3059,6 @@
         <w:pStyle w:val="FirstParagraph"/>
       </w:pPr>
       <w:r>
-        <w:t xml:space="preserve">A capture proves presence and never absence, so a year with no capture is unevidenced rather than</w:t>
-      </w:r>
-      <w:r>
-        <w:t xml:space="preserve"> </w:t>
-      </w:r>
-      <w:r>
-        <w:t xml:space="preserve">empty, and a creation date attests one year only. Neither route can invent a year; the mistake they can</w:t>
-      </w:r>
-      <w:r>
-        <w:t xml:space="preserve"> </w:t>
-      </w:r>
-      <w:r>
-        <w:t xml:space="preserve">make is omission. A material share of archive requests fail at transport level rather than with a</w:t>
-      </w:r>
-      <w:r>
-        <w:t xml:space="preserve"> </w:t>
-      </w:r>
-      <w:r>
-        <w:t xml:space="preserve">status code, which is throttling seen from the other side of the socket.</w:t>
-      </w:r>
-    </w:p>
-    <w:p>
-      <w:pPr>
-        <w:pStyle w:val="BodyText"/>
-      </w:pPr>
-      <w:r>
-        <w:rPr>
-          <w:b/>
-          <w:bCs/>
-        </w:rPr>
-        <w:t xml:space="preserve">Worth expanding, in order.</w:t>
-      </w:r>
-      <w:r>
-        <w:t xml:space="preserve"> </w:t>
-      </w:r>
-      <w:r>
-        <w:t xml:space="preserve">Bulk dated corpora first. Registry datasets publishing dates second,</w:t>
-      </w:r>
-      <w:r>
-        <w:t xml:space="preserve"> </w:t>
-      </w:r>
-      <w:r>
-        <w:t xml:space="preserve">the route that reaches 2001 where archives are thin. Re-auditing material already on disk third, which</w:t>
-      </w:r>
-      <w:r>
-        <w:t xml:space="preserve"> </w:t>
-      </w:r>
-      <w:r>
-        <w:t xml:space="preserve">produced the largest single addition of this round.</w:t>
-      </w:r>
-      <w:r>
-        <w:t xml:space="preserve"> </w:t>
-      </w:r>
-      <w:r>
-        <w:rPr>
-          <w:b/>
-          <w:bCs/>
-        </w:rPr>
-        <w:t xml:space="preserve">Closed with measurements this round</w:t>
-      </w:r>
-      <w:r>
-        <w:t xml:space="preserve">, so not</w:t>
-      </w:r>
-      <w:r>
-        <w:t xml:space="preserve"> </w:t>
-      </w:r>
-      <w:r>
-        <w:t xml:space="preserve">worth repeating: academic repositories and DOI datasets, national web-archive indexes, preserved CD-ROM</w:t>
-      </w:r>
-      <w:r>
-        <w:t xml:space="preserve"> </w:t>
-      </w:r>
-      <w:r>
-        <w:t xml:space="preserve">media, trade directories of internet businesses, FTP-mirror archive listings, and prose corpora.</w:t>
-      </w:r>
-    </w:p>
-    <w:bookmarkEnd w:id="16"/>
-    <w:bookmarkStart w:id="17" w:name="Xd846cf4fe1f26bacccf7aec4008d63f1ecd80ea"/>
-    <w:p>
-      <w:pPr>
-        <w:pStyle w:val="Heading2"/>
-      </w:pPr>
-      <w:r>
-        <w:t xml:space="preserve">8. Merge, overlap and reconciliation</w:t>
-      </w:r>
-    </w:p>
-    <w:p>
-      <w:pPr>
-        <w:pStyle w:val="FirstParagraph"/>
-      </w:pPr>
-      <w:r>
-        <w:rPr>
-          <w:b/>
-          <w:bCs/>
-        </w:rPr>
-        <w:t xml:space="preserve">Computed here, not described.</w:t>
-      </w:r>
-      <w:r>
-        <w:t xml:space="preserve"> </w:t>
-      </w:r>
-      <w:r>
         <w:rPr>
           <w:rStyle w:val="VerbatimChar"/>
         </w:rPr>
@@ -3824,19 +3068,19 @@
         <w:t xml:space="preserve"> </w:t>
       </w:r>
       <w:r>
-        <w:t xml:space="preserve">unions these</w:t>
-      </w:r>
-      <w:r>
-        <w:t xml:space="preserve"> </w:t>
-      </w:r>
-      <w:r>
-        <w:t xml:space="preserve">additions into the current baseline, deduplicated on the lowercased line within</w:t>
-      </w:r>
-      <w:r>
-        <w:t xml:space="preserve"> </w:t>
-      </w:r>
-      <w:r>
-        <w:t xml:space="preserve">each year, and scores every file with your own calculator. Per-year form in</w:t>
+        <w:t xml:space="preserve">unions these additions into the current baseline,</w:t>
+      </w:r>
+      <w:r>
+        <w:t xml:space="preserve"> </w:t>
+      </w:r>
+      <w:r>
+        <w:t xml:space="preserve">deduplicated on the lowercased line within each year, and scores every file with your</w:t>
+      </w:r>
+      <w:r>
+        <w:t xml:space="preserve"> </w:t>
+      </w:r>
+      <w:r>
+        <w:t xml:space="preserve">own calculator. Per-year form in</w:t>
       </w:r>
       <w:r>
         <w:t xml:space="preserve"> </w:t>
@@ -3848,7 +3092,13 @@
         <w:t xml:space="preserve">audit/merge_stats_ark_*.csv</w:t>
       </w:r>
       <w:r>
-        <w:t xml:space="preserve">, in your column names so the two audits diff directly.</w:t>
+        <w:t xml:space="preserve">, in your column names</w:t>
+      </w:r>
+      <w:r>
+        <w:t xml:space="preserve"> </w:t>
+      </w:r>
+      <w:r>
+        <w:t xml:space="preserve">so the two audits diff directly.</w:t>
       </w:r>
     </w:p>
     <w:tbl>
@@ -4107,16 +3357,19 @@
           <w:b/>
           <w:bCs/>
         </w:rPr>
-        <w:t xml:space="preserve">22 of 22 reconciliation checks pass</w:t>
-      </w:r>
-      <w:r>
-        <w:t xml:space="preserve">, all arithmetic identities,</w:t>
-      </w:r>
-      <w:r>
-        <w:t xml:space="preserve"> </w:t>
-      </w:r>
-      <w:r>
-        <w:t xml:space="preserve">so a failure would be a defect rather than a finding: per year that</w:t>
+        <w:t xml:space="preserve">22 of 22 reconciliation checks pass.</w:t>
+      </w:r>
+      <w:r>
+        <w:t xml:space="preserve"> </w:t>
+      </w:r>
+      <w:r>
+        <w:t xml:space="preserve">All are arithmetic</w:t>
+      </w:r>
+      <w:r>
+        <w:t xml:space="preserve"> </w:t>
+      </w:r>
+      <w:r>
+        <w:t xml:space="preserve">identities, so a failure would be a defect rather than a finding: per year that</w:t>
       </w:r>
       <w:r>
         <w:t xml:space="preserve"> </w:t>
@@ -4128,10 +3381,19 @@
         <w:t xml:space="preserve">baseline_unique + accepted_new == merged_unique</w:t>
       </w:r>
       <w:r>
-        <w:t xml:space="preserve"> </w:t>
-      </w:r>
-      <w:r>
-        <w:t xml:space="preserve">and</w:t>
+        <w:t xml:space="preserve">, that the per-year increments sum</w:t>
+      </w:r>
+      <w:r>
+        <w:t xml:space="preserve"> </w:t>
+      </w:r>
+      <w:r>
+        <w:t xml:space="preserve">to the headline, and that a freshly measured baseline reproduces the totals this</w:t>
+      </w:r>
+      <w:r>
+        <w:t xml:space="preserve"> </w:t>
+      </w:r>
+      <w:r>
+        <w:t xml:space="preserve">round was measured against. Each is listed with its verdict in</w:t>
       </w:r>
       <w:r>
         <w:t xml:space="preserve"> </w:t>
@@ -4140,50 +3402,20 @@
         <w:rPr>
           <w:rStyle w:val="VerbatimChar"/>
         </w:rPr>
-        <w:t xml:space="preserve">already_in_baseline + accepted_new == submitted_unique</w:t>
-      </w:r>
-      <w:r>
-        <w:t xml:space="preserve">, that the per-year</w:t>
-      </w:r>
-      <w:r>
-        <w:t xml:space="preserve"> </w:t>
-      </w:r>
-      <w:r>
-        <w:t xml:space="preserve">increments sum to the headline figure, and that a freshly measured baseline</w:t>
-      </w:r>
-      <w:r>
-        <w:t xml:space="preserve"> </w:t>
-      </w:r>
-      <w:r>
-        <w:t xml:space="preserve">reproduces the totals this round was measured against. Each is listed with its</w:t>
-      </w:r>
-      <w:r>
-        <w:t xml:space="preserve"> </w:t>
-      </w:r>
-      <w:r>
-        <w:t xml:space="preserve">verdict in</w:t>
-      </w:r>
-      <w:r>
-        <w:t xml:space="preserve"> </w:t>
-      </w:r>
-      <w:r>
-        <w:rPr>
-          <w:rStyle w:val="VerbatimChar"/>
-        </w:rPr>
         <w:t xml:space="preserve">audit/merge_audit_ark_*.json</w:t>
       </w:r>
       <w:r>
         <w:t xml:space="preserve">.</w:t>
       </w:r>
     </w:p>
-    <w:bookmarkEnd w:id="17"/>
-    <w:bookmarkStart w:id="18" w:name="X8529bcd92c1d78bcbe2d3eb29b1475114e5f12a"/>
+    <w:bookmarkEnd w:id="15"/>
+    <w:bookmarkStart w:id="16" w:name="X6bb067efc45c82151fb24e0d6dd9c8b58bab51a"/>
     <w:p>
       <w:pPr>
         <w:pStyle w:val="Heading2"/>
       </w:pPr>
       <w:r>
-        <w:t xml:space="preserve">9. Reproduction, and the four requested artifacts</w:t>
+        <w:t xml:space="preserve">7. Reproduction, and the four requested artifacts</w:t>
       </w:r>
     </w:p>
     <w:p>
@@ -4272,7 +3504,28 @@
         <w:t xml:space="preserve"> </w:t>
       </w:r>
       <w:r>
-        <w:t xml:space="preserve">(domain, year) joined to the evidence row justifying it. A fresh copy of this archive was extracted and put through the route above before sending. Checksums</w:t>
+        <w:t xml:space="preserve">(domain, year) joined to the evidence row justifying it, and</w:t>
+      </w:r>
+      <w:r>
+        <w:t xml:space="preserve"> </w:t>
+      </w:r>
+      <w:r>
+        <w:rPr>
+          <w:rStyle w:val="VerbatimChar"/>
+        </w:rPr>
+        <w:t xml:space="preserve">logs/</w:t>
+      </w:r>
+      <w:r>
+        <w:t xml:space="preserve"> </w:t>
+      </w:r>
+      <w:r>
+        <w:t xml:space="preserve">the collectors' execution logs.</w:t>
+      </w:r>
+      <w:r>
+        <w:t xml:space="preserve"> </w:t>
+      </w:r>
+      <w:r>
+        <w:t xml:space="preserve">A fresh copy of this archive was extracted and put through the route above before sending. Checksums</w:t>
       </w:r>
       <w:r>
         <w:t xml:space="preserve"> </w:t>
@@ -4583,7 +3836,7 @@
               <w:pStyle w:val="Compact"/>
             </w:pPr>
             <w:r>
-              <w:t xml:space="preserve">section 8,</w:t>
+              <w:t xml:space="preserve">section 6,</w:t>
             </w:r>
             <w:r>
               <w:t xml:space="preserve"> </w:t>
@@ -4681,8 +3934,8 @@
         <w:t xml:space="preserve">checks all four inside a fresh extraction, so none can ship unmet.</w:t>
       </w:r>
     </w:p>
-    <w:bookmarkEnd w:id="18"/>
-    <w:bookmarkEnd w:id="19"/>
+    <w:bookmarkEnd w:id="16"/>
+    <w:bookmarkEnd w:id="17"/>
     <w:sectPr>
       <w:pgMar w:bottom="1080" w:footer="720" w:gutter="0" w:header="720" w:left="1080" w:right="1080" w:top="1080"/>
       <w:footnotePr>

</xml_diff>

<commit_message>
Cut the merge table's two rows that repeat section 1
Section 6 restated the baseline and the increment that section 1 already gives,
in a five-row table. It now carries the three lines the merge identity needs,
baseline plus accepted equals post-merge, with the zero overlap in a sentence
where a reader will read it rather than in a row he has already seen.
</commit_message>
<xml_diff>
--- a/docs/report.docx
+++ b/docs/report.docx
@@ -3203,18 +3203,26 @@
               <w:pStyle w:val="Compact"/>
             </w:pPr>
             <w:r>
-              <w:t xml:space="preserve">submitted</w:t>
-            </w:r>
-          </w:p>
-        </w:tc>
-        <w:tc>
-          <w:tcPr/>
-          <w:p>
-            <w:pPr>
-              <w:pStyle w:val="Compact"/>
-              <w:jc w:val="right"/>
-            </w:pPr>
-            <w:r>
+              <w:rPr>
+                <w:b/>
+                <w:bCs/>
+              </w:rPr>
+              <w:t xml:space="preserve">accepted increment</w:t>
+            </w:r>
+          </w:p>
+        </w:tc>
+        <w:tc>
+          <w:tcPr/>
+          <w:p>
+            <w:pPr>
+              <w:pStyle w:val="Compact"/>
+              <w:jc w:val="right"/>
+            </w:pPr>
+            <w:r>
+              <w:rPr>
+                <w:b/>
+                <w:bCs/>
+              </w:rPr>
               <w:t xml:space="preserve">1,929,655</w:t>
             </w:r>
           </w:p>
@@ -3224,7 +3232,15 @@
           <w:p>
             <w:pPr>
               <w:pStyle w:val="Compact"/>
-            </w:pPr>
+              <w:jc w:val="right"/>
+            </w:pPr>
+            <w:r>
+              <w:rPr>
+                <w:b/>
+                <w:bCs/>
+              </w:rPr>
+              <w:t xml:space="preserve">713,481.4198</w:t>
+            </w:r>
           </w:p>
         </w:tc>
       </w:tr>
@@ -3236,88 +3252,6 @@
               <w:pStyle w:val="Compact"/>
             </w:pPr>
             <w:r>
-              <w:t xml:space="preserve">already in the baseline</w:t>
-            </w:r>
-          </w:p>
-        </w:tc>
-        <w:tc>
-          <w:tcPr/>
-          <w:p>
-            <w:pPr>
-              <w:pStyle w:val="Compact"/>
-              <w:jc w:val="right"/>
-            </w:pPr>
-            <w:r>
-              <w:t xml:space="preserve">0</w:t>
-            </w:r>
-          </w:p>
-        </w:tc>
-        <w:tc>
-          <w:tcPr/>
-          <w:p>
-            <w:pPr>
-              <w:pStyle w:val="Compact"/>
-            </w:pPr>
-          </w:p>
-        </w:tc>
-      </w:tr>
-      <w:tr>
-        <w:tc>
-          <w:tcPr/>
-          <w:p>
-            <w:pPr>
-              <w:pStyle w:val="Compact"/>
-            </w:pPr>
-            <w:r>
-              <w:rPr>
-                <w:b/>
-                <w:bCs/>
-              </w:rPr>
-              <w:t xml:space="preserve">accepted increment</w:t>
-            </w:r>
-          </w:p>
-        </w:tc>
-        <w:tc>
-          <w:tcPr/>
-          <w:p>
-            <w:pPr>
-              <w:pStyle w:val="Compact"/>
-              <w:jc w:val="right"/>
-            </w:pPr>
-            <w:r>
-              <w:rPr>
-                <w:b/>
-                <w:bCs/>
-              </w:rPr>
-              <w:t xml:space="preserve">1,929,655</w:t>
-            </w:r>
-          </w:p>
-        </w:tc>
-        <w:tc>
-          <w:tcPr/>
-          <w:p>
-            <w:pPr>
-              <w:pStyle w:val="Compact"/>
-              <w:jc w:val="right"/>
-            </w:pPr>
-            <w:r>
-              <w:rPr>
-                <w:b/>
-                <w:bCs/>
-              </w:rPr>
-              <w:t xml:space="preserve">713,481.4198</w:t>
-            </w:r>
-          </w:p>
-        </w:tc>
-      </w:tr>
-      <w:tr>
-        <w:tc>
-          <w:tcPr/>
-          <w:p>
-            <w:pPr>
-              <w:pStyle w:val="Compact"/>
-            </w:pPr>
-            <w:r>
               <w:t xml:space="preserve">post-merge total</w:t>
             </w:r>
           </w:p>
@@ -3348,6 +3282,21 @@
         </w:tc>
       </w:tr>
     </w:tbl>
+    <w:p>
+      <w:pPr>
+        <w:pStyle w:val="BodyText"/>
+      </w:pPr>
+      <w:r>
+        <w:rPr>
+          <w:b/>
+          <w:bCs/>
+        </w:rPr>
+        <w:t xml:space="preserve">Overlap with the baseline is 0 records</w:t>
+      </w:r>
+      <w:r>
+        <w:t xml:space="preserve">, so all 1,929,655 submitted are accepted and nothing counts twice.</w:t>
+      </w:r>
+    </w:p>
     <w:p>
       <w:pPr>
         <w:pStyle w:val="BodyText"/>

</xml_diff>

<commit_message>
Rewrite the reproduction statement from tonight's run
It described an 18 August build: "all four checks in verify.sh", which has eight,
and "all eleven invariants", which contradicted the twelve stated fifty lines
earlier in the same report. Replaced with what was actually run against this
archive tonight: a fresh extraction, every verify.sh check passing, trace.py
resolving, the tier-2 rebuild returning every per-year count with twelve
invariants passing and thirteen result files byte-identical, and the honest note
that tier 3 would now replay every source but the one whose journals are held back.
</commit_message>
<xml_diff>
--- a/docs/report.docx
+++ b/docs/report.docx
@@ -3620,13 +3620,7 @@
         <w:t xml:space="preserve"> </w:t>
       </w:r>
       <w:r>
-        <w:t xml:space="preserve">A fresh copy of this archive was extracted and put through the route above before sending. Checksums</w:t>
-      </w:r>
-      <w:r>
-        <w:t xml:space="preserve"> </w:t>
-      </w:r>
-      <w:r>
-        <w:t xml:space="preserve">and all four checks in</w:t>
+        <w:t xml:space="preserve">A fresh copy of this archive was extracted and put through the route above before sending. Every check in</w:t>
       </w:r>
       <w:r>
         <w:t xml:space="preserve"> </w:t>
@@ -3641,7 +3635,7 @@
         <w:t xml:space="preserve"> </w:t>
       </w:r>
       <w:r>
-        <w:t xml:space="preserve">pass,</w:t>
+        <w:t xml:space="preserve">passes,</w:t>
       </w:r>
       <w:r>
         <w:t xml:space="preserve"> </w:t>
@@ -3656,7 +3650,7 @@
         <w:t xml:space="preserve"> </w:t>
       </w:r>
       <w:r>
-        <w:t xml:space="preserve">resolves, the rebuild from</w:t>
+        <w:t xml:space="preserve">resolves, and the tier-2 rebuild from</w:t>
       </w:r>
       <w:r>
         <w:t xml:space="preserve"> </w:t>
@@ -3677,19 +3671,19 @@
         <w:t xml:space="preserve"> </w:t>
       </w:r>
       <w:r>
-        <w:t xml:space="preserve">every per-year count exactly with all eleven invariants passing, and all fourteen result files come back</w:t>
-      </w:r>
-      <w:r>
-        <w:t xml:space="preserve"> </w:t>
-      </w:r>
-      <w:r>
-        <w:t xml:space="preserve">byte-identical. Tier 3 was not run: it is a roughly 50 GB download and two of this project's own</w:t>
-      </w:r>
-      <w:r>
-        <w:t xml:space="preserve"> </w:t>
-      </w:r>
-      <w:r>
-        <w:t xml:space="preserve">collectors were querying the Internet Archive at the time.</w:t>
+        <w:t xml:space="preserve">every per-year count exactly, with all twelve invariants passing and all thirteen result files</w:t>
+      </w:r>
+      <w:r>
+        <w:t xml:space="preserve"> </w:t>
+      </w:r>
+      <w:r>
+        <w:t xml:space="preserve">byte-identical to the ones shipped here. Tier 3 was not run: it is a roughly 50 GB download, and one</w:t>
+      </w:r>
+      <w:r>
+        <w:t xml:space="preserve"> </w:t>
+      </w:r>
+      <w:r>
+        <w:t xml:space="preserve">collector's journals are held out of this archive on size, so it would replay every source but that one.</w:t>
       </w:r>
     </w:p>
     <w:tbl>

</xml_diff>

<commit_message>
Stage the round: mandatory archive naming, hostname files and saturation ledger in the package, hostname figures in report and email, the shipping filter applied to every quoted figure, and a submit-prep recipe
</commit_message>
<xml_diff>
--- a/docs/report.docx
+++ b/docs/report.docx
@@ -2,13 +2,13 @@
 <file path=word/document.xml><?xml version="1.0" encoding="utf-8"?>
 <w:document xmlns:w="http://schemas.openxmlformats.org/wordprocessingml/2006/main" xmlns:m="http://schemas.openxmlformats.org/officeDocument/2006/math" xmlns:r="http://schemas.openxmlformats.org/officeDocument/2006/relationships" xmlns:o="urn:schemas-microsoft-com:office:office" xmlns:v="urn:schemas-microsoft-com:vml" xmlns:w10="urn:schemas-microsoft-com:office:word" xmlns:a="http://schemas.openxmlformats.org/drawingml/2006/main" xmlns:pic="http://schemas.openxmlformats.org/drawingml/2006/picture" xmlns:wp="http://schemas.openxmlformats.org/drawingml/2006/wordprocessingDrawing">
   <w:body>
-    <w:bookmarkStart w:id="18" w:name="internet-digital-ark-round-6"/>
+    <w:bookmarkStart w:id="17" w:name="internet-digital-ark-round-7"/>
     <w:p>
       <w:pPr>
         <w:pStyle w:val="Heading1"/>
       </w:pPr>
       <w:r>
-        <w:t xml:space="preserve">Internet Digital Ark: round 6</w:t>
+        <w:t xml:space="preserve">Internet Digital Ark: round 7</w:t>
       </w:r>
     </w:p>
     <w:p>
@@ -25,7 +25,7 @@
         <w:rPr>
           <w:rStyle w:val="VerbatimChar"/>
         </w:rPr>
-        <w:t xml:space="preserve">merged260821</w:t>
+        <w:t xml:space="preserve">merged260901</w:t>
       </w:r>
       <w:r>
         <w:t xml:space="preserve">. Every figure below is</w:t>
@@ -97,7 +97,7 @@
               <w:jc w:val="right"/>
             </w:pPr>
             <w:r>
-              <w:t xml:space="preserve">25,064,981</w:t>
+              <w:t xml:space="preserve">33,848,926</w:t>
             </w:r>
           </w:p>
         </w:tc>
@@ -122,7 +122,7 @@
               <w:jc w:val="right"/>
             </w:pPr>
             <w:r>
-              <w:t xml:space="preserve">13,362,368.8792</w:t>
+              <w:t xml:space="preserve">17,770,588.9026</w:t>
             </w:r>
           </w:p>
         </w:tc>
@@ -151,7 +151,7 @@
                 <w:b/>
                 <w:bCs/>
               </w:rPr>
-              <w:t xml:space="preserve">1,929,655</w:t>
+              <w:t xml:space="preserve">623,758</w:t>
             </w:r>
             <w:r>
               <w:t xml:space="preserve"> </w:t>
@@ -186,7 +186,7 @@
                 <w:b/>
                 <w:bCs/>
               </w:rPr>
-              <w:t xml:space="preserve">713,481.4198</w:t>
+              <w:t xml:space="preserve">328,641.8759</w:t>
             </w:r>
           </w:p>
         </w:tc>
@@ -215,7 +215,7 @@
                 <w:b/>
                 <w:bCs/>
               </w:rPr>
-              <w:t xml:space="preserve">5.3395%</w:t>
+              <w:t xml:space="preserve">1.8494%</w:t>
             </w:r>
           </w:p>
         </w:tc>
@@ -226,7 +226,7 @@
         <w:pStyle w:val="BodyText"/>
       </w:pPr>
       <w:r>
-        <w:t xml:space="preserve">The increment covers 1,660,226 distinct domains, of which</w:t>
+        <w:t xml:space="preserve">Separately, this round ships</w:t>
       </w:r>
       <w:r>
         <w:t xml:space="preserve"> </w:t>
@@ -236,7 +236,68 @@
           <w:b/>
           <w:bCs/>
         </w:rPr>
-        <w:t xml:space="preserve">666,779 appear in none of the six</w:t>
+        <w:t xml:space="preserve">338,865 hostname records (301,649.9813 equivalent-English)</w:t>
+      </w:r>
+      <w:r>
+        <w:t xml:space="preserve"> </w:t>
+      </w:r>
+      <w:r>
+        <w:t xml:space="preserve">in</w:t>
+      </w:r>
+      <w:r>
+        <w:t xml:space="preserve"> </w:t>
+      </w:r>
+      <w:r>
+        <w:rPr>
+          <w:rStyle w:val="VerbatimChar"/>
+        </w:rPr>
+        <w:t xml:space="preserve">hostnames/</w:t>
+      </w:r>
+      <w:r>
+        <w:t xml:space="preserve">, one file per year: the second output unit you accepted on 2026-09-01, kept out of</w:t>
+      </w:r>
+      <w:r>
+        <w:t xml:space="preserve"> </w:t>
+      </w:r>
+      <w:r>
+        <w:t xml:space="preserve">the five fields above so line 5 stays comparable with earlier rounds. Scored at the</w:t>
+      </w:r>
+      <w:r>
+        <w:t xml:space="preserve"> </w:t>
+      </w:r>
+      <w:r>
+        <w:t xml:space="preserve">calculator's own unit, the combined growth rate is</w:t>
+      </w:r>
+      <w:r>
+        <w:t xml:space="preserve"> </w:t>
+      </w:r>
+      <w:r>
+        <w:rPr>
+          <w:b/>
+          <w:bCs/>
+        </w:rPr>
+        <w:t xml:space="preserve">3.5468%</w:t>
+      </w:r>
+      <w:r>
+        <w:t xml:space="preserve">.</w:t>
+      </w:r>
+    </w:p>
+    <w:p>
+      <w:pPr>
+        <w:pStyle w:val="BodyText"/>
+      </w:pPr>
+      <w:r>
+        <w:t xml:space="preserve">The increment covers 593,919 distinct domains, of which</w:t>
+      </w:r>
+      <w:r>
+        <w:t xml:space="preserve"> </w:t>
+      </w:r>
+      <w:r>
+        <w:rPr>
+          <w:b/>
+          <w:bCs/>
+        </w:rPr>
+        <w:t xml:space="preserve">46,115 appear in none of the six</w:t>
       </w:r>
       <w:r>
         <w:rPr>
@@ -292,7 +353,7 @@
               <w:jc w:val="right"/>
             </w:pPr>
             <w:r>
-              <w:t xml:space="preserve">merged260821</w:t>
+              <w:t xml:space="preserve">merged260901</w:t>
             </w:r>
           </w:p>
         </w:tc>
@@ -353,43 +414,43 @@
               <w:jc w:val="right"/>
             </w:pPr>
             <w:r>
-              <w:t xml:space="preserve">866,121</w:t>
-            </w:r>
-          </w:p>
-        </w:tc>
-        <w:tc>
-          <w:tcPr/>
-          <w:p>
-            <w:pPr>
-              <w:pStyle w:val="Compact"/>
-              <w:jc w:val="right"/>
-            </w:pPr>
-            <w:r>
-              <w:t xml:space="preserve">55,467</w:t>
-            </w:r>
-          </w:p>
-        </w:tc>
-        <w:tc>
-          <w:tcPr/>
-          <w:p>
-            <w:pPr>
-              <w:pStyle w:val="Compact"/>
-              <w:jc w:val="right"/>
-            </w:pPr>
-            <w:r>
-              <w:t xml:space="preserve">921,588</w:t>
-            </w:r>
-          </w:p>
-        </w:tc>
-        <w:tc>
-          <w:tcPr/>
-          <w:p>
-            <w:pPr>
-              <w:pStyle w:val="Compact"/>
-              <w:jc w:val="right"/>
-            </w:pPr>
-            <w:r>
-              <w:t xml:space="preserve">26,420.9323</w:t>
+              <w:t xml:space="preserve">979,994</w:t>
+            </w:r>
+          </w:p>
+        </w:tc>
+        <w:tc>
+          <w:tcPr/>
+          <w:p>
+            <w:pPr>
+              <w:pStyle w:val="Compact"/>
+              <w:jc w:val="right"/>
+            </w:pPr>
+            <w:r>
+              <w:t xml:space="preserve">8,864</w:t>
+            </w:r>
+          </w:p>
+        </w:tc>
+        <w:tc>
+          <w:tcPr/>
+          <w:p>
+            <w:pPr>
+              <w:pStyle w:val="Compact"/>
+              <w:jc w:val="right"/>
+            </w:pPr>
+            <w:r>
+              <w:t xml:space="preserve">988,858</w:t>
+            </w:r>
+          </w:p>
+        </w:tc>
+        <w:tc>
+          <w:tcPr/>
+          <w:p>
+            <w:pPr>
+              <w:pStyle w:val="Compact"/>
+              <w:jc w:val="right"/>
+            </w:pPr>
+            <w:r>
+              <w:t xml:space="preserve">5,681.6100</w:t>
             </w:r>
           </w:p>
         </w:tc>
@@ -414,43 +475,43 @@
               <w:jc w:val="right"/>
             </w:pPr>
             <w:r>
-              <w:t xml:space="preserve">1,891,386</w:t>
-            </w:r>
-          </w:p>
-        </w:tc>
-        <w:tc>
-          <w:tcPr/>
-          <w:p>
-            <w:pPr>
-              <w:pStyle w:val="Compact"/>
-              <w:jc w:val="right"/>
-            </w:pPr>
-            <w:r>
-              <w:t xml:space="preserve">134,717</w:t>
-            </w:r>
-          </w:p>
-        </w:tc>
-        <w:tc>
-          <w:tcPr/>
-          <w:p>
-            <w:pPr>
-              <w:pStyle w:val="Compact"/>
-              <w:jc w:val="right"/>
-            </w:pPr>
-            <w:r>
-              <w:t xml:space="preserve">2,026,103</w:t>
-            </w:r>
-          </w:p>
-        </w:tc>
-        <w:tc>
-          <w:tcPr/>
-          <w:p>
-            <w:pPr>
-              <w:pStyle w:val="Compact"/>
-              <w:jc w:val="right"/>
-            </w:pPr>
-            <w:r>
-              <w:t xml:space="preserve">52,829.5998</w:t>
+              <w:t xml:space="preserve">2,161,231</w:t>
+            </w:r>
+          </w:p>
+        </w:tc>
+        <w:tc>
+          <w:tcPr/>
+          <w:p>
+            <w:pPr>
+              <w:pStyle w:val="Compact"/>
+              <w:jc w:val="right"/>
+            </w:pPr>
+            <w:r>
+              <w:t xml:space="preserve">18,019</w:t>
+            </w:r>
+          </w:p>
+        </w:tc>
+        <w:tc>
+          <w:tcPr/>
+          <w:p>
+            <w:pPr>
+              <w:pStyle w:val="Compact"/>
+              <w:jc w:val="right"/>
+            </w:pPr>
+            <w:r>
+              <w:t xml:space="preserve">2,179,250</w:t>
+            </w:r>
+          </w:p>
+        </w:tc>
+        <w:tc>
+          <w:tcPr/>
+          <w:p>
+            <w:pPr>
+              <w:pStyle w:val="Compact"/>
+              <w:jc w:val="right"/>
+            </w:pPr>
+            <w:r>
+              <w:t xml:space="preserve">10,920.5345</w:t>
             </w:r>
           </w:p>
         </w:tc>
@@ -475,43 +536,43 @@
               <w:jc w:val="right"/>
             </w:pPr>
             <w:r>
-              <w:t xml:space="preserve">2,542,561</w:t>
-            </w:r>
-          </w:p>
-        </w:tc>
-        <w:tc>
-          <w:tcPr/>
-          <w:p>
-            <w:pPr>
-              <w:pStyle w:val="Compact"/>
-              <w:jc w:val="right"/>
-            </w:pPr>
-            <w:r>
-              <w:t xml:space="preserve">447,039</w:t>
-            </w:r>
-          </w:p>
-        </w:tc>
-        <w:tc>
-          <w:tcPr/>
-          <w:p>
-            <w:pPr>
-              <w:pStyle w:val="Compact"/>
-              <w:jc w:val="right"/>
-            </w:pPr>
-            <w:r>
-              <w:t xml:space="preserve">2,989,600</w:t>
-            </w:r>
-          </w:p>
-        </w:tc>
-        <w:tc>
-          <w:tcPr/>
-          <w:p>
-            <w:pPr>
-              <w:pStyle w:val="Compact"/>
-              <w:jc w:val="right"/>
-            </w:pPr>
-            <w:r>
-              <w:t xml:space="preserve">129,096.5233</w:t>
+              <w:t xml:space="preserve">3,119,897</w:t>
+            </w:r>
+          </w:p>
+        </w:tc>
+        <w:tc>
+          <w:tcPr/>
+          <w:p>
+            <w:pPr>
+              <w:pStyle w:val="Compact"/>
+              <w:jc w:val="right"/>
+            </w:pPr>
+            <w:r>
+              <w:t xml:space="preserve">22,997</w:t>
+            </w:r>
+          </w:p>
+        </w:tc>
+        <w:tc>
+          <w:tcPr/>
+          <w:p>
+            <w:pPr>
+              <w:pStyle w:val="Compact"/>
+              <w:jc w:val="right"/>
+            </w:pPr>
+            <w:r>
+              <w:t xml:space="preserve">3,142,894</w:t>
+            </w:r>
+          </w:p>
+        </w:tc>
+        <w:tc>
+          <w:tcPr/>
+          <w:p>
+            <w:pPr>
+              <w:pStyle w:val="Compact"/>
+              <w:jc w:val="right"/>
+            </w:pPr>
+            <w:r>
+              <w:t xml:space="preserve">14,378.7366</w:t>
             </w:r>
           </w:p>
         </w:tc>
@@ -536,43 +597,43 @@
               <w:jc w:val="right"/>
             </w:pPr>
             <w:r>
-              <w:t xml:space="preserve">5,118,649</w:t>
-            </w:r>
-          </w:p>
-        </w:tc>
-        <w:tc>
-          <w:tcPr/>
-          <w:p>
-            <w:pPr>
-              <w:pStyle w:val="Compact"/>
-              <w:jc w:val="right"/>
-            </w:pPr>
-            <w:r>
-              <w:t xml:space="preserve">822,806</w:t>
-            </w:r>
-          </w:p>
-        </w:tc>
-        <w:tc>
-          <w:tcPr/>
-          <w:p>
-            <w:pPr>
-              <w:pStyle w:val="Compact"/>
-              <w:jc w:val="right"/>
-            </w:pPr>
-            <w:r>
-              <w:t xml:space="preserve">5,941,455</w:t>
-            </w:r>
-          </w:p>
-        </w:tc>
-        <w:tc>
-          <w:tcPr/>
-          <w:p>
-            <w:pPr>
-              <w:pStyle w:val="Compact"/>
-              <w:jc w:val="right"/>
-            </w:pPr>
-            <w:r>
-              <w:t xml:space="preserve">205,286.2928</w:t>
+              <w:t xml:space="preserve">6,345,942</w:t>
+            </w:r>
+          </w:p>
+        </w:tc>
+        <w:tc>
+          <w:tcPr/>
+          <w:p>
+            <w:pPr>
+              <w:pStyle w:val="Compact"/>
+              <w:jc w:val="right"/>
+            </w:pPr>
+            <w:r>
+              <w:t xml:space="preserve">46,194</w:t>
+            </w:r>
+          </w:p>
+        </w:tc>
+        <w:tc>
+          <w:tcPr/>
+          <w:p>
+            <w:pPr>
+              <w:pStyle w:val="Compact"/>
+              <w:jc w:val="right"/>
+            </w:pPr>
+            <w:r>
+              <w:t xml:space="preserve">6,392,136</w:t>
+            </w:r>
+          </w:p>
+        </w:tc>
+        <w:tc>
+          <w:tcPr/>
+          <w:p>
+            <w:pPr>
+              <w:pStyle w:val="Compact"/>
+              <w:jc w:val="right"/>
+            </w:pPr>
+            <w:r>
+              <w:t xml:space="preserve">29,486.3458</w:t>
             </w:r>
           </w:p>
         </w:tc>
@@ -597,43 +658,43 @@
               <w:jc w:val="right"/>
             </w:pPr>
             <w:r>
-              <w:t xml:space="preserve">9,670,871</w:t>
-            </w:r>
-          </w:p>
-        </w:tc>
-        <w:tc>
-          <w:tcPr/>
-          <w:p>
-            <w:pPr>
-              <w:pStyle w:val="Compact"/>
-              <w:jc w:val="right"/>
-            </w:pPr>
-            <w:r>
-              <w:t xml:space="preserve">145,577</w:t>
-            </w:r>
-          </w:p>
-        </w:tc>
-        <w:tc>
-          <w:tcPr/>
-          <w:p>
-            <w:pPr>
-              <w:pStyle w:val="Compact"/>
-              <w:jc w:val="right"/>
-            </w:pPr>
-            <w:r>
-              <w:t xml:space="preserve">9,816,448</w:t>
-            </w:r>
-          </w:p>
-        </w:tc>
-        <w:tc>
-          <w:tcPr/>
-          <w:p>
-            <w:pPr>
-              <w:pStyle w:val="Compact"/>
-              <w:jc w:val="right"/>
-            </w:pPr>
-            <w:r>
-              <w:t xml:space="preserve">91,406.4015</w:t>
+              <w:t xml:space="preserve">10,705,102</w:t>
+            </w:r>
+          </w:p>
+        </w:tc>
+        <w:tc>
+          <w:tcPr/>
+          <w:p>
+            <w:pPr>
+              <w:pStyle w:val="Compact"/>
+              <w:jc w:val="right"/>
+            </w:pPr>
+            <w:r>
+              <w:t xml:space="preserve">27,486</w:t>
+            </w:r>
+          </w:p>
+        </w:tc>
+        <w:tc>
+          <w:tcPr/>
+          <w:p>
+            <w:pPr>
+              <w:pStyle w:val="Compact"/>
+              <w:jc w:val="right"/>
+            </w:pPr>
+            <w:r>
+              <w:t xml:space="preserve">10,732,588</w:t>
+            </w:r>
+          </w:p>
+        </w:tc>
+        <w:tc>
+          <w:tcPr/>
+          <w:p>
+            <w:pPr>
+              <w:pStyle w:val="Compact"/>
+              <w:jc w:val="right"/>
+            </w:pPr>
+            <w:r>
+              <w:t xml:space="preserve">16,246.1986</w:t>
             </w:r>
           </w:p>
         </w:tc>
@@ -658,43 +719,43 @@
               <w:jc w:val="right"/>
             </w:pPr>
             <w:r>
-              <w:t xml:space="preserve">4,975,393</w:t>
-            </w:r>
-          </w:p>
-        </w:tc>
-        <w:tc>
-          <w:tcPr/>
-          <w:p>
-            <w:pPr>
-              <w:pStyle w:val="Compact"/>
-              <w:jc w:val="right"/>
-            </w:pPr>
-            <w:r>
-              <w:t xml:space="preserve">324,049</w:t>
-            </w:r>
-          </w:p>
-        </w:tc>
-        <w:tc>
-          <w:tcPr/>
-          <w:p>
-            <w:pPr>
-              <w:pStyle w:val="Compact"/>
-              <w:jc w:val="right"/>
-            </w:pPr>
-            <w:r>
-              <w:t xml:space="preserve">5,299,442</w:t>
-            </w:r>
-          </w:p>
-        </w:tc>
-        <w:tc>
-          <w:tcPr/>
-          <w:p>
-            <w:pPr>
-              <w:pStyle w:val="Compact"/>
-              <w:jc w:val="right"/>
-            </w:pPr>
-            <w:r>
-              <w:t xml:space="preserve">208,441.6701</w:t>
+              <w:t xml:space="preserve">10,536,760</w:t>
+            </w:r>
+          </w:p>
+        </w:tc>
+        <w:tc>
+          <w:tcPr/>
+          <w:p>
+            <w:pPr>
+              <w:pStyle w:val="Compact"/>
+              <w:jc w:val="right"/>
+            </w:pPr>
+            <w:r>
+              <w:t xml:space="preserve">500,198</w:t>
+            </w:r>
+          </w:p>
+        </w:tc>
+        <w:tc>
+          <w:tcPr/>
+          <w:p>
+            <w:pPr>
+              <w:pStyle w:val="Compact"/>
+              <w:jc w:val="right"/>
+            </w:pPr>
+            <w:r>
+              <w:t xml:space="preserve">11,036,958</w:t>
+            </w:r>
+          </w:p>
+        </w:tc>
+        <w:tc>
+          <w:tcPr/>
+          <w:p>
+            <w:pPr>
+              <w:pStyle w:val="Compact"/>
+              <w:jc w:val="right"/>
+            </w:pPr>
+            <w:r>
+              <w:t xml:space="preserve">251,928.4504</w:t>
             </w:r>
           </w:p>
         </w:tc>
@@ -727,7 +788,7 @@
                 <w:b/>
                 <w:bCs/>
               </w:rPr>
-              <w:t xml:space="preserve">25,064,981</w:t>
+              <w:t xml:space="preserve">33,848,926</w:t>
             </w:r>
           </w:p>
         </w:tc>
@@ -743,7 +804,7 @@
                 <w:b/>
                 <w:bCs/>
               </w:rPr>
-              <w:t xml:space="preserve">1,929,655</w:t>
+              <w:t xml:space="preserve">623,758</w:t>
             </w:r>
           </w:p>
         </w:tc>
@@ -759,7 +820,7 @@
                 <w:b/>
                 <w:bCs/>
               </w:rPr>
-              <w:t xml:space="preserve">26,994,636</w:t>
+              <w:t xml:space="preserve">34,472,684</w:t>
             </w:r>
           </w:p>
         </w:tc>
@@ -775,7 +836,7 @@
                 <w:b/>
                 <w:bCs/>
               </w:rPr>
-              <w:t xml:space="preserve">713,481.4198</w:t>
+              <w:t xml:space="preserve">328,641.8759</w:t>
             </w:r>
           </w:p>
         </w:tc>
@@ -796,7 +857,7 @@
         <w:t xml:space="preserve"> </w:t>
       </w:r>
       <w:r>
-        <w:t xml:space="preserve">Summing the increases you have awarded, which is how the update log of 2026-08-18 defines the score: 1.659986%, 10.730988%, 14.901054% and this round's 5.3395% give</w:t>
+        <w:t xml:space="preserve">Summing the increases you have awarded, which is how the update log of 2026-08-18 defines the score: 1.659986%, 10.730988%, 14.901054%, 4.130718% and this round's 1.8494% give</w:t>
       </w:r>
       <w:r>
         <w:t xml:space="preserve"> </w:t>
@@ -806,14 +867,14 @@
           <w:b/>
           <w:bCs/>
         </w:rPr>
-        <w:t xml:space="preserve">32.6315%</w:t>
+        <w:t xml:space="preserve">33.2721%</w:t>
       </w:r>
       <w:r>
         <w:t xml:space="preserve">, with round 1's 1,429,524 records held out because it was awarded at 17.38% on records before the equivalent-English metric existed.</w:t>
       </w:r>
     </w:p>
     <w:bookmarkEnd w:id="9"/>
-    <w:bookmarkStart w:id="12" w:name="Xaddebbcc97ab0dc46033c62575ca606071719c4"/>
+    <w:bookmarkStart w:id="11" w:name="Xaddebbcc97ab0dc46033c62575ca606071719c4"/>
     <w:p>
       <w:pPr>
         <w:pStyle w:val="Heading2"/>
@@ -1042,19 +1103,19 @@
               <w:jc w:val="right"/>
             </w:pPr>
             <w:r>
-              <w:t xml:space="preserve">641,038</w:t>
-            </w:r>
-          </w:p>
-        </w:tc>
-        <w:tc>
-          <w:tcPr/>
-          <w:p>
-            <w:pPr>
-              <w:pStyle w:val="Compact"/>
-              <w:jc w:val="right"/>
-            </w:pPr>
-            <w:r>
-              <w:t xml:space="preserve">90,770.3</w:t>
+              <w:t xml:space="preserve">4</w:t>
+            </w:r>
+          </w:p>
+        </w:tc>
+        <w:tc>
+          <w:tcPr/>
+          <w:p>
+            <w:pPr>
+              <w:pStyle w:val="Compact"/>
+              <w:jc w:val="right"/>
+            </w:pPr>
+            <w:r>
+              <w:t xml:space="preserve">0.0</w:t>
             </w:r>
           </w:p>
         </w:tc>
@@ -1070,7 +1131,7 @@
               <w:rPr>
                 <w:rStyle w:val="VerbatimChar"/>
               </w:rPr>
-              <w:t xml:space="preserve">ripe_dbase_changed</w:t>
+              <w:t xml:space="preserve">ripe_dbase_split_2004</w:t>
             </w:r>
           </w:p>
         </w:tc>
@@ -1121,7 +1182,7 @@
               <w:pStyle w:val="Compact"/>
             </w:pPr>
             <w:r>
-              <w:t xml:space="preserve">same file,</w:t>
+              <w:t xml:space="preserve">ftp.funet.fi/pub/netinfo/RIPE/dbase/split/ripe.db.domain.gz,</w:t>
             </w:r>
             <w:r>
               <w:t xml:space="preserve"> </w:t>
@@ -1130,7 +1191,7 @@
               <w:rPr>
                 <w:rStyle w:val="VerbatimChar"/>
               </w:rPr>
-              <w:t xml:space="preserve">*ch:</w:t>
+              <w:t xml:space="preserve">changed:</w:t>
             </w:r>
             <w:r>
               <w:t xml:space="preserve"> </w:t>
@@ -1148,19 +1209,19 @@
               <w:jc w:val="right"/>
             </w:pPr>
             <w:r>
-              <w:t xml:space="preserve">399,401</w:t>
-            </w:r>
-          </w:p>
-        </w:tc>
-        <w:tc>
-          <w:tcPr/>
-          <w:p>
-            <w:pPr>
-              <w:pStyle w:val="Compact"/>
-              <w:jc w:val="right"/>
-            </w:pPr>
-            <w:r>
-              <w:t xml:space="preserve">58,398.0</w:t>
+              <w:t xml:space="preserve">1,493</w:t>
+            </w:r>
+          </w:p>
+        </w:tc>
+        <w:tc>
+          <w:tcPr/>
+          <w:p>
+            <w:pPr>
+              <w:pStyle w:val="Compact"/>
+              <w:jc w:val="right"/>
+            </w:pPr>
+            <w:r>
+              <w:t xml:space="preserve">908.6</w:t>
             </w:r>
           </w:p>
         </w:tc>
@@ -1235,752 +1296,19 @@
               <w:jc w:val="right"/>
             </w:pPr>
             <w:r>
-              <w:t xml:space="preserve">16,384</w:t>
-            </w:r>
-          </w:p>
-        </w:tc>
-        <w:tc>
-          <w:tcPr/>
-          <w:p>
-            <w:pPr>
-              <w:pStyle w:val="Compact"/>
-              <w:jc w:val="right"/>
-            </w:pPr>
-            <w:r>
-              <w:t xml:space="preserve">15,173.2</w:t>
-            </w:r>
-          </w:p>
-        </w:tc>
-      </w:tr>
-      <w:tr>
-        <w:tc>
-          <w:tcPr/>
-          <w:p>
-            <w:pPr>
-              <w:pStyle w:val="Compact"/>
-            </w:pPr>
-            <w:r>
-              <w:rPr>
-                <w:rStyle w:val="VerbatimChar"/>
-              </w:rPr>
-              <w:t xml:space="preserve">squidguard_2001_blacklist</w:t>
-            </w:r>
-          </w:p>
-        </w:tc>
-        <w:tc>
-          <w:tcPr/>
-          <w:p>
-            <w:pPr>
-              <w:pStyle w:val="Compact"/>
-            </w:pPr>
-            <w:r>
-              <w:rPr>
-                <w:rStyle w:val="VerbatimChar"/>
-              </w:rPr>
-              <w:t xml:space="preserve">artifact_listing</w:t>
-            </w:r>
-          </w:p>
-        </w:tc>
-        <w:tc>
-          <w:tcPr/>
-          <w:p>
-            <w:pPr>
-              <w:pStyle w:val="Compact"/>
-            </w:pPr>
-            <w:r>
-              <w:t xml:space="preserve">the list's own</w:t>
-            </w:r>
-            <w:r>
-              <w:t xml:space="preserve"> </w:t>
-            </w:r>
-            <w:r>
-              <w:rPr>
-                <w:rStyle w:val="VerbatimChar"/>
-              </w:rPr>
-              <w:t xml:space="preserve">compiled in ... on 2001.12.18</w:t>
-            </w:r>
-            <w:r>
-              <w:t xml:space="preserve"> </w:t>
-            </w:r>
-            <w:r>
-              <w:t xml:space="preserve">header, or the diff's filename date</w:t>
-            </w:r>
-          </w:p>
-        </w:tc>
-        <w:tc>
-          <w:tcPr/>
-          <w:p>
-            <w:pPr>
-              <w:pStyle w:val="Compact"/>
-            </w:pPr>
-            <w:r>
-              <w:t xml:space="preserve">archive.debian.org/.../squidguard_1.2.0.orig.tar.gz</w:t>
-            </w:r>
-          </w:p>
-        </w:tc>
-        <w:tc>
-          <w:tcPr/>
-          <w:p>
-            <w:pPr>
-              <w:pStyle w:val="Compact"/>
-              <w:jc w:val="right"/>
-            </w:pPr>
-            <w:r>
-              <w:t xml:space="preserve">18,000</w:t>
-            </w:r>
-          </w:p>
-        </w:tc>
-        <w:tc>
-          <w:tcPr/>
-          <w:p>
-            <w:pPr>
-              <w:pStyle w:val="Compact"/>
-              <w:jc w:val="right"/>
-            </w:pPr>
-            <w:r>
-              <w:t xml:space="preserve">10,376.9</w:t>
-            </w:r>
-          </w:p>
-        </w:tc>
-      </w:tr>
-      <w:tr>
-        <w:tc>
-          <w:tcPr/>
-          <w:p>
-            <w:pPr>
-              <w:pStyle w:val="Compact"/>
-            </w:pPr>
-            <w:r>
-              <w:rPr>
-                <w:rStyle w:val="VerbatimChar"/>
-              </w:rPr>
-              <w:t xml:space="preserve">namewinner_expiring</w:t>
-            </w:r>
-          </w:p>
-        </w:tc>
-        <w:tc>
-          <w:tcPr/>
-          <w:p>
-            <w:pPr>
-              <w:pStyle w:val="Compact"/>
-            </w:pPr>
-            <w:r>
-              <w:rPr>
-                <w:rStyle w:val="VerbatimChar"/>
-              </w:rPr>
-              <w:t xml:space="preserve">artifact_listing</w:t>
-            </w:r>
-          </w:p>
-        </w:tc>
-        <w:tc>
-          <w:tcPr/>
-          <w:p>
-            <w:pPr>
-              <w:pStyle w:val="Compact"/>
-            </w:pPr>
-            <w:r>
-              <w:t xml:space="preserve">the per-row date</w:t>
-            </w:r>
-            <w:r>
-              <w:t xml:space="preserve"> </w:t>
-            </w:r>
-            <w:r>
-              <w:rPr>
-                <w:rStyle w:val="VerbatimChar"/>
-              </w:rPr>
-              <w:t xml:space="preserve">25-OCT-01</w:t>
-            </w:r>
-            <w:r>
-              <w:t xml:space="preserve">, on every line</w:t>
-            </w:r>
-          </w:p>
-        </w:tc>
-        <w:tc>
-          <w:tcPr/>
-          <w:p>
-            <w:pPr>
-              <w:pStyle w:val="Compact"/>
-            </w:pPr>
-            <w:r>
-              <w:t xml:space="preserve">web.archive.org/web/20011026120205id_/namewinner.com/whole_list.php?del=tab</w:t>
-            </w:r>
-          </w:p>
-        </w:tc>
-        <w:tc>
-          <w:tcPr/>
-          <w:p>
-            <w:pPr>
-              <w:pStyle w:val="Compact"/>
-              <w:jc w:val="right"/>
-            </w:pPr>
-            <w:r>
-              <w:t xml:space="preserve">18,937</w:t>
-            </w:r>
-          </w:p>
-        </w:tc>
-        <w:tc>
-          <w:tcPr/>
-          <w:p>
-            <w:pPr>
-              <w:pStyle w:val="Compact"/>
-              <w:jc w:val="right"/>
-            </w:pPr>
-            <w:r>
-              <w:t xml:space="preserve">11,546.3</w:t>
-            </w:r>
-          </w:p>
-        </w:tc>
-      </w:tr>
-      <w:tr>
-        <w:tc>
-          <w:tcPr/>
-          <w:p>
-            <w:pPr>
-              <w:pStyle w:val="Compact"/>
-            </w:pPr>
-            <w:r>
-              <w:rPr>
-                <w:rStyle w:val="VerbatimChar"/>
-              </w:rPr>
-              <w:t xml:space="preserve">can_domain_registry_notices</w:t>
-            </w:r>
-          </w:p>
-        </w:tc>
-        <w:tc>
-          <w:tcPr/>
-          <w:p>
-            <w:pPr>
-              <w:pStyle w:val="Compact"/>
-            </w:pPr>
-            <w:r>
-              <w:rPr>
-                <w:rStyle w:val="VerbatimChar"/>
-              </w:rPr>
-              <w:t xml:space="preserve">whois_creation</w:t>
-            </w:r>
-          </w:p>
-        </w:tc>
-        <w:tc>
-          <w:tcPr/>
-          <w:p>
-            <w:pPr>
-              <w:pStyle w:val="Compact"/>
-            </w:pPr>
-            <w:r>
-              <w:t xml:space="preserve">the registry's own</w:t>
-            </w:r>
-            <w:r>
-              <w:t xml:space="preserve"> </w:t>
-            </w:r>
-            <w:r>
-              <w:rPr>
-                <w:rStyle w:val="VerbatimChar"/>
-              </w:rPr>
-              <w:t xml:space="preserve">Date-Approved:</w:t>
-            </w:r>
-            <w:r>
-              <w:t xml:space="preserve"> </w:t>
-            </w:r>
-            <w:r>
-              <w:t xml:space="preserve">field in its public approval notice</w:t>
-            </w:r>
-          </w:p>
-        </w:tc>
-        <w:tc>
-          <w:tcPr/>
-          <w:p>
-            <w:pPr>
-              <w:pStyle w:val="Compact"/>
-            </w:pPr>
-            <w:r>
-              <w:t xml:space="preserve">archive.org/download/usenet-can/can.domain.mbox.zip</w:t>
-            </w:r>
-          </w:p>
-        </w:tc>
-        <w:tc>
-          <w:tcPr/>
-          <w:p>
-            <w:pPr>
-              <w:pStyle w:val="Compact"/>
-              <w:jc w:val="right"/>
-            </w:pPr>
-            <w:r>
-              <w:t xml:space="preserve">9,485</w:t>
-            </w:r>
-          </w:p>
-        </w:tc>
-        <w:tc>
-          <w:tcPr/>
-          <w:p>
-            <w:pPr>
-              <w:pStyle w:val="Compact"/>
-              <w:jc w:val="right"/>
-            </w:pPr>
-            <w:r>
-              <w:t xml:space="preserve">7,934.2</w:t>
-            </w:r>
-          </w:p>
-        </w:tc>
-      </w:tr>
-      <w:tr>
-        <w:tc>
-          <w:tcPr/>
-          <w:p>
-            <w:pPr>
-              <w:pStyle w:val="Compact"/>
-            </w:pPr>
-            <w:r>
-              <w:rPr>
-                <w:rStyle w:val="VerbatimChar"/>
-              </w:rPr>
-              <w:t xml:space="preserve">cctld_register_listing_inbody</w:t>
-            </w:r>
-          </w:p>
-        </w:tc>
-        <w:tc>
-          <w:tcPr/>
-          <w:p>
-            <w:pPr>
-              <w:pStyle w:val="Compact"/>
-            </w:pPr>
-            <w:r>
-              <w:rPr>
-                <w:rStyle w:val="VerbatimChar"/>
-              </w:rPr>
-              <w:t xml:space="preserve">artifact_listing</w:t>
-            </w:r>
-          </w:p>
-        </w:tc>
-        <w:tc>
-          <w:tcPr/>
-          <w:p>
-            <w:pPr>
-              <w:pStyle w:val="Compact"/>
-            </w:pPr>
-            <w:r>
-              <w:t xml:space="preserve">the register page's own machine-written timestamp, or the row's due date</w:t>
-            </w:r>
-          </w:p>
-        </w:tc>
-        <w:tc>
-          <w:tcPr/>
-          <w:p>
-            <w:pPr>
-              <w:pStyle w:val="Compact"/>
-            </w:pPr>
-            <w:r>
-              <w:t xml:space="preserve">twnic.net.tw/DN/fz1.shtml and idnic.net.id/Info/RekapBelumBayar.html</w:t>
-            </w:r>
-          </w:p>
-        </w:tc>
-        <w:tc>
-          <w:tcPr/>
-          <w:p>
-            <w:pPr>
-              <w:pStyle w:val="Compact"/>
-              <w:jc w:val="right"/>
-            </w:pPr>
-            <w:r>
-              <w:t xml:space="preserve">10,177</w:t>
-            </w:r>
-          </w:p>
-        </w:tc>
-        <w:tc>
-          <w:tcPr/>
-          <w:p>
-            <w:pPr>
-              <w:pStyle w:val="Compact"/>
-              <w:jc w:val="right"/>
-            </w:pPr>
-            <w:r>
-              <w:t xml:space="preserve">1,609.6</w:t>
-            </w:r>
-          </w:p>
-        </w:tc>
-      </w:tr>
-      <w:tr>
-        <w:tc>
-          <w:tcPr/>
-          <w:p>
-            <w:pPr>
-              <w:pStyle w:val="Compact"/>
-            </w:pPr>
-            <w:r>
-              <w:rPr>
-                <w:rStyle w:val="VerbatimChar"/>
-              </w:rPr>
-              <w:t xml:space="preserve">dartmouth_bfs_seed</w:t>
-            </w:r>
-          </w:p>
-        </w:tc>
-        <w:tc>
-          <w:tcPr/>
-          <w:p>
-            <w:pPr>
-              <w:pStyle w:val="Compact"/>
-            </w:pPr>
-            <w:r>
-              <w:rPr>
-                <w:rStyle w:val="VerbatimChar"/>
-              </w:rPr>
-              <w:t xml:space="preserve">cdx_timestamp</w:t>
-            </w:r>
-          </w:p>
-        </w:tc>
-        <w:tc>
-          <w:tcPr/>
-          <w:p>
-            <w:pPr>
-              <w:pStyle w:val="Compact"/>
-            </w:pPr>
-            <w:r>
-              <w:t xml:space="preserve">field 2 of each CDX row, a 14-digit capture timestamp</w:t>
-            </w:r>
-          </w:p>
-        </w:tc>
-        <w:tc>
-          <w:tcPr/>
-          <w:p>
-            <w:pPr>
-              <w:pStyle w:val="Compact"/>
-            </w:pPr>
-            <w:r>
-              <w:t xml:space="preserve">archive.org, Dartmouth_10KwebURLs_GWB BFS level 0</w:t>
-            </w:r>
-          </w:p>
-        </w:tc>
-        <w:tc>
-          <w:tcPr/>
-          <w:p>
-            <w:pPr>
-              <w:pStyle w:val="Compact"/>
-              <w:jc w:val="right"/>
-            </w:pPr>
-            <w:r>
-              <w:t xml:space="preserve">2,442</w:t>
-            </w:r>
-          </w:p>
-        </w:tc>
-        <w:tc>
-          <w:tcPr/>
-          <w:p>
-            <w:pPr>
-              <w:pStyle w:val="Compact"/>
-              <w:jc w:val="right"/>
-            </w:pPr>
-            <w:r>
-              <w:t xml:space="preserve">1,408.6</w:t>
-            </w:r>
-          </w:p>
-        </w:tc>
-      </w:tr>
-      <w:tr>
-        <w:tc>
-          <w:tcPr/>
-          <w:p>
-            <w:pPr>
-              <w:pStyle w:val="Compact"/>
-            </w:pPr>
-            <w:r>
-              <w:rPr>
-                <w:rStyle w:val="VerbatimChar"/>
-              </w:rPr>
-              <w:t xml:space="preserve">iedr_register</w:t>
-            </w:r>
-          </w:p>
-        </w:tc>
-        <w:tc>
-          <w:tcPr/>
-          <w:p>
-            <w:pPr>
-              <w:pStyle w:val="Compact"/>
-            </w:pPr>
-            <w:r>
-              <w:rPr>
-                <w:rStyle w:val="VerbatimChar"/>
-              </w:rPr>
-              <w:t xml:space="preserve">artifact_listing</w:t>
-            </w:r>
-          </w:p>
-        </w:tc>
-        <w:tc>
-          <w:tcPr/>
-          <w:p>
-            <w:pPr>
-              <w:pStyle w:val="Compact"/>
-            </w:pPr>
-            <w:r>
-              <w:t xml:space="preserve">the page's own footer:</w:t>
-            </w:r>
-            <w:r>
-              <w:t xml:space="preserve"> </w:t>
-            </w:r>
-            <w:r>
-              <w:rPr>
-                <w:rStyle w:val="VerbatimChar"/>
-              </w:rPr>
-              <w:t xml:space="preserve">updated automatically at ... 2001</w:t>
-            </w:r>
-            <w:r>
-              <w:t xml:space="preserve"> </w:t>
-            </w:r>
-            <w:r>
-              <w:t xml:space="preserve">on the 2001 editions, a plain</w:t>
-            </w:r>
-            <w:r>
-              <w:t xml:space="preserve"> </w:t>
-            </w:r>
-            <w:r>
-              <w:rPr>
-                <w:rStyle w:val="VerbatimChar"/>
-              </w:rPr>
-              <w:t xml:space="preserve">Last updated 27 Nov 1999</w:t>
-            </w:r>
-            <w:r>
-              <w:t xml:space="preserve"> </w:t>
-            </w:r>
-            <w:r>
-              <w:t xml:space="preserve">on the two earlier ones, which carry 829 of the pairs</w:t>
-            </w:r>
-          </w:p>
-        </w:tc>
-        <w:tc>
-          <w:tcPr/>
-          <w:p>
-            <w:pPr>
-              <w:pStyle w:val="Compact"/>
-            </w:pPr>
-            <w:r>
-              <w:t xml:space="preserve">web.archive.org/web/20011221145100id_/</w:t>
-            </w:r>
-            <w:hyperlink r:id="rId11">
-              <w:r>
-                <w:rPr>
-                  <w:rStyle w:val="Hyperlink"/>
-                </w:rPr>
-                <w:t xml:space="preserve">http://www.domainregistry.ie/lists/a-doms.html</w:t>
-              </w:r>
-            </w:hyperlink>
-          </w:p>
-        </w:tc>
-        <w:tc>
-          <w:tcPr/>
-          <w:p>
-            <w:pPr>
-              <w:pStyle w:val="Compact"/>
-              <w:jc w:val="right"/>
-            </w:pPr>
-            <w:r>
-              <w:t xml:space="preserve">19,263</w:t>
-            </w:r>
-          </w:p>
-        </w:tc>
-        <w:tc>
-          <w:tcPr/>
-          <w:p>
-            <w:pPr>
-              <w:pStyle w:val="Compact"/>
-              <w:jc w:val="right"/>
-            </w:pPr>
-            <w:r>
-              <w:t xml:space="preserve">18,769.9</w:t>
-            </w:r>
-          </w:p>
-        </w:tc>
-      </w:tr>
-      <w:tr>
-        <w:tc>
-          <w:tcPr/>
-          <w:p>
-            <w:pPr>
-              <w:pStyle w:val="Compact"/>
-            </w:pPr>
-            <w:r>
-              <w:rPr>
-                <w:rStyle w:val="VerbatimChar"/>
-              </w:rPr>
-              <w:t xml:space="preserve">internic_zone</w:t>
-            </w:r>
-          </w:p>
-        </w:tc>
-        <w:tc>
-          <w:tcPr/>
-          <w:p>
-            <w:pPr>
-              <w:pStyle w:val="Compact"/>
-            </w:pPr>
-            <w:r>
-              <w:rPr>
-                <w:rStyle w:val="VerbatimChar"/>
-              </w:rPr>
-              <w:t xml:space="preserve">artifact_listing</w:t>
-            </w:r>
-          </w:p>
-        </w:tc>
-        <w:tc>
-          <w:tcPr/>
-          <w:p>
-            <w:pPr>
-              <w:pStyle w:val="Compact"/>
-            </w:pPr>
-            <w:r>
-              <w:t xml:space="preserve">the SOA serial inside the zone payload:</w:t>
-            </w:r>
-            <w:r>
-              <w:t xml:space="preserve"> </w:t>
-            </w:r>
-            <w:r>
-              <w:rPr>
-                <w:rStyle w:val="VerbatimChar"/>
-              </w:rPr>
-              <w:t xml:space="preserve">1997041800</w:t>
-            </w:r>
-            <w:r>
-              <w:t xml:space="preserve"> </w:t>
-            </w:r>
-            <w:r>
-              <w:t xml:space="preserve">for 12,320 pairs,</w:t>
-            </w:r>
-            <w:r>
-              <w:t xml:space="preserve"> </w:t>
-            </w:r>
-            <w:r>
-              <w:rPr>
-                <w:rStyle w:val="VerbatimChar"/>
-              </w:rPr>
-              <w:t xml:space="preserve">1999111901</w:t>
-            </w:r>
-            <w:r>
-              <w:t xml:space="preserve"> </w:t>
-            </w:r>
-            <w:r>
-              <w:t xml:space="preserve">for the 183 from the 1999</w:t>
-            </w:r>
-            <w:r>
-              <w:t xml:space="preserve"> </w:t>
-            </w:r>
-            <w:r>
-              <w:rPr>
-                <w:rStyle w:val="VerbatimChar"/>
-              </w:rPr>
-              <w:t xml:space="preserve">gov</w:t>
-            </w:r>
-            <w:r>
-              <w:t xml:space="preserve"> </w:t>
-            </w:r>
-            <w:r>
-              <w:t xml:space="preserve">zone</w:t>
-            </w:r>
-          </w:p>
-        </w:tc>
-        <w:tc>
-          <w:tcPr/>
-          <w:p>
-            <w:pPr>
-              <w:pStyle w:val="Compact"/>
-            </w:pPr>
-            <w:r>
-              <w:t xml:space="preserve">nic.mil mirror of ftp.internic.net/domain/, via web.archive.org</w:t>
-            </w:r>
-          </w:p>
-        </w:tc>
-        <w:tc>
-          <w:tcPr/>
-          <w:p>
-            <w:pPr>
-              <w:pStyle w:val="Compact"/>
-              <w:jc w:val="right"/>
-            </w:pPr>
-            <w:r>
-              <w:t xml:space="preserve">12,503</w:t>
-            </w:r>
-          </w:p>
-        </w:tc>
-        <w:tc>
-          <w:tcPr/>
-          <w:p>
-            <w:pPr>
-              <w:pStyle w:val="Compact"/>
-              <w:jc w:val="right"/>
-            </w:pPr>
-            <w:r>
-              <w:t xml:space="preserve">8,993.1</w:t>
-            </w:r>
-          </w:p>
-        </w:tc>
-      </w:tr>
-      <w:tr>
-        <w:tc>
-          <w:tcPr/>
-          <w:p>
-            <w:pPr>
-              <w:pStyle w:val="Compact"/>
-            </w:pPr>
-            <w:r>
-              <w:rPr>
-                <w:rStyle w:val="VerbatimChar"/>
-              </w:rPr>
-              <w:t xml:space="preserve">ukwa_geoindex</w:t>
-            </w:r>
-          </w:p>
-        </w:tc>
-        <w:tc>
-          <w:tcPr/>
-          <w:p>
-            <w:pPr>
-              <w:pStyle w:val="Compact"/>
-            </w:pPr>
-            <w:r>
-              <w:rPr>
-                <w:rStyle w:val="VerbatimChar"/>
-              </w:rPr>
-              <w:t xml:space="preserve">cdx_timestamp</w:t>
-            </w:r>
-          </w:p>
-        </w:tc>
-        <w:tc>
-          <w:tcPr/>
-          <w:p>
-            <w:pPr>
-              <w:pStyle w:val="Compact"/>
-            </w:pPr>
-            <w:r>
-              <w:t xml:space="preserve">the 14-digit capture timestamp on each row</w:t>
-            </w:r>
-          </w:p>
-        </w:tc>
-        <w:tc>
-          <w:tcPr/>
-          <w:p>
-            <w:pPr>
-              <w:pStyle w:val="Compact"/>
-            </w:pPr>
-            <w:r>
-              <w:t xml:space="preserve">bl.iro.bl.uk/downloads/090bbffa-d82c-4641-ba72-0089e8ef885f</w:t>
-            </w:r>
-          </w:p>
-        </w:tc>
-        <w:tc>
-          <w:tcPr/>
-          <w:p>
-            <w:pPr>
-              <w:pStyle w:val="Compact"/>
-              <w:jc w:val="right"/>
-            </w:pPr>
-            <w:r>
-              <w:t xml:space="preserve">4,591</w:t>
-            </w:r>
-          </w:p>
-        </w:tc>
-        <w:tc>
-          <w:tcPr/>
-          <w:p>
-            <w:pPr>
-              <w:pStyle w:val="Compact"/>
-              <w:jc w:val="right"/>
-            </w:pPr>
-            <w:r>
-              <w:t xml:space="preserve">4,493.0</w:t>
+              <w:t xml:space="preserve">24</w:t>
+            </w:r>
+          </w:p>
+        </w:tc>
+        <w:tc>
+          <w:tcPr/>
+          <w:p>
+            <w:pPr>
+              <w:pStyle w:val="Compact"/>
+              <w:jc w:val="right"/>
+            </w:pPr>
+            <w:r>
+              <w:t xml:space="preserve">22.2</w:t>
             </w:r>
           </w:p>
         </w:tc>
@@ -1995,7 +1323,25 @@
           <w:b/>
           <w:bCs/>
         </w:rPr>
-        <w:t xml:space="preserve">Two of these need a sentence.</w:t>
+        <w:t xml:space="preserve">The second output unit, and the day it repriced bytes already on disk.</w:t>
+      </w:r>
+      <w:r>
+        <w:t xml:space="preserve"> </w:t>
+      </w:r>
+      <w:r>
+        <w:t xml:space="preserve">On 2026-09-01 you</w:t>
+      </w:r>
+      <w:r>
+        <w:t xml:space="preserve"> </w:t>
+      </w:r>
+      <w:r>
+        <w:t xml:space="preserve">accepted valid hostnames as annual records beside registrable domains, with registrables still</w:t>
+      </w:r>
+      <w:r>
+        <w:t xml:space="preserve"> </w:t>
+      </w:r>
+      <w:r>
+        <w:t xml:space="preserve">prioritized. The pipeline gained</w:t>
       </w:r>
       <w:r>
         <w:t xml:space="preserve"> </w:t>
@@ -2004,40 +1350,34 @@
         <w:rPr>
           <w:rStyle w:val="VerbatimChar"/>
         </w:rPr>
-        <w:t xml:space="preserve">ripe_dbase_1999</w:t>
-      </w:r>
-      <w:r>
-        <w:t xml:space="preserve"> </w:t>
-      </w:r>
-      <w:r>
-        <w:t xml:space="preserve">is used with the written permission of the RIPE</w:t>
-      </w:r>
-      <w:r>
-        <w:t xml:space="preserve"> </w:t>
-      </w:r>
-      <w:r>
-        <w:t xml:space="preserve">NCC, gratefully acknowledged, and only the domain name is read from it: no contact, address or other</w:t>
-      </w:r>
-      <w:r>
-        <w:t xml:space="preserve"> </w:t>
-      </w:r>
-      <w:r>
-        <w:t xml:space="preserve">personal data.</w:t>
-      </w:r>
-      <w:r>
-        <w:t xml:space="preserve"> </w:t>
+        <w:t xml:space="preserve">hostname_year</w:t>
+      </w:r>
+      <w:r>
+        <w:t xml:space="preserve"> </w:t>
+      </w:r>
+      <w:r>
+        <w:t xml:space="preserve">the same day, behind the same evidence wall:</w:t>
+      </w:r>
+      <w:r>
+        <w:t xml:space="preserve"> </w:t>
+      </w:r>
+      <w:r>
+        <w:t xml:space="preserve">every hostname row foreign-keys the evidence observation whose own 14-digit capture timestamp</w:t>
+      </w:r>
+      <w:r>
+        <w:t xml:space="preserve"> </w:t>
+      </w:r>
+      <w:r>
+        <w:t xml:space="preserve">dates it, two integrity checks gate the relation (</w:t>
       </w:r>
       <w:r>
         <w:rPr>
           <w:rStyle w:val="VerbatimChar"/>
         </w:rPr>
-        <w:t xml:space="preserve">ripe_dbase_changed</w:t>
-      </w:r>
-      <w:r>
-        <w:t xml:space="preserve"> </w:t>
-      </w:r>
-      <w:r>
-        <w:t xml:space="preserve">reads a second attribute of that same file, the dated</w:t>
+        <w:t xml:space="preserve">hostname_wall_intact</w:t>
+      </w:r>
+      <w:r>
+        <w:t xml:space="preserve">,</w:t>
       </w:r>
       <w:r>
         <w:t xml:space="preserve"> </w:t>
@@ -2046,19 +1386,164 @@
         <w:rPr>
           <w:rStyle w:val="VerbatimChar"/>
         </w:rPr>
-        <w:t xml:space="preserve">changed:</w:t>
-      </w:r>
-      <w:r>
-        <w:t xml:space="preserve"> </w:t>
-      </w:r>
-      <w:r>
-        <w:t xml:space="preserve">line each object carries per update; an object cannot be modified before it exists, so the line</w:t>
-      </w:r>
-      <w:r>
-        <w:t xml:space="preserve"> </w:t>
-      </w:r>
-      <w:r>
-        <w:t xml:space="preserve">evidences that year and no other, which is what rule 6 asks for and a creation date cannot give.</w:t>
+        <w:t xml:space="preserve">hostname_is_below_its_parent</w:t>
+      </w:r>
+      <w:r>
+        <w:t xml:space="preserve">), and the hostnames ship as separate</w:t>
+      </w:r>
+      <w:r>
+        <w:t xml:space="preserve"> </w:t>
+      </w:r>
+      <w:r>
+        <w:rPr>
+          <w:rStyle w:val="VerbatimChar"/>
+        </w:rPr>
+        <w:t xml:space="preserve">NNNN_hostnames.txt</w:t>
+      </w:r>
+      <w:r>
+        <w:t xml:space="preserve"> </w:t>
+      </w:r>
+      <w:r>
+        <w:t xml:space="preserve">files</w:t>
+      </w:r>
+      <w:r>
+        <w:t xml:space="preserve"> </w:t>
+      </w:r>
+      <w:r>
+        <w:t xml:space="preserve">beside the annual masters, with their own</w:t>
+      </w:r>
+      <w:r>
+        <w:t xml:space="preserve"> </w:t>
+      </w:r>
+      <w:r>
+        <w:rPr>
+          <w:rStyle w:val="VerbatimChar"/>
+        </w:rPr>
+        <w:t xml:space="preserve">hostnames_evidence_manifest.csv</w:t>
+      </w:r>
+      <w:r>
+        <w:t xml:space="preserve">, so they can be</w:t>
+      </w:r>
+      <w:r>
+        <w:t xml:space="preserve"> </w:t>
+      </w:r>
+      <w:r>
+        <w:t xml:space="preserve">merged or discarded independently. The first corpus in was one this project had already paid</w:t>
+      </w:r>
+      <w:r>
+        <w:t xml:space="preserve"> </w:t>
+      </w:r>
+      <w:r>
+        <w:t xml:space="preserve">for and written off: 180 raw CDX domain-sweep journals from 2026-08-21..24, 46.8 million</w:t>
+      </w:r>
+      <w:r>
+        <w:t xml:space="preserve"> </w:t>
+      </w:r>
+      <w:r>
+        <w:t xml:space="preserve">capture rows, recorded then as "worth exactly 0" because the registrable unit collapsed every</w:t>
+      </w:r>
+      <w:r>
+        <w:t xml:space="preserve"> </w:t>
+      </w:r>
+      <w:r>
+        <w:rPr>
+          <w:rStyle w:val="VerbatimChar"/>
+        </w:rPr>
+        <w:t xml:space="preserve">www.foo.co.uk</w:t>
+      </w:r>
+      <w:r>
+        <w:t xml:space="preserve"> </w:t>
+      </w:r>
+      <w:r>
+        <w:t xml:space="preserve">onto a</w:t>
+      </w:r>
+      <w:r>
+        <w:t xml:space="preserve"> </w:t>
+      </w:r>
+      <w:r>
+        <w:rPr>
+          <w:rStyle w:val="VerbatimChar"/>
+        </w:rPr>
+        <w:t xml:space="preserve">foo.co.uk</w:t>
+      </w:r>
+      <w:r>
+        <w:t xml:space="preserve"> </w:t>
+      </w:r>
+      <w:r>
+        <w:t xml:space="preserve">the store already held. Under the hostname unit the same</w:t>
+      </w:r>
+      <w:r>
+        <w:t xml:space="preserve"> </w:t>
+      </w:r>
+      <w:r>
+        <w:t xml:space="preserve">bytes carry</w:t>
+      </w:r>
+      <w:r>
+        <w:t xml:space="preserve"> </w:t>
+      </w:r>
+      <w:r>
+        <w:rPr>
+          <w:b/>
+          <w:bCs/>
+        </w:rPr>
+        <w:t xml:space="preserve">338,865 net-new hostname records, 301,650 equivalent-English</w:t>
+      </w:r>
+      <w:r>
+        <w:t xml:space="preserve">, most of it at</w:t>
+      </w:r>
+      <w:r>
+        <w:t xml:space="preserve"> </w:t>
+      </w:r>
+      <w:r>
+        <w:t xml:space="preserve">2001. A unit definition, not a new download, moved the round by a third of the trigger; the</w:t>
+      </w:r>
+      <w:r>
+        <w:t xml:space="preserve"> </w:t>
+      </w:r>
+      <w:r>
+        <w:t xml:space="preserve">same lesson as the NYPW partitions, one level up: reprice held artifacts whenever the measure</w:t>
+      </w:r>
+      <w:r>
+        <w:t xml:space="preserve"> </w:t>
+      </w:r>
+      <w:r>
+        <w:t xml:space="preserve">changes. A live collector (</w:t>
+      </w:r>
+      <w:r>
+        <w:rPr>
+          <w:rStyle w:val="VerbatimChar"/>
+        </w:rPr>
+        <w:t xml:space="preserve">platform_sweep.sh</w:t>
+      </w:r>
+      <w:r>
+        <w:t xml:space="preserve">) now walks the subdomain platforms your own</w:t>
+      </w:r>
+      <w:r>
+        <w:t xml:space="preserve"> </w:t>
+      </w:r>
+      <w:r>
+        <w:t xml:space="preserve">benchmark proves dense, ranked by</w:t>
+      </w:r>
+      <w:r>
+        <w:t xml:space="preserve"> </w:t>
+      </w:r>
+      <w:r>
+        <w:rPr>
+          <w:rStyle w:val="VerbatimChar"/>
+        </w:rPr>
+        <w:t xml:space="preserve">rank_platform_parents.py</w:t>
+      </w:r>
+      <w:r>
+        <w:t xml:space="preserve"> </w:t>
+      </w:r>
+      <w:r>
+        <w:t xml:space="preserve">(cjb.net leads at 157,790</w:t>
+      </w:r>
+      <w:r>
+        <w:t xml:space="preserve"> </w:t>
+      </w:r>
+      <w:r>
+        <w:t xml:space="preserve">sub-hosts in your files against ~336,000 measured in the CDX index).</w:t>
       </w:r>
     </w:p>
     <w:p>
@@ -2067,8 +1552,213 @@
       </w:pPr>
       <w:r>
         <w:rPr>
+          <w:b/>
+          <w:bCs/>
+        </w:rPr>
+        <w:t xml:space="preserve">One of these needs a story, because the method is the finding.</w:t>
+      </w:r>
+      <w:r>
+        <w:t xml:space="preserve"> </w:t>
+      </w:r>
+      <w:r>
+        <w:rPr>
           <w:rStyle w:val="VerbatimChar"/>
         </w:rPr>
+        <w:t xml:space="preserve">nypw_timemaps</w:t>
+      </w:r>
+      <w:r>
+        <w:t xml:space="preserve"> </w:t>
+      </w:r>
+      <w:r>
+        <w:t xml:space="preserve">(the Internet</w:t>
+      </w:r>
+      <w:r>
+        <w:t xml:space="preserve"> </w:t>
+      </w:r>
+      <w:r>
+        <w:t xml:space="preserve">Archive's "Not Your Parents' Web" TimeMaps, CC BY 4.0) had been REJECTED in an earlier round at</w:t>
+      </w:r>
+      <w:r>
+        <w:t xml:space="preserve"> </w:t>
+      </w:r>
+      <w:r>
+        <w:t xml:space="preserve">14.2 equivalent-English, measured on its 1996 folder. A dedicated review lane, whose whole job is</w:t>
+      </w:r>
+      <w:r>
+        <w:t xml:space="preserve"> </w:t>
+      </w:r>
+      <w:r>
+        <w:t xml:space="preserve">re-reading closed verdicts whenever a measurement screen is retired, noticed that the folder year is</w:t>
+      </w:r>
+      <w:r>
+        <w:t xml:space="preserve"> </w:t>
+      </w:r>
+      <w:r>
+        <w:t xml:space="preserve">the year of FIRST capture, so the 1996 folder is precisely the corpus's most saturated slice. Re-tested</w:t>
+      </w:r>
+      <w:r>
+        <w:t xml:space="preserve"> </w:t>
+      </w:r>
+      <w:r>
+        <w:t xml:space="preserve">at the other end of the partition and then measured folder by folder from the ingest ledger's own</w:t>
+      </w:r>
+      <w:r>
+        <w:t xml:space="preserve"> </w:t>
+      </w:r>
+      <w:r>
+        <w:t xml:space="preserve">per-file counts, the source paid ~88,000 equivalent-English across 34 parts: year rows per million</w:t>
+      </w:r>
+      <w:r>
+        <w:t xml:space="preserve"> </w:t>
+      </w:r>
+      <w:r>
+        <w:t xml:space="preserve">records run 2000 ~24,000, 1999 ~10,000, 1997 ~1,500, 1996 ~640, 2001 exactly 4. Both the original</w:t>
+      </w:r>
+      <w:r>
+        <w:t xml:space="preserve"> </w:t>
+      </w:r>
+      <w:r>
+        <w:t xml:space="preserve">rejection and the reopening were correct about their own slice, which is the transferable lesson: a</w:t>
+      </w:r>
+      <w:r>
+        <w:t xml:space="preserve"> </w:t>
+      </w:r>
+      <w:r>
+        <w:t xml:space="preserve">partitioned corpus is measured per partition, never argued about. The same discipline caught an</w:t>
+      </w:r>
+      <w:r>
+        <w:t xml:space="preserve"> </w:t>
+      </w:r>
+      <w:r>
+        <w:t xml:space="preserve">agent's later claim that the 2001 folder was the real seam, wrong by four orders of magnitude</w:t>
+      </w:r>
+      <w:r>
+        <w:t xml:space="preserve"> </w:t>
+      </w:r>
+      <w:r>
+        <w:t xml:space="preserve">against the ledger, before it cost a single download.</w:t>
+      </w:r>
+    </w:p>
+    <w:p>
+      <w:pPr>
+        <w:pStyle w:val="BodyText"/>
+      </w:pPr>
+      <w:r>
+        <w:rPr>
+          <w:b/>
+          <w:bCs/>
+        </w:rPr>
+        <w:t xml:space="preserve">The same item then paid a second time, from a filter nobody had questioned.</w:t>
+      </w:r>
+      <w:r>
+        <w:t xml:space="preserve"> </w:t>
+      </w:r>
+      <w:r>
+        <w:t xml:space="preserve">The parser reading</w:t>
+      </w:r>
+      <w:r>
+        <w:t xml:space="preserve"> </w:t>
+      </w:r>
+      <w:r>
+        <w:t xml:space="preserve">those TimeMaps had, since the day it was written, discarded every row whose stored HTTP status was</w:t>
+      </w:r>
+      <w:r>
+        <w:t xml:space="preserve"> </w:t>
+      </w:r>
+      <w:r>
+        <w:t xml:space="preserve">not 200, counting them into a statistic and moving on. That lane is 6.37 million in-window rows,</w:t>
+      </w:r>
+      <w:r>
+        <w:t xml:space="preserve"> </w:t>
+      </w:r>
+      <w:r>
+        <w:t xml:space="preserve">12.8% of the corpus. A 302 or 404 row means the Archive's crawler resolved the hostname and a server</w:t>
+      </w:r>
+      <w:r>
+        <w:t xml:space="preserve"> </w:t>
+      </w:r>
+      <w:r>
+        <w:t xml:space="preserve">answered it at the stamped instant, which requires the name delegated exactly as a 200 does: the</w:t>
+      </w:r>
+      <w:r>
+        <w:t xml:space="preserve"> </w:t>
+      </w:r>
+      <w:r>
+        <w:t xml:space="preserve">status describes the resource, not the registration. Re-parsing the same thirty-four files with the</w:t>
+      </w:r>
+      <w:r>
+        <w:t xml:space="preserve"> </w:t>
+      </w:r>
+      <w:r>
+        <w:t xml:space="preserve">filter removed paid a further ~6,700 equivalent-English over 13,277 pairs, 96.4% of them dated 2001,</w:t>
+      </w:r>
+      <w:r>
+        <w:t xml:space="preserve"> </w:t>
+      </w:r>
+      <w:r>
+        <w:rPr>
+          <w:b/>
+          <w:bCs/>
+        </w:rPr>
+        <w:t xml:space="preserve">for zero new requests</w:t>
+      </w:r>
+      <w:r>
+        <w:t xml:space="preserve">: the bytes were already on disk. The transferable method is the shape of</w:t>
+      </w:r>
+      <w:r>
+        <w:t xml:space="preserve"> </w:t>
+      </w:r>
+      <w:r>
+        <w:t xml:space="preserve">the test.</w:t>
+      </w:r>
+      <w:r>
+        <w:t xml:space="preserve"> </w:t>
+      </w:r>
+      <w:r>
+        <w:rPr>
+          <w:b/>
+          <w:bCs/>
+        </w:rPr>
+        <w:t xml:space="preserve">To check whether a filter threw away something valuable, re-parse an artifact already</w:t>
+      </w:r>
+      <w:r>
+        <w:rPr>
+          <w:b/>
+          <w:bCs/>
+        </w:rPr>
+        <w:t xml:space="preserve"> </w:t>
+      </w:r>
+      <w:r>
+        <w:rPr>
+          <w:b/>
+          <w:bCs/>
+        </w:rPr>
+        <w:t xml:space="preserve">ingested rather than querying anything</w:t>
+      </w:r>
+      <w:r>
+        <w:t xml:space="preserve">, because ingesting the unfiltered lane first turns the</w:t>
+      </w:r>
+      <w:r>
+        <w:t xml:space="preserve"> </w:t>
+      </w:r>
+      <w:r>
+        <w:t xml:space="preserve">store itself into the control group and every pair the relaxed parser finds is attributable to the</w:t>
+      </w:r>
+      <w:r>
+        <w:t xml:space="preserve"> </w:t>
+      </w:r>
+      <w:r>
+        <w:t xml:space="preserve">relaxation alone. Cost: four minutes and one parser.</w:t>
+      </w:r>
+    </w:p>
+    <w:p>
+      <w:pPr>
+        <w:pStyle w:val="BodyText"/>
+      </w:pPr>
+      <w:r>
+        <w:rPr>
+          <w:rStyle w:val="VerbatimChar"/>
+        </w:rPr>
         <w:t xml:space="preserve">sources.md</w:t>
       </w:r>
       <w:r>
@@ -2102,8 +1792,8 @@
         <w:t xml:space="preserve">, with their tests, and apply to our additions only.</w:t>
       </w:r>
     </w:p>
-    <w:bookmarkEnd w:id="12"/>
-    <w:bookmarkStart w:id="13" w:name="Xcdc4aabc9e51ba6bbdcb8f75097fa8927dbcbf7"/>
+    <w:bookmarkEnd w:id="11"/>
+    <w:bookmarkStart w:id="12" w:name="Xcdc4aabc9e51ba6bbdcb8f75097fa8927dbcbf7"/>
     <w:p>
       <w:pPr>
         <w:pStyle w:val="Heading2"/>
@@ -2206,19 +1896,19 @@
               <w:jc w:val="right"/>
             </w:pPr>
             <w:r>
-              <w:t xml:space="preserve">80,270</w:t>
-            </w:r>
-          </w:p>
-        </w:tc>
-        <w:tc>
-          <w:tcPr/>
-          <w:p>
-            <w:pPr>
-              <w:pStyle w:val="Compact"/>
-              <w:jc w:val="right"/>
-            </w:pPr>
-            <w:r>
-              <w:t xml:space="preserve">66,653.7</w:t>
+              <w:t xml:space="preserve">92,408</w:t>
+            </w:r>
+          </w:p>
+        </w:tc>
+        <w:tc>
+          <w:tcPr/>
+          <w:p>
+            <w:pPr>
+              <w:pStyle w:val="Compact"/>
+              <w:jc w:val="right"/>
+            </w:pPr>
+            <w:r>
+              <w:t xml:space="preserve">66,496.3</w:t>
             </w:r>
           </w:p>
         </w:tc>
@@ -2269,19 +1959,19 @@
               <w:jc w:val="right"/>
             </w:pPr>
             <w:r>
-              <w:t xml:space="preserve">581,458</w:t>
-            </w:r>
-          </w:p>
-        </w:tc>
-        <w:tc>
-          <w:tcPr/>
-          <w:p>
-            <w:pPr>
-              <w:pStyle w:val="Compact"/>
-              <w:jc w:val="right"/>
-            </w:pPr>
-            <w:r>
-              <w:t xml:space="preserve">357,755.3</w:t>
+              <w:t xml:space="preserve">1,683</w:t>
+            </w:r>
+          </w:p>
+        </w:tc>
+        <w:tc>
+          <w:tcPr/>
+          <w:p>
+            <w:pPr>
+              <w:pStyle w:val="Compact"/>
+              <w:jc w:val="right"/>
+            </w:pPr>
+            <w:r>
+              <w:t xml:space="preserve">891.5</w:t>
             </w:r>
           </w:p>
         </w:tc>
@@ -2468,7 +2158,7 @@
           <w:b/>
           <w:bCs/>
         </w:rPr>
-        <w:t xml:space="preserve">2,380,517 domains carry no year-specific</w:t>
+        <w:t xml:space="preserve">2,419,546 domains carry no year-specific</w:t>
       </w:r>
       <w:r>
         <w:rPr>
@@ -2503,8 +2193,8 @@
         <w:t xml:space="preserve">, kept out of the annual files.</w:t>
       </w:r>
     </w:p>
-    <w:bookmarkEnd w:id="13"/>
-    <w:bookmarkStart w:id="14" w:name="X20f10262337b30b70279ee1a04243a08f16c5f5"/>
+    <w:bookmarkEnd w:id="12"/>
+    <w:bookmarkStart w:id="13" w:name="X20f10262337b30b70279ee1a04243a08f16c5f5"/>
     <w:p>
       <w:pPr>
         <w:pStyle w:val="Heading2"/>
@@ -2549,74 +2239,133 @@
           <w:b/>
           <w:bCs/>
         </w:rPr>
-        <w:t xml:space="preserve">What worked and what did not.</w:t>
-      </w:r>
-      <w:r>
-        <w:t xml:space="preserve"> </w:t>
-      </w:r>
-      <w:r>
-        <w:t xml:space="preserve">One clear written objective from the supervisor, then unattended</w:t>
-      </w:r>
-      <w:r>
-        <w:t xml:space="preserve"> </w:t>
-      </w:r>
-      <w:r>
-        <w:t xml:space="preserve">running, worked: it is how this round's sources were found. Detached collectors holding an absolute</w:t>
-      </w:r>
-      <w:r>
-        <w:t xml:space="preserve"> </w:t>
-      </w:r>
-      <w:r>
-        <w:t xml:space="preserve">epoch deadline worked, and kept collecting through a day when the agent could not be reached.</w:t>
-      </w:r>
-      <w:r>
-        <w:t xml:space="preserve"> </w:t>
-      </w:r>
-      <w:r>
-        <w:rPr>
-          <w:b/>
-          <w:bCs/>
-        </w:rPr>
-        <w:t xml:space="preserve">Scheduled wake-ups did not</w:t>
-      </w:r>
-      <w:r>
-        <w:t xml:space="preserve">: the agent answered only some firings.</w:t>
-      </w:r>
-      <w:r>
-        <w:t xml:space="preserve"> </w:t>
-      </w:r>
-      <w:r>
-        <w:rPr>
-          <w:b/>
-          <w:bCs/>
-        </w:rPr>
-        <w:t xml:space="preserve">A self-scheduling loop did</w:t>
-      </w:r>
-      <w:r>
-        <w:rPr>
-          <w:b/>
-          <w:bCs/>
-        </w:rPr>
-        <w:t xml:space="preserve"> </w:t>
-      </w:r>
-      <w:r>
-        <w:rPr>
-          <w:b/>
-          <w:bCs/>
-        </w:rPr>
-        <w:t xml:space="preserve">not hold</w:t>
-      </w:r>
-      <w:r>
-        <w:t xml:space="preserve"> </w:t>
-      </w:r>
-      <w:r>
-        <w:t xml:space="preserve">either, tried once. So the durable pattern is a human-written objective plus processes</w:t>
-      </w:r>
-      <w:r>
-        <w:t xml:space="preserve"> </w:t>
-      </w:r>
-      <w:r>
-        <w:t xml:space="preserve">that do not depend on the agent being awake.</w:t>
+        <w:t xml:space="preserve">New this round: the loop left the laptop.</w:t>
+      </w:r>
+      <w:r>
+        <w:t xml:space="preserve"> </w:t>
+      </w:r>
+      <w:r>
+        <w:t xml:space="preserve">Research now runs as scheduled workflows on a</w:t>
+      </w:r>
+      <w:r>
+        <w:t xml:space="preserve"> </w:t>
+      </w:r>
+      <w:r>
+        <w:t xml:space="preserve">self-hosted CI runner on a small always-on machine: researcher waves twice daily (several</w:t>
+      </w:r>
+      <w:r>
+        <w:t xml:space="preserve"> </w:t>
+      </w:r>
+      <w:r>
+        <w:t xml:space="preserve">hypotheses per agent, dealt best-first), a re-opener lane that re-reads closed verdicts whenever a</w:t>
+      </w:r>
+      <w:r>
+        <w:t xml:space="preserve"> </w:t>
+      </w:r>
+      <w:r>
+        <w:t xml:space="preserve">measurement screen is retired (it found this round's largest source on its first run), and a weekly</w:t>
+      </w:r>
+      <w:r>
+        <w:t xml:space="preserve"> </w:t>
+      </w:r>
+      <w:r>
+        <w:t xml:space="preserve">one-page digest. Every agent invocation passes one shared boundary that enforces what a print-mode</w:t>
+      </w:r>
+      <w:r>
+        <w:t xml:space="preserve"> </w:t>
+      </w:r>
+      <w:r>
+        <w:t xml:space="preserve">agent cannot be trusted to remember: a hard timeout, session-scheduling tools disabled, a fallback</w:t>
+      </w:r>
+      <w:r>
+        <w:t xml:space="preserve"> </w:t>
+      </w:r>
+      <w:r>
+        <w:t xml:space="preserve">verdict when no findings file appears, and per-run token telemetry feeding a budget governor that</w:t>
+      </w:r>
+      <w:r>
+        <w:t xml:space="preserve"> </w:t>
+      </w:r>
+      <w:r>
+        <w:t xml:space="preserve">skips waves above a set share of the weekly window. The mechanical half of banking, register rows</w:t>
+      </w:r>
+      <w:r>
+        <w:t xml:space="preserve"> </w:t>
+      </w:r>
+      <w:r>
+        <w:t xml:space="preserve">and result lines, is now deterministic code rather than a model; a model is spent only where</w:t>
+      </w:r>
+      <w:r>
+        <w:t xml:space="preserve"> </w:t>
+      </w:r>
+      <w:r>
+        <w:t xml:space="preserve">judgement pays: proposing, testing, and admitting under the standing rule. The human's remaining</w:t>
+      </w:r>
+      <w:r>
+        <w:t xml:space="preserve"> </w:t>
+      </w:r>
+      <w:r>
+        <w:t xml:space="preserve">touchpoints are deliberate: a</w:t>
+      </w:r>
+      <w:r>
+        <w:t xml:space="preserve"> </w:t>
+      </w:r>
+      <w:r>
+        <w:rPr>
+          <w:rStyle w:val="VerbatimChar"/>
+        </w:rPr>
+        <w:t xml:space="preserve">bank</w:t>
+      </w:r>
+      <w:r>
+        <w:t xml:space="preserve"> </w:t>
+      </w:r>
+      <w:r>
+        <w:t xml:space="preserve">command on the machine that holds the evidence store, approval</w:t>
+      </w:r>
+      <w:r>
+        <w:t xml:space="preserve"> </w:t>
+      </w:r>
+      <w:r>
+        <w:t xml:space="preserve">of anything the standing rule cannot cover, and submissions. Two proofs the contract holds from its</w:t>
+      </w:r>
+      <w:r>
+        <w:t xml:space="preserve"> </w:t>
+      </w:r>
+      <w:r>
+        <w:t xml:space="preserve">first unattended day: an agent census-priced a 26.6 GB Usenet hierarchy from 0.4% of its bytes and</w:t>
+      </w:r>
+      <w:r>
+        <w:t xml:space="preserve"> </w:t>
+      </w:r>
+      <w:r>
+        <w:t xml:space="preserve">closed it at 2.59 equivalent-English, and another read a national web archive's terms of use and</w:t>
+      </w:r>
+      <w:r>
+        <w:t xml:space="preserve"> </w:t>
+      </w:r>
+      <w:r>
+        <w:t xml:space="preserve">refused to send a single probe, which is exactly the failure mode that once cost this project 7,586</w:t>
+      </w:r>
+      <w:r>
+        <w:t xml:space="preserve"> </w:t>
+      </w:r>
+      <w:r>
+        <w:t xml:space="preserve">equivalent-English on</w:t>
+      </w:r>
+      <w:r>
+        <w:t xml:space="preserve"> </w:t>
+      </w:r>
+      <w:r>
+        <w:rPr>
+          <w:rStyle w:val="VerbatimChar"/>
+        </w:rPr>
+        <w:t xml:space="preserve">.nz</w:t>
+      </w:r>
+      <w:r>
+        <w:t xml:space="preserve"> </w:t>
+      </w:r>
+      <w:r>
+        <w:t xml:space="preserve">WHOIS.</w:t>
       </w:r>
     </w:p>
     <w:p>
@@ -2628,31 +2377,25 @@
           <w:b/>
           <w:bCs/>
         </w:rPr>
-        <w:t xml:space="preserve">Generating the names to ask about, rather than discovering them.</w:t>
-      </w:r>
-      <w:r>
-        <w:t xml:space="preserve"> </w:t>
-      </w:r>
-      <w:r>
-        <w:t xml:space="preserve">The candidate pool held</w:t>
-      </w:r>
-      <w:r>
-        <w:t xml:space="preserve"> </w:t>
-      </w:r>
-      <w:r>
-        <w:t xml:space="preserve">2,395,205 names with no in-window year when this was measured on 24 August, and asking RDAP about them</w:t>
-      </w:r>
-      <w:r>
-        <w:t xml:space="preserve"> </w:t>
-      </w:r>
-      <w:r>
-        <w:t xml:space="preserve">returns almost nothing: 602</w:t>
-      </w:r>
-      <w:r>
-        <w:t xml:space="preserve"> </w:t>
-      </w:r>
-      <w:r>
-        <w:t xml:space="preserve">queries drawn twice, once from the head and once seeded-random, produced</w:t>
+        <w:t xml:space="preserve">What worked and what did not.</w:t>
+      </w:r>
+      <w:r>
+        <w:t xml:space="preserve"> </w:t>
+      </w:r>
+      <w:r>
+        <w:t xml:space="preserve">One clear written objective from the supervisor, then unattended</w:t>
+      </w:r>
+      <w:r>
+        <w:t xml:space="preserve"> </w:t>
+      </w:r>
+      <w:r>
+        <w:t xml:space="preserve">running, worked: it is how this round's sources were found. Detached collectors holding an absolute</w:t>
+      </w:r>
+      <w:r>
+        <w:t xml:space="preserve"> </w:t>
+      </w:r>
+      <w:r>
+        <w:t xml:space="preserve">epoch deadline worked, and kept collecting through a day when the agent could not be reached.</w:t>
       </w:r>
       <w:r>
         <w:t xml:space="preserve"> </w:t>
@@ -2662,80 +2405,10 @@
           <w:b/>
           <w:bCs/>
         </w:rPr>
-        <w:t xml:space="preserve">zero</w:t>
-      </w:r>
-      <w:r>
-        <w:t xml:space="preserve"> </w:t>
-      </w:r>
-      <w:r>
-        <w:t xml:space="preserve">in-window creation</w:t>
-      </w:r>
-      <w:r>
-        <w:t xml:space="preserve"> </w:t>
-      </w:r>
-      <w:r>
-        <w:t xml:space="preserve">dates, because 73% of the pool answers 404 against 21.6% for domains we hold. A name no crawler</w:t>
-      </w:r>
-      <w:r>
-        <w:t xml:space="preserve"> </w:t>
-      </w:r>
-      <w:r>
-        <w:t xml:space="preserve">captured is usually a name that was never much of a site. So the question was inverted, from</w:t>
-      </w:r>
-      <w:r>
-        <w:t xml:space="preserve"> </w:t>
-      </w:r>
-      <w:r>
-        <w:rPr>
-          <w:i/>
-          <w:iCs/>
-        </w:rPr>
-        <w:t xml:space="preserve">which</w:t>
-      </w:r>
-      <w:r>
-        <w:rPr>
-          <w:i/>
-          <w:iCs/>
-        </w:rPr>
-        <w:t xml:space="preserve"> </w:t>
-      </w:r>
-      <w:r>
-        <w:rPr>
-          <w:i/>
-          <w:iCs/>
-        </w:rPr>
-        <w:t xml:space="preserve">real names have we not yet dated</w:t>
-      </w:r>
-      <w:r>
-        <w:t xml:space="preserve"> </w:t>
-      </w:r>
-      <w:r>
-        <w:t xml:space="preserve">to</w:t>
-      </w:r>
-      <w:r>
-        <w:t xml:space="preserve"> </w:t>
-      </w:r>
-      <w:r>
-        <w:rPr>
-          <w:i/>
-          <w:iCs/>
-        </w:rPr>
-        <w:t xml:space="preserve">which names can we invent that a registry will date for us</w:t>
-      </w:r>
-      <w:r>
-        <w:t xml:space="preserve">.</w:t>
-      </w:r>
-      <w:r>
-        <w:t xml:space="preserve"> </w:t>
-      </w:r>
-      <w:r>
-        <w:t xml:space="preserve">Four generated populations were priced against each other in the same unit, equivalent-English per</w:t>
-      </w:r>
-      <w:r>
-        <w:t xml:space="preserve"> </w:t>
-      </w:r>
-      <w:r>
-        <w:t xml:space="preserve">1,000 queries:</w:t>
+        <w:t xml:space="preserve">Scheduled wake-ups did not</w:t>
+      </w:r>
+      <w:r>
+        <w:t xml:space="preserve">: the agent answered only some firings.</w:t>
       </w:r>
       <w:r>
         <w:t xml:space="preserve"> </w:t>
@@ -2745,70 +2418,13 @@
           <w:b/>
           <w:bCs/>
         </w:rPr>
-        <w:t xml:space="preserve">sibling names</w:t>
-      </w:r>
-      <w:r>
-        <w:t xml:space="preserve">, every</w:t>
-      </w:r>
-      <w:r>
-        <w:t xml:space="preserve"> </w:t>
-      </w:r>
-      <w:r>
-        <w:rPr>
-          <w:rStyle w:val="VerbatimChar"/>
-        </w:rPr>
-        <w:t xml:space="preserve">.com</w:t>
-      </w:r>
-      <w:r>
-        <w:t xml:space="preserve">/</w:t>
-      </w:r>
-      <w:r>
-        <w:rPr>
-          <w:rStyle w:val="VerbatimChar"/>
-        </w:rPr>
-        <w:t xml:space="preserve">.net</w:t>
-      </w:r>
-      <w:r>
-        <w:t xml:space="preserve">/</w:t>
-      </w:r>
-      <w:r>
-        <w:rPr>
-          <w:rStyle w:val="VerbatimChar"/>
-        </w:rPr>
-        <w:t xml:space="preserve">.org</w:t>
-      </w:r>
-      <w:r>
-        <w:t xml:space="preserve"> </w:t>
-      </w:r>
-      <w:r>
-        <w:t xml:space="preserve">label we hold in window re-suffixed to the other two and filtered to what the</w:t>
-      </w:r>
-      <w:r>
-        <w:t xml:space="preserve"> </w:t>
-      </w:r>
-      <w:r>
-        <w:t xml:space="preserve">store lacks, 14,080,169 of them, measured over a first full round of 150,000 queries at 14,205</w:t>
-      </w:r>
-      <w:r>
-        <w:t xml:space="preserve"> </w:t>
-      </w:r>
-      <w:r>
-        <w:t xml:space="preserve">in-window creation dates, 9.47%,</w:t>
-      </w:r>
-      <w:r>
-        <w:t xml:space="preserve"> </w:t>
+        <w:t xml:space="preserve">A self-scheduling loop did</w:t>
       </w:r>
       <w:r>
         <w:rPr>
           <w:b/>
           <w:bCs/>
         </w:rPr>
-        <w:t xml:space="preserve">59.9 equivalent-English per 1,000 queries</w:t>
-      </w:r>
-      <w:r>
-        <w:t xml:space="preserve">;</w:t>
-      </w:r>
-      <w:r>
         <w:t xml:space="preserve"> </w:t>
       </w:r>
       <w:r>
@@ -2816,93 +2432,19 @@
           <w:b/>
           <w:bCs/>
         </w:rPr>
-        <w:t xml:space="preserve">English dictionary</w:t>
-      </w:r>
-      <w:r>
-        <w:rPr>
-          <w:b/>
-          <w:bCs/>
-        </w:rPr>
-        <w:t xml:space="preserve"> </w:t>
-      </w:r>
-      <w:r>
-        <w:rPr>
-          <w:b/>
-          <w:bCs/>
-        </w:rPr>
-        <w:t xml:space="preserve">words</w:t>
-      </w:r>
-      <w:r>
-        <w:t xml:space="preserve"> </w:t>
-      </w:r>
-      <w:r>
-        <w:t xml:space="preserve">across the same three suffixes, the densest in hit rate at 28.0% but 92.4% already held and</w:t>
-      </w:r>
-      <w:r>
-        <w:t xml:space="preserve"> </w:t>
-      </w:r>
-      <w:r>
-        <w:t xml:space="preserve">finite at roughly 235,000 words, so 13.5 per 1,000;</w:t>
-      </w:r>
-      <w:r>
-        <w:t xml:space="preserve"> </w:t>
-      </w:r>
-      <w:r>
-        <w:rPr>
-          <w:b/>
-          <w:bCs/>
-        </w:rPr>
-        <w:t xml:space="preserve">random four-character strings</w:t>
-      </w:r>
-      <w:r>
-        <w:t xml:space="preserve">, 6.3; and</w:t>
-      </w:r>
-      <w:r>
-        <w:t xml:space="preserve"> </w:t>
-      </w:r>
-      <w:r>
-        <w:rPr>
-          <w:b/>
-          <w:bCs/>
-        </w:rPr>
-        <w:t xml:space="preserve">invented two-word compounds</w:t>
-      </w:r>
-      <w:r>
-        <w:t xml:space="preserve">, 859 queries and</w:t>
-      </w:r>
-      <w:r>
-        <w:t xml:space="preserve"> </w:t>
-      </w:r>
-      <w:r>
-        <w:rPr>
-          <w:b/>
-          <w:bCs/>
-        </w:rPr>
-        <w:t xml:space="preserve">exactly zero</w:t>
-      </w:r>
-      <w:r>
-        <w:t xml:space="preserve"> </w:t>
-      </w:r>
-      <w:r>
-        <w:t xml:space="preserve">in-window, a population that was</w:t>
-      </w:r>
-      <w:r>
-        <w:t xml:space="preserve"> </w:t>
-      </w:r>
-      <w:r>
-        <w:t xml:space="preserve">registered later or never. Inventing the query beat two and a half million discovered candidates by</w:t>
-      </w:r>
-      <w:r>
-        <w:t xml:space="preserve"> </w:t>
-      </w:r>
-      <w:r>
-        <w:t xml:space="preserve">an unbounded margin, and the reason is that a registry answers about names that survived while an</w:t>
-      </w:r>
-      <w:r>
-        <w:t xml:space="preserve"> </w:t>
-      </w:r>
-      <w:r>
-        <w:t xml:space="preserve">archive is the only thing that can date a name that died.</w:t>
+        <w:t xml:space="preserve">not hold</w:t>
+      </w:r>
+      <w:r>
+        <w:t xml:space="preserve"> </w:t>
+      </w:r>
+      <w:r>
+        <w:t xml:space="preserve">either, tried once. So the durable pattern is a human-written objective plus processes</w:t>
+      </w:r>
+      <w:r>
+        <w:t xml:space="preserve"> </w:t>
+      </w:r>
+      <w:r>
+        <w:t xml:space="preserve">that do not depend on the agent being awake.</w:t>
       </w:r>
     </w:p>
     <w:p>
@@ -2914,31 +2456,31 @@
           <w:b/>
           <w:bCs/>
         </w:rPr>
-        <w:t xml:space="preserve">Where the human sits.</w:t>
-      </w:r>
-      <w:r>
-        <w:t xml:space="preserve"> </w:t>
-      </w:r>
-      <w:r>
-        <w:t xml:space="preserve">The agent runs the two collection engines, which are mechanical, and it may</w:t>
-      </w:r>
-      <w:r>
-        <w:t xml:space="preserve"> </w:t>
-      </w:r>
-      <w:r>
-        <w:t xml:space="preserve">re-run anything already decided. Everything else goes onto an approval list with a measured figure and</w:t>
-      </w:r>
-      <w:r>
-        <w:t xml:space="preserve"> </w:t>
-      </w:r>
-      <w:r>
-        <w:t xml:space="preserve">primary links. The supervisor works through that list source by source, opens the links, checks the</w:t>
-      </w:r>
-      <w:r>
-        <w:t xml:space="preserve"> </w:t>
-      </w:r>
-      <w:r>
-        <w:t xml:space="preserve">dating argument, and rules per source: master, candidate-only or rejected.</w:t>
+        <w:t xml:space="preserve">Generating the names to ask about, rather than discovering them.</w:t>
+      </w:r>
+      <w:r>
+        <w:t xml:space="preserve"> </w:t>
+      </w:r>
+      <w:r>
+        <w:t xml:space="preserve">The candidate pool held</w:t>
+      </w:r>
+      <w:r>
+        <w:t xml:space="preserve"> </w:t>
+      </w:r>
+      <w:r>
+        <w:t xml:space="preserve">2,395,205 names with no in-window year when this was measured on 24 August, and asking RDAP about them</w:t>
+      </w:r>
+      <w:r>
+        <w:t xml:space="preserve"> </w:t>
+      </w:r>
+      <w:r>
+        <w:t xml:space="preserve">returns almost nothing: 602</w:t>
+      </w:r>
+      <w:r>
+        <w:t xml:space="preserve"> </w:t>
+      </w:r>
+      <w:r>
+        <w:t xml:space="preserve">queries drawn twice, once from the head and once seeded-random, produced</w:t>
       </w:r>
       <w:r>
         <w:t xml:space="preserve"> </w:t>
@@ -2948,13 +2490,140 @@
           <w:b/>
           <w:bCs/>
         </w:rPr>
-        <w:t xml:space="preserve">This is enforced in code</w:t>
+        <w:t xml:space="preserve">zero</w:t>
+      </w:r>
+      <w:r>
+        <w:t xml:space="preserve"> </w:t>
+      </w:r>
+      <w:r>
+        <w:t xml:space="preserve">in-window creation</w:t>
+      </w:r>
+      <w:r>
+        <w:t xml:space="preserve"> </w:t>
+      </w:r>
+      <w:r>
+        <w:t xml:space="preserve">dates, because 73% of the pool answers 404 against 21.6% for domains we hold. A name no crawler</w:t>
+      </w:r>
+      <w:r>
+        <w:t xml:space="preserve"> </w:t>
+      </w:r>
+      <w:r>
+        <w:t xml:space="preserve">captured is usually a name that was never much of a site. So the question was inverted, from</w:t>
+      </w:r>
+      <w:r>
+        <w:t xml:space="preserve"> </w:t>
+      </w:r>
+      <w:r>
+        <w:rPr>
+          <w:i/>
+          <w:iCs/>
+        </w:rPr>
+        <w:t xml:space="preserve">which</w:t>
+      </w:r>
+      <w:r>
+        <w:rPr>
+          <w:i/>
+          <w:iCs/>
+        </w:rPr>
+        <w:t xml:space="preserve"> </w:t>
+      </w:r>
+      <w:r>
+        <w:rPr>
+          <w:i/>
+          <w:iCs/>
+        </w:rPr>
+        <w:t xml:space="preserve">real names have we not yet dated</w:t>
+      </w:r>
+      <w:r>
+        <w:t xml:space="preserve"> </w:t>
+      </w:r>
+      <w:r>
+        <w:t xml:space="preserve">to</w:t>
+      </w:r>
+      <w:r>
+        <w:t xml:space="preserve"> </w:t>
+      </w:r>
+      <w:r>
+        <w:rPr>
+          <w:i/>
+          <w:iCs/>
+        </w:rPr>
+        <w:t xml:space="preserve">which names can we invent that a registry will date for us</w:t>
+      </w:r>
+      <w:r>
+        <w:t xml:space="preserve">.</w:t>
+      </w:r>
+      <w:r>
+        <w:t xml:space="preserve"> </w:t>
+      </w:r>
+      <w:r>
+        <w:t xml:space="preserve">Four generated populations were priced against each other in the same unit, equivalent-English per</w:t>
+      </w:r>
+      <w:r>
+        <w:t xml:space="preserve"> </w:t>
+      </w:r>
+      <w:r>
+        <w:t xml:space="preserve">1,000 queries:</w:t>
+      </w:r>
+      <w:r>
+        <w:t xml:space="preserve"> </w:t>
       </w:r>
       <w:r>
         <w:rPr>
           <w:b/>
           <w:bCs/>
         </w:rPr>
+        <w:t xml:space="preserve">sibling names</w:t>
+      </w:r>
+      <w:r>
+        <w:t xml:space="preserve">, every</w:t>
+      </w:r>
+      <w:r>
+        <w:t xml:space="preserve"> </w:t>
+      </w:r>
+      <w:r>
+        <w:rPr>
+          <w:rStyle w:val="VerbatimChar"/>
+        </w:rPr>
+        <w:t xml:space="preserve">.com</w:t>
+      </w:r>
+      <w:r>
+        <w:t xml:space="preserve">/</w:t>
+      </w:r>
+      <w:r>
+        <w:rPr>
+          <w:rStyle w:val="VerbatimChar"/>
+        </w:rPr>
+        <w:t xml:space="preserve">.net</w:t>
+      </w:r>
+      <w:r>
+        <w:t xml:space="preserve">/</w:t>
+      </w:r>
+      <w:r>
+        <w:rPr>
+          <w:rStyle w:val="VerbatimChar"/>
+        </w:rPr>
+        <w:t xml:space="preserve">.org</w:t>
+      </w:r>
+      <w:r>
+        <w:t xml:space="preserve"> </w:t>
+      </w:r>
+      <w:r>
+        <w:t xml:space="preserve">label we hold in window re-suffixed to the other two and filtered to what the</w:t>
+      </w:r>
+      <w:r>
+        <w:t xml:space="preserve"> </w:t>
+      </w:r>
+      <w:r>
+        <w:t xml:space="preserve">store lacks, 14,080,169 of them, measured over a first full round of 150,000 queries at 14,205</w:t>
+      </w:r>
+      <w:r>
+        <w:t xml:space="preserve"> </w:t>
+      </w:r>
+      <w:r>
+        <w:t xml:space="preserve">in-window creation dates, 9.47%,</w:t>
+      </w:r>
+      <w:r>
         <w:t xml:space="preserve"> </w:t>
       </w:r>
       <w:r>
@@ -2962,46 +2631,106 @@
           <w:b/>
           <w:bCs/>
         </w:rPr>
-        <w:t xml:space="preserve">rather than by habit</w:t>
-      </w:r>
-      <w:r>
-        <w:t xml:space="preserve">:</w:t>
-      </w:r>
-      <w:r>
-        <w:t xml:space="preserve"> </w:t>
-      </w:r>
-      <w:r>
-        <w:rPr>
-          <w:rStyle w:val="VerbatimChar"/>
-        </w:rPr>
-        <w:t xml:space="preserve">ark ingest</w:t>
-      </w:r>
-      <w:r>
-        <w:t xml:space="preserve"> </w:t>
-      </w:r>
-      <w:r>
-        <w:t xml:space="preserve">refuses to run for a class with no written</w:t>
-      </w:r>
-      <w:r>
-        <w:t xml:space="preserve"> </w:t>
-      </w:r>
-      <w:r>
-        <w:rPr>
-          <w:rStyle w:val="VerbatimChar"/>
-        </w:rPr>
-        <w:t xml:space="preserve">Decision:</w:t>
-      </w:r>
-      <w:r>
-        <w:t xml:space="preserve"> </w:t>
-      </w:r>
-      <w:r>
-        <w:t xml:space="preserve">line, and</w:t>
-      </w:r>
-      <w:r>
-        <w:t xml:space="preserve"> </w:t>
-      </w:r>
-      <w:r>
-        <w:t xml:space="preserve">it refused twice in this round until the decision existed.</w:t>
+        <w:t xml:space="preserve">59.9 equivalent-English per 1,000 queries</w:t>
+      </w:r>
+      <w:r>
+        <w:t xml:space="preserve">;</w:t>
+      </w:r>
+      <w:r>
+        <w:t xml:space="preserve"> </w:t>
+      </w:r>
+      <w:r>
+        <w:rPr>
+          <w:b/>
+          <w:bCs/>
+        </w:rPr>
+        <w:t xml:space="preserve">English dictionary</w:t>
+      </w:r>
+      <w:r>
+        <w:rPr>
+          <w:b/>
+          <w:bCs/>
+        </w:rPr>
+        <w:t xml:space="preserve"> </w:t>
+      </w:r>
+      <w:r>
+        <w:rPr>
+          <w:b/>
+          <w:bCs/>
+        </w:rPr>
+        <w:t xml:space="preserve">words</w:t>
+      </w:r>
+      <w:r>
+        <w:t xml:space="preserve"> </w:t>
+      </w:r>
+      <w:r>
+        <w:t xml:space="preserve">across the same three suffixes, the densest in hit rate at 28.0% but 92.4% already held and</w:t>
+      </w:r>
+      <w:r>
+        <w:t xml:space="preserve"> </w:t>
+      </w:r>
+      <w:r>
+        <w:t xml:space="preserve">finite at roughly 235,000 words, so 13.5 per 1,000;</w:t>
+      </w:r>
+      <w:r>
+        <w:t xml:space="preserve"> </w:t>
+      </w:r>
+      <w:r>
+        <w:rPr>
+          <w:b/>
+          <w:bCs/>
+        </w:rPr>
+        <w:t xml:space="preserve">random four-character strings</w:t>
+      </w:r>
+      <w:r>
+        <w:t xml:space="preserve">, 6.3; and</w:t>
+      </w:r>
+      <w:r>
+        <w:t xml:space="preserve"> </w:t>
+      </w:r>
+      <w:r>
+        <w:rPr>
+          <w:b/>
+          <w:bCs/>
+        </w:rPr>
+        <w:t xml:space="preserve">invented two-word compounds</w:t>
+      </w:r>
+      <w:r>
+        <w:t xml:space="preserve">, 859 queries and</w:t>
+      </w:r>
+      <w:r>
+        <w:t xml:space="preserve"> </w:t>
+      </w:r>
+      <w:r>
+        <w:rPr>
+          <w:b/>
+          <w:bCs/>
+        </w:rPr>
+        <w:t xml:space="preserve">exactly zero</w:t>
+      </w:r>
+      <w:r>
+        <w:t xml:space="preserve"> </w:t>
+      </w:r>
+      <w:r>
+        <w:t xml:space="preserve">in-window, a population that was</w:t>
+      </w:r>
+      <w:r>
+        <w:t xml:space="preserve"> </w:t>
+      </w:r>
+      <w:r>
+        <w:t xml:space="preserve">registered later or never. Inventing the query beat two and a half million discovered candidates by</w:t>
+      </w:r>
+      <w:r>
+        <w:t xml:space="preserve"> </w:t>
+      </w:r>
+      <w:r>
+        <w:t xml:space="preserve">an unbounded margin, and the reason is that a registry answers about names that survived while an</w:t>
+      </w:r>
+      <w:r>
+        <w:t xml:space="preserve"> </w:t>
+      </w:r>
+      <w:r>
+        <w:t xml:space="preserve">archive is the only thing that can date a name that died.</w:t>
       </w:r>
     </w:p>
     <w:p>
@@ -3013,58 +2742,31 @@
           <w:b/>
           <w:bCs/>
         </w:rPr>
-        <w:t xml:space="preserve">What that gate is worth, measured.</w:t>
-      </w:r>
-      <w:r>
-        <w:t xml:space="preserve"> </w:t>
-      </w:r>
-      <w:r>
-        <w:t xml:space="preserve">11 sources were admitted in this round, each on a</w:t>
-      </w:r>
-      <w:r>
-        <w:t xml:space="preserve"> </w:t>
-      </w:r>
-      <w:r>
-        <w:t xml:space="preserve">separate written decision. 585,550 strings sit in the candidate pool under</w:t>
-      </w:r>
-      <w:r>
-        <w:t xml:space="preserve"> </w:t>
-      </w:r>
-      <w:r>
-        <w:rPr>
-          <w:rStyle w:val="VerbatimChar"/>
-        </w:rPr>
-        <w:t xml:space="preserve">.edu</w:t>
-      </w:r>
-      <w:r>
-        <w:t xml:space="preserve">,</w:t>
-      </w:r>
-      <w:r>
-        <w:t xml:space="preserve"> </w:t>
-      </w:r>
-      <w:r>
-        <w:rPr>
-          <w:rStyle w:val="VerbatimChar"/>
-        </w:rPr>
-        <w:t xml:space="preserve">.gov</w:t>
-      </w:r>
-      <w:r>
-        <w:t xml:space="preserve"> </w:t>
-      </w:r>
-      <w:r>
-        <w:t xml:space="preserve">and</w:t>
-      </w:r>
-      <w:r>
-        <w:t xml:space="preserve"> </w:t>
-      </w:r>
-      <w:r>
-        <w:rPr>
-          <w:rStyle w:val="VerbatimChar"/>
-        </w:rPr>
-        <w:t xml:space="preserve">.mil</w:t>
-      </w:r>
-      <w:r>
-        <w:t xml:space="preserve">, namespaces no one could register in freely, and</w:t>
+        <w:t xml:space="preserve">Where the human sits.</w:t>
+      </w:r>
+      <w:r>
+        <w:t xml:space="preserve"> </w:t>
+      </w:r>
+      <w:r>
+        <w:t xml:space="preserve">The agent runs the two collection engines, which are mechanical, and it may</w:t>
+      </w:r>
+      <w:r>
+        <w:t xml:space="preserve"> </w:t>
+      </w:r>
+      <w:r>
+        <w:t xml:space="preserve">re-run anything already decided. Everything else goes onto an approval list with a measured figure and</w:t>
+      </w:r>
+      <w:r>
+        <w:t xml:space="preserve"> </w:t>
+      </w:r>
+      <w:r>
+        <w:t xml:space="preserve">primary links. The supervisor works through that list source by source, opens the links, checks the</w:t>
+      </w:r>
+      <w:r>
+        <w:t xml:space="preserve"> </w:t>
+      </w:r>
+      <w:r>
+        <w:t xml:space="preserve">dating argument, and rules per source: master, candidate-only or rejected.</w:t>
       </w:r>
       <w:r>
         <w:t xml:space="preserve"> </w:t>
@@ -3074,31 +2776,60 @@
           <w:b/>
           <w:bCs/>
         </w:rPr>
-        <w:t xml:space="preserve">not one of them reached an annual file</w:t>
-      </w:r>
-      <w:r>
-        <w:t xml:space="preserve"> </w:t>
-      </w:r>
-      <w:r>
-        <w:t xml:space="preserve">without independent attestation. Twelve invariants run before</w:t>
-      </w:r>
-      <w:r>
-        <w:t xml:space="preserve"> </w:t>
-      </w:r>
-      <w:r>
-        <w:t xml:space="preserve">every commit and again inside the shipped archive; one of them caught a defect in this round, an</w:t>
-      </w:r>
-      <w:r>
-        <w:t xml:space="preserve"> </w:t>
-      </w:r>
-      <w:r>
-        <w:t xml:space="preserve">evidence value citing a page's date for a row dated from its own column, which was a wrong citation</w:t>
-      </w:r>
-      <w:r>
-        <w:t xml:space="preserve"> </w:t>
-      </w:r>
-      <w:r>
-        <w:t xml:space="preserve">rather than a wrong year.</w:t>
+        <w:t xml:space="preserve">This is enforced in code</w:t>
+      </w:r>
+      <w:r>
+        <w:rPr>
+          <w:b/>
+          <w:bCs/>
+        </w:rPr>
+        <w:t xml:space="preserve"> </w:t>
+      </w:r>
+      <w:r>
+        <w:rPr>
+          <w:b/>
+          <w:bCs/>
+        </w:rPr>
+        <w:t xml:space="preserve">rather than by habit</w:t>
+      </w:r>
+      <w:r>
+        <w:t xml:space="preserve">:</w:t>
+      </w:r>
+      <w:r>
+        <w:t xml:space="preserve"> </w:t>
+      </w:r>
+      <w:r>
+        <w:rPr>
+          <w:rStyle w:val="VerbatimChar"/>
+        </w:rPr>
+        <w:t xml:space="preserve">ark ingest</w:t>
+      </w:r>
+      <w:r>
+        <w:t xml:space="preserve"> </w:t>
+      </w:r>
+      <w:r>
+        <w:t xml:space="preserve">refuses to run for a class with no written</w:t>
+      </w:r>
+      <w:r>
+        <w:t xml:space="preserve"> </w:t>
+      </w:r>
+      <w:r>
+        <w:rPr>
+          <w:rStyle w:val="VerbatimChar"/>
+        </w:rPr>
+        <w:t xml:space="preserve">Decision:</w:t>
+      </w:r>
+      <w:r>
+        <w:t xml:space="preserve"> </w:t>
+      </w:r>
+      <w:r>
+        <w:t xml:space="preserve">line, and</w:t>
+      </w:r>
+      <w:r>
+        <w:t xml:space="preserve"> </w:t>
+      </w:r>
+      <w:r>
+        <w:t xml:space="preserve">it refused twice in this round until the decision existed.</w:t>
       </w:r>
     </w:p>
     <w:p>
@@ -3110,7 +2841,58 @@
           <w:b/>
           <w:bCs/>
         </w:rPr>
-        <w:t xml:space="preserve">Negative results are recorded as first-class.</w:t>
+        <w:t xml:space="preserve">What that gate is worth, measured.</w:t>
+      </w:r>
+      <w:r>
+        <w:t xml:space="preserve"> </w:t>
+      </w:r>
+      <w:r>
+        <w:t xml:space="preserve">3 sources were admitted in this round, each on a</w:t>
+      </w:r>
+      <w:r>
+        <w:t xml:space="preserve"> </w:t>
+      </w:r>
+      <w:r>
+        <w:t xml:space="preserve">separate written decision. 588,087 strings sit in the candidate pool under</w:t>
+      </w:r>
+      <w:r>
+        <w:t xml:space="preserve"> </w:t>
+      </w:r>
+      <w:r>
+        <w:rPr>
+          <w:rStyle w:val="VerbatimChar"/>
+        </w:rPr>
+        <w:t xml:space="preserve">.edu</w:t>
+      </w:r>
+      <w:r>
+        <w:t xml:space="preserve">,</w:t>
+      </w:r>
+      <w:r>
+        <w:t xml:space="preserve"> </w:t>
+      </w:r>
+      <w:r>
+        <w:rPr>
+          <w:rStyle w:val="VerbatimChar"/>
+        </w:rPr>
+        <w:t xml:space="preserve">.gov</w:t>
+      </w:r>
+      <w:r>
+        <w:t xml:space="preserve"> </w:t>
+      </w:r>
+      <w:r>
+        <w:t xml:space="preserve">and</w:t>
+      </w:r>
+      <w:r>
+        <w:t xml:space="preserve"> </w:t>
+      </w:r>
+      <w:r>
+        <w:rPr>
+          <w:rStyle w:val="VerbatimChar"/>
+        </w:rPr>
+        <w:t xml:space="preserve">.mil</w:t>
+      </w:r>
+      <w:r>
+        <w:t xml:space="preserve">, namespaces no one could register in freely, and</w:t>
       </w:r>
       <w:r>
         <w:t xml:space="preserve"> </w:t>
@@ -3120,10 +2902,56 @@
           <w:b/>
           <w:bCs/>
         </w:rPr>
-        <w:t xml:space="preserve">249 source families have been searched and recorded</w:t>
-      </w:r>
-      <w:r>
-        <w:t xml:space="preserve">, 44 developed far enough to earn their own section and 205 evaluated and closed, each with the measurement that closed it, so negative results stay visible and the same ground is not broken twice.</w:t>
+        <w:t xml:space="preserve">not one of them reached an annual file</w:t>
+      </w:r>
+      <w:r>
+        <w:t xml:space="preserve"> </w:t>
+      </w:r>
+      <w:r>
+        <w:t xml:space="preserve">without independent attestation. thirteen invariants run before</w:t>
+      </w:r>
+      <w:r>
+        <w:t xml:space="preserve"> </w:t>
+      </w:r>
+      <w:r>
+        <w:t xml:space="preserve">every commit and again inside the shipped archive; one of them caught a defect in this round, an</w:t>
+      </w:r>
+      <w:r>
+        <w:t xml:space="preserve"> </w:t>
+      </w:r>
+      <w:r>
+        <w:t xml:space="preserve">evidence value citing a page's date for a row dated from its own column, which was a wrong citation</w:t>
+      </w:r>
+      <w:r>
+        <w:t xml:space="preserve"> </w:t>
+      </w:r>
+      <w:r>
+        <w:t xml:space="preserve">rather than a wrong year.</w:t>
+      </w:r>
+    </w:p>
+    <w:p>
+      <w:pPr>
+        <w:pStyle w:val="BodyText"/>
+      </w:pPr>
+      <w:r>
+        <w:rPr>
+          <w:b/>
+          <w:bCs/>
+        </w:rPr>
+        <w:t xml:space="preserve">Negative results are recorded as first-class.</w:t>
+      </w:r>
+      <w:r>
+        <w:t xml:space="preserve"> </w:t>
+      </w:r>
+      <w:r>
+        <w:rPr>
+          <w:b/>
+          <w:bCs/>
+        </w:rPr>
+        <w:t xml:space="preserve">465 source families have been searched and recorded</w:t>
+      </w:r>
+      <w:r>
+        <w:t xml:space="preserve">, 60 developed far enough to earn their own section and 405 evaluated and closed, each with the measurement that closed it, so negative results stay visible and the same ground is not broken twice.</w:t>
       </w:r>
       <w:r>
         <w:t xml:space="preserve"> </w:t>
@@ -3141,8 +2969,8 @@
         <w:t xml:space="preserve">ships beside this report and names every one, with its acquisition route, date semantics and yield.</w:t>
       </w:r>
     </w:p>
-    <w:bookmarkEnd w:id="14"/>
-    <w:bookmarkStart w:id="15" w:name="Xb36eab86e5bbe496a8c1c2562c92443ce82eac8"/>
+    <w:bookmarkEnd w:id="13"/>
+    <w:bookmarkStart w:id="14" w:name="Xb36eab86e5bbe496a8c1c2562c92443ce82eac8"/>
     <w:p>
       <w:pPr>
         <w:pStyle w:val="Heading2"/>
@@ -3272,8 +3100,8 @@
         <w:t xml:space="preserve">.</w:t>
       </w:r>
     </w:p>
-    <w:bookmarkEnd w:id="15"/>
-    <w:bookmarkStart w:id="16" w:name="Xdb607c1ad2844399e8c98d4b1d379171dce7862"/>
+    <w:bookmarkEnd w:id="14"/>
+    <w:bookmarkStart w:id="15" w:name="Xdb607c1ad2844399e8c98d4b1d379171dce7862"/>
     <w:p>
       <w:pPr>
         <w:pStyle w:val="Heading2"/>
@@ -3394,31 +3222,31 @@
               <w:rPr>
                 <w:rStyle w:val="VerbatimChar"/>
               </w:rPr>
-              <w:t xml:space="preserve">merged260821</w:t>
-            </w:r>
-          </w:p>
-        </w:tc>
-        <w:tc>
-          <w:tcPr/>
-          <w:p>
-            <w:pPr>
-              <w:pStyle w:val="Compact"/>
-              <w:jc w:val="right"/>
-            </w:pPr>
-            <w:r>
-              <w:t xml:space="preserve">25,064,981</w:t>
-            </w:r>
-          </w:p>
-        </w:tc>
-        <w:tc>
-          <w:tcPr/>
-          <w:p>
-            <w:pPr>
-              <w:pStyle w:val="Compact"/>
-              <w:jc w:val="right"/>
-            </w:pPr>
-            <w:r>
-              <w:t xml:space="preserve">13,362,368.8792</w:t>
+              <w:t xml:space="preserve">merged260901</w:t>
+            </w:r>
+          </w:p>
+        </w:tc>
+        <w:tc>
+          <w:tcPr/>
+          <w:p>
+            <w:pPr>
+              <w:pStyle w:val="Compact"/>
+              <w:jc w:val="right"/>
+            </w:pPr>
+            <w:r>
+              <w:t xml:space="preserve">33,848,926</w:t>
+            </w:r>
+          </w:p>
+        </w:tc>
+        <w:tc>
+          <w:tcPr/>
+          <w:p>
+            <w:pPr>
+              <w:pStyle w:val="Compact"/>
+              <w:jc w:val="right"/>
+            </w:pPr>
+            <w:r>
+              <w:t xml:space="preserve">17,770,588.9026</w:t>
             </w:r>
           </w:p>
         </w:tc>
@@ -3451,7 +3279,7 @@
                 <w:b/>
                 <w:bCs/>
               </w:rPr>
-              <w:t xml:space="preserve">1,929,655</w:t>
+              <w:t xml:space="preserve">623,758</w:t>
             </w:r>
           </w:p>
         </w:tc>
@@ -3467,7 +3295,7 @@
                 <w:b/>
                 <w:bCs/>
               </w:rPr>
-              <w:t xml:space="preserve">713,481.4198</w:t>
+              <w:t xml:space="preserve">328,641.8759</w:t>
             </w:r>
           </w:p>
         </w:tc>
@@ -3492,19 +3320,19 @@
               <w:jc w:val="right"/>
             </w:pPr>
             <w:r>
-              <w:t xml:space="preserve">26,994,636</w:t>
-            </w:r>
-          </w:p>
-        </w:tc>
-        <w:tc>
-          <w:tcPr/>
-          <w:p>
-            <w:pPr>
-              <w:pStyle w:val="Compact"/>
-              <w:jc w:val="right"/>
-            </w:pPr>
-            <w:r>
-              <w:t xml:space="preserve">14,075,850.2990</w:t>
+              <w:t xml:space="preserve">34,472,684</w:t>
+            </w:r>
+          </w:p>
+        </w:tc>
+        <w:tc>
+          <w:tcPr/>
+          <w:p>
+            <w:pPr>
+              <w:pStyle w:val="Compact"/>
+              <w:jc w:val="right"/>
+            </w:pPr>
+            <w:r>
+              <w:t xml:space="preserve">18,099,230.7785</w:t>
             </w:r>
           </w:p>
         </w:tc>
@@ -3522,7 +3350,7 @@
         <w:t xml:space="preserve">Overlap with the baseline is 0 records</w:t>
       </w:r>
       <w:r>
-        <w:t xml:space="preserve">, so all 1,929,655 submitted are accepted and nothing counts twice.</w:t>
+        <w:t xml:space="preserve">, so all 623,758 submitted are accepted and nothing counts twice.</w:t>
       </w:r>
     </w:p>
     <w:p>
@@ -3585,8 +3413,8 @@
         <w:t xml:space="preserve">.</w:t>
       </w:r>
     </w:p>
-    <w:bookmarkEnd w:id="16"/>
-    <w:bookmarkStart w:id="17" w:name="X6bb067efc45c82151fb24e0d6dd9c8b58bab51a"/>
+    <w:bookmarkEnd w:id="15"/>
+    <w:bookmarkStart w:id="16" w:name="X6bb067efc45c82151fb24e0d6dd9c8b58bab51a"/>
     <w:p>
       <w:pPr>
         <w:pStyle w:val="Heading2"/>
@@ -4016,7 +3844,7 @@
               <w:rPr>
                 <w:rStyle w:val="VerbatimChar"/>
               </w:rPr>
-              <w:t xml:space="preserve">source/scripts/merge_against_baseline.py</w:t>
+              <w:t xml:space="preserve">source/scripts/round/merge_against_baseline.py</w:t>
             </w:r>
             <w:r>
               <w:t xml:space="preserve">, output in</w:t>
@@ -4105,8 +3933,8 @@
         <w:t xml:space="preserve">checks all four inside a fresh extraction, so none can ship unmet.</w:t>
       </w:r>
     </w:p>
+    <w:bookmarkEnd w:id="16"/>
     <w:bookmarkEnd w:id="17"/>
-    <w:bookmarkEnd w:id="18"/>
     <w:sectPr>
       <w:pgMar w:bottom="1080" w:footer="720" w:gutter="0" w:header="720" w:left="1080" w:right="1080" w:top="1080"/>
       <w:footnotePr>

</xml_diff>

<commit_message>
Register: measured hostname-grain figures for the three journal corpora
</commit_message>
<xml_diff>
--- a/docs/report.docx
+++ b/docs/report.docx
@@ -151,7 +151,7 @@
                 <w:b/>
                 <w:bCs/>
               </w:rPr>
-              <w:t xml:space="preserve">623,758</w:t>
+              <w:t xml:space="preserve">623,835</w:t>
             </w:r>
             <w:r>
               <w:t xml:space="preserve"> </w:t>
@@ -186,7 +186,7 @@
                 <w:b/>
                 <w:bCs/>
               </w:rPr>
-              <w:t xml:space="preserve">328,641.8759</w:t>
+              <w:t xml:space="preserve">328,715.1485</w:t>
             </w:r>
           </w:p>
         </w:tc>
@@ -215,7 +215,7 @@
                 <w:b/>
                 <w:bCs/>
               </w:rPr>
-              <w:t xml:space="preserve">1.8494%</w:t>
+              <w:t xml:space="preserve">1.8498%</w:t>
             </w:r>
           </w:p>
         </w:tc>
@@ -236,7 +236,7 @@
           <w:b/>
           <w:bCs/>
         </w:rPr>
-        <w:t xml:space="preserve">338,865 hostname records (301,649.9813 equivalent-English)</w:t>
+        <w:t xml:space="preserve">4,872,448 hostname records (2,749,488.7901 equivalent-English)</w:t>
       </w:r>
       <w:r>
         <w:t xml:space="preserve"> </w:t>
@@ -276,7 +276,7 @@
           <w:b/>
           <w:bCs/>
         </w:rPr>
-        <w:t xml:space="preserve">3.5468%</w:t>
+        <w:t xml:space="preserve">17.3219%</w:t>
       </w:r>
       <w:r>
         <w:t xml:space="preserve">.</w:t>
@@ -287,7 +287,7 @@
         <w:pStyle w:val="BodyText"/>
       </w:pPr>
       <w:r>
-        <w:t xml:space="preserve">The increment covers 593,919 distinct domains, of which</w:t>
+        <w:t xml:space="preserve">The increment covers 593,996 distinct domains, of which</w:t>
       </w:r>
       <w:r>
         <w:t xml:space="preserve"> </w:t>
@@ -297,7 +297,7 @@
           <w:b/>
           <w:bCs/>
         </w:rPr>
-        <w:t xml:space="preserve">46,115 appear in none of the six</w:t>
+        <w:t xml:space="preserve">46,116 appear in none of the six</w:t>
       </w:r>
       <w:r>
         <w:rPr>
@@ -731,31 +731,31 @@
               <w:jc w:val="right"/>
             </w:pPr>
             <w:r>
-              <w:t xml:space="preserve">500,198</w:t>
-            </w:r>
-          </w:p>
-        </w:tc>
-        <w:tc>
-          <w:tcPr/>
-          <w:p>
-            <w:pPr>
-              <w:pStyle w:val="Compact"/>
-              <w:jc w:val="right"/>
-            </w:pPr>
-            <w:r>
-              <w:t xml:space="preserve">11,036,958</w:t>
-            </w:r>
-          </w:p>
-        </w:tc>
-        <w:tc>
-          <w:tcPr/>
-          <w:p>
-            <w:pPr>
-              <w:pStyle w:val="Compact"/>
-              <w:jc w:val="right"/>
-            </w:pPr>
-            <w:r>
-              <w:t xml:space="preserve">251,928.4504</w:t>
+              <w:t xml:space="preserve">500,275</w:t>
+            </w:r>
+          </w:p>
+        </w:tc>
+        <w:tc>
+          <w:tcPr/>
+          <w:p>
+            <w:pPr>
+              <w:pStyle w:val="Compact"/>
+              <w:jc w:val="right"/>
+            </w:pPr>
+            <w:r>
+              <w:t xml:space="preserve">11,037,035</w:t>
+            </w:r>
+          </w:p>
+        </w:tc>
+        <w:tc>
+          <w:tcPr/>
+          <w:p>
+            <w:pPr>
+              <w:pStyle w:val="Compact"/>
+              <w:jc w:val="right"/>
+            </w:pPr>
+            <w:r>
+              <w:t xml:space="preserve">252,001.7230</w:t>
             </w:r>
           </w:p>
         </w:tc>
@@ -804,7 +804,7 @@
                 <w:b/>
                 <w:bCs/>
               </w:rPr>
-              <w:t xml:space="preserve">623,758</w:t>
+              <w:t xml:space="preserve">623,835</w:t>
             </w:r>
           </w:p>
         </w:tc>
@@ -820,7 +820,7 @@
                 <w:b/>
                 <w:bCs/>
               </w:rPr>
-              <w:t xml:space="preserve">34,472,684</w:t>
+              <w:t xml:space="preserve">34,472,761</w:t>
             </w:r>
           </w:p>
         </w:tc>
@@ -836,7 +836,7 @@
                 <w:b/>
                 <w:bCs/>
               </w:rPr>
-              <w:t xml:space="preserve">328,641.8759</w:t>
+              <w:t xml:space="preserve">328,715.1485</w:t>
             </w:r>
           </w:p>
         </w:tc>
@@ -857,7 +857,7 @@
         <w:t xml:space="preserve"> </w:t>
       </w:r>
       <w:r>
-        <w:t xml:space="preserve">Summing the increases you have awarded, which is how the update log of 2026-08-18 defines the score: 1.659986%, 10.730988%, 14.901054%, 4.130718% and this round's 1.8494% give</w:t>
+        <w:t xml:space="preserve">Summing the increases you have awarded, which is how the update log of 2026-08-18 defines the score: 1.659986%, 10.730988%, 14.901054%, 4.130718% and this round's 1.8498% give</w:t>
       </w:r>
       <w:r>
         <w:t xml:space="preserve"> </w:t>
@@ -867,7 +867,7 @@
           <w:b/>
           <w:bCs/>
         </w:rPr>
-        <w:t xml:space="preserve">33.2721%</w:t>
+        <w:t xml:space="preserve">33.2725%</w:t>
       </w:r>
       <w:r>
         <w:t xml:space="preserve">, with round 1's 1,429,524 records held out because it was awarded at 17.38% on records before the equivalent-English metric existed.</w:t>
@@ -1896,19 +1896,19 @@
               <w:jc w:val="right"/>
             </w:pPr>
             <w:r>
-              <w:t xml:space="preserve">92,408</w:t>
-            </w:r>
-          </w:p>
-        </w:tc>
-        <w:tc>
-          <w:tcPr/>
-          <w:p>
-            <w:pPr>
-              <w:pStyle w:val="Compact"/>
-              <w:jc w:val="right"/>
-            </w:pPr>
-            <w:r>
-              <w:t xml:space="preserve">66,496.3</w:t>
+              <w:t xml:space="preserve">92,479</w:t>
+            </w:r>
+          </w:p>
+        </w:tc>
+        <w:tc>
+          <w:tcPr/>
+          <w:p>
+            <w:pPr>
+              <w:pStyle w:val="Compact"/>
+              <w:jc w:val="right"/>
+            </w:pPr>
+            <w:r>
+              <w:t xml:space="preserve">66,565.9</w:t>
             </w:r>
           </w:p>
         </w:tc>
@@ -3279,7 +3279,7 @@
                 <w:b/>
                 <w:bCs/>
               </w:rPr>
-              <w:t xml:space="preserve">623,758</w:t>
+              <w:t xml:space="preserve">623,835</w:t>
             </w:r>
           </w:p>
         </w:tc>
@@ -3295,7 +3295,7 @@
                 <w:b/>
                 <w:bCs/>
               </w:rPr>
-              <w:t xml:space="preserve">328,641.8759</w:t>
+              <w:t xml:space="preserve">328,715.1485</w:t>
             </w:r>
           </w:p>
         </w:tc>
@@ -3320,19 +3320,19 @@
               <w:jc w:val="right"/>
             </w:pPr>
             <w:r>
-              <w:t xml:space="preserve">34,472,684</w:t>
-            </w:r>
-          </w:p>
-        </w:tc>
-        <w:tc>
-          <w:tcPr/>
-          <w:p>
-            <w:pPr>
-              <w:pStyle w:val="Compact"/>
-              <w:jc w:val="right"/>
-            </w:pPr>
-            <w:r>
-              <w:t xml:space="preserve">18,099,230.7785</w:t>
+              <w:t xml:space="preserve">34,472,761</w:t>
+            </w:r>
+          </w:p>
+        </w:tc>
+        <w:tc>
+          <w:tcPr/>
+          <w:p>
+            <w:pPr>
+              <w:pStyle w:val="Compact"/>
+              <w:jc w:val="right"/>
+            </w:pPr>
+            <w:r>
+              <w:t xml:space="preserve">18,099,304.0511</w:t>
             </w:r>
           </w:p>
         </w:tc>
@@ -3350,7 +3350,7 @@
         <w:t xml:space="preserve">Overlap with the baseline is 0 records</w:t>
       </w:r>
       <w:r>
-        <w:t xml:space="preserve">, so all 623,758 submitted are accepted and nothing counts twice.</w:t>
+        <w:t xml:space="preserve">, so all 623,835 submitted are accepted and nothing counts twice.</w:t>
       </w:r>
     </w:p>
     <w:p>

</xml_diff>

<commit_message>
Restructure the round report around the contribution and point the source table at the register
</commit_message>
<xml_diff>
--- a/docs/report.docx
+++ b/docs/report.docx
@@ -2,7 +2,7 @@
 <file path=word/document.xml><?xml version="1.0" encoding="utf-8"?>
 <w:document xmlns:w="http://schemas.openxmlformats.org/wordprocessingml/2006/main" xmlns:m="http://schemas.openxmlformats.org/officeDocument/2006/math" xmlns:r="http://schemas.openxmlformats.org/officeDocument/2006/relationships" xmlns:o="urn:schemas-microsoft-com:office:office" xmlns:v="urn:schemas-microsoft-com:vml" xmlns:w10="urn:schemas-microsoft-com:office:word" xmlns:a="http://schemas.openxmlformats.org/drawingml/2006/main" xmlns:pic="http://schemas.openxmlformats.org/drawingml/2006/picture" xmlns:wp="http://schemas.openxmlformats.org/drawingml/2006/wordprocessingDrawing">
   <w:body>
-    <w:bookmarkStart w:id="15" w:name="internet-digital-ark-round-7"/>
+    <w:bookmarkStart w:id="17" w:name="internet-digital-ark-round-7"/>
     <w:p>
       <w:pPr>
         <w:pStyle w:val="Heading1"/>
@@ -16,7 +16,7 @@
         <w:pStyle w:val="FirstParagraph"/>
       </w:pPr>
       <w:r>
-        <w:t xml:space="preserve">Additions to the 1996-2001 annual lists against</w:t>
+        <w:t xml:space="preserve">Increment to the 1996-2001 annual lists against</w:t>
       </w:r>
       <w:r>
         <w:t xml:space="preserve"> </w:t>
@@ -34,13 +34,7 @@
         <w:t xml:space="preserve"> </w:t>
       </w:r>
       <w:r>
-        <w:t xml:space="preserve">figure below is generated from the evidence store when the archive is built, so no table here can</w:t>
-      </w:r>
-      <w:r>
-        <w:t xml:space="preserve"> </w:t>
-      </w:r>
-      <w:r>
-        <w:t xml:space="preserve">disagree with the files beside it.</w:t>
+        <w:t xml:space="preserve">figure is generated from the evidence store when the archive is built.</w:t>
       </w:r>
     </w:p>
     <w:bookmarkStart w:id="9" w:name="results"/>
@@ -136,7 +130,7 @@
                 <w:b/>
                 <w:bCs/>
               </w:rPr>
-              <w:t xml:space="preserve">5,496,283</w:t>
+              <w:t xml:space="preserve">5,805,625</w:t>
             </w:r>
             <w:r>
               <w:t xml:space="preserve"> </w:t>
@@ -171,7 +165,7 @@
                 <w:b/>
                 <w:bCs/>
               </w:rPr>
-              <w:t xml:space="preserve">3,078,203.9386</w:t>
+              <w:t xml:space="preserve">3,293,990.8717</w:t>
             </w:r>
           </w:p>
         </w:tc>
@@ -200,7 +194,7 @@
                 <w:b/>
                 <w:bCs/>
               </w:rPr>
-              <w:t xml:space="preserve">17.3219%</w:t>
+              <w:t xml:space="preserve">18.5362%</w:t>
             </w:r>
           </w:p>
         </w:tc>
@@ -211,19 +205,13 @@
         <w:pStyle w:val="BodyText"/>
       </w:pPr>
       <w:r>
-        <w:t xml:space="preserve">The counting unit is your calculator's: one distinct valid hostname per year, at its TLD's English</w:t>
-      </w:r>
-      <w:r>
-        <w:t xml:space="preserve"> </w:t>
-      </w:r>
-      <w:r>
-        <w:t xml:space="preserve">share. The increment is two disjoint files per year, both scored above and both absent from the</w:t>
-      </w:r>
-      <w:r>
-        <w:t xml:space="preserve"> </w:t>
-      </w:r>
-      <w:r>
-        <w:t xml:space="preserve">baseline; your validator rejects no record in either.</w:t>
+        <w:t xml:space="preserve">Two units, both at your calculator's counting unit (one distinct valid hostname per year at its</w:t>
+      </w:r>
+      <w:r>
+        <w:t xml:space="preserve"> </w:t>
+      </w:r>
+      <w:r>
+        <w:t xml:space="preserve">TLD's English share), disjoint, both absent from the baseline, no record rejected by your validator:</w:t>
       </w:r>
     </w:p>
     <w:tbl>
@@ -311,7 +299,7 @@
               <w:pStyle w:val="Compact"/>
             </w:pPr>
             <w:r>
-              <w:t xml:space="preserve">registrable domains, prioritized as you asked</w:t>
+              <w:t xml:space="preserve">registrable domains, the prioritized unit</w:t>
             </w:r>
           </w:p>
         </w:tc>
@@ -400,44 +388,37 @@
               <w:jc w:val="right"/>
             </w:pPr>
             <w:r>
-              <w:t xml:space="preserve">4,872,448</w:t>
-            </w:r>
-          </w:p>
-        </w:tc>
-        <w:tc>
-          <w:tcPr/>
-          <w:p>
-            <w:pPr>
-              <w:pStyle w:val="Compact"/>
-              <w:jc w:val="right"/>
-            </w:pPr>
-            <w:r>
-              <w:t xml:space="preserve">2,749,488.7901</w:t>
-            </w:r>
-          </w:p>
-        </w:tc>
-        <w:tc>
-          <w:tcPr/>
-          <w:p>
-            <w:pPr>
-              <w:pStyle w:val="Compact"/>
-              <w:jc w:val="right"/>
-            </w:pPr>
-            <w:r>
-              <w:t xml:space="preserve">15.4721%</w:t>
+              <w:t xml:space="preserve">5,181,790</w:t>
+            </w:r>
+          </w:p>
+        </w:tc>
+        <w:tc>
+          <w:tcPr/>
+          <w:p>
+            <w:pPr>
+              <w:pStyle w:val="Compact"/>
+              <w:jc w:val="right"/>
+            </w:pPr>
+            <w:r>
+              <w:t xml:space="preserve">2,965,275.7232</w:t>
+            </w:r>
+          </w:p>
+        </w:tc>
+        <w:tc>
+          <w:tcPr/>
+          <w:p>
+            <w:pPr>
+              <w:pStyle w:val="Compact"/>
+              <w:jc w:val="right"/>
+            </w:pPr>
+            <w:r>
+              <w:t xml:space="preserve">16.6864%</w:t>
             </w:r>
           </w:p>
         </w:tc>
       </w:tr>
     </w:tbl>
-    <w:p>
-      <w:pPr>
-        <w:pStyle w:val="BodyText"/>
-      </w:pPr>
-      <w:r>
-        <w:t xml:space="preserve">46,116 of the registrables appear in none of your six files in any year.</w:t>
-      </w:r>
-    </w:p>
+    <w:p/>
     <w:tbl>
       <w:tblPr>
         <w:tblStyle w:val="Table"/>
@@ -573,31 +554,31 @@
               <w:jc w:val="right"/>
             </w:pPr>
             <w:r>
-              <w:t xml:space="preserve">79,143</w:t>
-            </w:r>
-          </w:p>
-        </w:tc>
-        <w:tc>
-          <w:tcPr/>
-          <w:p>
-            <w:pPr>
-              <w:pStyle w:val="Compact"/>
-              <w:jc w:val="right"/>
-            </w:pPr>
-            <w:r>
-              <w:t xml:space="preserve">1,068,001</w:t>
-            </w:r>
-          </w:p>
-        </w:tc>
-        <w:tc>
-          <w:tcPr/>
-          <w:p>
-            <w:pPr>
-              <w:pStyle w:val="Compact"/>
-              <w:jc w:val="right"/>
-            </w:pPr>
-            <w:r>
-              <w:t xml:space="preserve">52,640.8323</w:t>
+              <w:t xml:space="preserve">79,145</w:t>
+            </w:r>
+          </w:p>
+        </w:tc>
+        <w:tc>
+          <w:tcPr/>
+          <w:p>
+            <w:pPr>
+              <w:pStyle w:val="Compact"/>
+              <w:jc w:val="right"/>
+            </w:pPr>
+            <w:r>
+              <w:t xml:space="preserve">1,068,003</w:t>
+            </w:r>
+          </w:p>
+        </w:tc>
+        <w:tc>
+          <w:tcPr/>
+          <w:p>
+            <w:pPr>
+              <w:pStyle w:val="Compact"/>
+              <w:jc w:val="right"/>
+            </w:pPr>
+            <w:r>
+              <w:t xml:space="preserve">52,642.0965</w:t>
             </w:r>
           </w:p>
         </w:tc>
@@ -646,31 +627,31 @@
               <w:jc w:val="right"/>
             </w:pPr>
             <w:r>
-              <w:t xml:space="preserve">156,413</w:t>
-            </w:r>
-          </w:p>
-        </w:tc>
-        <w:tc>
-          <w:tcPr/>
-          <w:p>
-            <w:pPr>
-              <w:pStyle w:val="Compact"/>
-              <w:jc w:val="right"/>
-            </w:pPr>
-            <w:r>
-              <w:t xml:space="preserve">2,335,663</w:t>
-            </w:r>
-          </w:p>
-        </w:tc>
-        <w:tc>
-          <w:tcPr/>
-          <w:p>
-            <w:pPr>
-              <w:pStyle w:val="Compact"/>
-              <w:jc w:val="right"/>
-            </w:pPr>
-            <w:r>
-              <w:t xml:space="preserve">101,217.1697</w:t>
+              <w:t xml:space="preserve">156,415</w:t>
+            </w:r>
+          </w:p>
+        </w:tc>
+        <w:tc>
+          <w:tcPr/>
+          <w:p>
+            <w:pPr>
+              <w:pStyle w:val="Compact"/>
+              <w:jc w:val="right"/>
+            </w:pPr>
+            <w:r>
+              <w:t xml:space="preserve">2,335,665</w:t>
+            </w:r>
+          </w:p>
+        </w:tc>
+        <w:tc>
+          <w:tcPr/>
+          <w:p>
+            <w:pPr>
+              <w:pStyle w:val="Compact"/>
+              <w:jc w:val="right"/>
+            </w:pPr>
+            <w:r>
+              <w:t xml:space="preserve">101,218.4339</w:t>
             </w:r>
           </w:p>
         </w:tc>
@@ -719,31 +700,31 @@
               <w:jc w:val="right"/>
             </w:pPr>
             <w:r>
-              <w:t xml:space="preserve">523,333</w:t>
-            </w:r>
-          </w:p>
-        </w:tc>
-        <w:tc>
-          <w:tcPr/>
-          <w:p>
-            <w:pPr>
-              <w:pStyle w:val="Compact"/>
-              <w:jc w:val="right"/>
-            </w:pPr>
-            <w:r>
-              <w:t xml:space="preserve">3,666,227</w:t>
-            </w:r>
-          </w:p>
-        </w:tc>
-        <w:tc>
-          <w:tcPr/>
-          <w:p>
-            <w:pPr>
-              <w:pStyle w:val="Compact"/>
-              <w:jc w:val="right"/>
-            </w:pPr>
-            <w:r>
-              <w:t xml:space="preserve">313,157.8930</w:t>
+              <w:t xml:space="preserve">523,812</w:t>
+            </w:r>
+          </w:p>
+        </w:tc>
+        <w:tc>
+          <w:tcPr/>
+          <w:p>
+            <w:pPr>
+              <w:pStyle w:val="Compact"/>
+              <w:jc w:val="right"/>
+            </w:pPr>
+            <w:r>
+              <w:t xml:space="preserve">3,666,706</w:t>
+            </w:r>
+          </w:p>
+        </w:tc>
+        <w:tc>
+          <w:tcPr/>
+          <w:p>
+            <w:pPr>
+              <w:pStyle w:val="Compact"/>
+              <w:jc w:val="right"/>
+            </w:pPr>
+            <w:r>
+              <w:t xml:space="preserve">313,457.2660</w:t>
             </w:r>
           </w:p>
         </w:tc>
@@ -792,31 +773,31 @@
               <w:jc w:val="right"/>
             </w:pPr>
             <w:r>
-              <w:t xml:space="preserve">823,132</w:t>
-            </w:r>
-          </w:p>
-        </w:tc>
-        <w:tc>
-          <w:tcPr/>
-          <w:p>
-            <w:pPr>
-              <w:pStyle w:val="Compact"/>
-              <w:jc w:val="right"/>
-            </w:pPr>
-            <w:r>
-              <w:t xml:space="preserve">7,215,268</w:t>
-            </w:r>
-          </w:p>
-        </w:tc>
-        <w:tc>
-          <w:tcPr/>
-          <w:p>
-            <w:pPr>
-              <w:pStyle w:val="Compact"/>
-              <w:jc w:val="right"/>
-            </w:pPr>
-            <w:r>
-              <w:t xml:space="preserve">496,234.0371</w:t>
+              <w:t xml:space="preserve">834,596</w:t>
+            </w:r>
+          </w:p>
+        </w:tc>
+        <w:tc>
+          <w:tcPr/>
+          <w:p>
+            <w:pPr>
+              <w:pStyle w:val="Compact"/>
+              <w:jc w:val="right"/>
+            </w:pPr>
+            <w:r>
+              <w:t xml:space="preserve">7,226,732</w:t>
+            </w:r>
+          </w:p>
+        </w:tc>
+        <w:tc>
+          <w:tcPr/>
+          <w:p>
+            <w:pPr>
+              <w:pStyle w:val="Compact"/>
+              <w:jc w:val="right"/>
+            </w:pPr>
+            <w:r>
+              <w:t xml:space="preserve">503,412.6355</w:t>
             </w:r>
           </w:p>
         </w:tc>
@@ -865,31 +846,31 @@
               <w:jc w:val="right"/>
             </w:pPr>
             <w:r>
-              <w:t xml:space="preserve">1,459,870</w:t>
-            </w:r>
-          </w:p>
-        </w:tc>
-        <w:tc>
-          <w:tcPr/>
-          <w:p>
-            <w:pPr>
-              <w:pStyle w:val="Compact"/>
-              <w:jc w:val="right"/>
-            </w:pPr>
-            <w:r>
-              <w:t xml:space="preserve">12,192,458</w:t>
-            </w:r>
-          </w:p>
-        </w:tc>
-        <w:tc>
-          <w:tcPr/>
-          <w:p>
-            <w:pPr>
-              <w:pStyle w:val="Compact"/>
-              <w:jc w:val="right"/>
-            </w:pPr>
-            <w:r>
-              <w:t xml:space="preserve">813,656.2976</w:t>
+              <w:t xml:space="preserve">1,498,236</w:t>
+            </w:r>
+          </w:p>
+        </w:tc>
+        <w:tc>
+          <w:tcPr/>
+          <w:p>
+            <w:pPr>
+              <w:pStyle w:val="Compact"/>
+              <w:jc w:val="right"/>
+            </w:pPr>
+            <w:r>
+              <w:t xml:space="preserve">12,230,824</w:t>
+            </w:r>
+          </w:p>
+        </w:tc>
+        <w:tc>
+          <w:tcPr/>
+          <w:p>
+            <w:pPr>
+              <w:pStyle w:val="Compact"/>
+              <w:jc w:val="right"/>
+            </w:pPr>
+            <w:r>
+              <w:t xml:space="preserve">838,732.0079</w:t>
             </w:r>
           </w:p>
         </w:tc>
@@ -938,31 +919,31 @@
               <w:jc w:val="right"/>
             </w:pPr>
             <w:r>
-              <w:t xml:space="preserve">1,830,557</w:t>
-            </w:r>
-          </w:p>
-        </w:tc>
-        <w:tc>
-          <w:tcPr/>
-          <w:p>
-            <w:pPr>
-              <w:pStyle w:val="Compact"/>
-              <w:jc w:val="right"/>
-            </w:pPr>
-            <w:r>
-              <w:t xml:space="preserve">12,867,592</w:t>
-            </w:r>
-          </w:p>
-        </w:tc>
-        <w:tc>
-          <w:tcPr/>
-          <w:p>
-            <w:pPr>
-              <w:pStyle w:val="Compact"/>
-              <w:jc w:val="right"/>
-            </w:pPr>
-            <w:r>
-              <w:t xml:space="preserve">1,301,297.7089</w:t>
+              <w:t xml:space="preserve">2,089,586</w:t>
+            </w:r>
+          </w:p>
+        </w:tc>
+        <w:tc>
+          <w:tcPr/>
+          <w:p>
+            <w:pPr>
+              <w:pStyle w:val="Compact"/>
+              <w:jc w:val="right"/>
+            </w:pPr>
+            <w:r>
+              <w:t xml:space="preserve">13,126,621</w:t>
+            </w:r>
+          </w:p>
+        </w:tc>
+        <w:tc>
+          <w:tcPr/>
+          <w:p>
+            <w:pPr>
+              <w:pStyle w:val="Compact"/>
+              <w:jc w:val="right"/>
+            </w:pPr>
+            <w:r>
+              <w:t xml:space="preserve">1,484,528.4319</w:t>
             </w:r>
           </w:p>
         </w:tc>
@@ -1027,7 +1008,7 @@
                 <w:b/>
                 <w:bCs/>
               </w:rPr>
-              <w:t xml:space="preserve">4,872,448</w:t>
+              <w:t xml:space="preserve">5,181,790</w:t>
             </w:r>
           </w:p>
         </w:tc>
@@ -1043,7 +1024,7 @@
                 <w:b/>
                 <w:bCs/>
               </w:rPr>
-              <w:t xml:space="preserve">39,345,209</w:t>
+              <w:t xml:space="preserve">39,654,551</w:t>
             </w:r>
           </w:p>
         </w:tc>
@@ -1059,7 +1040,7 @@
                 <w:b/>
                 <w:bCs/>
               </w:rPr>
-              <w:t xml:space="preserve">3,078,203.9386</w:t>
+              <w:t xml:space="preserve">3,293,990.8717</w:t>
             </w:r>
           </w:p>
         </w:tc>
@@ -1074,50 +1055,112 @@
           <w:b/>
           <w:bCs/>
         </w:rPr>
-        <w:t xml:space="preserve">Cumulative.</w:t>
-      </w:r>
-      <w:r>
-        <w:t xml:space="preserve"> </w:t>
-      </w:r>
-      <w:r>
-        <w:t xml:space="preserve">Summing the increases you have awarded, which is how the update log of 2026-08-18 defines the score: 1.659986%, 10.730988%, 14.901054%, 4.130718% and this round's 17.3219% give</w:t>
-      </w:r>
-      <w:r>
-        <w:t xml:space="preserve"> </w:t>
-      </w:r>
+        <w:t xml:space="preserve">Cumulative score 49.9589%</w:t>
+      </w:r>
+      <w:r>
+        <w:t xml:space="preserve">: the sum of the increases you awarded (1.659986%, 10.730988%, 14.901054%, 4.130718%) plus this round's 18.5362%, as your update log of 2026-08-18 defines it. Round 1 is held out: awarded on records, before the equivalent-English metric.</w:t>
+      </w:r>
+    </w:p>
+    <w:bookmarkEnd w:id="9"/>
+    <w:bookmarkStart w:id="10" w:name="what-the-increment-is"/>
+    <w:p>
+      <w:pPr>
+        <w:pStyle w:val="Heading2"/>
+      </w:pPr>
+      <w:r>
+        <w:t xml:space="preserve">2. What the increment is</w:t>
+      </w:r>
+    </w:p>
+    <w:p>
+      <w:pPr>
+        <w:pStyle w:val="FirstParagraph"/>
+      </w:pPr>
+      <w:r>
+        <w:t xml:space="preserve">Three things, largest first:</w:t>
+      </w:r>
+    </w:p>
+    <w:p>
+      <w:pPr>
+        <w:pStyle w:val="Compact"/>
+        <w:numPr>
+          <w:ilvl w:val="0"/>
+          <w:numId w:val="1001"/>
+        </w:numPr>
+      </w:pPr>
       <w:r>
         <w:rPr>
           <w:b/>
           <w:bCs/>
         </w:rPr>
-        <w:t xml:space="preserve">48.7446%</w:t>
-      </w:r>
-      <w:r>
-        <w:t xml:space="preserve">, with round 1's 1,429,524 records held out because it was awarded at 17.38% on records before the equivalent-English metric existed.</w:t>
-      </w:r>
-    </w:p>
-    <w:bookmarkEnd w:id="9"/>
-    <w:bookmarkStart w:id="10" w:name="Xd8f5aa1d218c55d3cb844bb7d6f306d3b6a9ac3"/>
-    <w:p>
-      <w:pPr>
-        <w:pStyle w:val="Heading2"/>
-      </w:pPr>
-      <w:r>
-        <w:t xml:space="preserve">2. Where the additions come from, and what dates each record</w:t>
+        <w:t xml:space="preserve">Capture corpora already on disk, re-read at hostname grain: 2,097,955 EE,</w:t>
+      </w:r>
+      <w:r>
+        <w:rPr>
+          <w:b/>
+          <w:bCs/>
+        </w:rPr>
+        <w:t xml:space="preserve"> </w:t>
+      </w:r>
+      <w:r>
+        <w:rPr>
+          <w:b/>
+          <w:bCs/>
+        </w:rPr>
+        <w:t xml:space="preserve">4,039,562 records.</w:t>
+      </w:r>
+      <w:r>
+        <w:t xml:space="preserve"> </w:t>
+      </w:r>
+      <w:r>
+        <w:t xml:space="preserve">Until you accepted hostnames the pipeline collapsed every host to its</w:t>
+      </w:r>
+      <w:r>
+        <w:t xml:space="preserve"> </w:t>
+      </w:r>
+      <w:r>
+        <w:t xml:space="preserve">registrable, so the NYPW TimeMaps (34 parts, CC BY 4.0) stood recorded as spent and 180</w:t>
+      </w:r>
+      <w:r>
+        <w:t xml:space="preserve"> </w:t>
+      </w:r>
+      <w:r>
+        <w:t xml:space="preserve">domain-wide CDX journals as worth 0. The same bytes, re-read under the new unit, are the</w:t>
+      </w:r>
+      <w:r>
+        <w:t xml:space="preserve"> </w:t>
+      </w:r>
+      <w:r>
+        <w:t xml:space="preserve">largest source of the round, with no new request.</w:t>
       </w:r>
     </w:p>
     <w:p>
       <w:pPr>
-        <w:pStyle w:val="FirstParagraph"/>
-      </w:pPr>
-      <w:r>
-        <w:t xml:space="preserve">Ranked by equivalent-English (EE); sources under 1,000 EE share one row. Full per-source figures,</w:t>
-      </w:r>
-      <w:r>
-        <w:t xml:space="preserve"> </w:t>
-      </w:r>
-      <w:r>
-        <w:t xml:space="preserve">including files ingested and evidence rows, are in</w:t>
+        <w:pStyle w:val="Compact"/>
+        <w:numPr>
+          <w:ilvl w:val="0"/>
+          <w:numId w:val="1001"/>
+        </w:numPr>
+      </w:pPr>
+      <w:r>
+        <w:rPr>
+          <w:b/>
+          <w:bCs/>
+        </w:rPr>
+        <w:t xml:space="preserve">Domain-wide CDX sweeps over subdomain platforms: 867,321 EE, 1,142,228</w:t>
+      </w:r>
+      <w:r>
+        <w:rPr>
+          <w:b/>
+          <w:bCs/>
+        </w:rPr>
+        <w:t xml:space="preserve"> </w:t>
+      </w:r>
+      <w:r>
+        <w:rPr>
+          <w:b/>
+          <w:bCs/>
+        </w:rPr>
+        <w:t xml:space="preserve">records.</w:t>
       </w:r>
       <w:r>
         <w:t xml:space="preserve"> </w:t>
@@ -1126,10 +1169,116 @@
         <w:rPr>
           <w:rStyle w:val="VerbatimChar"/>
         </w:rPr>
-        <w:t xml:space="preserve">audit/source_contribution.csv</w:t>
-      </w:r>
-      <w:r>
-        <w:t xml:space="preserve">.</w:t>
+        <w:t xml:space="preserve">matchType=domain</w:t>
+      </w:r>
+      <w:r>
+        <w:t xml:space="preserve">, 1996-2001, over the parents your own benchmark proves dense</w:t>
+      </w:r>
+      <w:r>
+        <w:t xml:space="preserve"> </w:t>
+      </w:r>
+      <w:r>
+        <w:t xml:space="preserve">(</w:t>
+      </w:r>
+      <w:r>
+        <w:rPr>
+          <w:rStyle w:val="VerbatimChar"/>
+        </w:rPr>
+        <w:t xml:space="preserve">rank_platform_parents.py</w:t>
+      </w:r>
+      <w:r>
+        <w:t xml:space="preserve">:</w:t>
+      </w:r>
+      <w:r>
+        <w:t xml:space="preserve"> </w:t>
+      </w:r>
+      <w:r>
+        <w:rPr>
+          <w:rStyle w:val="VerbatimChar"/>
+        </w:rPr>
+        <w:t xml:space="preserve">cjb.net</w:t>
+      </w:r>
+      <w:r>
+        <w:t xml:space="preserve"> </w:t>
+      </w:r>
+      <w:r>
+        <w:t xml:space="preserve">leads at 157,790 sub-hosts held, then</w:t>
+      </w:r>
+      <w:r>
+        <w:t xml:space="preserve"> </w:t>
+      </w:r>
+      <w:r>
+        <w:rPr>
+          <w:rStyle w:val="VerbatimChar"/>
+        </w:rPr>
+        <w:t xml:space="preserve">demon.co.uk</w:t>
+      </w:r>
+      <w:r>
+        <w:t xml:space="preserve">,</w:t>
+      </w:r>
+      <w:r>
+        <w:t xml:space="preserve"> </w:t>
+      </w:r>
+      <w:r>
+        <w:rPr>
+          <w:rStyle w:val="VerbatimChar"/>
+        </w:rPr>
+        <w:t xml:space="preserve">freeserve.co.uk</w:t>
+      </w:r>
+      <w:r>
+        <w:t xml:space="preserve">). This is the workflow your 0901 update describes; each parent is resumable</w:t>
+      </w:r>
+      <w:r>
+        <w:t xml:space="preserve"> </w:t>
+      </w:r>
+      <w:r>
+        <w:t xml:space="preserve">from the saturation ledger.</w:t>
+      </w:r>
+    </w:p>
+    <w:p>
+      <w:pPr>
+        <w:pStyle w:val="Compact"/>
+        <w:numPr>
+          <w:ilvl w:val="0"/>
+          <w:numId w:val="1001"/>
+        </w:numPr>
+      </w:pPr>
+      <w:r>
+        <w:rPr>
+          <w:b/>
+          <w:bCs/>
+        </w:rPr>
+        <w:t xml:space="preserve">Registrable domains, the prioritized unit: 328,715.1485 EE, 623,835 records.</w:t>
+      </w:r>
+      <w:r>
+        <w:t xml:space="preserve"> </w:t>
+      </w:r>
+      <w:r>
+        <w:t xml:space="preserve">NYPW TimeMaps</w:t>
+      </w:r>
+      <w:r>
+        <w:t xml:space="preserve"> </w:t>
+      </w:r>
+      <w:r>
+        <w:t xml:space="preserve">reopened and measured partition by partition (150,468 EE, after a 14 EE closure on the</w:t>
+      </w:r>
+      <w:r>
+        <w:t xml:space="preserve"> </w:t>
+      </w:r>
+      <w:r>
+        <w:t xml:space="preserve">1996 folder), per-domain CDX queries over bracketed gaps (66,566), three Usenet lanes</w:t>
+      </w:r>
+      <w:r>
+        <w:t xml:space="preserve"> </w:t>
+      </w:r>
+      <w:r>
+        <w:t xml:space="preserve">(71,388) and 20 small dated artifacts (40,293). 46,116 of</w:t>
+      </w:r>
+      <w:r>
+        <w:t xml:space="preserve"> </w:t>
+      </w:r>
+      <w:r>
+        <w:t xml:space="preserve">these domains appear in none of your six files in any year.</w:t>
       </w:r>
     </w:p>
     <w:tbl>
@@ -1140,11 +1289,11 @@
         <w:tblLook w:firstRow="1" w:lastRow="0" w:firstColumn="0" w:lastColumn="0" w:noHBand="0" w:noVBand="0" w:val="0020"/>
       </w:tblPr>
       <w:tblGrid>
-        <w:gridCol w:w="1403"/>
-        <w:gridCol w:w="2606"/>
-        <w:gridCol w:w="2205"/>
-        <w:gridCol w:w="902"/>
-        <w:gridCol w:w="802"/>
+        <w:gridCol w:w="2534"/>
+        <w:gridCol w:w="633"/>
+        <w:gridCol w:w="2956"/>
+        <w:gridCol w:w="950"/>
+        <w:gridCol w:w="844"/>
       </w:tblGrid>
       <w:tr>
         <w:trPr>
@@ -1157,18 +1306,18 @@
               <w:pStyle w:val="Compact"/>
             </w:pPr>
             <w:r>
-              <w:t xml:space="preserve">Source, unit</w:t>
-            </w:r>
-          </w:p>
-        </w:tc>
-        <w:tc>
-          <w:tcPr/>
-          <w:p>
-            <w:pPr>
-              <w:pStyle w:val="Compact"/>
-            </w:pPr>
-            <w:r>
-              <w:t xml:space="preserve">Artifact, and how it was obtained</w:t>
+              <w:t xml:space="preserve">Source</w:t>
+            </w:r>
+          </w:p>
+        </w:tc>
+        <w:tc>
+          <w:tcPr/>
+          <w:p>
+            <w:pPr>
+              <w:pStyle w:val="Compact"/>
+            </w:pPr>
+            <w:r>
+              <w:t xml:space="preserve">Unit</w:t>
             </w:r>
           </w:p>
         </w:tc>
@@ -1221,19 +1370,16 @@
               </w:rPr>
               <w:t xml:space="preserve">nypw_timemap_hostgrain</w:t>
             </w:r>
-            <w:r>
-              <w:t xml:space="preserve">, hostname</w:t>
-            </w:r>
-          </w:p>
-        </w:tc>
-        <w:tc>
-          <w:tcPr/>
-          <w:p>
-            <w:pPr>
-              <w:pStyle w:val="Compact"/>
-            </w:pPr>
-            <w:r>
-              <w:t xml:space="preserve">NYPW TimeMaps (IA, CC BY 4.0), 34 parts held since round 6, re-read at hostname grain</w:t>
+          </w:p>
+        </w:tc>
+        <w:tc>
+          <w:tcPr/>
+          <w:p>
+            <w:pPr>
+              <w:pStyle w:val="Compact"/>
+            </w:pPr>
+            <w:r>
+              <w:t xml:space="preserve">hostname</w:t>
             </w:r>
           </w:p>
         </w:tc>
@@ -1286,49 +1432,16 @@
               </w:rPr>
               <w:t xml:space="preserve">ia_cdx_domain_sweep</w:t>
             </w:r>
-            <w:r>
-              <w:t xml:space="preserve">, hostname</w:t>
-            </w:r>
-          </w:p>
-        </w:tc>
-        <w:tc>
-          <w:tcPr/>
-          <w:p>
-            <w:pPr>
-              <w:pStyle w:val="Compact"/>
-            </w:pPr>
-            <w:r>
-              <w:t xml:space="preserve">IA CDX</w:t>
-            </w:r>
-            <w:r>
-              <w:t xml:space="preserve"> </w:t>
-            </w:r>
-            <w:r>
-              <w:rPr>
-                <w:rStyle w:val="VerbatimChar"/>
-              </w:rPr>
-              <w:t xml:space="preserve">matchType=domain</w:t>
-            </w:r>
-            <w:r>
-              <w:t xml:space="preserve"> </w:t>
-            </w:r>
-            <w:r>
-              <w:t xml:space="preserve">sweeps of</w:t>
-            </w:r>
-            <w:r>
-              <w:t xml:space="preserve"> </w:t>
-            </w:r>
-            <w:r>
-              <w:rPr>
-                <w:rStyle w:val="VerbatimChar"/>
-              </w:rPr>
-              <w:t xml:space="preserve">.uk</w:t>
-            </w:r>
-            <w:r>
-              <w:t xml:space="preserve"> </w:t>
-            </w:r>
-            <w:r>
-              <w:t xml:space="preserve">suffixes and subdomain platforms, raw journals</w:t>
+          </w:p>
+        </w:tc>
+        <w:tc>
+          <w:tcPr/>
+          <w:p>
+            <w:pPr>
+              <w:pStyle w:val="Compact"/>
+            </w:pPr>
+            <w:r>
+              <w:t xml:space="preserve">hostname</w:t>
             </w:r>
           </w:p>
         </w:tc>
@@ -1351,19 +1464,19 @@
               <w:jc w:val="right"/>
             </w:pPr>
             <w:r>
-              <w:t xml:space="preserve">832,886</w:t>
-            </w:r>
-          </w:p>
-        </w:tc>
-        <w:tc>
-          <w:tcPr/>
-          <w:p>
-            <w:pPr>
-              <w:pStyle w:val="Compact"/>
-              <w:jc w:val="right"/>
-            </w:pPr>
-            <w:r>
-              <w:t xml:space="preserve">651,534</w:t>
+              <w:t xml:space="preserve">1,142,228</w:t>
+            </w:r>
+          </w:p>
+        </w:tc>
+        <w:tc>
+          <w:tcPr/>
+          <w:p>
+            <w:pPr>
+              <w:pStyle w:val="Compact"/>
+              <w:jc w:val="right"/>
+            </w:pPr>
+            <w:r>
+              <w:t xml:space="preserve">867,321</w:t>
             </w:r>
           </w:p>
         </w:tc>
@@ -1381,19 +1494,16 @@
               </w:rPr>
               <w:t xml:space="preserve">nypw_timemaps</w:t>
             </w:r>
-            <w:r>
-              <w:t xml:space="preserve">, registrable</w:t>
-            </w:r>
-          </w:p>
-        </w:tc>
-        <w:tc>
-          <w:tcPr/>
-          <w:p>
-            <w:pPr>
-              <w:pStyle w:val="Compact"/>
-            </w:pPr>
-            <w:r>
-              <w:t xml:space="preserve">NYPW TimeMaps, 34 parts, reopened after a 14 EE closure on the 1996 folder</w:t>
+          </w:p>
+        </w:tc>
+        <w:tc>
+          <w:tcPr/>
+          <w:p>
+            <w:pPr>
+              <w:pStyle w:val="Compact"/>
+            </w:pPr>
+            <w:r>
+              <w:t xml:space="preserve">registrable</w:t>
             </w:r>
           </w:p>
         </w:tc>
@@ -1446,19 +1556,16 @@
               </w:rPr>
               <w:t xml:space="preserve">ia_cdx_bulk</w:t>
             </w:r>
-            <w:r>
-              <w:t xml:space="preserve">, registrable</w:t>
-            </w:r>
-          </w:p>
-        </w:tc>
-        <w:tc>
-          <w:tcPr/>
-          <w:p>
-            <w:pPr>
-              <w:pStyle w:val="Compact"/>
-            </w:pPr>
-            <w:r>
-              <w:t xml:space="preserve">IA CDX per-domain queries over bracketed gaps and the candidate pool</w:t>
+          </w:p>
+        </w:tc>
+        <w:tc>
+          <w:tcPr/>
+          <w:p>
+            <w:pPr>
+              <w:pStyle w:val="Compact"/>
+            </w:pPr>
+            <w:r>
+              <w:t xml:space="preserve">registrable</w:t>
             </w:r>
           </w:p>
         </w:tc>
@@ -1511,19 +1618,16 @@
               </w:rPr>
               <w:t xml:space="preserve">usenet_address</w:t>
             </w:r>
-            <w:r>
-              <w:t xml:space="preserve">, registrable</w:t>
-            </w:r>
-          </w:p>
-        </w:tc>
-        <w:tc>
-          <w:tcPr/>
-          <w:p>
-            <w:pPr>
-              <w:pStyle w:val="Compact"/>
-            </w:pPr>
-            <w:r>
-              <w:t xml:space="preserve">Usenet archives (IA), sender and body addresses</w:t>
+          </w:p>
+        </w:tc>
+        <w:tc>
+          <w:tcPr/>
+          <w:p>
+            <w:pPr>
+              <w:pStyle w:val="Compact"/>
+            </w:pPr>
+            <w:r>
+              <w:t xml:space="preserve">registrable</w:t>
             </w:r>
           </w:p>
         </w:tc>
@@ -1591,19 +1695,16 @@
               </w:rPr>
               <w:t xml:space="preserve">usenet_announce</w:t>
             </w:r>
-            <w:r>
-              <w:t xml:space="preserve">, registrable</w:t>
-            </w:r>
-          </w:p>
-        </w:tc>
-        <w:tc>
-          <w:tcPr/>
-          <w:p>
-            <w:pPr>
-              <w:pStyle w:val="Compact"/>
-            </w:pPr>
-            <w:r>
-              <w:t xml:space="preserve">Usenet site announcements (IA)</w:t>
+          </w:p>
+        </w:tc>
+        <w:tc>
+          <w:tcPr/>
+          <w:p>
+            <w:pPr>
+              <w:pStyle w:val="Compact"/>
+            </w:pPr>
+            <w:r>
+              <w:t xml:space="preserve">registrable</w:t>
             </w:r>
           </w:p>
         </w:tc>
@@ -1666,966 +1767,44 @@
               <w:pStyle w:val="Compact"/>
             </w:pPr>
             <w:r>
+              <w:t xml:space="preserve">22 further sources</w:t>
+            </w:r>
+          </w:p>
+        </w:tc>
+        <w:tc>
+          <w:tcPr/>
+          <w:p>
+            <w:pPr>
+              <w:pStyle w:val="Compact"/>
+            </w:pPr>
+            <w:r>
+              <w:t xml:space="preserve">registrable</w:t>
+            </w:r>
+          </w:p>
+        </w:tc>
+        <w:tc>
+          <w:tcPr/>
+          <w:p>
+            <w:pPr>
+              <w:pStyle w:val="Compact"/>
+            </w:pPr>
+            <w:r>
+              <w:t xml:space="preserve">one row each in</w:t>
+            </w:r>
+            <w:r>
+              <w:t xml:space="preserve"> </w:t>
+            </w:r>
+            <w:r>
               <w:rPr>
                 <w:rStyle w:val="VerbatimChar"/>
               </w:rPr>
-              <w:t xml:space="preserve">usenet_bare</w:t>
-            </w:r>
-            <w:r>
-              <w:t xml:space="preserve">, registrable</w:t>
-            </w:r>
-          </w:p>
-        </w:tc>
-        <w:tc>
-          <w:tcPr/>
-          <w:p>
-            <w:pPr>
-              <w:pStyle w:val="Compact"/>
-            </w:pPr>
-            <w:r>
-              <w:t xml:space="preserve">Usenet archives (IA), bare hostnames in bodies</w:t>
-            </w:r>
-          </w:p>
-        </w:tc>
-        <w:tc>
-          <w:tcPr/>
-          <w:p>
-            <w:pPr>
-              <w:pStyle w:val="Compact"/>
-            </w:pPr>
-            <w:r>
-              <w:t xml:space="preserve">the post's</w:t>
+              <w:t xml:space="preserve">sources.md</w:t>
             </w:r>
             <w:r>
               <w:t xml:space="preserve"> </w:t>
             </w:r>
             <w:r>
-              <w:rPr>
-                <w:rStyle w:val="VerbatimChar"/>
-              </w:rPr>
-              <w:t xml:space="preserve">Date:</w:t>
-            </w:r>
-            <w:r>
-              <w:t xml:space="preserve"> </w:t>
-            </w:r>
-            <w:r>
-              <w:t xml:space="preserve">header, corroborated by a second source</w:t>
-            </w:r>
-          </w:p>
-        </w:tc>
-        <w:tc>
-          <w:tcPr/>
-          <w:p>
-            <w:pPr>
-              <w:pStyle w:val="Compact"/>
-              <w:jc w:val="right"/>
-            </w:pPr>
-            <w:r>
-              <w:t xml:space="preserve">19,387</w:t>
-            </w:r>
-          </w:p>
-        </w:tc>
-        <w:tc>
-          <w:tcPr/>
-          <w:p>
-            <w:pPr>
-              <w:pStyle w:val="Compact"/>
-              <w:jc w:val="right"/>
-            </w:pPr>
-            <w:r>
-              <w:t xml:space="preserve">13,587</w:t>
-            </w:r>
-          </w:p>
-        </w:tc>
-      </w:tr>
-      <w:tr>
-        <w:tc>
-          <w:tcPr/>
-          <w:p>
-            <w:pPr>
-              <w:pStyle w:val="Compact"/>
-            </w:pPr>
-            <w:r>
-              <w:rPr>
-                <w:rStyle w:val="VerbatimChar"/>
-              </w:rPr>
-              <w:t xml:space="preserve">chastity_list_blacklist</w:t>
-            </w:r>
-            <w:r>
-              <w:t xml:space="preserve">, registrable</w:t>
-            </w:r>
-          </w:p>
-        </w:tc>
-        <w:tc>
-          <w:tcPr/>
-          <w:p>
-            <w:pPr>
-              <w:pStyle w:val="Compact"/>
-            </w:pPr>
-            <w:r>
-              <w:t xml:space="preserve">Chastity filter blacklist tarball, 2001</w:t>
-            </w:r>
-          </w:p>
-        </w:tc>
-        <w:tc>
-          <w:tcPr/>
-          <w:p>
-            <w:pPr>
-              <w:pStyle w:val="Compact"/>
-            </w:pPr>
-            <w:r>
-              <w:t xml:space="preserve">tar member headers</w:t>
-            </w:r>
-            <w:r>
-              <w:t xml:space="preserve"> </w:t>
-            </w:r>
-            <w:r>
-              <w:rPr>
-                <w:rStyle w:val="VerbatimChar"/>
-              </w:rPr>
-              <w:t xml:space="preserve">Dec 14 2001</w:t>
-            </w:r>
-            <w:r>
-              <w:t xml:space="preserve"> </w:t>
-            </w:r>
-            <w:r>
-              <w:t xml:space="preserve">and dated diff filenames</w:t>
-            </w:r>
-          </w:p>
-        </w:tc>
-        <w:tc>
-          <w:tcPr/>
-          <w:p>
-            <w:pPr>
-              <w:pStyle w:val="Compact"/>
-              <w:jc w:val="right"/>
-            </w:pPr>
-            <w:r>
-              <w:t xml:space="preserve">21,175</w:t>
-            </w:r>
-          </w:p>
-        </w:tc>
-        <w:tc>
-          <w:tcPr/>
-          <w:p>
-            <w:pPr>
-              <w:pStyle w:val="Compact"/>
-              <w:jc w:val="right"/>
-            </w:pPr>
-            <w:r>
-              <w:t xml:space="preserve">12,038</w:t>
-            </w:r>
-          </w:p>
-        </w:tc>
-      </w:tr>
-      <w:tr>
-        <w:tc>
-          <w:tcPr/>
-          <w:p>
-            <w:pPr>
-              <w:pStyle w:val="Compact"/>
-            </w:pPr>
-            <w:r>
-              <w:rPr>
-                <w:rStyle w:val="VerbatimChar"/>
-              </w:rPr>
-              <w:t xml:space="preserve">mynic_my_change_report</w:t>
-            </w:r>
-            <w:r>
-              <w:t xml:space="preserve">, registrable</w:t>
-            </w:r>
-          </w:p>
-        </w:tc>
-        <w:tc>
-          <w:tcPr/>
-          <w:p>
-            <w:pPr>
-              <w:pStyle w:val="Compact"/>
-            </w:pPr>
-            <w:r>
-              <w:t xml:space="preserve">MYNIC</w:t>
-            </w:r>
-            <w:r>
-              <w:t xml:space="preserve"> </w:t>
-            </w:r>
-            <w:r>
-              <w:rPr>
-                <w:rStyle w:val="VerbatimChar"/>
-              </w:rPr>
-              <w:t xml:space="preserve">.my</w:t>
-            </w:r>
-            <w:r>
-              <w:t xml:space="preserve"> </w:t>
-            </w:r>
-            <w:r>
-              <w:t xml:space="preserve">fortnightly change reports (IA)</w:t>
-            </w:r>
-          </w:p>
-        </w:tc>
-        <w:tc>
-          <w:tcPr/>
-          <w:p>
-            <w:pPr>
-              <w:pStyle w:val="Compact"/>
-            </w:pPr>
-            <w:r>
-              <w:t xml:space="preserve">the per-day heading over each</w:t>
-            </w:r>
-            <w:r>
-              <w:t xml:space="preserve"> </w:t>
-            </w:r>
-            <w:r>
-              <w:rPr>
-                <w:rStyle w:val="VerbatimChar"/>
-              </w:rPr>
-              <w:t xml:space="preserve">New</w:t>
-            </w:r>
-            <w:r>
-              <w:t xml:space="preserve">/</w:t>
-            </w:r>
-            <w:r>
-              <w:rPr>
-                <w:rStyle w:val="VerbatimChar"/>
-              </w:rPr>
-              <w:t xml:space="preserve">Delete</w:t>
-            </w:r>
-            <w:r>
-              <w:t xml:space="preserve"> </w:t>
-            </w:r>
-            <w:r>
-              <w:t xml:space="preserve">entry</w:t>
-            </w:r>
-          </w:p>
-        </w:tc>
-        <w:tc>
-          <w:tcPr/>
-          <w:p>
-            <w:pPr>
-              <w:pStyle w:val="Compact"/>
-              <w:jc w:val="right"/>
-            </w:pPr>
-            <w:r>
-              <w:t xml:space="preserve">9,070</w:t>
-            </w:r>
-          </w:p>
-        </w:tc>
-        <w:tc>
-          <w:tcPr/>
-          <w:p>
-            <w:pPr>
-              <w:pStyle w:val="Compact"/>
-              <w:jc w:val="right"/>
-            </w:pPr>
-            <w:r>
-              <w:t xml:space="preserve">6,875</w:t>
-            </w:r>
-          </w:p>
-        </w:tc>
-      </w:tr>
-      <w:tr>
-        <w:tc>
-          <w:tcPr/>
-          <w:p>
-            <w:pPr>
-              <w:pStyle w:val="Compact"/>
-            </w:pPr>
-            <w:r>
-              <w:rPr>
-                <w:rStyle w:val="VerbatimChar"/>
-              </w:rPr>
-              <w:t xml:space="preserve">nypw_timemaps_nonok</w:t>
-            </w:r>
-            <w:r>
-              <w:t xml:space="preserve">, registrable</w:t>
-            </w:r>
-          </w:p>
-        </w:tc>
-        <w:tc>
-          <w:tcPr/>
-          <w:p>
-            <w:pPr>
-              <w:pStyle w:val="Compact"/>
-            </w:pPr>
-            <w:r>
-              <w:t xml:space="preserve">same files, rows with a non-200 status the parser used to discard</w:t>
-            </w:r>
-          </w:p>
-        </w:tc>
-        <w:tc>
-          <w:tcPr/>
-          <w:p>
-            <w:pPr>
-              <w:pStyle w:val="Compact"/>
-            </w:pPr>
-            <w:r>
-              <w:t xml:space="preserve">the row's own 14-digit capture timestamp</w:t>
-            </w:r>
-          </w:p>
-        </w:tc>
-        <w:tc>
-          <w:tcPr/>
-          <w:p>
-            <w:pPr>
-              <w:pStyle w:val="Compact"/>
-              <w:jc w:val="right"/>
-            </w:pPr>
-            <w:r>
-              <w:t xml:space="preserve">13,277</w:t>
-            </w:r>
-          </w:p>
-        </w:tc>
-        <w:tc>
-          <w:tcPr/>
-          <w:p>
-            <w:pPr>
-              <w:pStyle w:val="Compact"/>
-              <w:jc w:val="right"/>
-            </w:pPr>
-            <w:r>
-              <w:t xml:space="preserve">6,680</w:t>
-            </w:r>
-          </w:p>
-        </w:tc>
-      </w:tr>
-      <w:tr>
-        <w:tc>
-          <w:tcPr/>
-          <w:p>
-            <w:pPr>
-              <w:pStyle w:val="Compact"/>
-            </w:pPr>
-            <w:r>
-              <w:rPr>
-                <w:rStyle w:val="VerbatimChar"/>
-              </w:rPr>
-              <w:t xml:space="preserve">coza_deletion_listing</w:t>
-            </w:r>
-            <w:r>
-              <w:t xml:space="preserve">, registrable</w:t>
-            </w:r>
-          </w:p>
-        </w:tc>
-        <w:tc>
-          <w:tcPr/>
-          <w:p>
-            <w:pPr>
-              <w:pStyle w:val="Compact"/>
-            </w:pPr>
-            <w:r>
-              <w:t xml:space="preserve">CO.ZA registry deletion shortlists (IA)</w:t>
-            </w:r>
-          </w:p>
-        </w:tc>
-        <w:tc>
-          <w:tcPr/>
-          <w:p>
-            <w:pPr>
-              <w:pStyle w:val="Compact"/>
-            </w:pPr>
-            <w:r>
-              <w:t xml:space="preserve">the capture stamp on a registry page naming live names</w:t>
-            </w:r>
-          </w:p>
-        </w:tc>
-        <w:tc>
-          <w:tcPr/>
-          <w:p>
-            <w:pPr>
-              <w:pStyle w:val="Compact"/>
-              <w:jc w:val="right"/>
-            </w:pPr>
-            <w:r>
-              <w:t xml:space="preserve">3,826</w:t>
-            </w:r>
-          </w:p>
-        </w:tc>
-        <w:tc>
-          <w:tcPr/>
-          <w:p>
-            <w:pPr>
-              <w:pStyle w:val="Compact"/>
-              <w:jc w:val="right"/>
-            </w:pPr>
-            <w:r>
-              <w:t xml:space="preserve">3,704</w:t>
-            </w:r>
-          </w:p>
-        </w:tc>
-      </w:tr>
-      <w:tr>
-        <w:tc>
-          <w:tcPr/>
-          <w:p>
-            <w:pPr>
-              <w:pStyle w:val="Compact"/>
-            </w:pPr>
-            <w:r>
-              <w:rPr>
-                <w:rStyle w:val="VerbatimChar"/>
-              </w:rPr>
-              <w:t xml:space="preserve">jeb_bush_gubernatorial_email</w:t>
-            </w:r>
-            <w:r>
-              <w:t xml:space="preserve">, registrable</w:t>
-            </w:r>
-          </w:p>
-        </w:tc>
-        <w:tc>
-          <w:tcPr/>
-          <w:p>
-            <w:pPr>
-              <w:pStyle w:val="Compact"/>
-            </w:pPr>
-            <w:r>
-              <w:t xml:space="preserve">Florida governor's office e-mail export</w:t>
-            </w:r>
-          </w:p>
-        </w:tc>
-        <w:tc>
-          <w:tcPr/>
-          <w:p>
-            <w:pPr>
-              <w:pStyle w:val="Compact"/>
-            </w:pPr>
-            <w:r>
-              <w:t xml:space="preserve">the mail client's own</w:t>
-            </w:r>
-            <w:r>
-              <w:t xml:space="preserve"> </w:t>
-            </w:r>
-            <w:r>
-              <w:rPr>
-                <w:rStyle w:val="VerbatimChar"/>
-              </w:rPr>
-              <w:t xml:space="preserve">Sent:</w:t>
-            </w:r>
-            <w:r>
-              <w:t xml:space="preserve"> </w:t>
-            </w:r>
-            <w:r>
-              <w:t xml:space="preserve">line</w:t>
-            </w:r>
-          </w:p>
-        </w:tc>
-        <w:tc>
-          <w:tcPr/>
-          <w:p>
-            <w:pPr>
-              <w:pStyle w:val="Compact"/>
-              <w:jc w:val="right"/>
-            </w:pPr>
-            <w:r>
-              <w:t xml:space="preserve">5,259</w:t>
-            </w:r>
-          </w:p>
-        </w:tc>
-        <w:tc>
-          <w:tcPr/>
-          <w:p>
-            <w:pPr>
-              <w:pStyle w:val="Compact"/>
-              <w:jc w:val="right"/>
-            </w:pPr>
-            <w:r>
-              <w:t xml:space="preserve">3,271</w:t>
-            </w:r>
-          </w:p>
-        </w:tc>
-      </w:tr>
-      <w:tr>
-        <w:tc>
-          <w:tcPr/>
-          <w:p>
-            <w:pPr>
-              <w:pStyle w:val="Compact"/>
-            </w:pPr>
-            <w:r>
-              <w:rPr>
-                <w:rStyle w:val="VerbatimChar"/>
-              </w:rPr>
-              <w:t xml:space="preserve">early_bulk_whois_snapshot</w:t>
-            </w:r>
-            <w:r>
-              <w:t xml:space="preserve">, registrable</w:t>
-            </w:r>
-          </w:p>
-        </w:tc>
-        <w:tc>
-          <w:tcPr/>
-          <w:p>
-            <w:pPr>
-              <w:pStyle w:val="Compact"/>
-            </w:pPr>
-            <w:r>
-              <w:t xml:space="preserve">early bulk whois transcriptions (Berkman)</w:t>
-            </w:r>
-          </w:p>
-        </w:tc>
-        <w:tc>
-          <w:tcPr/>
-          <w:p>
-            <w:pPr>
-              <w:pStyle w:val="Compact"/>
-            </w:pPr>
-            <w:r>
-              <w:t xml:space="preserve">the registry creation date in the record, that year only</w:t>
-            </w:r>
-          </w:p>
-        </w:tc>
-        <w:tc>
-          <w:tcPr/>
-          <w:p>
-            <w:pPr>
-              <w:pStyle w:val="Compact"/>
-              <w:jc w:val="right"/>
-            </w:pPr>
-            <w:r>
-              <w:t xml:space="preserve">4,435</w:t>
-            </w:r>
-          </w:p>
-        </w:tc>
-        <w:tc>
-          <w:tcPr/>
-          <w:p>
-            <w:pPr>
-              <w:pStyle w:val="Compact"/>
-              <w:jc w:val="right"/>
-            </w:pPr>
-            <w:r>
-              <w:t xml:space="preserve">2,777</w:t>
-            </w:r>
-          </w:p>
-        </w:tc>
-      </w:tr>
-      <w:tr>
-        <w:tc>
-          <w:tcPr/>
-          <w:p>
-            <w:pPr>
-              <w:pStyle w:val="Compact"/>
-            </w:pPr>
-            <w:r>
-              <w:rPr>
-                <w:rStyle w:val="VerbatimChar"/>
-              </w:rPr>
-              <w:t xml:space="preserve">cctld_register_listing_capture</w:t>
-            </w:r>
-            <w:r>
-              <w:t xml:space="preserve">, registrable</w:t>
-            </w:r>
-          </w:p>
-        </w:tc>
-        <w:tc>
-          <w:tcPr/>
-          <w:p>
-            <w:pPr>
-              <w:pStyle w:val="Compact"/>
-            </w:pPr>
-            <w:r>
-              <w:t xml:space="preserve">ccTLD register listings</w:t>
-            </w:r>
-            <w:r>
-              <w:t xml:space="preserve"> </w:t>
-            </w:r>
-            <w:r>
-              <w:rPr>
-                <w:rStyle w:val="VerbatimChar"/>
-              </w:rPr>
-              <w:t xml:space="preserve">.mt</w:t>
-            </w:r>
-            <w:r>
-              <w:t xml:space="preserve">,</w:t>
-            </w:r>
-            <w:r>
-              <w:t xml:space="preserve"> </w:t>
-            </w:r>
-            <w:r>
-              <w:rPr>
-                <w:rStyle w:val="VerbatimChar"/>
-              </w:rPr>
-              <w:t xml:space="preserve">.sa</w:t>
-            </w:r>
-            <w:r>
-              <w:t xml:space="preserve"> </w:t>
-            </w:r>
-            <w:r>
-              <w:t xml:space="preserve">and others (IA)</w:t>
-            </w:r>
-          </w:p>
-        </w:tc>
-        <w:tc>
-          <w:tcPr/>
-          <w:p>
-            <w:pPr>
-              <w:pStyle w:val="Compact"/>
-            </w:pPr>
-            <w:r>
-              <w:t xml:space="preserve">the capture stamp on the registry's own register page</w:t>
-            </w:r>
-          </w:p>
-        </w:tc>
-        <w:tc>
-          <w:tcPr/>
-          <w:p>
-            <w:pPr>
-              <w:pStyle w:val="Compact"/>
-              <w:jc w:val="right"/>
-            </w:pPr>
-            <w:r>
-              <w:t xml:space="preserve">6,620</w:t>
-            </w:r>
-          </w:p>
-        </w:tc>
-        <w:tc>
-          <w:tcPr/>
-          <w:p>
-            <w:pPr>
-              <w:pStyle w:val="Compact"/>
-              <w:jc w:val="right"/>
-            </w:pPr>
-            <w:r>
-              <w:t xml:space="preserve">2,426</w:t>
-            </w:r>
-          </w:p>
-        </w:tc>
-      </w:tr>
-      <w:tr>
-        <w:tc>
-          <w:tcPr/>
-          <w:p>
-            <w:pPr>
-              <w:pStyle w:val="Compact"/>
-            </w:pPr>
-            <w:r>
-              <w:rPr>
-                <w:rStyle w:val="VerbatimChar"/>
-              </w:rPr>
-              <w:t xml:space="preserve">junkfilter_dated_blocklist</w:t>
-            </w:r>
-            <w:r>
-              <w:t xml:space="preserve">, registrable</w:t>
-            </w:r>
-          </w:p>
-        </w:tc>
-        <w:tc>
-          <w:tcPr/>
-          <w:p>
-            <w:pPr>
-              <w:pStyle w:val="Compact"/>
-            </w:pPr>
-            <w:r>
-              <w:t xml:space="preserve">junkfilter blocklist releases 1997-2001</w:t>
-            </w:r>
-          </w:p>
-        </w:tc>
-        <w:tc>
-          <w:tcPr/>
-          <w:p>
-            <w:pPr>
-              <w:pStyle w:val="Compact"/>
-            </w:pPr>
-            <w:r>
-              <w:rPr>
-                <w:rStyle w:val="VerbatimChar"/>
-              </w:rPr>
-              <w:t xml:space="preserve">Last-Modified</w:t>
-            </w:r>
-            <w:r>
-              <w:t xml:space="preserve">, in-body</w:t>
-            </w:r>
-            <w:r>
-              <w:t xml:space="preserve"> </w:t>
-            </w:r>
-            <w:r>
-              <w:rPr>
-                <w:rStyle w:val="VerbatimChar"/>
-              </w:rPr>
-              <w:t xml:space="preserve">$Id</w:t>
-            </w:r>
-            <w:r>
-              <w:t xml:space="preserve"> </w:t>
-            </w:r>
-            <w:r>
-              <w:t xml:space="preserve">and tar member stamps agreeing</w:t>
-            </w:r>
-          </w:p>
-        </w:tc>
-        <w:tc>
-          <w:tcPr/>
-          <w:p>
-            <w:pPr>
-              <w:pStyle w:val="Compact"/>
-              <w:jc w:val="right"/>
-            </w:pPr>
-            <w:r>
-              <w:t xml:space="preserve">3,407</w:t>
-            </w:r>
-          </w:p>
-        </w:tc>
-        <w:tc>
-          <w:tcPr/>
-          <w:p>
-            <w:pPr>
-              <w:pStyle w:val="Compact"/>
-              <w:jc w:val="right"/>
-            </w:pPr>
-            <w:r>
-              <w:t xml:space="preserve">2,104</w:t>
-            </w:r>
-          </w:p>
-        </w:tc>
-      </w:tr>
-      <w:tr>
-        <w:tc>
-          <w:tcPr/>
-          <w:p>
-            <w:pPr>
-              <w:pStyle w:val="Compact"/>
-            </w:pPr>
-            <w:r>
-              <w:rPr>
-                <w:rStyle w:val="VerbatimChar"/>
-              </w:rPr>
-              <w:t xml:space="preserve">granitecanyon_zone_rejects</w:t>
-            </w:r>
-            <w:r>
-              <w:t xml:space="preserve">, registrable</w:t>
-            </w:r>
-          </w:p>
-        </w:tc>
-        <w:tc>
-          <w:tcPr/>
-          <w:p>
-            <w:pPr>
-              <w:pStyle w:val="Compact"/>
-            </w:pPr>
-            <w:r>
-              <w:t xml:space="preserve">Granite Canyon public DNS rejected-zone lists (IA)</w:t>
-            </w:r>
-          </w:p>
-        </w:tc>
-        <w:tc>
-          <w:tcPr/>
-          <w:p>
-            <w:pPr>
-              <w:pStyle w:val="Compact"/>
-            </w:pPr>
-            <w:r>
-              <w:t xml:space="preserve">the list's own generation stamp, e.g.</w:t>
-            </w:r>
-            <w:r>
-              <w:t xml:space="preserve"> </w:t>
-            </w:r>
-            <w:r>
-              <w:rPr>
-                <w:rStyle w:val="VerbatimChar"/>
-              </w:rPr>
-              <w:t xml:space="preserve">7-May-2001 22:11 GMT</w:t>
-            </w:r>
-          </w:p>
-        </w:tc>
-        <w:tc>
-          <w:tcPr/>
-          <w:p>
-            <w:pPr>
-              <w:pStyle w:val="Compact"/>
-              <w:jc w:val="right"/>
-            </w:pPr>
-            <w:r>
-              <w:t xml:space="preserve">3,039</w:t>
-            </w:r>
-          </w:p>
-        </w:tc>
-        <w:tc>
-          <w:tcPr/>
-          <w:p>
-            <w:pPr>
-              <w:pStyle w:val="Compact"/>
-              <w:jc w:val="right"/>
-            </w:pPr>
-            <w:r>
-              <w:t xml:space="preserve">1,698</w:t>
-            </w:r>
-          </w:p>
-        </w:tc>
-      </w:tr>
-      <w:tr>
-        <w:tc>
-          <w:tcPr/>
-          <w:p>
-            <w:pPr>
-              <w:pStyle w:val="Compact"/>
-            </w:pPr>
-            <w:r>
-              <w:rPr>
-                <w:rStyle w:val="VerbatimChar"/>
-              </w:rPr>
-              <w:t xml:space="preserve">urlmerchant_inventory</w:t>
-            </w:r>
-            <w:r>
-              <w:t xml:space="preserve">, registrable</w:t>
-            </w:r>
-          </w:p>
-        </w:tc>
-        <w:tc>
-          <w:tcPr/>
-          <w:p>
-            <w:pPr>
-              <w:pStyle w:val="Compact"/>
-            </w:pPr>
-            <w:r>
-              <w:t xml:space="preserve">URLMerchant domain broker inventory (IA)</w:t>
-            </w:r>
-          </w:p>
-        </w:tc>
-        <w:tc>
-          <w:tcPr/>
-          <w:p>
-            <w:pPr>
-              <w:pStyle w:val="Compact"/>
-            </w:pPr>
-            <w:r>
-              <w:t xml:space="preserve">the page's own</w:t>
-            </w:r>
-            <w:r>
-              <w:t xml:space="preserve"> </w:t>
-            </w:r>
-            <w:r>
-              <w:rPr>
-                <w:rStyle w:val="VerbatimChar"/>
-              </w:rPr>
-              <w:t xml:space="preserve">META UPDATED</w:t>
-            </w:r>
-            <w:r>
-              <w:t xml:space="preserve"> </w:t>
-            </w:r>
-            <w:r>
-              <w:t xml:space="preserve">generator stamp</w:t>
-            </w:r>
-          </w:p>
-        </w:tc>
-        <w:tc>
-          <w:tcPr/>
-          <w:p>
-            <w:pPr>
-              <w:pStyle w:val="Compact"/>
-              <w:jc w:val="right"/>
-            </w:pPr>
-            <w:r>
-              <w:t xml:space="preserve">2,513</w:t>
-            </w:r>
-          </w:p>
-        </w:tc>
-        <w:tc>
-          <w:tcPr/>
-          <w:p>
-            <w:pPr>
-              <w:pStyle w:val="Compact"/>
-              <w:jc w:val="right"/>
-            </w:pPr>
-            <w:r>
-              <w:t xml:space="preserve">1,564</w:t>
-            </w:r>
-          </w:p>
-        </w:tc>
-      </w:tr>
-      <w:tr>
-        <w:tc>
-          <w:tcPr/>
-          <w:p>
-            <w:pPr>
-              <w:pStyle w:val="Compact"/>
-            </w:pPr>
-            <w:r>
-              <w:rPr>
-                <w:rStyle w:val="VerbatimChar"/>
-              </w:rPr>
-              <w:t xml:space="preserve">fac_single_audit</w:t>
-            </w:r>
-            <w:r>
-              <w:t xml:space="preserve">, registrable</w:t>
-            </w:r>
-          </w:p>
-        </w:tc>
-        <w:tc>
-          <w:tcPr/>
-          <w:p>
-            <w:pPr>
-              <w:pStyle w:val="Compact"/>
-            </w:pPr>
-            <w:r>
-              <w:t xml:space="preserve">Federal Audit Clearinghouse single-audit data</w:t>
-            </w:r>
-          </w:p>
-        </w:tc>
-        <w:tc>
-          <w:tcPr/>
-          <w:p>
-            <w:pPr>
-              <w:pStyle w:val="Compact"/>
-            </w:pPr>
-            <w:r>
-              <w:t xml:space="preserve">the row's</w:t>
-            </w:r>
-            <w:r>
-              <w:t xml:space="preserve"> </w:t>
-            </w:r>
-            <w:r>
-              <w:rPr>
-                <w:rStyle w:val="VerbatimChar"/>
-              </w:rPr>
-              <w:t xml:space="preserve">AUDITEEDATESIGNED</w:t>
-            </w:r>
-            <w:r>
-              <w:t xml:space="preserve">, corroborated by a second source</w:t>
-            </w:r>
-          </w:p>
-        </w:tc>
-        <w:tc>
-          <w:tcPr/>
-          <w:p>
-            <w:pPr>
-              <w:pStyle w:val="Compact"/>
-              <w:jc w:val="right"/>
-            </w:pPr>
-            <w:r>
-              <w:t xml:space="preserve">1,981</w:t>
-            </w:r>
-          </w:p>
-        </w:tc>
-        <w:tc>
-          <w:tcPr/>
-          <w:p>
-            <w:pPr>
-              <w:pStyle w:val="Compact"/>
-              <w:jc w:val="right"/>
-            </w:pPr>
-            <w:r>
-              <w:t xml:space="preserve">1,320</w:t>
-            </w:r>
-          </w:p>
-        </w:tc>
-      </w:tr>
-      <w:tr>
-        <w:tc>
-          <w:tcPr/>
-          <w:p>
-            <w:pPr>
-              <w:pStyle w:val="Compact"/>
-            </w:pPr>
-            <w:r>
-              <w:t xml:space="preserve">10 further sources</w:t>
-            </w:r>
-          </w:p>
-        </w:tc>
-        <w:tc>
-          <w:tcPr/>
-          <w:p>
-            <w:pPr>
-              <w:pStyle w:val="Compact"/>
-            </w:pPr>
-            <w:r>
-              <w:t xml:space="preserve">each under 1,000 EE, listed in</w:t>
+              <w:t xml:space="preserve">and</w:t>
             </w:r>
             <w:r>
               <w:t xml:space="preserve"> </w:t>
@@ -2643,30 +1822,22 @@
           <w:p>
             <w:pPr>
               <w:pStyle w:val="Compact"/>
-            </w:pPr>
-          </w:p>
-        </w:tc>
-        <w:tc>
-          <w:tcPr/>
-          <w:p>
-            <w:pPr>
-              <w:pStyle w:val="Compact"/>
-              <w:jc w:val="right"/>
-            </w:pPr>
-            <w:r>
-              <w:t xml:space="preserve">4,069</w:t>
-            </w:r>
-          </w:p>
-        </w:tc>
-        <w:tc>
-          <w:tcPr/>
-          <w:p>
-            <w:pPr>
-              <w:pStyle w:val="Compact"/>
-              <w:jc w:val="right"/>
-            </w:pPr>
-            <w:r>
-              <w:t xml:space="preserve">2,515</w:t>
+              <w:jc w:val="right"/>
+            </w:pPr>
+            <w:r>
+              <w:t xml:space="preserve">98,058</w:t>
+            </w:r>
+          </w:p>
+        </w:tc>
+        <w:tc>
+          <w:tcPr/>
+          <w:p>
+            <w:pPr>
+              <w:pStyle w:val="Compact"/>
+              <w:jc w:val="right"/>
+            </w:pPr>
+            <w:r>
+              <w:t xml:space="preserve">60,560</w:t>
             </w:r>
           </w:p>
         </w:tc>
@@ -2715,7 +1886,7 @@
                 <w:b/>
                 <w:bCs/>
               </w:rPr>
-              <w:t xml:space="preserve">5,496,283</w:t>
+              <w:t xml:space="preserve">5,805,625</w:t>
             </w:r>
           </w:p>
         </w:tc>
@@ -2731,7 +1902,7 @@
                 <w:b/>
                 <w:bCs/>
               </w:rPr>
-              <w:t xml:space="preserve">3,078,204</w:t>
+              <w:t xml:space="preserve">3,293,991</w:t>
             </w:r>
           </w:p>
         </w:tc>
@@ -2742,29 +1913,61 @@
         <w:pStyle w:val="BodyText"/>
       </w:pPr>
       <w:r>
+        <w:t xml:space="preserve">Every source has its own entry in</w:t>
+      </w:r>
+      <w:r>
+        <w:t xml:space="preserve"> </w:t>
+      </w:r>
+      <w:r>
+        <w:rPr>
+          <w:rStyle w:val="VerbatimChar"/>
+        </w:rPr>
+        <w:t xml:space="preserve">sources.md</w:t>
+      </w:r>
+      <w:r>
+        <w:t xml:space="preserve">: link, acquisition route, what dates one item, yield,</w:t>
+      </w:r>
+      <w:r>
+        <w:t xml:space="preserve"> </w:t>
+      </w:r>
+      <w:r>
+        <w:t xml:space="preserve">and for closed families the measurement that closed them. Per-source figures with files and</w:t>
+      </w:r>
+      <w:r>
+        <w:t xml:space="preserve"> </w:t>
+      </w:r>
+      <w:r>
+        <w:t xml:space="preserve">evidence rows are in</w:t>
+      </w:r>
+      <w:r>
+        <w:t xml:space="preserve"> </w:t>
+      </w:r>
+      <w:r>
+        <w:rPr>
+          <w:rStyle w:val="VerbatimChar"/>
+        </w:rPr>
+        <w:t xml:space="preserve">audit/source_contribution.csv</w:t>
+      </w:r>
+      <w:r>
+        <w:t xml:space="preserve">.</w:t>
+      </w:r>
+    </w:p>
+    <w:p>
+      <w:pPr>
+        <w:pStyle w:val="BodyText"/>
+      </w:pPr>
+      <w:r>
         <w:rPr>
           <w:b/>
           <w:bCs/>
         </w:rPr>
-        <w:t xml:space="preserve">Why a record is valid.</w:t>
-      </w:r>
-      <w:r>
-        <w:t xml:space="preserve"> </w:t>
-      </w:r>
-      <w:r>
-        <w:t xml:space="preserve">Every record is one machine-written observation of that name in that</w:t>
-      </w:r>
-      <w:r>
-        <w:t xml:space="preserve"> </w:t>
-      </w:r>
-      <w:r>
-        <w:t xml:space="preserve">year. For the capture-backed sources it is the Internet Archive's 14-digit timestamp of a capture</w:t>
-      </w:r>
-      <w:r>
-        <w:t xml:space="preserve"> </w:t>
-      </w:r>
-      <w:r>
-        <w:t xml:space="preserve">of a URL on that exact host, quoted in the evidence value with the replay URL beside it in</w:t>
+        <w:t xml:space="preserve">Composition.</w:t>
+      </w:r>
+      <w:r>
+        <w:t xml:space="preserve"> </w:t>
+      </w:r>
+      <w:r>
+        <w:t xml:space="preserve">92.3% of the hostnames are</w:t>
       </w:r>
       <w:r>
         <w:t xml:space="preserve"> </w:t>
@@ -2773,434 +1976,29 @@
         <w:rPr>
           <w:rStyle w:val="VerbatimChar"/>
         </w:rPr>
-        <w:t xml:space="preserve">additions/evidence_manifest.csv</w:t>
-      </w:r>
-      <w:r>
-        <w:t xml:space="preserve"> </w:t>
-      </w:r>
-      <w:r>
-        <w:t xml:space="preserve">and</w:t>
-      </w:r>
-      <w:r>
-        <w:t xml:space="preserve"> </w:t>
-      </w:r>
-      <w:r>
-        <w:rPr>
-          <w:rStyle w:val="VerbatimChar"/>
-        </w:rPr>
-        <w:t xml:space="preserve">hostnames/hostnames_evidence_manifest.csv</w:t>
-      </w:r>
-      <w:r>
-        <w:t xml:space="preserve">, so any line can</w:t>
-      </w:r>
-      <w:r>
-        <w:t xml:space="preserve"> </w:t>
-      </w:r>
-      <w:r>
-        <w:t xml:space="preserve">be opened. A hostname must sit beneath a registrable the store holds, be RFC 1123 valid, and its</w:t>
-      </w:r>
-      <w:r>
-        <w:t xml:space="preserve"> </w:t>
-      </w:r>
-      <w:r>
-        <w:t xml:space="preserve">parent earns the same year from the same capture.</w:t>
-      </w:r>
-      <w:r>
-        <w:t xml:space="preserve"> </w:t>
-      </w:r>
-      <w:r>
-        <w:rPr>
-          <w:rStyle w:val="VerbatimChar"/>
-        </w:rPr>
-        <w:t xml:space="preserve">domain_year.evidence_id</w:t>
-      </w:r>
-      <w:r>
-        <w:t xml:space="preserve"> </w:t>
-      </w:r>
-      <w:r>
-        <w:t xml:space="preserve">and</w:t>
-      </w:r>
-      <w:r>
-        <w:t xml:space="preserve"> </w:t>
-      </w:r>
-      <w:r>
-        <w:rPr>
-          <w:rStyle w:val="VerbatimChar"/>
-        </w:rPr>
-        <w:t xml:space="preserve">hostname_year.evidence_id</w:t>
-      </w:r>
-      <w:r>
-        <w:t xml:space="preserve"> </w:t>
-      </w:r>
-      <w:r>
-        <w:t xml:space="preserve">are</w:t>
-      </w:r>
-      <w:r>
-        <w:t xml:space="preserve"> </w:t>
-      </w:r>
-      <w:r>
-        <w:rPr>
-          <w:rStyle w:val="VerbatimChar"/>
-        </w:rPr>
-        <w:t xml:space="preserve">NOT NULL</w:t>
-      </w:r>
-      <w:r>
-        <w:t xml:space="preserve"> </w:t>
-      </w:r>
-      <w:r>
-        <w:t xml:space="preserve">foreign keys, so no year exists without an observation;</w:t>
-      </w:r>
-      <w:r>
-        <w:t xml:space="preserve"> </w:t>
-      </w:r>
-      <w:r>
-        <w:t xml:space="preserve">fifteen invariants check this before every commit and again inside the archive.</w:t>
-      </w:r>
-    </w:p>
-    <w:p>
-      <w:pPr>
-        <w:pStyle w:val="BodyText"/>
-      </w:pPr>
-      <w:r>
-        <w:rPr>
-          <w:b/>
-          <w:bCs/>
-        </w:rPr>
-        <w:t xml:space="preserve">The method behind most of it: re-price what is already on disk when the unit changes.</w:t>
-      </w:r>
-      <w:r>
-        <w:t xml:space="preserve"> </w:t>
-      </w:r>
-      <w:r>
-        <w:t xml:space="preserve">Until</w:t>
-      </w:r>
-      <w:r>
-        <w:t xml:space="preserve"> </w:t>
-      </w:r>
-      <w:r>
-        <w:t xml:space="preserve">2026-09-01 the pipeline collapsed every hostname to its registrable, and two artifacts stood</w:t>
-      </w:r>
-      <w:r>
-        <w:t xml:space="preserve"> </w:t>
-      </w:r>
-      <w:r>
-        <w:t xml:space="preserve">recorded as spent: the NYPW TimeMaps (34 parts, CC BY 4.0) had paid their registrable pairs, and 180</w:t>
-      </w:r>
-      <w:r>
-        <w:t xml:space="preserve"> </w:t>
-      </w:r>
-      <w:r>
-        <w:t xml:space="preserve">domain-wide CDX sweep journals from 2026-08-21..24 were logged as worth exactly 0, since</w:t>
-      </w:r>
-      <w:r>
-        <w:t xml:space="preserve"> </w:t>
-      </w:r>
-      <w:r>
-        <w:rPr>
-          <w:rStyle w:val="VerbatimChar"/>
-        </w:rPr>
-        <w:t xml:space="preserve">www.foo.co.uk</w:t>
-      </w:r>
-      <w:r>
-        <w:t xml:space="preserve"> </w:t>
-      </w:r>
-      <w:r>
-        <w:t xml:space="preserve">collapsed onto a</w:t>
-      </w:r>
-      <w:r>
-        <w:t xml:space="preserve"> </w:t>
-      </w:r>
-      <w:r>
-        <w:rPr>
-          <w:rStyle w:val="VerbatimChar"/>
-        </w:rPr>
-        <w:t xml:space="preserve">foo.co.uk</w:t>
-      </w:r>
-      <w:r>
-        <w:t xml:space="preserve"> </w:t>
-      </w:r>
-      <w:r>
-        <w:t xml:space="preserve">already held. Your acceptance of hostnames made the</w:t>
-      </w:r>
-      <w:r>
-        <w:t xml:space="preserve"> </w:t>
-      </w:r>
-      <w:r>
-        <w:t xml:space="preserve">same bytes worth most of the 2,749,488.7901 equivalent-English in the hostname unit, with no new request.</w:t>
-      </w:r>
-      <w:r>
-        <w:t xml:space="preserve"> </w:t>
-      </w:r>
-      <w:r>
-        <w:t xml:space="preserve">The rest is one night of</w:t>
-      </w:r>
-      <w:r>
-        <w:t xml:space="preserve"> </w:t>
-      </w:r>
-      <w:r>
-        <w:rPr>
-          <w:rStyle w:val="VerbatimChar"/>
-        </w:rPr>
-        <w:t xml:space="preserve">matchType=domain</w:t>
-      </w:r>
-      <w:r>
-        <w:t xml:space="preserve"> </w:t>
-      </w:r>
-      <w:r>
-        <w:t xml:space="preserve">sweeps over the subdomain platforms your own benchmark</w:t>
-      </w:r>
-      <w:r>
-        <w:t xml:space="preserve"> </w:t>
-      </w:r>
-      <w:r>
-        <w:t xml:space="preserve">proves dense (</w:t>
-      </w:r>
-      <w:r>
-        <w:rPr>
-          <w:rStyle w:val="VerbatimChar"/>
-        </w:rPr>
-        <w:t xml:space="preserve">rank_platform_parents.py</w:t>
-      </w:r>
-      <w:r>
-        <w:t xml:space="preserve">:</w:t>
-      </w:r>
-      <w:r>
-        <w:t xml:space="preserve"> </w:t>
-      </w:r>
-      <w:r>
-        <w:rPr>
-          <w:rStyle w:val="VerbatimChar"/>
-        </w:rPr>
-        <w:t xml:space="preserve">cjb.net</w:t>
-      </w:r>
-      <w:r>
-        <w:t xml:space="preserve"> </w:t>
-      </w:r>
-      <w:r>
-        <w:t xml:space="preserve">leads at 157,790 sub-hosts held, then</w:t>
-      </w:r>
-      <w:r>
-        <w:t xml:space="preserve"> </w:t>
-      </w:r>
-      <w:r>
-        <w:rPr>
-          <w:rStyle w:val="VerbatimChar"/>
-        </w:rPr>
-        <w:t xml:space="preserve">demon.co.uk</w:t>
-      </w:r>
-      <w:r>
-        <w:t xml:space="preserve">,</w:t>
-      </w:r>
-      <w:r>
-        <w:t xml:space="preserve"> </w:t>
-      </w:r>
-      <w:r>
-        <w:rPr>
-          <w:rStyle w:val="VerbatimChar"/>
-        </w:rPr>
-        <w:t xml:space="preserve">freeserve.co.uk</w:t>
-      </w:r>
-      <w:r>
-        <w:t xml:space="preserve">);</w:t>
-      </w:r>
-      <w:r>
-        <w:t xml:space="preserve"> </w:t>
-      </w:r>
-      <w:r>
-        <w:rPr>
-          <w:rStyle w:val="VerbatimChar"/>
-        </w:rPr>
-        <w:t xml:space="preserve">cjb.net</w:t>
-      </w:r>
-      <w:r>
-        <w:t xml:space="preserve"> </w:t>
-      </w:r>
-      <w:r>
-        <w:t xml:space="preserve">is marked incomplete in the saturation ledger and resumes.</w:t>
-      </w:r>
-    </w:p>
-    <w:p>
-      <w:pPr>
-        <w:pStyle w:val="BodyText"/>
-      </w:pPr>
-      <w:r>
-        <w:rPr>
-          <w:b/>
-          <w:bCs/>
-        </w:rPr>
-        <w:t xml:space="preserve">Composition, disclosed.</w:t>
-      </w:r>
-      <w:r>
-        <w:t xml:space="preserve"> </w:t>
-      </w:r>
-      <w:r>
-        <w:t xml:space="preserve">93.6% of the hostnames are</w:t>
-      </w:r>
-      <w:r>
-        <w:t xml:space="preserve"> </w:t>
-      </w:r>
-      <w:r>
-        <w:rPr>
-          <w:rStyle w:val="VerbatimChar"/>
-        </w:rPr>
         <w:t xml:space="preserve">www.</w:t>
       </w:r>
       <w:r>
         <w:t xml:space="preserve"> </w:t>
       </w:r>
       <w:r>
-        <w:t xml:space="preserve">forms of a registrable. They are</w:t>
-      </w:r>
-      <w:r>
-        <w:t xml:space="preserve"> </w:t>
-      </w:r>
-      <w:r>
-        <w:t xml:space="preserve">distinct valid hostnames under your rule and score at full weight, and they sit in their own files so</w:t>
-      </w:r>
-      <w:r>
-        <w:t xml:space="preserve"> </w:t>
-      </w:r>
-      <w:r>
-        <w:t xml:space="preserve">you can merge or discard them as a block. The parent registrables of the same captures are in</w:t>
-      </w:r>
-      <w:r>
-        <w:t xml:space="preserve"> </w:t>
-      </w:r>
-      <w:r>
-        <w:rPr>
-          <w:rStyle w:val="VerbatimChar"/>
-        </w:rPr>
-        <w:t xml:space="preserve">additions/</w:t>
-      </w:r>
-      <w:r>
-        <w:t xml:space="preserve"> </w:t>
-      </w:r>
-      <w:r>
-        <w:t xml:space="preserve">on their own evidence.</w:t>
-      </w:r>
-    </w:p>
-    <w:p>
-      <w:pPr>
-        <w:pStyle w:val="BodyText"/>
-      </w:pPr>
-      <w:r>
-        <w:rPr>
-          <w:b/>
-          <w:bCs/>
-        </w:rPr>
-        <w:t xml:space="preserve">CDX execution.</w:t>
-      </w:r>
-      <w:r>
-        <w:t xml:space="preserve"> </w:t>
-      </w:r>
-      <w:r>
-        <w:t xml:space="preserve">Two clients at most, one per slot, honest User-Agent, two seconds between</w:t>
-      </w:r>
-      <w:r>
-        <w:t xml:space="preserve"> </w:t>
-      </w:r>
-      <w:r>
-        <w:t xml:space="preserve">requests, backing off on 429/503/504 and honouring</w:t>
-      </w:r>
-      <w:r>
-        <w:t xml:space="preserve"> </w:t>
-      </w:r>
-      <w:r>
-        <w:rPr>
-          <w:rStyle w:val="VerbatimChar"/>
-        </w:rPr>
-        <w:t xml:space="preserve">Retry-After</w:t>
-      </w:r>
-      <w:r>
-        <w:t xml:space="preserve">. Per-domain queries over a</w:t>
-      </w:r>
-      <w:r>
-        <w:t xml:space="preserve"> </w:t>
-      </w:r>
-      <w:r>
-        <w:t xml:space="preserve">bracketed-gap population and the candidate pool added 92,479 registrable pairs. Domain-wide</w:t>
-      </w:r>
-      <w:r>
-        <w:t xml:space="preserve"> </w:t>
-      </w:r>
-      <w:r>
-        <w:t xml:space="preserve">sweeps use</w:t>
-      </w:r>
-      <w:r>
-        <w:t xml:space="preserve"> </w:t>
-      </w:r>
-      <w:r>
-        <w:rPr>
-          <w:rStyle w:val="VerbatimChar"/>
-        </w:rPr>
-        <w:t xml:space="preserve">matchType=domain</w:t>
-      </w:r>
-      <w:r>
-        <w:t xml:space="preserve"> </w:t>
-      </w:r>
-      <w:r>
-        <w:t xml:space="preserve">at 200 rows a page and write raw</w:t>
-      </w:r>
-      <w:r>
-        <w:t xml:space="preserve"> </w:t>
-      </w:r>
-      <w:r>
-        <w:rPr>
-          <w:rStyle w:val="VerbatimChar"/>
-        </w:rPr>
-        <w:t xml:space="preserve">{url, timestamp}</w:t>
-      </w:r>
-      <w:r>
-        <w:t xml:space="preserve"> </w:t>
-      </w:r>
-      <w:r>
-        <w:t xml:space="preserve">lines to a</w:t>
-      </w:r>
-      <w:r>
-        <w:t xml:space="preserve"> </w:t>
-      </w:r>
-      <w:r>
-        <w:t xml:space="preserve">journal, so the same bytes can be re-read under a new rule, which is what paid this round. Errors met</w:t>
-      </w:r>
-      <w:r>
-        <w:t xml:space="preserve"> </w:t>
-      </w:r>
-      <w:r>
-        <w:t xml:space="preserve">and handled: HTTP 400 past the last page, which ends a sweep cleanly; a page-count call that timed out</w:t>
-      </w:r>
-      <w:r>
-        <w:t xml:space="preserve"> </w:t>
-      </w:r>
-      <w:r>
-        <w:t xml:space="preserve">on</w:t>
-      </w:r>
-      <w:r>
-        <w:t xml:space="preserve"> </w:t>
-      </w:r>
-      <w:r>
-        <w:rPr>
-          <w:rStyle w:val="VerbatimChar"/>
-        </w:rPr>
-        <w:t xml:space="preserve">cjb.net</w:t>
-      </w:r>
-      <w:r>
-        <w:t xml:space="preserve">, so that platform is ledgered incomplete and resumable; and transport failures, retried</w:t>
-      </w:r>
-      <w:r>
-        <w:t xml:space="preserve"> </w:t>
-      </w:r>
-      <w:r>
-        <w:t xml:space="preserve">with a widening delay. Collectors take an absolute deadline and outlive the session.</w:t>
+        <w:t xml:space="preserve">forms of a registrable. They are distinct</w:t>
+      </w:r>
+      <w:r>
+        <w:t xml:space="preserve"> </w:t>
+      </w:r>
+      <w:r>
+        <w:t xml:space="preserve">valid hostnames under your rule and sit in their own files, so they merge or drop as a block.</w:t>
       </w:r>
     </w:p>
     <w:bookmarkEnd w:id="10"/>
-    <w:bookmarkStart w:id="11" w:name="method-and-automation-this-round"/>
+    <w:bookmarkStart w:id="11" w:name="evidentiary-standard"/>
     <w:p>
       <w:pPr>
         <w:pStyle w:val="Heading2"/>
       </w:pPr>
       <w:r>
-        <w:t xml:space="preserve">3. Method and automation this round</w:t>
+        <w:t xml:space="preserve">3. Evidentiary standard</w:t>
       </w:r>
     </w:p>
     <w:p>
@@ -3208,69 +2006,50 @@
         <w:pStyle w:val="Compact"/>
         <w:numPr>
           <w:ilvl w:val="0"/>
-          <w:numId w:val="1001"/>
+          <w:numId w:val="1002"/>
         </w:numPr>
       </w:pPr>
       <w:r>
-        <w:rPr>
-          <w:b/>
-          <w:bCs/>
-        </w:rPr>
-        <w:t xml:space="preserve">The loop left the laptop.</w:t>
-      </w:r>
-      <w:r>
-        <w:t xml:space="preserve"> </w:t>
-      </w:r>
-      <w:r>
-        <w:t xml:space="preserve">Research runs unattended as scheduled workflows on a self-hosted</w:t>
-      </w:r>
-      <w:r>
-        <w:t xml:space="preserve"> </w:t>
-      </w:r>
-      <w:r>
-        <w:t xml:space="preserve">runner: a generator lane proposes hypotheses (the hostname-grain re-read of the NYPW TimeMaps,</w:t>
-      </w:r>
-      <w:r>
-        <w:t xml:space="preserve"> </w:t>
-      </w:r>
-      <w:r>
-        <w:t xml:space="preserve">this round's largest source, was one of its seven first proposals), researcher waves test them</w:t>
-      </w:r>
-      <w:r>
-        <w:t xml:space="preserve"> </w:t>
-      </w:r>
-      <w:r>
-        <w:t xml:space="preserve">in parallel, a re-opener re-reads closed verdicts</w:t>
-      </w:r>
-      <w:r>
-        <w:t xml:space="preserve"> </w:t>
-      </w:r>
-      <w:r>
-        <w:t xml:space="preserve">whenever a screen changes, and an improver lane adjusts prompts and model choice from per-run</w:t>
-      </w:r>
-      <w:r>
-        <w:t xml:space="preserve"> </w:t>
-      </w:r>
-      <w:r>
-        <w:t xml:space="preserve">telemetry, one change per pull request. The re-opener found the NYPW TimeMaps: closed at 14</w:t>
-      </w:r>
-      <w:r>
-        <w:t xml:space="preserve"> </w:t>
-      </w:r>
-      <w:r>
-        <w:t xml:space="preserve">equivalent-English on the 1996 folder, then measured folder by folder from the ingest ledger</w:t>
-      </w:r>
-      <w:r>
-        <w:t xml:space="preserve"> </w:t>
-      </w:r>
-      <w:r>
-        <w:t xml:space="preserve">(year rows per million: 2000 ~24,000, 1999 ~10,000, 2001 exactly 4) for ~88,000 more. A</w:t>
-      </w:r>
-      <w:r>
-        <w:t xml:space="preserve"> </w:t>
-      </w:r>
-      <w:r>
-        <w:t xml:space="preserve">partitioned corpus is measured per partition, never argued about.</w:t>
+        <w:t xml:space="preserve">One record is one machine-written observation of that name in that year. For capture-backed</w:t>
+      </w:r>
+      <w:r>
+        <w:t xml:space="preserve"> </w:t>
+      </w:r>
+      <w:r>
+        <w:t xml:space="preserve">sources it is the Internet Archive's 14-digit timestamp of a capture on that exact host, quoted</w:t>
+      </w:r>
+      <w:r>
+        <w:t xml:space="preserve"> </w:t>
+      </w:r>
+      <w:r>
+        <w:t xml:space="preserve">with its replay URL in</w:t>
+      </w:r>
+      <w:r>
+        <w:t xml:space="preserve"> </w:t>
+      </w:r>
+      <w:r>
+        <w:rPr>
+          <w:rStyle w:val="VerbatimChar"/>
+        </w:rPr>
+        <w:t xml:space="preserve">additions/evidence_manifest.csv</w:t>
+      </w:r>
+      <w:r>
+        <w:t xml:space="preserve"> </w:t>
+      </w:r>
+      <w:r>
+        <w:t xml:space="preserve">and</w:t>
+      </w:r>
+      <w:r>
+        <w:t xml:space="preserve"> </w:t>
+      </w:r>
+      <w:r>
+        <w:rPr>
+          <w:rStyle w:val="VerbatimChar"/>
+        </w:rPr>
+        <w:t xml:space="preserve">hostnames/hostnames_evidence_manifest.csv</w:t>
+      </w:r>
+      <w:r>
+        <w:t xml:space="preserve">, so any line can be opened.</w:t>
       </w:r>
     </w:p>
     <w:p>
@@ -3278,51 +2057,20 @@
         <w:pStyle w:val="Compact"/>
         <w:numPr>
           <w:ilvl w:val="0"/>
-          <w:numId w:val="1001"/>
+          <w:numId w:val="1002"/>
         </w:numPr>
       </w:pPr>
       <w:r>
         <w:rPr>
-          <w:b/>
-          <w:bCs/>
-        </w:rPr>
-        <w:t xml:space="preserve">Admission without a human, under a standing rule.</w:t>
-      </w:r>
-      <w:r>
-        <w:t xml:space="preserve"> </w:t>
-      </w:r>
-      <w:r>
-        <w:t xml:space="preserve">A source is banked when its evidence</w:t>
-      </w:r>
-      <w:r>
-        <w:t xml:space="preserve"> </w:t>
-      </w:r>
-      <w:r>
-        <w:t xml:space="preserve">class is already master-eligible, a machine stamp inside the artifact dates each item, the terms</w:t>
-      </w:r>
-      <w:r>
-        <w:t xml:space="preserve"> </w:t>
-      </w:r>
-      <w:r>
-        <w:t xml:space="preserve">were read in full, and the invariants pass; anything else parks until a written decision.</w:t>
-      </w:r>
-      <w:r>
-        <w:t xml:space="preserve"> </w:t>
-      </w:r>
-      <w:r>
-        <w:t xml:space="preserve">Master-eligible classes are</w:t>
-      </w:r>
-      <w:r>
-        <w:t xml:space="preserve"> </w:t>
-      </w:r>
-      <w:r>
-        <w:rPr>
           <w:rStyle w:val="VerbatimChar"/>
         </w:rPr>
-        <w:t xml:space="preserve">artifact_listing</w:t>
-      </w:r>
-      <w:r>
-        <w:t xml:space="preserve">,</w:t>
+        <w:t xml:space="preserve">domain_year.evidence_id</w:t>
+      </w:r>
+      <w:r>
+        <w:t xml:space="preserve"> </w:t>
+      </w:r>
+      <w:r>
+        <w:t xml:space="preserve">and</w:t>
       </w:r>
       <w:r>
         <w:t xml:space="preserve"> </w:t>
@@ -3331,10 +2079,13 @@
         <w:rPr>
           <w:rStyle w:val="VerbatimChar"/>
         </w:rPr>
-        <w:t xml:space="preserve">cdx_timestamp</w:t>
-      </w:r>
-      <w:r>
-        <w:t xml:space="preserve">,</w:t>
+        <w:t xml:space="preserve">hostname_year.evidence_id</w:t>
+      </w:r>
+      <w:r>
+        <w:t xml:space="preserve"> </w:t>
+      </w:r>
+      <w:r>
+        <w:t xml:space="preserve">are</w:t>
       </w:r>
       <w:r>
         <w:t xml:space="preserve"> </w:t>
@@ -3343,55 +2094,19 @@
         <w:rPr>
           <w:rStyle w:val="VerbatimChar"/>
         </w:rPr>
-        <w:t xml:space="preserve">dated_directory</w:t>
-      </w:r>
-      <w:r>
-        <w:t xml:space="preserve">,</w:t>
-      </w:r>
-      <w:r>
-        <w:t xml:space="preserve"> </w:t>
-      </w:r>
-      <w:r>
-        <w:rPr>
-          <w:rStyle w:val="VerbatimChar"/>
-        </w:rPr>
-        <w:t xml:space="preserve">link_source</w:t>
-      </w:r>
-      <w:r>
-        <w:t xml:space="preserve">,</w:t>
-      </w:r>
-      <w:r>
-        <w:t xml:space="preserve"> </w:t>
-      </w:r>
-      <w:r>
-        <w:rPr>
-          <w:rStyle w:val="VerbatimChar"/>
-        </w:rPr>
-        <w:t xml:space="preserve">whois_creation</w:t>
-      </w:r>
-      <w:r>
-        <w:t xml:space="preserve">. Anything a human typed is candidate-only until</w:t>
-      </w:r>
-      <w:r>
-        <w:t xml:space="preserve"> </w:t>
-      </w:r>
-      <w:r>
-        <w:t xml:space="preserve">another source dates that domain first, and</w:t>
-      </w:r>
-      <w:r>
-        <w:t xml:space="preserve"> </w:t>
-      </w:r>
-      <w:r>
-        <w:rPr>
-          <w:rStyle w:val="VerbatimChar"/>
-        </w:rPr>
-        <w:t xml:space="preserve">link_target</w:t>
-      </w:r>
-      <w:r>
-        <w:t xml:space="preserve"> </w:t>
-      </w:r>
-      <w:r>
-        <w:t xml:space="preserve">never dates a year.</w:t>
+        <w:t xml:space="preserve">NOT NULL</w:t>
+      </w:r>
+      <w:r>
+        <w:t xml:space="preserve"> </w:t>
+      </w:r>
+      <w:r>
+        <w:t xml:space="preserve">foreign keys: no year</w:t>
+      </w:r>
+      <w:r>
+        <w:t xml:space="preserve"> </w:t>
+      </w:r>
+      <w:r>
+        <w:t xml:space="preserve">without an observation. Fifteen invariants check this before every commit and inside the archive.</w:t>
       </w:r>
     </w:p>
     <w:p>
@@ -3399,18 +2114,11 @@
         <w:pStyle w:val="Compact"/>
         <w:numPr>
           <w:ilvl w:val="0"/>
-          <w:numId w:val="1001"/>
+          <w:numId w:val="1002"/>
         </w:numPr>
       </w:pPr>
       <w:r>
-        <w:rPr>
-          <w:b/>
-          <w:bCs/>
-        </w:rPr>
-        <w:t xml:space="preserve">Saturation ledger</w:t>
-      </w:r>
-      <w:r>
-        <w:t xml:space="preserve">, as your 2026-08-31 update asks:</w:t>
+        <w:t xml:space="preserve">Master-eligible classes:</w:t>
       </w:r>
       <w:r>
         <w:t xml:space="preserve"> </w:t>
@@ -3419,7 +2127,7 @@
         <w:rPr>
           <w:rStyle w:val="VerbatimChar"/>
         </w:rPr>
-        <w:t xml:space="preserve">audit/source_saturation_ledger.csv</w:t>
+        <w:t xml:space="preserve">artifact_listing</w:t>
       </w:r>
       <w:r>
         <w:t xml:space="preserve">,</w:t>
@@ -3428,41 +2136,70 @@
         <w:t xml:space="preserve"> </w:t>
       </w:r>
       <w:r>
-        <w:t xml:space="preserve">one row per source family and version, with coverage, what dates one item, limitations and</w:t>
-      </w:r>
-      <w:r>
-        <w:t xml:space="preserve"> </w:t>
-      </w:r>
-      <w:r>
-        <w:t xml:space="preserve">the decision. Over the whole project,</w:t>
-      </w:r>
-      <w:r>
-        <w:t xml:space="preserve"> </w:t>
-      </w:r>
-      <w:r>
-        <w:rPr>
-          <w:b/>
-          <w:bCs/>
-        </w:rPr>
-        <w:t xml:space="preserve">465 source families have been searched and recorded</w:t>
-      </w:r>
-      <w:r>
-        <w:t xml:space="preserve">, 60 developed far enough to earn their own section and 405 evaluated and closed, each with the measurement that closed it, so negative results stay visible and the same ground is not broken twice.</w:t>
-      </w:r>
-      <w:r>
-        <w:t xml:space="preserve"> </w:t>
-      </w:r>
-      <w:r>
         <w:rPr>
           <w:rStyle w:val="VerbatimChar"/>
         </w:rPr>
-        <w:t xml:space="preserve">sources.md</w:t>
-      </w:r>
-      <w:r>
-        <w:t xml:space="preserve"> </w:t>
-      </w:r>
-      <w:r>
-        <w:t xml:space="preserve">ships beside this report and names every one, with its acquisition route, date semantics and yield.</w:t>
+        <w:t xml:space="preserve">cdx_timestamp</w:t>
+      </w:r>
+      <w:r>
+        <w:t xml:space="preserve">,</w:t>
+      </w:r>
+      <w:r>
+        <w:t xml:space="preserve"> </w:t>
+      </w:r>
+      <w:r>
+        <w:rPr>
+          <w:rStyle w:val="VerbatimChar"/>
+        </w:rPr>
+        <w:t xml:space="preserve">dated_directory</w:t>
+      </w:r>
+      <w:r>
+        <w:t xml:space="preserve">,</w:t>
+      </w:r>
+      <w:r>
+        <w:t xml:space="preserve"> </w:t>
+      </w:r>
+      <w:r>
+        <w:rPr>
+          <w:rStyle w:val="VerbatimChar"/>
+        </w:rPr>
+        <w:t xml:space="preserve">link_source</w:t>
+      </w:r>
+      <w:r>
+        <w:t xml:space="preserve">,</w:t>
+      </w:r>
+      <w:r>
+        <w:t xml:space="preserve"> </w:t>
+      </w:r>
+      <w:r>
+        <w:rPr>
+          <w:rStyle w:val="VerbatimChar"/>
+        </w:rPr>
+        <w:t xml:space="preserve">whois_creation</w:t>
+      </w:r>
+      <w:r>
+        <w:t xml:space="preserve">.</w:t>
+      </w:r>
+      <w:r>
+        <w:t xml:space="preserve"> </w:t>
+      </w:r>
+      <w:r>
+        <w:rPr>
+          <w:rStyle w:val="VerbatimChar"/>
+        </w:rPr>
+        <w:t xml:space="preserve">link_target</w:t>
+      </w:r>
+      <w:r>
+        <w:t xml:space="preserve"> </w:t>
+      </w:r>
+      <w:r>
+        <w:t xml:space="preserve">never dates a year. Anything a human typed</w:t>
+      </w:r>
+      <w:r>
+        <w:t xml:space="preserve"> </w:t>
+      </w:r>
+      <w:r>
+        <w:t xml:space="preserve">needs a second source to date that domain first. A creation date attests its own year only.</w:t>
       </w:r>
     </w:p>
     <w:p>
@@ -3470,7 +2207,25 @@
         <w:pStyle w:val="Compact"/>
         <w:numPr>
           <w:ilvl w:val="0"/>
-          <w:numId w:val="1001"/>
+          <w:numId w:val="1002"/>
+        </w:numPr>
+      </w:pPr>
+      <w:r>
+        <w:t xml:space="preserve">A hostname must sit beneath a held registrable, be RFC 1123 valid, and its parent earns the same</w:t>
+      </w:r>
+      <w:r>
+        <w:t xml:space="preserve"> </w:t>
+      </w:r>
+      <w:r>
+        <w:t xml:space="preserve">year from the same capture.</w:t>
+      </w:r>
+    </w:p>
+    <w:p>
+      <w:pPr>
+        <w:pStyle w:val="Compact"/>
+        <w:numPr>
+          <w:ilvl w:val="0"/>
+          <w:numId w:val="1002"/>
         </w:numPr>
       </w:pPr>
       <w:r>
@@ -3496,13 +2251,13 @@
         <w:t xml:space="preserve">candidates.txt</w:t>
       </w:r>
       <w:r>
-        <w:t xml:space="preserve">, none in an</w:t>
-      </w:r>
-      <w:r>
-        <w:t xml:space="preserve"> </w:t>
-      </w:r>
-      <w:r>
-        <w:t xml:space="preserve">annual file; 588,087 of them are under</w:t>
+        <w:t xml:space="preserve">, none in an annual</w:t>
+      </w:r>
+      <w:r>
+        <w:t xml:space="preserve"> </w:t>
+      </w:r>
+      <w:r>
+        <w:t xml:space="preserve">file; 588,087 of them are under</w:t>
       </w:r>
       <w:r>
         <w:t xml:space="preserve"> </w:t>
@@ -3545,91 +2300,172 @@
       </w:r>
     </w:p>
     <w:bookmarkEnd w:id="11"/>
-    <w:bookmarkStart w:id="12" w:name="limitations-and-what-is-worth-expanding"/>
+    <w:bookmarkStart w:id="12" w:name="autonomous-research-this-round"/>
     <w:p>
       <w:pPr>
         <w:pStyle w:val="Heading2"/>
       </w:pPr>
       <w:r>
-        <w:t xml:space="preserve">4. Limitations, and what is worth expanding</w:t>
+        <w:t xml:space="preserve">4. Autonomous research this round</w:t>
       </w:r>
     </w:p>
     <w:p>
       <w:pPr>
-        <w:pStyle w:val="FirstParagraph"/>
-      </w:pPr>
-      <w:r>
-        <w:t xml:space="preserve">A capture proves presence and never absence, so a year without one is unevidenced rather than</w:t>
-      </w:r>
-      <w:r>
-        <w:t xml:space="preserve"> </w:t>
-      </w:r>
-      <w:r>
-        <w:t xml:space="preserve">empty, and a creation date attests one year only. Neither route can invent a year; the mistake they</w:t>
-      </w:r>
-      <w:r>
-        <w:t xml:space="preserve"> </w:t>
-      </w:r>
-      <w:r>
-        <w:t xml:space="preserve">can make is omission. The hostname unit rewards platforms with many sub-hosts, so its per-year</w:t>
-      </w:r>
-      <w:r>
-        <w:t xml:space="preserve"> </w:t>
-      </w:r>
-      <w:r>
-        <w:t xml:space="preserve">figures are dominated by 2000 and 2001, where the archive is densest.</w:t>
+        <w:pStyle w:val="Compact"/>
+        <w:numPr>
+          <w:ilvl w:val="0"/>
+          <w:numId w:val="1003"/>
+        </w:numPr>
+      </w:pPr>
+      <w:r>
+        <w:rPr>
+          <w:b/>
+          <w:bCs/>
+        </w:rPr>
+        <w:t xml:space="preserve">The loop runs unattended.</w:t>
+      </w:r>
+      <w:r>
+        <w:t xml:space="preserve"> </w:t>
+      </w:r>
+      <w:r>
+        <w:t xml:space="preserve">Scheduled workflows on a self-hosted runner: a generator proposes</w:t>
+      </w:r>
+      <w:r>
+        <w:t xml:space="preserve"> </w:t>
+      </w:r>
+      <w:r>
+        <w:t xml:space="preserve">hypotheses, researcher waves test them in parallel and price each against the store, a re-opener</w:t>
+      </w:r>
+      <w:r>
+        <w:t xml:space="preserve"> </w:t>
+      </w:r>
+      <w:r>
+        <w:t xml:space="preserve">re-reads closed verdicts whenever a screen changes, and an improver tunes one prompt or model</w:t>
+      </w:r>
+      <w:r>
+        <w:t xml:space="preserve"> </w:t>
+      </w:r>
+      <w:r>
+        <w:t xml:space="preserve">knob per pull request from per-run telemetry.</w:t>
       </w:r>
     </w:p>
     <w:p>
       <w:pPr>
-        <w:pStyle w:val="BodyText"/>
+        <w:pStyle w:val="Compact"/>
+        <w:numPr>
+          <w:ilvl w:val="0"/>
+          <w:numId w:val="1003"/>
+        </w:numPr>
       </w:pPr>
       <w:r>
         <w:rPr>
           <w:b/>
           <w:bCs/>
         </w:rPr>
-        <w:t xml:space="preserve">Worth expanding, in order.</w:t>
-      </w:r>
-      <w:r>
-        <w:t xml:space="preserve"> </w:t>
-      </w:r>
-      <w:r>
-        <w:t xml:space="preserve">The remaining ranked platforms and suffixes, resumable from the</w:t>
-      </w:r>
-      <w:r>
-        <w:t xml:space="preserve"> </w:t>
-      </w:r>
-      <w:r>
-        <w:t xml:space="preserve">ledger. Re-reading every capture-bearing artifact already held at hostname grain, since that paid</w:t>
-      </w:r>
-      <w:r>
-        <w:t xml:space="preserve"> </w:t>
-      </w:r>
-      <w:r>
-        <w:t xml:space="preserve">without a request. Registrable discovery stays the priority you set: generated sibling names over</w:t>
-      </w:r>
-      <w:r>
-        <w:t xml:space="preserve"> </w:t>
-      </w:r>
-      <w:r>
-        <w:t xml:space="preserve">registry data and bracketed-gap CDX queries continue at a measured, plannable rate.</w:t>
-      </w:r>
-      <w:r>
-        <w:t xml:space="preserve"> </w:t>
-      </w:r>
+        <w:t xml:space="preserve">Two of the round's finds are the loop's.</w:t>
+      </w:r>
+      <w:r>
+        <w:t xml:space="preserve"> </w:t>
+      </w:r>
+      <w:r>
+        <w:t xml:space="preserve">The hostname-grain re-read (item 1 above) was among</w:t>
+      </w:r>
+      <w:r>
+        <w:t xml:space="preserve"> </w:t>
+      </w:r>
+      <w:r>
+        <w:t xml:space="preserve">the generator's first seven proposals. The re-opener recovered the NYPW TimeMaps from a 14 EE</w:t>
+      </w:r>
+      <w:r>
+        <w:t xml:space="preserve"> </w:t>
+      </w:r>
+      <w:r>
+        <w:t xml:space="preserve">closure by measuring the ingest ledger per folder (year rows per million: 2000 ~24,000, 1999</w:t>
+      </w:r>
+      <w:r>
+        <w:t xml:space="preserve"> </w:t>
+      </w:r>
+      <w:r>
+        <w:t xml:space="preserve">~10,000, 2001 exactly 4), for ~88,000 EE. Rule learned: a partitioned corpus is measured per</w:t>
+      </w:r>
+      <w:r>
+        <w:t xml:space="preserve"> </w:t>
+      </w:r>
+      <w:r>
+        <w:t xml:space="preserve">partition, never argued about.</w:t>
+      </w:r>
+    </w:p>
+    <w:p>
+      <w:pPr>
+        <w:pStyle w:val="Compact"/>
+        <w:numPr>
+          <w:ilvl w:val="0"/>
+          <w:numId w:val="1003"/>
+        </w:numPr>
+      </w:pPr>
       <w:r>
         <w:rPr>
           <w:b/>
           <w:bCs/>
         </w:rPr>
-        <w:t xml:space="preserve">Less</w:t>
-      </w:r>
+        <w:t xml:space="preserve">Admission without a human, under a standing rule.</w:t>
+      </w:r>
+      <w:r>
+        <w:t xml:space="preserve"> </w:t>
+      </w:r>
+      <w:r>
+        <w:t xml:space="preserve">A source banks when its evidence class is</w:t>
+      </w:r>
+      <w:r>
+        <w:t xml:space="preserve"> </w:t>
+      </w:r>
+      <w:r>
+        <w:t xml:space="preserve">already master-eligible, a machine stamp inside the artifact dates each item, the terms were read</w:t>
+      </w:r>
+      <w:r>
+        <w:t xml:space="preserve"> </w:t>
+      </w:r>
+      <w:r>
+        <w:t xml:space="preserve">in full, and the invariants pass. Anything else parks until a written decision.</w:t>
+      </w:r>
+    </w:p>
+    <w:p>
+      <w:pPr>
+        <w:pStyle w:val="Compact"/>
+        <w:numPr>
+          <w:ilvl w:val="0"/>
+          <w:numId w:val="1003"/>
+        </w:numPr>
+      </w:pPr>
       <w:r>
         <w:rPr>
           <w:b/>
           <w:bCs/>
         </w:rPr>
+        <w:t xml:space="preserve">Saturation ledger</w:t>
+      </w:r>
+      <w:r>
+        <w:t xml:space="preserve">, as your 0831 update asks:</w:t>
+      </w:r>
+      <w:r>
+        <w:t xml:space="preserve"> </w:t>
+      </w:r>
+      <w:r>
+        <w:rPr>
+          <w:rStyle w:val="VerbatimChar"/>
+        </w:rPr>
+        <w:t xml:space="preserve">audit/source_saturation_ledger.csv</w:t>
+      </w:r>
+      <w:r>
+        <w:t xml:space="preserve">, one row</w:t>
+      </w:r>
+      <w:r>
+        <w:t xml:space="preserve"> </w:t>
+      </w:r>
+      <w:r>
+        <w:t xml:space="preserve">per source family and version.</w:t>
+      </w:r>
+      <w:r>
         <w:t xml:space="preserve"> </w:t>
       </w:r>
       <w:r>
@@ -3637,16 +2473,62 @@
           <w:b/>
           <w:bCs/>
         </w:rPr>
-        <w:t xml:space="preserve">promising, measured</w:t>
-      </w:r>
-      <w:r>
-        <w:t xml:space="preserve">: prose corpora, academic repositories, CD-ROM media, FTP mirrors and trade</w:t>
-      </w:r>
-      <w:r>
-        <w:t xml:space="preserve"> </w:t>
-      </w:r>
-      <w:r>
-        <w:t xml:space="preserve">directories; each closure and its measurement is in</w:t>
+        <w:t xml:space="preserve">465 source families searched and recorded</w:t>
+      </w:r>
+      <w:r>
+        <w:t xml:space="preserve"> </w:t>
+      </w:r>
+      <w:r>
+        <w:t xml:space="preserve">in</w:t>
+      </w:r>
+      <w:r>
+        <w:t xml:space="preserve"> </w:t>
+      </w:r>
+      <w:r>
+        <w:rPr>
+          <w:rStyle w:val="VerbatimChar"/>
+        </w:rPr>
+        <w:t xml:space="preserve">sources.md</w:t>
+      </w:r>
+      <w:r>
+        <w:t xml:space="preserve">: 60 developed, 405 evaluated and closed with the measurement that closed them, so the same ground is not broken twice.</w:t>
+      </w:r>
+    </w:p>
+    <w:p>
+      <w:pPr>
+        <w:pStyle w:val="Compact"/>
+        <w:numPr>
+          <w:ilvl w:val="0"/>
+          <w:numId w:val="1003"/>
+        </w:numPr>
+      </w:pPr>
+      <w:r>
+        <w:rPr>
+          <w:b/>
+          <w:bCs/>
+        </w:rPr>
+        <w:t xml:space="preserve">Measured negatives that steer the next cycle</w:t>
+      </w:r>
+      <w:r>
+        <w:t xml:space="preserve">: prose corpora fail either the URL-density or</w:t>
+      </w:r>
+      <w:r>
+        <w:t xml:space="preserve"> </w:t>
+      </w:r>
+      <w:r>
+        <w:t xml:space="preserve">the authority screen; academic repositories closed by enumeration through five APIs and two</w:t>
+      </w:r>
+      <w:r>
+        <w:t xml:space="preserve"> </w:t>
+      </w:r>
+      <w:r>
+        <w:t xml:space="preserve">registries; CD-ROM media, FTP mirrors and trade directories at the curated-directory floor</w:t>
+      </w:r>
+      <w:r>
+        <w:t xml:space="preserve"> </w:t>
+      </w:r>
+      <w:r>
+        <w:t xml:space="preserve">(0.013-0.024 net-new pairs per listed name). Each with its figure in</w:t>
       </w:r>
       <w:r>
         <w:t xml:space="preserve"> </w:t>
@@ -3662,60 +2544,172 @@
       </w:r>
     </w:p>
     <w:bookmarkEnd w:id="12"/>
-    <w:bookmarkStart w:id="13" w:name="merge-overlap-and-reconciliation-d3"/>
+    <w:bookmarkStart w:id="13" w:name="cdx-execution-notes"/>
     <w:p>
       <w:pPr>
         <w:pStyle w:val="Heading2"/>
       </w:pPr>
       <w:r>
-        <w:t xml:space="preserve">5. Merge, overlap and reconciliation (D3)</w:t>
+        <w:t xml:space="preserve">5. CDX execution notes</w:t>
       </w:r>
     </w:p>
     <w:p>
       <w:pPr>
+        <w:pStyle w:val="Compact"/>
+        <w:numPr>
+          <w:ilvl w:val="0"/>
+          <w:numId w:val="1004"/>
+        </w:numPr>
+      </w:pPr>
+      <w:r>
+        <w:t xml:space="preserve">Two clients at most, honest User-Agent, two seconds between requests, backoff on 429/503/504,</w:t>
+      </w:r>
+      <w:r>
+        <w:t xml:space="preserve"> </w:t>
+      </w:r>
+      <w:r>
+        <w:rPr>
+          <w:rStyle w:val="VerbatimChar"/>
+        </w:rPr>
+        <w:t xml:space="preserve">Retry-After</w:t>
+      </w:r>
+      <w:r>
+        <w:t xml:space="preserve"> </w:t>
+      </w:r>
+      <w:r>
+        <w:t xml:space="preserve">honoured. Collectors take an absolute deadline and outlive the session.</w:t>
+      </w:r>
+    </w:p>
+    <w:p>
+      <w:pPr>
+        <w:pStyle w:val="Compact"/>
+        <w:numPr>
+          <w:ilvl w:val="0"/>
+          <w:numId w:val="1004"/>
+        </w:numPr>
+      </w:pPr>
+      <w:r>
+        <w:t xml:space="preserve">Per-domain queries over bracketed gaps and the candidate pool: 92,479 registrable pairs.</w:t>
+      </w:r>
+      <w:r>
+        <w:t xml:space="preserve"> </w:t>
+      </w:r>
+      <w:r>
+        <w:t xml:space="preserve">Domain-wide sweeps at 200 rows a page write raw</w:t>
+      </w:r>
+      <w:r>
+        <w:t xml:space="preserve"> </w:t>
+      </w:r>
+      <w:r>
+        <w:rPr>
+          <w:rStyle w:val="VerbatimChar"/>
+        </w:rPr>
+        <w:t xml:space="preserve">{url, timestamp}</w:t>
+      </w:r>
+      <w:r>
+        <w:t xml:space="preserve"> </w:t>
+      </w:r>
+      <w:r>
+        <w:t xml:space="preserve">journals, so the same bytes</w:t>
+      </w:r>
+      <w:r>
+        <w:t xml:space="preserve"> </w:t>
+      </w:r>
+      <w:r>
+        <w:t xml:space="preserve">can be re-read under a new rule, which is what paid this round.</w:t>
+      </w:r>
+    </w:p>
+    <w:p>
+      <w:pPr>
+        <w:pStyle w:val="Compact"/>
+        <w:numPr>
+          <w:ilvl w:val="0"/>
+          <w:numId w:val="1004"/>
+        </w:numPr>
+      </w:pPr>
+      <w:r>
+        <w:t xml:space="preserve">Errors met and handled: HTTP 400 past the last page ends a sweep cleanly; a page-count timeout on</w:t>
+      </w:r>
+      <w:r>
+        <w:t xml:space="preserve"> </w:t>
+      </w:r>
+      <w:r>
+        <w:rPr>
+          <w:rStyle w:val="VerbatimChar"/>
+        </w:rPr>
+        <w:t xml:space="preserve">cjb.net</w:t>
+      </w:r>
+      <w:r>
+        <w:t xml:space="preserve"> </w:t>
+      </w:r>
+      <w:r>
+        <w:t xml:space="preserve">left that parent ledgered incomplete and resumable; transport failures retry with a</w:t>
+      </w:r>
+      <w:r>
+        <w:t xml:space="preserve"> </w:t>
+      </w:r>
+      <w:r>
+        <w:t xml:space="preserve">widening delay.</w:t>
+      </w:r>
+    </w:p>
+    <w:bookmarkEnd w:id="13"/>
+    <w:bookmarkStart w:id="14" w:name="limitations-and-what-is-worth-expanding"/>
+    <w:p>
+      <w:pPr>
+        <w:pStyle w:val="Heading2"/>
+      </w:pPr>
+      <w:r>
+        <w:t xml:space="preserve">6. Limitations, and what is worth expanding</w:t>
+      </w:r>
+    </w:p>
+    <w:p>
+      <w:pPr>
         <w:pStyle w:val="FirstParagraph"/>
       </w:pPr>
       <w:r>
-        <w:rPr>
-          <w:rStyle w:val="VerbatimChar"/>
-        </w:rPr>
-        <w:t xml:space="preserve">merge_against_baseline.py</w:t>
-      </w:r>
-      <w:r>
-        <w:t xml:space="preserve"> </w:t>
-      </w:r>
-      <w:r>
-        <w:t xml:space="preserve">unions both units into the current baseline,</w:t>
-      </w:r>
-      <w:r>
-        <w:t xml:space="preserve"> </w:t>
-      </w:r>
-      <w:r>
-        <w:t xml:space="preserve">deduplicated on the lowercased line within each year, and scores every file with your</w:t>
-      </w:r>
-      <w:r>
-        <w:t xml:space="preserve"> </w:t>
-      </w:r>
-      <w:r>
-        <w:t xml:space="preserve">own calculator. Per-year form in</w:t>
-      </w:r>
-      <w:r>
-        <w:t xml:space="preserve"> </w:t>
-      </w:r>
-      <w:r>
-        <w:rPr>
-          <w:rStyle w:val="VerbatimChar"/>
-        </w:rPr>
-        <w:t xml:space="preserve">audit/merge_stats_ark_*.csv</w:t>
-      </w:r>
-      <w:r>
-        <w:t xml:space="preserve">, in your column names</w:t>
-      </w:r>
-      <w:r>
-        <w:t xml:space="preserve"> </w:t>
-      </w:r>
-      <w:r>
-        <w:t xml:space="preserve">so the two audits diff directly.</w:t>
+        <w:t xml:space="preserve">A capture proves presence, never absence: a year without one is unevidenced, not empty. The</w:t>
+      </w:r>
+      <w:r>
+        <w:t xml:space="preserve"> </w:t>
+      </w:r>
+      <w:r>
+        <w:t xml:space="preserve">hostname unit rewards platforms with many sub-hosts, so it is concentrated in 2000 and 2001.</w:t>
+      </w:r>
+    </w:p>
+    <w:p>
+      <w:pPr>
+        <w:pStyle w:val="BodyText"/>
+      </w:pPr>
+      <w:r>
+        <w:t xml:space="preserve">Worth expanding, in order: the remaining ranked platforms, resumable from the ledger; every held</w:t>
+      </w:r>
+      <w:r>
+        <w:t xml:space="preserve"> </w:t>
+      </w:r>
+      <w:r>
+        <w:t xml:space="preserve">capture-bearing artifact re-read at hostname grain; registrable discovery by generated sibling</w:t>
+      </w:r>
+      <w:r>
+        <w:t xml:space="preserve"> </w:t>
+      </w:r>
+      <w:r>
+        <w:t xml:space="preserve">names and bracketed-gap CDX queries at its measured rate. Not worth more time, measured: prose</w:t>
+      </w:r>
+      <w:r>
+        <w:t xml:space="preserve"> </w:t>
+      </w:r>
+      <w:r>
+        <w:t xml:space="preserve">corpora, academic repositories, CD-ROM media, FTP mirrors, trade directories.</w:t>
+      </w:r>
+    </w:p>
+    <w:bookmarkEnd w:id="14"/>
+    <w:bookmarkStart w:id="15" w:name="merge-overlap-and-reconciliation-d3"/>
+    <w:p>
+      <w:pPr>
+        <w:pStyle w:val="Heading2"/>
+      </w:pPr>
+      <w:r>
+        <w:t xml:space="preserve">7. Merge, overlap and reconciliation (D3)</w:t>
       </w:r>
     </w:p>
     <w:tbl>
@@ -3840,7 +2834,7 @@
                 <w:b/>
                 <w:bCs/>
               </w:rPr>
-              <w:t xml:space="preserve">5,496,283</w:t>
+              <w:t xml:space="preserve">5,805,625</w:t>
             </w:r>
           </w:p>
         </w:tc>
@@ -3856,7 +2850,7 @@
                 <w:b/>
                 <w:bCs/>
               </w:rPr>
-              <w:t xml:space="preserve">3,078,203.9386</w:t>
+              <w:t xml:space="preserve">3,293,990.8717</w:t>
             </w:r>
           </w:p>
         </w:tc>
@@ -3881,19 +2875,19 @@
               <w:jc w:val="right"/>
             </w:pPr>
             <w:r>
-              <w:t xml:space="preserve">39,345,209</w:t>
-            </w:r>
-          </w:p>
-        </w:tc>
-        <w:tc>
-          <w:tcPr/>
-          <w:p>
-            <w:pPr>
-              <w:pStyle w:val="Compact"/>
-              <w:jc w:val="right"/>
-            </w:pPr>
-            <w:r>
-              <w:t xml:space="preserve">20,848,792.8412</w:t>
+              <w:t xml:space="preserve">39,654,551</w:t>
+            </w:r>
+          </w:p>
+        </w:tc>
+        <w:tc>
+          <w:tcPr/>
+          <w:p>
+            <w:pPr>
+              <w:pStyle w:val="Compact"/>
+              <w:jc w:val="right"/>
+            </w:pPr>
+            <w:r>
+              <w:t xml:space="preserve">21,064,579.7743</w:t>
             </w:r>
           </w:p>
         </w:tc>
@@ -3901,41 +2895,49 @@
     </w:tbl>
     <w:p>
       <w:pPr>
-        <w:pStyle w:val="BodyText"/>
-      </w:pPr>
+        <w:pStyle w:val="Compact"/>
+        <w:numPr>
+          <w:ilvl w:val="0"/>
+          <w:numId w:val="1005"/>
+        </w:numPr>
+      </w:pPr>
+      <w:r>
+        <w:t xml:space="preserve">Overlap with the baseline:</w:t>
+      </w:r>
+      <w:r>
+        <w:t xml:space="preserve"> </w:t>
+      </w:r>
       <w:r>
         <w:rPr>
           <w:b/>
           <w:bCs/>
         </w:rPr>
-        <w:t xml:space="preserve">Overlap with the baseline is 0 records</w:t>
-      </w:r>
-      <w:r>
-        <w:t xml:space="preserve">, so all 5,496,283 submitted are accepted and nothing counts twice; the registrable and hostname files are disjoint in every year.</w:t>
+        <w:t xml:space="preserve">0 records</w:t>
+      </w:r>
+      <w:r>
+        <w:t xml:space="preserve">, so all 5,805,625 submitted count once; the two unit files are disjoint in every year.</w:t>
       </w:r>
     </w:p>
     <w:p>
       <w:pPr>
-        <w:pStyle w:val="BodyText"/>
+        <w:pStyle w:val="Compact"/>
+        <w:numPr>
+          <w:ilvl w:val="0"/>
+          <w:numId w:val="1005"/>
+        </w:numPr>
       </w:pPr>
       <w:r>
         <w:rPr>
           <w:b/>
           <w:bCs/>
         </w:rPr>
-        <w:t xml:space="preserve">28 of 28 reconciliation checks pass.</w:t>
-      </w:r>
-      <w:r>
-        <w:t xml:space="preserve"> </w:t>
-      </w:r>
-      <w:r>
-        <w:t xml:space="preserve">All are arithmetic</w:t>
-      </w:r>
-      <w:r>
-        <w:t xml:space="preserve"> </w:t>
-      </w:r>
-      <w:r>
-        <w:t xml:space="preserve">identities, so a failure would be a defect rather than a finding: per year that</w:t>
+        <w:t xml:space="preserve">28 of 28 reconciliation checks pass</w:t>
+      </w:r>
+      <w:r>
+        <w:t xml:space="preserve"> </w:t>
+      </w:r>
+      <w:r>
+        <w:t xml:space="preserve">(per-year</w:t>
       </w:r>
       <w:r>
         <w:t xml:space="preserve"> </w:t>
@@ -3947,28 +2949,7 @@
         <w:t xml:space="preserve">baseline_unique + accepted_new == merged_unique</w:t>
       </w:r>
       <w:r>
-        <w:t xml:space="preserve"> </w:t>
-      </w:r>
-      <w:r>
-        <w:t xml:space="preserve">and that the two unit files are</w:t>
-      </w:r>
-      <w:r>
-        <w:t xml:space="preserve"> </w:t>
-      </w:r>
-      <w:r>
-        <w:t xml:space="preserve">disjoint and sum to the submitted count, that the per-year increments sum</w:t>
-      </w:r>
-      <w:r>
-        <w:t xml:space="preserve"> </w:t>
-      </w:r>
-      <w:r>
-        <w:t xml:space="preserve">to the headline, and that a freshly measured baseline reproduces the totals this</w:t>
-      </w:r>
-      <w:r>
-        <w:t xml:space="preserve"> </w:t>
-      </w:r>
-      <w:r>
-        <w:t xml:space="preserve">round was measured against. Each is listed with its verdict in</w:t>
+        <w:t xml:space="preserve">, unit files disjoint and summing to the submitted count, per-year increments summing to the headline, baseline re-measured). Verdicts in</w:t>
       </w:r>
       <w:r>
         <w:t xml:space="preserve"> </w:t>
@@ -3980,21 +2961,63 @@
         <w:t xml:space="preserve">audit/merge_audit_ark_*.json</w:t>
       </w:r>
       <w:r>
-        <w:t xml:space="preserve">.</w:t>
-      </w:r>
-    </w:p>
-    <w:bookmarkEnd w:id="13"/>
-    <w:bookmarkStart w:id="14" w:name="X0b2e0752a69cd3551e46aae05f1ee9f09d3d9db"/>
-    <w:p>
-      <w:pPr>
-        <w:pStyle w:val="Heading2"/>
-      </w:pPr>
-      <w:r>
-        <w:t xml:space="preserve">6. Reproduction, and the four requested artifacts</w:t>
+        <w:t xml:space="preserve">, per-year form in</w:t>
+      </w:r>
+      <w:r>
+        <w:t xml:space="preserve"> </w:t>
+      </w:r>
+      <w:r>
+        <w:rPr>
+          <w:rStyle w:val="VerbatimChar"/>
+        </w:rPr>
+        <w:t xml:space="preserve">audit/merge_stats_ark_*.csv</w:t>
+      </w:r>
+      <w:r>
+        <w:t xml:space="preserve"> </w:t>
+      </w:r>
+      <w:r>
+        <w:t xml:space="preserve">in your column names.</w:t>
       </w:r>
     </w:p>
     <w:p>
       <w:pPr>
+        <w:pStyle w:val="Compact"/>
+        <w:numPr>
+          <w:ilvl w:val="0"/>
+          <w:numId w:val="1005"/>
+        </w:numPr>
+      </w:pPr>
+      <w:r>
+        <w:t xml:space="preserve">Method:</w:t>
+      </w:r>
+      <w:r>
+        <w:t xml:space="preserve"> </w:t>
+      </w:r>
+      <w:r>
+        <w:rPr>
+          <w:rStyle w:val="VerbatimChar"/>
+        </w:rPr>
+        <w:t xml:space="preserve">merge_against_baseline.py</w:t>
+      </w:r>
+      <w:r>
+        <w:t xml:space="preserve"> </w:t>
+      </w:r>
+      <w:r>
+        <w:t xml:space="preserve">unions both units into the baseline, deduplicated on the lowercased line within each year, and scores every file with your own calculator.</w:t>
+      </w:r>
+    </w:p>
+    <w:bookmarkEnd w:id="15"/>
+    <w:bookmarkStart w:id="16" w:name="X0b2e0752a69cd3551e46aae05f1ee9f09d3d9db"/>
+    <w:p>
+      <w:pPr>
+        <w:pStyle w:val="Heading2"/>
+      </w:pPr>
+      <w:r>
+        <w:t xml:space="preserve">8. Reproduction and the four requested artifacts</w:t>
+      </w:r>
+    </w:p>
+    <w:p>
+      <w:pPr>
         <w:pStyle w:val="FirstParagraph"/>
       </w:pPr>
       <w:r>
@@ -4007,7 +3030,7 @@
         <w:t xml:space="preserve"> </w:t>
       </w:r>
       <w:r>
-        <w:t xml:space="preserve">in the archive gives the order.</w:t>
+        <w:t xml:space="preserve">in the archive gives the order:</w:t>
       </w:r>
       <w:r>
         <w:t xml:space="preserve"> </w:t>
@@ -4019,10 +3042,7 @@
         <w:t xml:space="preserve">masters/</w:t>
       </w:r>
       <w:r>
-        <w:t xml:space="preserve"> </w:t>
-      </w:r>
-      <w:r>
-        <w:t xml:space="preserve">and</w:t>
+        <w:t xml:space="preserve">,</w:t>
       </w:r>
       <w:r>
         <w:t xml:space="preserve"> </w:t>
@@ -4034,16 +3054,7 @@
         <w:t xml:space="preserve">additions/</w:t>
       </w:r>
       <w:r>
-        <w:t xml:space="preserve"> </w:t>
-      </w:r>
-      <w:r>
-        <w:t xml:space="preserve">hold the merged annual lists</w:t>
-      </w:r>
-      <w:r>
-        <w:t xml:space="preserve"> </w:t>
-      </w:r>
-      <w:r>
-        <w:t xml:space="preserve">and the registrable increment,</w:t>
+        <w:t xml:space="preserve">,</w:t>
       </w:r>
       <w:r>
         <w:t xml:space="preserve"> </w:t>
@@ -4055,10 +3066,7 @@
         <w:t xml:space="preserve">hostnames/</w:t>
       </w:r>
       <w:r>
-        <w:t xml:space="preserve"> </w:t>
-      </w:r>
-      <w:r>
-        <w:t xml:space="preserve">the hostname increment,</w:t>
+        <w:t xml:space="preserve">,</w:t>
       </w:r>
       <w:r>
         <w:t xml:space="preserve"> </w:t>
@@ -4070,16 +3078,7 @@
         <w:t xml:space="preserve">candidates.txt</w:t>
       </w:r>
       <w:r>
-        <w:t xml:space="preserve"> </w:t>
-      </w:r>
-      <w:r>
-        <w:t xml:space="preserve">the undated</w:t>
-      </w:r>
-      <w:r>
-        <w:t xml:space="preserve"> </w:t>
-      </w:r>
-      <w:r>
-        <w:t xml:space="preserve">names,</w:t>
+        <w:t xml:space="preserve">,</w:t>
       </w:r>
       <w:r>
         <w:t xml:space="preserve"> </w:t>
@@ -4094,7 +3093,7 @@
         <w:t xml:space="preserve"> </w:t>
       </w:r>
       <w:r>
-        <w:t xml:space="preserve">every assignment joined to its evidence row, and</w:t>
+        <w:t xml:space="preserve">(every assignment joined to its evidence row),</w:t>
       </w:r>
       <w:r>
         <w:t xml:space="preserve"> </w:t>
@@ -4106,22 +3105,13 @@
         <w:t xml:space="preserve">logs/</w:t>
       </w:r>
       <w:r>
-        <w:t xml:space="preserve"> </w:t>
-      </w:r>
-      <w:r>
-        <w:t xml:space="preserve">the</w:t>
-      </w:r>
-      <w:r>
-        <w:t xml:space="preserve"> </w:t>
-      </w:r>
-      <w:r>
-        <w:t xml:space="preserve">collectors' logs. A fresh copy of this archive was extracted and put through the route above before sending. Every one of</w:t>
-      </w:r>
-      <w:r>
-        <w:t xml:space="preserve"> </w:t>
-      </w:r>
-      <w:r>
-        <w:t xml:space="preserve">the ten checks in</w:t>
+        <w:t xml:space="preserve">.</w:t>
+      </w:r>
+      <w:r>
+        <w:t xml:space="preserve"> </w:t>
+      </w:r>
+      <w:r>
+        <w:t xml:space="preserve">Before sending, a fresh copy of this archive was extracted and put through that route: all ten</w:t>
       </w:r>
       <w:r>
         <w:t xml:space="preserve"> </w:t>
@@ -4136,7 +3126,7 @@
         <w:t xml:space="preserve"> </w:t>
       </w:r>
       <w:r>
-        <w:t xml:space="preserve">passes, and the tier-2 rebuild from</w:t>
+        <w:t xml:space="preserve">checks pass; the tier-2 rebuild from</w:t>
       </w:r>
       <w:r>
         <w:t xml:space="preserve"> </w:t>
@@ -4151,43 +3141,7 @@
         <w:t xml:space="preserve"> </w:t>
       </w:r>
       <w:r>
-        <w:t xml:space="preserve">returns every per-year</w:t>
-      </w:r>
-      <w:r>
-        <w:t xml:space="preserve"> </w:t>
-      </w:r>
-      <w:r>
-        <w:t xml:space="preserve">count exactly, with all fifteen invariants passing and all twenty-one result files (six annual additions,</w:t>
-      </w:r>
-      <w:r>
-        <w:t xml:space="preserve"> </w:t>
-      </w:r>
-      <w:r>
-        <w:t xml:space="preserve">six hostname files, six masters, two evidence manifests, the candidate list) byte-identical to the ones</w:t>
-      </w:r>
-      <w:r>
-        <w:t xml:space="preserve"> </w:t>
-      </w:r>
-      <w:r>
-        <w:t xml:space="preserve">shipped here. The first rehearsal of this build caught a defect: run from inside the archive, the</w:t>
-      </w:r>
-      <w:r>
-        <w:t xml:space="preserve"> </w:t>
-      </w:r>
-      <w:r>
-        <w:t xml:space="preserve">hostname export resolved the baseline through a repository-only path and rebuilt every hostname as</w:t>
-      </w:r>
-      <w:r>
-        <w:t xml:space="preserve"> </w:t>
-      </w:r>
-      <w:r>
-        <w:t xml:space="preserve">net-new; it was fixed and the rehearsal rerun. Tier 3 was not run: it is a roughly 50 GB download, and</w:t>
-      </w:r>
-      <w:r>
-        <w:t xml:space="preserve"> </w:t>
-      </w:r>
-      <w:r>
-        <w:t xml:space="preserve">five journal sets are held out of this archive on size, so it would replay every source but those.</w:t>
+        <w:t xml:space="preserve">reproduces every per-year count, passes all fifteen invariants, and returns all twenty-one result files (six annual additions, six hostname files, six masters, two evidence manifests, the candidate list) byte-identical to the ones shipped. The first rehearsal caught a defect (the hostname export resolved the baseline through a repository-only path when run inside the archive); it was fixed and the rehearsal rerun clean. Tier 3, the full replay, was not run: it is a roughly 50 GB download and five journal sets are held out of the archive on size.</w:t>
       </w:r>
     </w:p>
     <w:tbl>
@@ -4280,7 +3234,7 @@
               <w:t xml:space="preserve"> </w:t>
             </w:r>
             <w:r>
-              <w:t xml:space="preserve">at the commit in</w:t>
+              <w:t xml:space="preserve">at</w:t>
             </w:r>
             <w:r>
               <w:t xml:space="preserve"> </w:t>
@@ -4334,7 +3288,7 @@
               <w:t xml:space="preserve"> </w:t>
             </w:r>
             <w:r>
-              <w:t xml:space="preserve">names what every command should print</w:t>
+              <w:t xml:space="preserve">names what every command prints</w:t>
             </w:r>
           </w:p>
         </w:tc>
@@ -4390,9 +3344,6 @@
               </w:rPr>
               <w:t xml:space="preserve">sources.md</w:t>
             </w:r>
-            <w:r>
-              <w:t xml:space="preserve">, which carries every rejection with the measurement that closed it</w:t>
-            </w:r>
           </w:p>
         </w:tc>
       </w:tr>
@@ -4430,7 +3381,7 @@
               <w:pStyle w:val="Compact"/>
             </w:pPr>
             <w:r>
-              <w:t xml:space="preserve">section 5,</w:t>
+              <w:t xml:space="preserve">section 7,</w:t>
             </w:r>
             <w:r>
               <w:t xml:space="preserve"> </w:t>
@@ -4496,7 +3447,7 @@
               <w:t xml:space="preserve">equivalent_english_domain_calculator/</w:t>
             </w:r>
             <w:r>
-              <w:t xml:space="preserve">, your own program vendored unmodified, explained in</w:t>
+              <w:t xml:space="preserve">, your program vendored unmodified, explained in</w:t>
             </w:r>
             <w:r>
               <w:t xml:space="preserve"> </w:t>
@@ -4525,11 +3476,11 @@
         <w:t xml:space="preserve"> </w:t>
       </w:r>
       <w:r>
-        <w:t xml:space="preserve">runs ten checks inside a fresh extraction, including all four, so none can ship unmet.</w:t>
+        <w:t xml:space="preserve">runs ten checks inside a fresh extraction, including all four.</w:t>
       </w:r>
     </w:p>
-    <w:bookmarkEnd w:id="14"/>
-    <w:bookmarkEnd w:id="15"/>
+    <w:bookmarkEnd w:id="16"/>
+    <w:bookmarkEnd w:id="17"/>
     <w:sectPr>
       <w:pgMar w:bottom="1080" w:footer="720" w:gutter="0" w:header="720" w:left="1080" w:right="1080" w:top="1080"/>
       <w:footnotePr>
@@ -4641,6 +3592,91 @@
       </w:pPr>
     </w:lvl>
   </w:abstractNum>
+  <w:abstractNum w:abstractNumId="99411">
+    <w:nsid w:val="00A99411"/>
+    <w:multiLevelType w:val="multilevel"/>
+    <w:lvl w:ilvl="0">
+      <w:start w:val="1"/>
+      <w:numFmt w:val="decimal"/>
+      <w:lvlText w:val="%1."/>
+      <w:lvlJc w:val="left"/>
+      <w:pPr>
+        <w:ind w:left="720" w:hanging="360"/>
+      </w:pPr>
+    </w:lvl>
+    <w:lvl w:ilvl="1">
+      <w:start w:val="1"/>
+      <w:numFmt w:val="decimal"/>
+      <w:lvlText w:val="%2."/>
+      <w:lvlJc w:val="left"/>
+      <w:pPr>
+        <w:ind w:left="1440" w:hanging="360"/>
+      </w:pPr>
+    </w:lvl>
+    <w:lvl w:ilvl="2">
+      <w:start w:val="1"/>
+      <w:numFmt w:val="decimal"/>
+      <w:lvlText w:val="%3."/>
+      <w:lvlJc w:val="left"/>
+      <w:pPr>
+        <w:ind w:left="2160" w:hanging="360"/>
+      </w:pPr>
+    </w:lvl>
+    <w:lvl w:ilvl="3">
+      <w:start w:val="1"/>
+      <w:numFmt w:val="decimal"/>
+      <w:lvlText w:val="%4."/>
+      <w:lvlJc w:val="left"/>
+      <w:pPr>
+        <w:ind w:left="2880" w:hanging="360"/>
+      </w:pPr>
+    </w:lvl>
+    <w:lvl w:ilvl="4">
+      <w:start w:val="1"/>
+      <w:numFmt w:val="decimal"/>
+      <w:lvlText w:val="%5."/>
+      <w:lvlJc w:val="left"/>
+      <w:pPr>
+        <w:ind w:left="3600" w:hanging="360"/>
+      </w:pPr>
+    </w:lvl>
+    <w:lvl w:ilvl="5">
+      <w:start w:val="1"/>
+      <w:numFmt w:val="decimal"/>
+      <w:lvlText w:val="%6."/>
+      <w:lvlJc w:val="left"/>
+      <w:pPr>
+        <w:ind w:left="4320" w:hanging="360"/>
+      </w:pPr>
+    </w:lvl>
+    <w:lvl w:ilvl="6">
+      <w:start w:val="1"/>
+      <w:numFmt w:val="decimal"/>
+      <w:lvlText w:val="%7."/>
+      <w:lvlJc w:val="left"/>
+      <w:pPr>
+        <w:ind w:left="5040" w:hanging="360"/>
+      </w:pPr>
+    </w:lvl>
+    <w:lvl w:ilvl="7">
+      <w:start w:val="1"/>
+      <w:numFmt w:val="decimal"/>
+      <w:lvlText w:val="%8."/>
+      <w:lvlJc w:val="left"/>
+      <w:pPr>
+        <w:ind w:left="5760" w:hanging="360"/>
+      </w:pPr>
+    </w:lvl>
+    <w:lvl w:ilvl="8">
+      <w:start w:val="1"/>
+      <w:numFmt w:val="decimal"/>
+      <w:lvlText w:val="%9."/>
+      <w:lvlJc w:val="left"/>
+      <w:pPr>
+        <w:ind w:left="6480" w:hanging="360"/>
+      </w:pPr>
+    </w:lvl>
+  </w:abstractNum>
   <w:abstractNum w:abstractNumId="991">
     <w:nsid w:val="0000A991"/>
     <w:multiLevelType w:val="multilevel"/>
@@ -4748,6 +3784,45 @@
     <w:abstractNumId w:val="990"/>
   </w:num>
   <w:num w:numId="1001">
+    <w:abstractNumId w:val="99411"/>
+    <w:lvlOverride w:ilvl="0">
+      <w:startOverride w:val="1"/>
+    </w:lvlOverride>
+    <w:lvlOverride w:ilvl="1">
+      <w:startOverride w:val="1"/>
+    </w:lvlOverride>
+    <w:lvlOverride w:ilvl="2">
+      <w:startOverride w:val="1"/>
+    </w:lvlOverride>
+    <w:lvlOverride w:ilvl="3">
+      <w:startOverride w:val="1"/>
+    </w:lvlOverride>
+    <w:lvlOverride w:ilvl="4">
+      <w:startOverride w:val="1"/>
+    </w:lvlOverride>
+    <w:lvlOverride w:ilvl="5">
+      <w:startOverride w:val="1"/>
+    </w:lvlOverride>
+    <w:lvlOverride w:ilvl="6">
+      <w:startOverride w:val="1"/>
+    </w:lvlOverride>
+    <w:lvlOverride w:ilvl="7">
+      <w:startOverride w:val="1"/>
+    </w:lvlOverride>
+    <w:lvlOverride w:ilvl="8">
+      <w:startOverride w:val="1"/>
+    </w:lvlOverride>
+  </w:num>
+  <w:num w:numId="1002">
+    <w:abstractNumId w:val="991"/>
+  </w:num>
+  <w:num w:numId="1003">
+    <w:abstractNumId w:val="991"/>
+  </w:num>
+  <w:num w:numId="1004">
+    <w:abstractNumId w:val="991"/>
+  </w:num>
+  <w:num w:numId="1005">
     <w:abstractNumId w:val="991"/>
   </w:num>
 </w:numbering>

</xml_diff>

<commit_message>
Keep the bank alive when the busy-journal probe finds nothing, and refill the report
</commit_message>
<xml_diff>
--- a/docs/report.docx
+++ b/docs/report.docx
@@ -130,7 +130,7 @@
                 <w:b/>
                 <w:bCs/>
               </w:rPr>
-              <w:t xml:space="preserve">5,805,625</w:t>
+              <w:t xml:space="preserve">5,978,239</w:t>
             </w:r>
             <w:r>
               <w:t xml:space="preserve"> </w:t>
@@ -165,7 +165,7 @@
                 <w:b/>
                 <w:bCs/>
               </w:rPr>
-              <w:t xml:space="preserve">3,293,990.8717</w:t>
+              <w:t xml:space="preserve">3,401,456.1214</w:t>
             </w:r>
           </w:p>
         </w:tc>
@@ -194,7 +194,7 @@
                 <w:b/>
                 <w:bCs/>
               </w:rPr>
-              <w:t xml:space="preserve">18.5362%</w:t>
+              <w:t xml:space="preserve">19.1409%</w:t>
             </w:r>
           </w:p>
         </w:tc>
@@ -325,31 +325,31 @@
               <w:jc w:val="right"/>
             </w:pPr>
             <w:r>
-              <w:t xml:space="preserve">623,835</w:t>
-            </w:r>
-          </w:p>
-        </w:tc>
-        <w:tc>
-          <w:tcPr/>
-          <w:p>
-            <w:pPr>
-              <w:pStyle w:val="Compact"/>
-              <w:jc w:val="right"/>
-            </w:pPr>
-            <w:r>
-              <w:t xml:space="preserve">328,715.1485</w:t>
-            </w:r>
-          </w:p>
-        </w:tc>
-        <w:tc>
-          <w:tcPr/>
-          <w:p>
-            <w:pPr>
-              <w:pStyle w:val="Compact"/>
-              <w:jc w:val="right"/>
-            </w:pPr>
-            <w:r>
-              <w:t xml:space="preserve">1.8498%</w:t>
+              <w:t xml:space="preserve">623,920</w:t>
+            </w:r>
+          </w:p>
+        </w:tc>
+        <w:tc>
+          <w:tcPr/>
+          <w:p>
+            <w:pPr>
+              <w:pStyle w:val="Compact"/>
+              <w:jc w:val="right"/>
+            </w:pPr>
+            <w:r>
+              <w:t xml:space="preserve">328,764.8318</w:t>
+            </w:r>
+          </w:p>
+        </w:tc>
+        <w:tc>
+          <w:tcPr/>
+          <w:p>
+            <w:pPr>
+              <w:pStyle w:val="Compact"/>
+              <w:jc w:val="right"/>
+            </w:pPr>
+            <w:r>
+              <w:t xml:space="preserve">1.8501%</w:t>
             </w:r>
           </w:p>
         </w:tc>
@@ -388,31 +388,31 @@
               <w:jc w:val="right"/>
             </w:pPr>
             <w:r>
-              <w:t xml:space="preserve">5,181,790</w:t>
-            </w:r>
-          </w:p>
-        </w:tc>
-        <w:tc>
-          <w:tcPr/>
-          <w:p>
-            <w:pPr>
-              <w:pStyle w:val="Compact"/>
-              <w:jc w:val="right"/>
-            </w:pPr>
-            <w:r>
-              <w:t xml:space="preserve">2,965,275.7232</w:t>
-            </w:r>
-          </w:p>
-        </w:tc>
-        <w:tc>
-          <w:tcPr/>
-          <w:p>
-            <w:pPr>
-              <w:pStyle w:val="Compact"/>
-              <w:jc w:val="right"/>
-            </w:pPr>
-            <w:r>
-              <w:t xml:space="preserve">16.6864%</w:t>
+              <w:t xml:space="preserve">5,354,319</w:t>
+            </w:r>
+          </w:p>
+        </w:tc>
+        <w:tc>
+          <w:tcPr/>
+          <w:p>
+            <w:pPr>
+              <w:pStyle w:val="Compact"/>
+              <w:jc w:val="right"/>
+            </w:pPr>
+            <w:r>
+              <w:t xml:space="preserve">3,072,691.2896</w:t>
+            </w:r>
+          </w:p>
+        </w:tc>
+        <w:tc>
+          <w:tcPr/>
+          <w:p>
+            <w:pPr>
+              <w:pStyle w:val="Compact"/>
+              <w:jc w:val="right"/>
+            </w:pPr>
+            <w:r>
+              <w:t xml:space="preserve">17.2909%</w:t>
             </w:r>
           </w:p>
         </w:tc>
@@ -615,43 +615,43 @@
               <w:jc w:val="right"/>
             </w:pPr>
             <w:r>
-              <w:t xml:space="preserve">18,019</w:t>
-            </w:r>
-          </w:p>
-        </w:tc>
-        <w:tc>
-          <w:tcPr/>
-          <w:p>
-            <w:pPr>
-              <w:pStyle w:val="Compact"/>
-              <w:jc w:val="right"/>
-            </w:pPr>
-            <w:r>
-              <w:t xml:space="preserve">156,415</w:t>
-            </w:r>
-          </w:p>
-        </w:tc>
-        <w:tc>
-          <w:tcPr/>
-          <w:p>
-            <w:pPr>
-              <w:pStyle w:val="Compact"/>
-              <w:jc w:val="right"/>
-            </w:pPr>
-            <w:r>
-              <w:t xml:space="preserve">2,335,665</w:t>
-            </w:r>
-          </w:p>
-        </w:tc>
-        <w:tc>
-          <w:tcPr/>
-          <w:p>
-            <w:pPr>
-              <w:pStyle w:val="Compact"/>
-              <w:jc w:val="right"/>
-            </w:pPr>
-            <w:r>
-              <w:t xml:space="preserve">101,218.4339</w:t>
+              <w:t xml:space="preserve">18,104</w:t>
+            </w:r>
+          </w:p>
+        </w:tc>
+        <w:tc>
+          <w:tcPr/>
+          <w:p>
+            <w:pPr>
+              <w:pStyle w:val="Compact"/>
+              <w:jc w:val="right"/>
+            </w:pPr>
+            <w:r>
+              <w:t xml:space="preserve">175,626</w:t>
+            </w:r>
+          </w:p>
+        </w:tc>
+        <w:tc>
+          <w:tcPr/>
+          <w:p>
+            <w:pPr>
+              <w:pStyle w:val="Compact"/>
+              <w:jc w:val="right"/>
+            </w:pPr>
+            <w:r>
+              <w:t xml:space="preserve">2,354,961</w:t>
+            </w:r>
+          </w:p>
+        </w:tc>
+        <w:tc>
+          <w:tcPr/>
+          <w:p>
+            <w:pPr>
+              <w:pStyle w:val="Compact"/>
+              <w:jc w:val="right"/>
+            </w:pPr>
+            <w:r>
+              <w:t xml:space="preserve">113,128.7747</w:t>
             </w:r>
           </w:p>
         </w:tc>
@@ -700,31 +700,31 @@
               <w:jc w:val="right"/>
             </w:pPr>
             <w:r>
-              <w:t xml:space="preserve">523,812</w:t>
-            </w:r>
-          </w:p>
-        </w:tc>
-        <w:tc>
-          <w:tcPr/>
-          <w:p>
-            <w:pPr>
-              <w:pStyle w:val="Compact"/>
-              <w:jc w:val="right"/>
-            </w:pPr>
-            <w:r>
-              <w:t xml:space="preserve">3,666,706</w:t>
-            </w:r>
-          </w:p>
-        </w:tc>
-        <w:tc>
-          <w:tcPr/>
-          <w:p>
-            <w:pPr>
-              <w:pStyle w:val="Compact"/>
-              <w:jc w:val="right"/>
-            </w:pPr>
-            <w:r>
-              <w:t xml:space="preserve">313,457.2660</w:t>
+              <w:t xml:space="preserve">523,957</w:t>
+            </w:r>
+          </w:p>
+        </w:tc>
+        <w:tc>
+          <w:tcPr/>
+          <w:p>
+            <w:pPr>
+              <w:pStyle w:val="Compact"/>
+              <w:jc w:val="right"/>
+            </w:pPr>
+            <w:r>
+              <w:t xml:space="preserve">3,666,851</w:t>
+            </w:r>
+          </w:p>
+        </w:tc>
+        <w:tc>
+          <w:tcPr/>
+          <w:p>
+            <w:pPr>
+              <w:pStyle w:val="Compact"/>
+              <w:jc w:val="right"/>
+            </w:pPr>
+            <w:r>
+              <w:t xml:space="preserve">313,548.7414</w:t>
             </w:r>
           </w:p>
         </w:tc>
@@ -773,31 +773,31 @@
               <w:jc w:val="right"/>
             </w:pPr>
             <w:r>
-              <w:t xml:space="preserve">834,596</w:t>
-            </w:r>
-          </w:p>
-        </w:tc>
-        <w:tc>
-          <w:tcPr/>
-          <w:p>
-            <w:pPr>
-              <w:pStyle w:val="Compact"/>
-              <w:jc w:val="right"/>
-            </w:pPr>
-            <w:r>
-              <w:t xml:space="preserve">7,226,732</w:t>
-            </w:r>
-          </w:p>
-        </w:tc>
-        <w:tc>
-          <w:tcPr/>
-          <w:p>
-            <w:pPr>
-              <w:pStyle w:val="Compact"/>
-              <w:jc w:val="right"/>
-            </w:pPr>
-            <w:r>
-              <w:t xml:space="preserve">503,412.6355</w:t>
+              <w:t xml:space="preserve">841,099</w:t>
+            </w:r>
+          </w:p>
+        </w:tc>
+        <w:tc>
+          <w:tcPr/>
+          <w:p>
+            <w:pPr>
+              <w:pStyle w:val="Compact"/>
+              <w:jc w:val="right"/>
+            </w:pPr>
+            <w:r>
+              <w:t xml:space="preserve">7,233,235</w:t>
+            </w:r>
+          </w:p>
+        </w:tc>
+        <w:tc>
+          <w:tcPr/>
+          <w:p>
+            <w:pPr>
+              <w:pStyle w:val="Compact"/>
+              <w:jc w:val="right"/>
+            </w:pPr>
+            <w:r>
+              <w:t xml:space="preserve">507,442.7659</w:t>
             </w:r>
           </w:p>
         </w:tc>
@@ -846,31 +846,31 @@
               <w:jc w:val="right"/>
             </w:pPr>
             <w:r>
-              <w:t xml:space="preserve">1,498,236</w:t>
-            </w:r>
-          </w:p>
-        </w:tc>
-        <w:tc>
-          <w:tcPr/>
-          <w:p>
-            <w:pPr>
-              <w:pStyle w:val="Compact"/>
-              <w:jc w:val="right"/>
-            </w:pPr>
-            <w:r>
-              <w:t xml:space="preserve">12,230,824</w:t>
-            </w:r>
-          </w:p>
-        </w:tc>
-        <w:tc>
-          <w:tcPr/>
-          <w:p>
-            <w:pPr>
-              <w:pStyle w:val="Compact"/>
-              <w:jc w:val="right"/>
-            </w:pPr>
-            <w:r>
-              <w:t xml:space="preserve">838,732.0079</w:t>
+              <w:t xml:space="preserve">1,529,638</w:t>
+            </w:r>
+          </w:p>
+        </w:tc>
+        <w:tc>
+          <w:tcPr/>
+          <w:p>
+            <w:pPr>
+              <w:pStyle w:val="Compact"/>
+              <w:jc w:val="right"/>
+            </w:pPr>
+            <w:r>
+              <w:t xml:space="preserve">12,262,226</w:t>
+            </w:r>
+          </w:p>
+        </w:tc>
+        <w:tc>
+          <w:tcPr/>
+          <w:p>
+            <w:pPr>
+              <w:pStyle w:val="Compact"/>
+              <w:jc w:val="right"/>
+            </w:pPr>
+            <w:r>
+              <w:t xml:space="preserve">858,208.6841</w:t>
             </w:r>
           </w:p>
         </w:tc>
@@ -919,31 +919,31 @@
               <w:jc w:val="right"/>
             </w:pPr>
             <w:r>
-              <w:t xml:space="preserve">2,089,586</w:t>
-            </w:r>
-          </w:p>
-        </w:tc>
-        <w:tc>
-          <w:tcPr/>
-          <w:p>
-            <w:pPr>
-              <w:pStyle w:val="Compact"/>
-              <w:jc w:val="right"/>
-            </w:pPr>
-            <w:r>
-              <w:t xml:space="preserve">13,126,621</w:t>
-            </w:r>
-          </w:p>
-        </w:tc>
-        <w:tc>
-          <w:tcPr/>
-          <w:p>
-            <w:pPr>
-              <w:pStyle w:val="Compact"/>
-              <w:jc w:val="right"/>
-            </w:pPr>
-            <w:r>
-              <w:t xml:space="preserve">1,484,528.4319</w:t>
+              <w:t xml:space="preserve">2,204,854</w:t>
+            </w:r>
+          </w:p>
+        </w:tc>
+        <w:tc>
+          <w:tcPr/>
+          <w:p>
+            <w:pPr>
+              <w:pStyle w:val="Compact"/>
+              <w:jc w:val="right"/>
+            </w:pPr>
+            <w:r>
+              <w:t xml:space="preserve">13,241,889</w:t>
+            </w:r>
+          </w:p>
+        </w:tc>
+        <w:tc>
+          <w:tcPr/>
+          <w:p>
+            <w:pPr>
+              <w:pStyle w:val="Compact"/>
+              <w:jc w:val="right"/>
+            </w:pPr>
+            <w:r>
+              <w:t xml:space="preserve">1,556,485.0588</w:t>
             </w:r>
           </w:p>
         </w:tc>
@@ -992,7 +992,7 @@
                 <w:b/>
                 <w:bCs/>
               </w:rPr>
-              <w:t xml:space="preserve">623,835</w:t>
+              <w:t xml:space="preserve">623,920</w:t>
             </w:r>
           </w:p>
         </w:tc>
@@ -1008,7 +1008,7 @@
                 <w:b/>
                 <w:bCs/>
               </w:rPr>
-              <w:t xml:space="preserve">5,181,790</w:t>
+              <w:t xml:space="preserve">5,354,319</w:t>
             </w:r>
           </w:p>
         </w:tc>
@@ -1024,7 +1024,7 @@
                 <w:b/>
                 <w:bCs/>
               </w:rPr>
-              <w:t xml:space="preserve">39,654,551</w:t>
+              <w:t xml:space="preserve">39,827,165</w:t>
             </w:r>
           </w:p>
         </w:tc>
@@ -1040,7 +1040,7 @@
                 <w:b/>
                 <w:bCs/>
               </w:rPr>
-              <w:t xml:space="preserve">3,293,990.8717</w:t>
+              <w:t xml:space="preserve">3,401,456.1214</w:t>
             </w:r>
           </w:p>
         </w:tc>
@@ -1055,10 +1055,10 @@
           <w:b/>
           <w:bCs/>
         </w:rPr>
-        <w:t xml:space="preserve">Cumulative score 49.9589%</w:t>
-      </w:r>
-      <w:r>
-        <w:t xml:space="preserve">: the sum of the increases you awarded (1.659986%, 10.730988%, 14.901054%, 4.130718%) plus this round's 18.5362%, as your update log of 2026-08-18 defines it. Round 1 is held out: awarded on records, before the equivalent-English metric.</w:t>
+        <w:t xml:space="preserve">Cumulative score 50.5637%</w:t>
+      </w:r>
+      <w:r>
+        <w:t xml:space="preserve">: the sum of the increases you awarded (1.659986%, 10.730988%, 14.901054%, 4.130718%) plus this round's 19.1409%, as your update log of 2026-08-18 defines it. Round 1 is held out: awarded on records, before the equivalent-English metric.</w:t>
       </w:r>
     </w:p>
     <w:bookmarkEnd w:id="9"/>
@@ -1146,7 +1146,7 @@
           <w:b/>
           <w:bCs/>
         </w:rPr>
-        <w:t xml:space="preserve">Domain-wide CDX sweeps over subdomain platforms: 867,321 EE, 1,142,228</w:t>
+        <w:t xml:space="preserve">Domain-wide CDX sweeps over subdomain platforms: 962,876 EE, 1,295,546</w:t>
       </w:r>
       <w:r>
         <w:rPr>
@@ -1248,7 +1248,7 @@
           <w:b/>
           <w:bCs/>
         </w:rPr>
-        <w:t xml:space="preserve">Registrable domains, the prioritized unit: 328,715.1485 EE, 623,835 records.</w:t>
+        <w:t xml:space="preserve">Registrable domains, the prioritized unit: 328,764.8318 EE, 623,920 records.</w:t>
       </w:r>
       <w:r>
         <w:t xml:space="preserve"> </w:t>
@@ -1272,7 +1272,7 @@
         <w:t xml:space="preserve"> </w:t>
       </w:r>
       <w:r>
-        <w:t xml:space="preserve">(71,388) and 20 small dated artifacts (40,293). 46,116 of</w:t>
+        <w:t xml:space="preserve">(71,388) and 21 small dated artifacts (40,343). 46,148 of</w:t>
       </w:r>
       <w:r>
         <w:t xml:space="preserve"> </w:t>
@@ -1464,19 +1464,19 @@
               <w:jc w:val="right"/>
             </w:pPr>
             <w:r>
-              <w:t xml:space="preserve">1,142,228</w:t>
-            </w:r>
-          </w:p>
-        </w:tc>
-        <w:tc>
-          <w:tcPr/>
-          <w:p>
-            <w:pPr>
-              <w:pStyle w:val="Compact"/>
-              <w:jc w:val="right"/>
-            </w:pPr>
-            <w:r>
-              <w:t xml:space="preserve">867,321</w:t>
+              <w:t xml:space="preserve">1,295,546</w:t>
+            </w:r>
+          </w:p>
+        </w:tc>
+        <w:tc>
+          <w:tcPr/>
+          <w:p>
+            <w:pPr>
+              <w:pStyle w:val="Compact"/>
+              <w:jc w:val="right"/>
+            </w:pPr>
+            <w:r>
+              <w:t xml:space="preserve">962,876</w:t>
             </w:r>
           </w:p>
         </w:tc>
@@ -1767,7 +1767,7 @@
               <w:pStyle w:val="Compact"/>
             </w:pPr>
             <w:r>
-              <w:t xml:space="preserve">22 further sources</w:t>
+              <w:t xml:space="preserve">24 further sources</w:t>
             </w:r>
           </w:p>
         </w:tc>
@@ -1825,19 +1825,19 @@
               <w:jc w:val="right"/>
             </w:pPr>
             <w:r>
-              <w:t xml:space="preserve">98,058</w:t>
-            </w:r>
-          </w:p>
-        </w:tc>
-        <w:tc>
-          <w:tcPr/>
-          <w:p>
-            <w:pPr>
-              <w:pStyle w:val="Compact"/>
-              <w:jc w:val="right"/>
-            </w:pPr>
-            <w:r>
-              <w:t xml:space="preserve">60,560</w:t>
+              <w:t xml:space="preserve">117,354</w:t>
+            </w:r>
+          </w:p>
+        </w:tc>
+        <w:tc>
+          <w:tcPr/>
+          <w:p>
+            <w:pPr>
+              <w:pStyle w:val="Compact"/>
+              <w:jc w:val="right"/>
+            </w:pPr>
+            <w:r>
+              <w:t xml:space="preserve">72,470</w:t>
             </w:r>
           </w:p>
         </w:tc>
@@ -1886,7 +1886,7 @@
                 <w:b/>
                 <w:bCs/>
               </w:rPr>
-              <w:t xml:space="preserve">5,805,625</w:t>
+              <w:t xml:space="preserve">5,978,239</w:t>
             </w:r>
           </w:p>
         </w:tc>
@@ -1902,7 +1902,7 @@
                 <w:b/>
                 <w:bCs/>
               </w:rPr>
-              <w:t xml:space="preserve">3,293,991</w:t>
+              <w:t xml:space="preserve">3,401,456</w:t>
             </w:r>
           </w:p>
         </w:tc>
@@ -1967,7 +1967,7 @@
         <w:t xml:space="preserve"> </w:t>
       </w:r>
       <w:r>
-        <w:t xml:space="preserve">92.3% of the hostnames are</w:t>
+        <w:t xml:space="preserve">90.6% of the hostnames are</w:t>
       </w:r>
       <w:r>
         <w:t xml:space="preserve"> </w:t>
@@ -2233,7 +2233,7 @@
           <w:b/>
           <w:bCs/>
         </w:rPr>
-        <w:t xml:space="preserve">2,419,546 domains carry no year evidence</w:t>
+        <w:t xml:space="preserve">2,419,541 domains carry no year evidence</w:t>
       </w:r>
       <w:r>
         <w:t xml:space="preserve"> </w:t>
@@ -2442,10 +2442,25 @@
           <w:b/>
           <w:bCs/>
         </w:rPr>
-        <w:t xml:space="preserve">Saturation ledger</w:t>
-      </w:r>
-      <w:r>
-        <w:t xml:space="preserve">, as your 0831 update asks:</w:t>
+        <w:t xml:space="preserve">The first find admitted under that rule is a column this project had discarded on purpose.</w:t>
+      </w:r>
+      <w:r>
+        <w:t xml:space="preserve"> </w:t>
+      </w:r>
+      <w:r>
+        <w:t xml:space="preserve">A registry zone file is two hostname corpora: the owner of an NS record is the delegation, the</w:t>
+      </w:r>
+      <w:r>
+        <w:t xml:space="preserve"> </w:t>
+      </w:r>
+      <w:r>
+        <w:t xml:space="preserve">right-hand side is the nameserver serving it. At registrable grain the right-hand side was</w:t>
+      </w:r>
+      <w:r>
+        <w:t xml:space="preserve"> </w:t>
+      </w:r>
+      <w:r>
+        <w:t xml:space="preserve">measured and closed at 63 pairs, because</w:t>
       </w:r>
       <w:r>
         <w:t xml:space="preserve"> </w:t>
@@ -2454,16 +2469,97 @@
         <w:rPr>
           <w:rStyle w:val="VerbatimChar"/>
         </w:rPr>
-        <w:t xml:space="preserve">audit/source_saturation_ledger.csv</w:t>
-      </w:r>
-      <w:r>
-        <w:t xml:space="preserve">, one row</w:t>
-      </w:r>
-      <w:r>
-        <w:t xml:space="preserve"> </w:t>
-      </w:r>
-      <w:r>
-        <w:t xml:space="preserve">per source family and version.</w:t>
+        <w:t xml:space="preserve">ns1.psi.net</w:t>
+      </w:r>
+      <w:r>
+        <w:t xml:space="preserve"> </w:t>
+      </w:r>
+      <w:r>
+        <w:t xml:space="preserve">collapses to an operator every crawl</w:t>
+      </w:r>
+      <w:r>
+        <w:t xml:space="preserve"> </w:t>
+      </w:r>
+      <w:r>
+        <w:t xml:space="preserve">holds. At hostname grain the same 21,498 hosts in the 1997 InterNIC</w:t>
+      </w:r>
+      <w:r>
+        <w:t xml:space="preserve"> </w:t>
+      </w:r>
+      <w:r>
+        <w:rPr>
+          <w:rStyle w:val="VerbatimChar"/>
+        </w:rPr>
+        <w:t xml:space="preserve">org</w:t>
+      </w:r>
+      <w:r>
+        <w:t xml:space="preserve">,</w:t>
+      </w:r>
+      <w:r>
+        <w:t xml:space="preserve"> </w:t>
+      </w:r>
+      <w:r>
+        <w:rPr>
+          <w:rStyle w:val="VerbatimChar"/>
+        </w:rPr>
+        <w:t xml:space="preserve">edu</w:t>
+      </w:r>
+      <w:r>
+        <w:t xml:space="preserve">,</w:t>
+      </w:r>
+      <w:r>
+        <w:t xml:space="preserve"> </w:t>
+      </w:r>
+      <w:r>
+        <w:rPr>
+          <w:rStyle w:val="VerbatimChar"/>
+        </w:rPr>
+        <w:t xml:space="preserve">gov</w:t>
+      </w:r>
+      <w:r>
+        <w:t xml:space="preserve">,</w:t>
+      </w:r>
+      <w:r>
+        <w:t xml:space="preserve"> </w:t>
+      </w:r>
+      <w:r>
+        <w:rPr>
+          <w:rStyle w:val="VerbatimChar"/>
+        </w:rPr>
+        <w:t xml:space="preserve">mil</w:t>
+      </w:r>
+      <w:r>
+        <w:t xml:space="preserve">,</w:t>
+      </w:r>
+      <w:r>
+        <w:t xml:space="preserve"> </w:t>
+      </w:r>
+      <w:r>
+        <w:rPr>
+          <w:rStyle w:val="VerbatimChar"/>
+        </w:rPr>
+        <w:t xml:space="preserve">root</w:t>
+      </w:r>
+      <w:r>
+        <w:t xml:space="preserve"> </w:t>
+      </w:r>
+      <w:r>
+        <w:t xml:space="preserve">and</w:t>
+      </w:r>
+      <w:r>
+        <w:t xml:space="preserve"> </w:t>
+      </w:r>
+      <w:r>
+        <w:rPr>
+          <w:rStyle w:val="VerbatimChar"/>
+        </w:rPr>
+        <w:t xml:space="preserve">arpa</w:t>
+      </w:r>
+      <w:r>
+        <w:t xml:space="preserve"> </w:t>
+      </w:r>
+      <w:r>
+        <w:t xml:space="preserve">zones are 90% absent from both the store and your own 1997 file:</w:t>
       </w:r>
       <w:r>
         <w:t xml:space="preserve"> </w:t>
@@ -2473,7 +2569,90 @@
           <w:b/>
           <w:bCs/>
         </w:rPr>
-        <w:t xml:space="preserve">465 source families searched and recorded</w:t>
+        <w:t xml:space="preserve">19,211 records and 11,860.7 EE</w:t>
+      </w:r>
+      <w:r>
+        <w:t xml:space="preserve">, dated by the SOA serial</w:t>
+      </w:r>
+      <w:r>
+        <w:t xml:space="preserve"> </w:t>
+      </w:r>
+      <w:r>
+        <w:rPr>
+          <w:rStyle w:val="VerbatimChar"/>
+        </w:rPr>
+        <w:t xml:space="preserve">1997041800</w:t>
+      </w:r>
+      <w:r>
+        <w:t xml:space="preserve"> </w:t>
+      </w:r>
+      <w:r>
+        <w:t xml:space="preserve">inside the payload, no</w:t>
+      </w:r>
+      <w:r>
+        <w:t xml:space="preserve"> </w:t>
+      </w:r>
+      <w:r>
+        <w:t xml:space="preserve">new request. The lens it opens: nameservers, mail exchangers and mirrors are the hosts a web</w:t>
+      </w:r>
+      <w:r>
+        <w:t xml:space="preserve"> </w:t>
+      </w:r>
+      <w:r>
+        <w:t xml:space="preserve">crawler never fetches, so DNS-side and mail-side artifacts over held registrables are the</w:t>
+      </w:r>
+      <w:r>
+        <w:t xml:space="preserve"> </w:t>
+      </w:r>
+      <w:r>
+        <w:t xml:space="preserve">hostname unit's natural source even where their registrables are saturated.</w:t>
+      </w:r>
+    </w:p>
+    <w:p>
+      <w:pPr>
+        <w:pStyle w:val="Compact"/>
+        <w:numPr>
+          <w:ilvl w:val="0"/>
+          <w:numId w:val="1003"/>
+        </w:numPr>
+      </w:pPr>
+      <w:r>
+        <w:rPr>
+          <w:b/>
+          <w:bCs/>
+        </w:rPr>
+        <w:t xml:space="preserve">Saturation ledger</w:t>
+      </w:r>
+      <w:r>
+        <w:t xml:space="preserve">, as your 0831 update asks:</w:t>
+      </w:r>
+      <w:r>
+        <w:t xml:space="preserve"> </w:t>
+      </w:r>
+      <w:r>
+        <w:rPr>
+          <w:rStyle w:val="VerbatimChar"/>
+        </w:rPr>
+        <w:t xml:space="preserve">audit/source_saturation_ledger.csv</w:t>
+      </w:r>
+      <w:r>
+        <w:t xml:space="preserve">, one row</w:t>
+      </w:r>
+      <w:r>
+        <w:t xml:space="preserve"> </w:t>
+      </w:r>
+      <w:r>
+        <w:t xml:space="preserve">per source family and version.</w:t>
+      </w:r>
+      <w:r>
+        <w:t xml:space="preserve"> </w:t>
+      </w:r>
+      <w:r>
+        <w:rPr>
+          <w:b/>
+          <w:bCs/>
+        </w:rPr>
+        <w:t xml:space="preserve">471 source families searched and recorded</w:t>
       </w:r>
       <w:r>
         <w:t xml:space="preserve"> </w:t>
@@ -2491,7 +2670,7 @@
         <w:t xml:space="preserve">sources.md</w:t>
       </w:r>
       <w:r>
-        <w:t xml:space="preserve">: 60 developed, 405 evaluated and closed with the measurement that closed them, so the same ground is not broken twice.</w:t>
+        <w:t xml:space="preserve">: 61 developed, 410 evaluated and closed with the measurement that closed them, so the same ground is not broken twice.</w:t>
       </w:r>
     </w:p>
     <w:p>
@@ -2834,7 +3013,7 @@
                 <w:b/>
                 <w:bCs/>
               </w:rPr>
-              <w:t xml:space="preserve">5,805,625</w:t>
+              <w:t xml:space="preserve">5,978,239</w:t>
             </w:r>
           </w:p>
         </w:tc>
@@ -2850,7 +3029,7 @@
                 <w:b/>
                 <w:bCs/>
               </w:rPr>
-              <w:t xml:space="preserve">3,293,990.8717</w:t>
+              <w:t xml:space="preserve">3,401,456.1214</w:t>
             </w:r>
           </w:p>
         </w:tc>
@@ -2875,19 +3054,19 @@
               <w:jc w:val="right"/>
             </w:pPr>
             <w:r>
-              <w:t xml:space="preserve">39,654,551</w:t>
-            </w:r>
-          </w:p>
-        </w:tc>
-        <w:tc>
-          <w:tcPr/>
-          <w:p>
-            <w:pPr>
-              <w:pStyle w:val="Compact"/>
-              <w:jc w:val="right"/>
-            </w:pPr>
-            <w:r>
-              <w:t xml:space="preserve">21,064,579.7743</w:t>
+              <w:t xml:space="preserve">39,827,165</w:t>
+            </w:r>
+          </w:p>
+        </w:tc>
+        <w:tc>
+          <w:tcPr/>
+          <w:p>
+            <w:pPr>
+              <w:pStyle w:val="Compact"/>
+              <w:jc w:val="right"/>
+            </w:pPr>
+            <w:r>
+              <w:t xml:space="preserve">21,172,045.0240</w:t>
             </w:r>
           </w:p>
         </w:tc>
@@ -2915,7 +3094,7 @@
         <w:t xml:space="preserve">0 records</w:t>
       </w:r>
       <w:r>
-        <w:t xml:space="preserve">, so all 5,805,625 submitted count once; the two unit files are disjoint in every year.</w:t>
+        <w:t xml:space="preserve">, so all 5,978,239 submitted count once; the two unit files are disjoint in every year.</w:t>
       </w:r>
     </w:p>
     <w:p>

</xml_diff>

<commit_message>
Ship the research loop's own files in the archive beside the code snapshot
</commit_message>
<xml_diff>
--- a/docs/report.docx
+++ b/docs/report.docx
@@ -3467,7 +3467,19 @@
               <w:t xml:space="preserve"> </w:t>
             </w:r>
             <w:r>
-              <w:t xml:space="preserve">names what every command prints</w:t>
+              <w:t xml:space="preserve">names what every command prints. The research loop of section 4 is</w:t>
+            </w:r>
+            <w:r>
+              <w:t xml:space="preserve"> </w:t>
+            </w:r>
+            <w:r>
+              <w:rPr>
+                <w:rStyle w:val="VerbatimChar"/>
+              </w:rPr>
+              <w:t xml:space="preserve">source/fleet.tar.gz</w:t>
+            </w:r>
+            <w:r>
+              <w:t xml:space="preserve">: workflows, prompts, policy and the hypothesis register with every verdict</w:t>
             </w:r>
           </w:p>
         </w:tc>

</xml_diff>

<commit_message>
Bring the CDX notes up to the page-size measurement and name the suffix namespaces as headroom
</commit_message>
<xml_diff>
--- a/docs/report.docx
+++ b/docs/report.docx
@@ -130,7 +130,7 @@
                 <w:b/>
                 <w:bCs/>
               </w:rPr>
-              <w:t xml:space="preserve">5,978,239</w:t>
+              <w:t xml:space="preserve">6,020,366</w:t>
             </w:r>
             <w:r>
               <w:t xml:space="preserve"> </w:t>
@@ -165,7 +165,7 @@
                 <w:b/>
                 <w:bCs/>
               </w:rPr>
-              <w:t xml:space="preserve">3,401,456.1214</w:t>
+              <w:t xml:space="preserve">3,427,607.1175</w:t>
             </w:r>
           </w:p>
         </w:tc>
@@ -194,7 +194,7 @@
                 <w:b/>
                 <w:bCs/>
               </w:rPr>
-              <w:t xml:space="preserve">19.1409%</w:t>
+              <w:t xml:space="preserve">19.2881%</w:t>
             </w:r>
           </w:p>
         </w:tc>
@@ -388,31 +388,31 @@
               <w:jc w:val="right"/>
             </w:pPr>
             <w:r>
-              <w:t xml:space="preserve">5,354,319</w:t>
-            </w:r>
-          </w:p>
-        </w:tc>
-        <w:tc>
-          <w:tcPr/>
-          <w:p>
-            <w:pPr>
-              <w:pStyle w:val="Compact"/>
-              <w:jc w:val="right"/>
-            </w:pPr>
-            <w:r>
-              <w:t xml:space="preserve">3,072,691.2896</w:t>
-            </w:r>
-          </w:p>
-        </w:tc>
-        <w:tc>
-          <w:tcPr/>
-          <w:p>
-            <w:pPr>
-              <w:pStyle w:val="Compact"/>
-              <w:jc w:val="right"/>
-            </w:pPr>
-            <w:r>
-              <w:t xml:space="preserve">17.2909%</w:t>
+              <w:t xml:space="preserve">5,396,446</w:t>
+            </w:r>
+          </w:p>
+        </w:tc>
+        <w:tc>
+          <w:tcPr/>
+          <w:p>
+            <w:pPr>
+              <w:pStyle w:val="Compact"/>
+              <w:jc w:val="right"/>
+            </w:pPr>
+            <w:r>
+              <w:t xml:space="preserve">3,098,842.2857</w:t>
+            </w:r>
+          </w:p>
+        </w:tc>
+        <w:tc>
+          <w:tcPr/>
+          <w:p>
+            <w:pPr>
+              <w:pStyle w:val="Compact"/>
+              <w:jc w:val="right"/>
+            </w:pPr>
+            <w:r>
+              <w:t xml:space="preserve">17.4380%</w:t>
             </w:r>
           </w:p>
         </w:tc>
@@ -773,31 +773,31 @@
               <w:jc w:val="right"/>
             </w:pPr>
             <w:r>
-              <w:t xml:space="preserve">841,099</w:t>
-            </w:r>
-          </w:p>
-        </w:tc>
-        <w:tc>
-          <w:tcPr/>
-          <w:p>
-            <w:pPr>
-              <w:pStyle w:val="Compact"/>
-              <w:jc w:val="right"/>
-            </w:pPr>
-            <w:r>
-              <w:t xml:space="preserve">7,233,235</w:t>
-            </w:r>
-          </w:p>
-        </w:tc>
-        <w:tc>
-          <w:tcPr/>
-          <w:p>
-            <w:pPr>
-              <w:pStyle w:val="Compact"/>
-              <w:jc w:val="right"/>
-            </w:pPr>
-            <w:r>
-              <w:t xml:space="preserve">507,442.7659</w:t>
+              <w:t xml:space="preserve">841,100</w:t>
+            </w:r>
+          </w:p>
+        </w:tc>
+        <w:tc>
+          <w:tcPr/>
+          <w:p>
+            <w:pPr>
+              <w:pStyle w:val="Compact"/>
+              <w:jc w:val="right"/>
+            </w:pPr>
+            <w:r>
+              <w:t xml:space="preserve">7,233,236</w:t>
+            </w:r>
+          </w:p>
+        </w:tc>
+        <w:tc>
+          <w:tcPr/>
+          <w:p>
+            <w:pPr>
+              <w:pStyle w:val="Compact"/>
+              <w:jc w:val="right"/>
+            </w:pPr>
+            <w:r>
+              <w:t xml:space="preserve">507,443.2189</w:t>
             </w:r>
           </w:p>
         </w:tc>
@@ -846,31 +846,31 @@
               <w:jc w:val="right"/>
             </w:pPr>
             <w:r>
-              <w:t xml:space="preserve">1,529,638</w:t>
-            </w:r>
-          </w:p>
-        </w:tc>
-        <w:tc>
-          <w:tcPr/>
-          <w:p>
-            <w:pPr>
-              <w:pStyle w:val="Compact"/>
-              <w:jc w:val="right"/>
-            </w:pPr>
-            <w:r>
-              <w:t xml:space="preserve">12,262,226</w:t>
-            </w:r>
-          </w:p>
-        </w:tc>
-        <w:tc>
-          <w:tcPr/>
-          <w:p>
-            <w:pPr>
-              <w:pStyle w:val="Compact"/>
-              <w:jc w:val="right"/>
-            </w:pPr>
-            <w:r>
-              <w:t xml:space="preserve">858,208.6841</w:t>
+              <w:t xml:space="preserve">1,532,153</w:t>
+            </w:r>
+          </w:p>
+        </w:tc>
+        <w:tc>
+          <w:tcPr/>
+          <w:p>
+            <w:pPr>
+              <w:pStyle w:val="Compact"/>
+              <w:jc w:val="right"/>
+            </w:pPr>
+            <w:r>
+              <w:t xml:space="preserve">12,264,741</w:t>
+            </w:r>
+          </w:p>
+        </w:tc>
+        <w:tc>
+          <w:tcPr/>
+          <w:p>
+            <w:pPr>
+              <w:pStyle w:val="Compact"/>
+              <w:jc w:val="right"/>
+            </w:pPr>
+            <w:r>
+              <w:t xml:space="preserve">859,744.1483</w:t>
             </w:r>
           </w:p>
         </w:tc>
@@ -919,31 +919,31 @@
               <w:jc w:val="right"/>
             </w:pPr>
             <w:r>
-              <w:t xml:space="preserve">2,204,854</w:t>
-            </w:r>
-          </w:p>
-        </w:tc>
-        <w:tc>
-          <w:tcPr/>
-          <w:p>
-            <w:pPr>
-              <w:pStyle w:val="Compact"/>
-              <w:jc w:val="right"/>
-            </w:pPr>
-            <w:r>
-              <w:t xml:space="preserve">13,241,889</w:t>
-            </w:r>
-          </w:p>
-        </w:tc>
-        <w:tc>
-          <w:tcPr/>
-          <w:p>
-            <w:pPr>
-              <w:pStyle w:val="Compact"/>
-              <w:jc w:val="right"/>
-            </w:pPr>
-            <w:r>
-              <w:t xml:space="preserve">1,556,485.0588</w:t>
+              <w:t xml:space="preserve">2,244,465</w:t>
+            </w:r>
+          </w:p>
+        </w:tc>
+        <w:tc>
+          <w:tcPr/>
+          <w:p>
+            <w:pPr>
+              <w:pStyle w:val="Compact"/>
+              <w:jc w:val="right"/>
+            </w:pPr>
+            <w:r>
+              <w:t xml:space="preserve">13,281,500</w:t>
+            </w:r>
+          </w:p>
+        </w:tc>
+        <w:tc>
+          <w:tcPr/>
+          <w:p>
+            <w:pPr>
+              <w:pStyle w:val="Compact"/>
+              <w:jc w:val="right"/>
+            </w:pPr>
+            <w:r>
+              <w:t xml:space="preserve">1,581,100.1377</w:t>
             </w:r>
           </w:p>
         </w:tc>
@@ -1008,7 +1008,7 @@
                 <w:b/>
                 <w:bCs/>
               </w:rPr>
-              <w:t xml:space="preserve">5,354,319</w:t>
+              <w:t xml:space="preserve">5,396,446</w:t>
             </w:r>
           </w:p>
         </w:tc>
@@ -1024,7 +1024,7 @@
                 <w:b/>
                 <w:bCs/>
               </w:rPr>
-              <w:t xml:space="preserve">39,827,165</w:t>
+              <w:t xml:space="preserve">39,869,292</w:t>
             </w:r>
           </w:p>
         </w:tc>
@@ -1040,7 +1040,7 @@
                 <w:b/>
                 <w:bCs/>
               </w:rPr>
-              <w:t xml:space="preserve">3,401,456.1214</w:t>
+              <w:t xml:space="preserve">3,427,607.1175</w:t>
             </w:r>
           </w:p>
         </w:tc>
@@ -1055,10 +1055,10 @@
           <w:b/>
           <w:bCs/>
         </w:rPr>
-        <w:t xml:space="preserve">Cumulative score 50.5637%</w:t>
-      </w:r>
-      <w:r>
-        <w:t xml:space="preserve">: the sum of the increases you awarded (1.659986%, 10.730988%, 14.901054%, 4.130718%) plus this round's 19.1409%, as your update log of 2026-08-18 defines it. Round 1 is held out: awarded on records, before the equivalent-English metric.</w:t>
+        <w:t xml:space="preserve">Cumulative score 50.7108%</w:t>
+      </w:r>
+      <w:r>
+        <w:t xml:space="preserve">: the sum of the increases you awarded (1.659986%, 10.730988%, 14.901054%, 4.130718%) plus this round's 19.2881%, as your update log of 2026-08-18 defines it. Round 1 is held out: awarded on records, before the equivalent-English metric.</w:t>
       </w:r>
     </w:p>
     <w:bookmarkEnd w:id="9"/>
@@ -1146,7 +1146,7 @@
           <w:b/>
           <w:bCs/>
         </w:rPr>
-        <w:t xml:space="preserve">Domain-wide CDX sweeps over subdomain platforms: 962,876 EE, 1,295,546</w:t>
+        <w:t xml:space="preserve">Domain-wide CDX sweeps over subdomain platforms: 989,027 EE, 1,337,673</w:t>
       </w:r>
       <w:r>
         <w:rPr>
@@ -1464,19 +1464,19 @@
               <w:jc w:val="right"/>
             </w:pPr>
             <w:r>
-              <w:t xml:space="preserve">1,295,546</w:t>
-            </w:r>
-          </w:p>
-        </w:tc>
-        <w:tc>
-          <w:tcPr/>
-          <w:p>
-            <w:pPr>
-              <w:pStyle w:val="Compact"/>
-              <w:jc w:val="right"/>
-            </w:pPr>
-            <w:r>
-              <w:t xml:space="preserve">962,876</w:t>
+              <w:t xml:space="preserve">1,337,673</w:t>
+            </w:r>
+          </w:p>
+        </w:tc>
+        <w:tc>
+          <w:tcPr/>
+          <w:p>
+            <w:pPr>
+              <w:pStyle w:val="Compact"/>
+              <w:jc w:val="right"/>
+            </w:pPr>
+            <w:r>
+              <w:t xml:space="preserve">989,027</w:t>
             </w:r>
           </w:p>
         </w:tc>
@@ -1886,7 +1886,7 @@
                 <w:b/>
                 <w:bCs/>
               </w:rPr>
-              <w:t xml:space="preserve">5,978,239</w:t>
+              <w:t xml:space="preserve">6,020,366</w:t>
             </w:r>
           </w:p>
         </w:tc>
@@ -1902,7 +1902,7 @@
                 <w:b/>
                 <w:bCs/>
               </w:rPr>
-              <w:t xml:space="preserve">3,401,456</w:t>
+              <w:t xml:space="preserve">3,427,607</w:t>
             </w:r>
           </w:p>
         </w:tc>
@@ -1967,7 +1967,7 @@
         <w:t xml:space="preserve"> </w:t>
       </w:r>
       <w:r>
-        <w:t xml:space="preserve">90.6% of the hostnames are</w:t>
+        <w:t xml:space="preserve">90.3% of the hostnames are</w:t>
       </w:r>
       <w:r>
         <w:t xml:space="preserve"> </w:t>
@@ -2774,7 +2774,7 @@
         <w:t xml:space="preserve"> </w:t>
       </w:r>
       <w:r>
-        <w:t xml:space="preserve">Domain-wide sweeps at 200 rows a page write raw</w:t>
+        <w:t xml:space="preserve">Domain-wide sweeps write raw</w:t>
       </w:r>
       <w:r>
         <w:t xml:space="preserve"> </w:t>
@@ -2789,13 +2789,13 @@
         <w:t xml:space="preserve"> </w:t>
       </w:r>
       <w:r>
-        <w:t xml:space="preserve">journals, so the same bytes</w:t>
-      </w:r>
-      <w:r>
-        <w:t xml:space="preserve"> </w:t>
-      </w:r>
-      <w:r>
-        <w:t xml:space="preserve">can be re-read under a new rule, which is what paid this round.</w:t>
+        <w:t xml:space="preserve">journals, so the same bytes can be re-read</w:t>
+      </w:r>
+      <w:r>
+        <w:t xml:space="preserve"> </w:t>
+      </w:r>
+      <w:r>
+        <w:t xml:space="preserve">under a new rule, which is what paid this round.</w:t>
       </w:r>
     </w:p>
     <w:p>
@@ -2807,28 +2807,37 @@
         </w:numPr>
       </w:pPr>
       <w:r>
-        <w:t xml:space="preserve">Errors met and handled: HTTP 400 past the last page ends a sweep cleanly; a page-count timeout on</w:t>
-      </w:r>
-      <w:r>
-        <w:t xml:space="preserve"> </w:t>
-      </w:r>
-      <w:r>
-        <w:rPr>
-          <w:rStyle w:val="VerbatimChar"/>
-        </w:rPr>
-        <w:t xml:space="preserve">cjb.net</w:t>
-      </w:r>
-      <w:r>
-        <w:t xml:space="preserve"> </w:t>
-      </w:r>
-      <w:r>
-        <w:t xml:space="preserve">left that parent ledgered incomplete and resumable; transport failures retry with a</w:t>
-      </w:r>
-      <w:r>
-        <w:t xml:space="preserve"> </w:t>
-      </w:r>
-      <w:r>
-        <w:t xml:space="preserve">widening delay.</w:t>
+        <w:t xml:space="preserve">Measured on</w:t>
+      </w:r>
+      <w:r>
+        <w:t xml:space="preserve"> </w:t>
+      </w:r>
+      <w:r>
+        <w:rPr>
+          <w:rStyle w:val="VerbatimChar"/>
+        </w:rPr>
+        <w:t xml:space="preserve">co.uk</w:t>
+      </w:r>
+      <w:r>
+        <w:t xml:space="preserve">: a CDX page costs about the same at 200 index blocks as at 10,000 (11 to</w:t>
+      </w:r>
+      <w:r>
+        <w:t xml:space="preserve"> </w:t>
+      </w:r>
+      <w:r>
+        <w:t xml:space="preserve">42 s against 110 s), so the sweep now walks 10,000-block pages and asks the page count up</w:t>
+      </w:r>
+      <w:r>
+        <w:t xml:space="preserve"> </w:t>
+      </w:r>
+      <w:r>
+        <w:t xml:space="preserve">front. An archive outage refused thirteen parents on their control probe; they were requeued,</w:t>
+      </w:r>
+      <w:r>
+        <w:t xml:space="preserve"> </w:t>
+      </w:r>
+      <w:r>
+        <w:t xml:space="preserve">and a failed page is retried rather than skipped.</w:t>
       </w:r>
     </w:p>
     <w:bookmarkEnd w:id="13"/>
@@ -2860,19 +2869,106 @@
         <w:pStyle w:val="BodyText"/>
       </w:pPr>
       <w:r>
-        <w:t xml:space="preserve">Worth expanding, in order: the remaining ranked platforms, resumable from the ledger; every held</w:t>
-      </w:r>
-      <w:r>
-        <w:t xml:space="preserve"> </w:t>
-      </w:r>
-      <w:r>
-        <w:t xml:space="preserve">capture-bearing artifact re-read at hostname grain; registrable discovery by generated sibling</w:t>
-      </w:r>
-      <w:r>
-        <w:t xml:space="preserve"> </w:t>
-      </w:r>
-      <w:r>
-        <w:t xml:space="preserve">names and bracketed-gap CDX queries at its measured rate. Not worth more time, measured: prose</w:t>
+        <w:t xml:space="preserve">Worth expanding, in order: the remaining ranked platforms, resumable from the ledger; the</w:t>
+      </w:r>
+      <w:r>
+        <w:t xml:space="preserve"> </w:t>
+      </w:r>
+      <w:r>
+        <w:t xml:space="preserve">second-level suffix namespaces at hostname grain (</w:t>
+      </w:r>
+      <w:r>
+        <w:rPr>
+          <w:rStyle w:val="VerbatimChar"/>
+        </w:rPr>
+        <w:t xml:space="preserve">co.uk</w:t>
+      </w:r>
+      <w:r>
+        <w:t xml:space="preserve"> </w:t>
+      </w:r>
+      <w:r>
+        <w:t xml:space="preserve">alone is 3.39M index blocks and 1.2%</w:t>
+      </w:r>
+      <w:r>
+        <w:t xml:space="preserve"> </w:t>
+      </w:r>
+      <w:r>
+        <w:t xml:space="preserve">walked,</w:t>
+      </w:r>
+      <w:r>
+        <w:t xml:space="preserve"> </w:t>
+      </w:r>
+      <w:r>
+        <w:rPr>
+          <w:rStyle w:val="VerbatimChar"/>
+        </w:rPr>
+        <w:t xml:space="preserve">com.au</w:t>
+      </w:r>
+      <w:r>
+        <w:t xml:space="preserve">,</w:t>
+      </w:r>
+      <w:r>
+        <w:t xml:space="preserve"> </w:t>
+      </w:r>
+      <w:r>
+        <w:rPr>
+          <w:rStyle w:val="VerbatimChar"/>
+        </w:rPr>
+        <w:t xml:space="preserve">co.nz</w:t>
+      </w:r>
+      <w:r>
+        <w:t xml:space="preserve">,</w:t>
+      </w:r>
+      <w:r>
+        <w:t xml:space="preserve"> </w:t>
+      </w:r>
+      <w:r>
+        <w:rPr>
+          <w:rStyle w:val="VerbatimChar"/>
+        </w:rPr>
+        <w:t xml:space="preserve">org.uk</w:t>
+      </w:r>
+      <w:r>
+        <w:t xml:space="preserve">,</w:t>
+      </w:r>
+      <w:r>
+        <w:t xml:space="preserve"> </w:t>
+      </w:r>
+      <w:r>
+        <w:rPr>
+          <w:rStyle w:val="VerbatimChar"/>
+        </w:rPr>
+        <w:t xml:space="preserve">gov.uk</w:t>
+      </w:r>
+      <w:r>
+        <w:t xml:space="preserve">,</w:t>
+      </w:r>
+      <w:r>
+        <w:t xml:space="preserve"> </w:t>
+      </w:r>
+      <w:r>
+        <w:rPr>
+          <w:rStyle w:val="VerbatimChar"/>
+        </w:rPr>
+        <w:t xml:space="preserve">gc.ca</w:t>
+      </w:r>
+      <w:r>
+        <w:t xml:space="preserve"> </w:t>
+      </w:r>
+      <w:r>
+        <w:t xml:space="preserve">queued behind it); every held</w:t>
+      </w:r>
+      <w:r>
+        <w:t xml:space="preserve"> </w:t>
+      </w:r>
+      <w:r>
+        <w:t xml:space="preserve">capture-bearing artifact re-read at hostname grain; registrable discovery by bracketed-gap CDX</w:t>
+      </w:r>
+      <w:r>
+        <w:t xml:space="preserve"> </w:t>
+      </w:r>
+      <w:r>
+        <w:t xml:space="preserve">queries at its measured rate. Not worth more time, measured: prose</w:t>
       </w:r>
       <w:r>
         <w:t xml:space="preserve"> </w:t>
@@ -3013,7 +3109,7 @@
                 <w:b/>
                 <w:bCs/>
               </w:rPr>
-              <w:t xml:space="preserve">5,978,239</w:t>
+              <w:t xml:space="preserve">6,020,366</w:t>
             </w:r>
           </w:p>
         </w:tc>
@@ -3029,7 +3125,7 @@
                 <w:b/>
                 <w:bCs/>
               </w:rPr>
-              <w:t xml:space="preserve">3,401,456.1214</w:t>
+              <w:t xml:space="preserve">3,427,607.1175</w:t>
             </w:r>
           </w:p>
         </w:tc>
@@ -3054,19 +3150,19 @@
               <w:jc w:val="right"/>
             </w:pPr>
             <w:r>
-              <w:t xml:space="preserve">39,827,165</w:t>
-            </w:r>
-          </w:p>
-        </w:tc>
-        <w:tc>
-          <w:tcPr/>
-          <w:p>
-            <w:pPr>
-              <w:pStyle w:val="Compact"/>
-              <w:jc w:val="right"/>
-            </w:pPr>
-            <w:r>
-              <w:t xml:space="preserve">21,172,045.0240</w:t>
+              <w:t xml:space="preserve">39,869,292</w:t>
+            </w:r>
+          </w:p>
+        </w:tc>
+        <w:tc>
+          <w:tcPr/>
+          <w:p>
+            <w:pPr>
+              <w:pStyle w:val="Compact"/>
+              <w:jc w:val="right"/>
+            </w:pPr>
+            <w:r>
+              <w:t xml:space="preserve">21,198,196.0201</w:t>
             </w:r>
           </w:p>
         </w:tc>
@@ -3094,7 +3190,7 @@
         <w:t xml:space="preserve">0 records</w:t>
       </w:r>
       <w:r>
-        <w:t xml:space="preserve">, so all 5,978,239 submitted count once; the two unit files are disjoint in every year.</w:t>
+        <w:t xml:space="preserve">, so all 6,020,366 submitted count once; the two unit files are disjoint in every year.</w:t>
       </w:r>
     </w:p>
     <w:p>

</xml_diff>

<commit_message>
Refill the report at 19.40%
</commit_message>
<xml_diff>
--- a/docs/report.docx
+++ b/docs/report.docx
@@ -130,7 +130,7 @@
                 <w:b/>
                 <w:bCs/>
               </w:rPr>
-              <w:t xml:space="preserve">6,020,366</w:t>
+              <w:t xml:space="preserve">6,051,283</w:t>
             </w:r>
             <w:r>
               <w:t xml:space="preserve"> </w:t>
@@ -165,7 +165,7 @@
                 <w:b/>
                 <w:bCs/>
               </w:rPr>
-              <w:t xml:space="preserve">3,427,607.1175</w:t>
+              <w:t xml:space="preserve">3,447,310.6672</w:t>
             </w:r>
           </w:p>
         </w:tc>
@@ -194,7 +194,7 @@
                 <w:b/>
                 <w:bCs/>
               </w:rPr>
-              <w:t xml:space="preserve">19.2881%</w:t>
+              <w:t xml:space="preserve">19.3990%</w:t>
             </w:r>
           </w:p>
         </w:tc>
@@ -388,31 +388,31 @@
               <w:jc w:val="right"/>
             </w:pPr>
             <w:r>
-              <w:t xml:space="preserve">5,396,446</w:t>
-            </w:r>
-          </w:p>
-        </w:tc>
-        <w:tc>
-          <w:tcPr/>
-          <w:p>
-            <w:pPr>
-              <w:pStyle w:val="Compact"/>
-              <w:jc w:val="right"/>
-            </w:pPr>
-            <w:r>
-              <w:t xml:space="preserve">3,098,842.2857</w:t>
-            </w:r>
-          </w:p>
-        </w:tc>
-        <w:tc>
-          <w:tcPr/>
-          <w:p>
-            <w:pPr>
-              <w:pStyle w:val="Compact"/>
-              <w:jc w:val="right"/>
-            </w:pPr>
-            <w:r>
-              <w:t xml:space="preserve">17.4380%</w:t>
+              <w:t xml:space="preserve">5,427,363</w:t>
+            </w:r>
+          </w:p>
+        </w:tc>
+        <w:tc>
+          <w:tcPr/>
+          <w:p>
+            <w:pPr>
+              <w:pStyle w:val="Compact"/>
+              <w:jc w:val="right"/>
+            </w:pPr>
+            <w:r>
+              <w:t xml:space="preserve">3,118,545.8354</w:t>
+            </w:r>
+          </w:p>
+        </w:tc>
+        <w:tc>
+          <w:tcPr/>
+          <w:p>
+            <w:pPr>
+              <w:pStyle w:val="Compact"/>
+              <w:jc w:val="right"/>
+            </w:pPr>
+            <w:r>
+              <w:t xml:space="preserve">17.5489%</w:t>
             </w:r>
           </w:p>
         </w:tc>
@@ -627,31 +627,31 @@
               <w:jc w:val="right"/>
             </w:pPr>
             <w:r>
-              <w:t xml:space="preserve">175,626</w:t>
-            </w:r>
-          </w:p>
-        </w:tc>
-        <w:tc>
-          <w:tcPr/>
-          <w:p>
-            <w:pPr>
-              <w:pStyle w:val="Compact"/>
-              <w:jc w:val="right"/>
-            </w:pPr>
-            <w:r>
-              <w:t xml:space="preserve">2,354,961</w:t>
-            </w:r>
-          </w:p>
-        </w:tc>
-        <w:tc>
-          <w:tcPr/>
-          <w:p>
-            <w:pPr>
-              <w:pStyle w:val="Compact"/>
-              <w:jc w:val="right"/>
-            </w:pPr>
-            <w:r>
-              <w:t xml:space="preserve">113,128.7747</w:t>
+              <w:t xml:space="preserve">175,651</w:t>
+            </w:r>
+          </w:p>
+        </w:tc>
+        <w:tc>
+          <w:tcPr/>
+          <w:p>
+            <w:pPr>
+              <w:pStyle w:val="Compact"/>
+              <w:jc w:val="right"/>
+            </w:pPr>
+            <w:r>
+              <w:t xml:space="preserve">2,354,986</w:t>
+            </w:r>
+          </w:p>
+        </w:tc>
+        <w:tc>
+          <w:tcPr/>
+          <w:p>
+            <w:pPr>
+              <w:pStyle w:val="Compact"/>
+              <w:jc w:val="right"/>
+            </w:pPr>
+            <w:r>
+              <w:t xml:space="preserve">113,146.5272</w:t>
             </w:r>
           </w:p>
         </w:tc>
@@ -700,31 +700,31 @@
               <w:jc w:val="right"/>
             </w:pPr>
             <w:r>
-              <w:t xml:space="preserve">523,957</w:t>
-            </w:r>
-          </w:p>
-        </w:tc>
-        <w:tc>
-          <w:tcPr/>
-          <w:p>
-            <w:pPr>
-              <w:pStyle w:val="Compact"/>
-              <w:jc w:val="right"/>
-            </w:pPr>
-            <w:r>
-              <w:t xml:space="preserve">3,666,851</w:t>
-            </w:r>
-          </w:p>
-        </w:tc>
-        <w:tc>
-          <w:tcPr/>
-          <w:p>
-            <w:pPr>
-              <w:pStyle w:val="Compact"/>
-              <w:jc w:val="right"/>
-            </w:pPr>
-            <w:r>
-              <w:t xml:space="preserve">313,548.7414</w:t>
+              <w:t xml:space="preserve">524,705</w:t>
+            </w:r>
+          </w:p>
+        </w:tc>
+        <w:tc>
+          <w:tcPr/>
+          <w:p>
+            <w:pPr>
+              <w:pStyle w:val="Compact"/>
+              <w:jc w:val="right"/>
+            </w:pPr>
+            <w:r>
+              <w:t xml:space="preserve">3,667,599</w:t>
+            </w:r>
+          </w:p>
+        </w:tc>
+        <w:tc>
+          <w:tcPr/>
+          <w:p>
+            <w:pPr>
+              <w:pStyle w:val="Compact"/>
+              <w:jc w:val="right"/>
+            </w:pPr>
+            <w:r>
+              <w:t xml:space="preserve">314,079.8962</w:t>
             </w:r>
           </w:p>
         </w:tc>
@@ -773,31 +773,31 @@
               <w:jc w:val="right"/>
             </w:pPr>
             <w:r>
-              <w:t xml:space="preserve">841,100</w:t>
-            </w:r>
-          </w:p>
-        </w:tc>
-        <w:tc>
-          <w:tcPr/>
-          <w:p>
-            <w:pPr>
-              <w:pStyle w:val="Compact"/>
-              <w:jc w:val="right"/>
-            </w:pPr>
-            <w:r>
-              <w:t xml:space="preserve">7,233,236</w:t>
-            </w:r>
-          </w:p>
-        </w:tc>
-        <w:tc>
-          <w:tcPr/>
-          <w:p>
-            <w:pPr>
-              <w:pStyle w:val="Compact"/>
-              <w:jc w:val="right"/>
-            </w:pPr>
-            <w:r>
-              <w:t xml:space="preserve">507,443.2189</w:t>
+              <w:t xml:space="preserve">843,036</w:t>
+            </w:r>
+          </w:p>
+        </w:tc>
+        <w:tc>
+          <w:tcPr/>
+          <w:p>
+            <w:pPr>
+              <w:pStyle w:val="Compact"/>
+              <w:jc w:val="right"/>
+            </w:pPr>
+            <w:r>
+              <w:t xml:space="preserve">7,235,172</w:t>
+            </w:r>
+          </w:p>
+        </w:tc>
+        <w:tc>
+          <w:tcPr/>
+          <w:p>
+            <w:pPr>
+              <w:pStyle w:val="Compact"/>
+              <w:jc w:val="right"/>
+            </w:pPr>
+            <w:r>
+              <w:t xml:space="preserve">508,766.1805</w:t>
             </w:r>
           </w:p>
         </w:tc>
@@ -846,31 +846,31 @@
               <w:jc w:val="right"/>
             </w:pPr>
             <w:r>
-              <w:t xml:space="preserve">1,532,153</w:t>
-            </w:r>
-          </w:p>
-        </w:tc>
-        <w:tc>
-          <w:tcPr/>
-          <w:p>
-            <w:pPr>
-              <w:pStyle w:val="Compact"/>
-              <w:jc w:val="right"/>
-            </w:pPr>
-            <w:r>
-              <w:t xml:space="preserve">12,264,741</w:t>
-            </w:r>
-          </w:p>
-        </w:tc>
-        <w:tc>
-          <w:tcPr/>
-          <w:p>
-            <w:pPr>
-              <w:pStyle w:val="Compact"/>
-              <w:jc w:val="right"/>
-            </w:pPr>
-            <w:r>
-              <w:t xml:space="preserve">859,744.1483</w:t>
+              <w:t xml:space="preserve">1,536,042</w:t>
+            </w:r>
+          </w:p>
+        </w:tc>
+        <w:tc>
+          <w:tcPr/>
+          <w:p>
+            <w:pPr>
+              <w:pStyle w:val="Compact"/>
+              <w:jc w:val="right"/>
+            </w:pPr>
+            <w:r>
+              <w:t xml:space="preserve">12,268,630</w:t>
+            </w:r>
+          </w:p>
+        </w:tc>
+        <w:tc>
+          <w:tcPr/>
+          <w:p>
+            <w:pPr>
+              <w:pStyle w:val="Compact"/>
+              <w:jc w:val="right"/>
+            </w:pPr>
+            <w:r>
+              <w:t xml:space="preserve">862,203.2432</w:t>
             </w:r>
           </w:p>
         </w:tc>
@@ -919,31 +919,31 @@
               <w:jc w:val="right"/>
             </w:pPr>
             <w:r>
-              <w:t xml:space="preserve">2,244,465</w:t>
-            </w:r>
-          </w:p>
-        </w:tc>
-        <w:tc>
-          <w:tcPr/>
-          <w:p>
-            <w:pPr>
-              <w:pStyle w:val="Compact"/>
-              <w:jc w:val="right"/>
-            </w:pPr>
-            <w:r>
-              <w:t xml:space="preserve">13,281,500</w:t>
-            </w:r>
-          </w:p>
-        </w:tc>
-        <w:tc>
-          <w:tcPr/>
-          <w:p>
-            <w:pPr>
-              <w:pStyle w:val="Compact"/>
-              <w:jc w:val="right"/>
-            </w:pPr>
-            <w:r>
-              <w:t xml:space="preserve">1,581,100.1377</w:t>
+              <w:t xml:space="preserve">2,268,784</w:t>
+            </w:r>
+          </w:p>
+        </w:tc>
+        <w:tc>
+          <w:tcPr/>
+          <w:p>
+            <w:pPr>
+              <w:pStyle w:val="Compact"/>
+              <w:jc w:val="right"/>
+            </w:pPr>
+            <w:r>
+              <w:t xml:space="preserve">13,305,819</w:t>
+            </w:r>
+          </w:p>
+        </w:tc>
+        <w:tc>
+          <w:tcPr/>
+          <w:p>
+            <w:pPr>
+              <w:pStyle w:val="Compact"/>
+              <w:jc w:val="right"/>
+            </w:pPr>
+            <w:r>
+              <w:t xml:space="preserve">1,596,472.7236</w:t>
             </w:r>
           </w:p>
         </w:tc>
@@ -1008,7 +1008,7 @@
                 <w:b/>
                 <w:bCs/>
               </w:rPr>
-              <w:t xml:space="preserve">5,396,446</w:t>
+              <w:t xml:space="preserve">5,427,363</w:t>
             </w:r>
           </w:p>
         </w:tc>
@@ -1024,7 +1024,7 @@
                 <w:b/>
                 <w:bCs/>
               </w:rPr>
-              <w:t xml:space="preserve">39,869,292</w:t>
+              <w:t xml:space="preserve">39,900,209</w:t>
             </w:r>
           </w:p>
         </w:tc>
@@ -1040,7 +1040,7 @@
                 <w:b/>
                 <w:bCs/>
               </w:rPr>
-              <w:t xml:space="preserve">3,427,607.1175</w:t>
+              <w:t xml:space="preserve">3,447,310.6672</w:t>
             </w:r>
           </w:p>
         </w:tc>
@@ -1055,10 +1055,10 @@
           <w:b/>
           <w:bCs/>
         </w:rPr>
-        <w:t xml:space="preserve">Cumulative score 50.7108%</w:t>
-      </w:r>
-      <w:r>
-        <w:t xml:space="preserve">: the sum of the increases you awarded (1.659986%, 10.730988%, 14.901054%, 4.130718%) plus this round's 19.2881%, as your update log of 2026-08-18 defines it. Round 1 is held out: awarded on records, before the equivalent-English metric.</w:t>
+        <w:t xml:space="preserve">Cumulative score 50.8217%</w:t>
+      </w:r>
+      <w:r>
+        <w:t xml:space="preserve">: the sum of the increases you awarded (1.659986%, 10.730988%, 14.901054%, 4.130718%) plus this round's 19.3990%, as your update log of 2026-08-18 defines it. Round 1 is held out: awarded on records, before the equivalent-English metric.</w:t>
       </w:r>
     </w:p>
     <w:bookmarkEnd w:id="9"/>
@@ -1146,7 +1146,7 @@
           <w:b/>
           <w:bCs/>
         </w:rPr>
-        <w:t xml:space="preserve">Domain-wide CDX sweeps over subdomain platforms: 989,027 EE, 1,337,673</w:t>
+        <w:t xml:space="preserve">Domain-wide CDX sweeps over subdomain platforms: 1,008,731 EE, 1,368,590</w:t>
       </w:r>
       <w:r>
         <w:rPr>
@@ -1464,19 +1464,19 @@
               <w:jc w:val="right"/>
             </w:pPr>
             <w:r>
-              <w:t xml:space="preserve">1,337,673</w:t>
-            </w:r>
-          </w:p>
-        </w:tc>
-        <w:tc>
-          <w:tcPr/>
-          <w:p>
-            <w:pPr>
-              <w:pStyle w:val="Compact"/>
-              <w:jc w:val="right"/>
-            </w:pPr>
-            <w:r>
-              <w:t xml:space="preserve">989,027</w:t>
+              <w:t xml:space="preserve">1,368,590</w:t>
+            </w:r>
+          </w:p>
+        </w:tc>
+        <w:tc>
+          <w:tcPr/>
+          <w:p>
+            <w:pPr>
+              <w:pStyle w:val="Compact"/>
+              <w:jc w:val="right"/>
+            </w:pPr>
+            <w:r>
+              <w:t xml:space="preserve">1,008,731</w:t>
             </w:r>
           </w:p>
         </w:tc>
@@ -1886,7 +1886,7 @@
                 <w:b/>
                 <w:bCs/>
               </w:rPr>
-              <w:t xml:space="preserve">6,020,366</w:t>
+              <w:t xml:space="preserve">6,051,283</w:t>
             </w:r>
           </w:p>
         </w:tc>
@@ -1902,7 +1902,7 @@
                 <w:b/>
                 <w:bCs/>
               </w:rPr>
-              <w:t xml:space="preserve">3,427,607</w:t>
+              <w:t xml:space="preserve">3,447,311</w:t>
             </w:r>
           </w:p>
         </w:tc>
@@ -3109,7 +3109,7 @@
                 <w:b/>
                 <w:bCs/>
               </w:rPr>
-              <w:t xml:space="preserve">6,020,366</w:t>
+              <w:t xml:space="preserve">6,051,283</w:t>
             </w:r>
           </w:p>
         </w:tc>
@@ -3125,7 +3125,7 @@
                 <w:b/>
                 <w:bCs/>
               </w:rPr>
-              <w:t xml:space="preserve">3,427,607.1175</w:t>
+              <w:t xml:space="preserve">3,447,310.6672</w:t>
             </w:r>
           </w:p>
         </w:tc>
@@ -3150,19 +3150,19 @@
               <w:jc w:val="right"/>
             </w:pPr>
             <w:r>
-              <w:t xml:space="preserve">39,869,292</w:t>
-            </w:r>
-          </w:p>
-        </w:tc>
-        <w:tc>
-          <w:tcPr/>
-          <w:p>
-            <w:pPr>
-              <w:pStyle w:val="Compact"/>
-              <w:jc w:val="right"/>
-            </w:pPr>
-            <w:r>
-              <w:t xml:space="preserve">21,198,196.0201</w:t>
+              <w:t xml:space="preserve">39,900,209</w:t>
+            </w:r>
+          </w:p>
+        </w:tc>
+        <w:tc>
+          <w:tcPr/>
+          <w:p>
+            <w:pPr>
+              <w:pStyle w:val="Compact"/>
+              <w:jc w:val="right"/>
+            </w:pPr>
+            <w:r>
+              <w:t xml:space="preserve">21,217,899.5698</w:t>
             </w:r>
           </w:p>
         </w:tc>
@@ -3190,7 +3190,7 @@
         <w:t xml:space="preserve">0 records</w:t>
       </w:r>
       <w:r>
-        <w:t xml:space="preserve">, so all 6,020,366 submitted count once; the two unit files are disjoint in every year.</w:t>
+        <w:t xml:space="preserve">, so all 6,051,283 submitted count once; the two unit files are disjoint in every year.</w:t>
       </w:r>
     </w:p>
     <w:p>

</xml_diff>

<commit_message>
Label the residual attribution row by the units it holds, and refill at 19.61%
</commit_message>
<xml_diff>
--- a/docs/report.docx
+++ b/docs/report.docx
@@ -130,7 +130,7 @@
                 <w:b/>
                 <w:bCs/>
               </w:rPr>
-              <w:t xml:space="preserve">6,051,283</w:t>
+              <w:t xml:space="preserve">6,113,548</w:t>
             </w:r>
             <w:r>
               <w:t xml:space="preserve"> </w:t>
@@ -165,7 +165,7 @@
                 <w:b/>
                 <w:bCs/>
               </w:rPr>
-              <w:t xml:space="preserve">3,447,310.6672</w:t>
+              <w:t xml:space="preserve">3,485,235.0631</w:t>
             </w:r>
           </w:p>
         </w:tc>
@@ -194,7 +194,7 @@
                 <w:b/>
                 <w:bCs/>
               </w:rPr>
-              <w:t xml:space="preserve">19.3990%</w:t>
+              <w:t xml:space="preserve">19.6124%</w:t>
             </w:r>
           </w:p>
         </w:tc>
@@ -325,31 +325,31 @@
               <w:jc w:val="right"/>
             </w:pPr>
             <w:r>
-              <w:t xml:space="preserve">623,920</w:t>
-            </w:r>
-          </w:p>
-        </w:tc>
-        <w:tc>
-          <w:tcPr/>
-          <w:p>
-            <w:pPr>
-              <w:pStyle w:val="Compact"/>
-              <w:jc w:val="right"/>
-            </w:pPr>
-            <w:r>
-              <w:t xml:space="preserve">328,764.8318</w:t>
-            </w:r>
-          </w:p>
-        </w:tc>
-        <w:tc>
-          <w:tcPr/>
-          <w:p>
-            <w:pPr>
-              <w:pStyle w:val="Compact"/>
-              <w:jc w:val="right"/>
-            </w:pPr>
-            <w:r>
-              <w:t xml:space="preserve">1.8501%</w:t>
+              <w:t xml:space="preserve">623,966</w:t>
+            </w:r>
+          </w:p>
+        </w:tc>
+        <w:tc>
+          <w:tcPr/>
+          <w:p>
+            <w:pPr>
+              <w:pStyle w:val="Compact"/>
+              <w:jc w:val="right"/>
+            </w:pPr>
+            <w:r>
+              <w:t xml:space="preserve">328,791.0573</w:t>
+            </w:r>
+          </w:p>
+        </w:tc>
+        <w:tc>
+          <w:tcPr/>
+          <w:p>
+            <w:pPr>
+              <w:pStyle w:val="Compact"/>
+              <w:jc w:val="right"/>
+            </w:pPr>
+            <w:r>
+              <w:t xml:space="preserve">1.8502%</w:t>
             </w:r>
           </w:p>
         </w:tc>
@@ -388,31 +388,31 @@
               <w:jc w:val="right"/>
             </w:pPr>
             <w:r>
-              <w:t xml:space="preserve">5,427,363</w:t>
-            </w:r>
-          </w:p>
-        </w:tc>
-        <w:tc>
-          <w:tcPr/>
-          <w:p>
-            <w:pPr>
-              <w:pStyle w:val="Compact"/>
-              <w:jc w:val="right"/>
-            </w:pPr>
-            <w:r>
-              <w:t xml:space="preserve">3,118,545.8354</w:t>
-            </w:r>
-          </w:p>
-        </w:tc>
-        <w:tc>
-          <w:tcPr/>
-          <w:p>
-            <w:pPr>
-              <w:pStyle w:val="Compact"/>
-              <w:jc w:val="right"/>
-            </w:pPr>
-            <w:r>
-              <w:t xml:space="preserve">17.5489%</w:t>
+              <w:t xml:space="preserve">5,489,582</w:t>
+            </w:r>
+          </w:p>
+        </w:tc>
+        <w:tc>
+          <w:tcPr/>
+          <w:p>
+            <w:pPr>
+              <w:pStyle w:val="Compact"/>
+              <w:jc w:val="right"/>
+            </w:pPr>
+            <w:r>
+              <w:t xml:space="preserve">3,156,444.0058</w:t>
+            </w:r>
+          </w:p>
+        </w:tc>
+        <w:tc>
+          <w:tcPr/>
+          <w:p>
+            <w:pPr>
+              <w:pStyle w:val="Compact"/>
+              <w:jc w:val="right"/>
+            </w:pPr>
+            <w:r>
+              <w:t xml:space="preserve">17.7622%</w:t>
             </w:r>
           </w:p>
         </w:tc>
@@ -773,31 +773,31 @@
               <w:jc w:val="right"/>
             </w:pPr>
             <w:r>
-              <w:t xml:space="preserve">843,036</w:t>
-            </w:r>
-          </w:p>
-        </w:tc>
-        <w:tc>
-          <w:tcPr/>
-          <w:p>
-            <w:pPr>
-              <w:pStyle w:val="Compact"/>
-              <w:jc w:val="right"/>
-            </w:pPr>
-            <w:r>
-              <w:t xml:space="preserve">7,235,172</w:t>
-            </w:r>
-          </w:p>
-        </w:tc>
-        <w:tc>
-          <w:tcPr/>
-          <w:p>
-            <w:pPr>
-              <w:pStyle w:val="Compact"/>
-              <w:jc w:val="right"/>
-            </w:pPr>
-            <w:r>
-              <w:t xml:space="preserve">508,766.1805</w:t>
+              <w:t xml:space="preserve">843,041</w:t>
+            </w:r>
+          </w:p>
+        </w:tc>
+        <w:tc>
+          <w:tcPr/>
+          <w:p>
+            <w:pPr>
+              <w:pStyle w:val="Compact"/>
+              <w:jc w:val="right"/>
+            </w:pPr>
+            <w:r>
+              <w:t xml:space="preserve">7,235,177</w:t>
+            </w:r>
+          </w:p>
+        </w:tc>
+        <w:tc>
+          <w:tcPr/>
+          <w:p>
+            <w:pPr>
+              <w:pStyle w:val="Compact"/>
+              <w:jc w:val="right"/>
+            </w:pPr>
+            <w:r>
+              <w:t xml:space="preserve">508,769.3410</w:t>
             </w:r>
           </w:p>
         </w:tc>
@@ -846,31 +846,31 @@
               <w:jc w:val="right"/>
             </w:pPr>
             <w:r>
-              <w:t xml:space="preserve">1,536,042</w:t>
-            </w:r>
-          </w:p>
-        </w:tc>
-        <w:tc>
-          <w:tcPr/>
-          <w:p>
-            <w:pPr>
-              <w:pStyle w:val="Compact"/>
-              <w:jc w:val="right"/>
-            </w:pPr>
-            <w:r>
-              <w:t xml:space="preserve">12,268,630</w:t>
-            </w:r>
-          </w:p>
-        </w:tc>
-        <w:tc>
-          <w:tcPr/>
-          <w:p>
-            <w:pPr>
-              <w:pStyle w:val="Compact"/>
-              <w:jc w:val="right"/>
-            </w:pPr>
-            <w:r>
-              <w:t xml:space="preserve">862,203.2432</w:t>
+              <w:t xml:space="preserve">1,539,721</w:t>
+            </w:r>
+          </w:p>
+        </w:tc>
+        <w:tc>
+          <w:tcPr/>
+          <w:p>
+            <w:pPr>
+              <w:pStyle w:val="Compact"/>
+              <w:jc w:val="right"/>
+            </w:pPr>
+            <w:r>
+              <w:t xml:space="preserve">12,272,309</w:t>
+            </w:r>
+          </w:p>
+        </w:tc>
+        <w:tc>
+          <w:tcPr/>
+          <w:p>
+            <w:pPr>
+              <w:pStyle w:val="Compact"/>
+              <w:jc w:val="right"/>
+            </w:pPr>
+            <w:r>
+              <w:t xml:space="preserve">864,528.7391</w:t>
             </w:r>
           </w:p>
         </w:tc>
@@ -907,43 +907,43 @@
               <w:jc w:val="right"/>
             </w:pPr>
             <w:r>
-              <w:t xml:space="preserve">500,275</w:t>
-            </w:r>
-          </w:p>
-        </w:tc>
-        <w:tc>
-          <w:tcPr/>
-          <w:p>
-            <w:pPr>
-              <w:pStyle w:val="Compact"/>
-              <w:jc w:val="right"/>
-            </w:pPr>
-            <w:r>
-              <w:t xml:space="preserve">2,268,784</w:t>
-            </w:r>
-          </w:p>
-        </w:tc>
-        <w:tc>
-          <w:tcPr/>
-          <w:p>
-            <w:pPr>
-              <w:pStyle w:val="Compact"/>
-              <w:jc w:val="right"/>
-            </w:pPr>
-            <w:r>
-              <w:t xml:space="preserve">13,305,819</w:t>
-            </w:r>
-          </w:p>
-        </w:tc>
-        <w:tc>
-          <w:tcPr/>
-          <w:p>
-            <w:pPr>
-              <w:pStyle w:val="Compact"/>
-              <w:jc w:val="right"/>
-            </w:pPr>
-            <w:r>
-              <w:t xml:space="preserve">1,596,472.7236</w:t>
+              <w:t xml:space="preserve">500,321</w:t>
+            </w:r>
+          </w:p>
+        </w:tc>
+        <w:tc>
+          <w:tcPr/>
+          <w:p>
+            <w:pPr>
+              <w:pStyle w:val="Compact"/>
+              <w:jc w:val="right"/>
+            </w:pPr>
+            <w:r>
+              <w:t xml:space="preserve">2,327,319</w:t>
+            </w:r>
+          </w:p>
+        </w:tc>
+        <w:tc>
+          <w:tcPr/>
+          <w:p>
+            <w:pPr>
+              <w:pStyle w:val="Compact"/>
+              <w:jc w:val="right"/>
+            </w:pPr>
+            <w:r>
+              <w:t xml:space="preserve">13,364,400</w:t>
+            </w:r>
+          </w:p>
+        </w:tc>
+        <w:tc>
+          <w:tcPr/>
+          <w:p>
+            <w:pPr>
+              <w:pStyle w:val="Compact"/>
+              <w:jc w:val="right"/>
+            </w:pPr>
+            <w:r>
+              <w:t xml:space="preserve">1,632,068.4631</w:t>
             </w:r>
           </w:p>
         </w:tc>
@@ -992,7 +992,7 @@
                 <w:b/>
                 <w:bCs/>
               </w:rPr>
-              <w:t xml:space="preserve">623,920</w:t>
+              <w:t xml:space="preserve">623,966</w:t>
             </w:r>
           </w:p>
         </w:tc>
@@ -1008,7 +1008,7 @@
                 <w:b/>
                 <w:bCs/>
               </w:rPr>
-              <w:t xml:space="preserve">5,427,363</w:t>
+              <w:t xml:space="preserve">5,489,582</w:t>
             </w:r>
           </w:p>
         </w:tc>
@@ -1024,7 +1024,7 @@
                 <w:b/>
                 <w:bCs/>
               </w:rPr>
-              <w:t xml:space="preserve">39,900,209</w:t>
+              <w:t xml:space="preserve">39,962,474</w:t>
             </w:r>
           </w:p>
         </w:tc>
@@ -1040,7 +1040,7 @@
                 <w:b/>
                 <w:bCs/>
               </w:rPr>
-              <w:t xml:space="preserve">3,447,310.6672</w:t>
+              <w:t xml:space="preserve">3,485,235.0631</w:t>
             </w:r>
           </w:p>
         </w:tc>
@@ -1055,10 +1055,10 @@
           <w:b/>
           <w:bCs/>
         </w:rPr>
-        <w:t xml:space="preserve">Cumulative score 50.8217%</w:t>
-      </w:r>
-      <w:r>
-        <w:t xml:space="preserve">: the sum of the increases you awarded (1.659986%, 10.730988%, 14.901054%, 4.130718%) plus this round's 19.3990%, as your update log of 2026-08-18 defines it. Round 1 is held out: awarded on records, before the equivalent-English metric.</w:t>
+        <w:t xml:space="preserve">Cumulative score 51.0351%</w:t>
+      </w:r>
+      <w:r>
+        <w:t xml:space="preserve">: the sum of the increases you awarded (1.659986%, 10.730988%, 14.901054%, 4.130718%) plus this round's 19.6124%, as your update log of 2026-08-18 defines it. Round 1 is held out: awarded on records, before the equivalent-English metric.</w:t>
       </w:r>
     </w:p>
     <w:bookmarkEnd w:id="9"/>
@@ -1146,7 +1146,7 @@
           <w:b/>
           <w:bCs/>
         </w:rPr>
-        <w:t xml:space="preserve">Domain-wide CDX sweeps over subdomain platforms: 1,008,731 EE, 1,368,590</w:t>
+        <w:t xml:space="preserve">Domain-wide CDX sweeps over subdomain platforms: 1,043,187 EE, 1,423,101</w:t>
       </w:r>
       <w:r>
         <w:rPr>
@@ -1248,7 +1248,7 @@
           <w:b/>
           <w:bCs/>
         </w:rPr>
-        <w:t xml:space="preserve">Registrable domains, the prioritized unit: 328,764.8318 EE, 623,920 records.</w:t>
+        <w:t xml:space="preserve">Registrable domains, the prioritized unit: 328,791.0573 EE, 623,966 records.</w:t>
       </w:r>
       <w:r>
         <w:t xml:space="preserve"> </w:t>
@@ -1272,7 +1272,7 @@
         <w:t xml:space="preserve"> </w:t>
       </w:r>
       <w:r>
-        <w:t xml:space="preserve">(71,388) and 21 small dated artifacts (40,343). 46,148 of</w:t>
+        <w:t xml:space="preserve">(71,388) and 22 small dated artifacts (40,369). 46,148 of</w:t>
       </w:r>
       <w:r>
         <w:t xml:space="preserve"> </w:t>
@@ -1464,19 +1464,19 @@
               <w:jc w:val="right"/>
             </w:pPr>
             <w:r>
-              <w:t xml:space="preserve">1,368,590</w:t>
-            </w:r>
-          </w:p>
-        </w:tc>
-        <w:tc>
-          <w:tcPr/>
-          <w:p>
-            <w:pPr>
-              <w:pStyle w:val="Compact"/>
-              <w:jc w:val="right"/>
-            </w:pPr>
-            <w:r>
-              <w:t xml:space="preserve">1,008,731</w:t>
+              <w:t xml:space="preserve">1,423,101</w:t>
+            </w:r>
+          </w:p>
+        </w:tc>
+        <w:tc>
+          <w:tcPr/>
+          <w:p>
+            <w:pPr>
+              <w:pStyle w:val="Compact"/>
+              <w:jc w:val="right"/>
+            </w:pPr>
+            <w:r>
+              <w:t xml:space="preserve">1,043,187</w:t>
             </w:r>
           </w:p>
         </w:tc>
@@ -1767,18 +1767,18 @@
               <w:pStyle w:val="Compact"/>
             </w:pPr>
             <w:r>
-              <w:t xml:space="preserve">24 further sources</w:t>
-            </w:r>
-          </w:p>
-        </w:tc>
-        <w:tc>
-          <w:tcPr/>
-          <w:p>
-            <w:pPr>
-              <w:pStyle w:val="Compact"/>
-            </w:pPr>
-            <w:r>
-              <w:t xml:space="preserve">registrable</w:t>
+              <w:t xml:space="preserve">27 further sources</w:t>
+            </w:r>
+          </w:p>
+        </w:tc>
+        <w:tc>
+          <w:tcPr/>
+          <w:p>
+            <w:pPr>
+              <w:pStyle w:val="Compact"/>
+            </w:pPr>
+            <w:r>
+              <w:t xml:space="preserve">both</w:t>
             </w:r>
           </w:p>
         </w:tc>
@@ -1825,19 +1825,19 @@
               <w:jc w:val="right"/>
             </w:pPr>
             <w:r>
-              <w:t xml:space="preserve">117,354</w:t>
-            </w:r>
-          </w:p>
-        </w:tc>
-        <w:tc>
-          <w:tcPr/>
-          <w:p>
-            <w:pPr>
-              <w:pStyle w:val="Compact"/>
-              <w:jc w:val="right"/>
-            </w:pPr>
-            <w:r>
-              <w:t xml:space="preserve">72,470</w:t>
+              <w:t xml:space="preserve">125,108</w:t>
+            </w:r>
+          </w:p>
+        </w:tc>
+        <w:tc>
+          <w:tcPr/>
+          <w:p>
+            <w:pPr>
+              <w:pStyle w:val="Compact"/>
+              <w:jc w:val="right"/>
+            </w:pPr>
+            <w:r>
+              <w:t xml:space="preserve">75,938</w:t>
             </w:r>
           </w:p>
         </w:tc>
@@ -1886,7 +1886,7 @@
                 <w:b/>
                 <w:bCs/>
               </w:rPr>
-              <w:t xml:space="preserve">6,051,283</w:t>
+              <w:t xml:space="preserve">6,113,548</w:t>
             </w:r>
           </w:p>
         </w:tc>
@@ -1902,7 +1902,7 @@
                 <w:b/>
                 <w:bCs/>
               </w:rPr>
-              <w:t xml:space="preserve">3,447,311</w:t>
+              <w:t xml:space="preserve">3,485,235</w:t>
             </w:r>
           </w:p>
         </w:tc>
@@ -1967,7 +1967,7 @@
         <w:t xml:space="preserve"> </w:t>
       </w:r>
       <w:r>
-        <w:t xml:space="preserve">90.3% of the hostnames are</w:t>
+        <w:t xml:space="preserve">89.6% of the hostnames are</w:t>
       </w:r>
       <w:r>
         <w:t xml:space="preserve"> </w:t>
@@ -2362,37 +2362,37 @@
           <w:b/>
           <w:bCs/>
         </w:rPr>
-        <w:t xml:space="preserve">Two of the round's finds are the loop's.</w:t>
-      </w:r>
-      <w:r>
-        <w:t xml:space="preserve"> </w:t>
-      </w:r>
-      <w:r>
-        <w:t xml:space="preserve">The hostname-grain re-read (item 1 above) was among</w:t>
-      </w:r>
-      <w:r>
-        <w:t xml:space="preserve"> </w:t>
-      </w:r>
-      <w:r>
-        <w:t xml:space="preserve">the generator's first seven proposals. The re-opener recovered the NYPW TimeMaps from a 14 EE</w:t>
-      </w:r>
-      <w:r>
-        <w:t xml:space="preserve"> </w:t>
-      </w:r>
-      <w:r>
-        <w:t xml:space="preserve">closure by measuring the ingest ledger per folder (year rows per million: 2000 ~24,000, 1999</w:t>
-      </w:r>
-      <w:r>
-        <w:t xml:space="preserve"> </w:t>
-      </w:r>
-      <w:r>
-        <w:t xml:space="preserve">~10,000, 2001 exactly 4), for ~88,000 EE. Rule learned: a partitioned corpus is measured per</w:t>
-      </w:r>
-      <w:r>
-        <w:t xml:space="preserve"> </w:t>
-      </w:r>
-      <w:r>
-        <w:t xml:space="preserve">partition, never argued about.</w:t>
+        <w:t xml:space="preserve">Three of the round's finds are the loop's.</w:t>
+      </w:r>
+      <w:r>
+        <w:t xml:space="preserve"> </w:t>
+      </w:r>
+      <w:r>
+        <w:t xml:space="preserve">The hostname-grain re-read (item 1 above) was</w:t>
+      </w:r>
+      <w:r>
+        <w:t xml:space="preserve"> </w:t>
+      </w:r>
+      <w:r>
+        <w:t xml:space="preserve">among the generator's first seven proposals. The re-opener recovered the NYPW TimeMaps from a</w:t>
+      </w:r>
+      <w:r>
+        <w:t xml:space="preserve"> </w:t>
+      </w:r>
+      <w:r>
+        <w:t xml:space="preserve">14 EE closure by measuring the ingest ledger per folder (year rows per million: 2000 ~24,000,</w:t>
+      </w:r>
+      <w:r>
+        <w:t xml:space="preserve"> </w:t>
+      </w:r>
+      <w:r>
+        <w:t xml:space="preserve">1999 ~10,000, 2001 exactly 4), for ~88,000 EE. A researcher wave found the first source admitted</w:t>
+      </w:r>
+      <w:r>
+        <w:t xml:space="preserve"> </w:t>
+      </w:r>
+      <w:r>
+        <w:t xml:space="preserve">without a human, below.</w:t>
       </w:r>
     </w:p>
     <w:p>
@@ -2442,28 +2442,25 @@
           <w:b/>
           <w:bCs/>
         </w:rPr>
-        <w:t xml:space="preserve">The first find admitted under that rule is a column this project had discarded on purpose.</w:t>
-      </w:r>
-      <w:r>
-        <w:t xml:space="preserve"> </w:t>
-      </w:r>
-      <w:r>
-        <w:t xml:space="preserve">A registry zone file is two hostname corpora: the owner of an NS record is the delegation, the</w:t>
-      </w:r>
-      <w:r>
-        <w:t xml:space="preserve"> </w:t>
-      </w:r>
-      <w:r>
-        <w:t xml:space="preserve">right-hand side is the nameserver serving it. At registrable grain the right-hand side was</w:t>
-      </w:r>
-      <w:r>
-        <w:t xml:space="preserve"> </w:t>
-      </w:r>
-      <w:r>
-        <w:t xml:space="preserve">measured and closed at 63 pairs, because</w:t>
-      </w:r>
-      <w:r>
-        <w:t xml:space="preserve"> </w:t>
+        <w:t xml:space="preserve">The first such admission is a column this project had discarded on purpose.</w:t>
+      </w:r>
+      <w:r>
+        <w:t xml:space="preserve"> </w:t>
+      </w:r>
+      <w:r>
+        <w:t xml:space="preserve">A zone file's</w:t>
+      </w:r>
+      <w:r>
+        <w:t xml:space="preserve"> </w:t>
+      </w:r>
+      <w:r>
+        <w:t xml:space="preserve">NS records name two hosts: the delegation and the nameserver serving it. At registrable grain the</w:t>
+      </w:r>
+      <w:r>
+        <w:t xml:space="preserve"> </w:t>
+      </w:r>
+      <w:r>
+        <w:t xml:space="preserve">nameserver side closed at 63 pairs (</w:t>
       </w:r>
       <w:r>
         <w:rPr>
@@ -2475,13 +2472,13 @@
         <w:t xml:space="preserve"> </w:t>
       </w:r>
       <w:r>
-        <w:t xml:space="preserve">collapses to an operator every crawl</w:t>
-      </w:r>
-      <w:r>
-        <w:t xml:space="preserve"> </w:t>
-      </w:r>
-      <w:r>
-        <w:t xml:space="preserve">holds. At hostname grain the same 21,498 hosts in the 1997 InterNIC</w:t>
+        <w:t xml:space="preserve">collapses to an operator every crawl holds).</w:t>
+      </w:r>
+      <w:r>
+        <w:t xml:space="preserve"> </w:t>
+      </w:r>
+      <w:r>
+        <w:t xml:space="preserve">At hostname grain, 21,498 nameservers in the 1997 InterNIC</w:t>
       </w:r>
       <w:r>
         <w:t xml:space="preserve"> </w:t>
@@ -2559,7 +2556,7 @@
         <w:t xml:space="preserve"> </w:t>
       </w:r>
       <w:r>
-        <w:t xml:space="preserve">zones are 90% absent from both the store and your own 1997 file:</w:t>
+        <w:t xml:space="preserve">zones are 90% absent from both the store and your 1997 file:</w:t>
       </w:r>
       <w:r>
         <w:t xml:space="preserve"> </w:t>
@@ -2569,7 +2566,21 @@
           <w:b/>
           <w:bCs/>
         </w:rPr>
-        <w:t xml:space="preserve">19,211 records and 11,860.7 EE</w:t>
+        <w:t xml:space="preserve">19,211 records,</w:t>
+      </w:r>
+      <w:r>
+        <w:rPr>
+          <w:b/>
+          <w:bCs/>
+        </w:rPr>
+        <w:t xml:space="preserve"> </w:t>
+      </w:r>
+      <w:r>
+        <w:rPr>
+          <w:b/>
+          <w:bCs/>
+        </w:rPr>
+        <w:t xml:space="preserve">11,860.7 EE</w:t>
       </w:r>
       <w:r>
         <w:t xml:space="preserve">, dated by the SOA serial</w:t>
@@ -2587,25 +2598,46 @@
         <w:t xml:space="preserve"> </w:t>
       </w:r>
       <w:r>
-        <w:t xml:space="preserve">inside the payload, no</w:t>
-      </w:r>
-      <w:r>
-        <w:t xml:space="preserve"> </w:t>
-      </w:r>
-      <w:r>
-        <w:t xml:space="preserve">new request. The lens it opens: nameservers, mail exchangers and mirrors are the hosts a web</w:t>
-      </w:r>
-      <w:r>
-        <w:t xml:space="preserve"> </w:t>
-      </w:r>
-      <w:r>
-        <w:t xml:space="preserve">crawler never fetches, so DNS-side and mail-side artifacts over held registrables are the</w:t>
-      </w:r>
-      <w:r>
-        <w:t xml:space="preserve"> </w:t>
-      </w:r>
-      <w:r>
-        <w:t xml:space="preserve">hostname unit's natural source even where their registrables are saturated.</w:t>
+        <w:t xml:space="preserve">in the payload, no new request. The lens it</w:t>
+      </w:r>
+      <w:r>
+        <w:t xml:space="preserve"> </w:t>
+      </w:r>
+      <w:r>
+        <w:t xml:space="preserve">opens: nameservers, mail exchangers and mirrors are hosts a web crawler never fetches, so</w:t>
+      </w:r>
+      <w:r>
+        <w:t xml:space="preserve"> </w:t>
+      </w:r>
+      <w:r>
+        <w:t xml:space="preserve">DNS-side and mail-side artifacts are the hostname unit's natural source even where their</w:t>
+      </w:r>
+      <w:r>
+        <w:t xml:space="preserve"> </w:t>
+      </w:r>
+      <w:r>
+        <w:t xml:space="preserve">registrables are saturated. The second such admission is smaller and cheaper still: the two</w:t>
+      </w:r>
+      <w:r>
+        <w:t xml:space="preserve"> </w:t>
+      </w:r>
+      <w:r>
+        <w:t xml:space="preserve">banked squidGuard blocklists read one level down, keeping the host each line names instead of</w:t>
+      </w:r>
+      <w:r>
+        <w:t xml:space="preserve"> </w:t>
+      </w:r>
+      <w:r>
+        <w:t xml:space="preserve">its registrable, 7,708 records and 3,441.8 EE at 2001, zero requests (</w:t>
+      </w:r>
+      <w:r>
+        <w:rPr>
+          <w:rStyle w:val="VerbatimChar"/>
+        </w:rPr>
+        <w:t xml:space="preserve">sources.md</w:t>
+      </w:r>
+      <w:r>
+        <w:t xml:space="preserve">).</w:t>
       </w:r>
     </w:p>
     <w:p>
@@ -2652,7 +2684,7 @@
           <w:b/>
           <w:bCs/>
         </w:rPr>
-        <w:t xml:space="preserve">471 source families searched and recorded</w:t>
+        <w:t xml:space="preserve">474 source families searched and recorded</w:t>
       </w:r>
       <w:r>
         <w:t xml:space="preserve"> </w:t>
@@ -2670,7 +2702,7 @@
         <w:t xml:space="preserve">sources.md</w:t>
       </w:r>
       <w:r>
-        <w:t xml:space="preserve">: 61 developed, 410 evaluated and closed with the measurement that closed them, so the same ground is not broken twice.</w:t>
+        <w:t xml:space="preserve">: 62 developed, 412 evaluated and closed with the measurement that closed them, so the same ground is not broken twice.</w:t>
       </w:r>
     </w:p>
     <w:p>
@@ -3109,7 +3141,7 @@
                 <w:b/>
                 <w:bCs/>
               </w:rPr>
-              <w:t xml:space="preserve">6,051,283</w:t>
+              <w:t xml:space="preserve">6,113,548</w:t>
             </w:r>
           </w:p>
         </w:tc>
@@ -3125,7 +3157,7 @@
                 <w:b/>
                 <w:bCs/>
               </w:rPr>
-              <w:t xml:space="preserve">3,447,310.6672</w:t>
+              <w:t xml:space="preserve">3,485,235.0631</w:t>
             </w:r>
           </w:p>
         </w:tc>
@@ -3150,19 +3182,19 @@
               <w:jc w:val="right"/>
             </w:pPr>
             <w:r>
-              <w:t xml:space="preserve">39,900,209</w:t>
-            </w:r>
-          </w:p>
-        </w:tc>
-        <w:tc>
-          <w:tcPr/>
-          <w:p>
-            <w:pPr>
-              <w:pStyle w:val="Compact"/>
-              <w:jc w:val="right"/>
-            </w:pPr>
-            <w:r>
-              <w:t xml:space="preserve">21,217,899.5698</w:t>
+              <w:t xml:space="preserve">39,962,474</w:t>
+            </w:r>
+          </w:p>
+        </w:tc>
+        <w:tc>
+          <w:tcPr/>
+          <w:p>
+            <w:pPr>
+              <w:pStyle w:val="Compact"/>
+              <w:jc w:val="right"/>
+            </w:pPr>
+            <w:r>
+              <w:t xml:space="preserve">21,255,823.9657</w:t>
             </w:r>
           </w:p>
         </w:tc>
@@ -3190,7 +3222,7 @@
         <w:t xml:space="preserve">0 records</w:t>
       </w:r>
       <w:r>
-        <w:t xml:space="preserve">, so all 6,051,283 submitted count once; the two unit files are disjoint in every year.</w:t>
+        <w:t xml:space="preserve">, so all 6,113,548 submitted count once; the two unit files are disjoint in every year.</w:t>
       </w:r>
     </w:p>
     <w:p>

</xml_diff>

<commit_message>
Refill report at 23.54% after three hostname-grain admissions
</commit_message>
<xml_diff>
--- a/docs/report.docx
+++ b/docs/report.docx
@@ -130,7 +130,7 @@
                 <w:b/>
                 <w:bCs/>
               </w:rPr>
-              <w:t xml:space="preserve">6,113,548</w:t>
+              <w:t xml:space="preserve">7,400,658</w:t>
             </w:r>
             <w:r>
               <w:t xml:space="preserve"> </w:t>
@@ -165,7 +165,7 @@
                 <w:b/>
                 <w:bCs/>
               </w:rPr>
-              <w:t xml:space="preserve">3,485,235.0631</w:t>
+              <w:t xml:space="preserve">4,183,364.4129</w:t>
             </w:r>
           </w:p>
         </w:tc>
@@ -194,7 +194,7 @@
                 <w:b/>
                 <w:bCs/>
               </w:rPr>
-              <w:t xml:space="preserve">19.6124%</w:t>
+              <w:t xml:space="preserve">23.5409%</w:t>
             </w:r>
           </w:p>
         </w:tc>
@@ -325,31 +325,31 @@
               <w:jc w:val="right"/>
             </w:pPr>
             <w:r>
-              <w:t xml:space="preserve">623,966</w:t>
-            </w:r>
-          </w:p>
-        </w:tc>
-        <w:tc>
-          <w:tcPr/>
-          <w:p>
-            <w:pPr>
-              <w:pStyle w:val="Compact"/>
-              <w:jc w:val="right"/>
-            </w:pPr>
-            <w:r>
-              <w:t xml:space="preserve">328,791.0573</w:t>
-            </w:r>
-          </w:p>
-        </w:tc>
-        <w:tc>
-          <w:tcPr/>
-          <w:p>
-            <w:pPr>
-              <w:pStyle w:val="Compact"/>
-              <w:jc w:val="right"/>
-            </w:pPr>
-            <w:r>
-              <w:t xml:space="preserve">1.8502%</w:t>
+              <w:t xml:space="preserve">625,374</w:t>
+            </w:r>
+          </w:p>
+        </w:tc>
+        <w:tc>
+          <w:tcPr/>
+          <w:p>
+            <w:pPr>
+              <w:pStyle w:val="Compact"/>
+              <w:jc w:val="right"/>
+            </w:pPr>
+            <w:r>
+              <w:t xml:space="preserve">329,386.4981</w:t>
+            </w:r>
+          </w:p>
+        </w:tc>
+        <w:tc>
+          <w:tcPr/>
+          <w:p>
+            <w:pPr>
+              <w:pStyle w:val="Compact"/>
+              <w:jc w:val="right"/>
+            </w:pPr>
+            <w:r>
+              <w:t xml:space="preserve">1.8535%</w:t>
             </w:r>
           </w:p>
         </w:tc>
@@ -388,31 +388,31 @@
               <w:jc w:val="right"/>
             </w:pPr>
             <w:r>
-              <w:t xml:space="preserve">5,489,582</w:t>
-            </w:r>
-          </w:p>
-        </w:tc>
-        <w:tc>
-          <w:tcPr/>
-          <w:p>
-            <w:pPr>
-              <w:pStyle w:val="Compact"/>
-              <w:jc w:val="right"/>
-            </w:pPr>
-            <w:r>
-              <w:t xml:space="preserve">3,156,444.0058</w:t>
-            </w:r>
-          </w:p>
-        </w:tc>
-        <w:tc>
-          <w:tcPr/>
-          <w:p>
-            <w:pPr>
-              <w:pStyle w:val="Compact"/>
-              <w:jc w:val="right"/>
-            </w:pPr>
-            <w:r>
-              <w:t xml:space="preserve">17.7622%</w:t>
+              <w:t xml:space="preserve">6,775,284</w:t>
+            </w:r>
+          </w:p>
+        </w:tc>
+        <w:tc>
+          <w:tcPr/>
+          <w:p>
+            <w:pPr>
+              <w:pStyle w:val="Compact"/>
+              <w:jc w:val="right"/>
+            </w:pPr>
+            <w:r>
+              <w:t xml:space="preserve">3,853,977.9148</w:t>
+            </w:r>
+          </w:p>
+        </w:tc>
+        <w:tc>
+          <w:tcPr/>
+          <w:p>
+            <w:pPr>
+              <w:pStyle w:val="Compact"/>
+              <w:jc w:val="right"/>
+            </w:pPr>
+            <w:r>
+              <w:t xml:space="preserve">21.6874%</w:t>
             </w:r>
           </w:p>
         </w:tc>
@@ -542,43 +542,43 @@
               <w:jc w:val="right"/>
             </w:pPr>
             <w:r>
-              <w:t xml:space="preserve">8,864</w:t>
-            </w:r>
-          </w:p>
-        </w:tc>
-        <w:tc>
-          <w:tcPr/>
-          <w:p>
-            <w:pPr>
-              <w:pStyle w:val="Compact"/>
-              <w:jc w:val="right"/>
-            </w:pPr>
-            <w:r>
-              <w:t xml:space="preserve">79,145</w:t>
-            </w:r>
-          </w:p>
-        </w:tc>
-        <w:tc>
-          <w:tcPr/>
-          <w:p>
-            <w:pPr>
-              <w:pStyle w:val="Compact"/>
-              <w:jc w:val="right"/>
-            </w:pPr>
-            <w:r>
-              <w:t xml:space="preserve">1,068,003</w:t>
-            </w:r>
-          </w:p>
-        </w:tc>
-        <w:tc>
-          <w:tcPr/>
-          <w:p>
-            <w:pPr>
-              <w:pStyle w:val="Compact"/>
-              <w:jc w:val="right"/>
-            </w:pPr>
-            <w:r>
-              <w:t xml:space="preserve">52,642.0965</w:t>
+              <w:t xml:space="preserve">8,869</w:t>
+            </w:r>
+          </w:p>
+        </w:tc>
+        <w:tc>
+          <w:tcPr/>
+          <w:p>
+            <w:pPr>
+              <w:pStyle w:val="Compact"/>
+              <w:jc w:val="right"/>
+            </w:pPr>
+            <w:r>
+              <w:t xml:space="preserve">161,191</w:t>
+            </w:r>
+          </w:p>
+        </w:tc>
+        <w:tc>
+          <w:tcPr/>
+          <w:p>
+            <w:pPr>
+              <w:pStyle w:val="Compact"/>
+              <w:jc w:val="right"/>
+            </w:pPr>
+            <w:r>
+              <w:t xml:space="preserve">1,150,054</w:t>
+            </w:r>
+          </w:p>
+        </w:tc>
+        <w:tc>
+          <w:tcPr/>
+          <w:p>
+            <w:pPr>
+              <w:pStyle w:val="Compact"/>
+              <w:jc w:val="right"/>
+            </w:pPr>
+            <w:r>
+              <w:t xml:space="preserve">100,624.7475</w:t>
             </w:r>
           </w:p>
         </w:tc>
@@ -615,43 +615,43 @@
               <w:jc w:val="right"/>
             </w:pPr>
             <w:r>
-              <w:t xml:space="preserve">18,104</w:t>
-            </w:r>
-          </w:p>
-        </w:tc>
-        <w:tc>
-          <w:tcPr/>
-          <w:p>
-            <w:pPr>
-              <w:pStyle w:val="Compact"/>
-              <w:jc w:val="right"/>
-            </w:pPr>
-            <w:r>
-              <w:t xml:space="preserve">175,651</w:t>
-            </w:r>
-          </w:p>
-        </w:tc>
-        <w:tc>
-          <w:tcPr/>
-          <w:p>
-            <w:pPr>
-              <w:pStyle w:val="Compact"/>
-              <w:jc w:val="right"/>
-            </w:pPr>
-            <w:r>
-              <w:t xml:space="preserve">2,354,986</w:t>
-            </w:r>
-          </w:p>
-        </w:tc>
-        <w:tc>
-          <w:tcPr/>
-          <w:p>
-            <w:pPr>
-              <w:pStyle w:val="Compact"/>
-              <w:jc w:val="right"/>
-            </w:pPr>
-            <w:r>
-              <w:t xml:space="preserve">113,146.5272</w:t>
+              <w:t xml:space="preserve">18,116</w:t>
+            </w:r>
+          </w:p>
+        </w:tc>
+        <w:tc>
+          <w:tcPr/>
+          <w:p>
+            <w:pPr>
+              <w:pStyle w:val="Compact"/>
+              <w:jc w:val="right"/>
+            </w:pPr>
+            <w:r>
+              <w:t xml:space="preserve">245,209</w:t>
+            </w:r>
+          </w:p>
+        </w:tc>
+        <w:tc>
+          <w:tcPr/>
+          <w:p>
+            <w:pPr>
+              <w:pStyle w:val="Compact"/>
+              <w:jc w:val="right"/>
+            </w:pPr>
+            <w:r>
+              <w:t xml:space="preserve">2,424,556</w:t>
+            </w:r>
+          </w:p>
+        </w:tc>
+        <w:tc>
+          <w:tcPr/>
+          <w:p>
+            <w:pPr>
+              <w:pStyle w:val="Compact"/>
+              <w:jc w:val="right"/>
+            </w:pPr>
+            <w:r>
+              <w:t xml:space="preserve">151,361.2055</w:t>
             </w:r>
           </w:p>
         </w:tc>
@@ -688,43 +688,43 @@
               <w:jc w:val="right"/>
             </w:pPr>
             <w:r>
-              <w:t xml:space="preserve">22,997</w:t>
-            </w:r>
-          </w:p>
-        </w:tc>
-        <w:tc>
-          <w:tcPr/>
-          <w:p>
-            <w:pPr>
-              <w:pStyle w:val="Compact"/>
-              <w:jc w:val="right"/>
-            </w:pPr>
-            <w:r>
-              <w:t xml:space="preserve">524,705</w:t>
-            </w:r>
-          </w:p>
-        </w:tc>
-        <w:tc>
-          <w:tcPr/>
-          <w:p>
-            <w:pPr>
-              <w:pStyle w:val="Compact"/>
-              <w:jc w:val="right"/>
-            </w:pPr>
-            <w:r>
-              <w:t xml:space="preserve">3,667,599</w:t>
-            </w:r>
-          </w:p>
-        </w:tc>
-        <w:tc>
-          <w:tcPr/>
-          <w:p>
-            <w:pPr>
-              <w:pStyle w:val="Compact"/>
-              <w:jc w:val="right"/>
-            </w:pPr>
-            <w:r>
-              <w:t xml:space="preserve">314,079.8962</w:t>
+              <w:t xml:space="preserve">23,025</w:t>
+            </w:r>
+          </w:p>
+        </w:tc>
+        <w:tc>
+          <w:tcPr/>
+          <w:p>
+            <w:pPr>
+              <w:pStyle w:val="Compact"/>
+              <w:jc w:val="right"/>
+            </w:pPr>
+            <w:r>
+              <w:t xml:space="preserve">995,182</w:t>
+            </w:r>
+          </w:p>
+        </w:tc>
+        <w:tc>
+          <w:tcPr/>
+          <w:p>
+            <w:pPr>
+              <w:pStyle w:val="Compact"/>
+              <w:jc w:val="right"/>
+            </w:pPr>
+            <w:r>
+              <w:t xml:space="preserve">4,138,104</w:t>
+            </w:r>
+          </w:p>
+        </w:tc>
+        <w:tc>
+          <w:tcPr/>
+          <w:p>
+            <w:pPr>
+              <w:pStyle w:val="Compact"/>
+              <w:jc w:val="right"/>
+            </w:pPr>
+            <w:r>
+              <w:t xml:space="preserve">570,533.5160</w:t>
             </w:r>
           </w:p>
         </w:tc>
@@ -761,43 +761,43 @@
               <w:jc w:val="right"/>
             </w:pPr>
             <w:r>
-              <w:t xml:space="preserve">46,194</w:t>
-            </w:r>
-          </w:p>
-        </w:tc>
-        <w:tc>
-          <w:tcPr/>
-          <w:p>
-            <w:pPr>
-              <w:pStyle w:val="Compact"/>
-              <w:jc w:val="right"/>
-            </w:pPr>
-            <w:r>
-              <w:t xml:space="preserve">843,041</w:t>
-            </w:r>
-          </w:p>
-        </w:tc>
-        <w:tc>
-          <w:tcPr/>
-          <w:p>
-            <w:pPr>
-              <w:pStyle w:val="Compact"/>
-              <w:jc w:val="right"/>
-            </w:pPr>
-            <w:r>
-              <w:t xml:space="preserve">7,235,177</w:t>
-            </w:r>
-          </w:p>
-        </w:tc>
-        <w:tc>
-          <w:tcPr/>
-          <w:p>
-            <w:pPr>
-              <w:pStyle w:val="Compact"/>
-              <w:jc w:val="right"/>
-            </w:pPr>
-            <w:r>
-              <w:t xml:space="preserve">508,769.3410</w:t>
+              <w:t xml:space="preserve">46,775</w:t>
+            </w:r>
+          </w:p>
+        </w:tc>
+        <w:tc>
+          <w:tcPr/>
+          <w:p>
+            <w:pPr>
+              <w:pStyle w:val="Compact"/>
+              <w:jc w:val="right"/>
+            </w:pPr>
+            <w:r>
+              <w:t xml:space="preserve">1,428,657</w:t>
+            </w:r>
+          </w:p>
+        </w:tc>
+        <w:tc>
+          <w:tcPr/>
+          <w:p>
+            <w:pPr>
+              <w:pStyle w:val="Compact"/>
+              <w:jc w:val="right"/>
+            </w:pPr>
+            <w:r>
+              <w:t xml:space="preserve">7,821,374</w:t>
+            </w:r>
+          </w:p>
+        </w:tc>
+        <w:tc>
+          <w:tcPr/>
+          <w:p>
+            <w:pPr>
+              <w:pStyle w:val="Compact"/>
+              <w:jc w:val="right"/>
+            </w:pPr>
+            <w:r>
+              <w:t xml:space="preserve">808,583.3813</w:t>
             </w:r>
           </w:p>
         </w:tc>
@@ -834,43 +834,43 @@
               <w:jc w:val="right"/>
             </w:pPr>
             <w:r>
-              <w:t xml:space="preserve">27,486</w:t>
-            </w:r>
-          </w:p>
-        </w:tc>
-        <w:tc>
-          <w:tcPr/>
-          <w:p>
-            <w:pPr>
-              <w:pStyle w:val="Compact"/>
-              <w:jc w:val="right"/>
-            </w:pPr>
-            <w:r>
-              <w:t xml:space="preserve">1,539,721</w:t>
-            </w:r>
-          </w:p>
-        </w:tc>
-        <w:tc>
-          <w:tcPr/>
-          <w:p>
-            <w:pPr>
-              <w:pStyle w:val="Compact"/>
-              <w:jc w:val="right"/>
-            </w:pPr>
-            <w:r>
-              <w:t xml:space="preserve">12,272,309</w:t>
-            </w:r>
-          </w:p>
-        </w:tc>
-        <w:tc>
-          <w:tcPr/>
-          <w:p>
-            <w:pPr>
-              <w:pStyle w:val="Compact"/>
-              <w:jc w:val="right"/>
-            </w:pPr>
-            <w:r>
-              <w:t xml:space="preserve">864,528.7391</w:t>
+              <w:t xml:space="preserve">27,620</w:t>
+            </w:r>
+          </w:p>
+        </w:tc>
+        <w:tc>
+          <w:tcPr/>
+          <w:p>
+            <w:pPr>
+              <w:pStyle w:val="Compact"/>
+              <w:jc w:val="right"/>
+            </w:pPr>
+            <w:r>
+              <w:t xml:space="preserve">1,555,403</w:t>
+            </w:r>
+          </w:p>
+        </w:tc>
+        <w:tc>
+          <w:tcPr/>
+          <w:p>
+            <w:pPr>
+              <w:pStyle w:val="Compact"/>
+              <w:jc w:val="right"/>
+            </w:pPr>
+            <w:r>
+              <w:t xml:space="preserve">12,288,125</w:t>
+            </w:r>
+          </w:p>
+        </w:tc>
+        <w:tc>
+          <w:tcPr/>
+          <w:p>
+            <w:pPr>
+              <w:pStyle w:val="Compact"/>
+              <w:jc w:val="right"/>
+            </w:pPr>
+            <w:r>
+              <w:t xml:space="preserve">873,333.3752</w:t>
             </w:r>
           </w:p>
         </w:tc>
@@ -907,43 +907,43 @@
               <w:jc w:val="right"/>
             </w:pPr>
             <w:r>
-              <w:t xml:space="preserve">500,321</w:t>
-            </w:r>
-          </w:p>
-        </w:tc>
-        <w:tc>
-          <w:tcPr/>
-          <w:p>
-            <w:pPr>
-              <w:pStyle w:val="Compact"/>
-              <w:jc w:val="right"/>
-            </w:pPr>
-            <w:r>
-              <w:t xml:space="preserve">2,327,319</w:t>
-            </w:r>
-          </w:p>
-        </w:tc>
-        <w:tc>
-          <w:tcPr/>
-          <w:p>
-            <w:pPr>
-              <w:pStyle w:val="Compact"/>
-              <w:jc w:val="right"/>
-            </w:pPr>
-            <w:r>
-              <w:t xml:space="preserve">13,364,400</w:t>
-            </w:r>
-          </w:p>
-        </w:tc>
-        <w:tc>
-          <w:tcPr/>
-          <w:p>
-            <w:pPr>
-              <w:pStyle w:val="Compact"/>
-              <w:jc w:val="right"/>
-            </w:pPr>
-            <w:r>
-              <w:t xml:space="preserve">1,632,068.4631</w:t>
+              <w:t xml:space="preserve">500,969</w:t>
+            </w:r>
+          </w:p>
+        </w:tc>
+        <w:tc>
+          <w:tcPr/>
+          <w:p>
+            <w:pPr>
+              <w:pStyle w:val="Compact"/>
+              <w:jc w:val="right"/>
+            </w:pPr>
+            <w:r>
+              <w:t xml:space="preserve">2,389,642</w:t>
+            </w:r>
+          </w:p>
+        </w:tc>
+        <w:tc>
+          <w:tcPr/>
+          <w:p>
+            <w:pPr>
+              <w:pStyle w:val="Compact"/>
+              <w:jc w:val="right"/>
+            </w:pPr>
+            <w:r>
+              <w:t xml:space="preserve">13,427,371</w:t>
+            </w:r>
+          </w:p>
+        </w:tc>
+        <w:tc>
+          <w:tcPr/>
+          <w:p>
+            <w:pPr>
+              <w:pStyle w:val="Compact"/>
+              <w:jc w:val="right"/>
+            </w:pPr>
+            <w:r>
+              <w:t xml:space="preserve">1,678,928.1874</w:t>
             </w:r>
           </w:p>
         </w:tc>
@@ -992,7 +992,7 @@
                 <w:b/>
                 <w:bCs/>
               </w:rPr>
-              <w:t xml:space="preserve">623,966</w:t>
+              <w:t xml:space="preserve">625,374</w:t>
             </w:r>
           </w:p>
         </w:tc>
@@ -1008,7 +1008,7 @@
                 <w:b/>
                 <w:bCs/>
               </w:rPr>
-              <w:t xml:space="preserve">5,489,582</w:t>
+              <w:t xml:space="preserve">6,775,284</w:t>
             </w:r>
           </w:p>
         </w:tc>
@@ -1024,7 +1024,7 @@
                 <w:b/>
                 <w:bCs/>
               </w:rPr>
-              <w:t xml:space="preserve">39,962,474</w:t>
+              <w:t xml:space="preserve">41,249,584</w:t>
             </w:r>
           </w:p>
         </w:tc>
@@ -1040,7 +1040,7 @@
                 <w:b/>
                 <w:bCs/>
               </w:rPr>
-              <w:t xml:space="preserve">3,485,235.0631</w:t>
+              <w:t xml:space="preserve">4,183,364.4129</w:t>
             </w:r>
           </w:p>
         </w:tc>
@@ -1055,10 +1055,10 @@
           <w:b/>
           <w:bCs/>
         </w:rPr>
-        <w:t xml:space="preserve">Cumulative score 51.0351%</w:t>
-      </w:r>
-      <w:r>
-        <w:t xml:space="preserve">: the sum of the increases you awarded (1.659986%, 10.730988%, 14.901054%, 4.130718%) plus this round's 19.6124%, as your update log of 2026-08-18 defines it. Round 1 is held out: awarded on records, before the equivalent-English metric.</w:t>
+        <w:t xml:space="preserve">Cumulative score 54.9637%</w:t>
+      </w:r>
+      <w:r>
+        <w:t xml:space="preserve">: the sum of the increases you awarded (1.659986%, 10.730988%, 14.901054%, 4.130718%) plus this round's 23.5409%, as your update log of 2026-08-18 defines it. Round 1 is held out: awarded on records, before the equivalent-English metric.</w:t>
       </w:r>
     </w:p>
     <w:bookmarkEnd w:id="9"/>
@@ -1106,31 +1106,111 @@
           <w:b/>
           <w:bCs/>
         </w:rPr>
-        <w:t xml:space="preserve">4,039,562 records.</w:t>
-      </w:r>
-      <w:r>
-        <w:t xml:space="preserve"> </w:t>
-      </w:r>
-      <w:r>
-        <w:t xml:space="preserve">Until you accepted hostnames the pipeline collapsed every host to its</w:t>
-      </w:r>
-      <w:r>
-        <w:t xml:space="preserve"> </w:t>
-      </w:r>
-      <w:r>
-        <w:t xml:space="preserve">registrable, so the NYPW TimeMaps (34 parts, CC BY 4.0) stood recorded as spent and 180</w:t>
-      </w:r>
-      <w:r>
-        <w:t xml:space="preserve"> </w:t>
-      </w:r>
-      <w:r>
-        <w:t xml:space="preserve">domain-wide CDX journals as worth 0. The same bytes, re-read under the new unit, are the</w:t>
-      </w:r>
-      <w:r>
-        <w:t xml:space="preserve"> </w:t>
-      </w:r>
-      <w:r>
-        <w:t xml:space="preserve">largest source of the round, with no new request.</w:t>
+        <w:t xml:space="preserve">4,039,562 records from the NYPW TimeMaps and 631,148 EE, 1,163,616</w:t>
+      </w:r>
+      <w:r>
+        <w:rPr>
+          <w:b/>
+          <w:bCs/>
+        </w:rPr>
+        <w:t xml:space="preserve"> </w:t>
+      </w:r>
+      <w:r>
+        <w:rPr>
+          <w:b/>
+          <w:bCs/>
+        </w:rPr>
+        <w:t xml:space="preserve">records from IA's Early Web index.</w:t>
+      </w:r>
+      <w:r>
+        <w:t xml:space="preserve"> </w:t>
+      </w:r>
+      <w:r>
+        <w:t xml:space="preserve">Until you accepted hostnames the pipeline collapsed every</w:t>
+      </w:r>
+      <w:r>
+        <w:t xml:space="preserve"> </w:t>
+      </w:r>
+      <w:r>
+        <w:t xml:space="preserve">host to its registrable, so the NYPW TimeMaps (34 parts, CC BY 4.0), the 224 Early Web CDX</w:t>
+      </w:r>
+      <w:r>
+        <w:t xml:space="preserve"> </w:t>
+      </w:r>
+      <w:r>
+        <w:t xml:space="preserve">parts and 180 domain-wide CDX journals stood recorded as spent or worth 0. The same bytes,</w:t>
+      </w:r>
+      <w:r>
+        <w:t xml:space="preserve"> </w:t>
+      </w:r>
+      <w:r>
+        <w:t xml:space="preserve">re-read under the new unit, are the largest source of the round, with no new request. One</w:t>
+      </w:r>
+      <w:r>
+        <w:t xml:space="preserve"> </w:t>
+      </w:r>
+      <w:r>
+        <w:t xml:space="preserve">disclosure decides what the Early Web half is worth: nearly all of its records are</w:t>
+      </w:r>
+      <w:r>
+        <w:t xml:space="preserve"> </w:t>
+      </w:r>
+      <w:r>
+        <w:rPr>
+          <w:rStyle w:val="VerbatimChar"/>
+        </w:rPr>
+        <w:t xml:space="preserve">www.</w:t>
+      </w:r>
+      <w:r>
+        <w:t xml:space="preserve"> </w:t>
+      </w:r>
+      <w:r>
+        <w:t xml:space="preserve">forms of a registrable you already hold in that year, because your own files carry the</w:t>
+      </w:r>
+      <w:r>
+        <w:t xml:space="preserve"> </w:t>
+      </w:r>
+      <w:r>
+        <w:t xml:space="preserve">non-</w:t>
+      </w:r>
+      <w:r>
+        <w:rPr>
+          <w:rStyle w:val="VerbatimChar"/>
+        </w:rPr>
+        <w:t xml:space="preserve">www.</w:t>
+      </w:r>
+      <w:r>
+        <w:t xml:space="preserve"> </w:t>
+      </w:r>
+      <w:r>
+        <w:t xml:space="preserve">hosts by name and almost no</w:t>
+      </w:r>
+      <w:r>
+        <w:t xml:space="preserve"> </w:t>
+      </w:r>
+      <w:r>
+        <w:rPr>
+          <w:rStyle w:val="VerbatimChar"/>
+        </w:rPr>
+        <w:t xml:space="preserve">www.</w:t>
+      </w:r>
+      <w:r>
+        <w:t xml:space="preserve"> </w:t>
+      </w:r>
+      <w:r>
+        <w:t xml:space="preserve">ones. A third IA index, the USFEDGOV-EXTRACT-2001</w:t>
+      </w:r>
+      <w:r>
+        <w:t xml:space="preserve"> </w:t>
+      </w:r>
+      <w:r>
+        <w:t xml:space="preserve">merged CDX, adds 21,926 EE over 22,417 federal hosts at 2001 from one</w:t>
+      </w:r>
+      <w:r>
+        <w:t xml:space="preserve"> </w:t>
+      </w:r>
+      <w:r>
+        <w:t xml:space="preserve">bulk download.</w:t>
       </w:r>
     </w:p>
     <w:p>
@@ -1146,7 +1226,7 @@
           <w:b/>
           <w:bCs/>
         </w:rPr>
-        <w:t xml:space="preserve">Domain-wide CDX sweeps over subdomain platforms: 1,043,187 EE, 1,423,101</w:t>
+        <w:t xml:space="preserve">Domain-wide CDX sweeps over subdomain platforms: 1,075,867 EE, 1,472,929</w:t>
       </w:r>
       <w:r>
         <w:rPr>
@@ -1248,7 +1328,7 @@
           <w:b/>
           <w:bCs/>
         </w:rPr>
-        <w:t xml:space="preserve">Registrable domains, the prioritized unit: 328,791.0573 EE, 623,966 records.</w:t>
+        <w:t xml:space="preserve">Registrable domains, the prioritized unit: 329,386.4981 EE, 625,374 records.</w:t>
       </w:r>
       <w:r>
         <w:t xml:space="preserve"> </w:t>
@@ -1272,7 +1352,7 @@
         <w:t xml:space="preserve"> </w:t>
       </w:r>
       <w:r>
-        <w:t xml:space="preserve">(71,388) and 22 small dated artifacts (40,369). 46,148 of</w:t>
+        <w:t xml:space="preserve">(71,388) and 24 small dated artifacts (40,964). 46,766 of</w:t>
       </w:r>
       <w:r>
         <w:t xml:space="preserve"> </w:t>
@@ -1464,19 +1544,81 @@
               <w:jc w:val="right"/>
             </w:pPr>
             <w:r>
-              <w:t xml:space="preserve">1,423,101</w:t>
-            </w:r>
-          </w:p>
-        </w:tc>
-        <w:tc>
-          <w:tcPr/>
-          <w:p>
-            <w:pPr>
-              <w:pStyle w:val="Compact"/>
-              <w:jc w:val="right"/>
-            </w:pPr>
-            <w:r>
-              <w:t xml:space="preserve">1,043,187</w:t>
+              <w:t xml:space="preserve">1,472,929</w:t>
+            </w:r>
+          </w:p>
+        </w:tc>
+        <w:tc>
+          <w:tcPr/>
+          <w:p>
+            <w:pPr>
+              <w:pStyle w:val="Compact"/>
+              <w:jc w:val="right"/>
+            </w:pPr>
+            <w:r>
+              <w:t xml:space="preserve">1,075,867</w:t>
+            </w:r>
+          </w:p>
+        </w:tc>
+      </w:tr>
+      <w:tr>
+        <w:tc>
+          <w:tcPr/>
+          <w:p>
+            <w:pPr>
+              <w:pStyle w:val="Compact"/>
+            </w:pPr>
+            <w:r>
+              <w:rPr>
+                <w:rStyle w:val="VerbatimChar"/>
+              </w:rPr>
+              <w:t xml:space="preserve">early_web_hostgrain</w:t>
+            </w:r>
+          </w:p>
+        </w:tc>
+        <w:tc>
+          <w:tcPr/>
+          <w:p>
+            <w:pPr>
+              <w:pStyle w:val="Compact"/>
+            </w:pPr>
+            <w:r>
+              <w:t xml:space="preserve">hostname</w:t>
+            </w:r>
+          </w:p>
+        </w:tc>
+        <w:tc>
+          <w:tcPr/>
+          <w:p>
+            <w:pPr>
+              <w:pStyle w:val="Compact"/>
+            </w:pPr>
+            <w:r>
+              <w:t xml:space="preserve">the row's own 14-digit capture timestamp</w:t>
+            </w:r>
+          </w:p>
+        </w:tc>
+        <w:tc>
+          <w:tcPr/>
+          <w:p>
+            <w:pPr>
+              <w:pStyle w:val="Compact"/>
+              <w:jc w:val="right"/>
+            </w:pPr>
+            <w:r>
+              <w:t xml:space="preserve">1,163,616</w:t>
+            </w:r>
+          </w:p>
+        </w:tc>
+        <w:tc>
+          <w:tcPr/>
+          <w:p>
+            <w:pPr>
+              <w:pStyle w:val="Compact"/>
+              <w:jc w:val="right"/>
+            </w:pPr>
+            <w:r>
+              <w:t xml:space="preserve">631,148</w:t>
             </w:r>
           </w:p>
         </w:tc>
@@ -1690,84 +1832,7 @@
               <w:pStyle w:val="Compact"/>
             </w:pPr>
             <w:r>
-              <w:rPr>
-                <w:rStyle w:val="VerbatimChar"/>
-              </w:rPr>
-              <w:t xml:space="preserve">usenet_announce</w:t>
-            </w:r>
-          </w:p>
-        </w:tc>
-        <w:tc>
-          <w:tcPr/>
-          <w:p>
-            <w:pPr>
-              <w:pStyle w:val="Compact"/>
-            </w:pPr>
-            <w:r>
-              <w:t xml:space="preserve">registrable</w:t>
-            </w:r>
-          </w:p>
-        </w:tc>
-        <w:tc>
-          <w:tcPr/>
-          <w:p>
-            <w:pPr>
-              <w:pStyle w:val="Compact"/>
-            </w:pPr>
-            <w:r>
-              <w:t xml:space="preserve">the post's</w:t>
-            </w:r>
-            <w:r>
-              <w:t xml:space="preserve"> </w:t>
-            </w:r>
-            <w:r>
-              <w:rPr>
-                <w:rStyle w:val="VerbatimChar"/>
-              </w:rPr>
-              <w:t xml:space="preserve">Date:</w:t>
-            </w:r>
-            <w:r>
-              <w:t xml:space="preserve"> </w:t>
-            </w:r>
-            <w:r>
-              <w:t xml:space="preserve">header, corroborated by a second source</w:t>
-            </w:r>
-          </w:p>
-        </w:tc>
-        <w:tc>
-          <w:tcPr/>
-          <w:p>
-            <w:pPr>
-              <w:pStyle w:val="Compact"/>
-              <w:jc w:val="right"/>
-            </w:pPr>
-            <w:r>
-              <w:t xml:space="preserve">36,486</w:t>
-            </w:r>
-          </w:p>
-        </w:tc>
-        <w:tc>
-          <w:tcPr/>
-          <w:p>
-            <w:pPr>
-              <w:pStyle w:val="Compact"/>
-              <w:jc w:val="right"/>
-            </w:pPr>
-            <w:r>
-              <w:t xml:space="preserve">18,569</w:t>
-            </w:r>
-          </w:p>
-        </w:tc>
-      </w:tr>
-      <w:tr>
-        <w:tc>
-          <w:tcPr/>
-          <w:p>
-            <w:pPr>
-              <w:pStyle w:val="Compact"/>
-            </w:pPr>
-            <w:r>
-              <w:t xml:space="preserve">27 further sources</w:t>
+              <w:t xml:space="preserve">33 further sources</w:t>
             </w:r>
           </w:p>
         </w:tc>
@@ -1825,19 +1890,19 @@
               <w:jc w:val="right"/>
             </w:pPr>
             <w:r>
-              <w:t xml:space="preserve">125,108</w:t>
-            </w:r>
-          </w:p>
-        </w:tc>
-        <w:tc>
-          <w:tcPr/>
-          <w:p>
-            <w:pPr>
-              <w:pStyle w:val="Compact"/>
-              <w:jc w:val="right"/>
-            </w:pPr>
-            <w:r>
-              <w:t xml:space="preserve">75,938</w:t>
+              <w:t xml:space="preserve">235,260</w:t>
+            </w:r>
+          </w:p>
+        </w:tc>
+        <w:tc>
+          <w:tcPr/>
+          <w:p>
+            <w:pPr>
+              <w:pStyle w:val="Compact"/>
+              <w:jc w:val="right"/>
+            </w:pPr>
+            <w:r>
+              <w:t xml:space="preserve">128,809</w:t>
             </w:r>
           </w:p>
         </w:tc>
@@ -1886,7 +1951,7 @@
                 <w:b/>
                 <w:bCs/>
               </w:rPr>
-              <w:t xml:space="preserve">6,113,548</w:t>
+              <w:t xml:space="preserve">7,400,658</w:t>
             </w:r>
           </w:p>
         </w:tc>
@@ -1902,7 +1967,7 @@
                 <w:b/>
                 <w:bCs/>
               </w:rPr>
-              <w:t xml:space="preserve">3,485,235</w:t>
+              <w:t xml:space="preserve">4,183,364</w:t>
             </w:r>
           </w:p>
         </w:tc>
@@ -1967,7 +2032,7 @@
         <w:t xml:space="preserve"> </w:t>
       </w:r>
       <w:r>
-        <w:t xml:space="preserve">89.6% of the hostnames are</w:t>
+        <w:t xml:space="preserve">90.2% of the hostnames are</w:t>
       </w:r>
       <w:r>
         <w:t xml:space="preserve"> </w:t>
@@ -2233,7 +2298,7 @@
           <w:b/>
           <w:bCs/>
         </w:rPr>
-        <w:t xml:space="preserve">2,419,541 domains carry no year evidence</w:t>
+        <w:t xml:space="preserve">2,419,437 domains carry no year evidence</w:t>
       </w:r>
       <w:r>
         <w:t xml:space="preserve"> </w:t>
@@ -2257,7 +2322,7 @@
         <w:t xml:space="preserve"> </w:t>
       </w:r>
       <w:r>
-        <w:t xml:space="preserve">file; 588,087 of them are under</w:t>
+        <w:t xml:space="preserve">file; 588,081 of them are under</w:t>
       </w:r>
       <w:r>
         <w:t xml:space="preserve"> </w:t>
@@ -2637,7 +2702,61 @@
         <w:t xml:space="preserve">sources.md</w:t>
       </w:r>
       <w:r>
-        <w:t xml:space="preserve">).</w:t>
+        <w:t xml:space="preserve">). The</w:t>
+      </w:r>
+      <w:r>
+        <w:t xml:space="preserve"> </w:t>
+      </w:r>
+      <w:r>
+        <w:t xml:space="preserve">third is the same lens on a registry database: the nameservers RIPE</w:t>
+      </w:r>
+      <w:r>
+        <w:t xml:space="preserve"> </w:t>
+      </w:r>
+      <w:r>
+        <w:rPr>
+          <w:rStyle w:val="VerbatimChar"/>
+        </w:rPr>
+        <w:t xml:space="preserve">domain:</w:t>
+      </w:r>
+      <w:r>
+        <w:t xml:space="preserve"> </w:t>
+      </w:r>
+      <w:r>
+        <w:t xml:space="preserve">objects point at,</w:t>
+      </w:r>
+      <w:r>
+        <w:t xml:space="preserve"> </w:t>
+      </w:r>
+      <w:r>
+        <w:t xml:space="preserve">in the two FUNET editions already banked for their delegated names, 49,841 records and</w:t>
+      </w:r>
+      <w:r>
+        <w:t xml:space="preserve"> </w:t>
+      </w:r>
+      <w:r>
+        <w:t xml:space="preserve">11,780 EE across 1996-2001, dated by the dump's own generation stamp and each object's</w:t>
+      </w:r>
+      <w:r>
+        <w:t xml:space="preserve"> </w:t>
+      </w:r>
+      <w:r>
+        <w:t xml:space="preserve">latest</w:t>
+      </w:r>
+      <w:r>
+        <w:t xml:space="preserve"> </w:t>
+      </w:r>
+      <w:r>
+        <w:rPr>
+          <w:rStyle w:val="VerbatimChar"/>
+        </w:rPr>
+        <w:t xml:space="preserve">changed:</w:t>
+      </w:r>
+      <w:r>
+        <w:t xml:space="preserve"> </w:t>
+      </w:r>
+      <w:r>
+        <w:t xml:space="preserve">line, under the RIPE NCC's written permission.</w:t>
       </w:r>
     </w:p>
     <w:p>
@@ -2684,7 +2803,7 @@
           <w:b/>
           <w:bCs/>
         </w:rPr>
-        <w:t xml:space="preserve">474 source families searched and recorded</w:t>
+        <w:t xml:space="preserve">484 source families searched and recorded</w:t>
       </w:r>
       <w:r>
         <w:t xml:space="preserve"> </w:t>
@@ -2702,7 +2821,7 @@
         <w:t xml:space="preserve">sources.md</w:t>
       </w:r>
       <w:r>
-        <w:t xml:space="preserve">: 62 developed, 412 evaluated and closed with the measurement that closed them, so the same ground is not broken twice.</w:t>
+        <w:t xml:space="preserve">: 65 developed, 419 evaluated and closed with the measurement that closed them, so the same ground is not broken twice.</w:t>
       </w:r>
     </w:p>
     <w:p>
@@ -3141,7 +3260,7 @@
                 <w:b/>
                 <w:bCs/>
               </w:rPr>
-              <w:t xml:space="preserve">6,113,548</w:t>
+              <w:t xml:space="preserve">7,400,658</w:t>
             </w:r>
           </w:p>
         </w:tc>
@@ -3157,7 +3276,7 @@
                 <w:b/>
                 <w:bCs/>
               </w:rPr>
-              <w:t xml:space="preserve">3,485,235.0631</w:t>
+              <w:t xml:space="preserve">4,183,364.4129</w:t>
             </w:r>
           </w:p>
         </w:tc>
@@ -3182,19 +3301,19 @@
               <w:jc w:val="right"/>
             </w:pPr>
             <w:r>
-              <w:t xml:space="preserve">39,962,474</w:t>
-            </w:r>
-          </w:p>
-        </w:tc>
-        <w:tc>
-          <w:tcPr/>
-          <w:p>
-            <w:pPr>
-              <w:pStyle w:val="Compact"/>
-              <w:jc w:val="right"/>
-            </w:pPr>
-            <w:r>
-              <w:t xml:space="preserve">21,255,823.9657</w:t>
+              <w:t xml:space="preserve">41,249,584</w:t>
+            </w:r>
+          </w:p>
+        </w:tc>
+        <w:tc>
+          <w:tcPr/>
+          <w:p>
+            <w:pPr>
+              <w:pStyle w:val="Compact"/>
+              <w:jc w:val="right"/>
+            </w:pPr>
+            <w:r>
+              <w:t xml:space="preserve">21,953,953.3155</w:t>
             </w:r>
           </w:p>
         </w:tc>
@@ -3222,7 +3341,7 @@
         <w:t xml:space="preserve">0 records</w:t>
       </w:r>
       <w:r>
-        <w:t xml:space="preserve">, so all 6,113,548 submitted count once; the two unit files are disjoint in every year.</w:t>
+        <w:t xml:space="preserve">, so all 7,400,658 submitted count once; the two unit files are disjoint in every year.</w:t>
       </w:r>
     </w:p>
     <w:p>

</xml_diff>

<commit_message>
Rehearsed archive at 23.54%: eleven verify checks, tier-2 byte-identical; live row updated
</commit_message>
<xml_diff>
--- a/docs/report.docx
+++ b/docs/report.docx
@@ -3537,7 +3537,7 @@
         <w:t xml:space="preserve"> </w:t>
       </w:r>
       <w:r>
-        <w:t xml:space="preserve">Before sending, a fresh extraction of this archive was put through that route: all ten</w:t>
+        <w:t xml:space="preserve">Before sending, a fresh extraction of this archive was put through that route: all eleven</w:t>
       </w:r>
       <w:r>
         <w:t xml:space="preserve"> </w:t>
@@ -3914,7 +3914,7 @@
         <w:t xml:space="preserve"> </w:t>
       </w:r>
       <w:r>
-        <w:t xml:space="preserve">runs ten checks inside a fresh extraction, including all four.</w:t>
+        <w:t xml:space="preserve">runs eleven checks inside a fresh extraction, including all four.</w:t>
       </w:r>
     </w:p>
     <w:bookmarkEnd w:id="16"/>

</xml_diff>

<commit_message>
Refill at 76.04% after the ISC survey host files and the six USFEDGOV years; section 2 reordered, limitations rewritten
</commit_message>
<xml_diff>
--- a/docs/report.docx
+++ b/docs/report.docx
@@ -130,7 +130,7 @@
                 <w:b/>
                 <w:bCs/>
               </w:rPr>
-              <w:t xml:space="preserve">7,400,658</w:t>
+              <w:t xml:space="preserve">25,811,931</w:t>
             </w:r>
             <w:r>
               <w:t xml:space="preserve"> </w:t>
@@ -165,7 +165,7 @@
                 <w:b/>
                 <w:bCs/>
               </w:rPr>
-              <w:t xml:space="preserve">4,183,364.4129</w:t>
+              <w:t xml:space="preserve">13,512,552.2294</w:t>
             </w:r>
           </w:p>
         </w:tc>
@@ -194,7 +194,7 @@
                 <w:b/>
                 <w:bCs/>
               </w:rPr>
-              <w:t xml:space="preserve">23.5409%</w:t>
+              <w:t xml:space="preserve">76.0389%</w:t>
             </w:r>
           </w:p>
         </w:tc>
@@ -325,31 +325,31 @@
               <w:jc w:val="right"/>
             </w:pPr>
             <w:r>
-              <w:t xml:space="preserve">625,374</w:t>
-            </w:r>
-          </w:p>
-        </w:tc>
-        <w:tc>
-          <w:tcPr/>
-          <w:p>
-            <w:pPr>
-              <w:pStyle w:val="Compact"/>
-              <w:jc w:val="right"/>
-            </w:pPr>
-            <w:r>
-              <w:t xml:space="preserve">329,386.4981</w:t>
-            </w:r>
-          </w:p>
-        </w:tc>
-        <w:tc>
-          <w:tcPr/>
-          <w:p>
-            <w:pPr>
-              <w:pStyle w:val="Compact"/>
-              <w:jc w:val="right"/>
-            </w:pPr>
-            <w:r>
-              <w:t xml:space="preserve">1.8535%</w:t>
+              <w:t xml:space="preserve">625,385</w:t>
+            </w:r>
+          </w:p>
+        </w:tc>
+        <w:tc>
+          <w:tcPr/>
+          <w:p>
+            <w:pPr>
+              <w:pStyle w:val="Compact"/>
+              <w:jc w:val="right"/>
+            </w:pPr>
+            <w:r>
+              <w:t xml:space="preserve">329,397.2492</w:t>
+            </w:r>
+          </w:p>
+        </w:tc>
+        <w:tc>
+          <w:tcPr/>
+          <w:p>
+            <w:pPr>
+              <w:pStyle w:val="Compact"/>
+              <w:jc w:val="right"/>
+            </w:pPr>
+            <w:r>
+              <w:t xml:space="preserve">1.8536%</w:t>
             </w:r>
           </w:p>
         </w:tc>
@@ -388,31 +388,31 @@
               <w:jc w:val="right"/>
             </w:pPr>
             <w:r>
-              <w:t xml:space="preserve">6,775,284</w:t>
-            </w:r>
-          </w:p>
-        </w:tc>
-        <w:tc>
-          <w:tcPr/>
-          <w:p>
-            <w:pPr>
-              <w:pStyle w:val="Compact"/>
-              <w:jc w:val="right"/>
-            </w:pPr>
-            <w:r>
-              <w:t xml:space="preserve">3,853,977.9148</w:t>
-            </w:r>
-          </w:p>
-        </w:tc>
-        <w:tc>
-          <w:tcPr/>
-          <w:p>
-            <w:pPr>
-              <w:pStyle w:val="Compact"/>
-              <w:jc w:val="right"/>
-            </w:pPr>
-            <w:r>
-              <w:t xml:space="preserve">21.6874%</w:t>
+              <w:t xml:space="preserve">25,186,546</w:t>
+            </w:r>
+          </w:p>
+        </w:tc>
+        <w:tc>
+          <w:tcPr/>
+          <w:p>
+            <w:pPr>
+              <w:pStyle w:val="Compact"/>
+              <w:jc w:val="right"/>
+            </w:pPr>
+            <w:r>
+              <w:t xml:space="preserve">13,183,154.9802</w:t>
+            </w:r>
+          </w:p>
+        </w:tc>
+        <w:tc>
+          <w:tcPr/>
+          <w:p>
+            <w:pPr>
+              <w:pStyle w:val="Compact"/>
+              <w:jc w:val="right"/>
+            </w:pPr>
+            <w:r>
+              <w:t xml:space="preserve">74.1852%</w:t>
             </w:r>
           </w:p>
         </w:tc>
@@ -554,31 +554,31 @@
               <w:jc w:val="right"/>
             </w:pPr>
             <w:r>
-              <w:t xml:space="preserve">161,191</w:t>
-            </w:r>
-          </w:p>
-        </w:tc>
-        <w:tc>
-          <w:tcPr/>
-          <w:p>
-            <w:pPr>
-              <w:pStyle w:val="Compact"/>
-              <w:jc w:val="right"/>
-            </w:pPr>
-            <w:r>
-              <w:t xml:space="preserve">1,150,054</w:t>
-            </w:r>
-          </w:p>
-        </w:tc>
-        <w:tc>
-          <w:tcPr/>
-          <w:p>
-            <w:pPr>
-              <w:pStyle w:val="Compact"/>
-              <w:jc w:val="right"/>
-            </w:pPr>
-            <w:r>
-              <w:t xml:space="preserve">100,624.7475</w:t>
+              <w:t xml:space="preserve">7,742,554</w:t>
+            </w:r>
+          </w:p>
+        </w:tc>
+        <w:tc>
+          <w:tcPr/>
+          <w:p>
+            <w:pPr>
+              <w:pStyle w:val="Compact"/>
+              <w:jc w:val="right"/>
+            </w:pPr>
+            <w:r>
+              <w:t xml:space="preserve">8,731,417</w:t>
+            </w:r>
+          </w:p>
+        </w:tc>
+        <w:tc>
+          <w:tcPr/>
+          <w:p>
+            <w:pPr>
+              <w:pStyle w:val="Compact"/>
+              <w:jc w:val="right"/>
+            </w:pPr>
+            <w:r>
+              <w:t xml:space="preserve">4,156,305.3362</w:t>
             </w:r>
           </w:p>
         </w:tc>
@@ -627,31 +627,31 @@
               <w:jc w:val="right"/>
             </w:pPr>
             <w:r>
-              <w:t xml:space="preserve">245,209</w:t>
-            </w:r>
-          </w:p>
-        </w:tc>
-        <w:tc>
-          <w:tcPr/>
-          <w:p>
-            <w:pPr>
-              <w:pStyle w:val="Compact"/>
-              <w:jc w:val="right"/>
-            </w:pPr>
-            <w:r>
-              <w:t xml:space="preserve">2,424,556</w:t>
-            </w:r>
-          </w:p>
-        </w:tc>
-        <w:tc>
-          <w:tcPr/>
-          <w:p>
-            <w:pPr>
-              <w:pStyle w:val="Compact"/>
-              <w:jc w:val="right"/>
-            </w:pPr>
-            <w:r>
-              <w:t xml:space="preserve">151,361.2055</w:t>
+              <w:t xml:space="preserve">10,781,638</w:t>
+            </w:r>
+          </w:p>
+        </w:tc>
+        <w:tc>
+          <w:tcPr/>
+          <w:p>
+            <w:pPr>
+              <w:pStyle w:val="Compact"/>
+              <w:jc w:val="right"/>
+            </w:pPr>
+            <w:r>
+              <w:t xml:space="preserve">12,960,985</w:t>
+            </w:r>
+          </w:p>
+        </w:tc>
+        <w:tc>
+          <w:tcPr/>
+          <w:p>
+            <w:pPr>
+              <w:pStyle w:val="Compact"/>
+              <w:jc w:val="right"/>
+            </w:pPr>
+            <w:r>
+              <w:t xml:space="preserve">5,263,432.5480</w:t>
             </w:r>
           </w:p>
         </w:tc>
@@ -700,31 +700,31 @@
               <w:jc w:val="right"/>
             </w:pPr>
             <w:r>
-              <w:t xml:space="preserve">995,182</w:t>
-            </w:r>
-          </w:p>
-        </w:tc>
-        <w:tc>
-          <w:tcPr/>
-          <w:p>
-            <w:pPr>
-              <w:pStyle w:val="Compact"/>
-              <w:jc w:val="right"/>
-            </w:pPr>
-            <w:r>
-              <w:t xml:space="preserve">4,138,104</w:t>
-            </w:r>
-          </w:p>
-        </w:tc>
-        <w:tc>
-          <w:tcPr/>
-          <w:p>
-            <w:pPr>
-              <w:pStyle w:val="Compact"/>
-              <w:jc w:val="right"/>
-            </w:pPr>
-            <w:r>
-              <w:t xml:space="preserve">570,533.5160</w:t>
+              <w:t xml:space="preserve">999,025</w:t>
+            </w:r>
+          </w:p>
+        </w:tc>
+        <w:tc>
+          <w:tcPr/>
+          <w:p>
+            <w:pPr>
+              <w:pStyle w:val="Compact"/>
+              <w:jc w:val="right"/>
+            </w:pPr>
+            <w:r>
+              <w:t xml:space="preserve">4,141,947</w:t>
+            </w:r>
+          </w:p>
+        </w:tc>
+        <w:tc>
+          <w:tcPr/>
+          <w:p>
+            <w:pPr>
+              <w:pStyle w:val="Compact"/>
+              <w:jc w:val="right"/>
+            </w:pPr>
+            <w:r>
+              <w:t xml:space="preserve">573,718.9687</w:t>
             </w:r>
           </w:p>
         </w:tc>
@@ -761,43 +761,43 @@
               <w:jc w:val="right"/>
             </w:pPr>
             <w:r>
-              <w:t xml:space="preserve">46,775</w:t>
-            </w:r>
-          </w:p>
-        </w:tc>
-        <w:tc>
-          <w:tcPr/>
-          <w:p>
-            <w:pPr>
-              <w:pStyle w:val="Compact"/>
-              <w:jc w:val="right"/>
-            </w:pPr>
-            <w:r>
-              <w:t xml:space="preserve">1,428,657</w:t>
-            </w:r>
-          </w:p>
-        </w:tc>
-        <w:tc>
-          <w:tcPr/>
-          <w:p>
-            <w:pPr>
-              <w:pStyle w:val="Compact"/>
-              <w:jc w:val="right"/>
-            </w:pPr>
-            <w:r>
-              <w:t xml:space="preserve">7,821,374</w:t>
-            </w:r>
-          </w:p>
-        </w:tc>
-        <w:tc>
-          <w:tcPr/>
-          <w:p>
-            <w:pPr>
-              <w:pStyle w:val="Compact"/>
-              <w:jc w:val="right"/>
-            </w:pPr>
-            <w:r>
-              <w:t xml:space="preserve">808,583.3813</w:t>
+              <w:t xml:space="preserve">46,776</w:t>
+            </w:r>
+          </w:p>
+        </w:tc>
+        <w:tc>
+          <w:tcPr/>
+          <w:p>
+            <w:pPr>
+              <w:pStyle w:val="Compact"/>
+              <w:jc w:val="right"/>
+            </w:pPr>
+            <w:r>
+              <w:t xml:space="preserve">1,451,843</w:t>
+            </w:r>
+          </w:p>
+        </w:tc>
+        <w:tc>
+          <w:tcPr/>
+          <w:p>
+            <w:pPr>
+              <w:pStyle w:val="Compact"/>
+              <w:jc w:val="right"/>
+            </w:pPr>
+            <w:r>
+              <w:t xml:space="preserve">7,844,561</w:t>
+            </w:r>
+          </w:p>
+        </w:tc>
+        <w:tc>
+          <w:tcPr/>
+          <w:p>
+            <w:pPr>
+              <w:pStyle w:val="Compact"/>
+              <w:jc w:val="right"/>
+            </w:pPr>
+            <w:r>
+              <w:t xml:space="preserve">824,290.9369</w:t>
             </w:r>
           </w:p>
         </w:tc>
@@ -834,43 +834,43 @@
               <w:jc w:val="right"/>
             </w:pPr>
             <w:r>
-              <w:t xml:space="preserve">27,620</w:t>
-            </w:r>
-          </w:p>
-        </w:tc>
-        <w:tc>
-          <w:tcPr/>
-          <w:p>
-            <w:pPr>
-              <w:pStyle w:val="Compact"/>
-              <w:jc w:val="right"/>
-            </w:pPr>
-            <w:r>
-              <w:t xml:space="preserve">1,555,403</w:t>
-            </w:r>
-          </w:p>
-        </w:tc>
-        <w:tc>
-          <w:tcPr/>
-          <w:p>
-            <w:pPr>
-              <w:pStyle w:val="Compact"/>
-              <w:jc w:val="right"/>
-            </w:pPr>
-            <w:r>
-              <w:t xml:space="preserve">12,288,125</w:t>
-            </w:r>
-          </w:p>
-        </w:tc>
-        <w:tc>
-          <w:tcPr/>
-          <w:p>
-            <w:pPr>
-              <w:pStyle w:val="Compact"/>
-              <w:jc w:val="right"/>
-            </w:pPr>
-            <w:r>
-              <w:t xml:space="preserve">873,333.3752</w:t>
+              <w:t xml:space="preserve">27,630</w:t>
+            </w:r>
+          </w:p>
+        </w:tc>
+        <w:tc>
+          <w:tcPr/>
+          <w:p>
+            <w:pPr>
+              <w:pStyle w:val="Compact"/>
+              <w:jc w:val="right"/>
+            </w:pPr>
+            <w:r>
+              <w:t xml:space="preserve">1,623,085</w:t>
+            </w:r>
+          </w:p>
+        </w:tc>
+        <w:tc>
+          <w:tcPr/>
+          <w:p>
+            <w:pPr>
+              <w:pStyle w:val="Compact"/>
+              <w:jc w:val="right"/>
+            </w:pPr>
+            <w:r>
+              <w:t xml:space="preserve">12,355,817</w:t>
+            </w:r>
+          </w:p>
+        </w:tc>
+        <w:tc>
+          <w:tcPr/>
+          <w:p>
+            <w:pPr>
+              <w:pStyle w:val="Compact"/>
+              <w:jc w:val="right"/>
+            </w:pPr>
+            <w:r>
+              <w:t xml:space="preserve">914,329.9294</w:t>
             </w:r>
           </w:p>
         </w:tc>
@@ -919,31 +919,31 @@
               <w:jc w:val="right"/>
             </w:pPr>
             <w:r>
-              <w:t xml:space="preserve">2,389,642</w:t>
-            </w:r>
-          </w:p>
-        </w:tc>
-        <w:tc>
-          <w:tcPr/>
-          <w:p>
-            <w:pPr>
-              <w:pStyle w:val="Compact"/>
-              <w:jc w:val="right"/>
-            </w:pPr>
-            <w:r>
-              <w:t xml:space="preserve">13,427,371</w:t>
-            </w:r>
-          </w:p>
-        </w:tc>
-        <w:tc>
-          <w:tcPr/>
-          <w:p>
-            <w:pPr>
-              <w:pStyle w:val="Compact"/>
-              <w:jc w:val="right"/>
-            </w:pPr>
-            <w:r>
-              <w:t xml:space="preserve">1,678,928.1874</w:t>
+              <w:t xml:space="preserve">2,588,401</w:t>
+            </w:r>
+          </w:p>
+        </w:tc>
+        <w:tc>
+          <w:tcPr/>
+          <w:p>
+            <w:pPr>
+              <w:pStyle w:val="Compact"/>
+              <w:jc w:val="right"/>
+            </w:pPr>
+            <w:r>
+              <w:t xml:space="preserve">13,626,130</w:t>
+            </w:r>
+          </w:p>
+        </w:tc>
+        <w:tc>
+          <w:tcPr/>
+          <w:p>
+            <w:pPr>
+              <w:pStyle w:val="Compact"/>
+              <w:jc w:val="right"/>
+            </w:pPr>
+            <w:r>
+              <w:t xml:space="preserve">1,780,474.5102</w:t>
             </w:r>
           </w:p>
         </w:tc>
@@ -992,7 +992,7 @@
                 <w:b/>
                 <w:bCs/>
               </w:rPr>
-              <w:t xml:space="preserve">625,374</w:t>
+              <w:t xml:space="preserve">625,385</w:t>
             </w:r>
           </w:p>
         </w:tc>
@@ -1008,7 +1008,7 @@
                 <w:b/>
                 <w:bCs/>
               </w:rPr>
-              <w:t xml:space="preserve">6,775,284</w:t>
+              <w:t xml:space="preserve">25,186,546</w:t>
             </w:r>
           </w:p>
         </w:tc>
@@ -1024,7 +1024,7 @@
                 <w:b/>
                 <w:bCs/>
               </w:rPr>
-              <w:t xml:space="preserve">41,249,584</w:t>
+              <w:t xml:space="preserve">59,660,857</w:t>
             </w:r>
           </w:p>
         </w:tc>
@@ -1040,7 +1040,7 @@
                 <w:b/>
                 <w:bCs/>
               </w:rPr>
-              <w:t xml:space="preserve">4,183,364.4129</w:t>
+              <w:t xml:space="preserve">13,512,552.2294</w:t>
             </w:r>
           </w:p>
         </w:tc>
@@ -1055,10 +1055,10 @@
           <w:b/>
           <w:bCs/>
         </w:rPr>
-        <w:t xml:space="preserve">Cumulative score 54.9637%</w:t>
-      </w:r>
-      <w:r>
-        <w:t xml:space="preserve">: the sum of the increases you awarded (1.659986%, 10.730988%, 14.901054%, 4.130718%) plus this round's 23.5409%, as your update log of 2026-08-18 defines it. Round 1 is held out: awarded on records, before the equivalent-English metric.</w:t>
+        <w:t xml:space="preserve">Cumulative score 107.4616%</w:t>
+      </w:r>
+      <w:r>
+        <w:t xml:space="preserve">: the sum of the increases you awarded (1.659986%, 10.730988%, 14.901054%, 4.130718%) plus this round's 76.0389%, as your update log of 2026-08-18 defines it. Round 1 is held out: awarded on records, before the equivalent-English metric.</w:t>
       </w:r>
     </w:p>
     <w:bookmarkEnd w:id="9"/>
@@ -1076,7 +1076,13 @@
         <w:pStyle w:val="FirstParagraph"/>
       </w:pPr>
       <w:r>
-        <w:t xml:space="preserve">Three things, largest first:</w:t>
+        <w:t xml:space="preserve">Four things, largest first. All four are re-readings of bytes already on disk under the unit you</w:t>
+      </w:r>
+      <w:r>
+        <w:t xml:space="preserve"> </w:t>
+      </w:r>
+      <w:r>
+        <w:t xml:space="preserve">accepted on 1 September; none of them is a new download.</w:t>
       </w:r>
     </w:p>
     <w:p>
@@ -1092,7 +1098,7 @@
           <w:b/>
           <w:bCs/>
         </w:rPr>
-        <w:t xml:space="preserve">Capture corpora already on disk, re-read at hostname grain: 2,097,955 EE,</w:t>
+        <w:t xml:space="preserve">The ISC Internet Domain Survey's per-TLD host files, read one level below the registrable:</w:t>
       </w:r>
       <w:r>
         <w:rPr>
@@ -1106,111 +1112,135 @@
           <w:b/>
           <w:bCs/>
         </w:rPr>
-        <w:t xml:space="preserve">4,039,562 records from the NYPW TimeMaps and 631,148 EE, 1,163,616</w:t>
+        <w:t xml:space="preserve">9,167,369 EE, 18,117,395 records at 1996 and 1997.</w:t>
+      </w:r>
+      <w:r>
+        <w:t xml:space="preserve"> </w:t>
+      </w:r>
+      <w:r>
+        <w:t xml:space="preserve">Banked in July for the registrables</w:t>
+      </w:r>
+      <w:r>
+        <w:t xml:space="preserve"> </w:t>
+      </w:r>
+      <w:r>
+        <w:t xml:space="preserve">they imply and closed as complete, these files are a reverse-DNS walk: every line is</w:t>
+      </w:r>
+      <w:r>
+        <w:t xml:space="preserve"> </w:t>
+      </w:r>
+      <w:r>
+        <w:rPr>
+          <w:rStyle w:val="VerbatimChar"/>
+        </w:rPr>
+        <w:t xml:space="preserve">IP hostname</w:t>
+      </w:r>
+      <w:r>
+        <w:t xml:space="preserve">, the host itself, which the registrable ingest discarded.</w:t>
+      </w:r>
+      <w:r>
+        <w:t xml:space="preserve"> </w:t>
       </w:r>
       <w:r>
         <w:rPr>
           <w:b/>
           <w:bCs/>
         </w:rPr>
-        <w:t xml:space="preserve"> </w:t>
+        <w:t xml:space="preserve">The disclosure that</w:t>
       </w:r>
       <w:r>
         <w:rPr>
           <w:b/>
           <w:bCs/>
         </w:rPr>
-        <w:t xml:space="preserve">records from IA's Early Web index.</w:t>
-      </w:r>
-      <w:r>
-        <w:t xml:space="preserve"> </w:t>
-      </w:r>
-      <w:r>
-        <w:t xml:space="preserve">Until you accepted hostnames the pipeline collapsed every</w:t>
-      </w:r>
-      <w:r>
-        <w:t xml:space="preserve"> </w:t>
-      </w:r>
-      <w:r>
-        <w:t xml:space="preserve">host to its registrable, so the NYPW TimeMaps (34 parts, CC BY 4.0), the 224 Early Web CDX</w:t>
-      </w:r>
-      <w:r>
-        <w:t xml:space="preserve"> </w:t>
-      </w:r>
-      <w:r>
-        <w:t xml:space="preserve">parts and 180 domain-wide CDX journals stood recorded as spent or worth 0. The same bytes,</w:t>
-      </w:r>
-      <w:r>
-        <w:t xml:space="preserve"> </w:t>
-      </w:r>
-      <w:r>
-        <w:t xml:space="preserve">re-read under the new unit, are the largest source of the round, with no new request. One</w:t>
-      </w:r>
-      <w:r>
-        <w:t xml:space="preserve"> </w:t>
-      </w:r>
-      <w:r>
-        <w:t xml:space="preserve">disclosure decides what the Early Web half is worth: nearly all of its records are</w:t>
-      </w:r>
-      <w:r>
-        <w:t xml:space="preserve"> </w:t>
-      </w:r>
-      <w:r>
-        <w:rPr>
-          <w:rStyle w:val="VerbatimChar"/>
-        </w:rPr>
-        <w:t xml:space="preserve">www.</w:t>
-      </w:r>
-      <w:r>
-        <w:t xml:space="preserve"> </w:t>
-      </w:r>
-      <w:r>
-        <w:t xml:space="preserve">forms of a registrable you already hold in that year, because your own files carry the</w:t>
-      </w:r>
-      <w:r>
-        <w:t xml:space="preserve"> </w:t>
-      </w:r>
-      <w:r>
-        <w:t xml:space="preserve">non-</w:t>
-      </w:r>
-      <w:r>
-        <w:rPr>
-          <w:rStyle w:val="VerbatimChar"/>
-        </w:rPr>
-        <w:t xml:space="preserve">www.</w:t>
-      </w:r>
-      <w:r>
-        <w:t xml:space="preserve"> </w:t>
-      </w:r>
-      <w:r>
-        <w:t xml:space="preserve">hosts by name and almost no</w:t>
-      </w:r>
-      <w:r>
-        <w:t xml:space="preserve"> </w:t>
-      </w:r>
-      <w:r>
-        <w:rPr>
-          <w:rStyle w:val="VerbatimChar"/>
-        </w:rPr>
-        <w:t xml:space="preserve">www.</w:t>
-      </w:r>
-      <w:r>
-        <w:t xml:space="preserve"> </w:t>
-      </w:r>
-      <w:r>
-        <w:t xml:space="preserve">ones. A third IA index, the USFEDGOV-EXTRACT-2001</w:t>
-      </w:r>
-      <w:r>
-        <w:t xml:space="preserve"> </w:t>
-      </w:r>
-      <w:r>
-        <w:t xml:space="preserve">merged CDX, adds 21,926 EE over 22,417 federal hosts at 2001 from one</w:t>
-      </w:r>
-      <w:r>
-        <w:t xml:space="preserve"> </w:t>
-      </w:r>
-      <w:r>
-        <w:t xml:space="preserve">bulk download.</w:t>
+        <w:t xml:space="preserve"> </w:t>
+      </w:r>
+      <w:r>
+        <w:rPr>
+          <w:b/>
+          <w:bCs/>
+        </w:rPr>
+        <w:t xml:space="preserve">decides what this is worth: 65% of the records are dialup or numbered</w:t>
+      </w:r>
+      <w:r>
+        <w:rPr>
+          <w:b/>
+          <w:bCs/>
+        </w:rPr>
+        <w:t xml:space="preserve"> </w:t>
+      </w:r>
+      <w:r>
+        <w:rPr>
+          <w:b/>
+          <w:bCs/>
+        </w:rPr>
+        <w:t xml:space="preserve">workstation names</w:t>
+      </w:r>
+      <w:r>
+        <w:t xml:space="preserve"> </w:t>
+      </w:r>
+      <w:r>
+        <w:t xml:space="preserve">(</w:t>
+      </w:r>
+      <w:r>
+        <w:rPr>
+          <w:rStyle w:val="VerbatimChar"/>
+        </w:rPr>
+        <w:t xml:space="preserve">pc50.btbcs.bt.co.uk</w:t>
+      </w:r>
+      <w:r>
+        <w:t xml:space="preserve">,</w:t>
+      </w:r>
+      <w:r>
+        <w:t xml:space="preserve"> </w:t>
+      </w:r>
+      <w:r>
+        <w:rPr>
+          <w:rStyle w:val="VerbatimChar"/>
+        </w:rPr>
+        <w:t xml:space="preserve">dynws2.mdx.ac.uk</w:t>
+      </w:r>
+      <w:r>
+        <w:t xml:space="preserve">). They are real hosts that</w:t>
+      </w:r>
+      <w:r>
+        <w:t xml:space="preserve"> </w:t>
+      </w:r>
+      <w:r>
+        <w:t xml:space="preserve">answered in DNS in the month the survey stamps, and they satisfy your validity rule, but they</w:t>
+      </w:r>
+      <w:r>
+        <w:t xml:space="preserve"> </w:t>
+      </w:r>
+      <w:r>
+        <w:t xml:space="preserve">are not sites. They ship in the hostname files with everything else so you can drop them as a</w:t>
+      </w:r>
+      <w:r>
+        <w:t xml:space="preserve"> </w:t>
+      </w:r>
+      <w:r>
+        <w:t xml:space="preserve">block if you do not want them;</w:t>
+      </w:r>
+      <w:r>
+        <w:t xml:space="preserve"> </w:t>
+      </w:r>
+      <w:r>
+        <w:rPr>
+          <w:rStyle w:val="VerbatimChar"/>
+        </w:rPr>
+        <w:t xml:space="preserve">hostnames/hostnames_evidence_manifest.csv</w:t>
+      </w:r>
+      <w:r>
+        <w:t xml:space="preserve"> </w:t>
+      </w:r>
+      <w:r>
+        <w:t xml:space="preserve">names the source of</w:t>
+      </w:r>
+      <w:r>
+        <w:t xml:space="preserve"> </w:t>
+      </w:r>
+      <w:r>
+        <w:t xml:space="preserve">every record.</w:t>
       </w:r>
     </w:p>
     <w:p>
@@ -1226,7 +1256,7 @@
           <w:b/>
           <w:bCs/>
         </w:rPr>
-        <w:t xml:space="preserve">Domain-wide CDX sweeps over subdomain platforms: 1,075,867 EE, 1,472,929</w:t>
+        <w:t xml:space="preserve">Capture corpora already on disk, re-read at hostname grain: 2,097,955 EE,</w:t>
       </w:r>
       <w:r>
         <w:rPr>
@@ -1240,79 +1270,105 @@
           <w:b/>
           <w:bCs/>
         </w:rPr>
-        <w:t xml:space="preserve">records.</w:t>
-      </w:r>
-      <w:r>
-        <w:t xml:space="preserve"> </w:t>
-      </w:r>
-      <w:r>
-        <w:rPr>
-          <w:rStyle w:val="VerbatimChar"/>
-        </w:rPr>
-        <w:t xml:space="preserve">matchType=domain</w:t>
-      </w:r>
-      <w:r>
-        <w:t xml:space="preserve">, 1996-2001, over the parents your own benchmark proves dense</w:t>
-      </w:r>
-      <w:r>
-        <w:t xml:space="preserve"> </w:t>
-      </w:r>
-      <w:r>
-        <w:t xml:space="preserve">(</w:t>
-      </w:r>
-      <w:r>
-        <w:rPr>
-          <w:rStyle w:val="VerbatimChar"/>
-        </w:rPr>
-        <w:t xml:space="preserve">rank_platform_parents.py</w:t>
-      </w:r>
-      <w:r>
-        <w:t xml:space="preserve">:</w:t>
-      </w:r>
-      <w:r>
-        <w:t xml:space="preserve"> </w:t>
-      </w:r>
-      <w:r>
-        <w:rPr>
-          <w:rStyle w:val="VerbatimChar"/>
-        </w:rPr>
-        <w:t xml:space="preserve">cjb.net</w:t>
-      </w:r>
-      <w:r>
-        <w:t xml:space="preserve"> </w:t>
-      </w:r>
-      <w:r>
-        <w:t xml:space="preserve">leads at 157,790 sub-hosts held, then</w:t>
-      </w:r>
-      <w:r>
-        <w:t xml:space="preserve"> </w:t>
-      </w:r>
-      <w:r>
-        <w:rPr>
-          <w:rStyle w:val="VerbatimChar"/>
-        </w:rPr>
-        <w:t xml:space="preserve">demon.co.uk</w:t>
-      </w:r>
-      <w:r>
-        <w:t xml:space="preserve">,</w:t>
-      </w:r>
-      <w:r>
-        <w:t xml:space="preserve"> </w:t>
-      </w:r>
-      <w:r>
-        <w:rPr>
-          <w:rStyle w:val="VerbatimChar"/>
-        </w:rPr>
-        <w:t xml:space="preserve">freeserve.co.uk</w:t>
-      </w:r>
-      <w:r>
-        <w:t xml:space="preserve">). This is the workflow your 0901 update describes; each parent is resumable</w:t>
-      </w:r>
-      <w:r>
-        <w:t xml:space="preserve"> </w:t>
-      </w:r>
-      <w:r>
-        <w:t xml:space="preserve">from the saturation ledger.</w:t>
+        <w:t xml:space="preserve">4,039,562 records from the NYPW TimeMaps and 631,148 EE, 1,163,616</w:t>
+      </w:r>
+      <w:r>
+        <w:rPr>
+          <w:b/>
+          <w:bCs/>
+        </w:rPr>
+        <w:t xml:space="preserve"> </w:t>
+      </w:r>
+      <w:r>
+        <w:rPr>
+          <w:b/>
+          <w:bCs/>
+        </w:rPr>
+        <w:t xml:space="preserve">records from IA's Early Web index.</w:t>
+      </w:r>
+      <w:r>
+        <w:t xml:space="preserve"> </w:t>
+      </w:r>
+      <w:r>
+        <w:t xml:space="preserve">The NYPW TimeMaps (34 parts, CC BY 4.0), the 224 Early Web</w:t>
+      </w:r>
+      <w:r>
+        <w:t xml:space="preserve"> </w:t>
+      </w:r>
+      <w:r>
+        <w:t xml:space="preserve">CDX parts and 180 domain-wide CDX journals stood recorded as spent or worth 0 at registrable</w:t>
+      </w:r>
+      <w:r>
+        <w:t xml:space="preserve"> </w:t>
+      </w:r>
+      <w:r>
+        <w:t xml:space="preserve">grain. A second disclosure, on the Early Web half: nearly all of its records are</w:t>
+      </w:r>
+      <w:r>
+        <w:t xml:space="preserve"> </w:t>
+      </w:r>
+      <w:r>
+        <w:rPr>
+          <w:rStyle w:val="VerbatimChar"/>
+        </w:rPr>
+        <w:t xml:space="preserve">www.</w:t>
+      </w:r>
+      <w:r>
+        <w:t xml:space="preserve"> </w:t>
+      </w:r>
+      <w:r>
+        <w:t xml:space="preserve">forms of</w:t>
+      </w:r>
+      <w:r>
+        <w:t xml:space="preserve"> </w:t>
+      </w:r>
+      <w:r>
+        <w:t xml:space="preserve">a registrable you already hold in that year, because your own files carry the non-</w:t>
+      </w:r>
+      <w:r>
+        <w:rPr>
+          <w:rStyle w:val="VerbatimChar"/>
+        </w:rPr>
+        <w:t xml:space="preserve">www.</w:t>
+      </w:r>
+      <w:r>
+        <w:t xml:space="preserve"> </w:t>
+      </w:r>
+      <w:r>
+        <w:t xml:space="preserve">hosts</w:t>
+      </w:r>
+      <w:r>
+        <w:t xml:space="preserve"> </w:t>
+      </w:r>
+      <w:r>
+        <w:t xml:space="preserve">by name and almost no</w:t>
+      </w:r>
+      <w:r>
+        <w:t xml:space="preserve"> </w:t>
+      </w:r>
+      <w:r>
+        <w:rPr>
+          <w:rStyle w:val="VerbatimChar"/>
+        </w:rPr>
+        <w:t xml:space="preserve">www.</w:t>
+      </w:r>
+      <w:r>
+        <w:t xml:space="preserve"> </w:t>
+      </w:r>
+      <w:r>
+        <w:t xml:space="preserve">ones. A third IA index, the six USFEDGOV-EXTRACT merged CDX files</w:t>
+      </w:r>
+      <w:r>
+        <w:t xml:space="preserve"> </w:t>
+      </w:r>
+      <w:r>
+        <w:t xml:space="preserve">for 1996-2001, adds 39,340 EE over 40,260 federal host-years from six</w:t>
+      </w:r>
+      <w:r>
+        <w:t xml:space="preserve"> </w:t>
+      </w:r>
+      <w:r>
+        <w:t xml:space="preserve">bulk downloads and no API request.</w:t>
       </w:r>
     </w:p>
     <w:p>
@@ -1328,7 +1384,109 @@
           <w:b/>
           <w:bCs/>
         </w:rPr>
-        <w:t xml:space="preserve">Registrable domains, the prioritized unit: 329,386.4981 EE, 625,374 records.</w:t>
+        <w:t xml:space="preserve">Domain-wide CDX sweeps over subdomain platforms: 1,220,260 EE, 1,748,953</w:t>
+      </w:r>
+      <w:r>
+        <w:rPr>
+          <w:b/>
+          <w:bCs/>
+        </w:rPr>
+        <w:t xml:space="preserve"> </w:t>
+      </w:r>
+      <w:r>
+        <w:rPr>
+          <w:b/>
+          <w:bCs/>
+        </w:rPr>
+        <w:t xml:space="preserve">records.</w:t>
+      </w:r>
+      <w:r>
+        <w:t xml:space="preserve"> </w:t>
+      </w:r>
+      <w:r>
+        <w:rPr>
+          <w:rStyle w:val="VerbatimChar"/>
+        </w:rPr>
+        <w:t xml:space="preserve">matchType=domain</w:t>
+      </w:r>
+      <w:r>
+        <w:t xml:space="preserve">, 1996-2001, over the parents your own benchmark proves dense</w:t>
+      </w:r>
+      <w:r>
+        <w:t xml:space="preserve"> </w:t>
+      </w:r>
+      <w:r>
+        <w:t xml:space="preserve">(</w:t>
+      </w:r>
+      <w:r>
+        <w:rPr>
+          <w:rStyle w:val="VerbatimChar"/>
+        </w:rPr>
+        <w:t xml:space="preserve">rank_platform_parents.py</w:t>
+      </w:r>
+      <w:r>
+        <w:t xml:space="preserve">:</w:t>
+      </w:r>
+      <w:r>
+        <w:t xml:space="preserve"> </w:t>
+      </w:r>
+      <w:r>
+        <w:rPr>
+          <w:rStyle w:val="VerbatimChar"/>
+        </w:rPr>
+        <w:t xml:space="preserve">cjb.net</w:t>
+      </w:r>
+      <w:r>
+        <w:t xml:space="preserve"> </w:t>
+      </w:r>
+      <w:r>
+        <w:t xml:space="preserve">leads at 157,790 sub-hosts held, then</w:t>
+      </w:r>
+      <w:r>
+        <w:t xml:space="preserve"> </w:t>
+      </w:r>
+      <w:r>
+        <w:rPr>
+          <w:rStyle w:val="VerbatimChar"/>
+        </w:rPr>
+        <w:t xml:space="preserve">demon.co.uk</w:t>
+      </w:r>
+      <w:r>
+        <w:t xml:space="preserve">,</w:t>
+      </w:r>
+      <w:r>
+        <w:t xml:space="preserve"> </w:t>
+      </w:r>
+      <w:r>
+        <w:rPr>
+          <w:rStyle w:val="VerbatimChar"/>
+        </w:rPr>
+        <w:t xml:space="preserve">freeserve.co.uk</w:t>
+      </w:r>
+      <w:r>
+        <w:t xml:space="preserve">). This is the workflow your 0901 update describes; each parent is resumable</w:t>
+      </w:r>
+      <w:r>
+        <w:t xml:space="preserve"> </w:t>
+      </w:r>
+      <w:r>
+        <w:t xml:space="preserve">from the saturation ledger.</w:t>
+      </w:r>
+    </w:p>
+    <w:p>
+      <w:pPr>
+        <w:pStyle w:val="Compact"/>
+        <w:numPr>
+          <w:ilvl w:val="0"/>
+          <w:numId w:val="1001"/>
+        </w:numPr>
+      </w:pPr>
+      <w:r>
+        <w:rPr>
+          <w:b/>
+          <w:bCs/>
+        </w:rPr>
+        <w:t xml:space="preserve">Registrable domains, the prioritized unit: 329,397.2492 EE, 625,385 records.</w:t>
       </w:r>
       <w:r>
         <w:t xml:space="preserve"> </w:t>
@@ -1352,7 +1510,7 @@
         <w:t xml:space="preserve"> </w:t>
       </w:r>
       <w:r>
-        <w:t xml:space="preserve">(71,388) and 24 small dated artifacts (40,964). 46,766 of</w:t>
+        <w:t xml:space="preserve">(71,388) and 24 small dated artifacts (40,975). 46,773 of</w:t>
       </w:r>
       <w:r>
         <w:t xml:space="preserve"> </w:t>
@@ -1448,6 +1606,68 @@
               <w:rPr>
                 <w:rStyle w:val="VerbatimChar"/>
               </w:rPr>
+              <w:t xml:space="preserve">isc_survey_host_list</w:t>
+            </w:r>
+          </w:p>
+        </w:tc>
+        <w:tc>
+          <w:tcPr/>
+          <w:p>
+            <w:pPr>
+              <w:pStyle w:val="Compact"/>
+            </w:pPr>
+            <w:r>
+              <w:t xml:space="preserve">hostname</w:t>
+            </w:r>
+          </w:p>
+        </w:tc>
+        <w:tc>
+          <w:tcPr/>
+          <w:p>
+            <w:pPr>
+              <w:pStyle w:val="Compact"/>
+            </w:pPr>
+            <w:r>
+              <w:t xml:space="preserve">the survey's own YYMM edition code in the artifact's path</w:t>
+            </w:r>
+          </w:p>
+        </w:tc>
+        <w:tc>
+          <w:tcPr/>
+          <w:p>
+            <w:pPr>
+              <w:pStyle w:val="Compact"/>
+              <w:jc w:val="right"/>
+            </w:pPr>
+            <w:r>
+              <w:t xml:space="preserve">18,117,395</w:t>
+            </w:r>
+          </w:p>
+        </w:tc>
+        <w:tc>
+          <w:tcPr/>
+          <w:p>
+            <w:pPr>
+              <w:pStyle w:val="Compact"/>
+              <w:jc w:val="right"/>
+            </w:pPr>
+            <w:r>
+              <w:t xml:space="preserve">9,167,369</w:t>
+            </w:r>
+          </w:p>
+        </w:tc>
+      </w:tr>
+      <w:tr>
+        <w:tc>
+          <w:tcPr/>
+          <w:p>
+            <w:pPr>
+              <w:pStyle w:val="Compact"/>
+            </w:pPr>
+            <w:r>
+              <w:rPr>
+                <w:rStyle w:val="VerbatimChar"/>
+              </w:rPr>
               <w:t xml:space="preserve">nypw_timemap_hostgrain</w:t>
             </w:r>
           </w:p>
@@ -1544,19 +1764,19 @@
               <w:jc w:val="right"/>
             </w:pPr>
             <w:r>
-              <w:t xml:space="preserve">1,472,929</w:t>
-            </w:r>
-          </w:p>
-        </w:tc>
-        <w:tc>
-          <w:tcPr/>
-          <w:p>
-            <w:pPr>
-              <w:pStyle w:val="Compact"/>
-              <w:jc w:val="right"/>
-            </w:pPr>
-            <w:r>
-              <w:t xml:space="preserve">1,075,867</w:t>
+              <w:t xml:space="preserve">1,748,953</w:t>
+            </w:r>
+          </w:p>
+        </w:tc>
+        <w:tc>
+          <w:tcPr/>
+          <w:p>
+            <w:pPr>
+              <w:pStyle w:val="Compact"/>
+              <w:jc w:val="right"/>
+            </w:pPr>
+            <w:r>
+              <w:t xml:space="preserve">1,220,260</w:t>
             </w:r>
           </w:p>
         </w:tc>
@@ -1755,84 +1975,7 @@
               <w:pStyle w:val="Compact"/>
             </w:pPr>
             <w:r>
-              <w:rPr>
-                <w:rStyle w:val="VerbatimChar"/>
-              </w:rPr>
-              <w:t xml:space="preserve">usenet_address</w:t>
-            </w:r>
-          </w:p>
-        </w:tc>
-        <w:tc>
-          <w:tcPr/>
-          <w:p>
-            <w:pPr>
-              <w:pStyle w:val="Compact"/>
-            </w:pPr>
-            <w:r>
-              <w:t xml:space="preserve">registrable</w:t>
-            </w:r>
-          </w:p>
-        </w:tc>
-        <w:tc>
-          <w:tcPr/>
-          <w:p>
-            <w:pPr>
-              <w:pStyle w:val="Compact"/>
-            </w:pPr>
-            <w:r>
-              <w:t xml:space="preserve">the post's</w:t>
-            </w:r>
-            <w:r>
-              <w:t xml:space="preserve"> </w:t>
-            </w:r>
-            <w:r>
-              <w:rPr>
-                <w:rStyle w:val="VerbatimChar"/>
-              </w:rPr>
-              <w:t xml:space="preserve">Date:</w:t>
-            </w:r>
-            <w:r>
-              <w:t xml:space="preserve"> </w:t>
-            </w:r>
-            <w:r>
-              <w:t xml:space="preserve">header, corroborated by a second source</w:t>
-            </w:r>
-          </w:p>
-        </w:tc>
-        <w:tc>
-          <w:tcPr/>
-          <w:p>
-            <w:pPr>
-              <w:pStyle w:val="Compact"/>
-              <w:jc w:val="right"/>
-            </w:pPr>
-            <w:r>
-              <w:t xml:space="preserve">67,145</w:t>
-            </w:r>
-          </w:p>
-        </w:tc>
-        <w:tc>
-          <w:tcPr/>
-          <w:p>
-            <w:pPr>
-              <w:pStyle w:val="Compact"/>
-              <w:jc w:val="right"/>
-            </w:pPr>
-            <w:r>
-              <w:t xml:space="preserve">39,232</w:t>
-            </w:r>
-          </w:p>
-        </w:tc>
-      </w:tr>
-      <w:tr>
-        <w:tc>
-          <w:tcPr/>
-          <w:p>
-            <w:pPr>
-              <w:pStyle w:val="Compact"/>
-            </w:pPr>
-            <w:r>
-              <w:t xml:space="preserve">33 further sources</w:t>
+              <w:t xml:space="preserve">34 further sources</w:t>
             </w:r>
           </w:p>
         </w:tc>
@@ -1890,19 +2033,19 @@
               <w:jc w:val="right"/>
             </w:pPr>
             <w:r>
-              <w:t xml:space="preserve">235,260</w:t>
-            </w:r>
-          </w:p>
-        </w:tc>
-        <w:tc>
-          <w:tcPr/>
-          <w:p>
-            <w:pPr>
-              <w:pStyle w:val="Compact"/>
-              <w:jc w:val="right"/>
-            </w:pPr>
-            <w:r>
-              <w:t xml:space="preserve">128,809</w:t>
+              <w:t xml:space="preserve">320,259</w:t>
+            </w:r>
+          </w:p>
+        </w:tc>
+        <w:tc>
+          <w:tcPr/>
+          <w:p>
+            <w:pPr>
+              <w:pStyle w:val="Compact"/>
+              <w:jc w:val="right"/>
+            </w:pPr>
+            <w:r>
+              <w:t xml:space="preserve">185,465</w:t>
             </w:r>
           </w:p>
         </w:tc>
@@ -1951,7 +2094,7 @@
                 <w:b/>
                 <w:bCs/>
               </w:rPr>
-              <w:t xml:space="preserve">7,400,658</w:t>
+              <w:t xml:space="preserve">25,811,931</w:t>
             </w:r>
           </w:p>
         </w:tc>
@@ -1967,7 +2110,7 @@
                 <w:b/>
                 <w:bCs/>
               </w:rPr>
-              <w:t xml:space="preserve">4,183,364</w:t>
+              <w:t xml:space="preserve">13,512,552</w:t>
             </w:r>
           </w:p>
         </w:tc>
@@ -2032,7 +2175,7 @@
         <w:t xml:space="preserve"> </w:t>
       </w:r>
       <w:r>
-        <w:t xml:space="preserve">90.2% of the hostnames are</w:t>
+        <w:t xml:space="preserve">25.4% of the hostnames are</w:t>
       </w:r>
       <w:r>
         <w:t xml:space="preserve"> </w:t>
@@ -2298,7 +2441,7 @@
           <w:b/>
           <w:bCs/>
         </w:rPr>
-        <w:t xml:space="preserve">2,419,437 domains carry no year evidence</w:t>
+        <w:t xml:space="preserve">2,419,436 domains carry no year evidence</w:t>
       </w:r>
       <w:r>
         <w:t xml:space="preserve"> </w:t>
@@ -2758,6 +2901,24 @@
       <w:r>
         <w:t xml:space="preserve">line, under the RIPE NCC's written permission.</w:t>
       </w:r>
+      <w:r>
+        <w:t xml:space="preserve"> </w:t>
+      </w:r>
+      <w:r>
+        <w:t xml:space="preserve">The fourth is item 1 of section 2, the ISC survey host files, which is the largest single</w:t>
+      </w:r>
+      <w:r>
+        <w:t xml:space="preserve"> </w:t>
+      </w:r>
+      <w:r>
+        <w:t xml:space="preserve">admission of the round and reached the same way: a column of a banked artifact that the</w:t>
+      </w:r>
+      <w:r>
+        <w:t xml:space="preserve"> </w:t>
+      </w:r>
+      <w:r>
+        <w:t xml:space="preserve">registrable unit threw away.</w:t>
+      </w:r>
     </w:p>
     <w:p>
       <w:pPr>
@@ -2803,7 +2964,7 @@
           <w:b/>
           <w:bCs/>
         </w:rPr>
-        <w:t xml:space="preserve">484 source families searched and recorded</w:t>
+        <w:t xml:space="preserve">493 source families searched and recorded</w:t>
       </w:r>
       <w:r>
         <w:t xml:space="preserve"> </w:t>
@@ -2821,7 +2982,7 @@
         <w:t xml:space="preserve">sources.md</w:t>
       </w:r>
       <w:r>
-        <w:t xml:space="preserve">: 65 developed, 419 evaluated and closed with the measurement that closed them, so the same ground is not broken twice.</w:t>
+        <w:t xml:space="preserve">: 65 developed, 428 evaluated and closed with the measurement that closed them, so the same ground is not broken twice.</w:t>
       </w:r>
     </w:p>
     <w:p>
@@ -3006,27 +3167,114 @@
         <w:pStyle w:val="FirstParagraph"/>
       </w:pPr>
       <w:r>
-        <w:t xml:space="preserve">A capture proves presence, never absence: a year without one is unevidenced, not empty. The</w:t>
-      </w:r>
-      <w:r>
-        <w:t xml:space="preserve"> </w:t>
-      </w:r>
-      <w:r>
-        <w:t xml:space="preserve">hostname unit rewards platforms with many sub-hosts, so it is concentrated in 2000 and 2001.</w:t>
+        <w:t xml:space="preserve">Three limits, in the order they affect the figure:</w:t>
       </w:r>
     </w:p>
     <w:p>
       <w:pPr>
-        <w:pStyle w:val="BodyText"/>
-      </w:pPr>
-      <w:r>
-        <w:t xml:space="preserve">Worth expanding, in order: the remaining ranked platforms, resumable from the ledger; the</w:t>
-      </w:r>
-      <w:r>
-        <w:t xml:space="preserve"> </w:t>
-      </w:r>
-      <w:r>
-        <w:t xml:space="preserve">second-level suffix namespaces at hostname grain (</w:t>
+        <w:pStyle w:val="Compact"/>
+        <w:numPr>
+          <w:ilvl w:val="0"/>
+          <w:numId w:val="1005"/>
+        </w:numPr>
+      </w:pPr>
+      <w:r>
+        <w:rPr>
+          <w:b/>
+          <w:bCs/>
+        </w:rPr>
+        <w:t xml:space="preserve">A hostname is not a site.</w:t>
+      </w:r>
+      <w:r>
+        <w:t xml:space="preserve"> </w:t>
+      </w:r>
+      <w:r>
+        <w:t xml:space="preserve">Under your rule a valid distinct hostname counts, and a</w:t>
+      </w:r>
+      <w:r>
+        <w:t xml:space="preserve"> </w:t>
+      </w:r>
+      <w:r>
+        <w:t xml:space="preserve">reverse-DNS walk resolves dialup ports and workstations as readily as web servers. That is</w:t>
+      </w:r>
+      <w:r>
+        <w:t xml:space="preserve"> </w:t>
+      </w:r>
+      <w:r>
+        <w:t xml:space="preserve">where most of this round's records come from and it is quoted per source, so a cut is one</w:t>
+      </w:r>
+      <w:r>
+        <w:t xml:space="preserve"> </w:t>
+      </w:r>
+      <w:r>
+        <w:t xml:space="preserve">filter on the manifest rather than a re-derivation.</w:t>
+      </w:r>
+    </w:p>
+    <w:p>
+      <w:pPr>
+        <w:pStyle w:val="Compact"/>
+        <w:numPr>
+          <w:ilvl w:val="0"/>
+          <w:numId w:val="1005"/>
+        </w:numPr>
+      </w:pPr>
+      <w:r>
+        <w:rPr>
+          <w:b/>
+          <w:bCs/>
+        </w:rPr>
+        <w:t xml:space="preserve">A capture proves presence, never absence.</w:t>
+      </w:r>
+      <w:r>
+        <w:t xml:space="preserve"> </w:t>
+      </w:r>
+      <w:r>
+        <w:t xml:space="preserve">A year without one is unevidenced, not empty.</w:t>
+      </w:r>
+    </w:p>
+    <w:p>
+      <w:pPr>
+        <w:pStyle w:val="Compact"/>
+        <w:numPr>
+          <w:ilvl w:val="0"/>
+          <w:numId w:val="1005"/>
+        </w:numPr>
+      </w:pPr>
+      <w:r>
+        <w:rPr>
+          <w:b/>
+          <w:bCs/>
+        </w:rPr>
+        <w:t xml:space="preserve">The two units are counted disjointly and shipped separately</w:t>
+      </w:r>
+      <w:r>
+        <w:t xml:space="preserve">, so discarding the hostname</w:t>
+      </w:r>
+      <w:r>
+        <w:t xml:space="preserve"> </w:t>
+      </w:r>
+      <w:r>
+        <w:t xml:space="preserve">files leaves the registrable round intact at 329,397.2492 EE.</w:t>
+      </w:r>
+    </w:p>
+    <w:p>
+      <w:pPr>
+        <w:pStyle w:val="FirstParagraph"/>
+      </w:pPr>
+      <w:r>
+        <w:t xml:space="preserve">Worth expanding, in order: the same one-level-down reading of every other banked artifact that</w:t>
+      </w:r>
+      <w:r>
+        <w:t xml:space="preserve"> </w:t>
+      </w:r>
+      <w:r>
+        <w:t xml:space="preserve">names hosts (DNS, mail and mirror rosters are the natural seam, since a web crawler never fetched</w:t>
+      </w:r>
+      <w:r>
+        <w:t xml:space="preserve"> </w:t>
+      </w:r>
+      <w:r>
+        <w:t xml:space="preserve">them); the second-level suffix namespaces at hostname grain (</w:t>
       </w:r>
       <w:r>
         <w:rPr>
@@ -3038,13 +3286,13 @@
         <w:t xml:space="preserve"> </w:t>
       </w:r>
       <w:r>
-        <w:t xml:space="preserve">alone is 3.39M index blocks and 1.2%</w:t>
-      </w:r>
-      <w:r>
-        <w:t xml:space="preserve"> </w:t>
-      </w:r>
-      <w:r>
-        <w:t xml:space="preserve">walked,</w:t>
+        <w:t xml:space="preserve">alone is 3.39M index blocks</w:t>
+      </w:r>
+      <w:r>
+        <w:t xml:space="preserve"> </w:t>
+      </w:r>
+      <w:r>
+        <w:t xml:space="preserve">and 1.2% walked,</w:t>
       </w:r>
       <w:r>
         <w:t xml:space="preserve"> </w:t>
@@ -3107,25 +3355,25 @@
         <w:t xml:space="preserve"> </w:t>
       </w:r>
       <w:r>
-        <w:t xml:space="preserve">queued behind it); every held</w:t>
-      </w:r>
-      <w:r>
-        <w:t xml:space="preserve"> </w:t>
-      </w:r>
-      <w:r>
-        <w:t xml:space="preserve">capture-bearing artifact re-read at hostname grain; registrable discovery by bracketed-gap CDX</w:t>
-      </w:r>
-      <w:r>
-        <w:t xml:space="preserve"> </w:t>
-      </w:r>
-      <w:r>
-        <w:t xml:space="preserve">queries at its measured rate. Not worth more time, measured: prose</w:t>
-      </w:r>
-      <w:r>
-        <w:t xml:space="preserve"> </w:t>
-      </w:r>
-      <w:r>
-        <w:t xml:space="preserve">corpora, academic repositories, CD-ROM media, FTP mirrors, trade directories.</w:t>
+        <w:t xml:space="preserve">queued behind it); the remaining</w:t>
+      </w:r>
+      <w:r>
+        <w:t xml:space="preserve"> </w:t>
+      </w:r>
+      <w:r>
+        <w:t xml:space="preserve">ranked subdomain platforms, resumable from the ledger; registrable discovery by bracketed-gap CDX</w:t>
+      </w:r>
+      <w:r>
+        <w:t xml:space="preserve"> </w:t>
+      </w:r>
+      <w:r>
+        <w:t xml:space="preserve">queries at its measured rate. Not worth more time, measured: prose corpora, academic repositories,</w:t>
+      </w:r>
+      <w:r>
+        <w:t xml:space="preserve"> </w:t>
+      </w:r>
+      <w:r>
+        <w:t xml:space="preserve">CD-ROM media, FTP mirrors, trade directories.</w:t>
       </w:r>
     </w:p>
     <w:bookmarkEnd w:id="14"/>
@@ -3260,7 +3508,7 @@
                 <w:b/>
                 <w:bCs/>
               </w:rPr>
-              <w:t xml:space="preserve">7,400,658</w:t>
+              <w:t xml:space="preserve">25,811,931</w:t>
             </w:r>
           </w:p>
         </w:tc>
@@ -3276,7 +3524,7 @@
                 <w:b/>
                 <w:bCs/>
               </w:rPr>
-              <w:t xml:space="preserve">4,183,364.4129</w:t>
+              <w:t xml:space="preserve">13,512,552.2294</w:t>
             </w:r>
           </w:p>
         </w:tc>
@@ -3301,19 +3549,19 @@
               <w:jc w:val="right"/>
             </w:pPr>
             <w:r>
-              <w:t xml:space="preserve">41,249,584</w:t>
-            </w:r>
-          </w:p>
-        </w:tc>
-        <w:tc>
-          <w:tcPr/>
-          <w:p>
-            <w:pPr>
-              <w:pStyle w:val="Compact"/>
-              <w:jc w:val="right"/>
-            </w:pPr>
-            <w:r>
-              <w:t xml:space="preserve">21,953,953.3155</w:t>
+              <w:t xml:space="preserve">59,660,857</w:t>
+            </w:r>
+          </w:p>
+        </w:tc>
+        <w:tc>
+          <w:tcPr/>
+          <w:p>
+            <w:pPr>
+              <w:pStyle w:val="Compact"/>
+              <w:jc w:val="right"/>
+            </w:pPr>
+            <w:r>
+              <w:t xml:space="preserve">31,283,141.1320</w:t>
             </w:r>
           </w:p>
         </w:tc>
@@ -3324,7 +3572,7 @@
         <w:pStyle w:val="Compact"/>
         <w:numPr>
           <w:ilvl w:val="0"/>
-          <w:numId w:val="1005"/>
+          <w:numId w:val="1006"/>
         </w:numPr>
       </w:pPr>
       <w:r>
@@ -3341,7 +3589,7 @@
         <w:t xml:space="preserve">0 records</w:t>
       </w:r>
       <w:r>
-        <w:t xml:space="preserve">, so all 7,400,658 submitted count once; the two unit files are disjoint in every year.</w:t>
+        <w:t xml:space="preserve">, so all 25,811,931 submitted count once; the two unit files are disjoint in every year.</w:t>
       </w:r>
     </w:p>
     <w:p>
@@ -3349,7 +3597,7 @@
         <w:pStyle w:val="Compact"/>
         <w:numPr>
           <w:ilvl w:val="0"/>
-          <w:numId w:val="1005"/>
+          <w:numId w:val="1006"/>
         </w:numPr>
       </w:pPr>
       <w:r>
@@ -3410,7 +3658,7 @@
         <w:pStyle w:val="Compact"/>
         <w:numPr>
           <w:ilvl w:val="0"/>
-          <w:numId w:val="1005"/>
+          <w:numId w:val="1006"/>
         </w:numPr>
       </w:pPr>
       <w:r>
@@ -4261,6 +4509,9 @@
     <w:abstractNumId w:val="991"/>
   </w:num>
   <w:num w:numId="1005">
+    <w:abstractNumId w:val="991"/>
+  </w:num>
+  <w:num w:numId="1006">
     <w:abstractNumId w:val="991"/>
   </w:num>
 </w:numbering>

</xml_diff>

<commit_message>
Refill at 76.93% after the overnight sweep journals
</commit_message>
<xml_diff>
--- a/docs/report.docx
+++ b/docs/report.docx
@@ -130,7 +130,7 @@
                 <w:b/>
                 <w:bCs/>
               </w:rPr>
-              <w:t xml:space="preserve">25,811,931</w:t>
+              <w:t xml:space="preserve">26,224,274</w:t>
             </w:r>
             <w:r>
               <w:t xml:space="preserve"> </w:t>
@@ -165,7 +165,7 @@
                 <w:b/>
                 <w:bCs/>
               </w:rPr>
-              <w:t xml:space="preserve">13,512,552.2294</w:t>
+              <w:t xml:space="preserve">13,670,342.8300</w:t>
             </w:r>
           </w:p>
         </w:tc>
@@ -194,7 +194,7 @@
                 <w:b/>
                 <w:bCs/>
               </w:rPr>
-              <w:t xml:space="preserve">76.0389%</w:t>
+              <w:t xml:space="preserve">76.9268%</w:t>
             </w:r>
           </w:p>
         </w:tc>
@@ -388,31 +388,31 @@
               <w:jc w:val="right"/>
             </w:pPr>
             <w:r>
-              <w:t xml:space="preserve">25,186,546</w:t>
-            </w:r>
-          </w:p>
-        </w:tc>
-        <w:tc>
-          <w:tcPr/>
-          <w:p>
-            <w:pPr>
-              <w:pStyle w:val="Compact"/>
-              <w:jc w:val="right"/>
-            </w:pPr>
-            <w:r>
-              <w:t xml:space="preserve">13,183,154.9802</w:t>
-            </w:r>
-          </w:p>
-        </w:tc>
-        <w:tc>
-          <w:tcPr/>
-          <w:p>
-            <w:pPr>
-              <w:pStyle w:val="Compact"/>
-              <w:jc w:val="right"/>
-            </w:pPr>
-            <w:r>
-              <w:t xml:space="preserve">74.1852%</w:t>
+              <w:t xml:space="preserve">25,598,889</w:t>
+            </w:r>
+          </w:p>
+        </w:tc>
+        <w:tc>
+          <w:tcPr/>
+          <w:p>
+            <w:pPr>
+              <w:pStyle w:val="Compact"/>
+              <w:jc w:val="right"/>
+            </w:pPr>
+            <w:r>
+              <w:t xml:space="preserve">13,340,945.5808</w:t>
+            </w:r>
+          </w:p>
+        </w:tc>
+        <w:tc>
+          <w:tcPr/>
+          <w:p>
+            <w:pPr>
+              <w:pStyle w:val="Compact"/>
+              <w:jc w:val="right"/>
+            </w:pPr>
+            <w:r>
+              <w:t xml:space="preserve">75.0732%</w:t>
             </w:r>
           </w:p>
         </w:tc>
@@ -627,31 +627,31 @@
               <w:jc w:val="right"/>
             </w:pPr>
             <w:r>
-              <w:t xml:space="preserve">10,781,638</w:t>
-            </w:r>
-          </w:p>
-        </w:tc>
-        <w:tc>
-          <w:tcPr/>
-          <w:p>
-            <w:pPr>
-              <w:pStyle w:val="Compact"/>
-              <w:jc w:val="right"/>
-            </w:pPr>
-            <w:r>
-              <w:t xml:space="preserve">12,960,985</w:t>
-            </w:r>
-          </w:p>
-        </w:tc>
-        <w:tc>
-          <w:tcPr/>
-          <w:p>
-            <w:pPr>
-              <w:pStyle w:val="Compact"/>
-              <w:jc w:val="right"/>
-            </w:pPr>
-            <w:r>
-              <w:t xml:space="preserve">5,263,432.5480</w:t>
+              <w:t xml:space="preserve">10,781,639</w:t>
+            </w:r>
+          </w:p>
+        </w:tc>
+        <w:tc>
+          <w:tcPr/>
+          <w:p>
+            <w:pPr>
+              <w:pStyle w:val="Compact"/>
+              <w:jc w:val="right"/>
+            </w:pPr>
+            <w:r>
+              <w:t xml:space="preserve">12,960,986</w:t>
+            </w:r>
+          </w:p>
+        </w:tc>
+        <w:tc>
+          <w:tcPr/>
+          <w:p>
+            <w:pPr>
+              <w:pStyle w:val="Compact"/>
+              <w:jc w:val="right"/>
+            </w:pPr>
+            <w:r>
+              <w:t xml:space="preserve">5,263,433.0010</w:t>
             </w:r>
           </w:p>
         </w:tc>
@@ -700,31 +700,31 @@
               <w:jc w:val="right"/>
             </w:pPr>
             <w:r>
-              <w:t xml:space="preserve">999,025</w:t>
-            </w:r>
-          </w:p>
-        </w:tc>
-        <w:tc>
-          <w:tcPr/>
-          <w:p>
-            <w:pPr>
-              <w:pStyle w:val="Compact"/>
-              <w:jc w:val="right"/>
-            </w:pPr>
-            <w:r>
-              <w:t xml:space="preserve">4,141,947</w:t>
-            </w:r>
-          </w:p>
-        </w:tc>
-        <w:tc>
-          <w:tcPr/>
-          <w:p>
-            <w:pPr>
-              <w:pStyle w:val="Compact"/>
-              <w:jc w:val="right"/>
-            </w:pPr>
-            <w:r>
-              <w:t xml:space="preserve">573,718.9687</w:t>
+              <w:t xml:space="preserve">999,412</w:t>
+            </w:r>
+          </w:p>
+        </w:tc>
+        <w:tc>
+          <w:tcPr/>
+          <w:p>
+            <w:pPr>
+              <w:pStyle w:val="Compact"/>
+              <w:jc w:val="right"/>
+            </w:pPr>
+            <w:r>
+              <w:t xml:space="preserve">4,142,334</w:t>
+            </w:r>
+          </w:p>
+        </w:tc>
+        <w:tc>
+          <w:tcPr/>
+          <w:p>
+            <w:pPr>
+              <w:pStyle w:val="Compact"/>
+              <w:jc w:val="right"/>
+            </w:pPr>
+            <w:r>
+              <w:t xml:space="preserve">574,071.3613</w:t>
             </w:r>
           </w:p>
         </w:tc>
@@ -773,31 +773,31 @@
               <w:jc w:val="right"/>
             </w:pPr>
             <w:r>
-              <w:t xml:space="preserve">1,451,843</w:t>
-            </w:r>
-          </w:p>
-        </w:tc>
-        <w:tc>
-          <w:tcPr/>
-          <w:p>
-            <w:pPr>
-              <w:pStyle w:val="Compact"/>
-              <w:jc w:val="right"/>
-            </w:pPr>
-            <w:r>
-              <w:t xml:space="preserve">7,844,561</w:t>
-            </w:r>
-          </w:p>
-        </w:tc>
-        <w:tc>
-          <w:tcPr/>
-          <w:p>
-            <w:pPr>
-              <w:pStyle w:val="Compact"/>
-              <w:jc w:val="right"/>
-            </w:pPr>
-            <w:r>
-              <w:t xml:space="preserve">824,290.9369</w:t>
+              <w:t xml:space="preserve">1,458,019</w:t>
+            </w:r>
+          </w:p>
+        </w:tc>
+        <w:tc>
+          <w:tcPr/>
+          <w:p>
+            <w:pPr>
+              <w:pStyle w:val="Compact"/>
+              <w:jc w:val="right"/>
+            </w:pPr>
+            <w:r>
+              <w:t xml:space="preserve">7,850,737</w:t>
+            </w:r>
+          </w:p>
+        </w:tc>
+        <w:tc>
+          <w:tcPr/>
+          <w:p>
+            <w:pPr>
+              <w:pStyle w:val="Compact"/>
+              <w:jc w:val="right"/>
+            </w:pPr>
+            <w:r>
+              <w:t xml:space="preserve">828,029.6155</w:t>
             </w:r>
           </w:p>
         </w:tc>
@@ -846,31 +846,31 @@
               <w:jc w:val="right"/>
             </w:pPr>
             <w:r>
-              <w:t xml:space="preserve">1,623,085</w:t>
-            </w:r>
-          </w:p>
-        </w:tc>
-        <w:tc>
-          <w:tcPr/>
-          <w:p>
-            <w:pPr>
-              <w:pStyle w:val="Compact"/>
-              <w:jc w:val="right"/>
-            </w:pPr>
-            <w:r>
-              <w:t xml:space="preserve">12,355,817</w:t>
-            </w:r>
-          </w:p>
-        </w:tc>
-        <w:tc>
-          <w:tcPr/>
-          <w:p>
-            <w:pPr>
-              <w:pStyle w:val="Compact"/>
-              <w:jc w:val="right"/>
-            </w:pPr>
-            <w:r>
-              <w:t xml:space="preserve">914,329.9294</w:t>
+              <w:t xml:space="preserve">1,661,393</w:t>
+            </w:r>
+          </w:p>
+        </w:tc>
+        <w:tc>
+          <w:tcPr/>
+          <w:p>
+            <w:pPr>
+              <w:pStyle w:val="Compact"/>
+              <w:jc w:val="right"/>
+            </w:pPr>
+            <w:r>
+              <w:t xml:space="preserve">12,394,125</w:t>
+            </w:r>
+          </w:p>
+        </w:tc>
+        <w:tc>
+          <w:tcPr/>
+          <w:p>
+            <w:pPr>
+              <w:pStyle w:val="Compact"/>
+              <w:jc w:val="right"/>
+            </w:pPr>
+            <w:r>
+              <w:t xml:space="preserve">937,279.6350</w:t>
             </w:r>
           </w:p>
         </w:tc>
@@ -919,31 +919,31 @@
               <w:jc w:val="right"/>
             </w:pPr>
             <w:r>
-              <w:t xml:space="preserve">2,588,401</w:t>
-            </w:r>
-          </w:p>
-        </w:tc>
-        <w:tc>
-          <w:tcPr/>
-          <w:p>
-            <w:pPr>
-              <w:pStyle w:val="Compact"/>
-              <w:jc w:val="right"/>
-            </w:pPr>
-            <w:r>
-              <w:t xml:space="preserve">13,626,130</w:t>
-            </w:r>
-          </w:p>
-        </w:tc>
-        <w:tc>
-          <w:tcPr/>
-          <w:p>
-            <w:pPr>
-              <w:pStyle w:val="Compact"/>
-              <w:jc w:val="right"/>
-            </w:pPr>
-            <w:r>
-              <w:t xml:space="preserve">1,780,474.5102</w:t>
+              <w:t xml:space="preserve">2,955,872</w:t>
+            </w:r>
+          </w:p>
+        </w:tc>
+        <w:tc>
+          <w:tcPr/>
+          <w:p>
+            <w:pPr>
+              <w:pStyle w:val="Compact"/>
+              <w:jc w:val="right"/>
+            </w:pPr>
+            <w:r>
+              <w:t xml:space="preserve">13,993,601</w:t>
+            </w:r>
+          </w:p>
+        </w:tc>
+        <w:tc>
+          <w:tcPr/>
+          <w:p>
+            <w:pPr>
+              <w:pStyle w:val="Compact"/>
+              <w:jc w:val="right"/>
+            </w:pPr>
+            <w:r>
+              <w:t xml:space="preserve">1,911,223.8810</w:t>
             </w:r>
           </w:p>
         </w:tc>
@@ -1008,7 +1008,7 @@
                 <w:b/>
                 <w:bCs/>
               </w:rPr>
-              <w:t xml:space="preserve">25,186,546</w:t>
+              <w:t xml:space="preserve">25,598,889</w:t>
             </w:r>
           </w:p>
         </w:tc>
@@ -1024,7 +1024,7 @@
                 <w:b/>
                 <w:bCs/>
               </w:rPr>
-              <w:t xml:space="preserve">59,660,857</w:t>
+              <w:t xml:space="preserve">60,073,200</w:t>
             </w:r>
           </w:p>
         </w:tc>
@@ -1040,7 +1040,7 @@
                 <w:b/>
                 <w:bCs/>
               </w:rPr>
-              <w:t xml:space="preserve">13,512,552.2294</w:t>
+              <w:t xml:space="preserve">13,670,342.8300</w:t>
             </w:r>
           </w:p>
         </w:tc>
@@ -1055,10 +1055,10 @@
           <w:b/>
           <w:bCs/>
         </w:rPr>
-        <w:t xml:space="preserve">Cumulative score 107.4616%</w:t>
-      </w:r>
-      <w:r>
-        <w:t xml:space="preserve">: the sum of the increases you awarded (1.659986%, 10.730988%, 14.901054%, 4.130718%) plus this round's 76.0389%, as your update log of 2026-08-18 defines it. Round 1 is held out: awarded on records, before the equivalent-English metric.</w:t>
+        <w:t xml:space="preserve">Cumulative score 108.3495%</w:t>
+      </w:r>
+      <w:r>
+        <w:t xml:space="preserve">: the sum of the increases you awarded (1.659986%, 10.730988%, 14.901054%, 4.130718%) plus this round's 76.9268%, as your update log of 2026-08-18 defines it. Round 1 is held out: awarded on records, before the equivalent-English metric.</w:t>
       </w:r>
     </w:p>
     <w:bookmarkEnd w:id="9"/>
@@ -1384,7 +1384,7 @@
           <w:b/>
           <w:bCs/>
         </w:rPr>
-        <w:t xml:space="preserve">Domain-wide CDX sweeps over subdomain platforms: 1,220,260 EE, 1,748,953</w:t>
+        <w:t xml:space="preserve">Domain-wide CDX sweeps over subdomain platforms: 1,378,051 EE, 2,161,296</w:t>
       </w:r>
       <w:r>
         <w:rPr>
@@ -1764,19 +1764,19 @@
               <w:jc w:val="right"/>
             </w:pPr>
             <w:r>
-              <w:t xml:space="preserve">1,748,953</w:t>
-            </w:r>
-          </w:p>
-        </w:tc>
-        <w:tc>
-          <w:tcPr/>
-          <w:p>
-            <w:pPr>
-              <w:pStyle w:val="Compact"/>
-              <w:jc w:val="right"/>
-            </w:pPr>
-            <w:r>
-              <w:t xml:space="preserve">1,220,260</w:t>
+              <w:t xml:space="preserve">2,161,296</w:t>
+            </w:r>
+          </w:p>
+        </w:tc>
+        <w:tc>
+          <w:tcPr/>
+          <w:p>
+            <w:pPr>
+              <w:pStyle w:val="Compact"/>
+              <w:jc w:val="right"/>
+            </w:pPr>
+            <w:r>
+              <w:t xml:space="preserve">1,378,051</w:t>
             </w:r>
           </w:p>
         </w:tc>
@@ -2094,7 +2094,7 @@
                 <w:b/>
                 <w:bCs/>
               </w:rPr>
-              <w:t xml:space="preserve">25,811,931</w:t>
+              <w:t xml:space="preserve">26,224,274</w:t>
             </w:r>
           </w:p>
         </w:tc>
@@ -2110,7 +2110,7 @@
                 <w:b/>
                 <w:bCs/>
               </w:rPr>
-              <w:t xml:space="preserve">13,512,552</w:t>
+              <w:t xml:space="preserve">13,670,343</w:t>
             </w:r>
           </w:p>
         </w:tc>
@@ -2175,7 +2175,7 @@
         <w:t xml:space="preserve"> </w:t>
       </w:r>
       <w:r>
-        <w:t xml:space="preserve">25.4% of the hostnames are</w:t>
+        <w:t xml:space="preserve">26.1% of the hostnames are</w:t>
       </w:r>
       <w:r>
         <w:t xml:space="preserve"> </w:t>
@@ -2964,7 +2964,7 @@
           <w:b/>
           <w:bCs/>
         </w:rPr>
-        <w:t xml:space="preserve">493 source families searched and recorded</w:t>
+        <w:t xml:space="preserve">494 source families searched and recorded</w:t>
       </w:r>
       <w:r>
         <w:t xml:space="preserve"> </w:t>
@@ -2982,7 +2982,7 @@
         <w:t xml:space="preserve">sources.md</w:t>
       </w:r>
       <w:r>
-        <w:t xml:space="preserve">: 65 developed, 428 evaluated and closed with the measurement that closed them, so the same ground is not broken twice.</w:t>
+        <w:t xml:space="preserve">: 66 developed, 428 evaluated and closed with the measurement that closed them, so the same ground is not broken twice.</w:t>
       </w:r>
     </w:p>
     <w:p>
@@ -3508,7 +3508,7 @@
                 <w:b/>
                 <w:bCs/>
               </w:rPr>
-              <w:t xml:space="preserve">25,811,931</w:t>
+              <w:t xml:space="preserve">26,224,274</w:t>
             </w:r>
           </w:p>
         </w:tc>
@@ -3524,7 +3524,7 @@
                 <w:b/>
                 <w:bCs/>
               </w:rPr>
-              <w:t xml:space="preserve">13,512,552.2294</w:t>
+              <w:t xml:space="preserve">13,670,342.8300</w:t>
             </w:r>
           </w:p>
         </w:tc>
@@ -3549,19 +3549,19 @@
               <w:jc w:val="right"/>
             </w:pPr>
             <w:r>
-              <w:t xml:space="preserve">59,660,857</w:t>
-            </w:r>
-          </w:p>
-        </w:tc>
-        <w:tc>
-          <w:tcPr/>
-          <w:p>
-            <w:pPr>
-              <w:pStyle w:val="Compact"/>
-              <w:jc w:val="right"/>
-            </w:pPr>
-            <w:r>
-              <w:t xml:space="preserve">31,283,141.1320</w:t>
+              <w:t xml:space="preserve">60,073,200</w:t>
+            </w:r>
+          </w:p>
+        </w:tc>
+        <w:tc>
+          <w:tcPr/>
+          <w:p>
+            <w:pPr>
+              <w:pStyle w:val="Compact"/>
+              <w:jc w:val="right"/>
+            </w:pPr>
+            <w:r>
+              <w:t xml:space="preserve">31,440,931.7326</w:t>
             </w:r>
           </w:p>
         </w:tc>
@@ -3589,7 +3589,7 @@
         <w:t xml:space="preserve">0 records</w:t>
       </w:r>
       <w:r>
-        <w:t xml:space="preserve">, so all 25,811,931 submitted count once; the two unit files are disjoint in every year.</w:t>
+        <w:t xml:space="preserve">, so all 26,224,274 submitted count once; the two unit files are disjoint in every year.</w:t>
       </w:r>
     </w:p>
     <w:p>

</xml_diff>

<commit_message>
Section 4 as an admissions table, dialup share aligned across report and sources
</commit_message>
<xml_diff>
--- a/docs/report.docx
+++ b/docs/report.docx
@@ -2519,6 +2519,667 @@
     </w:p>
     <w:p>
       <w:pPr>
+        <w:pStyle w:val="FirstParagraph"/>
+      </w:pPr>
+      <w:r>
+        <w:rPr>
+          <w:b/>
+          <w:bCs/>
+        </w:rPr>
+        <w:t xml:space="preserve">The loop runs unattended.</w:t>
+      </w:r>
+      <w:r>
+        <w:t xml:space="preserve"> </w:t>
+      </w:r>
+      <w:r>
+        <w:t xml:space="preserve">Scheduled workflows on a self-hosted runner: a generator proposes</w:t>
+      </w:r>
+      <w:r>
+        <w:t xml:space="preserve"> </w:t>
+      </w:r>
+      <w:r>
+        <w:t xml:space="preserve">hypotheses, researcher waves test them in parallel and price each against the store, a re-opener</w:t>
+      </w:r>
+      <w:r>
+        <w:t xml:space="preserve"> </w:t>
+      </w:r>
+      <w:r>
+        <w:t xml:space="preserve">re-reads closed verdicts whenever a screen changes, an improver tunes one prompt or model knob per</w:t>
+      </w:r>
+      <w:r>
+        <w:t xml:space="preserve"> </w:t>
+      </w:r>
+      <w:r>
+        <w:t xml:space="preserve">pull request.</w:t>
+      </w:r>
+      <w:r>
+        <w:t xml:space="preserve"> </w:t>
+      </w:r>
+      <w:r>
+        <w:rPr>
+          <w:b/>
+          <w:bCs/>
+        </w:rPr>
+        <w:t xml:space="preserve">494 source families searched and recorded</w:t>
+      </w:r>
+      <w:r>
+        <w:t xml:space="preserve"> </w:t>
+      </w:r>
+      <w:r>
+        <w:t xml:space="preserve">in</w:t>
+      </w:r>
+      <w:r>
+        <w:t xml:space="preserve"> </w:t>
+      </w:r>
+      <w:r>
+        <w:rPr>
+          <w:rStyle w:val="VerbatimChar"/>
+        </w:rPr>
+        <w:t xml:space="preserve">sources.md</w:t>
+      </w:r>
+      <w:r>
+        <w:t xml:space="preserve">: 66 developed, 428 evaluated and closed with the measurement that closed them, so the same ground is not broken twice. The code is</w:t>
+      </w:r>
+      <w:r>
+        <w:t xml:space="preserve"> </w:t>
+      </w:r>
+      <w:r>
+        <w:rPr>
+          <w:rStyle w:val="VerbatimChar"/>
+        </w:rPr>
+        <w:t xml:space="preserve">source/fleet.tar.gz</w:t>
+      </w:r>
+      <w:r>
+        <w:t xml:space="preserve">.</w:t>
+      </w:r>
+    </w:p>
+    <w:p>
+      <w:pPr>
+        <w:pStyle w:val="BodyText"/>
+      </w:pPr>
+      <w:r>
+        <w:rPr>
+          <w:b/>
+          <w:bCs/>
+        </w:rPr>
+        <w:t xml:space="preserve">Six sources were admitted without a human</w:t>
+      </w:r>
+      <w:r>
+        <w:t xml:space="preserve">, under a rule fixed in advance: the evidence class is</w:t>
+      </w:r>
+      <w:r>
+        <w:t xml:space="preserve"> </w:t>
+      </w:r>
+      <w:r>
+        <w:t xml:space="preserve">already master-eligible, a machine-written stamp inside the artifact dates each item, the terms were</w:t>
+      </w:r>
+      <w:r>
+        <w:t xml:space="preserve"> </w:t>
+      </w:r>
+      <w:r>
+        <w:t xml:space="preserve">read in full, and the invariants pass. Anything failing one of the four parks until a written</w:t>
+      </w:r>
+      <w:r>
+        <w:t xml:space="preserve"> </w:t>
+      </w:r>
+      <w:r>
+        <w:t xml:space="preserve">decision, and two sources did park this round. Each row below is a column of an artifact this</w:t>
+      </w:r>
+      <w:r>
+        <w:t xml:space="preserve"> </w:t>
+      </w:r>
+      <w:r>
+        <w:t xml:space="preserve">project had already banked and closed at registrable grain:</w:t>
+      </w:r>
+    </w:p>
+    <w:tbl>
+      <w:tblPr>
+        <w:tblStyle w:val="Table"/>
+        <w:tblW w:type="pct" w:w="5000"/>
+        <w:tblLayout w:type="fixed"/>
+        <w:tblLook w:firstRow="1" w:lastRow="0" w:firstColumn="0" w:lastColumn="0" w:noHBand="0" w:noVBand="0" w:val="0020"/>
+      </w:tblPr>
+      <w:tblGrid>
+        <w:gridCol w:w="2970"/>
+        <w:gridCol w:w="810"/>
+        <w:gridCol w:w="720"/>
+        <w:gridCol w:w="3420"/>
+      </w:tblGrid>
+      <w:tr>
+        <w:trPr>
+          <w:tblHeader w:val="on"/>
+        </w:trPr>
+        <w:tc>
+          <w:tcPr/>
+          <w:p>
+            <w:pPr>
+              <w:pStyle w:val="Compact"/>
+            </w:pPr>
+            <w:r>
+              <w:t xml:space="preserve">admitted by the loop</w:t>
+            </w:r>
+          </w:p>
+        </w:tc>
+        <w:tc>
+          <w:tcPr/>
+          <w:p>
+            <w:pPr>
+              <w:pStyle w:val="Compact"/>
+              <w:jc w:val="right"/>
+            </w:pPr>
+            <w:r>
+              <w:t xml:space="preserve">records</w:t>
+            </w:r>
+          </w:p>
+        </w:tc>
+        <w:tc>
+          <w:tcPr/>
+          <w:p>
+            <w:pPr>
+              <w:pStyle w:val="Compact"/>
+              <w:jc w:val="right"/>
+            </w:pPr>
+            <w:r>
+              <w:t xml:space="preserve">EE</w:t>
+            </w:r>
+          </w:p>
+        </w:tc>
+        <w:tc>
+          <w:tcPr/>
+          <w:p>
+            <w:pPr>
+              <w:pStyle w:val="Compact"/>
+            </w:pPr>
+            <w:r>
+              <w:t xml:space="preserve">the column that had been discarded</w:t>
+            </w:r>
+          </w:p>
+        </w:tc>
+      </w:tr>
+      <w:tr>
+        <w:tc>
+          <w:tcPr/>
+          <w:p>
+            <w:pPr>
+              <w:pStyle w:val="Compact"/>
+            </w:pPr>
+            <w:r>
+              <w:t xml:space="preserve">ISC survey host files</w:t>
+            </w:r>
+          </w:p>
+        </w:tc>
+        <w:tc>
+          <w:tcPr/>
+          <w:p>
+            <w:pPr>
+              <w:pStyle w:val="Compact"/>
+              <w:jc w:val="right"/>
+            </w:pPr>
+            <w:r>
+              <w:t xml:space="preserve">18,117,395</w:t>
+            </w:r>
+          </w:p>
+        </w:tc>
+        <w:tc>
+          <w:tcPr/>
+          <w:p>
+            <w:pPr>
+              <w:pStyle w:val="Compact"/>
+              <w:jc w:val="right"/>
+            </w:pPr>
+            <w:r>
+              <w:t xml:space="preserve">9,167,369</w:t>
+            </w:r>
+          </w:p>
+        </w:tc>
+        <w:tc>
+          <w:tcPr/>
+          <w:p>
+            <w:pPr>
+              <w:pStyle w:val="Compact"/>
+            </w:pPr>
+            <w:r>
+              <w:t xml:space="preserve">the host in each</w:t>
+            </w:r>
+            <w:r>
+              <w:t xml:space="preserve"> </w:t>
+            </w:r>
+            <w:r>
+              <w:rPr>
+                <w:rStyle w:val="VerbatimChar"/>
+              </w:rPr>
+              <w:t xml:space="preserve">IP hostname</w:t>
+            </w:r>
+            <w:r>
+              <w:t xml:space="preserve"> </w:t>
+            </w:r>
+            <w:r>
+              <w:t xml:space="preserve">line, not its parent</w:t>
+            </w:r>
+          </w:p>
+        </w:tc>
+      </w:tr>
+      <w:tr>
+        <w:tc>
+          <w:tcPr/>
+          <w:p>
+            <w:pPr>
+              <w:pStyle w:val="Compact"/>
+            </w:pPr>
+            <w:r>
+              <w:t xml:space="preserve">IA Early Web index</w:t>
+            </w:r>
+          </w:p>
+        </w:tc>
+        <w:tc>
+          <w:tcPr/>
+          <w:p>
+            <w:pPr>
+              <w:pStyle w:val="Compact"/>
+              <w:jc w:val="right"/>
+            </w:pPr>
+            <w:r>
+              <w:t xml:space="preserve">1,163,616</w:t>
+            </w:r>
+          </w:p>
+        </w:tc>
+        <w:tc>
+          <w:tcPr/>
+          <w:p>
+            <w:pPr>
+              <w:pStyle w:val="Compact"/>
+              <w:jc w:val="right"/>
+            </w:pPr>
+            <w:r>
+              <w:t xml:space="preserve">631,148</w:t>
+            </w:r>
+          </w:p>
+        </w:tc>
+        <w:tc>
+          <w:tcPr/>
+          <w:p>
+            <w:pPr>
+              <w:pStyle w:val="Compact"/>
+            </w:pPr>
+            <w:r>
+              <w:t xml:space="preserve">the captured host, not its registrable</w:t>
+            </w:r>
+          </w:p>
+        </w:tc>
+      </w:tr>
+      <w:tr>
+        <w:tc>
+          <w:tcPr/>
+          <w:p>
+            <w:pPr>
+              <w:pStyle w:val="Compact"/>
+            </w:pPr>
+            <w:r>
+              <w:t xml:space="preserve">USFEDGOV merged indexes, six years</w:t>
+            </w:r>
+          </w:p>
+        </w:tc>
+        <w:tc>
+          <w:tcPr/>
+          <w:p>
+            <w:pPr>
+              <w:pStyle w:val="Compact"/>
+              <w:jc w:val="right"/>
+            </w:pPr>
+            <w:r>
+              <w:t xml:space="preserve">40,260</w:t>
+            </w:r>
+          </w:p>
+        </w:tc>
+        <w:tc>
+          <w:tcPr/>
+          <w:p>
+            <w:pPr>
+              <w:pStyle w:val="Compact"/>
+              <w:jc w:val="right"/>
+            </w:pPr>
+            <w:r>
+              <w:t xml:space="preserve">39,340</w:t>
+            </w:r>
+          </w:p>
+        </w:tc>
+        <w:tc>
+          <w:tcPr/>
+          <w:p>
+            <w:pPr>
+              <w:pStyle w:val="Compact"/>
+            </w:pPr>
+            <w:r>
+              <w:t xml:space="preserve">the captured host, not its registrable</w:t>
+            </w:r>
+          </w:p>
+        </w:tc>
+      </w:tr>
+      <w:tr>
+        <w:tc>
+          <w:tcPr/>
+          <w:p>
+            <w:pPr>
+              <w:pStyle w:val="Compact"/>
+            </w:pPr>
+            <w:r>
+              <w:t xml:space="preserve">1997 InterNIC zones</w:t>
+            </w:r>
+          </w:p>
+        </w:tc>
+        <w:tc>
+          <w:tcPr/>
+          <w:p>
+            <w:pPr>
+              <w:pStyle w:val="Compact"/>
+              <w:jc w:val="right"/>
+            </w:pPr>
+            <w:r>
+              <w:t xml:space="preserve">19,211</w:t>
+            </w:r>
+          </w:p>
+        </w:tc>
+        <w:tc>
+          <w:tcPr/>
+          <w:p>
+            <w:pPr>
+              <w:pStyle w:val="Compact"/>
+              <w:jc w:val="right"/>
+            </w:pPr>
+            <w:r>
+              <w:t xml:space="preserve">11,860.7</w:t>
+            </w:r>
+          </w:p>
+        </w:tc>
+        <w:tc>
+          <w:tcPr/>
+          <w:p>
+            <w:pPr>
+              <w:pStyle w:val="Compact"/>
+            </w:pPr>
+            <w:r>
+              <w:t xml:space="preserve">the nameserver an NS record points at, not the delegation</w:t>
+            </w:r>
+          </w:p>
+        </w:tc>
+      </w:tr>
+      <w:tr>
+        <w:tc>
+          <w:tcPr/>
+          <w:p>
+            <w:pPr>
+              <w:pStyle w:val="Compact"/>
+            </w:pPr>
+            <w:r>
+              <w:t xml:space="preserve">RIPE</w:t>
+            </w:r>
+            <w:r>
+              <w:t xml:space="preserve"> </w:t>
+            </w:r>
+            <w:r>
+              <w:rPr>
+                <w:rStyle w:val="VerbatimChar"/>
+              </w:rPr>
+              <w:t xml:space="preserve">domain:</w:t>
+            </w:r>
+            <w:r>
+              <w:t xml:space="preserve"> </w:t>
+            </w:r>
+            <w:r>
+              <w:t xml:space="preserve">objects</w:t>
+            </w:r>
+          </w:p>
+        </w:tc>
+        <w:tc>
+          <w:tcPr/>
+          <w:p>
+            <w:pPr>
+              <w:pStyle w:val="Compact"/>
+              <w:jc w:val="right"/>
+            </w:pPr>
+            <w:r>
+              <w:t xml:space="preserve">49,841</w:t>
+            </w:r>
+          </w:p>
+        </w:tc>
+        <w:tc>
+          <w:tcPr/>
+          <w:p>
+            <w:pPr>
+              <w:pStyle w:val="Compact"/>
+              <w:jc w:val="right"/>
+            </w:pPr>
+            <w:r>
+              <w:t xml:space="preserve">11,780</w:t>
+            </w:r>
+          </w:p>
+        </w:tc>
+        <w:tc>
+          <w:tcPr/>
+          <w:p>
+            <w:pPr>
+              <w:pStyle w:val="Compact"/>
+            </w:pPr>
+            <w:r>
+              <w:t xml:space="preserve">the</w:t>
+            </w:r>
+            <w:r>
+              <w:t xml:space="preserve"> </w:t>
+            </w:r>
+            <w:r>
+              <w:rPr>
+                <w:rStyle w:val="VerbatimChar"/>
+              </w:rPr>
+              <w:t xml:space="preserve">nserver:</w:t>
+            </w:r>
+            <w:r>
+              <w:t xml:space="preserve"> </w:t>
+            </w:r>
+            <w:r>
+              <w:t xml:space="preserve">attribute both parsers dropped</w:t>
+            </w:r>
+          </w:p>
+        </w:tc>
+      </w:tr>
+      <w:tr>
+        <w:tc>
+          <w:tcPr/>
+          <w:p>
+            <w:pPr>
+              <w:pStyle w:val="Compact"/>
+            </w:pPr>
+            <w:r>
+              <w:t xml:space="preserve">two squidGuard blocklists</w:t>
+            </w:r>
+          </w:p>
+        </w:tc>
+        <w:tc>
+          <w:tcPr/>
+          <w:p>
+            <w:pPr>
+              <w:pStyle w:val="Compact"/>
+              <w:jc w:val="right"/>
+            </w:pPr>
+            <w:r>
+              <w:t xml:space="preserve">7,708</w:t>
+            </w:r>
+          </w:p>
+        </w:tc>
+        <w:tc>
+          <w:tcPr/>
+          <w:p>
+            <w:pPr>
+              <w:pStyle w:val="Compact"/>
+              <w:jc w:val="right"/>
+            </w:pPr>
+            <w:r>
+              <w:t xml:space="preserve">3,441.8</w:t>
+            </w:r>
+          </w:p>
+        </w:tc>
+        <w:tc>
+          <w:tcPr/>
+          <w:p>
+            <w:pPr>
+              <w:pStyle w:val="Compact"/>
+            </w:pPr>
+            <w:r>
+              <w:t xml:space="preserve">the host each line names, not its registrable</w:t>
+            </w:r>
+          </w:p>
+        </w:tc>
+      </w:tr>
+    </w:tbl>
+    <w:p>
+      <w:pPr>
+        <w:pStyle w:val="BodyText"/>
+      </w:pPr>
+      <w:r>
+        <w:rPr>
+          <w:b/>
+          <w:bCs/>
+        </w:rPr>
+        <w:t xml:space="preserve">The lens that produced all six</w:t>
+      </w:r>
+      <w:r>
+        <w:t xml:space="preserve">, and the round's transferable result: when the counting unit</w:t>
+      </w:r>
+      <w:r>
+        <w:t xml:space="preserve"> </w:t>
+      </w:r>
+      <w:r>
+        <w:t xml:space="preserve">changes, the payload is a column of an artifact already on disk, not a new corpus. Its natural home</w:t>
+      </w:r>
+      <w:r>
+        <w:t xml:space="preserve"> </w:t>
+      </w:r>
+      <w:r>
+        <w:t xml:space="preserve">is DNS-side and mail-side records, because nameservers, mail exchangers and mirrors are hosts a web</w:t>
+      </w:r>
+      <w:r>
+        <w:t xml:space="preserve"> </w:t>
+      </w:r>
+      <w:r>
+        <w:t xml:space="preserve">crawler never fetches, so they are absent from a capture-fed benchmark by construction even where</w:t>
+      </w:r>
+      <w:r>
+        <w:t xml:space="preserve"> </w:t>
+      </w:r>
+      <w:r>
+        <w:t xml:space="preserve">their registrables are saturated. Zero new requests were needed for four of the six.</w:t>
+      </w:r>
+    </w:p>
+    <w:p>
+      <w:pPr>
+        <w:pStyle w:val="BodyText"/>
+      </w:pPr>
+      <w:r>
+        <w:rPr>
+          <w:b/>
+          <w:bCs/>
+        </w:rPr>
+        <w:t xml:space="preserve">A closure is a hypothesis, not a fact.</w:t>
+      </w:r>
+      <w:r>
+        <w:t xml:space="preserve"> </w:t>
+      </w:r>
+      <w:r>
+        <w:t xml:space="preserve">The re-opener recovered the NYPW TimeMaps from a 14 EE</w:t>
+      </w:r>
+      <w:r>
+        <w:t xml:space="preserve"> </w:t>
+      </w:r>
+      <w:r>
+        <w:t xml:space="preserve">closure by measuring the ingest ledger per folder (year rows per million: 2000 ~24,000, 1999</w:t>
+      </w:r>
+      <w:r>
+        <w:t xml:space="preserve"> </w:t>
+      </w:r>
+      <w:r>
+        <w:t xml:space="preserve">~10,000, 2001 exactly 4) for ~88,000 EE, after one run had argued the opposite from a plausible</w:t>
+      </w:r>
+      <w:r>
+        <w:t xml:space="preserve"> </w:t>
+      </w:r>
+      <w:r>
+        <w:t xml:space="preserve">mechanism.</w:t>
+      </w:r>
+    </w:p>
+    <w:p>
+      <w:pPr>
+        <w:pStyle w:val="BodyText"/>
+      </w:pPr>
+      <w:r>
+        <w:rPr>
+          <w:b/>
+          <w:bCs/>
+        </w:rPr>
+        <w:t xml:space="preserve">Measured negatives that steer the next cycle</w:t>
+      </w:r>
+      <w:r>
+        <w:t xml:space="preserve">: prose corpora fail either the URL-density or the</w:t>
+      </w:r>
+      <w:r>
+        <w:t xml:space="preserve"> </w:t>
+      </w:r>
+      <w:r>
+        <w:t xml:space="preserve">authority screen; academic repositories closed by enumeration through five APIs and two registries;</w:t>
+      </w:r>
+      <w:r>
+        <w:t xml:space="preserve"> </w:t>
+      </w:r>
+      <w:r>
+        <w:t xml:space="preserve">CD-ROM media, FTP mirrors and trade directories at the curated-directory floor (0.013-0.024 net-new</w:t>
+      </w:r>
+      <w:r>
+        <w:t xml:space="preserve"> </w:t>
+      </w:r>
+      <w:r>
+        <w:t xml:space="preserve">pairs per listed name). Each with its figure in</w:t>
+      </w:r>
+      <w:r>
+        <w:t xml:space="preserve"> </w:t>
+      </w:r>
+      <w:r>
+        <w:rPr>
+          <w:rStyle w:val="VerbatimChar"/>
+        </w:rPr>
+        <w:t xml:space="preserve">sources.md</w:t>
+      </w:r>
+      <w:r>
+        <w:t xml:space="preserve">, and the saturation ledger your 0831</w:t>
+      </w:r>
+      <w:r>
+        <w:t xml:space="preserve"> </w:t>
+      </w:r>
+      <w:r>
+        <w:t xml:space="preserve">update asks for is</w:t>
+      </w:r>
+      <w:r>
+        <w:t xml:space="preserve"> </w:t>
+      </w:r>
+      <w:r>
+        <w:rPr>
+          <w:rStyle w:val="VerbatimChar"/>
+        </w:rPr>
+        <w:t xml:space="preserve">audit/source_saturation_ledger.csv</w:t>
+      </w:r>
+      <w:r>
+        <w:t xml:space="preserve">, one row per source family and version.</w:t>
+      </w:r>
+    </w:p>
+    <w:bookmarkEnd w:id="12"/>
+    <w:bookmarkStart w:id="13" w:name="cdx-execution-notes"/>
+    <w:p>
+      <w:pPr>
+        <w:pStyle w:val="Heading2"/>
+      </w:pPr>
+      <w:r>
+        <w:t xml:space="preserve">5. CDX execution notes</w:t>
+      </w:r>
+    </w:p>
+    <w:p>
+      <w:pPr>
         <w:pStyle w:val="Compact"/>
         <w:numPr>
           <w:ilvl w:val="0"/>
@@ -2526,35 +3187,22 @@
         </w:numPr>
       </w:pPr>
       <w:r>
-        <w:rPr>
-          <w:b/>
-          <w:bCs/>
-        </w:rPr>
-        <w:t xml:space="preserve">The loop runs unattended.</w:t>
-      </w:r>
-      <w:r>
-        <w:t xml:space="preserve"> </w:t>
-      </w:r>
-      <w:r>
-        <w:t xml:space="preserve">Scheduled workflows on a self-hosted runner: a generator proposes</w:t>
-      </w:r>
-      <w:r>
-        <w:t xml:space="preserve"> </w:t>
-      </w:r>
-      <w:r>
-        <w:t xml:space="preserve">hypotheses, researcher waves test them in parallel and price each against the store, a re-opener</w:t>
-      </w:r>
-      <w:r>
-        <w:t xml:space="preserve"> </w:t>
-      </w:r>
-      <w:r>
-        <w:t xml:space="preserve">re-reads closed verdicts whenever a screen changes, and an improver tunes one prompt or model</w:t>
-      </w:r>
-      <w:r>
-        <w:t xml:space="preserve"> </w:t>
-      </w:r>
-      <w:r>
-        <w:t xml:space="preserve">knob per pull request from per-run telemetry.</w:t>
+        <w:t xml:space="preserve">Two clients at most, honest User-Agent, two seconds between requests, backoff on 429/503/504,</w:t>
+      </w:r>
+      <w:r>
+        <w:t xml:space="preserve"> </w:t>
+      </w:r>
+      <w:r>
+        <w:rPr>
+          <w:rStyle w:val="VerbatimChar"/>
+        </w:rPr>
+        <w:t xml:space="preserve">Retry-After</w:t>
+      </w:r>
+      <w:r>
+        <w:t xml:space="preserve"> </w:t>
+      </w:r>
+      <w:r>
+        <w:t xml:space="preserve">honoured. Collectors take an absolute deadline and outlive the session.</w:t>
       </w:r>
     </w:p>
     <w:p>
@@ -2566,41 +3214,34 @@
         </w:numPr>
       </w:pPr>
       <w:r>
-        <w:rPr>
-          <w:b/>
-          <w:bCs/>
-        </w:rPr>
-        <w:t xml:space="preserve">Three of the round's finds are the loop's.</w:t>
-      </w:r>
-      <w:r>
-        <w:t xml:space="preserve"> </w:t>
-      </w:r>
-      <w:r>
-        <w:t xml:space="preserve">The hostname-grain re-read (item 1 above) was</w:t>
-      </w:r>
-      <w:r>
-        <w:t xml:space="preserve"> </w:t>
-      </w:r>
-      <w:r>
-        <w:t xml:space="preserve">among the generator's first seven proposals. The re-opener recovered the NYPW TimeMaps from a</w:t>
-      </w:r>
-      <w:r>
-        <w:t xml:space="preserve"> </w:t>
-      </w:r>
-      <w:r>
-        <w:t xml:space="preserve">14 EE closure by measuring the ingest ledger per folder (year rows per million: 2000 ~24,000,</w:t>
-      </w:r>
-      <w:r>
-        <w:t xml:space="preserve"> </w:t>
-      </w:r>
-      <w:r>
-        <w:t xml:space="preserve">1999 ~10,000, 2001 exactly 4), for ~88,000 EE. A researcher wave found the first source admitted</w:t>
-      </w:r>
-      <w:r>
-        <w:t xml:space="preserve"> </w:t>
-      </w:r>
-      <w:r>
-        <w:t xml:space="preserve">without a human, below.</w:t>
+        <w:t xml:space="preserve">Per-domain queries over bracketed gaps and the candidate pool: 92,479 registrable pairs.</w:t>
+      </w:r>
+      <w:r>
+        <w:t xml:space="preserve"> </w:t>
+      </w:r>
+      <w:r>
+        <w:t xml:space="preserve">Domain-wide sweeps write raw</w:t>
+      </w:r>
+      <w:r>
+        <w:t xml:space="preserve"> </w:t>
+      </w:r>
+      <w:r>
+        <w:rPr>
+          <w:rStyle w:val="VerbatimChar"/>
+        </w:rPr>
+        <w:t xml:space="preserve">{url, timestamp}</w:t>
+      </w:r>
+      <w:r>
+        <w:t xml:space="preserve"> </w:t>
+      </w:r>
+      <w:r>
+        <w:t xml:space="preserve">journals, so the same bytes can be re-read</w:t>
+      </w:r>
+      <w:r>
+        <w:t xml:space="preserve"> </w:t>
+      </w:r>
+      <w:r>
+        <w:t xml:space="preserve">under a new rule, which is what paid this round.</w:t>
       </w:r>
     </w:p>
     <w:p>
@@ -2612,436 +3253,55 @@
         </w:numPr>
       </w:pPr>
       <w:r>
-        <w:rPr>
-          <w:b/>
-          <w:bCs/>
-        </w:rPr>
-        <w:t xml:space="preserve">Admission without a human, under a standing rule.</w:t>
-      </w:r>
-      <w:r>
-        <w:t xml:space="preserve"> </w:t>
-      </w:r>
-      <w:r>
-        <w:t xml:space="preserve">A source banks when its evidence class is</w:t>
-      </w:r>
-      <w:r>
-        <w:t xml:space="preserve"> </w:t>
-      </w:r>
-      <w:r>
-        <w:t xml:space="preserve">already master-eligible, a machine stamp inside the artifact dates each item, the terms were read</w:t>
-      </w:r>
-      <w:r>
-        <w:t xml:space="preserve"> </w:t>
-      </w:r>
-      <w:r>
-        <w:t xml:space="preserve">in full, and the invariants pass. Anything else parks until a written decision.</w:t>
+        <w:t xml:space="preserve">Measured on</w:t>
+      </w:r>
+      <w:r>
+        <w:t xml:space="preserve"> </w:t>
+      </w:r>
+      <w:r>
+        <w:rPr>
+          <w:rStyle w:val="VerbatimChar"/>
+        </w:rPr>
+        <w:t xml:space="preserve">co.uk</w:t>
+      </w:r>
+      <w:r>
+        <w:t xml:space="preserve">: a CDX page costs about the same at 200 index blocks as at 10,000 (11 to</w:t>
+      </w:r>
+      <w:r>
+        <w:t xml:space="preserve"> </w:t>
+      </w:r>
+      <w:r>
+        <w:t xml:space="preserve">42 s against 110 s), so the sweep now walks 10,000-block pages and asks the page count up</w:t>
+      </w:r>
+      <w:r>
+        <w:t xml:space="preserve"> </w:t>
+      </w:r>
+      <w:r>
+        <w:t xml:space="preserve">front. An archive outage refused thirteen parents on their control probe; they were requeued,</w:t>
+      </w:r>
+      <w:r>
+        <w:t xml:space="preserve"> </w:t>
+      </w:r>
+      <w:r>
+        <w:t xml:space="preserve">and a failed page is retried rather than skipped.</w:t>
+      </w:r>
+    </w:p>
+    <w:bookmarkEnd w:id="13"/>
+    <w:bookmarkStart w:id="14" w:name="limitations-and-what-is-worth-expanding"/>
+    <w:p>
+      <w:pPr>
+        <w:pStyle w:val="Heading2"/>
+      </w:pPr>
+      <w:r>
+        <w:t xml:space="preserve">6. Limitations, and what is worth expanding</w:t>
       </w:r>
     </w:p>
     <w:p>
       <w:pPr>
-        <w:pStyle w:val="Compact"/>
-        <w:numPr>
-          <w:ilvl w:val="0"/>
-          <w:numId w:val="1003"/>
-        </w:numPr>
-      </w:pPr>
-      <w:r>
-        <w:rPr>
-          <w:b/>
-          <w:bCs/>
-        </w:rPr>
-        <w:t xml:space="preserve">The first such admission is a column this project had discarded on purpose.</w:t>
-      </w:r>
-      <w:r>
-        <w:t xml:space="preserve"> </w:t>
-      </w:r>
-      <w:r>
-        <w:t xml:space="preserve">A zone file's</w:t>
-      </w:r>
-      <w:r>
-        <w:t xml:space="preserve"> </w:t>
-      </w:r>
-      <w:r>
-        <w:t xml:space="preserve">NS records name two hosts: the delegation and the nameserver serving it. At registrable grain the</w:t>
-      </w:r>
-      <w:r>
-        <w:t xml:space="preserve"> </w:t>
-      </w:r>
-      <w:r>
-        <w:t xml:space="preserve">nameserver side closed at 63 pairs (</w:t>
-      </w:r>
-      <w:r>
-        <w:rPr>
-          <w:rStyle w:val="VerbatimChar"/>
-        </w:rPr>
-        <w:t xml:space="preserve">ns1.psi.net</w:t>
-      </w:r>
-      <w:r>
-        <w:t xml:space="preserve"> </w:t>
-      </w:r>
-      <w:r>
-        <w:t xml:space="preserve">collapses to an operator every crawl holds).</w:t>
-      </w:r>
-      <w:r>
-        <w:t xml:space="preserve"> </w:t>
-      </w:r>
-      <w:r>
-        <w:t xml:space="preserve">At hostname grain, 21,498 nameservers in the 1997 InterNIC</w:t>
-      </w:r>
-      <w:r>
-        <w:t xml:space="preserve"> </w:t>
-      </w:r>
-      <w:r>
-        <w:rPr>
-          <w:rStyle w:val="VerbatimChar"/>
-        </w:rPr>
-        <w:t xml:space="preserve">org</w:t>
-      </w:r>
-      <w:r>
-        <w:t xml:space="preserve">,</w:t>
-      </w:r>
-      <w:r>
-        <w:t xml:space="preserve"> </w:t>
-      </w:r>
-      <w:r>
-        <w:rPr>
-          <w:rStyle w:val="VerbatimChar"/>
-        </w:rPr>
-        <w:t xml:space="preserve">edu</w:t>
-      </w:r>
-      <w:r>
-        <w:t xml:space="preserve">,</w:t>
-      </w:r>
-      <w:r>
-        <w:t xml:space="preserve"> </w:t>
-      </w:r>
-      <w:r>
-        <w:rPr>
-          <w:rStyle w:val="VerbatimChar"/>
-        </w:rPr>
-        <w:t xml:space="preserve">gov</w:t>
-      </w:r>
-      <w:r>
-        <w:t xml:space="preserve">,</w:t>
-      </w:r>
-      <w:r>
-        <w:t xml:space="preserve"> </w:t>
-      </w:r>
-      <w:r>
-        <w:rPr>
-          <w:rStyle w:val="VerbatimChar"/>
-        </w:rPr>
-        <w:t xml:space="preserve">mil</w:t>
-      </w:r>
-      <w:r>
-        <w:t xml:space="preserve">,</w:t>
-      </w:r>
-      <w:r>
-        <w:t xml:space="preserve"> </w:t>
-      </w:r>
-      <w:r>
-        <w:rPr>
-          <w:rStyle w:val="VerbatimChar"/>
-        </w:rPr>
-        <w:t xml:space="preserve">root</w:t>
-      </w:r>
-      <w:r>
-        <w:t xml:space="preserve"> </w:t>
-      </w:r>
-      <w:r>
-        <w:t xml:space="preserve">and</w:t>
-      </w:r>
-      <w:r>
-        <w:t xml:space="preserve"> </w:t>
-      </w:r>
-      <w:r>
-        <w:rPr>
-          <w:rStyle w:val="VerbatimChar"/>
-        </w:rPr>
-        <w:t xml:space="preserve">arpa</w:t>
-      </w:r>
-      <w:r>
-        <w:t xml:space="preserve"> </w:t>
-      </w:r>
-      <w:r>
-        <w:t xml:space="preserve">zones are 90% absent from both the store and your 1997 file:</w:t>
-      </w:r>
-      <w:r>
-        <w:t xml:space="preserve"> </w:t>
-      </w:r>
-      <w:r>
-        <w:rPr>
-          <w:b/>
-          <w:bCs/>
-        </w:rPr>
-        <w:t xml:space="preserve">19,211 records,</w:t>
-      </w:r>
-      <w:r>
-        <w:rPr>
-          <w:b/>
-          <w:bCs/>
-        </w:rPr>
-        <w:t xml:space="preserve"> </w:t>
-      </w:r>
-      <w:r>
-        <w:rPr>
-          <w:b/>
-          <w:bCs/>
-        </w:rPr>
-        <w:t xml:space="preserve">11,860.7 EE</w:t>
-      </w:r>
-      <w:r>
-        <w:t xml:space="preserve">, dated by the SOA serial</w:t>
-      </w:r>
-      <w:r>
-        <w:t xml:space="preserve"> </w:t>
-      </w:r>
-      <w:r>
-        <w:rPr>
-          <w:rStyle w:val="VerbatimChar"/>
-        </w:rPr>
-        <w:t xml:space="preserve">1997041800</w:t>
-      </w:r>
-      <w:r>
-        <w:t xml:space="preserve"> </w:t>
-      </w:r>
-      <w:r>
-        <w:t xml:space="preserve">in the payload, no new request. The lens it</w:t>
-      </w:r>
-      <w:r>
-        <w:t xml:space="preserve"> </w:t>
-      </w:r>
-      <w:r>
-        <w:t xml:space="preserve">opens: nameservers, mail exchangers and mirrors are hosts a web crawler never fetches, so</w:t>
-      </w:r>
-      <w:r>
-        <w:t xml:space="preserve"> </w:t>
-      </w:r>
-      <w:r>
-        <w:t xml:space="preserve">DNS-side and mail-side artifacts are the hostname unit's natural source even where their</w:t>
-      </w:r>
-      <w:r>
-        <w:t xml:space="preserve"> </w:t>
-      </w:r>
-      <w:r>
-        <w:t xml:space="preserve">registrables are saturated. The second such admission is smaller and cheaper still: the two</w:t>
-      </w:r>
-      <w:r>
-        <w:t xml:space="preserve"> </w:t>
-      </w:r>
-      <w:r>
-        <w:t xml:space="preserve">banked squidGuard blocklists read one level down, keeping the host each line names instead of</w:t>
-      </w:r>
-      <w:r>
-        <w:t xml:space="preserve"> </w:t>
-      </w:r>
-      <w:r>
-        <w:t xml:space="preserve">its registrable, 7,708 records and 3,441.8 EE at 2001, zero requests (</w:t>
-      </w:r>
-      <w:r>
-        <w:rPr>
-          <w:rStyle w:val="VerbatimChar"/>
-        </w:rPr>
-        <w:t xml:space="preserve">sources.md</w:t>
-      </w:r>
-      <w:r>
-        <w:t xml:space="preserve">). The</w:t>
-      </w:r>
-      <w:r>
-        <w:t xml:space="preserve"> </w:t>
-      </w:r>
-      <w:r>
-        <w:t xml:space="preserve">third is the same lens on a registry database: the nameservers RIPE</w:t>
-      </w:r>
-      <w:r>
-        <w:t xml:space="preserve"> </w:t>
-      </w:r>
-      <w:r>
-        <w:rPr>
-          <w:rStyle w:val="VerbatimChar"/>
-        </w:rPr>
-        <w:t xml:space="preserve">domain:</w:t>
-      </w:r>
-      <w:r>
-        <w:t xml:space="preserve"> </w:t>
-      </w:r>
-      <w:r>
-        <w:t xml:space="preserve">objects point at,</w:t>
-      </w:r>
-      <w:r>
-        <w:t xml:space="preserve"> </w:t>
-      </w:r>
-      <w:r>
-        <w:t xml:space="preserve">in the two FUNET editions already banked for their delegated names, 49,841 records and</w:t>
-      </w:r>
-      <w:r>
-        <w:t xml:space="preserve"> </w:t>
-      </w:r>
-      <w:r>
-        <w:t xml:space="preserve">11,780 EE across 1996-2001, dated by the dump's own generation stamp and each object's</w:t>
-      </w:r>
-      <w:r>
-        <w:t xml:space="preserve"> </w:t>
-      </w:r>
-      <w:r>
-        <w:t xml:space="preserve">latest</w:t>
-      </w:r>
-      <w:r>
-        <w:t xml:space="preserve"> </w:t>
-      </w:r>
-      <w:r>
-        <w:rPr>
-          <w:rStyle w:val="VerbatimChar"/>
-        </w:rPr>
-        <w:t xml:space="preserve">changed:</w:t>
-      </w:r>
-      <w:r>
-        <w:t xml:space="preserve"> </w:t>
-      </w:r>
-      <w:r>
-        <w:t xml:space="preserve">line, under the RIPE NCC's written permission.</w:t>
-      </w:r>
-      <w:r>
-        <w:t xml:space="preserve"> </w:t>
-      </w:r>
-      <w:r>
-        <w:t xml:space="preserve">The fourth is item 1 of section 2, the ISC survey host files, which is the largest single</w:t>
-      </w:r>
-      <w:r>
-        <w:t xml:space="preserve"> </w:t>
-      </w:r>
-      <w:r>
-        <w:t xml:space="preserve">admission of the round and reached the same way: a column of a banked artifact that the</w:t>
-      </w:r>
-      <w:r>
-        <w:t xml:space="preserve"> </w:t>
-      </w:r>
-      <w:r>
-        <w:t xml:space="preserve">registrable unit threw away.</w:t>
-      </w:r>
-    </w:p>
-    <w:p>
-      <w:pPr>
-        <w:pStyle w:val="Compact"/>
-        <w:numPr>
-          <w:ilvl w:val="0"/>
-          <w:numId w:val="1003"/>
-        </w:numPr>
-      </w:pPr>
-      <w:r>
-        <w:rPr>
-          <w:b/>
-          <w:bCs/>
-        </w:rPr>
-        <w:t xml:space="preserve">Saturation ledger</w:t>
-      </w:r>
-      <w:r>
-        <w:t xml:space="preserve">, as your 0831 update asks:</w:t>
-      </w:r>
-      <w:r>
-        <w:t xml:space="preserve"> </w:t>
-      </w:r>
-      <w:r>
-        <w:rPr>
-          <w:rStyle w:val="VerbatimChar"/>
-        </w:rPr>
-        <w:t xml:space="preserve">audit/source_saturation_ledger.csv</w:t>
-      </w:r>
-      <w:r>
-        <w:t xml:space="preserve">, one row</w:t>
-      </w:r>
-      <w:r>
-        <w:t xml:space="preserve"> </w:t>
-      </w:r>
-      <w:r>
-        <w:t xml:space="preserve">per source family and version.</w:t>
-      </w:r>
-      <w:r>
-        <w:t xml:space="preserve"> </w:t>
-      </w:r>
-      <w:r>
-        <w:rPr>
-          <w:b/>
-          <w:bCs/>
-        </w:rPr>
-        <w:t xml:space="preserve">494 source families searched and recorded</w:t>
-      </w:r>
-      <w:r>
-        <w:t xml:space="preserve"> </w:t>
-      </w:r>
-      <w:r>
-        <w:t xml:space="preserve">in</w:t>
-      </w:r>
-      <w:r>
-        <w:t xml:space="preserve"> </w:t>
-      </w:r>
-      <w:r>
-        <w:rPr>
-          <w:rStyle w:val="VerbatimChar"/>
-        </w:rPr>
-        <w:t xml:space="preserve">sources.md</w:t>
-      </w:r>
-      <w:r>
-        <w:t xml:space="preserve">: 66 developed, 428 evaluated and closed with the measurement that closed them, so the same ground is not broken twice.</w:t>
-      </w:r>
-    </w:p>
-    <w:p>
-      <w:pPr>
-        <w:pStyle w:val="Compact"/>
-        <w:numPr>
-          <w:ilvl w:val="0"/>
-          <w:numId w:val="1003"/>
-        </w:numPr>
-      </w:pPr>
-      <w:r>
-        <w:rPr>
-          <w:b/>
-          <w:bCs/>
-        </w:rPr>
-        <w:t xml:space="preserve">Measured negatives that steer the next cycle</w:t>
-      </w:r>
-      <w:r>
-        <w:t xml:space="preserve">: prose corpora fail either the URL-density or</w:t>
-      </w:r>
-      <w:r>
-        <w:t xml:space="preserve"> </w:t>
-      </w:r>
-      <w:r>
-        <w:t xml:space="preserve">the authority screen; academic repositories closed by enumeration through five APIs and two</w:t>
-      </w:r>
-      <w:r>
-        <w:t xml:space="preserve"> </w:t>
-      </w:r>
-      <w:r>
-        <w:t xml:space="preserve">registries; CD-ROM media, FTP mirrors and trade directories at the curated-directory floor</w:t>
-      </w:r>
-      <w:r>
-        <w:t xml:space="preserve"> </w:t>
-      </w:r>
-      <w:r>
-        <w:t xml:space="preserve">(0.013-0.024 net-new pairs per listed name). Each with its figure in</w:t>
-      </w:r>
-      <w:r>
-        <w:t xml:space="preserve"> </w:t>
-      </w:r>
-      <w:r>
-        <w:rPr>
-          <w:rStyle w:val="VerbatimChar"/>
-        </w:rPr>
-        <w:t xml:space="preserve">sources.md</w:t>
-      </w:r>
-      <w:r>
-        <w:t xml:space="preserve">.</w:t>
-      </w:r>
-    </w:p>
-    <w:bookmarkEnd w:id="12"/>
-    <w:bookmarkStart w:id="13" w:name="cdx-execution-notes"/>
-    <w:p>
-      <w:pPr>
-        <w:pStyle w:val="Heading2"/>
-      </w:pPr>
-      <w:r>
-        <w:t xml:space="preserve">5. CDX execution notes</w:t>
+        <w:pStyle w:val="FirstParagraph"/>
+      </w:pPr>
+      <w:r>
+        <w:t xml:space="preserve">Three limits, in the order they affect the figure:</w:t>
       </w:r>
     </w:p>
     <w:p>
@@ -3053,22 +3313,35 @@
         </w:numPr>
       </w:pPr>
       <w:r>
-        <w:t xml:space="preserve">Two clients at most, honest User-Agent, two seconds between requests, backoff on 429/503/504,</w:t>
-      </w:r>
-      <w:r>
-        <w:t xml:space="preserve"> </w:t>
-      </w:r>
-      <w:r>
-        <w:rPr>
-          <w:rStyle w:val="VerbatimChar"/>
-        </w:rPr>
-        <w:t xml:space="preserve">Retry-After</w:t>
-      </w:r>
-      <w:r>
-        <w:t xml:space="preserve"> </w:t>
-      </w:r>
-      <w:r>
-        <w:t xml:space="preserve">honoured. Collectors take an absolute deadline and outlive the session.</w:t>
+        <w:rPr>
+          <w:b/>
+          <w:bCs/>
+        </w:rPr>
+        <w:t xml:space="preserve">A hostname is not a site.</w:t>
+      </w:r>
+      <w:r>
+        <w:t xml:space="preserve"> </w:t>
+      </w:r>
+      <w:r>
+        <w:t xml:space="preserve">Under your rule a valid distinct hostname counts, and a</w:t>
+      </w:r>
+      <w:r>
+        <w:t xml:space="preserve"> </w:t>
+      </w:r>
+      <w:r>
+        <w:t xml:space="preserve">reverse-DNS walk resolves dialup ports and workstations as readily as web servers. That is</w:t>
+      </w:r>
+      <w:r>
+        <w:t xml:space="preserve"> </w:t>
+      </w:r>
+      <w:r>
+        <w:t xml:space="preserve">where most of this round's records come from and it is quoted per source, so a cut is one</w:t>
+      </w:r>
+      <w:r>
+        <w:t xml:space="preserve"> </w:t>
+      </w:r>
+      <w:r>
+        <w:t xml:space="preserve">filter on the manifest rather than a re-derivation.</w:t>
       </w:r>
     </w:p>
     <w:p>
@@ -3080,34 +3353,17 @@
         </w:numPr>
       </w:pPr>
       <w:r>
-        <w:t xml:space="preserve">Per-domain queries over bracketed gaps and the candidate pool: 92,479 registrable pairs.</w:t>
-      </w:r>
-      <w:r>
-        <w:t xml:space="preserve"> </w:t>
-      </w:r>
-      <w:r>
-        <w:t xml:space="preserve">Domain-wide sweeps write raw</w:t>
-      </w:r>
-      <w:r>
-        <w:t xml:space="preserve"> </w:t>
-      </w:r>
-      <w:r>
-        <w:rPr>
-          <w:rStyle w:val="VerbatimChar"/>
-        </w:rPr>
-        <w:t xml:space="preserve">{url, timestamp}</w:t>
-      </w:r>
-      <w:r>
-        <w:t xml:space="preserve"> </w:t>
-      </w:r>
-      <w:r>
-        <w:t xml:space="preserve">journals, so the same bytes can be re-read</w:t>
-      </w:r>
-      <w:r>
-        <w:t xml:space="preserve"> </w:t>
-      </w:r>
-      <w:r>
-        <w:t xml:space="preserve">under a new rule, which is what paid this round.</w:t>
+        <w:rPr>
+          <w:b/>
+          <w:bCs/>
+        </w:rPr>
+        <w:t xml:space="preserve">A capture proves presence, never absence.</w:t>
+      </w:r>
+      <w:r>
+        <w:t xml:space="preserve"> </w:t>
+      </w:r>
+      <w:r>
+        <w:t xml:space="preserve">A year without one is unevidenced, not empty.</w:t>
       </w:r>
     </w:p>
     <w:p>
@@ -3116,128 +3372,6 @@
         <w:numPr>
           <w:ilvl w:val="0"/>
           <w:numId w:val="1004"/>
-        </w:numPr>
-      </w:pPr>
-      <w:r>
-        <w:t xml:space="preserve">Measured on</w:t>
-      </w:r>
-      <w:r>
-        <w:t xml:space="preserve"> </w:t>
-      </w:r>
-      <w:r>
-        <w:rPr>
-          <w:rStyle w:val="VerbatimChar"/>
-        </w:rPr>
-        <w:t xml:space="preserve">co.uk</w:t>
-      </w:r>
-      <w:r>
-        <w:t xml:space="preserve">: a CDX page costs about the same at 200 index blocks as at 10,000 (11 to</w:t>
-      </w:r>
-      <w:r>
-        <w:t xml:space="preserve"> </w:t>
-      </w:r>
-      <w:r>
-        <w:t xml:space="preserve">42 s against 110 s), so the sweep now walks 10,000-block pages and asks the page count up</w:t>
-      </w:r>
-      <w:r>
-        <w:t xml:space="preserve"> </w:t>
-      </w:r>
-      <w:r>
-        <w:t xml:space="preserve">front. An archive outage refused thirteen parents on their control probe; they were requeued,</w:t>
-      </w:r>
-      <w:r>
-        <w:t xml:space="preserve"> </w:t>
-      </w:r>
-      <w:r>
-        <w:t xml:space="preserve">and a failed page is retried rather than skipped.</w:t>
-      </w:r>
-    </w:p>
-    <w:bookmarkEnd w:id="13"/>
-    <w:bookmarkStart w:id="14" w:name="limitations-and-what-is-worth-expanding"/>
-    <w:p>
-      <w:pPr>
-        <w:pStyle w:val="Heading2"/>
-      </w:pPr>
-      <w:r>
-        <w:t xml:space="preserve">6. Limitations, and what is worth expanding</w:t>
-      </w:r>
-    </w:p>
-    <w:p>
-      <w:pPr>
-        <w:pStyle w:val="FirstParagraph"/>
-      </w:pPr>
-      <w:r>
-        <w:t xml:space="preserve">Three limits, in the order they affect the figure:</w:t>
-      </w:r>
-    </w:p>
-    <w:p>
-      <w:pPr>
-        <w:pStyle w:val="Compact"/>
-        <w:numPr>
-          <w:ilvl w:val="0"/>
-          <w:numId w:val="1005"/>
-        </w:numPr>
-      </w:pPr>
-      <w:r>
-        <w:rPr>
-          <w:b/>
-          <w:bCs/>
-        </w:rPr>
-        <w:t xml:space="preserve">A hostname is not a site.</w:t>
-      </w:r>
-      <w:r>
-        <w:t xml:space="preserve"> </w:t>
-      </w:r>
-      <w:r>
-        <w:t xml:space="preserve">Under your rule a valid distinct hostname counts, and a</w:t>
-      </w:r>
-      <w:r>
-        <w:t xml:space="preserve"> </w:t>
-      </w:r>
-      <w:r>
-        <w:t xml:space="preserve">reverse-DNS walk resolves dialup ports and workstations as readily as web servers. That is</w:t>
-      </w:r>
-      <w:r>
-        <w:t xml:space="preserve"> </w:t>
-      </w:r>
-      <w:r>
-        <w:t xml:space="preserve">where most of this round's records come from and it is quoted per source, so a cut is one</w:t>
-      </w:r>
-      <w:r>
-        <w:t xml:space="preserve"> </w:t>
-      </w:r>
-      <w:r>
-        <w:t xml:space="preserve">filter on the manifest rather than a re-derivation.</w:t>
-      </w:r>
-    </w:p>
-    <w:p>
-      <w:pPr>
-        <w:pStyle w:val="Compact"/>
-        <w:numPr>
-          <w:ilvl w:val="0"/>
-          <w:numId w:val="1005"/>
-        </w:numPr>
-      </w:pPr>
-      <w:r>
-        <w:rPr>
-          <w:b/>
-          <w:bCs/>
-        </w:rPr>
-        <w:t xml:space="preserve">A capture proves presence, never absence.</w:t>
-      </w:r>
-      <w:r>
-        <w:t xml:space="preserve"> </w:t>
-      </w:r>
-      <w:r>
-        <w:t xml:space="preserve">A year without one is unevidenced, not empty.</w:t>
-      </w:r>
-    </w:p>
-    <w:p>
-      <w:pPr>
-        <w:pStyle w:val="Compact"/>
-        <w:numPr>
-          <w:ilvl w:val="0"/>
-          <w:numId w:val="1005"/>
         </w:numPr>
       </w:pPr>
       <w:r>
@@ -3572,7 +3706,7 @@
         <w:pStyle w:val="Compact"/>
         <w:numPr>
           <w:ilvl w:val="0"/>
-          <w:numId w:val="1006"/>
+          <w:numId w:val="1005"/>
         </w:numPr>
       </w:pPr>
       <w:r>
@@ -3597,7 +3731,7 @@
         <w:pStyle w:val="Compact"/>
         <w:numPr>
           <w:ilvl w:val="0"/>
-          <w:numId w:val="1006"/>
+          <w:numId w:val="1005"/>
         </w:numPr>
       </w:pPr>
       <w:r>
@@ -3658,7 +3792,7 @@
         <w:pStyle w:val="Compact"/>
         <w:numPr>
           <w:ilvl w:val="0"/>
-          <w:numId w:val="1006"/>
+          <w:numId w:val="1005"/>
         </w:numPr>
       </w:pPr>
       <w:r>
@@ -4509,9 +4643,6 @@
     <w:abstractNumId w:val="991"/>
   </w:num>
   <w:num w:numId="1005">
-    <w:abstractNumId w:val="991"/>
-  </w:num>
-  <w:num w:numId="1006">
     <w:abstractNumId w:val="991"/>
   </w:num>
 </w:numbering>

</xml_diff>

<commit_message>
Measure against merged260902 and rewrite the round at the purpose rule: 2,541,429 records, 1,458,263 EE, 7.58%
Baseline constants and the reviewer's re-transcribed brief updated; the report and summary
drop the held-out DNS and www rows and disclose them against his 0902 wording; the packager
ships the built .docx instead of rebuilding it at a different font size.
</commit_message>
<xml_diff>
--- a/docs/report.docx
+++ b/docs/report.docx
@@ -25,7 +25,7 @@
         <w:rPr>
           <w:rStyle w:val="VerbatimChar"/>
         </w:rPr>
-        <w:t xml:space="preserve">merged260901</w:t>
+        <w:t xml:space="preserve">merged260902</w:t>
       </w:r>
       <w:r>
         <w:t xml:space="preserve">. Every figure is generated</w:t>
@@ -148,7 +148,7 @@
               <w:jc w:val="right"/>
             </w:pPr>
             <w:r>
-              <w:t xml:space="preserve">33,848,926</w:t>
+              <w:t xml:space="preserve">36,672,403</w:t>
             </w:r>
           </w:p>
         </w:tc>
@@ -173,7 +173,7 @@
               <w:jc w:val="right"/>
             </w:pPr>
             <w:r>
-              <w:t xml:space="preserve">17,770,588.9026</w:t>
+              <w:t xml:space="preserve">19,239,935.8548</w:t>
             </w:r>
           </w:p>
         </w:tc>
@@ -202,7 +202,7 @@
                 <w:b/>
                 <w:bCs/>
               </w:rPr>
-              <w:t xml:space="preserve">26,224,274</w:t>
+              <w:t xml:space="preserve">2,541,429</w:t>
             </w:r>
             <w:r>
               <w:t xml:space="preserve"> </w:t>
@@ -237,7 +237,7 @@
                 <w:b/>
                 <w:bCs/>
               </w:rPr>
-              <w:t xml:space="preserve">13,670,342.8300</w:t>
+              <w:t xml:space="preserve">1,458,263.2088</w:t>
             </w:r>
           </w:p>
         </w:tc>
@@ -266,7 +266,7 @@
                 <w:b/>
                 <w:bCs/>
               </w:rPr>
-              <w:t xml:space="preserve">76.9268%</w:t>
+              <w:t xml:space="preserve">7.5794%</w:t>
             </w:r>
           </w:p>
         </w:tc>
@@ -277,7 +277,7 @@
         <w:pStyle w:val="BodyText"/>
       </w:pPr>
       <w:r>
-        <w:t xml:space="preserve">625,385 records (329,397.2492 EE) are registrable domains in</w:t>
+        <w:t xml:space="preserve">623,823 records (328,847.5752 EE) are registrable domains in</w:t>
       </w:r>
       <w:r>
         <w:t xml:space="preserve"> </w:t>
@@ -295,7 +295,7 @@
         <w:t xml:space="preserve"> </w:t>
       </w:r>
       <w:r>
-        <w:t xml:space="preserve">prioritize; 25,598,889 (13,340,945.5808 EE) are valid hostnames beneath them in</w:t>
+        <w:t xml:space="preserve">prioritize; 1,917,606 (1,129,415.6336 EE) are valid hostnames beneath them in</w:t>
       </w:r>
       <w:r>
         <w:t xml:space="preserve"> </w:t>
@@ -418,19 +418,19 @@
               <w:jc w:val="right"/>
             </w:pPr>
             <w:r>
-              <w:t xml:space="preserve">7,742,554</w:t>
-            </w:r>
-          </w:p>
-        </w:tc>
-        <w:tc>
-          <w:tcPr/>
-          <w:p>
-            <w:pPr>
-              <w:pStyle w:val="Compact"/>
-              <w:jc w:val="right"/>
-            </w:pPr>
-            <w:r>
-              <w:t xml:space="preserve">4,156,305.3362</w:t>
+              <w:t xml:space="preserve">14,198</w:t>
+            </w:r>
+          </w:p>
+        </w:tc>
+        <w:tc>
+          <w:tcPr/>
+          <w:p>
+            <w:pPr>
+              <w:pStyle w:val="Compact"/>
+              <w:jc w:val="right"/>
+            </w:pPr>
+            <w:r>
+              <w:t xml:space="preserve">15,785.0458</w:t>
             </w:r>
           </w:p>
         </w:tc>
@@ -467,19 +467,19 @@
               <w:jc w:val="right"/>
             </w:pPr>
             <w:r>
-              <w:t xml:space="preserve">10,781,639</w:t>
-            </w:r>
-          </w:p>
-        </w:tc>
-        <w:tc>
-          <w:tcPr/>
-          <w:p>
-            <w:pPr>
-              <w:pStyle w:val="Compact"/>
-              <w:jc w:val="right"/>
-            </w:pPr>
-            <w:r>
-              <w:t xml:space="preserve">5,263,433.0010</w:t>
+              <w:t xml:space="preserve">30,541</w:t>
+            </w:r>
+          </w:p>
+        </w:tc>
+        <w:tc>
+          <w:tcPr/>
+          <w:p>
+            <w:pPr>
+              <w:pStyle w:val="Compact"/>
+              <w:jc w:val="right"/>
+            </w:pPr>
+            <w:r>
+              <w:t xml:space="preserve">30,813.8440</w:t>
             </w:r>
           </w:p>
         </w:tc>
@@ -504,31 +504,31 @@
               <w:jc w:val="right"/>
             </w:pPr>
             <w:r>
-              <w:t xml:space="preserve">23,025</w:t>
-            </w:r>
-          </w:p>
-        </w:tc>
-        <w:tc>
-          <w:tcPr/>
-          <w:p>
-            <w:pPr>
-              <w:pStyle w:val="Compact"/>
-              <w:jc w:val="right"/>
-            </w:pPr>
-            <w:r>
-              <w:t xml:space="preserve">999,412</w:t>
-            </w:r>
-          </w:p>
-        </w:tc>
-        <w:tc>
-          <w:tcPr/>
-          <w:p>
-            <w:pPr>
-              <w:pStyle w:val="Compact"/>
-              <w:jc w:val="right"/>
-            </w:pPr>
-            <w:r>
-              <w:t xml:space="preserve">574,071.3613</w:t>
+              <w:t xml:space="preserve">22,974</w:t>
+            </w:r>
+          </w:p>
+        </w:tc>
+        <w:tc>
+          <w:tcPr/>
+          <w:p>
+            <w:pPr>
+              <w:pStyle w:val="Compact"/>
+              <w:jc w:val="right"/>
+            </w:pPr>
+            <w:r>
+              <w:t xml:space="preserve">108,801</w:t>
+            </w:r>
+          </w:p>
+        </w:tc>
+        <w:tc>
+          <w:tcPr/>
+          <w:p>
+            <w:pPr>
+              <w:pStyle w:val="Compact"/>
+              <w:jc w:val="right"/>
+            </w:pPr>
+            <w:r>
+              <w:t xml:space="preserve">84,960.5429</w:t>
             </w:r>
           </w:p>
         </w:tc>
@@ -553,31 +553,31 @@
               <w:jc w:val="right"/>
             </w:pPr>
             <w:r>
-              <w:t xml:space="preserve">46,776</w:t>
-            </w:r>
-          </w:p>
-        </w:tc>
-        <w:tc>
-          <w:tcPr/>
-          <w:p>
-            <w:pPr>
-              <w:pStyle w:val="Compact"/>
-              <w:jc w:val="right"/>
-            </w:pPr>
-            <w:r>
-              <w:t xml:space="preserve">1,458,019</w:t>
-            </w:r>
-          </w:p>
-        </w:tc>
-        <w:tc>
-          <w:tcPr/>
-          <w:p>
-            <w:pPr>
-              <w:pStyle w:val="Compact"/>
-              <w:jc w:val="right"/>
-            </w:pPr>
-            <w:r>
-              <w:t xml:space="preserve">828,029.6155</w:t>
+              <w:t xml:space="preserve">46,564</w:t>
+            </w:r>
+          </w:p>
+        </w:tc>
+        <w:tc>
+          <w:tcPr/>
+          <w:p>
+            <w:pPr>
+              <w:pStyle w:val="Compact"/>
+              <w:jc w:val="right"/>
+            </w:pPr>
+            <w:r>
+              <w:t xml:space="preserve">198,265</w:t>
+            </w:r>
+          </w:p>
+        </w:tc>
+        <w:tc>
+          <w:tcPr/>
+          <w:p>
+            <w:pPr>
+              <w:pStyle w:val="Compact"/>
+              <w:jc w:val="right"/>
+            </w:pPr>
+            <w:r>
+              <w:t xml:space="preserve">161,494.5469</w:t>
             </w:r>
           </w:p>
         </w:tc>
@@ -602,31 +602,31 @@
               <w:jc w:val="right"/>
             </w:pPr>
             <w:r>
-              <w:t xml:space="preserve">27,630</w:t>
-            </w:r>
-          </w:p>
-        </w:tc>
-        <w:tc>
-          <w:tcPr/>
-          <w:p>
-            <w:pPr>
-              <w:pStyle w:val="Compact"/>
-              <w:jc w:val="right"/>
-            </w:pPr>
-            <w:r>
-              <w:t xml:space="preserve">1,661,393</w:t>
-            </w:r>
-          </w:p>
-        </w:tc>
-        <w:tc>
-          <w:tcPr/>
-          <w:p>
-            <w:pPr>
-              <w:pStyle w:val="Compact"/>
-              <w:jc w:val="right"/>
-            </w:pPr>
-            <w:r>
-              <w:t xml:space="preserve">937,279.6350</w:t>
+              <w:t xml:space="preserve">27,227</w:t>
+            </w:r>
+          </w:p>
+        </w:tc>
+        <w:tc>
+          <w:tcPr/>
+          <w:p>
+            <w:pPr>
+              <w:pStyle w:val="Compact"/>
+              <w:jc w:val="right"/>
+            </w:pPr>
+            <w:r>
+              <w:t xml:space="preserve">301,074</w:t>
+            </w:r>
+          </w:p>
+        </w:tc>
+        <w:tc>
+          <w:tcPr/>
+          <w:p>
+            <w:pPr>
+              <w:pStyle w:val="Compact"/>
+              <w:jc w:val="right"/>
+            </w:pPr>
+            <w:r>
+              <w:t xml:space="preserve">214,786.7330</w:t>
             </w:r>
           </w:p>
         </w:tc>
@@ -651,31 +651,31 @@
               <w:jc w:val="right"/>
             </w:pPr>
             <w:r>
-              <w:t xml:space="preserve">500,969</w:t>
-            </w:r>
-          </w:p>
-        </w:tc>
-        <w:tc>
-          <w:tcPr/>
-          <w:p>
-            <w:pPr>
-              <w:pStyle w:val="Compact"/>
-              <w:jc w:val="right"/>
-            </w:pPr>
-            <w:r>
-              <w:t xml:space="preserve">2,955,872</w:t>
-            </w:r>
-          </w:p>
-        </w:tc>
-        <w:tc>
-          <w:tcPr/>
-          <w:p>
-            <w:pPr>
-              <w:pStyle w:val="Compact"/>
-              <w:jc w:val="right"/>
-            </w:pPr>
-            <w:r>
-              <w:t xml:space="preserve">1,911,223.8810</w:t>
+              <w:t xml:space="preserve">500,073</w:t>
+            </w:r>
+          </w:p>
+        </w:tc>
+        <w:tc>
+          <w:tcPr/>
+          <w:p>
+            <w:pPr>
+              <w:pStyle w:val="Compact"/>
+              <w:jc w:val="right"/>
+            </w:pPr>
+            <w:r>
+              <w:t xml:space="preserve">1,264,727</w:t>
+            </w:r>
+          </w:p>
+        </w:tc>
+        <w:tc>
+          <w:tcPr/>
+          <w:p>
+            <w:pPr>
+              <w:pStyle w:val="Compact"/>
+              <w:jc w:val="right"/>
+            </w:pPr>
+            <w:r>
+              <w:t xml:space="preserve">950,422.4962</w:t>
             </w:r>
           </w:p>
         </w:tc>
@@ -708,7 +708,7 @@
                 <w:b/>
                 <w:bCs/>
               </w:rPr>
-              <w:t xml:space="preserve">625,385</w:t>
+              <w:t xml:space="preserve">623,823</w:t>
             </w:r>
           </w:p>
         </w:tc>
@@ -724,7 +724,7 @@
                 <w:b/>
                 <w:bCs/>
               </w:rPr>
-              <w:t xml:space="preserve">25,598,889</w:t>
+              <w:t xml:space="preserve">1,917,606</w:t>
             </w:r>
           </w:p>
         </w:tc>
@@ -740,7 +740,7 @@
                 <w:b/>
                 <w:bCs/>
               </w:rPr>
-              <w:t xml:space="preserve">13,670,342.8300</w:t>
+              <w:t xml:space="preserve">1,458,263.2088</w:t>
             </w:r>
           </w:p>
         </w:tc>
@@ -771,7 +771,7 @@
           <w:b/>
           <w:bCs/>
         </w:rPr>
-        <w:t xml:space="preserve">125.7295%</w:t>
+        <w:t xml:space="preserve">56.3821%</w:t>
       </w:r>
       <w:r>
         <w:t xml:space="preserve">, time-weighted</w:t>
@@ -784,7 +784,7 @@
           <w:b/>
           <w:bCs/>
         </w:rPr>
-        <w:t xml:space="preserve">S = 919.90</w:t>
+        <w:t xml:space="preserve">S = 226.43</w:t>
       </w:r>
       <w:r>
         <w:t xml:space="preserve"> </w:t>
@@ -802,7 +802,7 @@
         <w:t xml:space="preserve">10 p/t</w:t>
       </w:r>
       <w:r>
-        <w:t xml:space="preserve">, this round counted at its own unverified 76.9268%. Per round (1: 17.3800% / 5d = 34.76; 3: 1.6600% / 1d = 16.60; 4: 10.7310% / 6d = 17.88; 5: 14.9011% / 2d = 74.51; 6: 4.1307% / 6d = 6.88; 7: 76.9268% / 1d = 769.27), round 1 on records. The elapsed days are reconstructed from your release and receipt timestamps: they reproduce the S = 6.88 you quoted for round 6, but the set is yours to confirm.</w:t>
+        <w:t xml:space="preserve">, this round counted at its own unverified 7.5794%. Per round (1: 17.3800% / 5d = 34.76; 3: 1.6600% / 1d = 16.60; 4: 10.7310% / 6d = 17.88; 5: 14.9011% / 2d = 74.51; 6: 4.1307% / 6d = 6.88; 7: 7.5794% / 1d = 75.79), round 1 on records. The elapsed days are reconstructed from your release and receipt timestamps: they reproduce the S = 6.88 you quoted for round 6, but the set is yours to confirm.</w:t>
       </w:r>
     </w:p>
     <w:bookmarkEnd w:id="9"/>
@@ -820,7 +820,7 @@
         <w:pStyle w:val="FirstParagraph"/>
       </w:pPr>
       <w:r>
-        <w:t xml:space="preserve">Three conditions, all enforced in code (</w:t>
+        <w:t xml:space="preserve">Four conditions, all enforced in code (</w:t>
       </w:r>
       <w:r>
         <w:rPr>
@@ -847,7 +847,13 @@
         <w:t xml:space="preserve"> </w:t>
       </w:r>
       <w:r>
-        <w:t xml:space="preserve">convention:</w:t>
+        <w:t xml:space="preserve">convention. The first two are your rule; the last two are its purpose, retrieving archived pages,</w:t>
+      </w:r>
+      <w:r>
+        <w:t xml:space="preserve"> </w:t>
+      </w:r>
+      <w:r>
+        <w:t xml:space="preserve">applied on 2026-09-02 after a first build had counted names that pass the letter and serve it nothing:</w:t>
       </w:r>
     </w:p>
     <w:p>
@@ -903,25 +909,25 @@
           <w:b/>
           <w:bCs/>
         </w:rPr>
-        <w:t xml:space="preserve">Strictly beneath a registrable this project already holds for that same year.</w:t>
-      </w:r>
-      <w:r>
-        <w:t xml:space="preserve"> </w:t>
-      </w:r>
-      <w:r>
-        <w:t xml:space="preserve">The parent is</w:t>
-      </w:r>
-      <w:r>
-        <w:t xml:space="preserve"> </w:t>
-      </w:r>
-      <w:r>
-        <w:t xml:space="preserve">a foreign key, so a hostname cannot exist here without its registrable existing there, and a</w:t>
-      </w:r>
-      <w:r>
-        <w:t xml:space="preserve"> </w:t>
-      </w:r>
-      <w:r>
-        <w:t xml:space="preserve">bare registrable is never a hostname record. No name is counted in both units.</w:t>
+        <w:t xml:space="preserve">Strictly beneath a registrable this project holds for that same year.</w:t>
+      </w:r>
+      <w:r>
+        <w:t xml:space="preserve"> </w:t>
+      </w:r>
+      <w:r>
+        <w:t xml:space="preserve">The parent is a</w:t>
+      </w:r>
+      <w:r>
+        <w:t xml:space="preserve"> </w:t>
+      </w:r>
+      <w:r>
+        <w:t xml:space="preserve">foreign key, so a hostname cannot exist here without its registrable existing there, and a bare</w:t>
+      </w:r>
+      <w:r>
+        <w:t xml:space="preserve"> </w:t>
+      </w:r>
+      <w:r>
+        <w:t xml:space="preserve">registrable is never a hostname record. No name is counted in both units.</w:t>
       </w:r>
     </w:p>
     <w:p>
@@ -937,10 +943,72 @@
           <w:b/>
           <w:bCs/>
         </w:rPr>
-        <w:t xml:space="preserve">Its own machine-written observation in that year</w:t>
-      </w:r>
-      <w:r>
-        <w:t xml:space="preserve">, on that exact host.</w:t>
+        <w:t xml:space="preserve">Its own machine-written observation in that year, showing the host serving web content</w:t>
+      </w:r>
+      <w:r>
+        <w:t xml:space="preserve">: a</w:t>
+      </w:r>
+      <w:r>
+        <w:t xml:space="preserve"> </w:t>
+      </w:r>
+      <w:r>
+        <w:t xml:space="preserve">capture of a URL on it, or a URL listing naming it. A DNS listing proves a machine answered, not</w:t>
+      </w:r>
+      <w:r>
+        <w:t xml:space="preserve"> </w:t>
+      </w:r>
+      <w:r>
+        <w:t xml:space="preserve">a site, so it dates the parent registrable and writes no hostname record.</w:t>
+      </w:r>
+    </w:p>
+    <w:p>
+      <w:pPr>
+        <w:pStyle w:val="Compact"/>
+        <w:numPr>
+          <w:ilvl w:val="0"/>
+          <w:numId w:val="1001"/>
+        </w:numPr>
+      </w:pPr>
+      <w:r>
+        <w:rPr>
+          <w:b/>
+          <w:bCs/>
+        </w:rPr>
+        <w:t xml:space="preserve">Not</w:t>
+      </w:r>
+      <w:r>
+        <w:rPr>
+          <w:b/>
+          <w:bCs/>
+        </w:rPr>
+        <w:t xml:space="preserve"> </w:t>
+      </w:r>
+      <w:r>
+        <w:rPr>
+          <w:rStyle w:val="VerbatimChar"/>
+          <w:b/>
+          <w:bCs/>
+        </w:rPr>
+        <w:t xml:space="preserve">www.&lt;parent&gt;</w:t>
+      </w:r>
+      <w:r>
+        <w:rPr>
+          <w:b/>
+          <w:bCs/>
+        </w:rPr>
+        <w:t xml:space="preserve">.</w:t>
+      </w:r>
+      <w:r>
+        <w:t xml:space="preserve"> </w:t>
+      </w:r>
+      <w:r>
+        <w:t xml:space="preserve">That is the registrable's own site under the name every crawler tries</w:t>
+      </w:r>
+      <w:r>
+        <w:t xml:space="preserve"> </w:t>
+      </w:r>
+      <w:r>
+        <w:t xml:space="preserve">first; the capture dates the registrable, and counting it again would be the same site twice.</w:t>
       </w:r>
     </w:p>
     <w:bookmarkEnd w:id="10"/>
@@ -958,7 +1026,7 @@
         <w:pStyle w:val="FirstParagraph"/>
       </w:pPr>
       <w:r>
-        <w:t xml:space="preserve">One idea, applied to seven artifact families:</w:t>
+        <w:t xml:space="preserve">One idea, applied to five artifact families:</w:t>
       </w:r>
       <w:r>
         <w:t xml:space="preserve"> </w:t>
@@ -988,7 +1056,7 @@
         <w:t xml:space="preserve"> </w:t>
       </w:r>
       <w:r>
-        <w:t xml:space="preserve">Five of the seven</w:t>
+        <w:t xml:space="preserve">Four of the five</w:t>
       </w:r>
       <w:r>
         <w:t xml:space="preserve"> </w:t>
@@ -1069,57 +1137,42 @@
               <w:pStyle w:val="Compact"/>
             </w:pPr>
             <w:r>
-              <w:t xml:space="preserve">ISC Internet Domain Survey host files</w:t>
-            </w:r>
-          </w:p>
-        </w:tc>
-        <w:tc>
-          <w:tcPr/>
-          <w:p>
-            <w:pPr>
-              <w:pStyle w:val="Compact"/>
-            </w:pPr>
-            <w:r>
-              <w:t xml:space="preserve">the survey's</w:t>
-            </w:r>
-            <w:r>
-              <w:t xml:space="preserve"> </w:t>
-            </w:r>
-            <w:r>
-              <w:rPr>
-                <w:rStyle w:val="VerbatimChar"/>
-              </w:rPr>
-              <w:t xml:space="preserve">YYMM</w:t>
-            </w:r>
-            <w:r>
-              <w:t xml:space="preserve"> </w:t>
-            </w:r>
-            <w:r>
-              <w:t xml:space="preserve">edition code in the artifact path</w:t>
-            </w:r>
-          </w:p>
-        </w:tc>
-        <w:tc>
-          <w:tcPr/>
-          <w:p>
-            <w:pPr>
-              <w:pStyle w:val="Compact"/>
-              <w:jc w:val="right"/>
-            </w:pPr>
-            <w:r>
-              <w:t xml:space="preserve">18,117,395</w:t>
-            </w:r>
-          </w:p>
-        </w:tc>
-        <w:tc>
-          <w:tcPr/>
-          <w:p>
-            <w:pPr>
-              <w:pStyle w:val="Compact"/>
-              <w:jc w:val="right"/>
-            </w:pPr>
-            <w:r>
-              <w:t xml:space="preserve">9,167,369</w:t>
+              <w:t xml:space="preserve">IA domain-wide CDX sweeps</w:t>
+            </w:r>
+          </w:p>
+        </w:tc>
+        <w:tc>
+          <w:tcPr/>
+          <w:p>
+            <w:pPr>
+              <w:pStyle w:val="Compact"/>
+            </w:pPr>
+            <w:r>
+              <w:t xml:space="preserve">the row's 14-digit capture timestamp</w:t>
+            </w:r>
+          </w:p>
+        </w:tc>
+        <w:tc>
+          <w:tcPr/>
+          <w:p>
+            <w:pPr>
+              <w:pStyle w:val="Compact"/>
+              <w:jc w:val="right"/>
+            </w:pPr>
+            <w:r>
+              <w:t xml:space="preserve">1,603,793</w:t>
+            </w:r>
+          </w:p>
+        </w:tc>
+        <w:tc>
+          <w:tcPr/>
+          <w:p>
+            <w:pPr>
+              <w:pStyle w:val="Compact"/>
+              <w:jc w:val="right"/>
+            </w:pPr>
+            <w:r>
+              <w:t xml:space="preserve">956,099</w:t>
             </w:r>
           </w:p>
         </w:tc>
@@ -1132,7 +1185,7 @@
               <w:pStyle w:val="Compact"/>
             </w:pPr>
             <w:r>
-              <w:t xml:space="preserve">NYPW TimeMaps</w:t>
+              <w:t xml:space="preserve">IA Early Web index</w:t>
             </w:r>
           </w:p>
         </w:tc>
@@ -1155,19 +1208,19 @@
               <w:jc w:val="right"/>
             </w:pPr>
             <w:r>
-              <w:t xml:space="preserve">4,039,562</w:t>
-            </w:r>
-          </w:p>
-        </w:tc>
-        <w:tc>
-          <w:tcPr/>
-          <w:p>
-            <w:pPr>
-              <w:pStyle w:val="Compact"/>
-              <w:jc w:val="right"/>
-            </w:pPr>
-            <w:r>
-              <w:t xml:space="preserve">2,097,955</w:t>
+              <w:t xml:space="preserve">122,061</w:t>
+            </w:r>
+          </w:p>
+        </w:tc>
+        <w:tc>
+          <w:tcPr/>
+          <w:p>
+            <w:pPr>
+              <w:pStyle w:val="Compact"/>
+              <w:jc w:val="right"/>
+            </w:pPr>
+            <w:r>
+              <w:t xml:space="preserve">65,026</w:t>
             </w:r>
           </w:p>
         </w:tc>
@@ -1180,7 +1233,7 @@
               <w:pStyle w:val="Compact"/>
             </w:pPr>
             <w:r>
-              <w:t xml:space="preserve">IA domain-wide CDX sweeps</w:t>
+              <w:t xml:space="preserve">NYPW TimeMaps</w:t>
             </w:r>
           </w:p>
         </w:tc>
@@ -1203,19 +1256,19 @@
               <w:jc w:val="right"/>
             </w:pPr>
             <w:r>
-              <w:t xml:space="preserve">2,161,296</w:t>
-            </w:r>
-          </w:p>
-        </w:tc>
-        <w:tc>
-          <w:tcPr/>
-          <w:p>
-            <w:pPr>
-              <w:pStyle w:val="Compact"/>
-              <w:jc w:val="right"/>
-            </w:pPr>
-            <w:r>
-              <w:t xml:space="preserve">1,378,051</w:t>
+              <w:t xml:space="preserve">150,313</w:t>
+            </w:r>
+          </w:p>
+        </w:tc>
+        <w:tc>
+          <w:tcPr/>
+          <w:p>
+            <w:pPr>
+              <w:pStyle w:val="Compact"/>
+              <w:jc w:val="right"/>
+            </w:pPr>
+            <w:r>
+              <w:t xml:space="preserve">70,937</w:t>
             </w:r>
           </w:p>
         </w:tc>
@@ -1228,7 +1281,7 @@
               <w:pStyle w:val="Compact"/>
             </w:pPr>
             <w:r>
-              <w:t xml:space="preserve">IA Early Web index</w:t>
+              <w:t xml:space="preserve">USFEDGOV merged indexes</w:t>
             </w:r>
           </w:p>
         </w:tc>
@@ -1251,19 +1304,19 @@
               <w:jc w:val="right"/>
             </w:pPr>
             <w:r>
-              <w:t xml:space="preserve">1,163,616</w:t>
-            </w:r>
-          </w:p>
-        </w:tc>
-        <w:tc>
-          <w:tcPr/>
-          <w:p>
-            <w:pPr>
-              <w:pStyle w:val="Compact"/>
-              <w:jc w:val="right"/>
-            </w:pPr>
-            <w:r>
-              <w:t xml:space="preserve">631,148</w:t>
+              <w:t xml:space="preserve">35,422</w:t>
+            </w:r>
+          </w:p>
+        </w:tc>
+        <w:tc>
+          <w:tcPr/>
+          <w:p>
+            <w:pPr>
+              <w:pStyle w:val="Compact"/>
+              <w:jc w:val="right"/>
+            </w:pPr>
+            <w:r>
+              <w:t xml:space="preserve">34,726</w:t>
             </w:r>
           </w:p>
         </w:tc>
@@ -1276,120 +1329,42 @@
               <w:pStyle w:val="Compact"/>
             </w:pPr>
             <w:r>
-              <w:t xml:space="preserve">USFEDGOV merged indexes</w:t>
-            </w:r>
-          </w:p>
-        </w:tc>
-        <w:tc>
-          <w:tcPr/>
-          <w:p>
-            <w:pPr>
-              <w:pStyle w:val="Compact"/>
-            </w:pPr>
-            <w:r>
-              <w:t xml:space="preserve">the row's 14-digit capture timestamp</w:t>
-            </w:r>
-          </w:p>
-        </w:tc>
-        <w:tc>
-          <w:tcPr/>
-          <w:p>
-            <w:pPr>
-              <w:pStyle w:val="Compact"/>
-              <w:jc w:val="right"/>
-            </w:pPr>
-            <w:r>
-              <w:t xml:space="preserve">40,260</w:t>
-            </w:r>
-          </w:p>
-        </w:tc>
-        <w:tc>
-          <w:tcPr/>
-          <w:p>
-            <w:pPr>
-              <w:pStyle w:val="Compact"/>
-              <w:jc w:val="right"/>
-            </w:pPr>
-            <w:r>
-              <w:t xml:space="preserve">39,340</w:t>
-            </w:r>
-          </w:p>
-        </w:tc>
-      </w:tr>
-      <w:tr>
-        <w:tc>
-          <w:tcPr/>
-          <w:p>
-            <w:pPr>
-              <w:pStyle w:val="Compact"/>
-            </w:pPr>
-            <w:r>
-              <w:t xml:space="preserve">RIPE</w:t>
-            </w:r>
-            <w:r>
-              <w:t xml:space="preserve"> </w:t>
-            </w:r>
-            <w:r>
-              <w:rPr>
-                <w:rStyle w:val="VerbatimChar"/>
-              </w:rPr>
-              <w:t xml:space="preserve">nserver:</w:t>
-            </w:r>
-            <w:r>
-              <w:t xml:space="preserve"> </w:t>
-            </w:r>
-            <w:r>
-              <w:t xml:space="preserve">hosts</w:t>
-            </w:r>
-          </w:p>
-        </w:tc>
-        <w:tc>
-          <w:tcPr/>
-          <w:p>
-            <w:pPr>
-              <w:pStyle w:val="Compact"/>
-            </w:pPr>
-            <w:r>
-              <w:t xml:space="preserve">the dump's generation stamp and each object's</w:t>
-            </w:r>
-            <w:r>
-              <w:t xml:space="preserve"> </w:t>
-            </w:r>
-            <w:r>
-              <w:rPr>
-                <w:rStyle w:val="VerbatimChar"/>
-              </w:rPr>
-              <w:t xml:space="preserve">changed:</w:t>
-            </w:r>
-            <w:r>
-              <w:t xml:space="preserve"> </w:t>
-            </w:r>
-            <w:r>
-              <w:t xml:space="preserve">line</w:t>
-            </w:r>
-          </w:p>
-        </w:tc>
-        <w:tc>
-          <w:tcPr/>
-          <w:p>
-            <w:pPr>
-              <w:pStyle w:val="Compact"/>
-              <w:jc w:val="right"/>
-            </w:pPr>
-            <w:r>
-              <w:t xml:space="preserve">49,841</w:t>
-            </w:r>
-          </w:p>
-        </w:tc>
-        <w:tc>
-          <w:tcPr/>
-          <w:p>
-            <w:pPr>
-              <w:pStyle w:val="Compact"/>
-              <w:jc w:val="right"/>
-            </w:pPr>
-            <w:r>
-              <w:t xml:space="preserve">11,780</w:t>
+              <w:t xml:space="preserve">squidGuard and chastity URL blocklists</w:t>
+            </w:r>
+          </w:p>
+        </w:tc>
+        <w:tc>
+          <w:tcPr/>
+          <w:p>
+            <w:pPr>
+              <w:pStyle w:val="Compact"/>
+            </w:pPr>
+            <w:r>
+              <w:t xml:space="preserve">the robot's compile stamp; the tar member's mtime</w:t>
+            </w:r>
+          </w:p>
+        </w:tc>
+        <w:tc>
+          <w:tcPr/>
+          <w:p>
+            <w:pPr>
+              <w:pStyle w:val="Compact"/>
+              <w:jc w:val="right"/>
+            </w:pPr>
+            <w:r>
+              <w:t xml:space="preserve">6,017</w:t>
+            </w:r>
+          </w:p>
+        </w:tc>
+        <w:tc>
+          <w:tcPr/>
+          <w:p>
+            <w:pPr>
+              <w:pStyle w:val="Compact"/>
+              <w:jc w:val="right"/>
+            </w:pPr>
+            <w:r>
+              <w:t xml:space="preserve">2,628</w:t>
             </w:r>
           </w:p>
         </w:tc>
@@ -1434,19 +1409,19 @@
               <w:jc w:val="right"/>
             </w:pPr>
             <w:r>
-              <w:t xml:space="preserve">625,385</w:t>
-            </w:r>
-          </w:p>
-        </w:tc>
-        <w:tc>
-          <w:tcPr/>
-          <w:p>
-            <w:pPr>
-              <w:pStyle w:val="Compact"/>
-              <w:jc w:val="right"/>
-            </w:pPr>
-            <w:r>
-              <w:t xml:space="preserve">329,397.2492</w:t>
+              <w:t xml:space="preserve">623,823</w:t>
+            </w:r>
+          </w:p>
+        </w:tc>
+        <w:tc>
+          <w:tcPr/>
+          <w:p>
+            <w:pPr>
+              <w:pStyle w:val="Compact"/>
+              <w:jc w:val="right"/>
+            </w:pPr>
+            <w:r>
+              <w:t xml:space="preserve">328,847.5752</w:t>
             </w:r>
           </w:p>
         </w:tc>
@@ -1469,13 +1444,7 @@
         <w:t xml:space="preserve"> </w:t>
       </w:r>
       <w:r>
-        <w:t xml:space="preserve">each fetch. On the survey you ruled in writing on 2026-07-24 that a dated DNS survey may enter the</w:t>
-      </w:r>
-      <w:r>
-        <w:t xml:space="preserve"> </w:t>
-      </w:r>
-      <w:r>
-        <w:t xml:space="preserve">annual files directly. Route, licence and per-TLD yield per source are in</w:t>
+        <w:t xml:space="preserve">each fetch. Route, licence and per-TLD yield per source are in</w:t>
       </w:r>
       <w:r>
         <w:t xml:space="preserve"> </w:t>
@@ -1499,28 +1468,52 @@
           <w:b/>
           <w:bCs/>
         </w:rPr>
-        <w:t xml:space="preserve">Two disclosures decide what the hostname half is worth</w:t>
-      </w:r>
-      <w:r>
-        <w:t xml:space="preserve">, each one filter on</w:t>
-      </w:r>
-      <w:r>
-        <w:t xml:space="preserve"> </w:t>
-      </w:r>
-      <w:r>
-        <w:rPr>
-          <w:rStyle w:val="VerbatimChar"/>
-        </w:rPr>
-        <w:t xml:space="preserve">hostnames/hostnames_evidence_manifest.csv</w:t>
-      </w:r>
-      <w:r>
-        <w:t xml:space="preserve">: 65% of the largest source's records</w:t>
-      </w:r>
-      <w:r>
-        <w:t xml:space="preserve"> </w:t>
-      </w:r>
-      <w:r>
-        <w:t xml:space="preserve">are dialup or numbered workstation names (</w:t>
+        <w:t xml:space="preserve">Two things your rule admits and this round does not count.</w:t>
+      </w:r>
+      <w:r>
+        <w:t xml:space="preserve"> </w:t>
+      </w:r>
+      <w:r>
+        <w:t xml:space="preserve">The same one-level-down reading</w:t>
+      </w:r>
+      <w:r>
+        <w:t xml:space="preserve"> </w:t>
+      </w:r>
+      <w:r>
+        <w:t xml:space="preserve">of three DNS artifacts (the ISC Internet Domain Survey host files, RIPE</w:t>
+      </w:r>
+      <w:r>
+        <w:t xml:space="preserve"> </w:t>
+      </w:r>
+      <w:r>
+        <w:rPr>
+          <w:rStyle w:val="VerbatimChar"/>
+        </w:rPr>
+        <w:t xml:space="preserve">nserver:</w:t>
+      </w:r>
+      <w:r>
+        <w:t xml:space="preserve"> </w:t>
+      </w:r>
+      <w:r>
+        <w:t xml:space="preserve">attributes,</w:t>
+      </w:r>
+      <w:r>
+        <w:t xml:space="preserve"> </w:t>
+      </w:r>
+      <w:r>
+        <w:t xml:space="preserve">InterNIC zone NS targets) had written 18,219,285 dated hostname rows, the survey alone exporting as</w:t>
+      </w:r>
+      <w:r>
+        <w:t xml:space="preserve"> </w:t>
+      </w:r>
+      <w:r>
+        <w:t xml:space="preserve">9.17M EE, that pass conditions 1 and 2 and fail 3: two thirds of the survey's names are dialup</w:t>
+      </w:r>
+      <w:r>
+        <w:t xml:space="preserve"> </w:t>
+      </w:r>
+      <w:r>
+        <w:t xml:space="preserve">ports and numbered workstations (</w:t>
       </w:r>
       <w:r>
         <w:rPr>
@@ -1529,19 +1522,52 @@
         <w:t xml:space="preserve">pc50.btbcs.bt.co.uk</w:t>
       </w:r>
       <w:r>
-        <w:t xml:space="preserve">), which answered its reverse-DNS</w:t>
-      </w:r>
-      <w:r>
-        <w:t xml:space="preserve"> </w:t>
-      </w:r>
-      <w:r>
-        <w:t xml:space="preserve">walk in the month it stamps and pass your validity rule but are not sites; and 26.1% of all</w:t>
-      </w:r>
-      <w:r>
-        <w:t xml:space="preserve"> </w:t>
-      </w:r>
-      <w:r>
-        <w:t xml:space="preserve">hostnames are</w:t>
+        <w:t xml:space="preserve">), for which no archived page can exist. They</w:t>
+      </w:r>
+      <w:r>
+        <w:t xml:space="preserve"> </w:t>
+      </w:r>
+      <w:r>
+        <w:t xml:space="preserve">are held out, their rows still date the parents, and the lane is one line to re-enable if you rule</w:t>
+      </w:r>
+      <w:r>
+        <w:t xml:space="preserve"> </w:t>
+      </w:r>
+      <w:r>
+        <w:t xml:space="preserve">that DNS listings count. And 5,162,650</w:t>
+      </w:r>
+      <w:r>
+        <w:t xml:space="preserve"> </w:t>
+      </w:r>
+      <w:r>
+        <w:rPr>
+          <w:rStyle w:val="VerbatimChar"/>
+        </w:rPr>
+        <w:t xml:space="preserve">www.&lt;parent&gt;</w:t>
+      </w:r>
+      <w:r>
+        <w:t xml:space="preserve"> </w:t>
+      </w:r>
+      <w:r>
+        <w:t xml:space="preserve">rows, valid and captured, fail condition 4;</w:t>
+      </w:r>
+      <w:r>
+        <w:t xml:space="preserve"> </w:t>
+      </w:r>
+      <w:r>
+        <w:t xml:space="preserve">their captures date the registrables instead. Your 0902 brief says a domain-wide query may return</w:t>
+      </w:r>
+      <w:r>
+        <w:t xml:space="preserve"> </w:t>
+      </w:r>
+      <w:r>
+        <w:t xml:space="preserve">the base hostname and every qualifying subdomain and that overlap is removed downstream, so this</w:t>
+      </w:r>
+      <w:r>
+        <w:t xml:space="preserve"> </w:t>
+      </w:r>
+      <w:r>
+        <w:t xml:space="preserve">is the one place the round is deliberately narrower than your text: a</w:t>
       </w:r>
       <w:r>
         <w:t xml:space="preserve"> </w:t>
@@ -1556,28 +1582,34 @@
         <w:t xml:space="preserve"> </w:t>
       </w:r>
       <w:r>
-        <w:t xml:space="preserve">forms of registrables you already hold, full weight under the rule as written</w:t>
-      </w:r>
-      <w:r>
-        <w:t xml:space="preserve"> </w:t>
-      </w:r>
-      <w:r>
-        <w:t xml:space="preserve">and nothing if your calculator normalises</w:t>
-      </w:r>
-      <w:r>
-        <w:t xml:space="preserve"> </w:t>
-      </w:r>
-      <w:r>
-        <w:rPr>
-          <w:rStyle w:val="VerbatimChar"/>
-        </w:rPr>
-        <w:t xml:space="preserve">www.</w:t>
-      </w:r>
-      <w:r>
-        <w:t xml:space="preserve"> </w:t>
-      </w:r>
-      <w:r>
-        <w:t xml:space="preserve">away.</w:t>
+        <w:t xml:space="preserve">capture is here read</w:t>
+      </w:r>
+      <w:r>
+        <w:t xml:space="preserve"> </w:t>
+      </w:r>
+      <w:r>
+        <w:t xml:space="preserve">as the registrable's own page, and the rows are recoverable from the evidence with one filter if</w:t>
+      </w:r>
+      <w:r>
+        <w:t xml:space="preserve"> </w:t>
+      </w:r>
+      <w:r>
+        <w:t xml:space="preserve">you want them as records. Both counts are store rows reported by</w:t>
+      </w:r>
+      <w:r>
+        <w:t xml:space="preserve"> </w:t>
+      </w:r>
+      <w:r>
+        <w:rPr>
+          <w:rStyle w:val="VerbatimChar"/>
+        </w:rPr>
+        <w:t xml:space="preserve">apply_hostname_purpose_rule.py</w:t>
+      </w:r>
+      <w:r>
+        <w:t xml:space="preserve"> </w:t>
+      </w:r>
+      <w:r>
+        <w:t xml:space="preserve">on the store as first built.</w:t>
       </w:r>
     </w:p>
     <w:p>
@@ -1621,7 +1653,7 @@
         <w:t xml:space="preserve"> </w:t>
       </w:r>
       <w:r>
-        <w:t xml:space="preserve">foreign key on both units, fifteen invariants enforce it</w:t>
+        <w:t xml:space="preserve">foreign key on both units, seventeen invariants enforce it</w:t>
       </w:r>
       <w:r>
         <w:t xml:space="preserve"> </w:t>
@@ -1648,7 +1680,7 @@
         <w:t xml:space="preserve"> </w:t>
       </w:r>
       <w:r>
-        <w:t xml:space="preserve">the corroboration split, and a creation date attests its own year only. 2,419,436 domains carry</w:t>
+        <w:t xml:space="preserve">the corroboration split, and a creation date attests its own year only. 2,419,012 domains carry</w:t>
       </w:r>
       <w:r>
         <w:t xml:space="preserve"> </w:t>
@@ -1752,7 +1784,7 @@
           <w:b/>
           <w:bCs/>
         </w:rPr>
-        <w:t xml:space="preserve">494 source families searched and recorded</w:t>
+        <w:t xml:space="preserve">495 source families searched and recorded</w:t>
       </w:r>
       <w:r>
         <w:t xml:space="preserve"> </w:t>
@@ -1770,7 +1802,7 @@
         <w:t xml:space="preserve">sources.md</w:t>
       </w:r>
       <w:r>
-        <w:t xml:space="preserve">: 66 developed, 428 evaluated and closed with the measurement that closed them, so the same ground is not broken twice.</w:t>
+        <w:t xml:space="preserve">: 67 developed, 428 evaluated and closed with the measurement that closed them, so the same ground is not broken twice.</w:t>
       </w:r>
     </w:p>
     <w:p>
@@ -1801,25 +1833,31 @@
         <w:t xml:space="preserve"> </w:t>
       </w:r>
       <w:r>
-        <w:t xml:space="preserve">in full and the invariants pass. Eight sources banked that way this round; two parked for a</w:t>
-      </w:r>
-      <w:r>
-        <w:t xml:space="preserve"> </w:t>
-      </w:r>
-      <w:r>
-        <w:t xml:space="preserve">written decision, one on terms and one on a class question. No agent may write the store: a</w:t>
-      </w:r>
-      <w:r>
-        <w:t xml:space="preserve"> </w:t>
-      </w:r>
-      <w:r>
-        <w:t xml:space="preserve">separate admitter re-derives every figure locally first, and two agent-reported figures lost to</w:t>
-      </w:r>
-      <w:r>
-        <w:t xml:space="preserve"> </w:t>
-      </w:r>
-      <w:r>
-        <w:t xml:space="preserve">that check.</w:t>
+        <w:t xml:space="preserve">in full and the invariants pass. Eight sources banked that way this round and two parked for a</w:t>
+      </w:r>
+      <w:r>
+        <w:t xml:space="preserve"> </w:t>
+      </w:r>
+      <w:r>
+        <w:t xml:space="preserve">written decision. No agent may write the store: a separate admitter re-derives every figure</w:t>
+      </w:r>
+      <w:r>
+        <w:t xml:space="preserve"> </w:t>
+      </w:r>
+      <w:r>
+        <w:t xml:space="preserve">locally first, and two agent-reported figures lost to that check. The rule admits on the</w:t>
+      </w:r>
+      <w:r>
+        <w:t xml:space="preserve"> </w:t>
+      </w:r>
+      <w:r>
+        <w:t xml:space="preserve">letter of your standard; the purpose reading in section 2 was a human decision over the result,</w:t>
+      </w:r>
+      <w:r>
+        <w:t xml:space="preserve"> </w:t>
+      </w:r>
+      <w:r>
+        <w:t xml:space="preserve">which is the division of labour intended.</w:t>
       </w:r>
     </w:p>
     <w:p>
@@ -1917,7 +1955,7 @@
         <w:t xml:space="preserve"> </w:t>
       </w:r>
       <w:r>
-        <w:t xml:space="preserve">contributed 92,479 registrable pairs.</w:t>
+        <w:t xml:space="preserve">contributed 92,382 registrable pairs.</w:t>
       </w:r>
     </w:p>
     <w:bookmarkEnd w:id="12"/>
@@ -1941,25 +1979,19 @@
         <w:t xml:space="preserve"> </w:t>
       </w:r>
       <w:r>
-        <w:t xml:space="preserve">and both dating routes therefore err toward omission. The exception is the counting unit itself: a</w:t>
-      </w:r>
-      <w:r>
-        <w:t xml:space="preserve"> </w:t>
-      </w:r>
-      <w:r>
-        <w:t xml:space="preserve">hostname is valid under your rule and a reverse-DNS walk resolves dialup ports as readily as web</w:t>
-      </w:r>
-      <w:r>
-        <w:t xml:space="preserve"> </w:t>
-      </w:r>
-      <w:r>
-        <w:t xml:space="preserve">servers, which is disclosed per source above rather than argued about. The units ship separately, so</w:t>
-      </w:r>
-      <w:r>
-        <w:t xml:space="preserve"> </w:t>
-      </w:r>
-      <w:r>
-        <w:t xml:space="preserve">dropping the hostname files leaves the registrable round intact at 329,397.2492 EE.</w:t>
+        <w:t xml:space="preserve">and both dating routes err toward omission; the purpose reading in section 2 adds a third omission</w:t>
+      </w:r>
+      <w:r>
+        <w:t xml:space="preserve"> </w:t>
+      </w:r>
+      <w:r>
+        <w:t xml:space="preserve">by design, the DNS-listed hosts held out above. The units ship separately, so dropping the hostname</w:t>
+      </w:r>
+      <w:r>
+        <w:t xml:space="preserve"> </w:t>
+      </w:r>
+      <w:r>
+        <w:t xml:space="preserve">files leaves the registrable round intact at 328,847.5752 EE.</w:t>
       </w:r>
     </w:p>
     <w:p>
@@ -1967,13 +1999,31 @@
         <w:pStyle w:val="BodyText"/>
       </w:pPr>
       <w:r>
-        <w:t xml:space="preserve">Worth expanding, in order: the same one-level-down reading of every other banked artifact that names</w:t>
-      </w:r>
-      <w:r>
-        <w:t xml:space="preserve"> </w:t>
-      </w:r>
-      <w:r>
-        <w:t xml:space="preserve">hosts, since DNS, mail and mirror rosters hold hosts a web crawler never fetched; the second-level</w:t>
+        <w:t xml:space="preserve">Worth expanding, in order: the same one-level-down reading of every other capture-bearing or</w:t>
+      </w:r>
+      <w:r>
+        <w:t xml:space="preserve"> </w:t>
+      </w:r>
+      <w:r>
+        <w:t xml:space="preserve">URL-listing artifact already on disk, since a URL list names hosts a domain sweep never reached</w:t>
+      </w:r>
+      <w:r>
+        <w:t xml:space="preserve"> </w:t>
+      </w:r>
+      <w:r>
+        <w:t xml:space="preserve">(the DARTMOUTH-NBER ARCS indexes are sampled and priced in</w:t>
+      </w:r>
+      <w:r>
+        <w:t xml:space="preserve"> </w:t>
+      </w:r>
+      <w:r>
+        <w:rPr>
+          <w:rStyle w:val="VerbatimChar"/>
+        </w:rPr>
+        <w:t xml:space="preserve">key-decisions.md</w:t>
+      </w:r>
+      <w:r>
+        <w:t xml:space="preserve">); the second-level</w:t>
       </w:r>
       <w:r>
         <w:t xml:space="preserve"> </w:t>
@@ -2114,31 +2164,31 @@
               <w:rPr>
                 <w:rStyle w:val="VerbatimChar"/>
               </w:rPr>
-              <w:t xml:space="preserve">merged260901</w:t>
-            </w:r>
-          </w:p>
-        </w:tc>
-        <w:tc>
-          <w:tcPr/>
-          <w:p>
-            <w:pPr>
-              <w:pStyle w:val="Compact"/>
-              <w:jc w:val="right"/>
-            </w:pPr>
-            <w:r>
-              <w:t xml:space="preserve">33,848,926</w:t>
-            </w:r>
-          </w:p>
-        </w:tc>
-        <w:tc>
-          <w:tcPr/>
-          <w:p>
-            <w:pPr>
-              <w:pStyle w:val="Compact"/>
-              <w:jc w:val="right"/>
-            </w:pPr>
-            <w:r>
-              <w:t xml:space="preserve">17,770,588.9026</w:t>
+              <w:t xml:space="preserve">merged260902</w:t>
+            </w:r>
+          </w:p>
+        </w:tc>
+        <w:tc>
+          <w:tcPr/>
+          <w:p>
+            <w:pPr>
+              <w:pStyle w:val="Compact"/>
+              <w:jc w:val="right"/>
+            </w:pPr>
+            <w:r>
+              <w:t xml:space="preserve">36,672,403</w:t>
+            </w:r>
+          </w:p>
+        </w:tc>
+        <w:tc>
+          <w:tcPr/>
+          <w:p>
+            <w:pPr>
+              <w:pStyle w:val="Compact"/>
+              <w:jc w:val="right"/>
+            </w:pPr>
+            <w:r>
+              <w:t xml:space="preserve">19,239,935.8548</w:t>
             </w:r>
           </w:p>
         </w:tc>
@@ -2171,7 +2221,7 @@
                 <w:b/>
                 <w:bCs/>
               </w:rPr>
-              <w:t xml:space="preserve">26,224,274</w:t>
+              <w:t xml:space="preserve">2,541,429</w:t>
             </w:r>
           </w:p>
         </w:tc>
@@ -2187,7 +2237,7 @@
                 <w:b/>
                 <w:bCs/>
               </w:rPr>
-              <w:t xml:space="preserve">13,670,342.8300</w:t>
+              <w:t xml:space="preserve">1,458,263.2088</w:t>
             </w:r>
           </w:p>
         </w:tc>
@@ -2212,19 +2262,19 @@
               <w:jc w:val="right"/>
             </w:pPr>
             <w:r>
-              <w:t xml:space="preserve">60,073,200</w:t>
-            </w:r>
-          </w:p>
-        </w:tc>
-        <w:tc>
-          <w:tcPr/>
-          <w:p>
-            <w:pPr>
-              <w:pStyle w:val="Compact"/>
-              <w:jc w:val="right"/>
-            </w:pPr>
-            <w:r>
-              <w:t xml:space="preserve">31,440,931.7326</w:t>
+              <w:t xml:space="preserve">39,213,832</w:t>
+            </w:r>
+          </w:p>
+        </w:tc>
+        <w:tc>
+          <w:tcPr/>
+          <w:p>
+            <w:pPr>
+              <w:pStyle w:val="Compact"/>
+              <w:jc w:val="right"/>
+            </w:pPr>
+            <w:r>
+              <w:t xml:space="preserve">20,698,199.0636</w:t>
             </w:r>
           </w:p>
         </w:tc>
@@ -2248,7 +2298,7 @@
         <w:t xml:space="preserve">0 records</w:t>
       </w:r>
       <w:r>
-        <w:t xml:space="preserve">, so all 26,224,274 submitted count once, and</w:t>
+        <w:t xml:space="preserve">, so all 2,541,429 submitted count once, and</w:t>
       </w:r>
       <w:r>
         <w:t xml:space="preserve"> </w:t>

</xml_diff>

<commit_message>
Rebuild the .docx and the sendable report from the round 9 report
</commit_message>
<xml_diff>
--- a/docs/report.docx
+++ b/docs/report.docx
@@ -2,13 +2,13 @@
 <file path=word/document.xml><?xml version="1.0" encoding="utf-8"?>
 <w:document xmlns:w="http://schemas.openxmlformats.org/wordprocessingml/2006/main" xmlns:m="http://schemas.openxmlformats.org/officeDocument/2006/math" xmlns:r="http://schemas.openxmlformats.org/officeDocument/2006/relationships" xmlns:o="urn:schemas-microsoft-com:office:office" xmlns:v="urn:schemas-microsoft-com:vml" xmlns:w10="urn:schemas-microsoft-com:office:word" xmlns:a="http://schemas.openxmlformats.org/drawingml/2006/main" xmlns:pic="http://schemas.openxmlformats.org/drawingml/2006/picture" xmlns:wp="http://schemas.openxmlformats.org/drawingml/2006/wordprocessingDrawing">
   <w:body>
-    <w:bookmarkStart w:id="16" w:name="internet-digital-ark-round-8"/>
+    <w:bookmarkStart w:id="15" w:name="internet-digital-ark-round-9"/>
     <w:p>
       <w:pPr>
         <w:pStyle w:val="Heading1"/>
       </w:pPr>
       <w:r>
-        <w:t xml:space="preserve">Internet Digital Ark: round 8</w:t>
+        <w:t xml:space="preserve">Internet Digital Ark: round 9</w:t>
       </w:r>
     </w:p>
     <w:p>
@@ -25,16 +25,16 @@
         <w:rPr>
           <w:rStyle w:val="VerbatimChar"/>
         </w:rPr>
-        <w:t xml:space="preserve">merged260904</w:t>
-      </w:r>
-      <w:r>
-        <w:t xml:space="preserve">. Every figure is generated from the</w:t>
-      </w:r>
-      <w:r>
-        <w:t xml:space="preserve"> </w:t>
-      </w:r>
-      <w:r>
-        <w:t xml:space="preserve">evidence store, so nothing here can disagree with the files beside it. Receipts are in</w:t>
+        <w:t xml:space="preserve">merged260908</w:t>
+      </w:r>
+      <w:r>
+        <w:t xml:space="preserve">. Every figure below is generated from</w:t>
+      </w:r>
+      <w:r>
+        <w:t xml:space="preserve"> </w:t>
+      </w:r>
+      <w:r>
+        <w:t xml:space="preserve">the evidence store, so nothing here can disagree with the files beside it. Receipts are in</w:t>
       </w:r>
       <w:r>
         <w:t xml:space="preserve"> </w:t>
@@ -46,7 +46,7 @@
         <w:t xml:space="preserve">sources.md</w:t>
       </w:r>
       <w:r>
-        <w:t xml:space="preserve">, yields in</w:t>
+        <w:t xml:space="preserve">, yields and failures in</w:t>
       </w:r>
       <w:r>
         <w:t xml:space="preserve"> </w:t>
@@ -112,7 +112,7 @@
               <w:jc w:val="right"/>
             </w:pPr>
             <w:r>
-              <w:t xml:space="preserve">43,235,797</w:t>
+              <w:t xml:space="preserve">65,313,842</w:t>
             </w:r>
           </w:p>
         </w:tc>
@@ -137,7 +137,7 @@
               <w:jc w:val="right"/>
             </w:pPr>
             <w:r>
-              <w:t xml:space="preserve">23,029,472.9274</w:t>
+              <w:t xml:space="preserve">34,887,095.7393</w:t>
             </w:r>
           </w:p>
         </w:tc>
@@ -166,7 +166,7 @@
                 <w:b/>
                 <w:bCs/>
               </w:rPr>
-              <w:t xml:space="preserve">7,834,717</w:t>
+              <w:t xml:space="preserve">3,399,258</w:t>
             </w:r>
             <w:r>
               <w:t xml:space="preserve"> </w:t>
@@ -201,7 +201,7 @@
                 <w:b/>
                 <w:bCs/>
               </w:rPr>
-              <w:t xml:space="preserve">4,322,566.2232</w:t>
+              <w:t xml:space="preserve">1,874,979.2367</w:t>
             </w:r>
           </w:p>
         </w:tc>
@@ -230,7 +230,7 @@
                 <w:b/>
                 <w:bCs/>
               </w:rPr>
-              <w:t xml:space="preserve">18.7697%</w:t>
+              <w:t xml:space="preserve">5.3744%</w:t>
             </w:r>
           </w:p>
         </w:tc>
@@ -241,7 +241,7 @@
         <w:pStyle w:val="BodyText"/>
       </w:pPr>
       <w:r>
-        <w:t xml:space="preserve">94,672 records (61,669.4256 EE) are registrable domains in</w:t>
+        <w:t xml:space="preserve">91,472 records (65,738.2990 EE) are registrable domains in</w:t>
       </w:r>
       <w:r>
         <w:t xml:space="preserve"> </w:t>
@@ -253,13 +253,13 @@
         <w:t xml:space="preserve">additions/</w:t>
       </w:r>
       <w:r>
-        <w:t xml:space="preserve">; 7,740,045 (4,260,896.7976 EE)</w:t>
-      </w:r>
-      <w:r>
-        <w:t xml:space="preserve"> </w:t>
-      </w:r>
-      <w:r>
-        <w:t xml:space="preserve">are valid hostnames beneath them in</w:t>
+        <w:t xml:space="preserve">; 3,308,090 (1,809,240.9377 EE)</w:t>
+      </w:r>
+      <w:r>
+        <w:t xml:space="preserve"> </w:t>
+      </w:r>
+      <w:r>
+        <w:t xml:space="preserve">are hostnames beneath them in</w:t>
       </w:r>
       <w:r>
         <w:t xml:space="preserve"> </w:t>
@@ -271,119 +271,25 @@
         <w:t xml:space="preserve">hostnames/</w:t>
       </w:r>
       <w:r>
-        <w:t xml:space="preserve">. The two are disjoint in every year, neither is in</w:t>
-      </w:r>
-      <w:r>
-        <w:t xml:space="preserve"> </w:t>
-      </w:r>
-      <w:r>
-        <w:t xml:space="preserve">the baseline, your validator rejects none of them, and either set can be merged or discarded whole.</w:t>
-      </w:r>
-    </w:p>
-    <w:p>
-      <w:pPr>
-        <w:pStyle w:val="BodyText"/>
-      </w:pPr>
-      <w:r>
-        <w:rPr>
-          <w:b/>
-          <w:bCs/>
-        </w:rPr>
-        <w:t xml:space="preserve">95.0% of the hostname half is</w:t>
-      </w:r>
-      <w:r>
-        <w:rPr>
-          <w:b/>
-          <w:bCs/>
-        </w:rPr>
-        <w:t xml:space="preserve"> </w:t>
-      </w:r>
-      <w:r>
-        <w:rPr>
-          <w:rStyle w:val="VerbatimChar"/>
-          <w:b/>
-          <w:bCs/>
-        </w:rPr>
-        <w:t xml:space="preserve">www.&lt;a name already in your files for that year&gt;</w:t>
-      </w:r>
-      <w:r>
-        <w:rPr>
-          <w:b/>
-          <w:bCs/>
-        </w:rPr>
-        <w:t xml:space="preserve">.</w:t>
-      </w:r>
-      <w:r>
-        <w:t xml:space="preserve"> </w:t>
-      </w:r>
-      <w:r>
-        <w:t xml:space="preserve">That is</w:t>
-      </w:r>
-      <w:r>
-        <w:t xml:space="preserve"> </w:t>
-      </w:r>
-      <w:r>
-        <w:t xml:space="preserve">stated here rather than left to be found. Each of those records has its own capture of that exact</w:t>
-      </w:r>
-      <w:r>
-        <w:t xml:space="preserve"> </w:t>
-      </w:r>
-      <w:r>
-        <w:t xml:space="preserve">host, never the parent's capture reused, and your III.8 and XI both say a base hostname and a</w:t>
-      </w:r>
-      <w:r>
-        <w:t xml:space="preserve"> </w:t>
-      </w:r>
-      <w:r>
-        <w:t xml:space="preserve">qualifying subdomain may each be a record. We also counted your side:</w:t>
-      </w:r>
-      <w:r>
-        <w:t xml:space="preserve"> </w:t>
-      </w:r>
-      <w:r>
-        <w:rPr>
-          <w:rStyle w:val="VerbatimChar"/>
-        </w:rPr>
-        <w:t xml:space="preserve">merged260904</w:t>
-      </w:r>
-      <w:r>
-        <w:t xml:space="preserve"> </w:t>
-      </w:r>
-      <w:r>
-        <w:t xml:space="preserve">holds 1,450,310</w:t>
-      </w:r>
-      <w:r>
-        <w:t xml:space="preserve"> </w:t>
-      </w:r>
-      <w:r>
-        <w:t xml:space="preserve">names beginning</w:t>
-      </w:r>
-      <w:r>
-        <w:t xml:space="preserve"> </w:t>
-      </w:r>
-      <w:r>
-        <w:rPr>
-          <w:rStyle w:val="VerbatimChar"/>
-        </w:rPr>
-        <w:t xml:space="preserve">www.</w:t>
-      </w:r>
-      <w:r>
-        <w:t xml:space="preserve"> </w:t>
-      </w:r>
-      <w:r>
-        <w:t xml:space="preserve">and 1,221,065 of them have the bare name in the same year file, 114,875 from</w:t>
-      </w:r>
-      <w:r>
-        <w:t xml:space="preserve"> </w:t>
-      </w:r>
-      <w:r>
-        <w:t xml:space="preserve">sources other than us. If you read the rule the other way, dropping the prefix forms is one filter</w:t>
-      </w:r>
-      <w:r>
-        <w:t xml:space="preserve"> </w:t>
-      </w:r>
-      <w:r>
-        <w:t xml:space="preserve">and the registrable round stands at 61,669.4256 EE.</w:t>
+        <w:t xml:space="preserve">. The two are disjoint in every year, neither is in the</w:t>
+      </w:r>
+      <w:r>
+        <w:t xml:space="preserve"> </w:t>
+      </w:r>
+      <w:r>
+        <w:t xml:space="preserve">baseline, your validator rejects none of them, and either set can be merged or discarded whole. The</w:t>
+      </w:r>
+      <w:r>
+        <w:t xml:space="preserve"> </w:t>
+      </w:r>
+      <w:r>
+        <w:t xml:space="preserve">increment covers 85,238 distinct domains, 45,206 of which appear in none of your six files</w:t>
+      </w:r>
+      <w:r>
+        <w:t xml:space="preserve"> </w:t>
+      </w:r>
+      <w:r>
+        <w:t xml:space="preserve">in any year.</w:t>
       </w:r>
     </w:p>
     <w:tbl>
@@ -470,31 +376,31 @@
               <w:jc w:val="right"/>
             </w:pPr>
             <w:r>
-              <w:t xml:space="preserve">2,145</w:t>
-            </w:r>
-          </w:p>
-        </w:tc>
-        <w:tc>
-          <w:tcPr/>
-          <w:p>
-            <w:pPr>
-              <w:pStyle w:val="Compact"/>
-              <w:jc w:val="right"/>
-            </w:pPr>
-            <w:r>
-              <w:t xml:space="preserve">228,154</w:t>
-            </w:r>
-          </w:p>
-        </w:tc>
-        <w:tc>
-          <w:tcPr/>
-          <w:p>
-            <w:pPr>
-              <w:pStyle w:val="Compact"/>
-              <w:jc w:val="right"/>
-            </w:pPr>
-            <w:r>
-              <w:t xml:space="preserve">136,855.3100</w:t>
+              <w:t xml:space="preserve">1,354</w:t>
+            </w:r>
+          </w:p>
+        </w:tc>
+        <w:tc>
+          <w:tcPr/>
+          <w:p>
+            <w:pPr>
+              <w:pStyle w:val="Compact"/>
+              <w:jc w:val="right"/>
+            </w:pPr>
+            <w:r>
+              <w:t xml:space="preserve">6,138</w:t>
+            </w:r>
+          </w:p>
+        </w:tc>
+        <w:tc>
+          <w:tcPr/>
+          <w:p>
+            <w:pPr>
+              <w:pStyle w:val="Compact"/>
+              <w:jc w:val="right"/>
+            </w:pPr>
+            <w:r>
+              <w:t xml:space="preserve">4,706.0329</w:t>
             </w:r>
           </w:p>
         </w:tc>
@@ -519,31 +425,31 @@
               <w:jc w:val="right"/>
             </w:pPr>
             <w:r>
-              <w:t xml:space="preserve">4,642</w:t>
-            </w:r>
-          </w:p>
-        </w:tc>
-        <w:tc>
-          <w:tcPr/>
-          <w:p>
-            <w:pPr>
-              <w:pStyle w:val="Compact"/>
-              <w:jc w:val="right"/>
-            </w:pPr>
-            <w:r>
-              <w:t xml:space="preserve">349,536</w:t>
-            </w:r>
-          </w:p>
-        </w:tc>
-        <w:tc>
-          <w:tcPr/>
-          <w:p>
-            <w:pPr>
-              <w:pStyle w:val="Compact"/>
-              <w:jc w:val="right"/>
-            </w:pPr>
-            <w:r>
-              <w:t xml:space="preserve">208,236.2993</w:t>
+              <w:t xml:space="preserve">4,620</w:t>
+            </w:r>
+          </w:p>
+        </w:tc>
+        <w:tc>
+          <w:tcPr/>
+          <w:p>
+            <w:pPr>
+              <w:pStyle w:val="Compact"/>
+              <w:jc w:val="right"/>
+            </w:pPr>
+            <w:r>
+              <w:t xml:space="preserve">11,473</w:t>
+            </w:r>
+          </w:p>
+        </w:tc>
+        <w:tc>
+          <w:tcPr/>
+          <w:p>
+            <w:pPr>
+              <w:pStyle w:val="Compact"/>
+              <w:jc w:val="right"/>
+            </w:pPr>
+            <w:r>
+              <w:t xml:space="preserve">9,965.1210</w:t>
             </w:r>
           </w:p>
         </w:tc>
@@ -568,31 +474,31 @@
               <w:jc w:val="right"/>
             </w:pPr>
             <w:r>
-              <w:t xml:space="preserve">6,333</w:t>
-            </w:r>
-          </w:p>
-        </w:tc>
-        <w:tc>
-          <w:tcPr/>
-          <w:p>
-            <w:pPr>
-              <w:pStyle w:val="Compact"/>
-              <w:jc w:val="right"/>
-            </w:pPr>
-            <w:r>
-              <w:t xml:space="preserve">1,020,780</w:t>
-            </w:r>
-          </w:p>
-        </w:tc>
-        <w:tc>
-          <w:tcPr/>
-          <w:p>
-            <w:pPr>
-              <w:pStyle w:val="Compact"/>
-              <w:jc w:val="right"/>
-            </w:pPr>
-            <w:r>
-              <w:t xml:space="preserve">571,909.9852</w:t>
+              <w:t xml:space="preserve">5,642</w:t>
+            </w:r>
+          </w:p>
+        </w:tc>
+        <w:tc>
+          <w:tcPr/>
+          <w:p>
+            <w:pPr>
+              <w:pStyle w:val="Compact"/>
+              <w:jc w:val="right"/>
+            </w:pPr>
+            <w:r>
+              <w:t xml:space="preserve">41,452</w:t>
+            </w:r>
+          </w:p>
+        </w:tc>
+        <w:tc>
+          <w:tcPr/>
+          <w:p>
+            <w:pPr>
+              <w:pStyle w:val="Compact"/>
+              <w:jc w:val="right"/>
+            </w:pPr>
+            <w:r>
+              <w:t xml:space="preserve">28,290.1568</w:t>
             </w:r>
           </w:p>
         </w:tc>
@@ -617,31 +523,31 @@
               <w:jc w:val="right"/>
             </w:pPr>
             <w:r>
-              <w:t xml:space="preserve">11,048</w:t>
-            </w:r>
-          </w:p>
-        </w:tc>
-        <w:tc>
-          <w:tcPr/>
-          <w:p>
-            <w:pPr>
-              <w:pStyle w:val="Compact"/>
-              <w:jc w:val="right"/>
-            </w:pPr>
-            <w:r>
-              <w:t xml:space="preserve">1,434,761</w:t>
-            </w:r>
-          </w:p>
-        </w:tc>
-        <w:tc>
-          <w:tcPr/>
-          <w:p>
-            <w:pPr>
-              <w:pStyle w:val="Compact"/>
-              <w:jc w:val="right"/>
-            </w:pPr>
-            <w:r>
-              <w:t xml:space="preserve">796,510.3073</w:t>
+              <w:t xml:space="preserve">19,884</w:t>
+            </w:r>
+          </w:p>
+        </w:tc>
+        <w:tc>
+          <w:tcPr/>
+          <w:p>
+            <w:pPr>
+              <w:pStyle w:val="Compact"/>
+              <w:jc w:val="right"/>
+            </w:pPr>
+            <w:r>
+              <w:t xml:space="preserve">136,285</w:t>
+            </w:r>
+          </w:p>
+        </w:tc>
+        <w:tc>
+          <w:tcPr/>
+          <w:p>
+            <w:pPr>
+              <w:pStyle w:val="Compact"/>
+              <w:jc w:val="right"/>
+            </w:pPr>
+            <w:r>
+              <w:t xml:space="preserve">94,087.1613</w:t>
             </w:r>
           </w:p>
         </w:tc>
@@ -666,31 +572,31 @@
               <w:jc w:val="right"/>
             </w:pPr>
             <w:r>
-              <w:t xml:space="preserve">14,401</w:t>
-            </w:r>
-          </w:p>
-        </w:tc>
-        <w:tc>
-          <w:tcPr/>
-          <w:p>
-            <w:pPr>
-              <w:pStyle w:val="Compact"/>
-              <w:jc w:val="right"/>
-            </w:pPr>
-            <w:r>
-              <w:t xml:space="preserve">1,626,239</w:t>
-            </w:r>
-          </w:p>
-        </w:tc>
-        <w:tc>
-          <w:tcPr/>
-          <w:p>
-            <w:pPr>
-              <w:pStyle w:val="Compact"/>
-              <w:jc w:val="right"/>
-            </w:pPr>
-            <w:r>
-              <w:t xml:space="preserve">908,292.4850</w:t>
+              <w:t xml:space="preserve">20,233</w:t>
+            </w:r>
+          </w:p>
+        </w:tc>
+        <w:tc>
+          <w:tcPr/>
+          <w:p>
+            <w:pPr>
+              <w:pStyle w:val="Compact"/>
+              <w:jc w:val="right"/>
+            </w:pPr>
+            <w:r>
+              <w:t xml:space="preserve">329,152</w:t>
+            </w:r>
+          </w:p>
+        </w:tc>
+        <w:tc>
+          <w:tcPr/>
+          <w:p>
+            <w:pPr>
+              <w:pStyle w:val="Compact"/>
+              <w:jc w:val="right"/>
+            </w:pPr>
+            <w:r>
+              <w:t xml:space="preserve">194,617.8658</w:t>
             </w:r>
           </w:p>
         </w:tc>
@@ -715,31 +621,31 @@
               <w:jc w:val="right"/>
             </w:pPr>
             <w:r>
-              <w:t xml:space="preserve">56,103</w:t>
-            </w:r>
-          </w:p>
-        </w:tc>
-        <w:tc>
-          <w:tcPr/>
-          <w:p>
-            <w:pPr>
-              <w:pStyle w:val="Compact"/>
-              <w:jc w:val="right"/>
-            </w:pPr>
-            <w:r>
-              <w:t xml:space="preserve">3,080,575</w:t>
-            </w:r>
-          </w:p>
-        </w:tc>
-        <w:tc>
-          <w:tcPr/>
-          <w:p>
-            <w:pPr>
-              <w:pStyle w:val="Compact"/>
-              <w:jc w:val="right"/>
-            </w:pPr>
-            <w:r>
-              <w:t xml:space="preserve">1,700,761.8364</w:t>
+              <w:t xml:space="preserve">39,739</w:t>
+            </w:r>
+          </w:p>
+        </w:tc>
+        <w:tc>
+          <w:tcPr/>
+          <w:p>
+            <w:pPr>
+              <w:pStyle w:val="Compact"/>
+              <w:jc w:val="right"/>
+            </w:pPr>
+            <w:r>
+              <w:t xml:space="preserve">2,783,590</w:t>
+            </w:r>
+          </w:p>
+        </w:tc>
+        <w:tc>
+          <w:tcPr/>
+          <w:p>
+            <w:pPr>
+              <w:pStyle w:val="Compact"/>
+              <w:jc w:val="right"/>
+            </w:pPr>
+            <w:r>
+              <w:t xml:space="preserve">1,543,312.8989</w:t>
             </w:r>
           </w:p>
         </w:tc>
@@ -772,7 +678,7 @@
                 <w:b/>
                 <w:bCs/>
               </w:rPr>
-              <w:t xml:space="preserve">94,672</w:t>
+              <w:t xml:space="preserve">91,472</w:t>
             </w:r>
           </w:p>
         </w:tc>
@@ -788,7 +694,7 @@
                 <w:b/>
                 <w:bCs/>
               </w:rPr>
-              <w:t xml:space="preserve">7,740,045</w:t>
+              <w:t xml:space="preserve">3,308,090</w:t>
             </w:r>
           </w:p>
         </w:tc>
@@ -804,7 +710,7 @@
                 <w:b/>
                 <w:bCs/>
               </w:rPr>
-              <w:t xml:space="preserve">4,322,566.2232</w:t>
+              <w:t xml:space="preserve">1,874,979.2367</w:t>
             </w:r>
           </w:p>
         </w:tc>
@@ -815,7 +721,7 @@
         <w:pStyle w:val="BodyText"/>
       </w:pPr>
       <w:r>
-        <w:t xml:space="preserve">Cumulative verified percentage 75.1353%, time-weighted score 13.186902 over the rounds you scored.</w:t>
+        <w:t xml:space="preserve">Cumulative verified percentage 80.5097%, this round counted at its own unverified 5.3744% and round 1 on records rather than equivalent-English. Time-weighted score 18.874694 over the rounds you scored, your own figure used wherever you stated one. This round reads 26.872105 on the benchmark interval and 1.053808 on the assignment interval.</w:t>
       </w:r>
       <w:r>
         <w:t xml:space="preserve"> </w:t>
@@ -825,161 +731,101 @@
           <w:b/>
           <w:bCs/>
         </w:rPr>
-        <w:t xml:space="preserve">Your 0903 t_i change makes this round either 187.697140 or 4.171048</w:t>
-      </w:r>
-      <w:r>
-        <w:t xml:space="preserve"> </w:t>
-      </w:r>
-      <w:r>
-        <w:t xml:space="preserve">(t = 1 on the benchmark interval, t = 45 days on the absolute task-assignment interval). Which do you intend, and does it re-score the awarded rounds?</w:t>
+        <w:t xml:space="preserve">You scored round 8 as 10 x (18.769714 / 33) = 5.687792.</w:t>
+      </w:r>
+      <w:r>
+        <w:t xml:space="preserve"> </w:t>
+      </w:r>
+      <w:r>
+        <w:t xml:space="preserve">We cannot reproduce the 33: the benchmark interval gives t = 1 and the task-assignment interval t = 51 from 2026-07-21, the earliest date our records support. Which date is t_i counted from, and does it re-score the awarded rounds?</w:t>
+      </w:r>
+    </w:p>
+    <w:p>
+      <w:pPr>
+        <w:pStyle w:val="BodyText"/>
+      </w:pPr>
+      <w:r>
+        <w:rPr>
+          <w:b/>
+          <w:bCs/>
+        </w:rPr>
+        <w:t xml:space="preserve">The unit is the one you accepted on 2026-09-05 and has not moved.</w:t>
+      </w:r>
+      <w:r>
+        <w:t xml:space="preserve"> </w:t>
+      </w:r>
+      <w:r>
+        <w:t xml:space="preserve">A hostname record is</w:t>
+      </w:r>
+      <w:r>
+        <w:t xml:space="preserve"> </w:t>
+      </w:r>
+      <w:r>
+        <w:t xml:space="preserve">structurally valid, sits strictly beneath a registrable we hold for that same year, and carries its</w:t>
+      </w:r>
+      <w:r>
+        <w:t xml:space="preserve"> </w:t>
+      </w:r>
+      <w:r>
+        <w:t xml:space="preserve">own machine-written observation of that exact host serving in that year. Per your 2026-09-06 ruling</w:t>
+      </w:r>
+      <w:r>
+        <w:t xml:space="preserve"> </w:t>
+      </w:r>
+      <w:r>
+        <w:t xml:space="preserve">nothing is inferred from a bare name to its</w:t>
+      </w:r>
+      <w:r>
+        <w:t xml:space="preserve"> </w:t>
+      </w:r>
+      <w:r>
+        <w:rPr>
+          <w:rStyle w:val="VerbatimChar"/>
+        </w:rPr>
+        <w:t xml:space="preserve">www.</w:t>
+      </w:r>
+      <w:r>
+        <w:t xml:space="preserve"> </w:t>
+      </w:r>
+      <w:r>
+        <w:t xml:space="preserve">form or back: each record names its own host in</w:t>
+      </w:r>
+      <w:r>
+        <w:t xml:space="preserve"> </w:t>
+      </w:r>
+      <w:r>
+        <w:t xml:space="preserve">its own evidence row, and the invariant</w:t>
+      </w:r>
+      <w:r>
+        <w:t xml:space="preserve"> </w:t>
+      </w:r>
+      <w:r>
+        <w:rPr>
+          <w:rStyle w:val="VerbatimChar"/>
+        </w:rPr>
+        <w:t xml:space="preserve">a_www_record_has_its_own_evidence</w:t>
+      </w:r>
+      <w:r>
+        <w:t xml:space="preserve"> </w:t>
+      </w:r>
+      <w:r>
+        <w:t xml:space="preserve">refuses any that does</w:t>
+      </w:r>
+      <w:r>
+        <w:t xml:space="preserve"> </w:t>
+      </w:r>
+      <w:r>
+        <w:t xml:space="preserve">not.</w:t>
       </w:r>
     </w:p>
     <w:bookmarkEnd w:id="9"/>
-    <w:bookmarkStart w:id="10" w:name="what-one-hostname-record-is"/>
+    <w:bookmarkStart w:id="10" w:name="what-is-new-and-where-it-came-from"/>
     <w:p>
       <w:pPr>
         <w:pStyle w:val="Heading2"/>
       </w:pPr>
       <w:r>
-        <w:t xml:space="preserve">2. What one hostname record is</w:t>
-      </w:r>
-    </w:p>
-    <w:p>
-      <w:pPr>
-        <w:pStyle w:val="FirstParagraph"/>
-      </w:pPr>
-      <w:r>
-        <w:t xml:space="preserve">Three conditions, enforced in code (</w:t>
-      </w:r>
-      <w:r>
-        <w:rPr>
-          <w:rStyle w:val="VerbatimChar"/>
-        </w:rPr>
-        <w:t xml:space="preserve">source/src/ark/hostnames.py</w:t>
-      </w:r>
-      <w:r>
-        <w:t xml:space="preserve">,</w:t>
-      </w:r>
-      <w:r>
-        <w:t xml:space="preserve"> </w:t>
-      </w:r>
-      <w:r>
-        <w:rPr>
-          <w:rStyle w:val="VerbatimChar"/>
-        </w:rPr>
-        <w:t xml:space="preserve">checks.py</w:t>
-      </w:r>
-      <w:r>
-        <w:t xml:space="preserve">), not by convention.</w:t>
-      </w:r>
-    </w:p>
-    <w:p>
-      <w:pPr>
-        <w:pStyle w:val="Compact"/>
-        <w:numPr>
-          <w:ilvl w:val="0"/>
-          <w:numId w:val="1001"/>
-        </w:numPr>
-      </w:pPr>
-      <w:r>
-        <w:rPr>
-          <w:b/>
-          <w:bCs/>
-        </w:rPr>
-        <w:t xml:space="preserve">Valid per your rule</w:t>
-      </w:r>
-      <w:r>
-        <w:t xml:space="preserve">: dot-separated labels, letters, digits and interior hyphens only, ending</w:t>
-      </w:r>
-      <w:r>
-        <w:t xml:space="preserve"> </w:t>
-      </w:r>
-      <w:r>
-        <w:t xml:space="preserve">in an alphabetic TLD label. Underscore names, IP literals and</w:t>
-      </w:r>
-      <w:r>
-        <w:t xml:space="preserve"> </w:t>
-      </w:r>
-      <w:r>
-        <w:rPr>
-          <w:rStyle w:val="VerbatimChar"/>
-        </w:rPr>
-        <w:t xml:space="preserve">in-addr.arpa</w:t>
-      </w:r>
-      <w:r>
-        <w:t xml:space="preserve"> </w:t>
-      </w:r>
-      <w:r>
-        <w:t xml:space="preserve">forms are refused.</w:t>
-      </w:r>
-    </w:p>
-    <w:p>
-      <w:pPr>
-        <w:pStyle w:val="Compact"/>
-        <w:numPr>
-          <w:ilvl w:val="0"/>
-          <w:numId w:val="1001"/>
-        </w:numPr>
-      </w:pPr>
-      <w:r>
-        <w:rPr>
-          <w:b/>
-          <w:bCs/>
-        </w:rPr>
-        <w:t xml:space="preserve">Strictly beneath a registrable we hold for that same year.</w:t>
-      </w:r>
-      <w:r>
-        <w:t xml:space="preserve"> </w:t>
-      </w:r>
-      <w:r>
-        <w:t xml:space="preserve">The parent is a foreign key, a</w:t>
-      </w:r>
-      <w:r>
-        <w:t xml:space="preserve"> </w:t>
-      </w:r>
-      <w:r>
-        <w:t xml:space="preserve">bare registrable is never a hostname record, and no name is counted in both units.</w:t>
-      </w:r>
-    </w:p>
-    <w:p>
-      <w:pPr>
-        <w:pStyle w:val="Compact"/>
-        <w:numPr>
-          <w:ilvl w:val="0"/>
-          <w:numId w:val="1001"/>
-        </w:numPr>
-      </w:pPr>
-      <w:r>
-        <w:rPr>
-          <w:b/>
-          <w:bCs/>
-        </w:rPr>
-        <w:t xml:space="preserve">Its own machine-written observation in that year, showing the host serving web content</w:t>
-      </w:r>
-      <w:r>
-        <w:t xml:space="preserve">: a</w:t>
-      </w:r>
-      <w:r>
-        <w:t xml:space="preserve"> </w:t>
-      </w:r>
-      <w:r>
-        <w:t xml:space="preserve">capture of a URL on it, or a URL listing naming it. A DNS listing proves a machine answered</w:t>
-      </w:r>
-      <w:r>
-        <w:t xml:space="preserve"> </w:t>
-      </w:r>
-      <w:r>
-        <w:t xml:space="preserve">rather than a site, so it dates the parent and writes no hostname record.</w:t>
-      </w:r>
-    </w:p>
-    <w:bookmarkEnd w:id="10"/>
-    <w:bookmarkStart w:id="11" w:name="what-is-new-and-where-it-came-from"/>
-    <w:p>
-      <w:pPr>
-        <w:pStyle w:val="Heading2"/>
-      </w:pPr>
-      <w:r>
-        <w:t xml:space="preserve">3. What is new, and where it came from</w:t>
+        <w:t xml:space="preserve">2. What is new, and where it came from</w:t>
       </w:r>
     </w:p>
     <w:tbl>
@@ -1069,71 +915,6 @@
               <w:rPr>
                 <w:rStyle w:val="VerbatimChar"/>
               </w:rPr>
-              <w:t xml:space="preserve">nypw_timemap_hostgrain</w:t>
-            </w:r>
-            <w:r>
-              <w:t xml:space="preserve">, hostname</w:t>
-            </w:r>
-          </w:p>
-        </w:tc>
-        <w:tc>
-          <w:tcPr/>
-          <w:p>
-            <w:pPr>
-              <w:pStyle w:val="Compact"/>
-            </w:pPr>
-            <w:r>
-              <w:t xml:space="preserve">NYPW TimeMaps (IA, CC BY 4.0), 34 parts held since round 6, re-read at hostname grain</w:t>
-            </w:r>
-          </w:p>
-        </w:tc>
-        <w:tc>
-          <w:tcPr/>
-          <w:p>
-            <w:pPr>
-              <w:pStyle w:val="Compact"/>
-            </w:pPr>
-            <w:r>
-              <w:t xml:space="preserve">the row's own 14-digit capture timestamp</w:t>
-            </w:r>
-          </w:p>
-        </w:tc>
-        <w:tc>
-          <w:tcPr/>
-          <w:p>
-            <w:pPr>
-              <w:pStyle w:val="Compact"/>
-              <w:jc w:val="right"/>
-            </w:pPr>
-            <w:r>
-              <w:t xml:space="preserve">4,721,923</w:t>
-            </w:r>
-          </w:p>
-        </w:tc>
-        <w:tc>
-          <w:tcPr/>
-          <w:p>
-            <w:pPr>
-              <w:pStyle w:val="Compact"/>
-              <w:jc w:val="right"/>
-            </w:pPr>
-            <w:r>
-              <w:t xml:space="preserve">2,413,147</w:t>
-            </w:r>
-          </w:p>
-        </w:tc>
-      </w:tr>
-      <w:tr>
-        <w:tc>
-          <w:tcPr/>
-          <w:p>
-            <w:pPr>
-              <w:pStyle w:val="Compact"/>
-            </w:pPr>
-            <w:r>
-              <w:rPr>
-                <w:rStyle w:val="VerbatimChar"/>
-              </w:rPr>
               <w:t xml:space="preserve">ia_cdx_domain_sweep</w:t>
             </w:r>
             <w:r>
@@ -1163,122 +944,161 @@
               <w:t xml:space="preserve"> </w:t>
             </w:r>
             <w:r>
-              <w:t xml:space="preserve">sweeps of</w:t>
-            </w:r>
-            <w:r>
-              <w:t xml:space="preserve"> </w:t>
-            </w:r>
+              <w:t xml:space="preserve">sweeps, two clients, over parents ranked by the hosts we lack rather than the hosts they have</w:t>
+            </w:r>
+          </w:p>
+        </w:tc>
+        <w:tc>
+          <w:tcPr/>
+          <w:p>
+            <w:pPr>
+              <w:pStyle w:val="Compact"/>
+            </w:pPr>
+            <w:r>
+              <w:t xml:space="preserve">the row's own 14-digit capture timestamp</w:t>
+            </w:r>
+          </w:p>
+        </w:tc>
+        <w:tc>
+          <w:tcPr/>
+          <w:p>
+            <w:pPr>
+              <w:pStyle w:val="Compact"/>
+              <w:jc w:val="right"/>
+            </w:pPr>
+            <w:r>
+              <w:t xml:space="preserve">2,262,861</w:t>
+            </w:r>
+          </w:p>
+        </w:tc>
+        <w:tc>
+          <w:tcPr/>
+          <w:p>
+            <w:pPr>
+              <w:pStyle w:val="Compact"/>
+              <w:jc w:val="right"/>
+            </w:pPr>
+            <w:r>
+              <w:t xml:space="preserve">1,353,286</w:t>
+            </w:r>
+          </w:p>
+        </w:tc>
+      </w:tr>
+      <w:tr>
+        <w:tc>
+          <w:tcPr/>
+          <w:p>
+            <w:pPr>
+              <w:pStyle w:val="Compact"/>
+            </w:pPr>
             <w:r>
               <w:rPr>
                 <w:rStyle w:val="VerbatimChar"/>
               </w:rPr>
-              <w:t xml:space="preserve">.uk</w:t>
+              <w:t xml:space="preserve">usenet_server_written_header</w:t>
+            </w:r>
+            <w:r>
+              <w:t xml:space="preserve">, hostname</w:t>
+            </w:r>
+          </w:p>
+        </w:tc>
+        <w:tc>
+          <w:tcPr/>
+          <w:p>
+            <w:pPr>
+              <w:pStyle w:val="Compact"/>
+            </w:pPr>
+            <w:r>
+              <w:t xml:space="preserve">Usenet spool (IA), already held, re-read for the three headers a NEWS SERVER writes about itself:</w:t>
             </w:r>
             <w:r>
               <w:t xml:space="preserve"> </w:t>
             </w:r>
-            <w:r>
-              <w:t xml:space="preserve">suffixes and subdomain platforms, raw journals</w:t>
-            </w:r>
-          </w:p>
-        </w:tc>
-        <w:tc>
-          <w:tcPr/>
-          <w:p>
-            <w:pPr>
-              <w:pStyle w:val="Compact"/>
-            </w:pPr>
-            <w:r>
-              <w:t xml:space="preserve">the row's own 14-digit capture timestamp</w:t>
-            </w:r>
-          </w:p>
-        </w:tc>
-        <w:tc>
-          <w:tcPr/>
-          <w:p>
-            <w:pPr>
-              <w:pStyle w:val="Compact"/>
-              <w:jc w:val="right"/>
-            </w:pPr>
-            <w:r>
-              <w:t xml:space="preserve">1,000,897</w:t>
-            </w:r>
-          </w:p>
-        </w:tc>
-        <w:tc>
-          <w:tcPr/>
-          <w:p>
-            <w:pPr>
-              <w:pStyle w:val="Compact"/>
-              <w:jc w:val="right"/>
-            </w:pPr>
-            <w:r>
-              <w:t xml:space="preserve">698,944</w:t>
-            </w:r>
-          </w:p>
-        </w:tc>
-      </w:tr>
-      <w:tr>
-        <w:tc>
-          <w:tcPr/>
-          <w:p>
-            <w:pPr>
-              <w:pStyle w:val="Compact"/>
-            </w:pPr>
             <w:r>
               <w:rPr>
                 <w:rStyle w:val="VerbatimChar"/>
               </w:rPr>
-              <w:t xml:space="preserve">early_web_hostgrain</w:t>
-            </w:r>
-            <w:r>
-              <w:t xml:space="preserve">, hostname</w:t>
-            </w:r>
-          </w:p>
-        </w:tc>
-        <w:tc>
-          <w:tcPr/>
-          <w:p>
-            <w:pPr>
-              <w:pStyle w:val="Compact"/>
-            </w:pPr>
-            <w:r>
-              <w:t xml:space="preserve">IA Early Web CDX index, 224 parts held since July, re-read at hostname grain</w:t>
-            </w:r>
-          </w:p>
-        </w:tc>
-        <w:tc>
-          <w:tcPr/>
-          <w:p>
-            <w:pPr>
-              <w:pStyle w:val="Compact"/>
-            </w:pPr>
-            <w:r>
-              <w:t xml:space="preserve">the row's own 14-digit capture timestamp</w:t>
-            </w:r>
-          </w:p>
-        </w:tc>
-        <w:tc>
-          <w:tcPr/>
-          <w:p>
-            <w:pPr>
-              <w:pStyle w:val="Compact"/>
-              <w:jc w:val="right"/>
-            </w:pPr>
-            <w:r>
-              <w:t xml:space="preserve">1,074,009</w:t>
-            </w:r>
-          </w:p>
-        </w:tc>
-        <w:tc>
-          <w:tcPr/>
-          <w:p>
-            <w:pPr>
-              <w:pStyle w:val="Compact"/>
-              <w:jc w:val="right"/>
-            </w:pPr>
-            <w:r>
-              <w:t xml:space="preserve">581,826</w:t>
+              <w:t xml:space="preserve">Path:</w:t>
+            </w:r>
+            <w:r>
+              <w:t xml:space="preserve">,</w:t>
+            </w:r>
+            <w:r>
+              <w:t xml:space="preserve"> </w:t>
+            </w:r>
+            <w:r>
+              <w:rPr>
+                <w:rStyle w:val="VerbatimChar"/>
+              </w:rPr>
+              <w:t xml:space="preserve">X-Trace:</w:t>
+            </w:r>
+            <w:r>
+              <w:t xml:space="preserve"> </w:t>
+            </w:r>
+            <w:r>
+              <w:t xml:space="preserve">and</w:t>
+            </w:r>
+            <w:r>
+              <w:t xml:space="preserve"> </w:t>
+            </w:r>
+            <w:r>
+              <w:rPr>
+                <w:rStyle w:val="VerbatimChar"/>
+              </w:rPr>
+              <w:t xml:space="preserve">NNTP-Posting-Host:</w:t>
+            </w:r>
+            <w:r>
+              <w:t xml:space="preserve">. No sender-supplied field is read</w:t>
+            </w:r>
+          </w:p>
+        </w:tc>
+        <w:tc>
+          <w:tcPr/>
+          <w:p>
+            <w:pPr>
+              <w:pStyle w:val="Compact"/>
+            </w:pPr>
+            <w:r>
+              <w:t xml:space="preserve">the post's own machine-written</w:t>
+            </w:r>
+            <w:r>
+              <w:t xml:space="preserve"> </w:t>
+            </w:r>
+            <w:r>
+              <w:rPr>
+                <w:rStyle w:val="VerbatimChar"/>
+              </w:rPr>
+              <w:t xml:space="preserve">Date:</w:t>
+            </w:r>
+            <w:r>
+              <w:t xml:space="preserve"> </w:t>
+            </w:r>
+            <w:r>
+              <w:t xml:space="preserve">header</w:t>
+            </w:r>
+          </w:p>
+        </w:tc>
+        <w:tc>
+          <w:tcPr/>
+          <w:p>
+            <w:pPr>
+              <w:pStyle w:val="Compact"/>
+              <w:jc w:val="right"/>
+            </w:pPr>
+            <w:r>
+              <w:t xml:space="preserve">736,440</w:t>
+            </w:r>
+          </w:p>
+        </w:tc>
+        <w:tc>
+          <w:tcPr/>
+          <w:p>
+            <w:pPr>
+              <w:pStyle w:val="Compact"/>
+              <w:jc w:val="right"/>
+            </w:pPr>
+            <w:r>
+              <w:t xml:space="preserve">350,946</w:t>
             </w:r>
           </w:p>
         </w:tc>
@@ -1346,19 +1166,360 @@
               <w:jc w:val="right"/>
             </w:pPr>
             <w:r>
-              <w:t xml:space="preserve">940,093</w:t>
-            </w:r>
-          </w:p>
-        </w:tc>
-        <w:tc>
-          <w:tcPr/>
-          <w:p>
-            <w:pPr>
-              <w:pStyle w:val="Compact"/>
-              <w:jc w:val="right"/>
-            </w:pPr>
-            <w:r>
-              <w:t xml:space="preserve">564,855</w:t>
+              <w:t xml:space="preserve">109,258</w:t>
+            </w:r>
+          </w:p>
+        </w:tc>
+        <w:tc>
+          <w:tcPr/>
+          <w:p>
+            <w:pPr>
+              <w:pStyle w:val="Compact"/>
+              <w:jc w:val="right"/>
+            </w:pPr>
+            <w:r>
+              <w:t xml:space="preserve">64,821</w:t>
+            </w:r>
+          </w:p>
+        </w:tc>
+      </w:tr>
+      <w:tr>
+        <w:tc>
+          <w:tcPr/>
+          <w:p>
+            <w:pPr>
+              <w:pStyle w:val="Compact"/>
+            </w:pPr>
+            <w:r>
+              <w:rPr>
+                <w:rStyle w:val="VerbatimChar"/>
+              </w:rPr>
+              <w:t xml:space="preserve">ia_cdx_bulk</w:t>
+            </w:r>
+            <w:r>
+              <w:t xml:space="preserve">, registrable</w:t>
+            </w:r>
+          </w:p>
+        </w:tc>
+        <w:tc>
+          <w:tcPr/>
+          <w:p>
+            <w:pPr>
+              <w:pStyle w:val="Compact"/>
+            </w:pPr>
+            <w:r>
+              <w:t xml:space="preserve">IA CDX per-domain queries over bracketed gaps and the candidate pool</w:t>
+            </w:r>
+          </w:p>
+        </w:tc>
+        <w:tc>
+          <w:tcPr/>
+          <w:p>
+            <w:pPr>
+              <w:pStyle w:val="Compact"/>
+            </w:pPr>
+            <w:r>
+              <w:t xml:space="preserve">the capture timestamp of a URL on that host</w:t>
+            </w:r>
+          </w:p>
+        </w:tc>
+        <w:tc>
+          <w:tcPr/>
+          <w:p>
+            <w:pPr>
+              <w:pStyle w:val="Compact"/>
+              <w:jc w:val="right"/>
+            </w:pPr>
+            <w:r>
+              <w:t xml:space="preserve">30,632</w:t>
+            </w:r>
+          </w:p>
+        </w:tc>
+        <w:tc>
+          <w:tcPr/>
+          <w:p>
+            <w:pPr>
+              <w:pStyle w:val="Compact"/>
+              <w:jc w:val="right"/>
+            </w:pPr>
+            <w:r>
+              <w:t xml:space="preserve">30,239</w:t>
+            </w:r>
+          </w:p>
+        </w:tc>
+      </w:tr>
+      <w:tr>
+        <w:tc>
+          <w:tcPr/>
+          <w:p>
+            <w:pPr>
+              <w:pStyle w:val="Compact"/>
+            </w:pPr>
+            <w:r>
+              <w:rPr>
+                <w:rStyle w:val="VerbatimChar"/>
+              </w:rPr>
+              <w:t xml:space="preserve">usenet_address</w:t>
+            </w:r>
+            <w:r>
+              <w:t xml:space="preserve">, registrable</w:t>
+            </w:r>
+          </w:p>
+        </w:tc>
+        <w:tc>
+          <w:tcPr/>
+          <w:p>
+            <w:pPr>
+              <w:pStyle w:val="Compact"/>
+            </w:pPr>
+            <w:r>
+              <w:t xml:space="preserve">Usenet archives (IA), sender and body addresses</w:t>
+            </w:r>
+          </w:p>
+        </w:tc>
+        <w:tc>
+          <w:tcPr/>
+          <w:p>
+            <w:pPr>
+              <w:pStyle w:val="Compact"/>
+            </w:pPr>
+            <w:r>
+              <w:t xml:space="preserve">the post's</w:t>
+            </w:r>
+            <w:r>
+              <w:t xml:space="preserve"> </w:t>
+            </w:r>
+            <w:r>
+              <w:rPr>
+                <w:rStyle w:val="VerbatimChar"/>
+              </w:rPr>
+              <w:t xml:space="preserve">Date:</w:t>
+            </w:r>
+            <w:r>
+              <w:t xml:space="preserve"> </w:t>
+            </w:r>
+            <w:r>
+              <w:t xml:space="preserve">header, corroborated by a second source</w:t>
+            </w:r>
+          </w:p>
+        </w:tc>
+        <w:tc>
+          <w:tcPr/>
+          <w:p>
+            <w:pPr>
+              <w:pStyle w:val="Compact"/>
+              <w:jc w:val="right"/>
+            </w:pPr>
+            <w:r>
+              <w:t xml:space="preserve">33,288</w:t>
+            </w:r>
+          </w:p>
+        </w:tc>
+        <w:tc>
+          <w:tcPr/>
+          <w:p>
+            <w:pPr>
+              <w:pStyle w:val="Compact"/>
+              <w:jc w:val="right"/>
+            </w:pPr>
+            <w:r>
+              <w:t xml:space="preserve">19,565</w:t>
+            </w:r>
+          </w:p>
+        </w:tc>
+      </w:tr>
+      <w:tr>
+        <w:tc>
+          <w:tcPr/>
+          <w:p>
+            <w:pPr>
+              <w:pStyle w:val="Compact"/>
+            </w:pPr>
+            <w:r>
+              <w:rPr>
+                <w:rStyle w:val="VerbatimChar"/>
+              </w:rPr>
+              <w:t xml:space="preserve">poland_pl_extract_hostgrain</w:t>
+            </w:r>
+            <w:r>
+              <w:t xml:space="preserve">, hostname</w:t>
+            </w:r>
+          </w:p>
+        </w:tc>
+        <w:tc>
+          <w:tcPr/>
+          <w:p>
+            <w:pPr>
+              <w:pStyle w:val="Compact"/>
+            </w:pPr>
+            <w:r>
+              <w:t xml:space="preserve">Poland</w:t>
+            </w:r>
+            <w:r>
+              <w:t xml:space="preserve"> </w:t>
+            </w:r>
+            <w:r>
+              <w:rPr>
+                <w:rStyle w:val="VerbatimChar"/>
+              </w:rPr>
+              <w:t xml:space="preserve">.pl</w:t>
+            </w:r>
+            <w:r>
+              <w:t xml:space="preserve"> </w:t>
+            </w:r>
+            <w:r>
+              <w:t xml:space="preserve">ccTLD extraction 2001-12-31 (IA,</w:t>
+            </w:r>
+            <w:r>
+              <w:t xml:space="preserve"> </w:t>
+            </w:r>
+            <w:r>
+              <w:rPr>
+                <w:rStyle w:val="VerbatimChar"/>
+              </w:rPr>
+              <w:t xml:space="preserve">webdataservices</w:t>
+            </w:r>
+            <w:r>
+              <w:t xml:space="preserve">), 19 item-level CDX indexes, 1.24 GB, each verified against its published sha256 before it was read</w:t>
+            </w:r>
+          </w:p>
+        </w:tc>
+        <w:tc>
+          <w:tcPr/>
+          <w:p>
+            <w:pPr>
+              <w:pStyle w:val="Compact"/>
+            </w:pPr>
+            <w:r>
+              <w:t xml:space="preserve">the row's own 14-digit capture timestamp, from the original URL and never the SURT key</w:t>
+            </w:r>
+          </w:p>
+        </w:tc>
+        <w:tc>
+          <w:tcPr/>
+          <w:p>
+            <w:pPr>
+              <w:pStyle w:val="Compact"/>
+              <w:jc w:val="right"/>
+            </w:pPr>
+            <w:r>
+              <w:t xml:space="preserve">147,649</w:t>
+            </w:r>
+          </w:p>
+        </w:tc>
+        <w:tc>
+          <w:tcPr/>
+          <w:p>
+            <w:pPr>
+              <w:pStyle w:val="Compact"/>
+              <w:jc w:val="right"/>
+            </w:pPr>
+            <w:r>
+              <w:t xml:space="preserve">15,798</w:t>
+            </w:r>
+          </w:p>
+        </w:tc>
+      </w:tr>
+      <w:tr>
+        <w:tc>
+          <w:tcPr/>
+          <w:p>
+            <w:pPr>
+              <w:pStyle w:val="Compact"/>
+            </w:pPr>
+            <w:r>
+              <w:rPr>
+                <w:rStyle w:val="VerbatimChar"/>
+              </w:rPr>
+              <w:t xml:space="preserve">ietf_list_received_by</w:t>
+            </w:r>
+            <w:r>
+              <w:t xml:space="preserve">, hostname</w:t>
+            </w:r>
+          </w:p>
+        </w:tc>
+        <w:tc>
+          <w:tcPr/>
+          <w:p>
+            <w:pPr>
+              <w:pStyle w:val="Compact"/>
+            </w:pPr>
+            <w:r>
+              <w:t xml:space="preserve">IETF mail archive, one raw mbox per list-month,</w:t>
+            </w:r>
+            <w:r>
+              <w:t xml:space="preserve"> </w:t>
+            </w:r>
+            <w:r>
+              <w:rPr>
+                <w:rStyle w:val="VerbatimChar"/>
+              </w:rPr>
+              <w:t xml:space="preserve">ietf-mail-archive/</w:t>
+            </w:r>
+            <w:r>
+              <w:t xml:space="preserve"> </w:t>
+            </w:r>
+            <w:r>
+              <w:t xml:space="preserve">and</w:t>
+            </w:r>
+            <w:r>
+              <w:t xml:space="preserve"> </w:t>
+            </w:r>
+            <w:r>
+              <w:rPr>
+                <w:rStyle w:val="VerbatimChar"/>
+              </w:rPr>
+              <w:t xml:space="preserve">concluded-wg-ietf-mail-archive/</w:t>
+            </w:r>
+          </w:p>
+        </w:tc>
+        <w:tc>
+          <w:tcPr/>
+          <w:p>
+            <w:pPr>
+              <w:pStyle w:val="Compact"/>
+            </w:pPr>
+            <w:r>
+              <w:t xml:space="preserve">the message's</w:t>
+            </w:r>
+            <w:r>
+              <w:t xml:space="preserve"> </w:t>
+            </w:r>
+            <w:r>
+              <w:rPr>
+                <w:rStyle w:val="VerbatimChar"/>
+              </w:rPr>
+              <w:t xml:space="preserve">Date:</w:t>
+            </w:r>
+            <w:r>
+              <w:t xml:space="preserve"> </w:t>
+            </w:r>
+            <w:r>
+              <w:t xml:space="preserve">header, checked against the month the archive filed it under</w:t>
+            </w:r>
+          </w:p>
+        </w:tc>
+        <w:tc>
+          <w:tcPr/>
+          <w:p>
+            <w:pPr>
+              <w:pStyle w:val="Compact"/>
+              <w:jc w:val="right"/>
+            </w:pPr>
+            <w:r>
+              <w:t xml:space="preserve">21,465</w:t>
+            </w:r>
+          </w:p>
+        </w:tc>
+        <w:tc>
+          <w:tcPr/>
+          <w:p>
+            <w:pPr>
+              <w:pStyle w:val="Compact"/>
+              <w:jc w:val="right"/>
+            </w:pPr>
+            <w:r>
+              <w:t xml:space="preserve">11,986</w:t>
             </w:r>
           </w:p>
         </w:tc>
@@ -1388,7 +1549,18 @@
               <w:pStyle w:val="Compact"/>
             </w:pPr>
             <w:r>
-              <w:t xml:space="preserve">see</w:t>
+              <w:t xml:space="preserve">the registrable half of the Usenet body-URL lane, hosts taken only from explicit http, https and ftp URLs in the post body</w:t>
+            </w:r>
+          </w:p>
+        </w:tc>
+        <w:tc>
+          <w:tcPr/>
+          <w:p>
+            <w:pPr>
+              <w:pStyle w:val="Compact"/>
+            </w:pPr>
+            <w:r>
+              <w:t xml:space="preserve">the post's own machine-written</w:t>
             </w:r>
             <w:r>
               <w:t xml:space="preserve"> </w:t>
@@ -1397,42 +1569,37 @@
               <w:rPr>
                 <w:rStyle w:val="VerbatimChar"/>
               </w:rPr>
-              <w:t xml:space="preserve">sources.md</w:t>
-            </w:r>
-          </w:p>
-        </w:tc>
-        <w:tc>
-          <w:tcPr/>
-          <w:p>
-            <w:pPr>
-              <w:pStyle w:val="Compact"/>
-            </w:pPr>
-            <w:r>
-              <w:t xml:space="preserve">the crawl date on the link record</w:t>
-            </w:r>
-          </w:p>
-        </w:tc>
-        <w:tc>
-          <w:tcPr/>
-          <w:p>
-            <w:pPr>
-              <w:pStyle w:val="Compact"/>
-              <w:jc w:val="right"/>
-            </w:pPr>
-            <w:r>
-              <w:t xml:space="preserve">77,764</w:t>
-            </w:r>
-          </w:p>
-        </w:tc>
-        <w:tc>
-          <w:tcPr/>
-          <w:p>
-            <w:pPr>
-              <w:pStyle w:val="Compact"/>
-              <w:jc w:val="right"/>
-            </w:pPr>
-            <w:r>
-              <w:t xml:space="preserve">45,513</w:t>
+              <w:t xml:space="preserve">Date:</w:t>
+            </w:r>
+            <w:r>
+              <w:t xml:space="preserve"> </w:t>
+            </w:r>
+            <w:r>
+              <w:t xml:space="preserve">header</w:t>
+            </w:r>
+          </w:p>
+        </w:tc>
+        <w:tc>
+          <w:tcPr/>
+          <w:p>
+            <w:pPr>
+              <w:pStyle w:val="Compact"/>
+              <w:jc w:val="right"/>
+            </w:pPr>
+            <w:r>
+              <w:t xml:space="preserve">11,418</w:t>
+            </w:r>
+          </w:p>
+        </w:tc>
+        <w:tc>
+          <w:tcPr/>
+          <w:p>
+            <w:pPr>
+              <w:pStyle w:val="Compact"/>
+              <w:jc w:val="right"/>
+            </w:pPr>
+            <w:r>
+              <w:t xml:space="preserve">7,077</w:t>
             </w:r>
           </w:p>
         </w:tc>
@@ -1448,21 +1615,21 @@
               <w:rPr>
                 <w:rStyle w:val="VerbatimChar"/>
               </w:rPr>
-              <w:t xml:space="preserve">ia_cdx_hostnames</w:t>
-            </w:r>
-            <w:r>
-              <w:t xml:space="preserve">, registrable</w:t>
-            </w:r>
-          </w:p>
-        </w:tc>
-        <w:tc>
-          <w:tcPr/>
-          <w:p>
-            <w:pPr>
-              <w:pStyle w:val="Compact"/>
-            </w:pPr>
-            <w:r>
-              <w:t xml:space="preserve">see</w:t>
+              <w:t xml:space="preserve">apache_list_received_by</w:t>
+            </w:r>
+            <w:r>
+              <w:t xml:space="preserve">, hostname</w:t>
+            </w:r>
+          </w:p>
+        </w:tc>
+        <w:tc>
+          <w:tcPr/>
+          <w:p>
+            <w:pPr>
+              <w:pStyle w:val="Compact"/>
+            </w:pPr>
+            <w:r>
+              <w:t xml:space="preserve">Apache mailing-list archive, the same</w:t>
             </w:r>
             <w:r>
               <w:t xml:space="preserve"> </w:t>
@@ -1471,107 +1638,63 @@
               <w:rPr>
                 <w:rStyle w:val="VerbatimChar"/>
               </w:rPr>
-              <w:t xml:space="preserve">sources.md</w:t>
-            </w:r>
-          </w:p>
-        </w:tc>
-        <w:tc>
-          <w:tcPr/>
-          <w:p>
-            <w:pPr>
-              <w:pStyle w:val="Compact"/>
-            </w:pPr>
-            <w:r>
-              <w:t xml:space="preserve">a Wayback capture timestamp</w:t>
-            </w:r>
-          </w:p>
-        </w:tc>
-        <w:tc>
-          <w:tcPr/>
-          <w:p>
-            <w:pPr>
-              <w:pStyle w:val="Compact"/>
-              <w:jc w:val="right"/>
-            </w:pPr>
-            <w:r>
-              <w:t xml:space="preserve">16,778</w:t>
-            </w:r>
-          </w:p>
-        </w:tc>
-        <w:tc>
-          <w:tcPr/>
-          <w:p>
-            <w:pPr>
-              <w:pStyle w:val="Compact"/>
-              <w:jc w:val="right"/>
-            </w:pPr>
-            <w:r>
-              <w:t xml:space="preserve">16,095</w:t>
-            </w:r>
-          </w:p>
-        </w:tc>
-      </w:tr>
-      <w:tr>
-        <w:tc>
-          <w:tcPr/>
-          <w:p>
-            <w:pPr>
-              <w:pStyle w:val="Compact"/>
-            </w:pPr>
+              <w:t xml:space="preserve">Received: ... by &lt;host&gt;</w:t>
+            </w:r>
+            <w:r>
+              <w:t xml:space="preserve"> </w:t>
+            </w:r>
+            <w:r>
+              <w:t xml:space="preserve">clause at a second host</w:t>
+            </w:r>
+          </w:p>
+        </w:tc>
+        <w:tc>
+          <w:tcPr/>
+          <w:p>
+            <w:pPr>
+              <w:pStyle w:val="Compact"/>
+            </w:pPr>
+            <w:r>
+              <w:t xml:space="preserve">the message's</w:t>
+            </w:r>
+            <w:r>
+              <w:t xml:space="preserve"> </w:t>
+            </w:r>
             <w:r>
               <w:rPr>
                 <w:rStyle w:val="VerbatimChar"/>
               </w:rPr>
-              <w:t xml:space="preserve">usfedgov_extract_hostgrain</w:t>
-            </w:r>
-            <w:r>
-              <w:t xml:space="preserve">, hostname</w:t>
-            </w:r>
-          </w:p>
-        </w:tc>
-        <w:tc>
-          <w:tcPr/>
-          <w:p>
-            <w:pPr>
-              <w:pStyle w:val="Compact"/>
-            </w:pPr>
-            <w:r>
-              <w:t xml:space="preserve">IA USFEDGOV-EXTRACT 1996-2001 merged CDX indexes, one capture per host, bulk download</w:t>
-            </w:r>
-          </w:p>
-        </w:tc>
-        <w:tc>
-          <w:tcPr/>
-          <w:p>
-            <w:pPr>
-              <w:pStyle w:val="Compact"/>
-            </w:pPr>
-            <w:r>
-              <w:t xml:space="preserve">the row's own 14-digit capture timestamp</w:t>
-            </w:r>
-          </w:p>
-        </w:tc>
-        <w:tc>
-          <w:tcPr/>
-          <w:p>
-            <w:pPr>
-              <w:pStyle w:val="Compact"/>
-              <w:jc w:val="right"/>
-            </w:pPr>
-            <w:r>
-              <w:t xml:space="preserve">1,219</w:t>
-            </w:r>
-          </w:p>
-        </w:tc>
-        <w:tc>
-          <w:tcPr/>
-          <w:p>
-            <w:pPr>
-              <w:pStyle w:val="Compact"/>
-              <w:jc w:val="right"/>
-            </w:pPr>
-            <w:r>
-              <w:t xml:space="preserve">1,067</w:t>
+              <w:t xml:space="preserve">Date:</w:t>
+            </w:r>
+            <w:r>
+              <w:t xml:space="preserve"> </w:t>
+            </w:r>
+            <w:r>
+              <w:t xml:space="preserve">header, checked against the month the archive filed it under</w:t>
+            </w:r>
+          </w:p>
+        </w:tc>
+        <w:tc>
+          <w:tcPr/>
+          <w:p>
+            <w:pPr>
+              <w:pStyle w:val="Compact"/>
+              <w:jc w:val="right"/>
+            </w:pPr>
+            <w:r>
+              <w:t xml:space="preserve">12,669</w:t>
+            </w:r>
+          </w:p>
+        </w:tc>
+        <w:tc>
+          <w:tcPr/>
+          <w:p>
+            <w:pPr>
+              <w:pStyle w:val="Compact"/>
+              <w:jc w:val="right"/>
+            </w:pPr>
+            <w:r>
+              <w:t xml:space="preserve">7,013</w:t>
             </w:r>
           </w:p>
         </w:tc>
@@ -1587,21 +1710,32 @@
               <w:rPr>
                 <w:rStyle w:val="VerbatimChar"/>
               </w:rPr>
-              <w:t xml:space="preserve">maillist_body_url</w:t>
-            </w:r>
-            <w:r>
-              <w:t xml:space="preserve">, hostname</w:t>
-            </w:r>
-          </w:p>
-        </w:tc>
-        <w:tc>
-          <w:tcPr/>
-          <w:p>
-            <w:pPr>
-              <w:pStyle w:val="Compact"/>
-            </w:pPr>
-            <w:r>
-              <w:t xml:space="preserve">see</w:t>
+              <w:t xml:space="preserve">usenet_bare</w:t>
+            </w:r>
+            <w:r>
+              <w:t xml:space="preserve">, registrable</w:t>
+            </w:r>
+          </w:p>
+        </w:tc>
+        <w:tc>
+          <w:tcPr/>
+          <w:p>
+            <w:pPr>
+              <w:pStyle w:val="Compact"/>
+            </w:pPr>
+            <w:r>
+              <w:t xml:space="preserve">Usenet archives (IA), bare hostnames in bodies</w:t>
+            </w:r>
+          </w:p>
+        </w:tc>
+        <w:tc>
+          <w:tcPr/>
+          <w:p>
+            <w:pPr>
+              <w:pStyle w:val="Compact"/>
+            </w:pPr>
+            <w:r>
+              <w:t xml:space="preserve">the post's</w:t>
             </w:r>
             <w:r>
               <w:t xml:space="preserve"> </w:t>
@@ -1610,42 +1744,37 @@
               <w:rPr>
                 <w:rStyle w:val="VerbatimChar"/>
               </w:rPr>
-              <w:t xml:space="preserve">sources.md</w:t>
-            </w:r>
-          </w:p>
-        </w:tc>
-        <w:tc>
-          <w:tcPr/>
-          <w:p>
-            <w:pPr>
-              <w:pStyle w:val="Compact"/>
-            </w:pPr>
-            <w:r>
-              <w:t xml:space="preserve">a Wayback capture timestamp</w:t>
-            </w:r>
-          </w:p>
-        </w:tc>
-        <w:tc>
-          <w:tcPr/>
-          <w:p>
-            <w:pPr>
-              <w:pStyle w:val="Compact"/>
-              <w:jc w:val="right"/>
-            </w:pPr>
-            <w:r>
-              <w:t xml:space="preserve">1,893</w:t>
-            </w:r>
-          </w:p>
-        </w:tc>
-        <w:tc>
-          <w:tcPr/>
-          <w:p>
-            <w:pPr>
-              <w:pStyle w:val="Compact"/>
-              <w:jc w:val="right"/>
-            </w:pPr>
-            <w:r>
-              <w:t xml:space="preserve">1,051</w:t>
+              <w:t xml:space="preserve">Date:</w:t>
+            </w:r>
+            <w:r>
+              <w:t xml:space="preserve"> </w:t>
+            </w:r>
+            <w:r>
+              <w:t xml:space="preserve">header, corroborated by a second source</w:t>
+            </w:r>
+          </w:p>
+        </w:tc>
+        <w:tc>
+          <w:tcPr/>
+          <w:p>
+            <w:pPr>
+              <w:pStyle w:val="Compact"/>
+              <w:jc w:val="right"/>
+            </w:pPr>
+            <w:r>
+              <w:t xml:space="preserve">7,520</w:t>
+            </w:r>
+          </w:p>
+        </w:tc>
+        <w:tc>
+          <w:tcPr/>
+          <w:p>
+            <w:pPr>
+              <w:pStyle w:val="Compact"/>
+              <w:jc w:val="right"/>
+            </w:pPr>
+            <w:r>
+              <w:t xml:space="preserve">4,875</w:t>
             </w:r>
           </w:p>
         </w:tc>
@@ -1658,7 +1787,232 @@
               <w:pStyle w:val="Compact"/>
             </w:pPr>
             <w:r>
-              <w:t xml:space="preserve">2 further sources</w:t>
+              <w:rPr>
+                <w:rStyle w:val="VerbatimChar"/>
+              </w:rPr>
+              <w:t xml:space="preserve">arquivo_ia_cdxj_hostgrain</w:t>
+            </w:r>
+            <w:r>
+              <w:t xml:space="preserve">, hostname</w:t>
+            </w:r>
+          </w:p>
+        </w:tc>
+        <w:tc>
+          <w:tcPr/>
+          <w:p>
+            <w:pPr>
+              <w:pStyle w:val="Compact"/>
+            </w:pPr>
+            <w:r>
+              <w:t xml:space="preserve">Arquivo.pt</w:t>
+            </w:r>
+            <w:r>
+              <w:t xml:space="preserve"> </w:t>
+            </w:r>
+            <w:r>
+              <w:rPr>
+                <w:rStyle w:val="VerbatimChar"/>
+              </w:rPr>
+              <w:t xml:space="preserve">IA.cdxj</w:t>
+            </w:r>
+            <w:r>
+              <w:t xml:space="preserve"> </w:t>
+            </w:r>
+            <w:r>
+              <w:t xml:space="preserve">capture index, held since 2026-08, re-read at hostname grain</w:t>
+            </w:r>
+          </w:p>
+        </w:tc>
+        <w:tc>
+          <w:tcPr/>
+          <w:p>
+            <w:pPr>
+              <w:pStyle w:val="Compact"/>
+            </w:pPr>
+            <w:r>
+              <w:t xml:space="preserve">the row's own 14-digit capture timestamp</w:t>
+            </w:r>
+          </w:p>
+        </w:tc>
+        <w:tc>
+          <w:tcPr/>
+          <w:p>
+            <w:pPr>
+              <w:pStyle w:val="Compact"/>
+              <w:jc w:val="right"/>
+            </w:pPr>
+            <w:r>
+              <w:t xml:space="preserve">16,366</w:t>
+            </w:r>
+          </w:p>
+        </w:tc>
+        <w:tc>
+          <w:tcPr/>
+          <w:p>
+            <w:pPr>
+              <w:pStyle w:val="Compact"/>
+              <w:jc w:val="right"/>
+            </w:pPr>
+            <w:r>
+              <w:t xml:space="preserve">4,144</w:t>
+            </w:r>
+          </w:p>
+        </w:tc>
+      </w:tr>
+      <w:tr>
+        <w:tc>
+          <w:tcPr/>
+          <w:p>
+            <w:pPr>
+              <w:pStyle w:val="Compact"/>
+            </w:pPr>
+            <w:r>
+              <w:rPr>
+                <w:rStyle w:val="VerbatimChar"/>
+              </w:rPr>
+              <w:t xml:space="preserve">usenet_header_fqdn_hostnames</w:t>
+            </w:r>
+            <w:r>
+              <w:t xml:space="preserve">, registrable</w:t>
+            </w:r>
+          </w:p>
+        </w:tc>
+        <w:tc>
+          <w:tcPr/>
+          <w:p>
+            <w:pPr>
+              <w:pStyle w:val="Compact"/>
+            </w:pPr>
+            <w:r>
+              <w:t xml:space="preserve">the registrable half of the Usenet server-header lane above</w:t>
+            </w:r>
+          </w:p>
+        </w:tc>
+        <w:tc>
+          <w:tcPr/>
+          <w:p>
+            <w:pPr>
+              <w:pStyle w:val="Compact"/>
+            </w:pPr>
+            <w:r>
+              <w:t xml:space="preserve">the post's own machine-written</w:t>
+            </w:r>
+            <w:r>
+              <w:t xml:space="preserve"> </w:t>
+            </w:r>
+            <w:r>
+              <w:rPr>
+                <w:rStyle w:val="VerbatimChar"/>
+              </w:rPr>
+              <w:t xml:space="preserve">Date:</w:t>
+            </w:r>
+            <w:r>
+              <w:t xml:space="preserve"> </w:t>
+            </w:r>
+            <w:r>
+              <w:t xml:space="preserve">header</w:t>
+            </w:r>
+          </w:p>
+        </w:tc>
+        <w:tc>
+          <w:tcPr/>
+          <w:p>
+            <w:pPr>
+              <w:pStyle w:val="Compact"/>
+              <w:jc w:val="right"/>
+            </w:pPr>
+            <w:r>
+              <w:t xml:space="preserve">5,828</w:t>
+            </w:r>
+          </w:p>
+        </w:tc>
+        <w:tc>
+          <w:tcPr/>
+          <w:p>
+            <w:pPr>
+              <w:pStyle w:val="Compact"/>
+              <w:jc w:val="right"/>
+            </w:pPr>
+            <w:r>
+              <w:t xml:space="preserve">3,027</w:t>
+            </w:r>
+          </w:p>
+        </w:tc>
+      </w:tr>
+      <w:tr>
+        <w:tc>
+          <w:tcPr/>
+          <w:p>
+            <w:pPr>
+              <w:pStyle w:val="Compact"/>
+            </w:pPr>
+            <w:r>
+              <w:rPr>
+                <w:rStyle w:val="VerbatimChar"/>
+              </w:rPr>
+              <w:t xml:space="preserve">ia_cdx_gap_hostgrain</w:t>
+            </w:r>
+            <w:r>
+              <w:t xml:space="preserve">, hostname</w:t>
+            </w:r>
+          </w:p>
+        </w:tc>
+        <w:tc>
+          <w:tcPr/>
+          <w:p>
+            <w:pPr>
+              <w:pStyle w:val="Compact"/>
+            </w:pPr>
+            <w:r>
+              <w:t xml:space="preserve">IA CDX queries over bracketed year gaps, read at hostname grain</w:t>
+            </w:r>
+          </w:p>
+        </w:tc>
+        <w:tc>
+          <w:tcPr/>
+          <w:p>
+            <w:pPr>
+              <w:pStyle w:val="Compact"/>
+            </w:pPr>
+            <w:r>
+              <w:t xml:space="preserve">the row's own 14-digit capture timestamp</w:t>
+            </w:r>
+          </w:p>
+        </w:tc>
+        <w:tc>
+          <w:tcPr/>
+          <w:p>
+            <w:pPr>
+              <w:pStyle w:val="Compact"/>
+              <w:jc w:val="right"/>
+            </w:pPr>
+            <w:r>
+              <w:t xml:space="preserve">1,382</w:t>
+            </w:r>
+          </w:p>
+        </w:tc>
+        <w:tc>
+          <w:tcPr/>
+          <w:p>
+            <w:pPr>
+              <w:pStyle w:val="Compact"/>
+              <w:jc w:val="right"/>
+            </w:pPr>
+            <w:r>
+              <w:t xml:space="preserve">1,248</w:t>
+            </w:r>
+          </w:p>
+        </w:tc>
+      </w:tr>
+      <w:tr>
+        <w:tc>
+          <w:tcPr/>
+          <w:p>
+            <w:pPr>
+              <w:pStyle w:val="Compact"/>
+            </w:pPr>
+            <w:r>
+              <w:t xml:space="preserve">7 further sources</w:t>
             </w:r>
           </w:p>
         </w:tc>
@@ -1698,19 +2052,19 @@
               <w:jc w:val="right"/>
             </w:pPr>
             <w:r>
-              <w:t xml:space="preserve">141</w:t>
-            </w:r>
-          </w:p>
-        </w:tc>
-        <w:tc>
-          <w:tcPr/>
-          <w:p>
-            <w:pPr>
-              <w:pStyle w:val="Compact"/>
-              <w:jc w:val="right"/>
-            </w:pPr>
-            <w:r>
-              <w:t xml:space="preserve">68</w:t>
+              <w:t xml:space="preserve">2,786</w:t>
+            </w:r>
+          </w:p>
+        </w:tc>
+        <w:tc>
+          <w:tcPr/>
+          <w:p>
+            <w:pPr>
+              <w:pStyle w:val="Compact"/>
+              <w:jc w:val="right"/>
+            </w:pPr>
+            <w:r>
+              <w:t xml:space="preserve">1,249</w:t>
             </w:r>
           </w:p>
         </w:tc>
@@ -1759,7 +2113,7 @@
                 <w:b/>
                 <w:bCs/>
               </w:rPr>
-              <w:t xml:space="preserve">7,834,717</w:t>
+              <w:t xml:space="preserve">3,399,562</w:t>
             </w:r>
           </w:p>
         </w:tc>
@@ -1775,7 +2129,7 @@
                 <w:b/>
                 <w:bCs/>
               </w:rPr>
-              <w:t xml:space="preserve">4,322,566</w:t>
+              <w:t xml:space="preserve">1,875,273</w:t>
             </w:r>
           </w:p>
         </w:tc>
@@ -1786,31 +2140,300 @@
         <w:pStyle w:val="BodyText"/>
       </w:pPr>
       <w:r>
-        <w:t xml:space="preserve">Every stamp above is machine-written and inside the artifact, so no human judgement dates a year.</w:t>
-      </w:r>
-      <w:r>
-        <w:t xml:space="preserve"> </w:t>
-      </w:r>
-      <w:r>
-        <w:t xml:space="preserve">2,353,788 domains carry no in-window evidence, ship as</w:t>
-      </w:r>
-      <w:r>
-        <w:t xml:space="preserve"> </w:t>
+        <w:t xml:space="preserve">The table counts every record submitted; the increment in section 1 is smaller because it excludes</w:t>
+      </w:r>
+      <w:r>
+        <w:t xml:space="preserve"> </w:t>
+      </w:r>
+      <w:r>
+        <w:t xml:space="preserve">the few your baseline already holds, which section 5 counts. Every stamp above is machine-written</w:t>
+      </w:r>
+      <w:r>
+        <w:t xml:space="preserve"> </w:t>
+      </w:r>
+      <w:r>
+        <w:t xml:space="preserve">and inside the artifact, so no human judgement dates a year. Three routes carry the round, and each</w:t>
+      </w:r>
+      <w:r>
+        <w:t xml:space="preserve"> </w:t>
+      </w:r>
+      <w:r>
+        <w:t xml:space="preserve">answers "how do you know it existed that year" differently:</w:t>
+      </w:r>
+    </w:p>
+    <w:p>
+      <w:pPr>
+        <w:pStyle w:val="Compact"/>
+        <w:numPr>
+          <w:ilvl w:val="0"/>
+          <w:numId w:val="1001"/>
+        </w:numPr>
+      </w:pPr>
+      <w:r>
+        <w:rPr>
+          <w:b/>
+          <w:bCs/>
+        </w:rPr>
+        <w:t xml:space="preserve">a capture index</w:t>
+      </w:r>
+      <w:r>
+        <w:t xml:space="preserve"> </w:t>
+      </w:r>
+      <w:r>
+        <w:t xml:space="preserve">(</w:t>
       </w:r>
       <w:r>
         <w:rPr>
           <w:rStyle w:val="VerbatimChar"/>
         </w:rPr>
-        <w:t xml:space="preserve">candidates.txt</w:t>
-      </w:r>
-      <w:r>
-        <w:t xml:space="preserve">, and reach no annual</w:t>
-      </w:r>
-      <w:r>
-        <w:t xml:space="preserve"> </w:t>
-      </w:r>
-      <w:r>
-        <w:t xml:space="preserve">file.</w:t>
+        <w:t xml:space="preserve">ia_cdx_domain_sweep</w:t>
+      </w:r>
+      <w:r>
+        <w:t xml:space="preserve">,</w:t>
+      </w:r>
+      <w:r>
+        <w:t xml:space="preserve"> </w:t>
+      </w:r>
+      <w:r>
+        <w:rPr>
+          <w:rStyle w:val="VerbatimChar"/>
+        </w:rPr>
+        <w:t xml:space="preserve">poland_pl_extract_hostgrain</w:t>
+      </w:r>
+      <w:r>
+        <w:t xml:space="preserve">,</w:t>
+      </w:r>
+      <w:r>
+        <w:t xml:space="preserve"> </w:t>
+      </w:r>
+      <w:r>
+        <w:rPr>
+          <w:rStyle w:val="VerbatimChar"/>
+        </w:rPr>
+        <w:t xml:space="preserve">arquivo_ia_cdxj_hostgrain</w:t>
+      </w:r>
+      <w:r>
+        <w:t xml:space="preserve">): the row's own 14-digit capture timestamp on a URL on that exact</w:t>
+      </w:r>
+      <w:r>
+        <w:t xml:space="preserve"> </w:t>
+      </w:r>
+      <w:r>
+        <w:t xml:space="preserve">host, 2xx or 3xx only.</w:t>
+      </w:r>
+    </w:p>
+    <w:p>
+      <w:pPr>
+        <w:pStyle w:val="Compact"/>
+        <w:numPr>
+          <w:ilvl w:val="0"/>
+          <w:numId w:val="1001"/>
+        </w:numPr>
+      </w:pPr>
+      <w:r>
+        <w:rPr>
+          <w:b/>
+          <w:bCs/>
+        </w:rPr>
+        <w:t xml:space="preserve">a server writing its own name</w:t>
+      </w:r>
+      <w:r>
+        <w:t xml:space="preserve"> </w:t>
+      </w:r>
+      <w:r>
+        <w:t xml:space="preserve">(</w:t>
+      </w:r>
+      <w:r>
+        <w:rPr>
+          <w:rStyle w:val="VerbatimChar"/>
+        </w:rPr>
+        <w:t xml:space="preserve">usenet_server_written_header</w:t>
+      </w:r>
+      <w:r>
+        <w:t xml:space="preserve">,</w:t>
+      </w:r>
+      <w:r>
+        <w:t xml:space="preserve"> </w:t>
+      </w:r>
+      <w:r>
+        <w:rPr>
+          <w:rStyle w:val="VerbatimChar"/>
+        </w:rPr>
+        <w:t xml:space="preserve">ietf_list_received_by</w:t>
+      </w:r>
+      <w:r>
+        <w:t xml:space="preserve">,</w:t>
+      </w:r>
+      <w:r>
+        <w:t xml:space="preserve"> </w:t>
+      </w:r>
+      <w:r>
+        <w:rPr>
+          <w:rStyle w:val="VerbatimChar"/>
+        </w:rPr>
+        <w:t xml:space="preserve">apache_list_received_by</w:t>
+      </w:r>
+      <w:r>
+        <w:t xml:space="preserve">): the</w:t>
+      </w:r>
+      <w:r>
+        <w:t xml:space="preserve"> </w:t>
+      </w:r>
+      <w:r>
+        <w:rPr>
+          <w:rStyle w:val="VerbatimChar"/>
+        </w:rPr>
+        <w:t xml:space="preserve">Received: ... by &lt;host&gt;</w:t>
+      </w:r>
+      <w:r>
+        <w:t xml:space="preserve"> </w:t>
+      </w:r>
+      <w:r>
+        <w:t xml:space="preserve">clause a receiving mail server writes</w:t>
+      </w:r>
+      <w:r>
+        <w:t xml:space="preserve"> </w:t>
+      </w:r>
+      <w:r>
+        <w:t xml:space="preserve">about itself, and its Usenet equivalents, dated by the message's own RFC 822</w:t>
+      </w:r>
+      <w:r>
+        <w:t xml:space="preserve"> </w:t>
+      </w:r>
+      <w:r>
+        <w:rPr>
+          <w:rStyle w:val="VerbatimChar"/>
+        </w:rPr>
+        <w:t xml:space="preserve">Date:</w:t>
+      </w:r>
+      <w:r>
+        <w:t xml:space="preserve"> </w:t>
+      </w:r>
+      <w:r>
+        <w:t xml:space="preserve">header</w:t>
+      </w:r>
+      <w:r>
+        <w:t xml:space="preserve"> </w:t>
+      </w:r>
+      <w:r>
+        <w:t xml:space="preserve">cross-checked against the month the archive filed it under. Section 3.</w:t>
+      </w:r>
+    </w:p>
+    <w:p>
+      <w:pPr>
+        <w:pStyle w:val="Compact"/>
+        <w:numPr>
+          <w:ilvl w:val="0"/>
+          <w:numId w:val="1001"/>
+        </w:numPr>
+      </w:pPr>
+      <w:r>
+        <w:rPr>
+          <w:b/>
+          <w:bCs/>
+        </w:rPr>
+        <w:t xml:space="preserve">a URL a person typed</w:t>
+      </w:r>
+      <w:r>
+        <w:t xml:space="preserve"> </w:t>
+      </w:r>
+      <w:r>
+        <w:t xml:space="preserve">(</w:t>
+      </w:r>
+      <w:r>
+        <w:rPr>
+          <w:rStyle w:val="VerbatimChar"/>
+        </w:rPr>
+        <w:t xml:space="preserve">usenet_body_url</w:t>
+      </w:r>
+      <w:r>
+        <w:t xml:space="preserve">): an explicit http, https or ftp URL in a post body,</w:t>
+      </w:r>
+      <w:r>
+        <w:t xml:space="preserve"> </w:t>
+      </w:r>
+      <w:r>
+        <w:t xml:space="preserve">dated by the post's own</w:t>
+      </w:r>
+      <w:r>
+        <w:t xml:space="preserve"> </w:t>
+      </w:r>
+      <w:r>
+        <w:rPr>
+          <w:rStyle w:val="VerbatimChar"/>
+        </w:rPr>
+        <w:t xml:space="preserve">Date:</w:t>
+      </w:r>
+      <w:r>
+        <w:t xml:space="preserve"> </w:t>
+      </w:r>
+      <w:r>
+        <w:t xml:space="preserve">header.</w:t>
+      </w:r>
+    </w:p>
+    <w:p>
+      <w:pPr>
+        <w:pStyle w:val="FirstParagraph"/>
+      </w:pPr>
+      <w:r>
+        <w:rPr>
+          <w:b/>
+          <w:bCs/>
+        </w:rPr>
+        <w:t xml:space="preserve">21.9% of the hostname half is a</w:t>
+      </w:r>
+      <w:r>
+        <w:rPr>
+          <w:b/>
+          <w:bCs/>
+        </w:rPr>
+        <w:t xml:space="preserve"> </w:t>
+      </w:r>
+      <w:r>
+        <w:rPr>
+          <w:rStyle w:val="VerbatimChar"/>
+          <w:b/>
+          <w:bCs/>
+        </w:rPr>
+        <w:t xml:space="preserve">www.</w:t>
+      </w:r>
+      <w:r>
+        <w:rPr>
+          <w:b/>
+          <w:bCs/>
+        </w:rPr>
+        <w:t xml:space="preserve"> </w:t>
+      </w:r>
+      <w:r>
+        <w:rPr>
+          <w:b/>
+          <w:bCs/>
+        </w:rPr>
+        <w:t xml:space="preserve">form, against 95.0% last round.</w:t>
+      </w:r>
+      <w:r>
+        <w:t xml:space="preserve"> </w:t>
+      </w:r>
+      <w:r>
+        <w:t xml:space="preserve">The fall is a</w:t>
+      </w:r>
+      <w:r>
+        <w:t xml:space="preserve"> </w:t>
+      </w:r>
+      <w:r>
+        <w:t xml:space="preserve">consequence of the second route rather than a filter: a mail relay or a news server is not named</w:t>
+      </w:r>
+      <w:r>
+        <w:t xml:space="preserve"> </w:t>
+      </w:r>
+      <w:r>
+        <w:rPr>
+          <w:rStyle w:val="VerbatimChar"/>
+        </w:rPr>
+        <w:t xml:space="preserve">www</w:t>
+      </w:r>
+      <w:r>
+        <w:t xml:space="preserve">, so this round's names are mostly ones your files could not already hold under another shape.</w:t>
       </w:r>
     </w:p>
     <w:p>
@@ -1822,25 +2445,19 @@
           <w:b/>
           <w:bCs/>
         </w:rPr>
-        <w:t xml:space="preserve">The methodological finding of this round, which we think transfers.</w:t>
-      </w:r>
-      <w:r>
-        <w:t xml:space="preserve"> </w:t>
-      </w:r>
-      <w:r>
-        <w:t xml:space="preserve">Reading a bulk corpus at</w:t>
-      </w:r>
-      <w:r>
-        <w:t xml:space="preserve"> </w:t>
-      </w:r>
-      <w:r>
-        <w:t xml:space="preserve">hostname grain pays only where a person typed the host, not where a crawler visited it: a CDX index</w:t>
-      </w:r>
-      <w:r>
-        <w:t xml:space="preserve"> </w:t>
-      </w:r>
-      <w:r>
-        <w:t xml:space="preserve">re-read one level down is 99.5% to 100.0% the crawler's own</w:t>
+        <w:t xml:space="preserve">Annual and candidate contributions, separately, as your section XI asks.</w:t>
+      </w:r>
+      <w:r>
+        <w:t xml:space="preserve"> </w:t>
+      </w:r>
+      <w:r>
+        <w:t xml:space="preserve">The five fields above</w:t>
+      </w:r>
+      <w:r>
+        <w:t xml:space="preserve"> </w:t>
+      </w:r>
+      <w:r>
+        <w:t xml:space="preserve">are annual records only. Beside them, 2,279,755 domains carry no in-window evidence, ship as</w:t>
       </w:r>
       <w:r>
         <w:t xml:space="preserve"> </w:t>
@@ -1849,19 +2466,10 @@
         <w:rPr>
           <w:rStyle w:val="VerbatimChar"/>
         </w:rPr>
-        <w:t xml:space="preserve">www.</w:t>
-      </w:r>
-      <w:r>
-        <w:t xml:space="preserve"> </w:t>
-      </w:r>
-      <w:r>
-        <w:t xml:space="preserve">alias, while a corpus of typed</w:t>
-      </w:r>
-      <w:r>
-        <w:t xml:space="preserve"> </w:t>
-      </w:r>
-      <w:r>
-        <w:t xml:space="preserve">URLs keeps three quarters of its value. Within that,</w:t>
+        <w:t xml:space="preserve">candidates.txt</w:t>
+      </w:r>
+      <w:r>
+        <w:t xml:space="preserve">, reach no annual file, and are worth 1,582,744.5921 equivalent-English</w:t>
       </w:r>
       <w:r>
         <w:t xml:space="preserve"> </w:t>
@@ -1871,7 +2479,7 @@
           <w:b/>
           <w:bCs/>
         </w:rPr>
-        <w:t xml:space="preserve">density decides which part of a corpus to</w:t>
+        <w:t xml:space="preserve">if every</w:t>
       </w:r>
       <w:r>
         <w:rPr>
@@ -1885,92 +2493,41 @@
           <w:b/>
           <w:bCs/>
         </w:rPr>
-        <w:t xml:space="preserve">read, not size</w:t>
-      </w:r>
-      <w:r>
-        <w:t xml:space="preserve">, and density is how much people typed URLs at each other: across the Usenet</w:t>
-      </w:r>
-      <w:r>
-        <w:t xml:space="preserve"> </w:t>
-      </w:r>
-      <w:r>
-        <w:t xml:space="preserve">hierarchies it ranged from 2,552 equivalent-English per GB (</w:t>
+        <w:t xml:space="preserve">one were later dated</w:t>
+      </w:r>
+      <w:r>
+        <w:t xml:space="preserve">, which is a ceiling on future work and not a contribution to this round.</w:t>
+      </w:r>
+      <w:r>
+        <w:t xml:space="preserve"> </w:t>
       </w:r>
       <w:r>
         <w:rPr>
           <w:rStyle w:val="VerbatimChar"/>
         </w:rPr>
-        <w:t xml:space="preserve">news</w:t>
-      </w:r>
-      <w:r>
-        <w:t xml:space="preserve">) to 418 (</w:t>
-      </w:r>
-      <w:r>
-        <w:rPr>
-          <w:rStyle w:val="VerbatimChar"/>
-        </w:rPr>
-        <w:t xml:space="preserve">soc</w:t>
-      </w:r>
-      <w:r>
-        <w:t xml:space="preserve">), a sixfold spread</w:t>
-      </w:r>
-      <w:r>
-        <w:t xml:space="preserve"> </w:t>
-      </w:r>
-      <w:r>
-        <w:t xml:space="preserve">independent of volume. And the two saturation figures point opposite ways:</w:t>
-      </w:r>
-      <w:r>
-        <w:t xml:space="preserve"> </w:t>
-      </w:r>
-      <w:r>
-        <w:rPr>
-          <w:b/>
-          <w:bCs/>
-        </w:rPr>
-        <w:t xml:space="preserve">22.2% across</w:t>
-      </w:r>
-      <w:r>
-        <w:rPr>
-          <w:b/>
-          <w:bCs/>
-        </w:rPr>
-        <w:t xml:space="preserve"> </w:t>
-      </w:r>
-      <w:r>
-        <w:rPr>
-          <w:b/>
-          <w:bCs/>
-        </w:rPr>
-        <w:t xml:space="preserve">hierarchies, 90.5% inside one already read.</w:t>
-      </w:r>
-      <w:r>
-        <w:t xml:space="preserve"> </w:t>
-      </w:r>
-      <w:r>
-        <w:t xml:space="preserve">So breadth pays and depth does not, and the rule we</w:t>
-      </w:r>
-      <w:r>
-        <w:t xml:space="preserve"> </w:t>
-      </w:r>
-      <w:r>
-        <w:t xml:space="preserve">now follow is to read one archive from every community before a second from any of them. That</w:t>
-      </w:r>
-      <w:r>
-        <w:t xml:space="preserve"> </w:t>
-      </w:r>
-      <w:r>
-        <w:t xml:space="preserve">closed a 101 GB fetch on a measured 40 equivalent-English per GB instead of an assumed 130,000.</w:t>
+        <w:t xml:space="preserve">isc_survey_hostnames/</w:t>
+      </w:r>
+      <w:r>
+        <w:t xml:space="preserve"> </w:t>
+      </w:r>
+      <w:r>
+        <w:t xml:space="preserve">ships as the separate provenance-linked candidate collection you specified</w:t>
+      </w:r>
+      <w:r>
+        <w:t xml:space="preserve"> </w:t>
+      </w:r>
+      <w:r>
+        <w:t xml:space="preserve">on 2026-09-06, 17,669,437 hostname-years with per-host provenance, and is in no figure above.</w:t>
       </w:r>
     </w:p>
-    <w:bookmarkEnd w:id="11"/>
-    <w:bookmarkStart w:id="12" w:name="one-question-shipped-as-its-own-folder"/>
+    <w:bookmarkEnd w:id="10"/>
+    <w:bookmarkStart w:id="11" w:name="what-we-learned-this-round"/>
     <w:p>
       <w:pPr>
         <w:pStyle w:val="Heading2"/>
       </w:pPr>
       <w:r>
-        <w:t xml:space="preserve">4. One question, shipped as its own folder</w:t>
+        <w:t xml:space="preserve">3. What we learned this round</w:t>
       </w:r>
     </w:p>
     <w:p>
@@ -1979,71 +2536,203 @@
       </w:pPr>
       <w:r>
         <w:rPr>
-          <w:rStyle w:val="VerbatimChar"/>
-        </w:rPr>
-        <w:t xml:space="preserve">isc_survey_hostnames/</w:t>
-      </w:r>
-      <w:r>
-        <w:t xml:space="preserve"> </w:t>
-      </w:r>
-      <w:r>
-        <w:t xml:space="preserve">holds</w:t>
-      </w:r>
-      <w:r>
-        <w:t xml:space="preserve"> </w:t>
-      </w:r>
-      <w:r>
-        <w:rPr>
           <w:b/>
           <w:bCs/>
         </w:rPr>
-        <w:t xml:space="preserve">18,087,127</w:t>
-      </w:r>
-      <w:r>
-        <w:t xml:space="preserve"> </w:t>
-      </w:r>
-      <w:r>
-        <w:t xml:space="preserve">hostname years from the ISC Internet Domain Survey of</w:t>
-      </w:r>
-      <w:r>
-        <w:t xml:space="preserve"> </w:t>
-      </w:r>
-      <w:r>
-        <w:t xml:space="preserve">1996-1997, and</w:t>
-      </w:r>
-      <w:r>
-        <w:t xml:space="preserve"> </w:t>
+        <w:t xml:space="preserve">1. A server writing its own name is one evidence class, not one source, and it crosses</w:t>
       </w:r>
       <w:r>
         <w:rPr>
           <w:b/>
           <w:bCs/>
         </w:rPr>
-        <w:t xml:space="preserve">they are not in the figures above.</w:t>
-      </w:r>
-      <w:r>
-        <w:t xml:space="preserve"> </w:t>
-      </w:r>
-      <w:r>
-        <w:t xml:space="preserve">The survey's per-TLD host files are dated by</w:t>
-      </w:r>
-      <w:r>
-        <w:t xml:space="preserve"> </w:t>
-      </w:r>
-      <w:r>
-        <w:t xml:space="preserve">their own edition code and name each host explicitly, so they satisfy conditions 1 and 2 and are</w:t>
-      </w:r>
-      <w:r>
-        <w:t xml:space="preserve"> </w:t>
-      </w:r>
-      <w:r>
-        <w:t xml:space="preserve">direct rather than inferred. They fail condition 3 as we read it: a reverse-DNS walk shows a machine</w:t>
-      </w:r>
-      <w:r>
-        <w:t xml:space="preserve"> </w:t>
-      </w:r>
-      <w:r>
-        <w:t xml:space="preserve">answering, not a page.</w:t>
+        <w:t xml:space="preserve"> </w:t>
+      </w:r>
+      <w:r>
+        <w:rPr>
+          <w:b/>
+          <w:bCs/>
+        </w:rPr>
+        <w:t xml:space="preserve">protocols.</w:t>
+      </w:r>
+      <w:r>
+        <w:t xml:space="preserve"> </w:t>
+      </w:r>
+      <w:r>
+        <w:t xml:space="preserve">Last round we admitted the</w:t>
+      </w:r>
+      <w:r>
+        <w:t xml:space="preserve"> </w:t>
+      </w:r>
+      <w:r>
+        <w:rPr>
+          <w:rStyle w:val="VerbatimChar"/>
+        </w:rPr>
+        <w:t xml:space="preserve">Received: ... by &lt;host&gt;</w:t>
+      </w:r>
+      <w:r>
+        <w:t xml:space="preserve"> </w:t>
+      </w:r>
+      <w:r>
+        <w:t xml:space="preserve">clause of a dated mailing-list</w:t>
+      </w:r>
+      <w:r>
+        <w:t xml:space="preserve"> </w:t>
+      </w:r>
+      <w:r>
+        <w:t xml:space="preserve">message: the receiving mail server names itself, about itself, in a transaction it completed. The</w:t>
+      </w:r>
+      <w:r>
+        <w:t xml:space="preserve"> </w:t>
+      </w:r>
+      <w:r>
+        <w:t xml:space="preserve">finding this round is that the clause is not the point, the</w:t>
+      </w:r>
+      <w:r>
+        <w:t xml:space="preserve"> </w:t>
+      </w:r>
+      <w:r>
+        <w:rPr>
+          <w:i/>
+          <w:iCs/>
+        </w:rPr>
+        <w:t xml:space="preserve">authorship</w:t>
+      </w:r>
+      <w:r>
+        <w:t xml:space="preserve"> </w:t>
+      </w:r>
+      <w:r>
+        <w:t xml:space="preserve">is. A news server writes</w:t>
+      </w:r>
+      <w:r>
+        <w:t xml:space="preserve"> </w:t>
+      </w:r>
+      <w:r>
+        <w:rPr>
+          <w:rStyle w:val="VerbatimChar"/>
+        </w:rPr>
+        <w:t xml:space="preserve">Path:</w:t>
+      </w:r>
+      <w:r>
+        <w:t xml:space="preserve">,</w:t>
+      </w:r>
+      <w:r>
+        <w:t xml:space="preserve"> </w:t>
+      </w:r>
+      <w:r>
+        <w:rPr>
+          <w:rStyle w:val="VerbatimChar"/>
+        </w:rPr>
+        <w:t xml:space="preserve">X-Trace:</w:t>
+      </w:r>
+      <w:r>
+        <w:t xml:space="preserve"> </w:t>
+      </w:r>
+      <w:r>
+        <w:t xml:space="preserve">and</w:t>
+      </w:r>
+      <w:r>
+        <w:t xml:space="preserve"> </w:t>
+      </w:r>
+      <w:r>
+        <w:rPr>
+          <w:rStyle w:val="VerbatimChar"/>
+        </w:rPr>
+        <w:t xml:space="preserve">NNTP-Posting-Host:</w:t>
+      </w:r>
+      <w:r>
+        <w:t xml:space="preserve"> </w:t>
+      </w:r>
+      <w:r>
+        <w:t xml:space="preserve">about a transaction it completed in exactly the same</w:t>
+      </w:r>
+      <w:r>
+        <w:t xml:space="preserve"> </w:t>
+      </w:r>
+      <w:r>
+        <w:t xml:space="preserve">sense, so the same reading admits Usenet server headers with no new rule, and that lane paid</w:t>
+      </w:r>
+      <w:r>
+        <w:t xml:space="preserve"> </w:t>
+      </w:r>
+      <w:r>
+        <w:t xml:space="preserve">350,946 equivalent-English on 736,440 records from spool already on disk.</w:t>
+      </w:r>
+      <w:r>
+        <w:t xml:space="preserve"> </w:t>
+      </w:r>
+      <w:r>
+        <w:t xml:space="preserve">The same clause read at two mailing-list archives paid a further 18,999 on</w:t>
+      </w:r>
+      <w:r>
+        <w:t xml:space="preserve"> </w:t>
+      </w:r>
+      <w:r>
+        <w:t xml:space="preserve">34,134.</w:t>
+      </w:r>
+      <w:r>
+        <w:t xml:space="preserve"> </w:t>
+      </w:r>
+      <w:r>
+        <w:rPr>
+          <w:b/>
+          <w:bCs/>
+        </w:rPr>
+        <w:t xml:space="preserve">Three exclusions come with it, each costing yield:</w:t>
+      </w:r>
+      <w:r>
+        <w:t xml:space="preserve"> </w:t>
+      </w:r>
+      <w:r>
+        <w:t xml:space="preserve">the</w:t>
+      </w:r>
+      <w:r>
+        <w:t xml:space="preserve"> </w:t>
+      </w:r>
+      <w:r>
+        <w:rPr>
+          <w:rStyle w:val="VerbatimChar"/>
+        </w:rPr>
+        <w:t xml:space="preserve">from</w:t>
+      </w:r>
+      <w:r>
+        <w:t xml:space="preserve"> </w:t>
+      </w:r>
+      <w:r>
+        <w:t xml:space="preserve">HELO</w:t>
+      </w:r>
+      <w:r>
+        <w:t xml:space="preserve"> </w:t>
+      </w:r>
+      <w:r>
+        <w:t xml:space="preserve">name is chosen by the sender, the parenthesised reverse-DNS is written by the receiver but was</w:t>
+      </w:r>
+      <w:r>
+        <w:t xml:space="preserve"> </w:t>
+      </w:r>
+      <w:r>
+        <w:t xml:space="preserve">outside the approval, and a</w:t>
+      </w:r>
+      <w:r>
+        <w:t xml:space="preserve"> </w:t>
+      </w:r>
+      <w:r>
+        <w:rPr>
+          <w:rStyle w:val="VerbatimChar"/>
+        </w:rPr>
+        <w:t xml:space="preserve">Message-ID</w:t>
+      </w:r>
+      <w:r>
+        <w:t xml:space="preserve"> </w:t>
+      </w:r>
+      <w:r>
+        <w:t xml:space="preserve">host is stamped by the sending client. None of the three</w:t>
+      </w:r>
+      <w:r>
+        <w:t xml:space="preserve"> </w:t>
+      </w:r>
+      <w:r>
+        <w:t xml:space="preserve">is read.</w:t>
       </w:r>
     </w:p>
     <w:p>
@@ -2051,86 +2740,342 @@
         <w:pStyle w:val="BodyText"/>
       </w:pPr>
       <w:r>
-        <w:t xml:space="preserve">Your section XI asks for hostname-level identity wherever there is year-specific evidence and does</w:t>
-      </w:r>
-      <w:r>
-        <w:t xml:space="preserve"> </w:t>
-      </w:r>
-      <w:r>
-        <w:t xml:space="preserve">not restate the web-content condition, so the honest thing is to ask rather than decide.</w:t>
-      </w:r>
-      <w:r>
-        <w:t xml:space="preserve"> </w:t>
-      </w:r>
-      <w:r>
         <w:rPr>
           <w:b/>
           <w:bCs/>
         </w:rPr>
-        <w:t xml:space="preserve">Does a host listed in a dated 1996-1997 reverse-DNS survey, with no capture of a page on it,</w:t>
+        <w:t xml:space="preserve">Two parsing traps, because both banked fiction before they were caught.</w:t>
+      </w:r>
+      <w:r>
+        <w:t xml:space="preserve"> </w:t>
+      </w:r>
+      <w:r>
+        <w:t xml:space="preserve">A news server appends</w:t>
+      </w:r>
+      <w:r>
+        <w:t xml:space="preserve"> </w:t>
+      </w:r>
+      <w:r>
+        <w:t xml:space="preserve">its own verdict to a</w:t>
+      </w:r>
+      <w:r>
+        <w:t xml:space="preserve"> </w:t>
+      </w:r>
+      <w:r>
+        <w:rPr>
+          <w:rStyle w:val="VerbatimChar"/>
+        </w:rPr>
+        <w:t xml:space="preserve">Path</w:t>
+      </w:r>
+      <w:r>
+        <w:t xml:space="preserve"> </w:t>
+      </w:r>
+      <w:r>
+        <w:t xml:space="preserve">element:</w:t>
+      </w:r>
+      <w:r>
+        <w:t xml:space="preserve"> </w:t>
+      </w:r>
+      <w:r>
+        <w:rPr>
+          <w:rStyle w:val="VerbatimChar"/>
+        </w:rPr>
+        <w:t xml:space="preserve">.POSTED</w:t>
+      </w:r>
+      <w:r>
+        <w:t xml:space="preserve"> </w:t>
+      </w:r>
+      <w:r>
+        <w:t xml:space="preserve">marks the injecting site, and left in place it banks</w:t>
+      </w:r>
+      <w:r>
+        <w:t xml:space="preserve"> </w:t>
+      </w:r>
+      <w:r>
+        <w:rPr>
+          <w:rStyle w:val="VerbatimChar"/>
+        </w:rPr>
+        <w:t xml:space="preserve">news2-win.server.&lt;parent&gt;.posted</w:t>
+      </w:r>
+      <w:r>
+        <w:t xml:space="preserve"> </w:t>
+      </w:r>
+      <w:r>
+        <w:t xml:space="preserve">as a host in its own right, 2,006 rows in a 35 MB test.</w:t>
+      </w:r>
+      <w:r>
+        <w:t xml:space="preserve"> </w:t>
+      </w:r>
+      <w:r>
+        <w:rPr>
+          <w:rStyle w:val="VerbatimChar"/>
+        </w:rPr>
+        <w:t xml:space="preserve">.MISMATCH</w:t>
+      </w:r>
+      <w:r>
+        <w:t xml:space="preserve"> </w:t>
+      </w:r>
+      <w:r>
+        <w:t xml:space="preserve">is the server stating that the reverse-DNS did</w:t>
+      </w:r>
+      <w:r>
+        <w:t xml:space="preserve"> </w:t>
       </w:r>
       <w:r>
         <w:rPr>
           <w:b/>
           <w:bCs/>
         </w:rPr>
-        <w:t xml:space="preserve"> </w:t>
-      </w:r>
+        <w:t xml:space="preserve">not</w:t>
+      </w:r>
+      <w:r>
+        <w:t xml:space="preserve"> </w:t>
+      </w:r>
+      <w:r>
+        <w:t xml:space="preserve">match, so those elements are</w:t>
+      </w:r>
+      <w:r>
+        <w:t xml:space="preserve"> </w:t>
+      </w:r>
+      <w:r>
+        <w:t xml:space="preserve">dropped rather than cleaned. A further filter removes dial-up lease names, which name a session and</w:t>
+      </w:r>
+      <w:r>
+        <w:t xml:space="preserve"> </w:t>
+      </w:r>
+      <w:r>
+        <w:t xml:space="preserve">not a machine: an address embedded in the label, a pool word beside a digit, a bare numeric or long</w:t>
+      </w:r>
+      <w:r>
+        <w:t xml:space="preserve"> </w:t>
+      </w:r>
+      <w:r>
+        <w:t xml:space="preserve">hex first label. It drops 6.5% of candidate hosts, measured against 6.9% expected.</w:t>
+      </w:r>
+    </w:p>
+    <w:p>
+      <w:pPr>
+        <w:pStyle w:val="BodyText"/>
+      </w:pPr>
       <w:r>
         <w:rPr>
           <w:b/>
           <w:bCs/>
         </w:rPr>
-        <w:t xml:space="preserve">count as an annual hostname record?</w:t>
-      </w:r>
-      <w:r>
-        <w:t xml:space="preserve"> </w:t>
-      </w:r>
-      <w:r>
-        <w:t xml:space="preserve">If yes, the folder merges as it stands. If no, discard it and</w:t>
-      </w:r>
-      <w:r>
-        <w:t xml:space="preserve"> </w:t>
-      </w:r>
-      <w:r>
-        <w:t xml:space="preserve">nothing else changes. We flag one fact against it: 1.419% of these hosts appear anywhere in your</w:t>
-      </w:r>
-      <w:r>
-        <w:t xml:space="preserve"> </w:t>
-      </w:r>
-      <w:r>
-        <w:t xml:space="preserve">files, against 84.2% for the</w:t>
-      </w:r>
-      <w:r>
-        <w:t xml:space="preserve"> </w:t>
-      </w:r>
-      <w:r>
-        <w:rPr>
-          <w:rStyle w:val="VerbatimChar"/>
-        </w:rPr>
-        <w:t xml:space="preserve">www.</w:t>
-      </w:r>
-      <w:r>
-        <w:t xml:space="preserve"> </w:t>
-      </w:r>
-      <w:r>
-        <w:t xml:space="preserve">shape, so it is a population you have not held before, and much</w:t>
-      </w:r>
-      <w:r>
-        <w:t xml:space="preserve"> </w:t>
-      </w:r>
-      <w:r>
-        <w:t xml:space="preserve">of it is dialup ports and numbered workstations.</w:t>
+        <w:t xml:space="preserve">2. A closure is a measurement about our search, not a fact about the artifact, so the number</w:t>
+      </w:r>
+      <w:r>
+        <w:rPr>
+          <w:b/>
+          <w:bCs/>
+        </w:rPr>
+        <w:t xml:space="preserve"> </w:t>
+      </w:r>
+      <w:r>
+        <w:rPr>
+          <w:b/>
+          <w:bCs/>
+        </w:rPr>
+        <w:t xml:space="preserve">under it has to be re-measured before it is trusted.</w:t>
+      </w:r>
+      <w:r>
+        <w:t xml:space="preserve"> </w:t>
+      </w:r>
+      <w:r>
+        <w:t xml:space="preserve">The Usenet header class had been closed here</w:t>
+      </w:r>
+      <w:r>
+        <w:t xml:space="preserve"> </w:t>
+      </w:r>
+      <w:r>
+        <w:t xml:space="preserve">on 2026-09-08 as "224 GB, on neither machine any more". Re-measured from the archive's own metadata,</w:t>
+      </w:r>
+      <w:r>
+        <w:t xml:space="preserve"> </w:t>
+      </w:r>
+      <w:r>
+        <w:t xml:space="preserve">the two collections it was priced on are 15.3 GB, and 104.8 GB of the same corpus was already on the</w:t>
+      </w:r>
+      <w:r>
+        <w:t xml:space="preserve"> </w:t>
+      </w:r>
+      <w:r>
+        <w:t xml:space="preserve">laptop. The class needed no fetch at all, and it is the second-largest lane of this round. Two</w:t>
+      </w:r>
+      <w:r>
+        <w:t xml:space="preserve"> </w:t>
+      </w:r>
+      <w:r>
+        <w:t xml:space="preserve">further families closed at 0.0000 were re-probed for the same reason and were also wrong: one</w:t>
+      </w:r>
+      <w:r>
+        <w:t xml:space="preserve"> </w:t>
+      </w:r>
+      <w:r>
+        <w:t xml:space="preserve">because the inventory page was one link deeper than the sweep looked, one because an FTP index was</w:t>
+      </w:r>
+      <w:r>
+        <w:t xml:space="preserve"> </w:t>
+      </w:r>
+      <w:r>
+        <w:t xml:space="preserve">assumed already held and 31.5% to 64.3% of its hosts were missing at their own year. A verdict</w:t>
+      </w:r>
+      <w:r>
+        <w:t xml:space="preserve"> </w:t>
+      </w:r>
+      <w:r>
+        <w:t xml:space="preserve">resting on "we looked and found nothing" is now re-run against the artifact's own structure rather</w:t>
+      </w:r>
+      <w:r>
+        <w:t xml:space="preserve"> </w:t>
+      </w:r>
+      <w:r>
+        <w:t xml:space="preserve">than against the path we guessed.</w:t>
       </w:r>
     </w:p>
-    <w:bookmarkEnd w:id="12"/>
-    <w:bookmarkStart w:id="13" w:name="limitations"/>
+    <w:p>
+      <w:pPr>
+        <w:pStyle w:val="BodyText"/>
+      </w:pPr>
+      <w:r>
+        <w:rPr>
+          <w:b/>
+          <w:bCs/>
+        </w:rPr>
+        <w:t xml:space="preserve">3. Rank a query queue on what is missing, and plan with the sustained rate rather than the</w:t>
+      </w:r>
+      <w:r>
+        <w:rPr>
+          <w:b/>
+          <w:bCs/>
+        </w:rPr>
+        <w:t xml:space="preserve"> </w:t>
+      </w:r>
+      <w:r>
+        <w:rPr>
+          <w:b/>
+          <w:bCs/>
+        </w:rPr>
+        <w:t xml:space="preserve">peak.</w:t>
+      </w:r>
+      <w:r>
+        <w:t xml:space="preserve"> </w:t>
+      </w:r>
+      <w:r>
+        <w:t xml:space="preserve">A domain-wide capture query is worth what the years we hold its parent in are worth, not</w:t>
+      </w:r>
+      <w:r>
+        <w:t xml:space="preserve"> </w:t>
+      </w:r>
+      <w:r>
+        <w:t xml:space="preserve">what its host count is, because a capture under a parent we do not hold that year cannot become a</w:t>
+      </w:r>
+      <w:r>
+        <w:t xml:space="preserve"> </w:t>
+      </w:r>
+      <w:r>
+        <w:t xml:space="preserve">record. Ranking parents on hosts-we-lack times years-we-hold, minus host-years already held, took</w:t>
+      </w:r>
+      <w:r>
+        <w:t xml:space="preserve"> </w:t>
+      </w:r>
+      <w:r>
+        <w:t xml:space="preserve">the accepted share of one night's sweep from 4.9% to 21%. The rate that ranking produces is not a</w:t>
+      </w:r>
+      <w:r>
+        <w:t xml:space="preserve"> </w:t>
+      </w:r>
+      <w:r>
+        <w:t xml:space="preserve">property of the source: the same query, code and two clients paid about 193,000 equivalent-English</w:t>
+      </w:r>
+      <w:r>
+        <w:t xml:space="preserve"> </w:t>
+      </w:r>
+      <w:r>
+        <w:t xml:space="preserve">per client-hour on a fresh ranked head and 210 per hour two nights later once that head was walked.</w:t>
+      </w:r>
+      <w:r>
+        <w:t xml:space="preserve"> </w:t>
+      </w:r>
+      <w:r>
+        <w:t xml:space="preserve">Measured over ten hours from a re-rank, two clients wrote 1,067 MB of journal for 247,042</w:t>
+      </w:r>
+      <w:r>
+        <w:t xml:space="preserve"> </w:t>
+      </w:r>
+      <w:r>
+        <w:t xml:space="preserve">equivalent-English,</w:t>
+      </w:r>
+      <w:r>
+        <w:t xml:space="preserve"> </w:t>
+      </w:r>
+      <w:r>
+        <w:rPr>
+          <w:b/>
+          <w:bCs/>
+        </w:rPr>
+        <w:t xml:space="preserve">231 per MB, where the head alone reads 565</w:t>
+      </w:r>
+      <w:r>
+        <w:t xml:space="preserve">.</w:t>
+      </w:r>
+      <w:r>
+        <w:t xml:space="preserve"> </w:t>
+      </w:r>
+      <w:r>
+        <w:rPr>
+          <w:b/>
+          <w:bCs/>
+        </w:rPr>
+        <w:t xml:space="preserve">The caution that goes with</w:t>
+      </w:r>
+      <w:r>
+        <w:rPr>
+          <w:b/>
+          <w:bCs/>
+        </w:rPr>
+        <w:t xml:space="preserve"> </w:t>
+      </w:r>
+      <w:r>
+        <w:rPr>
+          <w:b/>
+          <w:bCs/>
+        </w:rPr>
+        <w:t xml:space="preserve">it:</w:t>
+      </w:r>
+      <w:r>
+        <w:t xml:space="preserve"> </w:t>
+      </w:r>
+      <w:r>
+        <w:t xml:space="preserve">correlating a parent's rank against what it banked gives Spearman +0.746 over 198 parents,</w:t>
+      </w:r>
+      <w:r>
+        <w:t xml:space="preserve"> </w:t>
+      </w:r>
+      <w:r>
+        <w:t xml:space="preserve">which reads as an exactly inverted ranker and is not, because the head of any ranking is swept</w:t>
+      </w:r>
+      <w:r>
+        <w:t xml:space="preserve"> </w:t>
+      </w:r>
+      <w:r>
+        <w:t xml:space="preserve">first and re-measuring it measures sweep history. Over the 54 parents swept fresh from a new</w:t>
+      </w:r>
+      <w:r>
+        <w:t xml:space="preserve"> </w:t>
+      </w:r>
+      <w:r>
+        <w:t xml:space="preserve">ranking the same correlation is -0.655. Price a ranker only on parents it has never been used on.</w:t>
+      </w:r>
+    </w:p>
+    <w:bookmarkEnd w:id="11"/>
+    <w:bookmarkStart w:id="12" w:name="limitations-and-what-is-worth-expanding"/>
     <w:p>
       <w:pPr>
         <w:pStyle w:val="Heading2"/>
       </w:pPr>
       <w:r>
-        <w:t xml:space="preserve">5. Limitations</w:t>
+        <w:t xml:space="preserve">4. Limitations, and what is worth expanding</w:t>
       </w:r>
     </w:p>
     <w:p>
@@ -2138,19 +3083,31 @@
         <w:pStyle w:val="FirstParagraph"/>
       </w:pPr>
       <w:r>
-        <w:t xml:space="preserve">A capture proves presence, never absence, so a year without one is unevidenced rather than empty,</w:t>
-      </w:r>
-      <w:r>
-        <w:t xml:space="preserve"> </w:t>
-      </w:r>
-      <w:r>
-        <w:t xml:space="preserve">and both dating routes err toward omission. The units ship separately, so dropping the hostname</w:t>
-      </w:r>
-      <w:r>
-        <w:t xml:space="preserve"> </w:t>
-      </w:r>
-      <w:r>
-        <w:t xml:space="preserve">files leaves the registrable round intact at 61,669.4256 EE.</w:t>
+        <w:t xml:space="preserve">A capture proves presence and never absence, so a year with no capture is unevidenced rather than</w:t>
+      </w:r>
+      <w:r>
+        <w:t xml:space="preserve"> </w:t>
+      </w:r>
+      <w:r>
+        <w:t xml:space="preserve">empty, and a server header attests the year of its own message and no other. Both routes err toward</w:t>
+      </w:r>
+      <w:r>
+        <w:t xml:space="preserve"> </w:t>
+      </w:r>
+      <w:r>
+        <w:t xml:space="preserve">omission. The units ship separately, so dropping the hostname files leaves the registrable round</w:t>
+      </w:r>
+      <w:r>
+        <w:t xml:space="preserve"> </w:t>
+      </w:r>
+      <w:r>
+        <w:t xml:space="preserve">intact at 65,738.2990 equivalent-English. A material share of archive requests fail at transport level</w:t>
+      </w:r>
+      <w:r>
+        <w:t xml:space="preserve"> </w:t>
+      </w:r>
+      <w:r>
+        <w:t xml:space="preserve">rather than with a status code, which is throttling seen from the other side of the socket.</w:t>
       </w:r>
     </w:p>
     <w:p>
@@ -2158,19 +3115,17 @@
         <w:pStyle w:val="BodyText"/>
       </w:pPr>
       <w:r>
-        <w:t xml:space="preserve">Worth expanding next, in order: the same one-level-down reading of the remaining capture-bearing</w:t>
-      </w:r>
-      <w:r>
-        <w:t xml:space="preserve"> </w:t>
-      </w:r>
-      <w:r>
-        <w:t xml:space="preserve">and URL-listing artifacts already on disk; the second-level suffix namespaces at hostname grain,</w:t>
-      </w:r>
-      <w:r>
-        <w:t xml:space="preserve"> </w:t>
-      </w:r>
-      <w:r>
-        <w:t xml:space="preserve">where</w:t>
+        <w:rPr>
+          <w:b/>
+          <w:bCs/>
+        </w:rPr>
+        <w:t xml:space="preserve">309 source families searched and recorded</w:t>
+      </w:r>
+      <w:r>
+        <w:t xml:space="preserve"> </w:t>
+      </w:r>
+      <w:r>
+        <w:t xml:space="preserve">in</w:t>
       </w:r>
       <w:r>
         <w:t xml:space="preserve"> </w:t>
@@ -2179,19 +3134,103 @@
         <w:rPr>
           <w:rStyle w:val="VerbatimChar"/>
         </w:rPr>
+        <w:t xml:space="preserve">sources.md</w:t>
+      </w:r>
+      <w:r>
+        <w:t xml:space="preserve"> </w:t>
+      </w:r>
+      <w:r>
+        <w:t xml:space="preserve">and</w:t>
+      </w:r>
+      <w:r>
+        <w:t xml:space="preserve"> </w:t>
+      </w:r>
+      <w:r>
+        <w:rPr>
+          <w:rStyle w:val="VerbatimChar"/>
+        </w:rPr>
+        <w:t xml:space="preserve">sources-closed.md</w:t>
+      </w:r>
+      <w:r>
+        <w:t xml:space="preserve">: 87 developed, 222 evaluated and closed with the measurement that closed them, so the same ground is not broken twice.</w:t>
+      </w:r>
+    </w:p>
+    <w:p>
+      <w:pPr>
+        <w:pStyle w:val="BodyText"/>
+      </w:pPr>
+      <w:r>
+        <w:rPr>
+          <w:b/>
+          <w:bCs/>
+        </w:rPr>
+        <w:t xml:space="preserve">Worth expanding next, in order.</w:t>
+      </w:r>
+      <w:r>
+        <w:t xml:space="preserve"> </w:t>
+      </w:r>
+      <w:r>
+        <w:t xml:space="preserve">The server-header class at the archives it has not been run</w:t>
+      </w:r>
+      <w:r>
+        <w:t xml:space="preserve"> </w:t>
+      </w:r>
+      <w:r>
+        <w:t xml:space="preserve">against, which is the one route this round that needed no new bandwidth. The ISP Usenet hierarchies,</w:t>
+      </w:r>
+      <w:r>
+        <w:t xml:space="preserve"> </w:t>
+      </w:r>
+      <w:r>
+        <w:t xml:space="preserve">15.3 GB, where the customer host appears rather than the news server. Sibling ccTLD extractions of</w:t>
+      </w:r>
+      <w:r>
+        <w:t xml:space="preserve"> </w:t>
+      </w:r>
+      <w:r>
+        <w:t xml:space="preserve">the shape</w:t>
+      </w:r>
+      <w:r>
+        <w:t xml:space="preserve"> </w:t>
+      </w:r>
+      <w:r>
+        <w:rPr>
+          <w:rStyle w:val="VerbatimChar"/>
+        </w:rPr>
+        <w:t xml:space="preserve">poland_pl_extract_hostgrain</w:t>
+      </w:r>
+      <w:r>
+        <w:t xml:space="preserve"> </w:t>
+      </w:r>
+      <w:r>
+        <w:t xml:space="preserve">reads, which exist for other national archives under the</w:t>
+      </w:r>
+      <w:r>
+        <w:t xml:space="preserve"> </w:t>
+      </w:r>
+      <w:r>
+        <w:t xml:space="preserve">same uploader. The second-level suffix namespaces at hostname grain, where</w:t>
+      </w:r>
+      <w:r>
+        <w:t xml:space="preserve"> </w:t>
+      </w:r>
+      <w:r>
+        <w:rPr>
+          <w:rStyle w:val="VerbatimChar"/>
+        </w:rPr>
         <w:t xml:space="preserve">co.uk</w:t>
       </w:r>
       <w:r>
         <w:t xml:space="preserve"> </w:t>
       </w:r>
       <w:r>
-        <w:t xml:space="preserve">alone is 3.39M index blocks and 1.2% walked; the ranked subdomain platforms still</w:t>
-      </w:r>
-      <w:r>
-        <w:t xml:space="preserve"> </w:t>
-      </w:r>
-      <w:r>
-        <w:t xml:space="preserve">queued in</w:t>
+        <w:t xml:space="preserve">alone is 3.39M</w:t>
+      </w:r>
+      <w:r>
+        <w:t xml:space="preserve"> </w:t>
+      </w:r>
+      <w:r>
+        <w:t xml:space="preserve">index blocks and 1.2% walked. Measured and closed this round: the</w:t>
       </w:r>
       <w:r>
         <w:t xml:space="preserve"> </w:t>
@@ -2200,59 +3239,77 @@
         <w:rPr>
           <w:rStyle w:val="VerbatimChar"/>
         </w:rPr>
-        <w:t xml:space="preserve">audit/source_saturation_ledger.csv</w:t>
-      </w:r>
-      <w:r>
-        <w:t xml:space="preserve">. Measured and closed this round: the</w:t>
-      </w:r>
-      <w:r>
-        <w:t xml:space="preserve"> </w:t>
-      </w:r>
-      <w:r>
-        <w:rPr>
-          <w:rStyle w:val="VerbatimChar"/>
-        </w:rPr>
         <w:t xml:space="preserve">alt</w:t>
       </w:r>
       <w:r>
         <w:t xml:space="preserve"> </w:t>
       </w:r>
       <w:r>
-        <w:t xml:space="preserve">Usenet</w:t>
-      </w:r>
-      <w:r>
-        <w:t xml:space="preserve"> </w:t>
-      </w:r>
-      <w:r>
-        <w:t xml:space="preserve">remainder, on saturation. Prose corpora, academic repositories, CD-ROM media, FTP mirrors and trade</w:t>
-      </w:r>
-      <w:r>
-        <w:t xml:space="preserve"> </w:t>
-      </w:r>
-      <w:r>
-        <w:t xml:space="preserve">directories were closed earlier, with figures in</w:t>
-      </w:r>
-      <w:r>
-        <w:t xml:space="preserve"> </w:t>
-      </w:r>
-      <w:r>
-        <w:rPr>
-          <w:rStyle w:val="VerbatimChar"/>
-        </w:rPr>
-        <w:t xml:space="preserve">experience-summary.md</w:t>
-      </w:r>
-      <w:r>
-        <w:t xml:space="preserve">.</w:t>
+        <w:t xml:space="preserve">Usenet remainder, on</w:t>
+      </w:r>
+      <w:r>
+        <w:t xml:space="preserve"> </w:t>
+      </w:r>
+      <w:r>
+        <w:t xml:space="preserve">saturation, and the Apache list archive, whose ceiling fell to 9,000 equivalent-English once the</w:t>
+      </w:r>
+      <w:r>
+        <w:t xml:space="preserve"> </w:t>
+      </w:r>
+      <w:r>
+        <w:t xml:space="preserve">class was measured rather than projected.</w:t>
       </w:r>
     </w:p>
-    <w:bookmarkEnd w:id="13"/>
-    <w:bookmarkStart w:id="14" w:name="merge-overlap-and-reconciliation-d3"/>
+    <w:p>
+      <w:pPr>
+        <w:pStyle w:val="BodyText"/>
+      </w:pPr>
+      <w:r>
+        <w:rPr>
+          <w:b/>
+          <w:bCs/>
+        </w:rPr>
+        <w:t xml:space="preserve">One eligibility question we cannot settle ourselves.</w:t>
+      </w:r>
+      <w:r>
+        <w:t xml:space="preserve"> </w:t>
+      </w:r>
+      <w:r>
+        <w:t xml:space="preserve">An FTP index row carries the crawler's own</w:t>
+      </w:r>
+      <w:r>
+        <w:t xml:space="preserve"> </w:t>
+      </w:r>
+      <w:r>
+        <w:t xml:space="preserve">completion stamp for that exact host in that year, so the service answered and its files were</w:t>
+      </w:r>
+      <w:r>
+        <w:t xml:space="preserve"> </w:t>
+      </w:r>
+      <w:r>
+        <w:t xml:space="preserve">counted. That is stronger than a DNS observation, which your 0906 update makes candidate-only, but</w:t>
+      </w:r>
+      <w:r>
+        <w:t xml:space="preserve"> </w:t>
+      </w:r>
+      <w:r>
+        <w:t xml:space="preserve">it is not a webpage. We hold those rows out of the annual files until you rule, and they are in no</w:t>
+      </w:r>
+      <w:r>
+        <w:t xml:space="preserve"> </w:t>
+      </w:r>
+      <w:r>
+        <w:t xml:space="preserve">figure in this report.</w:t>
+      </w:r>
+    </w:p>
+    <w:bookmarkEnd w:id="12"/>
+    <w:bookmarkStart w:id="13" w:name="merge-overlap-and-reconciliation-d3"/>
     <w:p>
       <w:pPr>
         <w:pStyle w:val="Heading2"/>
       </w:pPr>
       <w:r>
-        <w:t xml:space="preserve">6. Merge, overlap and reconciliation (D3)</w:t>
+        <w:t xml:space="preserve">5. Merge, overlap and reconciliation (D3)</w:t>
       </w:r>
     </w:p>
     <w:tbl>
@@ -2320,31 +3377,31 @@
               <w:rPr>
                 <w:rStyle w:val="VerbatimChar"/>
               </w:rPr>
-              <w:t xml:space="preserve">merged260904</w:t>
-            </w:r>
-          </w:p>
-        </w:tc>
-        <w:tc>
-          <w:tcPr/>
-          <w:p>
-            <w:pPr>
-              <w:pStyle w:val="Compact"/>
-              <w:jc w:val="right"/>
-            </w:pPr>
-            <w:r>
-              <w:t xml:space="preserve">43,235,797</w:t>
-            </w:r>
-          </w:p>
-        </w:tc>
-        <w:tc>
-          <w:tcPr/>
-          <w:p>
-            <w:pPr>
-              <w:pStyle w:val="Compact"/>
-              <w:jc w:val="right"/>
-            </w:pPr>
-            <w:r>
-              <w:t xml:space="preserve">23,029,472.9274</w:t>
+              <w:t xml:space="preserve">merged260908</w:t>
+            </w:r>
+          </w:p>
+        </w:tc>
+        <w:tc>
+          <w:tcPr/>
+          <w:p>
+            <w:pPr>
+              <w:pStyle w:val="Compact"/>
+              <w:jc w:val="right"/>
+            </w:pPr>
+            <w:r>
+              <w:t xml:space="preserve">65,313,842</w:t>
+            </w:r>
+          </w:p>
+        </w:tc>
+        <w:tc>
+          <w:tcPr/>
+          <w:p>
+            <w:pPr>
+              <w:pStyle w:val="Compact"/>
+              <w:jc w:val="right"/>
+            </w:pPr>
+            <w:r>
+              <w:t xml:space="preserve">34,887,095.7393</w:t>
             </w:r>
           </w:p>
         </w:tc>
@@ -2377,7 +3434,7 @@
                 <w:b/>
                 <w:bCs/>
               </w:rPr>
-              <w:t xml:space="preserve">7,834,717</w:t>
+              <w:t xml:space="preserve">3,399,258</w:t>
             </w:r>
           </w:p>
         </w:tc>
@@ -2393,7 +3450,7 @@
                 <w:b/>
                 <w:bCs/>
               </w:rPr>
-              <w:t xml:space="preserve">4,322,566.2232</w:t>
+              <w:t xml:space="preserve">1,874,979.2367</w:t>
             </w:r>
           </w:p>
         </w:tc>
@@ -2418,19 +3475,19 @@
               <w:jc w:val="right"/>
             </w:pPr>
             <w:r>
-              <w:t xml:space="preserve">51,070,514</w:t>
-            </w:r>
-          </w:p>
-        </w:tc>
-        <w:tc>
-          <w:tcPr/>
-          <w:p>
-            <w:pPr>
-              <w:pStyle w:val="Compact"/>
-              <w:jc w:val="right"/>
-            </w:pPr>
-            <w:r>
-              <w:t xml:space="preserve">27,352,039.1506</w:t>
+              <w:t xml:space="preserve">68,713,100</w:t>
+            </w:r>
+          </w:p>
+        </w:tc>
+        <w:tc>
+          <w:tcPr/>
+          <w:p>
+            <w:pPr>
+              <w:pStyle w:val="Compact"/>
+              <w:jc w:val="right"/>
+            </w:pPr>
+            <w:r>
+              <w:t xml:space="preserve">36,762,074.9760</w:t>
             </w:r>
           </w:p>
         </w:tc>
@@ -2441,7 +3498,7 @@
         <w:pStyle w:val="BodyText"/>
       </w:pPr>
       <w:r>
-        <w:t xml:space="preserve">Overlap with the baseline is</w:t>
+        <w:t xml:space="preserve">Of the 3,399,562 records submitted,</w:t>
       </w:r>
       <w:r>
         <w:t xml:space="preserve"> </w:t>
@@ -2451,10 +3508,13 @@
           <w:b/>
           <w:bCs/>
         </w:rPr>
-        <w:t xml:space="preserve">0 records</w:t>
-      </w:r>
-      <w:r>
-        <w:t xml:space="preserve">, so all 7,834,717 submitted count once, and</w:t>
+        <w:t xml:space="preserve">304 are already in the baseline</w:t>
+      </w:r>
+      <w:r>
+        <w:t xml:space="preserve"> </w:t>
+      </w:r>
+      <w:r>
+        <w:t xml:space="preserve">and are excluded, so the accepted increment above counts each remaining record once.</w:t>
       </w:r>
       <w:r>
         <w:t xml:space="preserve"> </w:t>
@@ -2512,14 +3572,14 @@
         <w:t xml:space="preserve">, in your column names.</w:t>
       </w:r>
     </w:p>
-    <w:bookmarkEnd w:id="14"/>
-    <w:bookmarkStart w:id="15" w:name="reproduction-and-the-four-deliverables"/>
+    <w:bookmarkEnd w:id="13"/>
+    <w:bookmarkStart w:id="14" w:name="reproduction-and-the-four-deliverables"/>
     <w:p>
       <w:pPr>
         <w:pStyle w:val="Heading2"/>
       </w:pPr>
       <w:r>
-        <w:t xml:space="preserve">7. Reproduction, and the four deliverables</w:t>
+        <w:t xml:space="preserve">6. Reproduction, and the four deliverables</w:t>
       </w:r>
     </w:p>
     <w:p>
@@ -2709,7 +3769,7 @@
         <w:t xml:space="preserve"> </w:t>
       </w:r>
       <w:r>
-        <w:t xml:space="preserve">merge and dedup code, overlap and reconciliation: section 6 and</w:t>
+        <w:t xml:space="preserve">merge and dedup code, overlap and reconciliation: section 5 and</w:t>
       </w:r>
       <w:r>
         <w:t xml:space="preserve"> </w:t>
@@ -2776,8 +3836,8 @@
         <w:t xml:space="preserve">.</w:t>
       </w:r>
     </w:p>
+    <w:bookmarkEnd w:id="14"/>
     <w:bookmarkEnd w:id="15"/>
-    <w:bookmarkEnd w:id="16"/>
     <w:sectPr>
       <w:pgMar w:bottom="1080" w:footer="720" w:gutter="0" w:header="720" w:left="1080" w:right="1080" w:top="1080"/>
       <w:footnotePr>
@@ -2889,123 +3949,114 @@
       </w:pPr>
     </w:lvl>
   </w:abstractNum>
-  <w:abstractNum w:abstractNumId="99411">
-    <w:nsid w:val="00A99411"/>
+  <w:abstractNum w:abstractNumId="991">
+    <w:nsid w:val="0000A991"/>
     <w:multiLevelType w:val="multilevel"/>
     <w:lvl w:ilvl="0">
-      <w:start w:val="1"/>
-      <w:numFmt w:val="decimal"/>
-      <w:lvlText w:val="%1."/>
+      <w:numFmt w:val="bullet"/>
+      <w:lvlText w:val=""/>
       <w:lvlJc w:val="left"/>
       <w:pPr>
         <w:ind w:left="720" w:hanging="360"/>
       </w:pPr>
+      <w:rPr>
+        <w:rFonts w:ascii="Symbol" w:hAnsi="Symbol" w:cs="Symbol" w:hint="default"/>
+      </w:rPr>
     </w:lvl>
     <w:lvl w:ilvl="1">
-      <w:start w:val="1"/>
-      <w:numFmt w:val="decimal"/>
-      <w:lvlText w:val="%2."/>
+      <w:numFmt w:val="bullet"/>
+      <w:lvlText w:val="o"/>
       <w:lvlJc w:val="left"/>
       <w:pPr>
         <w:ind w:left="1440" w:hanging="360"/>
       </w:pPr>
+      <w:rPr>
+        <w:rFonts w:ascii="Courier New" w:hAnsi="Courier New" w:cs="Courier New" w:hint="default"/>
+      </w:rPr>
     </w:lvl>
     <w:lvl w:ilvl="2">
-      <w:start w:val="1"/>
-      <w:numFmt w:val="decimal"/>
-      <w:lvlText w:val="%3."/>
+      <w:numFmt w:val="bullet"/>
+      <w:lvlText w:val=""/>
       <w:lvlJc w:val="left"/>
       <w:pPr>
         <w:ind w:left="2160" w:hanging="360"/>
       </w:pPr>
+      <w:rPr>
+        <w:rFonts w:ascii="Wingdings" w:hAnsi="Wingdings" w:cs="Wingdings" w:hint="default"/>
+      </w:rPr>
     </w:lvl>
     <w:lvl w:ilvl="3">
-      <w:start w:val="1"/>
-      <w:numFmt w:val="decimal"/>
-      <w:lvlText w:val="%4."/>
+      <w:numFmt w:val="bullet"/>
+      <w:lvlText w:val=""/>
       <w:lvlJc w:val="left"/>
       <w:pPr>
         <w:ind w:left="2880" w:hanging="360"/>
       </w:pPr>
+      <w:rPr>
+        <w:rFonts w:ascii="Symbol" w:hAnsi="Symbol" w:cs="Symbol" w:hint="default"/>
+      </w:rPr>
     </w:lvl>
     <w:lvl w:ilvl="4">
-      <w:start w:val="1"/>
-      <w:numFmt w:val="decimal"/>
-      <w:lvlText w:val="%5."/>
+      <w:numFmt w:val="bullet"/>
+      <w:lvlText w:val="o"/>
       <w:lvlJc w:val="left"/>
       <w:pPr>
         <w:ind w:left="3600" w:hanging="360"/>
       </w:pPr>
+      <w:rPr>
+        <w:rFonts w:ascii="Courier New" w:hAnsi="Courier New" w:cs="Courier New" w:hint="default"/>
+      </w:rPr>
     </w:lvl>
     <w:lvl w:ilvl="5">
-      <w:start w:val="1"/>
-      <w:numFmt w:val="decimal"/>
-      <w:lvlText w:val="%6."/>
+      <w:numFmt w:val="bullet"/>
+      <w:lvlText w:val=""/>
       <w:lvlJc w:val="left"/>
       <w:pPr>
         <w:ind w:left="4320" w:hanging="360"/>
       </w:pPr>
+      <w:rPr>
+        <w:rFonts w:ascii="Wingdings" w:hAnsi="Wingdings" w:cs="Wingdings" w:hint="default"/>
+      </w:rPr>
     </w:lvl>
     <w:lvl w:ilvl="6">
-      <w:start w:val="1"/>
-      <w:numFmt w:val="decimal"/>
-      <w:lvlText w:val="%7."/>
+      <w:numFmt w:val="bullet"/>
+      <w:lvlText w:val=""/>
       <w:lvlJc w:val="left"/>
       <w:pPr>
         <w:ind w:left="5040" w:hanging="360"/>
       </w:pPr>
+      <w:rPr>
+        <w:rFonts w:ascii="Symbol" w:hAnsi="Symbol" w:cs="Symbol" w:hint="default"/>
+      </w:rPr>
     </w:lvl>
     <w:lvl w:ilvl="7">
-      <w:start w:val="1"/>
-      <w:numFmt w:val="decimal"/>
-      <w:lvlText w:val="%8."/>
+      <w:numFmt w:val="bullet"/>
+      <w:lvlText w:val="o"/>
       <w:lvlJc w:val="left"/>
       <w:pPr>
         <w:ind w:left="5760" w:hanging="360"/>
       </w:pPr>
+      <w:rPr>
+        <w:rFonts w:ascii="Courier New" w:hAnsi="Courier New" w:cs="Courier New" w:hint="default"/>
+      </w:rPr>
     </w:lvl>
     <w:lvl w:ilvl="8">
-      <w:start w:val="1"/>
-      <w:numFmt w:val="decimal"/>
-      <w:lvlText w:val="%9."/>
+      <w:numFmt w:val="bullet"/>
+      <w:lvlText w:val=""/>
       <w:lvlJc w:val="left"/>
       <w:pPr>
         <w:ind w:left="6480" w:hanging="360"/>
       </w:pPr>
+      <w:rPr>
+        <w:rFonts w:ascii="Wingdings" w:hAnsi="Wingdings" w:cs="Wingdings" w:hint="default"/>
+      </w:rPr>
     </w:lvl>
   </w:abstractNum>
   <w:num w:numId="1000">
     <w:abstractNumId w:val="990"/>
   </w:num>
   <w:num w:numId="1001">
-    <w:abstractNumId w:val="99411"/>
-    <w:lvlOverride w:ilvl="0">
-      <w:startOverride w:val="1"/>
-    </w:lvlOverride>
-    <w:lvlOverride w:ilvl="1">
-      <w:startOverride w:val="1"/>
-    </w:lvlOverride>
-    <w:lvlOverride w:ilvl="2">
-      <w:startOverride w:val="1"/>
-    </w:lvlOverride>
-    <w:lvlOverride w:ilvl="3">
-      <w:startOverride w:val="1"/>
-    </w:lvlOverride>
-    <w:lvlOverride w:ilvl="4">
-      <w:startOverride w:val="1"/>
-    </w:lvlOverride>
-    <w:lvlOverride w:ilvl="5">
-      <w:startOverride w:val="1"/>
-    </w:lvlOverride>
-    <w:lvlOverride w:ilvl="6">
-      <w:startOverride w:val="1"/>
-    </w:lvlOverride>
-    <w:lvlOverride w:ilvl="7">
-      <w:startOverride w:val="1"/>
-    </w:lvlOverride>
-    <w:lvlOverride w:ilvl="8">
-      <w:startOverride w:val="1"/>
-    </w:lvlOverride>
+    <w:abstractNumId w:val="991"/>
   </w:num>
 </w:numbering>
 </file>

</xml_diff>

<commit_message>
The report's own table was still counting the 304 the export had stopped shipping
The attribution table read 3,399,562 against an increment of 3,399,258, and the
difference was exactly the records the export now diffs out against his annual
files. `report_figures.py` was still asking our ingested copy of the baseline, so
the report described a population the archive does not contain. It applies the
same diff now, and the table total and the increment are one number.

The merge section also read "0 are already in the baseline and are excluded",
which is a sentence about nothing. At zero it now says what the zero means: not
one submitted record is already his, because the export checks his files before it
writes.
</commit_message>
<xml_diff>
--- a/docs/report.docx
+++ b/docs/report.docx
@@ -2,7 +2,7 @@
 <file path=word/document.xml><?xml version="1.0" encoding="utf-8"?>
 <w:document xmlns:w="http://schemas.openxmlformats.org/wordprocessingml/2006/main" xmlns:m="http://schemas.openxmlformats.org/officeDocument/2006/math" xmlns:r="http://schemas.openxmlformats.org/officeDocument/2006/relationships" xmlns:o="urn:schemas-microsoft-com:office:office" xmlns:v="urn:schemas-microsoft-com:vml" xmlns:w10="urn:schemas-microsoft-com:office:word" xmlns:a="http://schemas.openxmlformats.org/drawingml/2006/main" xmlns:pic="http://schemas.openxmlformats.org/drawingml/2006/picture" xmlns:wp="http://schemas.openxmlformats.org/drawingml/2006/wordprocessingDrawing">
   <w:body>
-    <w:bookmarkStart w:id="14" w:name="internet-digital-ark-round-9"/>
+    <w:bookmarkStart w:id="15" w:name="internet-digital-ark-round-9"/>
     <w:p>
       <w:pPr>
         <w:pStyle w:val="Heading1"/>
@@ -265,7 +265,7 @@
         <w:pStyle w:val="BodyText"/>
       </w:pPr>
       <w:r>
-        <w:t xml:space="preserve">91,472 records (65,738.2990 EE) are registrable domains in</w:t>
+        <w:t xml:space="preserve">91,168 records (65,738.2990 EE) are registrable domains in</w:t>
       </w:r>
       <w:r>
         <w:t xml:space="preserve"> </w:t>
@@ -304,13 +304,13 @@
         <w:t xml:space="preserve"> </w:t>
       </w:r>
       <w:r>
-        <w:t xml:space="preserve">the baseline, and either set can be merged or discarded whole. The increment covers 85,238</w:t>
-      </w:r>
-      <w:r>
-        <w:t xml:space="preserve"> </w:t>
-      </w:r>
-      <w:r>
-        <w:t xml:space="preserve">distinct domains, 45,206 of which appear in none of your six files in any year.</w:t>
+        <w:t xml:space="preserve">the baseline, and either set can be merged or discarded whole. The increment covers 84,942</w:t>
+      </w:r>
+      <w:r>
+        <w:t xml:space="preserve"> </w:t>
+      </w:r>
+      <w:r>
+        <w:t xml:space="preserve">distinct domains, 44,919 of which appear in none of your six files in any year.</w:t>
       </w:r>
     </w:p>
     <w:tbl>
@@ -593,7 +593,7 @@
               <w:jc w:val="right"/>
             </w:pPr>
             <w:r>
-              <w:t xml:space="preserve">20,233</w:t>
+              <w:t xml:space="preserve">20,232</w:t>
             </w:r>
           </w:p>
         </w:tc>
@@ -642,7 +642,7 @@
               <w:jc w:val="right"/>
             </w:pPr>
             <w:r>
-              <w:t xml:space="preserve">39,739</w:t>
+              <w:t xml:space="preserve">39,436</w:t>
             </w:r>
           </w:p>
         </w:tc>
@@ -699,7 +699,7 @@
                 <w:b/>
                 <w:bCs/>
               </w:rPr>
-              <w:t xml:space="preserve">91,472</w:t>
+              <w:t xml:space="preserve">91,168</w:t>
             </w:r>
           </w:p>
         </w:tc>
@@ -1152,19 +1152,19 @@
               <w:jc w:val="right"/>
             </w:pPr>
             <w:r>
-              <w:t xml:space="preserve">30,632</w:t>
-            </w:r>
-          </w:p>
-        </w:tc>
-        <w:tc>
-          <w:tcPr/>
-          <w:p>
-            <w:pPr>
-              <w:pStyle w:val="Compact"/>
-              <w:jc w:val="right"/>
-            </w:pPr>
-            <w:r>
-              <w:t xml:space="preserve">30,239</w:t>
+              <w:t xml:space="preserve">30,343</w:t>
+            </w:r>
+          </w:p>
+        </w:tc>
+        <w:tc>
+          <w:tcPr/>
+          <w:p>
+            <w:pPr>
+              <w:pStyle w:val="Compact"/>
+              <w:jc w:val="right"/>
+            </w:pPr>
+            <w:r>
+              <w:t xml:space="preserve">29,954</w:t>
             </w:r>
           </w:p>
         </w:tc>
@@ -1472,19 +1472,19 @@
               <w:jc w:val="right"/>
             </w:pPr>
             <w:r>
-              <w:t xml:space="preserve">11,418</w:t>
-            </w:r>
-          </w:p>
-        </w:tc>
-        <w:tc>
-          <w:tcPr/>
-          <w:p>
-            <w:pPr>
-              <w:pStyle w:val="Compact"/>
-              <w:jc w:val="right"/>
-            </w:pPr>
-            <w:r>
-              <w:t xml:space="preserve">7,077</w:t>
+              <w:t xml:space="preserve">11,413</w:t>
+            </w:r>
+          </w:p>
+        </w:tc>
+        <w:tc>
+          <w:tcPr/>
+          <w:p>
+            <w:pPr>
+              <w:pStyle w:val="Compact"/>
+              <w:jc w:val="right"/>
+            </w:pPr>
+            <w:r>
+              <w:t xml:space="preserve">7,074</w:t>
             </w:r>
           </w:p>
         </w:tc>
@@ -1792,19 +1792,19 @@
               <w:jc w:val="right"/>
             </w:pPr>
             <w:r>
-              <w:t xml:space="preserve">5,828</w:t>
-            </w:r>
-          </w:p>
-        </w:tc>
-        <w:tc>
-          <w:tcPr/>
-          <w:p>
-            <w:pPr>
-              <w:pStyle w:val="Compact"/>
-              <w:jc w:val="right"/>
-            </w:pPr>
-            <w:r>
-              <w:t xml:space="preserve">3,027</w:t>
+              <w:t xml:space="preserve">5,826</w:t>
+            </w:r>
+          </w:p>
+        </w:tc>
+        <w:tc>
+          <w:tcPr/>
+          <w:p>
+            <w:pPr>
+              <w:pStyle w:val="Compact"/>
+              <w:jc w:val="right"/>
+            </w:pPr>
+            <w:r>
+              <w:t xml:space="preserve">3,026</w:t>
             </w:r>
           </w:p>
         </w:tc>
@@ -1922,19 +1922,19 @@
               <w:jc w:val="right"/>
             </w:pPr>
             <w:r>
-              <w:t xml:space="preserve">2,786</w:t>
-            </w:r>
-          </w:p>
-        </w:tc>
-        <w:tc>
-          <w:tcPr/>
-          <w:p>
-            <w:pPr>
-              <w:pStyle w:val="Compact"/>
-              <w:jc w:val="right"/>
-            </w:pPr>
-            <w:r>
-              <w:t xml:space="preserve">1,249</w:t>
+              <w:t xml:space="preserve">2,778</w:t>
+            </w:r>
+          </w:p>
+        </w:tc>
+        <w:tc>
+          <w:tcPr/>
+          <w:p>
+            <w:pPr>
+              <w:pStyle w:val="Compact"/>
+              <w:jc w:val="right"/>
+            </w:pPr>
+            <w:r>
+              <w:t xml:space="preserve">1,244</w:t>
             </w:r>
           </w:p>
         </w:tc>
@@ -1983,7 +1983,7 @@
                 <w:b/>
                 <w:bCs/>
               </w:rPr>
-              <w:t xml:space="preserve">3,399,562</w:t>
+              <w:t xml:space="preserve">3,399,258</w:t>
             </w:r>
           </w:p>
         </w:tc>
@@ -1999,7 +1999,7 @@
                 <w:b/>
                 <w:bCs/>
               </w:rPr>
-              <w:t xml:space="preserve">1,875,273</w:t>
+              <w:t xml:space="preserve">1,874,979</w:t>
             </w:r>
           </w:p>
         </w:tc>
@@ -2010,25 +2010,25 @@
         <w:pStyle w:val="BodyText"/>
       </w:pPr>
       <w:r>
-        <w:t xml:space="preserve">The table counts every record submitted; the increment in section 1 is smaller because it excludes</w:t>
-      </w:r>
-      <w:r>
-        <w:t xml:space="preserve"> </w:t>
-      </w:r>
-      <w:r>
-        <w:t xml:space="preserve">the few your baseline already holds, which section 4 counts. Every stamp above is machine-written</w:t>
-      </w:r>
-      <w:r>
-        <w:t xml:space="preserve"> </w:t>
-      </w:r>
-      <w:r>
-        <w:t xml:space="preserve">and inside the artifact, so no human judgement dates a year, and the middle column says which stamp</w:t>
-      </w:r>
-      <w:r>
-        <w:t xml:space="preserve"> </w:t>
-      </w:r>
-      <w:r>
-        <w:t xml:space="preserve">for every source.</w:t>
+        <w:t xml:space="preserve">Every stamp above is machine-written and inside the artifact, so no human judgement dates a year,</w:t>
+      </w:r>
+      <w:r>
+        <w:t xml:space="preserve"> </w:t>
+      </w:r>
+      <w:r>
+        <w:t xml:space="preserve">and the middle column says which stamp for every source. Nothing in this table is a record your</w:t>
+      </w:r>
+      <w:r>
+        <w:t xml:space="preserve"> </w:t>
+      </w:r>
+      <w:r>
+        <w:t xml:space="preserve">baseline already holds: the export diffs every shipped list against your own six annual files, so</w:t>
+      </w:r>
+      <w:r>
+        <w:t xml:space="preserve"> </w:t>
+      </w:r>
+      <w:r>
+        <w:t xml:space="preserve">the overlap in section 5 is zero by construction.</w:t>
       </w:r>
     </w:p>
     <w:p>
@@ -2142,13 +2142,13 @@
       </w:r>
     </w:p>
     <w:bookmarkEnd w:id="10"/>
-    <w:bookmarkStart w:id="11" w:name="the-candidate-track"/>
+    <w:bookmarkStart w:id="11" w:name="the-candidate-track-counted-the-same-way"/>
     <w:p>
       <w:pPr>
         <w:pStyle w:val="Heading2"/>
       </w:pPr>
       <w:r>
-        <w:t xml:space="preserve">3. The candidate track</w:t>
+        <w:t xml:space="preserve">3. The candidate track, counted the same way</w:t>
       </w:r>
     </w:p>
     <w:p>
@@ -2156,7 +2156,19 @@
         <w:pStyle w:val="FirstParagraph"/>
       </w:pPr>
       <w:r>
-        <w:t xml:space="preserve">2,279,755 domains carry no evidence that earns them a year. They ship as</w:t>
+        <w:t xml:space="preserve">You score candidates separately and at the same rate, so this is a contribution and is held to the</w:t>
+      </w:r>
+      <w:r>
+        <w:t xml:space="preserve"> </w:t>
+      </w:r>
+      <w:r>
+        <w:t xml:space="preserve">same standard as the annual one: a name your files already carry is not an addition. Every</w:t>
+      </w:r>
+      <w:r>
+        <w:t xml:space="preserve"> </w:t>
+      </w:r>
+      <w:r>
+        <w:t xml:space="preserve">candidate collection we hold is unioned into one pool, then diffed against your</w:t>
       </w:r>
       <w:r>
         <w:t xml:space="preserve"> </w:t>
@@ -2165,128 +2177,13 @@
         <w:rPr>
           <w:rStyle w:val="VerbatimChar"/>
         </w:rPr>
-        <w:t xml:space="preserve">candidates.txt</w:t>
-      </w:r>
-      <w:r>
-        <w:t xml:space="preserve"> </w:t>
-      </w:r>
-      <w:r>
-        <w:t xml:space="preserve">and</w:t>
-      </w:r>
-      <w:r>
-        <w:t xml:space="preserve"> </w:t>
-      </w:r>
-      <w:r>
-        <w:t xml:space="preserve">reach no annual file. They are worth 1,582,744.5921 equivalent-English if every one were later</w:t>
-      </w:r>
-      <w:r>
-        <w:t xml:space="preserve"> </w:t>
-      </w:r>
-      <w:r>
-        <w:t xml:space="preserve">dated, which is a ceiling on future work and not a contribution to this round.</w:t>
-      </w:r>
-    </w:p>
-    <w:p>
-      <w:pPr>
-        <w:pStyle w:val="BodyText"/>
-      </w:pPr>
-      <w:r>
-        <w:rPr>
-          <w:b/>
-          <w:bCs/>
-        </w:rPr>
-        <w:t xml:space="preserve">New this round: the same pool also ships as one batch of year files,</w:t>
-      </w:r>
-      <w:r>
-        <w:rPr>
-          <w:b/>
-          <w:bCs/>
-        </w:rPr>
-        <w:t xml:space="preserve"> </w:t>
-      </w:r>
-      <w:r>
-        <w:rPr>
-          <w:rStyle w:val="VerbatimChar"/>
-          <w:b/>
-          <w:bCs/>
-        </w:rPr>
-        <w:t xml:space="preserve">candidates/&lt;year&gt;.txt</w:t>
-      </w:r>
-      <w:r>
-        <w:rPr>
-          <w:b/>
-          <w:bCs/>
-        </w:rPr>
-        <w:t xml:space="preserve">.</w:t>
-      </w:r>
-      <w:r>
-        <w:t xml:space="preserve"> </w:t>
-      </w:r>
-      <w:r>
-        <w:t xml:space="preserve">Most of these names carry a dated observation that does not promote them, chiefly a link-target row</w:t>
-      </w:r>
-      <w:r>
-        <w:t xml:space="preserve"> </w:t>
-      </w:r>
-      <w:r>
-        <w:t xml:space="preserve">naming the domain in a crawl of that year, so the year says when the name was seen rather than that</w:t>
-      </w:r>
-      <w:r>
-        <w:t xml:space="preserve"> </w:t>
-      </w:r>
-      <w:r>
-        <w:t xml:space="preserve">it existed. The files overlap and their counts must not be summed as the pool size. Nothing here is</w:t>
-      </w:r>
-      <w:r>
-        <w:t xml:space="preserve"> </w:t>
-      </w:r>
-      <w:r>
-        <w:t xml:space="preserve">new data: every name is already in</w:t>
-      </w:r>
-      <w:r>
-        <w:t xml:space="preserve"> </w:t>
-      </w:r>
-      <w:r>
-        <w:rPr>
-          <w:rStyle w:val="VerbatimChar"/>
-        </w:rPr>
-        <w:t xml:space="preserve">candidates.txt</w:t>
-      </w:r>
-      <w:r>
-        <w:t xml:space="preserve">.</w:t>
-      </w:r>
-    </w:p>
-    <w:p>
-      <w:pPr>
-        <w:pStyle w:val="BodyText"/>
-      </w:pPr>
-      <w:r>
-        <w:rPr>
-          <w:rStyle w:val="VerbatimChar"/>
-        </w:rPr>
-        <w:t xml:space="preserve">isc_survey_hostnames/</w:t>
-      </w:r>
-      <w:r>
-        <w:t xml:space="preserve"> </w:t>
-      </w:r>
-      <w:r>
-        <w:t xml:space="preserve">is the separate provenance-linked candidate collection you specified on</w:t>
-      </w:r>
-      <w:r>
-        <w:t xml:space="preserve"> </w:t>
-      </w:r>
-      <w:r>
-        <w:t xml:space="preserve">2026-09-06: 17,669,437 hostname-years with per-host provenance, in no figure above.</w:t>
-      </w:r>
-    </w:p>
-    <w:bookmarkEnd w:id="11"/>
-    <w:bookmarkStart w:id="12" w:name="merge-overlap-and-reconciliation-d3"/>
-    <w:p>
-      <w:pPr>
-        <w:pStyle w:val="Heading2"/>
-      </w:pPr>
-      <w:r>
-        <w:t xml:space="preserve">4. Merge, overlap and reconciliation (D3)</w:t>
+        <w:t xml:space="preserve">candidate_pool.txt</w:t>
+      </w:r>
+      <w:r>
+        <w:t xml:space="preserve"> </w:t>
+      </w:r>
+      <w:r>
+        <w:t xml:space="preserve">and all six annual files.</w:t>
       </w:r>
     </w:p>
     <w:tbl>
@@ -2320,19 +2217,19 @@
               <w:jc w:val="right"/>
             </w:pPr>
             <w:r>
-              <w:t xml:space="preserve">records</w:t>
-            </w:r>
-          </w:p>
-        </w:tc>
-        <w:tc>
-          <w:tcPr/>
-          <w:p>
-            <w:pPr>
-              <w:pStyle w:val="Compact"/>
-              <w:jc w:val="right"/>
-            </w:pPr>
-            <w:r>
-              <w:t xml:space="preserve">equivalent-English</w:t>
+              <w:t xml:space="preserve">Names</w:t>
+            </w:r>
+          </w:p>
+        </w:tc>
+        <w:tc>
+          <w:tcPr/>
+          <w:p>
+            <w:pPr>
+              <w:pStyle w:val="Compact"/>
+              <w:jc w:val="right"/>
+            </w:pPr>
+            <w:r>
+              <w:t xml:space="preserve">Equivalent-English</w:t>
             </w:r>
           </w:p>
         </w:tc>
@@ -2345,57 +2242,102 @@
               <w:pStyle w:val="Compact"/>
             </w:pPr>
             <w:r>
-              <w:t xml:space="preserve">baseline</w:t>
-            </w:r>
-            <w:r>
-              <w:t xml:space="preserve"> </w:t>
-            </w:r>
+              <w:t xml:space="preserve">registrable domains</w:t>
+            </w:r>
+          </w:p>
+        </w:tc>
+        <w:tc>
+          <w:tcPr/>
+          <w:p>
+            <w:pPr>
+              <w:pStyle w:val="Compact"/>
+              <w:jc w:val="right"/>
+            </w:pPr>
+            <w:r>
+              <w:t xml:space="preserve">29,327</w:t>
+            </w:r>
+          </w:p>
+        </w:tc>
+        <w:tc>
+          <w:tcPr/>
+          <w:p>
+            <w:pPr>
+              <w:pStyle w:val="Compact"/>
+              <w:jc w:val="right"/>
+            </w:pPr>
+            <w:r>
+              <w:t xml:space="preserve">4,237.1081</w:t>
+            </w:r>
+          </w:p>
+        </w:tc>
+      </w:tr>
+      <w:tr>
+        <w:tc>
+          <w:tcPr/>
+          <w:p>
+            <w:pPr>
+              <w:pStyle w:val="Compact"/>
+            </w:pPr>
+            <w:r>
+              <w:t xml:space="preserve">exact hostnames</w:t>
+            </w:r>
+          </w:p>
+        </w:tc>
+        <w:tc>
+          <w:tcPr/>
+          <w:p>
+            <w:pPr>
+              <w:pStyle w:val="Compact"/>
+              <w:jc w:val="right"/>
+            </w:pPr>
+            <w:r>
+              <w:t xml:space="preserve">13,109,834</w:t>
+            </w:r>
+          </w:p>
+        </w:tc>
+        <w:tc>
+          <w:tcPr/>
+          <w:p>
+            <w:pPr>
+              <w:pStyle w:val="Compact"/>
+              <w:jc w:val="right"/>
+            </w:pPr>
+            <w:r>
+              <w:t xml:space="preserve">6,691,826.9522</w:t>
+            </w:r>
+          </w:p>
+        </w:tc>
+      </w:tr>
+      <w:tr>
+        <w:tc>
+          <w:tcPr/>
+          <w:p>
+            <w:pPr>
+              <w:pStyle w:val="Compact"/>
+            </w:pPr>
             <w:r>
               <w:rPr>
                 <w:rStyle w:val="VerbatimChar"/>
+                <w:b/>
+                <w:bCs/>
               </w:rPr>
-              <w:t xml:space="preserve">merged260908</w:t>
-            </w:r>
-          </w:p>
-        </w:tc>
-        <w:tc>
-          <w:tcPr/>
-          <w:p>
-            <w:pPr>
-              <w:pStyle w:val="Compact"/>
-              <w:jc w:val="right"/>
-            </w:pPr>
-            <w:r>
-              <w:t xml:space="preserve">65,313,842</w:t>
-            </w:r>
-          </w:p>
-        </w:tc>
-        <w:tc>
-          <w:tcPr/>
-          <w:p>
-            <w:pPr>
-              <w:pStyle w:val="Compact"/>
-              <w:jc w:val="right"/>
-            </w:pPr>
-            <w:r>
-              <w:t xml:space="preserve">34,887,095.7393</w:t>
-            </w:r>
-          </w:p>
-        </w:tc>
-      </w:tr>
-      <w:tr>
-        <w:tc>
-          <w:tcPr/>
-          <w:p>
-            <w:pPr>
-              <w:pStyle w:val="Compact"/>
+              <w:t xml:space="preserve">candidate_additions.txt</w:t>
+            </w:r>
+          </w:p>
+        </w:tc>
+        <w:tc>
+          <w:tcPr/>
+          <w:p>
+            <w:pPr>
+              <w:pStyle w:val="Compact"/>
+              <w:jc w:val="right"/>
             </w:pPr>
             <w:r>
               <w:rPr>
                 <w:b/>
                 <w:bCs/>
               </w:rPr>
-              <w:t xml:space="preserve">accepted increment</w:t>
+              <w:t xml:space="preserve">13,139,161</w:t>
             </w:r>
           </w:p>
         </w:tc>
@@ -2411,60 +2353,7 @@
                 <w:b/>
                 <w:bCs/>
               </w:rPr>
-              <w:t xml:space="preserve">3,399,258</w:t>
-            </w:r>
-          </w:p>
-        </w:tc>
-        <w:tc>
-          <w:tcPr/>
-          <w:p>
-            <w:pPr>
-              <w:pStyle w:val="Compact"/>
-              <w:jc w:val="right"/>
-            </w:pPr>
-            <w:r>
-              <w:rPr>
-                <w:b/>
-                <w:bCs/>
-              </w:rPr>
-              <w:t xml:space="preserve">1,874,979.2367</w:t>
-            </w:r>
-          </w:p>
-        </w:tc>
-      </w:tr>
-      <w:tr>
-        <w:tc>
-          <w:tcPr/>
-          <w:p>
-            <w:pPr>
-              <w:pStyle w:val="Compact"/>
-            </w:pPr>
-            <w:r>
-              <w:t xml:space="preserve">post-merge total</w:t>
-            </w:r>
-          </w:p>
-        </w:tc>
-        <w:tc>
-          <w:tcPr/>
-          <w:p>
-            <w:pPr>
-              <w:pStyle w:val="Compact"/>
-              <w:jc w:val="right"/>
-            </w:pPr>
-            <w:r>
-              <w:t xml:space="preserve">68,713,100</w:t>
-            </w:r>
-          </w:p>
-        </w:tc>
-        <w:tc>
-          <w:tcPr/>
-          <w:p>
-            <w:pPr>
-              <w:pStyle w:val="Compact"/>
-              <w:jc w:val="right"/>
-            </w:pPr>
-            <w:r>
-              <w:t xml:space="preserve">36,762,074.9760</w:t>
+              <w:t xml:space="preserve">6,696,064.0603</w:t>
             </w:r>
           </w:p>
         </w:tc>
@@ -2475,7 +2364,7 @@
         <w:pStyle w:val="BodyText"/>
       </w:pPr>
       <w:r>
-        <w:t xml:space="preserve">Of the 3,399,562 records submitted,</w:t>
+        <w:t xml:space="preserve">That is</w:t>
       </w:r>
       <w:r>
         <w:t xml:space="preserve"> </w:t>
@@ -2485,26 +2374,74 @@
           <w:b/>
           <w:bCs/>
         </w:rPr>
-        <w:t xml:space="preserve">304 are already in the baseline</w:t>
-      </w:r>
-      <w:r>
-        <w:t xml:space="preserve"> </w:t>
-      </w:r>
-      <w:r>
-        <w:t xml:space="preserve">and are excluded, so the accepted increment above counts each remaining record once.</w:t>
-      </w:r>
-      <w:r>
-        <w:t xml:space="preserve"> </w:t>
-      </w:r>
+        <w:t xml:space="preserve">19.1935%</w:t>
+      </w:r>
+      <w:r>
+        <w:t xml:space="preserve"> </w:t>
+      </w:r>
+      <w:r>
+        <w:t xml:space="preserve">of the same equivalent-English denominator as section 1, on the track you</w:t>
+      </w:r>
+      <w:r>
+        <w:t xml:space="preserve"> </w:t>
+      </w:r>
+      <w:r>
+        <w:t xml:space="preserve">count separately, and it is never added to the annual increment.</w:t>
+      </w:r>
+    </w:p>
+    <w:p>
+      <w:pPr>
+        <w:pStyle w:val="BodyText"/>
+      </w:pPr>
       <w:r>
         <w:rPr>
           <w:b/>
           <w:bCs/>
         </w:rPr>
-        <w:t xml:space="preserve">28 of 28 reconciliation checks pass</w:t>
-      </w:r>
-      <w:r>
-        <w:t xml:space="preserve">.</w:t>
+        <w:t xml:space="preserve">Where the names came from.</w:t>
+      </w:r>
+      <w:r>
+        <w:t xml:space="preserve"> </w:t>
+      </w:r>
+      <w:r>
+        <w:t xml:space="preserve">The hostnames are the ISC Internet Domain Survey of 1996-1997, dated</w:t>
+      </w:r>
+      <w:r>
+        <w:t xml:space="preserve"> </w:t>
+      </w:r>
+      <w:r>
+        <w:t xml:space="preserve">by each edition's own code and named host by host: a DNS observation, which your 2026-09-05 ruling</w:t>
+      </w:r>
+      <w:r>
+        <w:t xml:space="preserve"> </w:t>
+      </w:r>
+      <w:r>
+        <w:t xml:space="preserve">makes candidate-only, and which promotes one host at a time when exact-host web evidence arrives.</w:t>
+      </w:r>
+      <w:r>
+        <w:t xml:space="preserve"> </w:t>
+      </w:r>
+      <w:r>
+        <w:t xml:space="preserve">The registrable names are what our own lanes turned up without an in-window stamp, chiefly hosts</w:t>
+      </w:r>
+      <w:r>
+        <w:t xml:space="preserve"> </w:t>
+      </w:r>
+      <w:r>
+        <w:t xml:space="preserve">named in Usenet posts and mail archives whose date we could not pin to a year we could defend.</w:t>
+      </w:r>
+      <w:r>
+        <w:t xml:space="preserve"> </w:t>
+      </w:r>
+      <w:r>
+        <w:rPr>
+          <w:b/>
+          <w:bCs/>
+        </w:rPr>
+        <w:t xml:space="preserve">Provenance is per name and not in this list</w:t>
+      </w:r>
+      <w:r>
+        <w:t xml:space="preserve">:</w:t>
       </w:r>
       <w:r>
         <w:t xml:space="preserve"> </w:t>
@@ -2513,13 +2450,19 @@
         <w:rPr>
           <w:rStyle w:val="VerbatimChar"/>
         </w:rPr>
-        <w:t xml:space="preserve">merge_against_baseline.py</w:t>
-      </w:r>
-      <w:r>
-        <w:t xml:space="preserve"> </w:t>
-      </w:r>
-      <w:r>
-        <w:t xml:space="preserve">unions both units into the baseline, deduplicates on the lowercased line within each year and scores every file with your own calculator; the per-check verdicts are in</w:t>
+        <w:t xml:space="preserve">provenance/</w:t>
+      </w:r>
+      <w:r>
+        <w:t xml:space="preserve"> </w:t>
+      </w:r>
+      <w:r>
+        <w:t xml:space="preserve">joins every name to the evidence row</w:t>
+      </w:r>
+      <w:r>
+        <w:t xml:space="preserve"> </w:t>
+      </w:r>
+      <w:r>
+        <w:t xml:space="preserve">behind it, and</w:t>
       </w:r>
       <w:r>
         <w:t xml:space="preserve"> </w:t>
@@ -2528,13 +2471,55 @@
         <w:rPr>
           <w:rStyle w:val="VerbatimChar"/>
         </w:rPr>
-        <w:t xml:space="preserve">audit/merge_audit_ark_*.json</w:t>
-      </w:r>
-      <w:r>
-        <w:t xml:space="preserve"> </w:t>
-      </w:r>
-      <w:r>
-        <w:t xml:space="preserve">and the per-year form in</w:t>
+        <w:t xml:space="preserve">isc_survey_hostnames/isc_survey_provenance.csv</w:t>
+      </w:r>
+      <w:r>
+        <w:t xml:space="preserve"> </w:t>
+      </w:r>
+      <w:r>
+        <w:t xml:space="preserve">carries the survey edition, source</w:t>
+      </w:r>
+      <w:r>
+        <w:t xml:space="preserve"> </w:t>
+      </w:r>
+      <w:r>
+        <w:t xml:space="preserve">file, recovery URL, record location, extraction method and target year for every hostname, which is</w:t>
+      </w:r>
+      <w:r>
+        <w:t xml:space="preserve"> </w:t>
+      </w:r>
+      <w:r>
+        <w:t xml:space="preserve">the shape you specified on 2026-09-06. That collection also still ships in its own folder; its</w:t>
+      </w:r>
+      <w:r>
+        <w:t xml:space="preserve"> </w:t>
+      </w:r>
+      <w:r>
+        <w:t xml:space="preserve">names are inside the pool above and are not counted twice.</w:t>
+      </w:r>
+    </w:p>
+    <w:p>
+      <w:pPr>
+        <w:pStyle w:val="BodyText"/>
+      </w:pPr>
+      <w:r>
+        <w:rPr>
+          <w:b/>
+          <w:bCs/>
+        </w:rPr>
+        <w:t xml:space="preserve">Our registrable pool is nearly exhausted against yours, which is worth knowing.</w:t>
+      </w:r>
+      <w:r>
+        <w:t xml:space="preserve"> </w:t>
+      </w:r>
+      <w:r>
+        <w:t xml:space="preserve">It holds</w:t>
+      </w:r>
+      <w:r>
+        <w:t xml:space="preserve"> </w:t>
+      </w:r>
+      <w:r>
+        <w:t xml:space="preserve">2,279,755 undated names and ships whole as</w:t>
       </w:r>
       <w:r>
         <w:t xml:space="preserve"> </w:t>
@@ -2543,20 +2528,35 @@
         <w:rPr>
           <w:rStyle w:val="VerbatimChar"/>
         </w:rPr>
-        <w:t xml:space="preserve">audit/merge_stats_ark_*.csv</w:t>
-      </w:r>
-      <w:r>
-        <w:t xml:space="preserve">, in your column names.</w:t>
+        <w:t xml:space="preserve">candidates.txt</w:t>
+      </w:r>
+      <w:r>
+        <w:t xml:space="preserve"> </w:t>
+      </w:r>
+      <w:r>
+        <w:t xml:space="preserve">as the working set, but only</w:t>
+      </w:r>
+      <w:r>
+        <w:t xml:space="preserve"> </w:t>
+      </w:r>
+      <w:r>
+        <w:t xml:space="preserve">29,327 of them are absent from your files. Reporting the working set as the contribution would</w:t>
+      </w:r>
+      <w:r>
+        <w:t xml:space="preserve"> </w:t>
+      </w:r>
+      <w:r>
+        <w:t xml:space="preserve">have overstated that half of the track by 78x.</w:t>
       </w:r>
     </w:p>
-    <w:bookmarkEnd w:id="12"/>
-    <w:bookmarkStart w:id="13" w:name="reproduction-and-the-four-deliverables"/>
+    <w:bookmarkEnd w:id="11"/>
+    <w:bookmarkStart w:id="12" w:name="Xe026b65939a52a3eb5d6b4dca52d28c81d5d93b"/>
     <w:p>
       <w:pPr>
         <w:pStyle w:val="Heading2"/>
       </w:pPr>
       <w:r>
-        <w:t xml:space="preserve">5. Reproduction, and the four deliverables</w:t>
+        <w:t xml:space="preserve">4. How the work runs, and what we would do next</w:t>
       </w:r>
     </w:p>
     <w:p>
@@ -2564,82 +2564,37 @@
         <w:pStyle w:val="FirstParagraph"/>
       </w:pPr>
       <w:r>
-        <w:rPr>
-          <w:rStyle w:val="VerbatimChar"/>
-        </w:rPr>
-        <w:t xml:space="preserve">README.md</w:t>
-      </w:r>
-      <w:r>
-        <w:t xml:space="preserve"> </w:t>
-      </w:r>
-      <w:r>
-        <w:t xml:space="preserve">in the archive gives the route and the file map. Every evidence row names its source,</w:t>
-      </w:r>
-      <w:r>
-        <w:t xml:space="preserve"> </w:t>
-      </w:r>
-      <w:r>
-        <w:t xml:space="preserve">evidence type, dated value, URL and extraction method;</w:t>
-      </w:r>
-      <w:r>
-        <w:t xml:space="preserve"> </w:t>
-      </w:r>
-      <w:r>
-        <w:rPr>
-          <w:rStyle w:val="VerbatimChar"/>
-        </w:rPr>
-        <w:t xml:space="preserve">additions/evidence_manifest.csv</w:t>
-      </w:r>
-      <w:r>
-        <w:t xml:space="preserve"> </w:t>
-      </w:r>
-      <w:r>
-        <w:t xml:space="preserve">and</w:t>
-      </w:r>
-      <w:r>
-        <w:t xml:space="preserve"> </w:t>
-      </w:r>
-      <w:r>
-        <w:rPr>
-          <w:rStyle w:val="VerbatimChar"/>
-        </w:rPr>
-        <w:t xml:space="preserve">hostnames/hostnames_evidence_manifest.csv</w:t>
-      </w:r>
-      <w:r>
-        <w:t xml:space="preserve"> </w:t>
-      </w:r>
-      <w:r>
-        <w:t xml:space="preserve">repeat those columns per record. Before sending, a fresh extraction of this archive was put through that route: all eleven</w:t>
-      </w:r>
-      <w:r>
-        <w:t xml:space="preserve"> </w:t>
-      </w:r>
-      <w:r>
-        <w:rPr>
-          <w:rStyle w:val="VerbatimChar"/>
-        </w:rPr>
-        <w:t xml:space="preserve">verify.sh</w:t>
-      </w:r>
-      <w:r>
-        <w:t xml:space="preserve"> </w:t>
-      </w:r>
-      <w:r>
-        <w:t xml:space="preserve">checks pass, and the tier-2 rebuild from</w:t>
-      </w:r>
-      <w:r>
-        <w:t xml:space="preserve"> </w:t>
-      </w:r>
-      <w:r>
-        <w:rPr>
-          <w:rStyle w:val="VerbatimChar"/>
-        </w:rPr>
-        <w:t xml:space="preserve">provenance/</w:t>
-      </w:r>
-      <w:r>
-        <w:t xml:space="preserve"> </w:t>
-      </w:r>
-      <w:r>
-        <w:t xml:space="preserve">reproduces every per-year count, passes the seventeen invariants and returns all twenty-one result files byte-identical to the ones shipped. Tier 3, the full replay, was not run: about 50 GB, with eight journal sets held out of the archive on size.</w:t>
+        <w:t xml:space="preserve">Two archive clients at most, ever, with an honest User-Agent naming the project and a contact, and</w:t>
+      </w:r>
+      <w:r>
+        <w:t xml:space="preserve"> </w:t>
+      </w:r>
+      <w:r>
+        <w:t xml:space="preserve">they hold the CDX channel exclusively. Beside them an autonomous research harness runs on a</w:t>
+      </w:r>
+      <w:r>
+        <w:t xml:space="preserve"> </w:t>
+      </w:r>
+      <w:r>
+        <w:t xml:space="preserve">self-hosted runner: one lane proposes sources, one prices each against a snapshot of the store, a</w:t>
+      </w:r>
+      <w:r>
+        <w:t xml:space="preserve"> </w:t>
+      </w:r>
+      <w:r>
+        <w:t xml:space="preserve">separate admitter re-derives every figure locally before anything is banked, and a re-opener</w:t>
+      </w:r>
+      <w:r>
+        <w:t xml:space="preserve"> </w:t>
+      </w:r>
+      <w:r>
+        <w:t xml:space="preserve">re-tests closed verdicts whenever a measurement screen retires. The research lanes can never write</w:t>
+      </w:r>
+      <w:r>
+        <w:t xml:space="preserve"> </w:t>
+      </w:r>
+      <w:r>
+        <w:t xml:space="preserve">to the store, which is why an agent's own figure has never decided a record.</w:t>
       </w:r>
     </w:p>
     <w:p>
@@ -2651,13 +2606,19 @@
           <w:b/>
           <w:bCs/>
         </w:rPr>
-        <w:t xml:space="preserve">D1</w:t>
-      </w:r>
-      <w:r>
-        <w:t xml:space="preserve"> </w:t>
-      </w:r>
-      <w:r>
-        <w:t xml:space="preserve">code and instructions:</w:t>
+        <w:t xml:space="preserve">No agent assigns a year, and no source reaches an annual file without a written decision.</w:t>
+      </w:r>
+      <w:r>
+        <w:t xml:space="preserve"> </w:t>
+      </w:r>
+      <w:r>
+        <w:t xml:space="preserve">A</w:t>
+      </w:r>
+      <w:r>
+        <w:t xml:space="preserve"> </w:t>
+      </w:r>
+      <w:r>
+        <w:t xml:space="preserve">year comes from a machine-written stamp inside the artifact;</w:t>
       </w:r>
       <w:r>
         <w:t xml:space="preserve"> </w:t>
@@ -2666,13 +2627,13 @@
         <w:rPr>
           <w:rStyle w:val="VerbatimChar"/>
         </w:rPr>
-        <w:t xml:space="preserve">source/source.tar.gz</w:t>
-      </w:r>
-      <w:r>
-        <w:t xml:space="preserve"> </w:t>
-      </w:r>
-      <w:r>
-        <w:t xml:space="preserve">at</w:t>
+        <w:t xml:space="preserve">ark ingest</w:t>
+      </w:r>
+      <w:r>
+        <w:t xml:space="preserve"> </w:t>
+      </w:r>
+      <w:r>
+        <w:t xml:space="preserve">refuses any class with no</w:t>
       </w:r>
       <w:r>
         <w:t xml:space="preserve"> </w:t>
@@ -2681,44 +2642,61 @@
         <w:rPr>
           <w:rStyle w:val="VerbatimChar"/>
         </w:rPr>
-        <w:t xml:space="preserve">source/COMMIT.txt</w:t>
-      </w:r>
-      <w:r>
-        <w:t xml:space="preserve">, with the autonomous</w:t>
-      </w:r>
-      <w:r>
-        <w:t xml:space="preserve"> </w:t>
-      </w:r>
-      <w:r>
-        <w:t xml:space="preserve">research loop as</w:t>
-      </w:r>
-      <w:r>
-        <w:t xml:space="preserve"> </w:t>
-      </w:r>
-      <w:r>
-        <w:rPr>
-          <w:rStyle w:val="VerbatimChar"/>
-        </w:rPr>
-        <w:t xml:space="preserve">source/fleet.tar.gz</w:t>
-      </w:r>
-      <w:r>
-        <w:t xml:space="preserve">.</w:t>
-      </w:r>
-      <w:r>
-        <w:t xml:space="preserve"> </w:t>
-      </w:r>
+        <w:t xml:space="preserve">Decision:</w:t>
+      </w:r>
+      <w:r>
+        <w:t xml:space="preserve"> </w:t>
+      </w:r>
+      <w:r>
+        <w:t xml:space="preserve">line, and it refused twice this round until the decision existed. Eighteen invariants</w:t>
+      </w:r>
+      <w:r>
+        <w:t xml:space="preserve"> </w:t>
+      </w:r>
+      <w:r>
+        <w:t xml:space="preserve">run before every commit and again inside the archive you are holding.</w:t>
+      </w:r>
+    </w:p>
+    <w:p>
+      <w:pPr>
+        <w:pStyle w:val="BodyText"/>
+      </w:pPr>
       <w:r>
         <w:rPr>
           <w:b/>
           <w:bCs/>
         </w:rPr>
-        <w:t xml:space="preserve">D2</w:t>
-      </w:r>
-      <w:r>
-        <w:t xml:space="preserve"> </w:t>
-      </w:r>
-      <w:r>
-        <w:t xml:space="preserve">experience summary:</w:t>
+        <w:t xml:space="preserve">Next, in the order we would spend the hours.</w:t>
+      </w:r>
+      <w:r>
+        <w:t xml:space="preserve"> </w:t>
+      </w:r>
+      <w:r>
+        <w:t xml:space="preserve">The server-header class at the archives it has not</w:t>
+      </w:r>
+      <w:r>
+        <w:t xml:space="preserve"> </w:t>
+      </w:r>
+      <w:r>
+        <w:t xml:space="preserve">been run against, which needs no new bandwidth. The ISP Usenet hierarchies, where the customer host</w:t>
+      </w:r>
+      <w:r>
+        <w:t xml:space="preserve"> </w:t>
+      </w:r>
+      <w:r>
+        <w:t xml:space="preserve">appears rather than the news server. Sibling national ccTLD extractions of the shape the Poland</w:t>
+      </w:r>
+      <w:r>
+        <w:t xml:space="preserve"> </w:t>
+      </w:r>
+      <w:r>
+        <w:t xml:space="preserve">index has, which exist for other countries under the same uploader. Second-level suffix namespaces</w:t>
+      </w:r>
+      <w:r>
+        <w:t xml:space="preserve"> </w:t>
+      </w:r>
+      <w:r>
+        <w:t xml:space="preserve">at hostname grain, where</w:t>
       </w:r>
       <w:r>
         <w:t xml:space="preserve"> </w:t>
@@ -2727,62 +2705,231 @@
         <w:rPr>
           <w:rStyle w:val="VerbatimChar"/>
         </w:rPr>
-        <w:t xml:space="preserve">experience-summary.md</w:t>
-      </w:r>
-      <w:r>
-        <w:t xml:space="preserve">, with</w:t>
-      </w:r>
-      <w:r>
-        <w:t xml:space="preserve"> </w:t>
-      </w:r>
-      <w:r>
-        <w:t xml:space="preserve">this round's findings in</w:t>
-      </w:r>
-      <w:r>
-        <w:t xml:space="preserve"> </w:t>
-      </w:r>
-      <w:r>
-        <w:rPr>
-          <w:rStyle w:val="VerbatimChar"/>
-        </w:rPr>
-        <w:t xml:space="preserve">findings.md</w:t>
-      </w:r>
-      <w:r>
-        <w:t xml:space="preserve">.</w:t>
-      </w:r>
-      <w:r>
-        <w:t xml:space="preserve"> </w:t>
-      </w:r>
+        <w:t xml:space="preserve">co.uk</w:t>
+      </w:r>
+      <w:r>
+        <w:t xml:space="preserve"> </w:t>
+      </w:r>
+      <w:r>
+        <w:t xml:space="preserve">alone is 3.39M index blocks and 1.2% walked. And promoting ISC</w:t>
+      </w:r>
+      <w:r>
+        <w:t xml:space="preserve"> </w:t>
+      </w:r>
+      <w:r>
+        <w:t xml:space="preserve">candidates one host at a time as exact-host web evidence arrives, which is the only route that</w:t>
+      </w:r>
+      <w:r>
+        <w:t xml:space="preserve"> </w:t>
+      </w:r>
+      <w:r>
+        <w:t xml:space="preserve">turns that 6.7 million into annual records.</w:t>
+      </w:r>
+    </w:p>
+    <w:bookmarkEnd w:id="12"/>
+    <w:bookmarkStart w:id="13" w:name="merge-overlap-and-reconciliation-d3"/>
+    <w:p>
+      <w:pPr>
+        <w:pStyle w:val="Heading2"/>
+      </w:pPr>
+      <w:r>
+        <w:t xml:space="preserve">5. Merge, overlap and reconciliation (D3)</w:t>
+      </w:r>
+    </w:p>
+    <w:tbl>
+      <w:tblPr>
+        <w:tblStyle w:val="Table"/>
+        <w:tblW w:type="auto" w:w="0"/>
+        <w:tblLook w:firstRow="1" w:lastRow="0" w:firstColumn="0" w:lastColumn="0" w:noHBand="0" w:noVBand="0" w:val="0020"/>
+      </w:tblPr>
+      <w:tblGrid>
+        <w:gridCol w:w="2640"/>
+        <w:gridCol w:w="2640"/>
+        <w:gridCol w:w="2640"/>
+      </w:tblGrid>
+      <w:tr>
+        <w:trPr>
+          <w:tblHeader w:val="on"/>
+        </w:trPr>
+        <w:tc>
+          <w:tcPr/>
+          <w:p>
+            <w:pPr>
+              <w:pStyle w:val="Compact"/>
+            </w:pPr>
+          </w:p>
+        </w:tc>
+        <w:tc>
+          <w:tcPr/>
+          <w:p>
+            <w:pPr>
+              <w:pStyle w:val="Compact"/>
+              <w:jc w:val="right"/>
+            </w:pPr>
+            <w:r>
+              <w:t xml:space="preserve">records</w:t>
+            </w:r>
+          </w:p>
+        </w:tc>
+        <w:tc>
+          <w:tcPr/>
+          <w:p>
+            <w:pPr>
+              <w:pStyle w:val="Compact"/>
+              <w:jc w:val="right"/>
+            </w:pPr>
+            <w:r>
+              <w:t xml:space="preserve">equivalent-English</w:t>
+            </w:r>
+          </w:p>
+        </w:tc>
+      </w:tr>
+      <w:tr>
+        <w:tc>
+          <w:tcPr/>
+          <w:p>
+            <w:pPr>
+              <w:pStyle w:val="Compact"/>
+            </w:pPr>
+            <w:r>
+              <w:t xml:space="preserve">baseline</w:t>
+            </w:r>
+            <w:r>
+              <w:t xml:space="preserve"> </w:t>
+            </w:r>
+            <w:r>
+              <w:rPr>
+                <w:rStyle w:val="VerbatimChar"/>
+              </w:rPr>
+              <w:t xml:space="preserve">merged260908</w:t>
+            </w:r>
+          </w:p>
+        </w:tc>
+        <w:tc>
+          <w:tcPr/>
+          <w:p>
+            <w:pPr>
+              <w:pStyle w:val="Compact"/>
+              <w:jc w:val="right"/>
+            </w:pPr>
+            <w:r>
+              <w:t xml:space="preserve">65,313,842</w:t>
+            </w:r>
+          </w:p>
+        </w:tc>
+        <w:tc>
+          <w:tcPr/>
+          <w:p>
+            <w:pPr>
+              <w:pStyle w:val="Compact"/>
+              <w:jc w:val="right"/>
+            </w:pPr>
+            <w:r>
+              <w:t xml:space="preserve">34,887,095.7393</w:t>
+            </w:r>
+          </w:p>
+        </w:tc>
+      </w:tr>
+      <w:tr>
+        <w:tc>
+          <w:tcPr/>
+          <w:p>
+            <w:pPr>
+              <w:pStyle w:val="Compact"/>
+            </w:pPr>
+            <w:r>
+              <w:rPr>
+                <w:b/>
+                <w:bCs/>
+              </w:rPr>
+              <w:t xml:space="preserve">accepted increment</w:t>
+            </w:r>
+          </w:p>
+        </w:tc>
+        <w:tc>
+          <w:tcPr/>
+          <w:p>
+            <w:pPr>
+              <w:pStyle w:val="Compact"/>
+              <w:jc w:val="right"/>
+            </w:pPr>
+            <w:r>
+              <w:rPr>
+                <w:b/>
+                <w:bCs/>
+              </w:rPr>
+              <w:t xml:space="preserve">3,399,258</w:t>
+            </w:r>
+          </w:p>
+        </w:tc>
+        <w:tc>
+          <w:tcPr/>
+          <w:p>
+            <w:pPr>
+              <w:pStyle w:val="Compact"/>
+              <w:jc w:val="right"/>
+            </w:pPr>
+            <w:r>
+              <w:rPr>
+                <w:b/>
+                <w:bCs/>
+              </w:rPr>
+              <w:t xml:space="preserve">1,874,979.2367</w:t>
+            </w:r>
+          </w:p>
+        </w:tc>
+      </w:tr>
+      <w:tr>
+        <w:tc>
+          <w:tcPr/>
+          <w:p>
+            <w:pPr>
+              <w:pStyle w:val="Compact"/>
+            </w:pPr>
+            <w:r>
+              <w:t xml:space="preserve">post-merge total</w:t>
+            </w:r>
+          </w:p>
+        </w:tc>
+        <w:tc>
+          <w:tcPr/>
+          <w:p>
+            <w:pPr>
+              <w:pStyle w:val="Compact"/>
+              <w:jc w:val="right"/>
+            </w:pPr>
+            <w:r>
+              <w:t xml:space="preserve">68,713,100</w:t>
+            </w:r>
+          </w:p>
+        </w:tc>
+        <w:tc>
+          <w:tcPr/>
+          <w:p>
+            <w:pPr>
+              <w:pStyle w:val="Compact"/>
+              <w:jc w:val="right"/>
+            </w:pPr>
+            <w:r>
+              <w:t xml:space="preserve">36,762,074.9760</w:t>
+            </w:r>
+          </w:p>
+        </w:tc>
+      </w:tr>
+    </w:tbl>
+    <w:p>
+      <w:pPr>
+        <w:pStyle w:val="BodyText"/>
+      </w:pPr>
       <w:r>
         <w:rPr>
           <w:b/>
           <w:bCs/>
         </w:rPr>
-        <w:t xml:space="preserve">D3</w:t>
-      </w:r>
-      <w:r>
-        <w:t xml:space="preserve"> </w:t>
-      </w:r>
-      <w:r>
-        <w:t xml:space="preserve">merge and dedup code, overlap and reconciliation:</w:t>
-      </w:r>
-      <w:r>
-        <w:t xml:space="preserve"> </w:t>
-      </w:r>
-      <w:r>
-        <w:t xml:space="preserve">section 4 and</w:t>
-      </w:r>
-      <w:r>
-        <w:t xml:space="preserve"> </w:t>
-      </w:r>
-      <w:r>
-        <w:rPr>
-          <w:rStyle w:val="VerbatimChar"/>
-        </w:rPr>
-        <w:t xml:space="preserve">audit/</w:t>
-      </w:r>
-      <w:r>
-        <w:t xml:space="preserve">.</w:t>
+        <w:t xml:space="preserve">Not one of the 3,399,258 records submitted is already in the baseline</w:t>
+      </w:r>
+      <w:r>
+        <w:t xml:space="preserve">, so every one of them counts exactly once: the export diffs each shipped list against your own annual files before it writes them.</w:t>
       </w:r>
       <w:r>
         <w:t xml:space="preserve"> </w:t>
@@ -2792,13 +2939,10 @@
           <w:b/>
           <w:bCs/>
         </w:rPr>
-        <w:t xml:space="preserve">D4</w:t>
-      </w:r>
-      <w:r>
-        <w:t xml:space="preserve"> </w:t>
-      </w:r>
-      <w:r>
-        <w:t xml:space="preserve">runnable metric code:</w:t>
+        <w:t xml:space="preserve">28 of 28 reconciliation checks pass</w:t>
+      </w:r>
+      <w:r>
+        <w:t xml:space="preserve">.</w:t>
       </w:r>
       <w:r>
         <w:t xml:space="preserve"> </w:t>
@@ -2807,16 +2951,13 @@
         <w:rPr>
           <w:rStyle w:val="VerbatimChar"/>
         </w:rPr>
-        <w:t xml:space="preserve">equivalent_english_domain_calculator/</w:t>
-      </w:r>
-      <w:r>
-        <w:t xml:space="preserve">, your</w:t>
-      </w:r>
-      <w:r>
-        <w:t xml:space="preserve"> </w:t>
-      </w:r>
-      <w:r>
-        <w:t xml:space="preserve">program vendored unmodified and explained in</w:t>
+        <w:t xml:space="preserve">merge_against_baseline.py</w:t>
+      </w:r>
+      <w:r>
+        <w:t xml:space="preserve"> </w:t>
+      </w:r>
+      <w:r>
+        <w:t xml:space="preserve">unions both units into the baseline, deduplicates on the lowercased line within each year and scores every file with your own calculator; the per-check verdicts are in</w:t>
       </w:r>
       <w:r>
         <w:t xml:space="preserve"> </w:t>
@@ -2825,14 +2966,311 @@
         <w:rPr>
           <w:rStyle w:val="VerbatimChar"/>
         </w:rPr>
-        <w:t xml:space="preserve">metric-explained.md</w:t>
-      </w:r>
-      <w:r>
-        <w:t xml:space="preserve">.</w:t>
+        <w:t xml:space="preserve">audit/merge_audit_ark_*.json</w:t>
+      </w:r>
+      <w:r>
+        <w:t xml:space="preserve"> </w:t>
+      </w:r>
+      <w:r>
+        <w:t xml:space="preserve">and the per-year form in</w:t>
+      </w:r>
+      <w:r>
+        <w:t xml:space="preserve"> </w:t>
+      </w:r>
+      <w:r>
+        <w:rPr>
+          <w:rStyle w:val="VerbatimChar"/>
+        </w:rPr>
+        <w:t xml:space="preserve">audit/merge_stats_ark_*.csv</w:t>
+      </w:r>
+      <w:r>
+        <w:t xml:space="preserve">, in your column names.</w:t>
       </w:r>
     </w:p>
     <w:bookmarkEnd w:id="13"/>
+    <w:bookmarkStart w:id="14" w:name="reproduction-and-the-four-deliverables"/>
+    <w:p>
+      <w:pPr>
+        <w:pStyle w:val="Heading2"/>
+      </w:pPr>
+      <w:r>
+        <w:t xml:space="preserve">6. Reproduction, and the four deliverables</w:t>
+      </w:r>
+    </w:p>
+    <w:p>
+      <w:pPr>
+        <w:pStyle w:val="FirstParagraph"/>
+      </w:pPr>
+      <w:r>
+        <w:rPr>
+          <w:rStyle w:val="VerbatimChar"/>
+        </w:rPr>
+        <w:t xml:space="preserve">README.md</w:t>
+      </w:r>
+      <w:r>
+        <w:t xml:space="preserve"> </w:t>
+      </w:r>
+      <w:r>
+        <w:t xml:space="preserve">in the archive gives the route and the file map. Every evidence row names its source,</w:t>
+      </w:r>
+      <w:r>
+        <w:t xml:space="preserve"> </w:t>
+      </w:r>
+      <w:r>
+        <w:t xml:space="preserve">evidence type, dated value, URL and extraction method;</w:t>
+      </w:r>
+      <w:r>
+        <w:t xml:space="preserve"> </w:t>
+      </w:r>
+      <w:r>
+        <w:rPr>
+          <w:rStyle w:val="VerbatimChar"/>
+        </w:rPr>
+        <w:t xml:space="preserve">additions/evidence_manifest.csv</w:t>
+      </w:r>
+      <w:r>
+        <w:t xml:space="preserve"> </w:t>
+      </w:r>
+      <w:r>
+        <w:t xml:space="preserve">and</w:t>
+      </w:r>
+      <w:r>
+        <w:t xml:space="preserve"> </w:t>
+      </w:r>
+      <w:r>
+        <w:rPr>
+          <w:rStyle w:val="VerbatimChar"/>
+        </w:rPr>
+        <w:t xml:space="preserve">hostnames/hostnames_evidence_manifest.csv</w:t>
+      </w:r>
+      <w:r>
+        <w:t xml:space="preserve"> </w:t>
+      </w:r>
+      <w:r>
+        <w:t xml:space="preserve">repeat those columns per record. Before sending, a fresh extraction of this archive was put through that route: all eleven</w:t>
+      </w:r>
+      <w:r>
+        <w:t xml:space="preserve"> </w:t>
+      </w:r>
+      <w:r>
+        <w:rPr>
+          <w:rStyle w:val="VerbatimChar"/>
+        </w:rPr>
+        <w:t xml:space="preserve">verify.sh</w:t>
+      </w:r>
+      <w:r>
+        <w:t xml:space="preserve"> </w:t>
+      </w:r>
+      <w:r>
+        <w:t xml:space="preserve">checks pass, and the tier-2 rebuild from</w:t>
+      </w:r>
+      <w:r>
+        <w:t xml:space="preserve"> </w:t>
+      </w:r>
+      <w:r>
+        <w:rPr>
+          <w:rStyle w:val="VerbatimChar"/>
+        </w:rPr>
+        <w:t xml:space="preserve">provenance/</w:t>
+      </w:r>
+      <w:r>
+        <w:t xml:space="preserve"> </w:t>
+      </w:r>
+      <w:r>
+        <w:t xml:space="preserve">reproduces every per-year count, passes the seventeen invariants and returns all twenty-one result files byte-identical to the ones shipped. Tier 3, the full replay, was not run: about 50 GB, with eight journal sets held out of the archive on size.</w:t>
+      </w:r>
+    </w:p>
+    <w:p>
+      <w:pPr>
+        <w:pStyle w:val="BodyText"/>
+      </w:pPr>
+      <w:r>
+        <w:rPr>
+          <w:b/>
+          <w:bCs/>
+        </w:rPr>
+        <w:t xml:space="preserve">D1</w:t>
+      </w:r>
+      <w:r>
+        <w:t xml:space="preserve"> </w:t>
+      </w:r>
+      <w:r>
+        <w:t xml:space="preserve">code and instructions:</w:t>
+      </w:r>
+      <w:r>
+        <w:t xml:space="preserve"> </w:t>
+      </w:r>
+      <w:r>
+        <w:rPr>
+          <w:rStyle w:val="VerbatimChar"/>
+        </w:rPr>
+        <w:t xml:space="preserve">source/source.tar.gz</w:t>
+      </w:r>
+      <w:r>
+        <w:t xml:space="preserve"> </w:t>
+      </w:r>
+      <w:r>
+        <w:t xml:space="preserve">at</w:t>
+      </w:r>
+      <w:r>
+        <w:t xml:space="preserve"> </w:t>
+      </w:r>
+      <w:r>
+        <w:rPr>
+          <w:rStyle w:val="VerbatimChar"/>
+        </w:rPr>
+        <w:t xml:space="preserve">source/COMMIT.txt</w:t>
+      </w:r>
+      <w:r>
+        <w:t xml:space="preserve">, with the autonomous</w:t>
+      </w:r>
+      <w:r>
+        <w:t xml:space="preserve"> </w:t>
+      </w:r>
+      <w:r>
+        <w:t xml:space="preserve">research loop as</w:t>
+      </w:r>
+      <w:r>
+        <w:t xml:space="preserve"> </w:t>
+      </w:r>
+      <w:r>
+        <w:rPr>
+          <w:rStyle w:val="VerbatimChar"/>
+        </w:rPr>
+        <w:t xml:space="preserve">source/fleet.tar.gz</w:t>
+      </w:r>
+      <w:r>
+        <w:t xml:space="preserve">.</w:t>
+      </w:r>
+      <w:r>
+        <w:t xml:space="preserve"> </w:t>
+      </w:r>
+      <w:r>
+        <w:rPr>
+          <w:b/>
+          <w:bCs/>
+        </w:rPr>
+        <w:t xml:space="preserve">D2</w:t>
+      </w:r>
+      <w:r>
+        <w:t xml:space="preserve"> </w:t>
+      </w:r>
+      <w:r>
+        <w:t xml:space="preserve">experience summary:</w:t>
+      </w:r>
+      <w:r>
+        <w:t xml:space="preserve"> </w:t>
+      </w:r>
+      <w:r>
+        <w:rPr>
+          <w:rStyle w:val="VerbatimChar"/>
+        </w:rPr>
+        <w:t xml:space="preserve">experience-summary.md</w:t>
+      </w:r>
+      <w:r>
+        <w:t xml:space="preserve">, with</w:t>
+      </w:r>
+      <w:r>
+        <w:t xml:space="preserve"> </w:t>
+      </w:r>
+      <w:r>
+        <w:t xml:space="preserve">this round's findings in</w:t>
+      </w:r>
+      <w:r>
+        <w:t xml:space="preserve"> </w:t>
+      </w:r>
+      <w:r>
+        <w:rPr>
+          <w:rStyle w:val="VerbatimChar"/>
+        </w:rPr>
+        <w:t xml:space="preserve">findings.md</w:t>
+      </w:r>
+      <w:r>
+        <w:t xml:space="preserve">.</w:t>
+      </w:r>
+      <w:r>
+        <w:t xml:space="preserve"> </w:t>
+      </w:r>
+      <w:r>
+        <w:rPr>
+          <w:b/>
+          <w:bCs/>
+        </w:rPr>
+        <w:t xml:space="preserve">D3</w:t>
+      </w:r>
+      <w:r>
+        <w:t xml:space="preserve"> </w:t>
+      </w:r>
+      <w:r>
+        <w:t xml:space="preserve">merge and dedup code, overlap and reconciliation:</w:t>
+      </w:r>
+      <w:r>
+        <w:t xml:space="preserve"> </w:t>
+      </w:r>
+      <w:r>
+        <w:t xml:space="preserve">section 5 and</w:t>
+      </w:r>
+      <w:r>
+        <w:t xml:space="preserve"> </w:t>
+      </w:r>
+      <w:r>
+        <w:rPr>
+          <w:rStyle w:val="VerbatimChar"/>
+        </w:rPr>
+        <w:t xml:space="preserve">audit/</w:t>
+      </w:r>
+      <w:r>
+        <w:t xml:space="preserve">.</w:t>
+      </w:r>
+      <w:r>
+        <w:t xml:space="preserve"> </w:t>
+      </w:r>
+      <w:r>
+        <w:rPr>
+          <w:b/>
+          <w:bCs/>
+        </w:rPr>
+        <w:t xml:space="preserve">D4</w:t>
+      </w:r>
+      <w:r>
+        <w:t xml:space="preserve"> </w:t>
+      </w:r>
+      <w:r>
+        <w:t xml:space="preserve">runnable metric code:</w:t>
+      </w:r>
+      <w:r>
+        <w:t xml:space="preserve"> </w:t>
+      </w:r>
+      <w:r>
+        <w:rPr>
+          <w:rStyle w:val="VerbatimChar"/>
+        </w:rPr>
+        <w:t xml:space="preserve">equivalent_english_domain_calculator/</w:t>
+      </w:r>
+      <w:r>
+        <w:t xml:space="preserve">, your</w:t>
+      </w:r>
+      <w:r>
+        <w:t xml:space="preserve"> </w:t>
+      </w:r>
+      <w:r>
+        <w:t xml:space="preserve">program vendored unmodified and explained in</w:t>
+      </w:r>
+      <w:r>
+        <w:t xml:space="preserve"> </w:t>
+      </w:r>
+      <w:r>
+        <w:rPr>
+          <w:rStyle w:val="VerbatimChar"/>
+        </w:rPr>
+        <w:t xml:space="preserve">metric-explained.md</w:t>
+      </w:r>
+      <w:r>
+        <w:t xml:space="preserve">.</w:t>
+      </w:r>
+    </w:p>
     <w:bookmarkEnd w:id="14"/>
+    <w:bookmarkEnd w:id="15"/>
     <w:sectPr>
       <w:pgMar w:bottom="1080" w:footer="720" w:gutter="0" w:header="720" w:left="1080" w:right="1080" w:top="1080"/>
       <w:footnotePr>

</xml_diff>

<commit_message>
Trim the report: the candidate and method sections cost a page between them
</commit_message>
<xml_diff>
--- a/docs/report.docx
+++ b/docs/report.docx
@@ -298,19 +298,19 @@
         <w:t xml:space="preserve">hostnames/</w:t>
       </w:r>
       <w:r>
-        <w:t xml:space="preserve">. The two are disjoint in every year, neither is in</w:t>
-      </w:r>
-      <w:r>
-        <w:t xml:space="preserve"> </w:t>
-      </w:r>
-      <w:r>
-        <w:t xml:space="preserve">the baseline, and either set can be merged or discarded whole. The increment covers 84,942</w:t>
-      </w:r>
-      <w:r>
-        <w:t xml:space="preserve"> </w:t>
-      </w:r>
-      <w:r>
-        <w:t xml:space="preserve">distinct domains, 44,919 of which appear in none of your six files in any year.</w:t>
+        <w:t xml:space="preserve">: disjoint in every year, and either set can be</w:t>
+      </w:r>
+      <w:r>
+        <w:t xml:space="preserve"> </w:t>
+      </w:r>
+      <w:r>
+        <w:t xml:space="preserve">merged or discarded whole. 84,942 distinct domains carry the increment, 44,919 of them</w:t>
+      </w:r>
+      <w:r>
+        <w:t xml:space="preserve"> </w:t>
+      </w:r>
+      <w:r>
+        <w:t xml:space="preserve">absent from your six files in every year.</w:t>
       </w:r>
     </w:p>
     <w:tbl>
@@ -2010,25 +2010,25 @@
         <w:pStyle w:val="BodyText"/>
       </w:pPr>
       <w:r>
-        <w:t xml:space="preserve">Every stamp above is machine-written and inside the artifact, so no human judgement dates a year,</w:t>
-      </w:r>
-      <w:r>
-        <w:t xml:space="preserve"> </w:t>
-      </w:r>
-      <w:r>
-        <w:t xml:space="preserve">and the middle column says which stamp for every source. Nothing in this table is a record your</w:t>
-      </w:r>
-      <w:r>
-        <w:t xml:space="preserve"> </w:t>
-      </w:r>
-      <w:r>
-        <w:t xml:space="preserve">baseline already holds: the export diffs every shipped list against your own six annual files, so</w:t>
-      </w:r>
-      <w:r>
-        <w:t xml:space="preserve"> </w:t>
-      </w:r>
-      <w:r>
-        <w:t xml:space="preserve">the overlap in section 5 is zero by construction.</w:t>
+        <w:t xml:space="preserve">Every stamp is machine-written and inside the artifact, so no human judgement dates a year, and the</w:t>
+      </w:r>
+      <w:r>
+        <w:t xml:space="preserve"> </w:t>
+      </w:r>
+      <w:r>
+        <w:t xml:space="preserve">middle column names the stamp per source. Nothing here is a record you already hold: the export</w:t>
+      </w:r>
+      <w:r>
+        <w:t xml:space="preserve"> </w:t>
+      </w:r>
+      <w:r>
+        <w:t xml:space="preserve">diffs every shipped list against your own annual files, so section 5's overlap is zero by</w:t>
+      </w:r>
+      <w:r>
+        <w:t xml:space="preserve"> </w:t>
+      </w:r>
+      <w:r>
+        <w:t xml:space="preserve">construction.</w:t>
       </w:r>
     </w:p>
     <w:p>
@@ -2040,13 +2040,10 @@
           <w:b/>
           <w:bCs/>
         </w:rPr>
-        <w:t xml:space="preserve">One class is new.</w:t>
-      </w:r>
-      <w:r>
-        <w:t xml:space="preserve"> </w:t>
-      </w:r>
-      <w:r>
-        <w:t xml:space="preserve">A server writing its own name: the</w:t>
+        <w:t xml:space="preserve">One class is new</w:t>
+      </w:r>
+      <w:r>
+        <w:t xml:space="preserve">, a server writing its own name: the</w:t>
       </w:r>
       <w:r>
         <w:t xml:space="preserve"> </w:t>
@@ -2124,21 +2121,19 @@
         <w:t xml:space="preserve"> </w:t>
       </w:r>
       <w:r>
-        <w:t xml:space="preserve">section 1 gives the exclusions and the two parsing traps that had to be caught first.</w:t>
-      </w:r>
-    </w:p>
-    <w:p>
-      <w:pPr>
-        <w:pStyle w:val="BodyText"/>
-      </w:pPr>
-      <w:r>
-        <w:t xml:space="preserve">A capture proves presence and never absence, and a server header attests the year of its own</w:t>
-      </w:r>
-      <w:r>
-        <w:t xml:space="preserve"> </w:t>
-      </w:r>
-      <w:r>
-        <w:t xml:space="preserve">message and no other, so both routes err toward omission rather than invention.</w:t>
+        <w:t xml:space="preserve">gives the exclusions and the two parsing traps caught first. A capture proves</w:t>
+      </w:r>
+      <w:r>
+        <w:t xml:space="preserve"> </w:t>
+      </w:r>
+      <w:r>
+        <w:t xml:space="preserve">presence and never absence, and a header attests its own message's year and no other, so both err</w:t>
+      </w:r>
+      <w:r>
+        <w:t xml:space="preserve"> </w:t>
+      </w:r>
+      <w:r>
+        <w:t xml:space="preserve">toward omission.</w:t>
       </w:r>
     </w:p>
     <w:bookmarkEnd w:id="10"/>
@@ -2156,19 +2151,19 @@
         <w:pStyle w:val="FirstParagraph"/>
       </w:pPr>
       <w:r>
-        <w:t xml:space="preserve">You score candidates separately and at the same rate, so this is a contribution and is held to the</w:t>
-      </w:r>
-      <w:r>
-        <w:t xml:space="preserve"> </w:t>
-      </w:r>
-      <w:r>
-        <w:t xml:space="preserve">same standard as the annual one: a name your files already carry is not an addition. Every</w:t>
-      </w:r>
-      <w:r>
-        <w:t xml:space="preserve"> </w:t>
-      </w:r>
-      <w:r>
-        <w:t xml:space="preserve">candidate collection we hold is unioned into one pool, then diffed against your</w:t>
+        <w:t xml:space="preserve">You score candidates separately, at the same rate, over the same denominator, so this is a</w:t>
+      </w:r>
+      <w:r>
+        <w:t xml:space="preserve"> </w:t>
+      </w:r>
+      <w:r>
+        <w:t xml:space="preserve">contribution and is held to the annual standard: every collection we hold unioned into one pool,</w:t>
+      </w:r>
+      <w:r>
+        <w:t xml:space="preserve"> </w:t>
+      </w:r>
+      <w:r>
+        <w:t xml:space="preserve">then diffed against your</w:t>
       </w:r>
       <w:r>
         <w:t xml:space="preserve"> </w:t>
@@ -2364,12 +2359,6 @@
         <w:pStyle w:val="BodyText"/>
       </w:pPr>
       <w:r>
-        <w:t xml:space="preserve">That is</w:t>
-      </w:r>
-      <w:r>
-        <w:t xml:space="preserve"> </w:t>
-      </w:r>
-      <w:r>
         <w:rPr>
           <w:b/>
           <w:bCs/>
@@ -2380,13 +2369,7 @@
         <w:t xml:space="preserve"> </w:t>
       </w:r>
       <w:r>
-        <w:t xml:space="preserve">of the same equivalent-English denominator as section 1, on the track you</w:t>
-      </w:r>
-      <w:r>
-        <w:t xml:space="preserve"> </w:t>
-      </w:r>
-      <w:r>
-        <w:t xml:space="preserve">count separately, and it is never added to the annual increment.</w:t>
+        <w:t xml:space="preserve">of the same denominator as section 1, never added to it.</w:t>
       </w:r>
     </w:p>
     <w:p>
@@ -2394,50 +2377,28 @@
         <w:pStyle w:val="BodyText"/>
       </w:pPr>
       <w:r>
+        <w:t xml:space="preserve">The hostnames are the ISC Internet Domain Survey of 1996-1997, dated by each edition's own code:</w:t>
+      </w:r>
+      <w:r>
+        <w:t xml:space="preserve"> </w:t>
+      </w:r>
+      <w:r>
+        <w:t xml:space="preserve">a DNS observation, which your 0905 ruling makes candidate-only and promotable one host at a time on</w:t>
+      </w:r>
+      <w:r>
+        <w:t xml:space="preserve"> </w:t>
+      </w:r>
+      <w:r>
+        <w:t xml:space="preserve">exact-host web evidence. The registrables are names our lanes found without a year we could defend.</w:t>
+      </w:r>
+      <w:r>
+        <w:t xml:space="preserve"> </w:t>
+      </w:r>
+      <w:r>
         <w:rPr>
           <w:b/>
           <w:bCs/>
         </w:rPr>
-        <w:t xml:space="preserve">Where the names came from.</w:t>
-      </w:r>
-      <w:r>
-        <w:t xml:space="preserve"> </w:t>
-      </w:r>
-      <w:r>
-        <w:t xml:space="preserve">The hostnames are the ISC Internet Domain Survey of 1996-1997, dated</w:t>
-      </w:r>
-      <w:r>
-        <w:t xml:space="preserve"> </w:t>
-      </w:r>
-      <w:r>
-        <w:t xml:space="preserve">by each edition's own code and named host by host: a DNS observation, which your 2026-09-05 ruling</w:t>
-      </w:r>
-      <w:r>
-        <w:t xml:space="preserve"> </w:t>
-      </w:r>
-      <w:r>
-        <w:t xml:space="preserve">makes candidate-only, and which promotes one host at a time when exact-host web evidence arrives.</w:t>
-      </w:r>
-      <w:r>
-        <w:t xml:space="preserve"> </w:t>
-      </w:r>
-      <w:r>
-        <w:t xml:space="preserve">The registrable names are what our own lanes turned up without an in-window stamp, chiefly hosts</w:t>
-      </w:r>
-      <w:r>
-        <w:t xml:space="preserve"> </w:t>
-      </w:r>
-      <w:r>
-        <w:t xml:space="preserve">named in Usenet posts and mail archives whose date we could not pin to a year we could defend.</w:t>
-      </w:r>
-      <w:r>
-        <w:t xml:space="preserve"> </w:t>
-      </w:r>
-      <w:r>
-        <w:rPr>
-          <w:b/>
-          <w:bCs/>
-        </w:rPr>
         <w:t xml:space="preserve">Provenance is per name and not in this list</w:t>
       </w:r>
       <w:r>
@@ -2456,13 +2417,13 @@
         <w:t xml:space="preserve"> </w:t>
       </w:r>
       <w:r>
-        <w:t xml:space="preserve">joins every name to the evidence row</w:t>
-      </w:r>
-      <w:r>
-        <w:t xml:space="preserve"> </w:t>
-      </w:r>
-      <w:r>
-        <w:t xml:space="preserve">behind it, and</w:t>
+        <w:t xml:space="preserve">joins each name to its evidence row,</w:t>
+      </w:r>
+      <w:r>
+        <w:t xml:space="preserve"> </w:t>
+      </w:r>
+      <w:r>
+        <w:t xml:space="preserve">and</w:t>
       </w:r>
       <w:r>
         <w:t xml:space="preserve"> </w:t>
@@ -2477,25 +2438,25 @@
         <w:t xml:space="preserve"> </w:t>
       </w:r>
       <w:r>
-        <w:t xml:space="preserve">carries the survey edition, source</w:t>
-      </w:r>
-      <w:r>
-        <w:t xml:space="preserve"> </w:t>
-      </w:r>
-      <w:r>
-        <w:t xml:space="preserve">file, recovery URL, record location, extraction method and target year for every hostname, which is</w:t>
-      </w:r>
-      <w:r>
-        <w:t xml:space="preserve"> </w:t>
-      </w:r>
-      <w:r>
-        <w:t xml:space="preserve">the shape you specified on 2026-09-06. That collection also still ships in its own folder; its</w:t>
-      </w:r>
-      <w:r>
-        <w:t xml:space="preserve"> </w:t>
-      </w:r>
-      <w:r>
-        <w:t xml:space="preserve">names are inside the pool above and are not counted twice.</w:t>
+        <w:t xml:space="preserve">carries the survey edition, source file,</w:t>
+      </w:r>
+      <w:r>
+        <w:t xml:space="preserve"> </w:t>
+      </w:r>
+      <w:r>
+        <w:t xml:space="preserve">recovery URL, record location, extraction method and year for every hostname, the shape you</w:t>
+      </w:r>
+      <w:r>
+        <w:t xml:space="preserve"> </w:t>
+      </w:r>
+      <w:r>
+        <w:t xml:space="preserve">specified on 2026-09-06. That folder still ships; its names are inside the pool and not counted</w:t>
+      </w:r>
+      <w:r>
+        <w:t xml:space="preserve"> </w:t>
+      </w:r>
+      <w:r>
+        <w:t xml:space="preserve">twice.</w:t>
       </w:r>
     </w:p>
     <w:p>
@@ -2503,60 +2464,29 @@
         <w:pStyle w:val="BodyText"/>
       </w:pPr>
       <w:r>
-        <w:rPr>
-          <w:b/>
-          <w:bCs/>
-        </w:rPr>
-        <w:t xml:space="preserve">Our registrable pool is nearly exhausted against yours, which is worth knowing.</w:t>
-      </w:r>
-      <w:r>
-        <w:t xml:space="preserve"> </w:t>
-      </w:r>
-      <w:r>
-        <w:t xml:space="preserve">It holds</w:t>
-      </w:r>
-      <w:r>
-        <w:t xml:space="preserve"> </w:t>
-      </w:r>
-      <w:r>
-        <w:t xml:space="preserve">2,279,755 undated names and ships whole as</w:t>
-      </w:r>
-      <w:r>
-        <w:t xml:space="preserve"> </w:t>
-      </w:r>
-      <w:r>
-        <w:rPr>
-          <w:rStyle w:val="VerbatimChar"/>
-        </w:rPr>
-        <w:t xml:space="preserve">candidates.txt</w:t>
-      </w:r>
-      <w:r>
-        <w:t xml:space="preserve"> </w:t>
-      </w:r>
-      <w:r>
-        <w:t xml:space="preserve">as the working set, but only</w:t>
-      </w:r>
-      <w:r>
-        <w:t xml:space="preserve"> </w:t>
-      </w:r>
-      <w:r>
-        <w:t xml:space="preserve">29,327 of them are absent from your files. Reporting the working set as the contribution would</w:t>
-      </w:r>
-      <w:r>
-        <w:t xml:space="preserve"> </w:t>
-      </w:r>
-      <w:r>
-        <w:t xml:space="preserve">have overstated that half of the track by 78x.</w:t>
+        <w:t xml:space="preserve">One measurement worth passing on: our working pool holds 2,279,755 undated names, of which</w:t>
+      </w:r>
+      <w:r>
+        <w:t xml:space="preserve"> </w:t>
+      </w:r>
+      <w:r>
+        <w:t xml:space="preserve">29,327 are absent from your files. Shipping a working set as a contribution would have</w:t>
+      </w:r>
+      <w:r>
+        <w:t xml:space="preserve"> </w:t>
+      </w:r>
+      <w:r>
+        <w:t xml:space="preserve">overstated that half of the track by 78x.</w:t>
       </w:r>
     </w:p>
     <w:bookmarkEnd w:id="11"/>
-    <w:bookmarkStart w:id="12" w:name="Xe026b65939a52a3eb5d6b4dca52d28c81d5d93b"/>
+    <w:bookmarkStart w:id="12" w:name="how-the-work-runs-and-where-it-goes-next"/>
     <w:p>
       <w:pPr>
         <w:pStyle w:val="Heading2"/>
       </w:pPr>
       <w:r>
-        <w:t xml:space="preserve">4. How the work runs, and what we would do next</w:t>
+        <w:t xml:space="preserve">4. How the work runs, and where it goes next</w:t>
       </w:r>
     </w:p>
     <w:p>
@@ -2570,7 +2500,7 @@
         <w:t xml:space="preserve"> </w:t>
       </w:r>
       <w:r>
-        <w:t xml:space="preserve">they hold the CDX channel exclusively. Beside them an autonomous research harness runs on a</w:t>
+        <w:t xml:space="preserve">they hold the CDX channel exclusively. An autonomous research harness runs beside them on a</w:t>
       </w:r>
       <w:r>
         <w:t xml:space="preserve"> </w:t>
@@ -2588,13 +2518,34 @@
         <w:t xml:space="preserve"> </w:t>
       </w:r>
       <w:r>
-        <w:t xml:space="preserve">re-tests closed verdicts whenever a measurement screen retires. The research lanes can never write</w:t>
-      </w:r>
-      <w:r>
-        <w:t xml:space="preserve"> </w:t>
-      </w:r>
-      <w:r>
-        <w:t xml:space="preserve">to the store, which is why an agent's own figure has never decided a record.</w:t>
+        <w:t xml:space="preserve">re-tests closed verdicts whenever a measurement screen retires.</w:t>
+      </w:r>
+      <w:r>
+        <w:t xml:space="preserve"> </w:t>
+      </w:r>
+      <w:r>
+        <w:rPr>
+          <w:b/>
+          <w:bCs/>
+        </w:rPr>
+        <w:t xml:space="preserve">The research lanes cannot write</w:t>
+      </w:r>
+      <w:r>
+        <w:rPr>
+          <w:b/>
+          <w:bCs/>
+        </w:rPr>
+        <w:t xml:space="preserve"> </w:t>
+      </w:r>
+      <w:r>
+        <w:rPr>
+          <w:b/>
+          <w:bCs/>
+        </w:rPr>
+        <w:t xml:space="preserve">to the store</w:t>
+      </w:r>
+      <w:r>
+        <w:t xml:space="preserve">, which is why an agent's own figure has never decided a record.</w:t>
       </w:r>
     </w:p>
     <w:p>
@@ -2648,13 +2599,13 @@
         <w:t xml:space="preserve"> </w:t>
       </w:r>
       <w:r>
-        <w:t xml:space="preserve">line, and it refused twice this round until the decision existed. Eighteen invariants</w:t>
-      </w:r>
-      <w:r>
-        <w:t xml:space="preserve"> </w:t>
-      </w:r>
-      <w:r>
-        <w:t xml:space="preserve">run before every commit and again inside the archive you are holding.</w:t>
+        <w:t xml:space="preserve">line and refused twice this round until one existed. Eighteen invariants run before</w:t>
+      </w:r>
+      <w:r>
+        <w:t xml:space="preserve"> </w:t>
+      </w:r>
+      <w:r>
+        <w:t xml:space="preserve">every commit and again inside this archive.</w:t>
       </w:r>
     </w:p>
     <w:p>
@@ -2662,41 +2613,25 @@
         <w:pStyle w:val="BodyText"/>
       </w:pPr>
       <w:r>
-        <w:rPr>
-          <w:b/>
-          <w:bCs/>
-        </w:rPr>
-        <w:t xml:space="preserve">Next, in the order we would spend the hours.</w:t>
-      </w:r>
-      <w:r>
-        <w:t xml:space="preserve"> </w:t>
-      </w:r>
-      <w:r>
-        <w:t xml:space="preserve">The server-header class at the archives it has not</w:t>
-      </w:r>
-      <w:r>
-        <w:t xml:space="preserve"> </w:t>
-      </w:r>
-      <w:r>
-        <w:t xml:space="preserve">been run against, which needs no new bandwidth. The ISP Usenet hierarchies, where the customer host</w:t>
-      </w:r>
-      <w:r>
-        <w:t xml:space="preserve"> </w:t>
-      </w:r>
-      <w:r>
-        <w:t xml:space="preserve">appears rather than the news server. Sibling national ccTLD extractions of the shape the Poland</w:t>
-      </w:r>
-      <w:r>
-        <w:t xml:space="preserve"> </w:t>
-      </w:r>
-      <w:r>
-        <w:t xml:space="preserve">index has, which exist for other countries under the same uploader. Second-level suffix namespaces</w:t>
-      </w:r>
-      <w:r>
-        <w:t xml:space="preserve"> </w:t>
-      </w:r>
-      <w:r>
-        <w:t xml:space="preserve">at hostname grain, where</w:t>
+        <w:t xml:space="preserve">Next, in the order we would spend the hours: the server-header class at the archives it has not</w:t>
+      </w:r>
+      <w:r>
+        <w:t xml:space="preserve"> </w:t>
+      </w:r>
+      <w:r>
+        <w:t xml:space="preserve">been run against, which needs no new bandwidth; the ISP Usenet hierarchies, where the customer host</w:t>
+      </w:r>
+      <w:r>
+        <w:t xml:space="preserve"> </w:t>
+      </w:r>
+      <w:r>
+        <w:t xml:space="preserve">appears rather than the news server; sibling national ccTLD extractions of the shape the Poland</w:t>
+      </w:r>
+      <w:r>
+        <w:t xml:space="preserve"> </w:t>
+      </w:r>
+      <w:r>
+        <w:t xml:space="preserve">index has; second-level suffix namespaces at hostname grain, where</w:t>
       </w:r>
       <w:r>
         <w:t xml:space="preserve"> </w:t>
@@ -2711,19 +2646,19 @@
         <w:t xml:space="preserve"> </w:t>
       </w:r>
       <w:r>
-        <w:t xml:space="preserve">alone is 3.39M index blocks and 1.2% walked. And promoting ISC</w:t>
-      </w:r>
-      <w:r>
-        <w:t xml:space="preserve"> </w:t>
-      </w:r>
-      <w:r>
-        <w:t xml:space="preserve">candidates one host at a time as exact-host web evidence arrives, which is the only route that</w:t>
-      </w:r>
-      <w:r>
-        <w:t xml:space="preserve"> </w:t>
-      </w:r>
-      <w:r>
-        <w:t xml:space="preserve">turns that 6.7 million into annual records.</w:t>
+        <w:t xml:space="preserve">alone is 3.39M index</w:t>
+      </w:r>
+      <w:r>
+        <w:t xml:space="preserve"> </w:t>
+      </w:r>
+      <w:r>
+        <w:t xml:space="preserve">blocks and 1.2% walked; and promoting ISC candidates as exact-host web evidence arrives, the one</w:t>
+      </w:r>
+      <w:r>
+        <w:t xml:space="preserve"> </w:t>
+      </w:r>
+      <w:r>
+        <w:t xml:space="preserve">route that turns 6,691,826.9522 candidate equivalent-English into annual records.</w:t>
       </w:r>
     </w:p>
     <w:bookmarkEnd w:id="12"/>

</xml_diff>

<commit_message>
The report is four sections for a reader with minutes, not six
He reads on a schedule and the report was 1,615 words over six sections, so
it spent his time on prose that repeated earlier rounds: the harness
description, the next-step list twice, a candidate-track table beside its own
paragraph. It is now 1,112 words: the five figures, the per-year table, the
candidate track in one paragraph, the six sources that carry the round with
what dates each record, the merge audit, and a table saying which shipped file
answers each thing his brief asks the Word report to document. The detail did
not disappear, it moved to the files he can hand to a summariser.

The compact attribution table replaces the wide one, which cost half a page on
a column that repeats sources.md.
</commit_message>
<xml_diff>
--- a/docs/report.docx
+++ b/docs/report.docx
@@ -2,7 +2,7 @@
 <file path=word/document.xml><?xml version="1.0" encoding="utf-8"?>
 <w:document xmlns:w="http://schemas.openxmlformats.org/wordprocessingml/2006/main" xmlns:m="http://schemas.openxmlformats.org/officeDocument/2006/math" xmlns:r="http://schemas.openxmlformats.org/officeDocument/2006/relationships" xmlns:o="urn:schemas-microsoft-com:office:office" xmlns:v="urn:schemas-microsoft-com:vml" xmlns:w10="urn:schemas-microsoft-com:office:word" xmlns:a="http://schemas.openxmlformats.org/drawingml/2006/main" xmlns:pic="http://schemas.openxmlformats.org/drawingml/2006/picture" xmlns:wp="http://schemas.openxmlformats.org/drawingml/2006/wordprocessingDrawing">
   <w:body>
-    <w:bookmarkStart w:id="15" w:name="internet-digital-ark-round-9"/>
+    <w:bookmarkStart w:id="13" w:name="internet-digital-ark-round-9"/>
     <w:p>
       <w:pPr>
         <w:pStyle w:val="Heading1"/>
@@ -16,7 +16,7 @@
         <w:pStyle w:val="FirstParagraph"/>
       </w:pPr>
       <w:r>
-        <w:t xml:space="preserve">Additions to the 1996-2001 annual lists, against</w:t>
+        <w:t xml:space="preserve">Additions to the 1996-2001 annual lists and to the candidate pool, against</w:t>
       </w:r>
       <w:r>
         <w:t xml:space="preserve"> </w:t>
@@ -28,73 +28,19 @@
         <w:t xml:space="preserve">merged260908</w:t>
       </w:r>
       <w:r>
-        <w:t xml:space="preserve">. Every figure is generated from the</w:t>
-      </w:r>
-      <w:r>
-        <w:t xml:space="preserve"> </w:t>
-      </w:r>
-      <w:r>
-        <w:t xml:space="preserve">evidence store, so nothing here can disagree with the files beside it. The round's research</w:t>
-      </w:r>
-      <w:r>
-        <w:t xml:space="preserve"> </w:t>
-      </w:r>
-      <w:r>
-        <w:t xml:space="preserve">findings are in</w:t>
-      </w:r>
-      <w:r>
-        <w:t xml:space="preserve"> </w:t>
-      </w:r>
-      <w:r>
-        <w:rPr>
-          <w:rStyle w:val="VerbatimChar"/>
-        </w:rPr>
-        <w:t xml:space="preserve">findings.md</w:t>
-      </w:r>
-      <w:r>
-        <w:t xml:space="preserve">, the failures, yields and next steps in</w:t>
-      </w:r>
-      <w:r>
-        <w:t xml:space="preserve"> </w:t>
-      </w:r>
-      <w:r>
-        <w:rPr>
-          <w:rStyle w:val="VerbatimChar"/>
-        </w:rPr>
-        <w:t xml:space="preserve">experience-summary.md</w:t>
-      </w:r>
-      <w:r>
-        <w:t xml:space="preserve">, the</w:t>
-      </w:r>
-      <w:r>
-        <w:t xml:space="preserve"> </w:t>
-      </w:r>
-      <w:r>
-        <w:t xml:space="preserve">per-source receipts in</w:t>
-      </w:r>
-      <w:r>
-        <w:t xml:space="preserve"> </w:t>
-      </w:r>
-      <w:r>
-        <w:rPr>
-          <w:rStyle w:val="VerbatimChar"/>
-        </w:rPr>
-        <w:t xml:space="preserve">sources.md</w:t>
-      </w:r>
-      <w:r>
-        <w:t xml:space="preserve">, and the route through the archive in</w:t>
-      </w:r>
-      <w:r>
-        <w:t xml:space="preserve"> </w:t>
-      </w:r>
-      <w:r>
-        <w:rPr>
-          <w:rStyle w:val="VerbatimChar"/>
-        </w:rPr>
-        <w:t xml:space="preserve">README.md</w:t>
-      </w:r>
-      <w:r>
-        <w:t xml:space="preserve">.</w:t>
+        <w:t xml:space="preserve">. Every</w:t>
+      </w:r>
+      <w:r>
+        <w:t xml:space="preserve"> </w:t>
+      </w:r>
+      <w:r>
+        <w:t xml:space="preserve">figure below is generated from the evidence store, so this report cannot disagree with the files</w:t>
+      </w:r>
+      <w:r>
+        <w:t xml:space="preserve"> </w:t>
+      </w:r>
+      <w:r>
+        <w:t xml:space="preserve">beside it.</w:t>
       </w:r>
     </w:p>
     <w:bookmarkStart w:id="9" w:name="results"/>
@@ -277,16 +223,13 @@
         <w:t xml:space="preserve">additions/</w:t>
       </w:r>
       <w:r>
-        <w:t xml:space="preserve"> </w:t>
-      </w:r>
-      <w:r>
-        <w:t xml:space="preserve">and 3,308,090 (1,809,240.9377</w:t>
-      </w:r>
-      <w:r>
-        <w:t xml:space="preserve"> </w:t>
-      </w:r>
-      <w:r>
-        <w:t xml:space="preserve">EE) are hostnames beneath them in</w:t>
+        <w:t xml:space="preserve">, 3,308,090 (1,809,240.9377 EE)</w:t>
+      </w:r>
+      <w:r>
+        <w:t xml:space="preserve"> </w:t>
+      </w:r>
+      <w:r>
+        <w:t xml:space="preserve">are hostnames beneath them in</w:t>
       </w:r>
       <w:r>
         <w:t xml:space="preserve"> </w:t>
@@ -298,19 +241,19 @@
         <w:t xml:space="preserve">hostnames/</w:t>
       </w:r>
       <w:r>
-        <w:t xml:space="preserve">: disjoint in every year, and either set can be</w:t>
-      </w:r>
-      <w:r>
-        <w:t xml:space="preserve"> </w:t>
-      </w:r>
-      <w:r>
-        <w:t xml:space="preserve">merged or discarded whole. 84,942 distinct domains carry the increment, 44,919 of them</w:t>
-      </w:r>
-      <w:r>
-        <w:t xml:space="preserve"> </w:t>
-      </w:r>
-      <w:r>
-        <w:t xml:space="preserve">absent from your six files in every year.</w:t>
+        <w:t xml:space="preserve">: disjoint in every year, either set mergeable or</w:t>
+      </w:r>
+      <w:r>
+        <w:t xml:space="preserve"> </w:t>
+      </w:r>
+      <w:r>
+        <w:t xml:space="preserve">discardable whole. 44,919 of the 84,942 distinct domains carrying the increment are absent</w:t>
+      </w:r>
+      <w:r>
+        <w:t xml:space="preserve"> </w:t>
+      </w:r>
+      <w:r>
+        <w:t xml:space="preserve">from your six files in every year.</w:t>
       </w:r>
     </w:p>
     <w:tbl>
@@ -742,17 +685,147 @@
         <w:pStyle w:val="BodyText"/>
       </w:pPr>
       <w:r>
+        <w:rPr>
+          <w:b/>
+          <w:bCs/>
+        </w:rPr>
+        <w:t xml:space="preserve">The candidate track is claimed too, separately.</w:t>
+      </w:r>
+      <w:r>
+        <w:t xml:space="preserve"> </w:t>
+      </w:r>
+      <w:r>
+        <w:rPr>
+          <w:rStyle w:val="VerbatimChar"/>
+        </w:rPr>
+        <w:t xml:space="preserve">candidate_additions.txt</w:t>
+      </w:r>
+      <w:r>
+        <w:t xml:space="preserve">: 13,139,161 names,</w:t>
+      </w:r>
+      <w:r>
+        <w:t xml:space="preserve"> </w:t>
+      </w:r>
+      <w:r>
+        <w:t xml:space="preserve">6,696,064.0603 EE,</w:t>
+      </w:r>
+      <w:r>
+        <w:t xml:space="preserve"> </w:t>
+      </w:r>
+      <w:r>
+        <w:rPr>
+          <w:b/>
+          <w:bCs/>
+        </w:rPr>
+        <w:t xml:space="preserve">19.1935%</w:t>
+      </w:r>
+      <w:r>
+        <w:t xml:space="preserve"> </w:t>
+      </w:r>
+      <w:r>
+        <w:t xml:space="preserve">of the same denominator, never added to the annual increment.</w:t>
+      </w:r>
+      <w:r>
+        <w:t xml:space="preserve"> </w:t>
+      </w:r>
+      <w:r>
+        <w:t xml:space="preserve">It is net-new the way the annual files are, every collection we hold unioned into one pool and then</w:t>
+      </w:r>
+      <w:r>
+        <w:t xml:space="preserve"> </w:t>
+      </w:r>
+      <w:r>
+        <w:t xml:space="preserve">diffed against your</w:t>
+      </w:r>
+      <w:r>
+        <w:t xml:space="preserve"> </w:t>
+      </w:r>
+      <w:r>
+        <w:rPr>
+          <w:rStyle w:val="VerbatimChar"/>
+        </w:rPr>
+        <w:t xml:space="preserve">candidate_pool.txt</w:t>
+      </w:r>
+      <w:r>
+        <w:t xml:space="preserve"> </w:t>
+      </w:r>
+      <w:r>
+        <w:t xml:space="preserve">and all six annual files. 13,109,834 are ISC survey</w:t>
+      </w:r>
+      <w:r>
+        <w:t xml:space="preserve"> </w:t>
+      </w:r>
+      <w:r>
+        <w:t xml:space="preserve">hostnames, dated by each edition's own code and candidate-only under your 0905 ruling; 29,327 are</w:t>
+      </w:r>
+      <w:r>
+        <w:t xml:space="preserve"> </w:t>
+      </w:r>
+      <w:r>
+        <w:t xml:space="preserve">registrables our lanes found without a year we could defend, out of 2,279,755 undated names in</w:t>
+      </w:r>
+      <w:r>
+        <w:t xml:space="preserve"> </w:t>
+      </w:r>
+      <w:r>
+        <w:t xml:space="preserve">the working pool, so shipping the pool itself would have overstated that half 78-fold. Provenance is</w:t>
+      </w:r>
+      <w:r>
+        <w:t xml:space="preserve"> </w:t>
+      </w:r>
+      <w:r>
+        <w:t xml:space="preserve">per name and not in the list:</w:t>
+      </w:r>
+      <w:r>
+        <w:t xml:space="preserve"> </w:t>
+      </w:r>
+      <w:r>
+        <w:rPr>
+          <w:rStyle w:val="VerbatimChar"/>
+        </w:rPr>
+        <w:t xml:space="preserve">provenance/</w:t>
+      </w:r>
+      <w:r>
+        <w:t xml:space="preserve"> </w:t>
+      </w:r>
+      <w:r>
+        <w:t xml:space="preserve">and</w:t>
+      </w:r>
+      <w:r>
+        <w:t xml:space="preserve"> </w:t>
+      </w:r>
+      <w:r>
+        <w:rPr>
+          <w:rStyle w:val="VerbatimChar"/>
+        </w:rPr>
+        <w:t xml:space="preserve">isc_survey_hostnames/isc_survey_provenance.csv</w:t>
+      </w:r>
+      <w:r>
+        <w:t xml:space="preserve">,</w:t>
+      </w:r>
+      <w:r>
+        <w:t xml:space="preserve"> </w:t>
+      </w:r>
+      <w:r>
+        <w:t xml:space="preserve">in the shape you specified on 0906.</w:t>
+      </w:r>
+    </w:p>
+    <w:p>
+      <w:pPr>
+        <w:pStyle w:val="BodyText"/>
+      </w:pPr>
+      <w:r>
         <w:t xml:space="preserve">Cumulative verified percentage 80.5097%, this round at its own unverified 5.3744% and round 1 on records. Time-weighted score 18.874694 over the three rounds you scored, your own figure where you stated one. Under your 0903 rule, at the origin your round 8 divisor implies (2026-09-04 less 33 days), this round is t = 39 and adds 1.378057.</w:t>
       </w:r>
     </w:p>
     <w:bookmarkEnd w:id="9"/>
-    <w:bookmarkStart w:id="10" w:name="what-is-new-and-where-it-came-from"/>
+    <w:bookmarkStart w:id="10" w:name="Xeae89d24c1164cf3632bb0717e850d7322f24cf"/>
     <w:p>
       <w:pPr>
         <w:pStyle w:val="Heading2"/>
       </w:pPr>
       <w:r>
-        <w:t xml:space="preserve">2. What is new, and where it came from</w:t>
+        <w:t xml:space="preserve">2. Where the increment came from, and what dates each record</w:t>
       </w:r>
     </w:p>
     <w:tbl>
@@ -763,11 +836,11 @@
         <w:tblLook w:firstRow="1" w:lastRow="0" w:firstColumn="0" w:lastColumn="0" w:noHBand="0" w:noVBand="0" w:val="0020"/>
       </w:tblPr>
       <w:tblGrid>
-        <w:gridCol w:w="1403"/>
-        <w:gridCol w:w="2606"/>
-        <w:gridCol w:w="2205"/>
-        <w:gridCol w:w="902"/>
-        <w:gridCol w:w="802"/>
+        <w:gridCol w:w="2534"/>
+        <w:gridCol w:w="633"/>
+        <w:gridCol w:w="2956"/>
+        <w:gridCol w:w="950"/>
+        <w:gridCol w:w="844"/>
       </w:tblGrid>
       <w:tr>
         <w:trPr>
@@ -780,18 +853,18 @@
               <w:pStyle w:val="Compact"/>
             </w:pPr>
             <w:r>
-              <w:t xml:space="preserve">Source, unit</w:t>
-            </w:r>
-          </w:p>
-        </w:tc>
-        <w:tc>
-          <w:tcPr/>
-          <w:p>
-            <w:pPr>
-              <w:pStyle w:val="Compact"/>
-            </w:pPr>
-            <w:r>
-              <w:t xml:space="preserve">Artifact, and how it was obtained</w:t>
+              <w:t xml:space="preserve">Source</w:t>
+            </w:r>
+          </w:p>
+        </w:tc>
+        <w:tc>
+          <w:tcPr/>
+          <w:p>
+            <w:pPr>
+              <w:pStyle w:val="Compact"/>
+            </w:pPr>
+            <w:r>
+              <w:t xml:space="preserve">Unit</w:t>
             </w:r>
           </w:p>
         </w:tc>
@@ -844,34 +917,16 @@
               </w:rPr>
               <w:t xml:space="preserve">ia_cdx_domain_sweep</w:t>
             </w:r>
-            <w:r>
-              <w:t xml:space="preserve">, hostname</w:t>
-            </w:r>
-          </w:p>
-        </w:tc>
-        <w:tc>
-          <w:tcPr/>
-          <w:p>
-            <w:pPr>
-              <w:pStyle w:val="Compact"/>
-            </w:pPr>
-            <w:r>
-              <w:t xml:space="preserve">IA CDX</w:t>
-            </w:r>
-            <w:r>
-              <w:t xml:space="preserve"> </w:t>
-            </w:r>
-            <w:r>
-              <w:rPr>
-                <w:rStyle w:val="VerbatimChar"/>
-              </w:rPr>
-              <w:t xml:space="preserve">matchType=domain</w:t>
-            </w:r>
-            <w:r>
-              <w:t xml:space="preserve"> </w:t>
-            </w:r>
-            <w:r>
-              <w:t xml:space="preserve">sweeps, two clients, parents ranked by the hosts we lack</w:t>
+          </w:p>
+        </w:tc>
+        <w:tc>
+          <w:tcPr/>
+          <w:p>
+            <w:pPr>
+              <w:pStyle w:val="Compact"/>
+            </w:pPr>
+            <w:r>
+              <w:t xml:space="preserve">hostname</w:t>
             </w:r>
           </w:p>
         </w:tc>
@@ -924,52 +979,16 @@
               </w:rPr>
               <w:t xml:space="preserve">usenet_server_written_header</w:t>
             </w:r>
-            <w:r>
-              <w:t xml:space="preserve">, hostname</w:t>
-            </w:r>
-          </w:p>
-        </w:tc>
-        <w:tc>
-          <w:tcPr/>
-          <w:p>
-            <w:pPr>
-              <w:pStyle w:val="Compact"/>
-            </w:pPr>
-            <w:r>
-              <w:t xml:space="preserve">Usenet spool (IA), already held, re-read for the three headers a news server writes about itself:</w:t>
-            </w:r>
-            <w:r>
-              <w:t xml:space="preserve"> </w:t>
-            </w:r>
-            <w:r>
-              <w:rPr>
-                <w:rStyle w:val="VerbatimChar"/>
-              </w:rPr>
-              <w:t xml:space="preserve">Path:</w:t>
-            </w:r>
-            <w:r>
-              <w:t xml:space="preserve">,</w:t>
-            </w:r>
-            <w:r>
-              <w:t xml:space="preserve"> </w:t>
-            </w:r>
-            <w:r>
-              <w:rPr>
-                <w:rStyle w:val="VerbatimChar"/>
-              </w:rPr>
-              <w:t xml:space="preserve">X-Trace:</w:t>
-            </w:r>
-            <w:r>
-              <w:t xml:space="preserve">,</w:t>
-            </w:r>
-            <w:r>
-              <w:t xml:space="preserve"> </w:t>
-            </w:r>
-            <w:r>
-              <w:rPr>
-                <w:rStyle w:val="VerbatimChar"/>
-              </w:rPr>
-              <w:t xml:space="preserve">NNTP-Posting-Host:</w:t>
+          </w:p>
+        </w:tc>
+        <w:tc>
+          <w:tcPr/>
+          <w:p>
+            <w:pPr>
+              <w:pStyle w:val="Compact"/>
+            </w:pPr>
+            <w:r>
+              <w:t xml:space="preserve">hostname</w:t>
             </w:r>
           </w:p>
         </w:tc>
@@ -1037,19 +1056,16 @@
               </w:rPr>
               <w:t xml:space="preserve">usenet_body_url</w:t>
             </w:r>
-            <w:r>
-              <w:t xml:space="preserve">, hostname</w:t>
-            </w:r>
-          </w:p>
-        </w:tc>
-        <w:tc>
-          <w:tcPr/>
-          <w:p>
-            <w:pPr>
-              <w:pStyle w:val="Compact"/>
-            </w:pPr>
-            <w:r>
-              <w:t xml:space="preserve">Every non-alt Usenet hierarchy (IA), 224 GB read whole, hosts only from explicit http, https and ftp URLs in the post body</w:t>
+          </w:p>
+        </w:tc>
+        <w:tc>
+          <w:tcPr/>
+          <w:p>
+            <w:pPr>
+              <w:pStyle w:val="Compact"/>
+            </w:pPr>
+            <w:r>
+              <w:t xml:space="preserve">hostname</w:t>
             </w:r>
           </w:p>
         </w:tc>
@@ -1117,19 +1133,16 @@
               </w:rPr>
               <w:t xml:space="preserve">ia_cdx_bulk</w:t>
             </w:r>
-            <w:r>
-              <w:t xml:space="preserve">, registrable</w:t>
-            </w:r>
-          </w:p>
-        </w:tc>
-        <w:tc>
-          <w:tcPr/>
-          <w:p>
-            <w:pPr>
-              <w:pStyle w:val="Compact"/>
-            </w:pPr>
-            <w:r>
-              <w:t xml:space="preserve">IA CDX per-domain queries over bracketed year gaps and the candidate pool</w:t>
+          </w:p>
+        </w:tc>
+        <w:tc>
+          <w:tcPr/>
+          <w:p>
+            <w:pPr>
+              <w:pStyle w:val="Compact"/>
+            </w:pPr>
+            <w:r>
+              <w:t xml:space="preserve">registrable</w:t>
             </w:r>
           </w:p>
         </w:tc>
@@ -1182,19 +1195,16 @@
               </w:rPr>
               <w:t xml:space="preserve">usenet_address</w:t>
             </w:r>
-            <w:r>
-              <w:t xml:space="preserve">, registrable</w:t>
-            </w:r>
-          </w:p>
-        </w:tc>
-        <w:tc>
-          <w:tcPr/>
-          <w:p>
-            <w:pPr>
-              <w:pStyle w:val="Compact"/>
-            </w:pPr>
-            <w:r>
-              <w:t xml:space="preserve">Usenet archives (IA), sender and body addresses</w:t>
+          </w:p>
+        </w:tc>
+        <w:tc>
+          <w:tcPr/>
+          <w:p>
+            <w:pPr>
+              <w:pStyle w:val="Compact"/>
+            </w:pPr>
+            <w:r>
+              <w:t xml:space="preserve">registrable</w:t>
             </w:r>
           </w:p>
         </w:tc>
@@ -1262,34 +1272,16 @@
               </w:rPr>
               <w:t xml:space="preserve">poland_pl_extract_hostgrain</w:t>
             </w:r>
-            <w:r>
-              <w:t xml:space="preserve">, hostname</w:t>
-            </w:r>
-          </w:p>
-        </w:tc>
-        <w:tc>
-          <w:tcPr/>
-          <w:p>
-            <w:pPr>
-              <w:pStyle w:val="Compact"/>
-            </w:pPr>
-            <w:r>
-              <w:t xml:space="preserve">Poland</w:t>
-            </w:r>
-            <w:r>
-              <w:t xml:space="preserve"> </w:t>
-            </w:r>
-            <w:r>
-              <w:rPr>
-                <w:rStyle w:val="VerbatimChar"/>
-              </w:rPr>
-              <w:t xml:space="preserve">.pl</w:t>
-            </w:r>
-            <w:r>
-              <w:t xml:space="preserve"> </w:t>
-            </w:r>
-            <w:r>
-              <w:t xml:space="preserve">ccTLD extraction 2001-12-31 (IA), 19 CDX indexes, 1.24 GB, each verified against its published sha256</w:t>
+          </w:p>
+        </w:tc>
+        <w:tc>
+          <w:tcPr/>
+          <w:p>
+            <w:pPr>
+              <w:pStyle w:val="Compact"/>
+            </w:pPr>
+            <w:r>
+              <w:t xml:space="preserve">hostname</w:t>
             </w:r>
           </w:p>
         </w:tc>
@@ -1337,571 +1329,52 @@
               <w:pStyle w:val="Compact"/>
             </w:pPr>
             <w:r>
+              <w:t xml:space="preserve">14 further sources</w:t>
+            </w:r>
+          </w:p>
+        </w:tc>
+        <w:tc>
+          <w:tcPr/>
+          <w:p>
+            <w:pPr>
+              <w:pStyle w:val="Compact"/>
+            </w:pPr>
+            <w:r>
+              <w:t xml:space="preserve">both</w:t>
+            </w:r>
+          </w:p>
+        </w:tc>
+        <w:tc>
+          <w:tcPr/>
+          <w:p>
+            <w:pPr>
+              <w:pStyle w:val="Compact"/>
+            </w:pPr>
+            <w:r>
+              <w:t xml:space="preserve">one row each in</w:t>
+            </w:r>
+            <w:r>
+              <w:t xml:space="preserve"> </w:t>
+            </w:r>
+            <w:r>
               <w:rPr>
                 <w:rStyle w:val="VerbatimChar"/>
               </w:rPr>
-              <w:t xml:space="preserve">ietf_list_received_by</w:t>
-            </w:r>
-            <w:r>
-              <w:t xml:space="preserve">, hostname</w:t>
-            </w:r>
-          </w:p>
-        </w:tc>
-        <w:tc>
-          <w:tcPr/>
-          <w:p>
-            <w:pPr>
-              <w:pStyle w:val="Compact"/>
-            </w:pPr>
-            <w:r>
-              <w:t xml:space="preserve">IETF mail archive, one raw mbox per list-month</w:t>
-            </w:r>
-          </w:p>
-        </w:tc>
-        <w:tc>
-          <w:tcPr/>
-          <w:p>
-            <w:pPr>
-              <w:pStyle w:val="Compact"/>
-            </w:pPr>
-            <w:r>
-              <w:t xml:space="preserve">the message's</w:t>
+              <w:t xml:space="preserve">sources.md</w:t>
             </w:r>
             <w:r>
               <w:t xml:space="preserve"> </w:t>
             </w:r>
             <w:r>
+              <w:t xml:space="preserve">and</w:t>
+            </w:r>
+            <w:r>
+              <w:t xml:space="preserve"> </w:t>
+            </w:r>
+            <w:r>
               <w:rPr>
                 <w:rStyle w:val="VerbatimChar"/>
               </w:rPr>
-              <w:t xml:space="preserve">Date:</w:t>
-            </w:r>
-            <w:r>
-              <w:t xml:space="preserve"> </w:t>
-            </w:r>
-            <w:r>
-              <w:t xml:space="preserve">header, checked against the month the archive filed it under</w:t>
-            </w:r>
-          </w:p>
-        </w:tc>
-        <w:tc>
-          <w:tcPr/>
-          <w:p>
-            <w:pPr>
-              <w:pStyle w:val="Compact"/>
-              <w:jc w:val="right"/>
-            </w:pPr>
-            <w:r>
-              <w:t xml:space="preserve">21,465</w:t>
-            </w:r>
-          </w:p>
-        </w:tc>
-        <w:tc>
-          <w:tcPr/>
-          <w:p>
-            <w:pPr>
-              <w:pStyle w:val="Compact"/>
-              <w:jc w:val="right"/>
-            </w:pPr>
-            <w:r>
-              <w:t xml:space="preserve">11,986</w:t>
-            </w:r>
-          </w:p>
-        </w:tc>
-      </w:tr>
-      <w:tr>
-        <w:tc>
-          <w:tcPr/>
-          <w:p>
-            <w:pPr>
-              <w:pStyle w:val="Compact"/>
-            </w:pPr>
-            <w:r>
-              <w:rPr>
-                <w:rStyle w:val="VerbatimChar"/>
-              </w:rPr>
-              <w:t xml:space="preserve">usenet_body_url_hostnames</w:t>
-            </w:r>
-            <w:r>
-              <w:t xml:space="preserve">, registrable</w:t>
-            </w:r>
-          </w:p>
-        </w:tc>
-        <w:tc>
-          <w:tcPr/>
-          <w:p>
-            <w:pPr>
-              <w:pStyle w:val="Compact"/>
-            </w:pPr>
-            <w:r>
-              <w:t xml:space="preserve">the registrable half of the Usenet body-URL lane</w:t>
-            </w:r>
-          </w:p>
-        </w:tc>
-        <w:tc>
-          <w:tcPr/>
-          <w:p>
-            <w:pPr>
-              <w:pStyle w:val="Compact"/>
-            </w:pPr>
-            <w:r>
-              <w:t xml:space="preserve">the post's own machine-written</w:t>
-            </w:r>
-            <w:r>
-              <w:t xml:space="preserve"> </w:t>
-            </w:r>
-            <w:r>
-              <w:rPr>
-                <w:rStyle w:val="VerbatimChar"/>
-              </w:rPr>
-              <w:t xml:space="preserve">Date:</w:t>
-            </w:r>
-            <w:r>
-              <w:t xml:space="preserve"> </w:t>
-            </w:r>
-            <w:r>
-              <w:t xml:space="preserve">header</w:t>
-            </w:r>
-          </w:p>
-        </w:tc>
-        <w:tc>
-          <w:tcPr/>
-          <w:p>
-            <w:pPr>
-              <w:pStyle w:val="Compact"/>
-              <w:jc w:val="right"/>
-            </w:pPr>
-            <w:r>
-              <w:t xml:space="preserve">11,413</w:t>
-            </w:r>
-          </w:p>
-        </w:tc>
-        <w:tc>
-          <w:tcPr/>
-          <w:p>
-            <w:pPr>
-              <w:pStyle w:val="Compact"/>
-              <w:jc w:val="right"/>
-            </w:pPr>
-            <w:r>
-              <w:t xml:space="preserve">7,074</w:t>
-            </w:r>
-          </w:p>
-        </w:tc>
-      </w:tr>
-      <w:tr>
-        <w:tc>
-          <w:tcPr/>
-          <w:p>
-            <w:pPr>
-              <w:pStyle w:val="Compact"/>
-            </w:pPr>
-            <w:r>
-              <w:rPr>
-                <w:rStyle w:val="VerbatimChar"/>
-              </w:rPr>
-              <w:t xml:space="preserve">apache_list_received_by</w:t>
-            </w:r>
-            <w:r>
-              <w:t xml:space="preserve">, hostname</w:t>
-            </w:r>
-          </w:p>
-        </w:tc>
-        <w:tc>
-          <w:tcPr/>
-          <w:p>
-            <w:pPr>
-              <w:pStyle w:val="Compact"/>
-            </w:pPr>
-            <w:r>
-              <w:t xml:space="preserve">Apache mailing-list archive, the same clause at a second host</w:t>
-            </w:r>
-          </w:p>
-        </w:tc>
-        <w:tc>
-          <w:tcPr/>
-          <w:p>
-            <w:pPr>
-              <w:pStyle w:val="Compact"/>
-            </w:pPr>
-            <w:r>
-              <w:t xml:space="preserve">the message's</w:t>
-            </w:r>
-            <w:r>
-              <w:t xml:space="preserve"> </w:t>
-            </w:r>
-            <w:r>
-              <w:rPr>
-                <w:rStyle w:val="VerbatimChar"/>
-              </w:rPr>
-              <w:t xml:space="preserve">Date:</w:t>
-            </w:r>
-            <w:r>
-              <w:t xml:space="preserve"> </w:t>
-            </w:r>
-            <w:r>
-              <w:t xml:space="preserve">header, checked against the month the archive filed it under</w:t>
-            </w:r>
-          </w:p>
-        </w:tc>
-        <w:tc>
-          <w:tcPr/>
-          <w:p>
-            <w:pPr>
-              <w:pStyle w:val="Compact"/>
-              <w:jc w:val="right"/>
-            </w:pPr>
-            <w:r>
-              <w:t xml:space="preserve">12,669</w:t>
-            </w:r>
-          </w:p>
-        </w:tc>
-        <w:tc>
-          <w:tcPr/>
-          <w:p>
-            <w:pPr>
-              <w:pStyle w:val="Compact"/>
-              <w:jc w:val="right"/>
-            </w:pPr>
-            <w:r>
-              <w:t xml:space="preserve">7,013</w:t>
-            </w:r>
-          </w:p>
-        </w:tc>
-      </w:tr>
-      <w:tr>
-        <w:tc>
-          <w:tcPr/>
-          <w:p>
-            <w:pPr>
-              <w:pStyle w:val="Compact"/>
-            </w:pPr>
-            <w:r>
-              <w:rPr>
-                <w:rStyle w:val="VerbatimChar"/>
-              </w:rPr>
-              <w:t xml:space="preserve">usenet_bare</w:t>
-            </w:r>
-            <w:r>
-              <w:t xml:space="preserve">, registrable</w:t>
-            </w:r>
-          </w:p>
-        </w:tc>
-        <w:tc>
-          <w:tcPr/>
-          <w:p>
-            <w:pPr>
-              <w:pStyle w:val="Compact"/>
-            </w:pPr>
-            <w:r>
-              <w:t xml:space="preserve">Usenet archives (IA), bare hostnames in bodies</w:t>
-            </w:r>
-          </w:p>
-        </w:tc>
-        <w:tc>
-          <w:tcPr/>
-          <w:p>
-            <w:pPr>
-              <w:pStyle w:val="Compact"/>
-            </w:pPr>
-            <w:r>
-              <w:t xml:space="preserve">the post's</w:t>
-            </w:r>
-            <w:r>
-              <w:t xml:space="preserve"> </w:t>
-            </w:r>
-            <w:r>
-              <w:rPr>
-                <w:rStyle w:val="VerbatimChar"/>
-              </w:rPr>
-              <w:t xml:space="preserve">Date:</w:t>
-            </w:r>
-            <w:r>
-              <w:t xml:space="preserve"> </w:t>
-            </w:r>
-            <w:r>
-              <w:t xml:space="preserve">header, corroborated by a second source</w:t>
-            </w:r>
-          </w:p>
-        </w:tc>
-        <w:tc>
-          <w:tcPr/>
-          <w:p>
-            <w:pPr>
-              <w:pStyle w:val="Compact"/>
-              <w:jc w:val="right"/>
-            </w:pPr>
-            <w:r>
-              <w:t xml:space="preserve">7,520</w:t>
-            </w:r>
-          </w:p>
-        </w:tc>
-        <w:tc>
-          <w:tcPr/>
-          <w:p>
-            <w:pPr>
-              <w:pStyle w:val="Compact"/>
-              <w:jc w:val="right"/>
-            </w:pPr>
-            <w:r>
-              <w:t xml:space="preserve">4,875</w:t>
-            </w:r>
-          </w:p>
-        </w:tc>
-      </w:tr>
-      <w:tr>
-        <w:tc>
-          <w:tcPr/>
-          <w:p>
-            <w:pPr>
-              <w:pStyle w:val="Compact"/>
-            </w:pPr>
-            <w:r>
-              <w:rPr>
-                <w:rStyle w:val="VerbatimChar"/>
-              </w:rPr>
-              <w:t xml:space="preserve">arquivo_ia_cdxj_hostgrain</w:t>
-            </w:r>
-            <w:r>
-              <w:t xml:space="preserve">, hostname</w:t>
-            </w:r>
-          </w:p>
-        </w:tc>
-        <w:tc>
-          <w:tcPr/>
-          <w:p>
-            <w:pPr>
-              <w:pStyle w:val="Compact"/>
-            </w:pPr>
-            <w:r>
-              <w:t xml:space="preserve">Arquivo.pt</w:t>
-            </w:r>
-            <w:r>
-              <w:t xml:space="preserve"> </w:t>
-            </w:r>
-            <w:r>
-              <w:rPr>
-                <w:rStyle w:val="VerbatimChar"/>
-              </w:rPr>
-              <w:t xml:space="preserve">IA.cdxj</w:t>
-            </w:r>
-            <w:r>
-              <w:t xml:space="preserve"> </w:t>
-            </w:r>
-            <w:r>
-              <w:t xml:space="preserve">capture index, held since 2026-08, re-read at hostname grain</w:t>
-            </w:r>
-          </w:p>
-        </w:tc>
-        <w:tc>
-          <w:tcPr/>
-          <w:p>
-            <w:pPr>
-              <w:pStyle w:val="Compact"/>
-            </w:pPr>
-            <w:r>
-              <w:t xml:space="preserve">the row's own 14-digit capture timestamp</w:t>
-            </w:r>
-          </w:p>
-        </w:tc>
-        <w:tc>
-          <w:tcPr/>
-          <w:p>
-            <w:pPr>
-              <w:pStyle w:val="Compact"/>
-              <w:jc w:val="right"/>
-            </w:pPr>
-            <w:r>
-              <w:t xml:space="preserve">16,366</w:t>
-            </w:r>
-          </w:p>
-        </w:tc>
-        <w:tc>
-          <w:tcPr/>
-          <w:p>
-            <w:pPr>
-              <w:pStyle w:val="Compact"/>
-              <w:jc w:val="right"/>
-            </w:pPr>
-            <w:r>
-              <w:t xml:space="preserve">4,144</w:t>
-            </w:r>
-          </w:p>
-        </w:tc>
-      </w:tr>
-      <w:tr>
-        <w:tc>
-          <w:tcPr/>
-          <w:p>
-            <w:pPr>
-              <w:pStyle w:val="Compact"/>
-            </w:pPr>
-            <w:r>
-              <w:rPr>
-                <w:rStyle w:val="VerbatimChar"/>
-              </w:rPr>
-              <w:t xml:space="preserve">usenet_header_fqdn_hostnames</w:t>
-            </w:r>
-            <w:r>
-              <w:t xml:space="preserve">, registrable</w:t>
-            </w:r>
-          </w:p>
-        </w:tc>
-        <w:tc>
-          <w:tcPr/>
-          <w:p>
-            <w:pPr>
-              <w:pStyle w:val="Compact"/>
-            </w:pPr>
-            <w:r>
-              <w:t xml:space="preserve">the registrable half of the Usenet server-header lane above</w:t>
-            </w:r>
-          </w:p>
-        </w:tc>
-        <w:tc>
-          <w:tcPr/>
-          <w:p>
-            <w:pPr>
-              <w:pStyle w:val="Compact"/>
-            </w:pPr>
-            <w:r>
-              <w:t xml:space="preserve">the post's own machine-written</w:t>
-            </w:r>
-            <w:r>
-              <w:t xml:space="preserve"> </w:t>
-            </w:r>
-            <w:r>
-              <w:rPr>
-                <w:rStyle w:val="VerbatimChar"/>
-              </w:rPr>
-              <w:t xml:space="preserve">Date:</w:t>
-            </w:r>
-            <w:r>
-              <w:t xml:space="preserve"> </w:t>
-            </w:r>
-            <w:r>
-              <w:t xml:space="preserve">header</w:t>
-            </w:r>
-          </w:p>
-        </w:tc>
-        <w:tc>
-          <w:tcPr/>
-          <w:p>
-            <w:pPr>
-              <w:pStyle w:val="Compact"/>
-              <w:jc w:val="right"/>
-            </w:pPr>
-            <w:r>
-              <w:t xml:space="preserve">5,826</w:t>
-            </w:r>
-          </w:p>
-        </w:tc>
-        <w:tc>
-          <w:tcPr/>
-          <w:p>
-            <w:pPr>
-              <w:pStyle w:val="Compact"/>
-              <w:jc w:val="right"/>
-            </w:pPr>
-            <w:r>
-              <w:t xml:space="preserve">3,026</w:t>
-            </w:r>
-          </w:p>
-        </w:tc>
-      </w:tr>
-      <w:tr>
-        <w:tc>
-          <w:tcPr/>
-          <w:p>
-            <w:pPr>
-              <w:pStyle w:val="Compact"/>
-            </w:pPr>
-            <w:r>
-              <w:rPr>
-                <w:rStyle w:val="VerbatimChar"/>
-              </w:rPr>
-              <w:t xml:space="preserve">ia_cdx_gap_hostgrain</w:t>
-            </w:r>
-            <w:r>
-              <w:t xml:space="preserve">, hostname</w:t>
-            </w:r>
-          </w:p>
-        </w:tc>
-        <w:tc>
-          <w:tcPr/>
-          <w:p>
-            <w:pPr>
-              <w:pStyle w:val="Compact"/>
-            </w:pPr>
-            <w:r>
-              <w:t xml:space="preserve">IA CDX queries over bracketed year gaps, read at hostname grain</w:t>
-            </w:r>
-          </w:p>
-        </w:tc>
-        <w:tc>
-          <w:tcPr/>
-          <w:p>
-            <w:pPr>
-              <w:pStyle w:val="Compact"/>
-            </w:pPr>
-            <w:r>
-              <w:t xml:space="preserve">the row's own 14-digit capture timestamp</w:t>
-            </w:r>
-          </w:p>
-        </w:tc>
-        <w:tc>
-          <w:tcPr/>
-          <w:p>
-            <w:pPr>
-              <w:pStyle w:val="Compact"/>
-              <w:jc w:val="right"/>
-            </w:pPr>
-            <w:r>
-              <w:t xml:space="preserve">1,382</w:t>
-            </w:r>
-          </w:p>
-        </w:tc>
-        <w:tc>
-          <w:tcPr/>
-          <w:p>
-            <w:pPr>
-              <w:pStyle w:val="Compact"/>
-              <w:jc w:val="right"/>
-            </w:pPr>
-            <w:r>
-              <w:t xml:space="preserve">1,248</w:t>
-            </w:r>
-          </w:p>
-        </w:tc>
-      </w:tr>
-      <w:tr>
-        <w:tc>
-          <w:tcPr/>
-          <w:p>
-            <w:pPr>
-              <w:pStyle w:val="Compact"/>
-            </w:pPr>
-            <w:r>
-              <w:t xml:space="preserve">7 further sources</w:t>
-            </w:r>
-          </w:p>
-        </w:tc>
-        <w:tc>
-          <w:tcPr/>
-          <w:p>
-            <w:pPr>
-              <w:pStyle w:val="Compact"/>
-            </w:pPr>
-            <w:r>
-              <w:t xml:space="preserve">each under 1,000 EE, listed in</w:t>
-            </w:r>
-            <w:r>
-              <w:t xml:space="preserve"> </w:t>
-            </w:r>
-            <w:r>
-              <w:rPr>
-                <w:rStyle w:val="VerbatimChar"/>
-              </w:rPr>
               <w:t xml:space="preserve">audit/source_contribution.csv</w:t>
             </w:r>
           </w:p>
@@ -1911,30 +1384,22 @@
           <w:p>
             <w:pPr>
               <w:pStyle w:val="Compact"/>
-            </w:pPr>
-          </w:p>
-        </w:tc>
-        <w:tc>
-          <w:tcPr/>
-          <w:p>
-            <w:pPr>
-              <w:pStyle w:val="Compact"/>
-              <w:jc w:val="right"/>
-            </w:pPr>
-            <w:r>
-              <w:t xml:space="preserve">2,778</w:t>
-            </w:r>
-          </w:p>
-        </w:tc>
-        <w:tc>
-          <w:tcPr/>
-          <w:p>
-            <w:pPr>
-              <w:pStyle w:val="Compact"/>
-              <w:jc w:val="right"/>
-            </w:pPr>
-            <w:r>
-              <w:t xml:space="preserve">1,244</w:t>
+              <w:jc w:val="right"/>
+            </w:pPr>
+            <w:r>
+              <w:t xml:space="preserve">79,419</w:t>
+            </w:r>
+          </w:p>
+        </w:tc>
+        <w:tc>
+          <w:tcPr/>
+          <w:p>
+            <w:pPr>
+              <w:pStyle w:val="Compact"/>
+              <w:jc w:val="right"/>
+            </w:pPr>
+            <w:r>
+              <w:t xml:space="preserve">40,609</w:t>
             </w:r>
           </w:p>
         </w:tc>
@@ -2010,25 +1475,185 @@
         <w:pStyle w:val="BodyText"/>
       </w:pPr>
       <w:r>
-        <w:t xml:space="preserve">Every stamp is machine-written and inside the artifact, so no human judgement dates a year, and the</w:t>
-      </w:r>
-      <w:r>
-        <w:t xml:space="preserve"> </w:t>
-      </w:r>
-      <w:r>
-        <w:t xml:space="preserve">middle column names the stamp per source. Nothing here is a record you already hold: the export</w:t>
-      </w:r>
-      <w:r>
-        <w:t xml:space="preserve"> </w:t>
-      </w:r>
-      <w:r>
-        <w:t xml:space="preserve">diffs every shipped list against your own annual files, so section 5's overlap is zero by</w:t>
-      </w:r>
-      <w:r>
-        <w:t xml:space="preserve"> </w:t>
-      </w:r>
-      <w:r>
-        <w:t xml:space="preserve">construction.</w:t>
+        <w:t xml:space="preserve">Every year comes from a machine-written stamp inside the artifact, a capture timestamp or the</w:t>
+      </w:r>
+      <w:r>
+        <w:t xml:space="preserve"> </w:t>
+      </w:r>
+      <w:r>
+        <w:t xml:space="preserve">message's own</w:t>
+      </w:r>
+      <w:r>
+        <w:t xml:space="preserve"> </w:t>
+      </w:r>
+      <w:r>
+        <w:rPr>
+          <w:rStyle w:val="VerbatimChar"/>
+        </w:rPr>
+        <w:t xml:space="preserve">Date:</w:t>
+      </w:r>
+      <w:r>
+        <w:t xml:space="preserve"> </w:t>
+      </w:r>
+      <w:r>
+        <w:t xml:space="preserve">header, so no human judgement dates a record; per-record columns are in</w:t>
+      </w:r>
+      <w:r>
+        <w:t xml:space="preserve"> </w:t>
+      </w:r>
+      <w:r>
+        <w:rPr>
+          <w:rStyle w:val="VerbatimChar"/>
+        </w:rPr>
+        <w:t xml:space="preserve">additions/evidence_manifest.csv</w:t>
+      </w:r>
+      <w:r>
+        <w:t xml:space="preserve"> </w:t>
+      </w:r>
+      <w:r>
+        <w:t xml:space="preserve">and</w:t>
+      </w:r>
+      <w:r>
+        <w:t xml:space="preserve"> </w:t>
+      </w:r>
+      <w:r>
+        <w:rPr>
+          <w:rStyle w:val="VerbatimChar"/>
+        </w:rPr>
+        <w:t xml:space="preserve">hostnames/hostnames_evidence_manifest.csv</w:t>
+      </w:r>
+      <w:r>
+        <w:t xml:space="preserve">, per-source</w:t>
+      </w:r>
+      <w:r>
+        <w:t xml:space="preserve"> </w:t>
+      </w:r>
+      <w:r>
+        <w:t xml:space="preserve">reasoning in</w:t>
+      </w:r>
+      <w:r>
+        <w:t xml:space="preserve"> </w:t>
+      </w:r>
+      <w:r>
+        <w:rPr>
+          <w:rStyle w:val="VerbatimChar"/>
+        </w:rPr>
+        <w:t xml:space="preserve">sources.md</w:t>
+      </w:r>
+      <w:r>
+        <w:t xml:space="preserve">.</w:t>
+      </w:r>
+      <w:r>
+        <w:t xml:space="preserve"> </w:t>
+      </w:r>
+      <w:r>
+        <w:rPr>
+          <w:b/>
+          <w:bCs/>
+        </w:rPr>
+        <w:t xml:space="preserve">One evidence class is new: a server writing its own name.</w:t>
+      </w:r>
+      <w:r>
+        <w:t xml:space="preserve"> </w:t>
+      </w:r>
+      <w:r>
+        <w:t xml:space="preserve">The</w:t>
+      </w:r>
+      <w:r>
+        <w:t xml:space="preserve"> </w:t>
+      </w:r>
+      <w:r>
+        <w:rPr>
+          <w:rStyle w:val="VerbatimChar"/>
+        </w:rPr>
+        <w:t xml:space="preserve">Received: ... by &lt;host&gt;</w:t>
+      </w:r>
+      <w:r>
+        <w:t xml:space="preserve"> </w:t>
+      </w:r>
+      <w:r>
+        <w:t xml:space="preserve">clause you accepted last round reads the same in NNTP, so the</w:t>
+      </w:r>
+      <w:r>
+        <w:t xml:space="preserve"> </w:t>
+      </w:r>
+      <w:r>
+        <w:rPr>
+          <w:rStyle w:val="VerbatimChar"/>
+        </w:rPr>
+        <w:t xml:space="preserve">Path:</w:t>
+      </w:r>
+      <w:r>
+        <w:t xml:space="preserve">,</w:t>
+      </w:r>
+      <w:r>
+        <w:t xml:space="preserve"> </w:t>
+      </w:r>
+      <w:r>
+        <w:rPr>
+          <w:rStyle w:val="VerbatimChar"/>
+        </w:rPr>
+        <w:t xml:space="preserve">X-Trace:</w:t>
+      </w:r>
+      <w:r>
+        <w:t xml:space="preserve"> </w:t>
+      </w:r>
+      <w:r>
+        <w:t xml:space="preserve">and</w:t>
+      </w:r>
+      <w:r>
+        <w:t xml:space="preserve"> </w:t>
+      </w:r>
+      <w:r>
+        <w:rPr>
+          <w:rStyle w:val="VerbatimChar"/>
+        </w:rPr>
+        <w:t xml:space="preserve">NNTP-Posting-Host:</w:t>
+      </w:r>
+      <w:r>
+        <w:t xml:space="preserve"> </w:t>
+      </w:r>
+      <w:r>
+        <w:t xml:space="preserve">headers a news server writes about a transaction it completed</w:t>
+      </w:r>
+      <w:r>
+        <w:t xml:space="preserve"> </w:t>
+      </w:r>
+      <w:r>
+        <w:t xml:space="preserve">are admitted under the same rule and no new one. No sender-supplied field is read. That class paid</w:t>
+      </w:r>
+      <w:r>
+        <w:t xml:space="preserve"> </w:t>
+      </w:r>
+      <w:r>
+        <w:t xml:space="preserve">350,946 EE from spool already on disk, at no new bandwidth;</w:t>
+      </w:r>
+      <w:r>
+        <w:t xml:space="preserve"> </w:t>
+      </w:r>
+      <w:r>
+        <w:rPr>
+          <w:rStyle w:val="VerbatimChar"/>
+        </w:rPr>
+        <w:t xml:space="preserve">findings.md</w:t>
+      </w:r>
+      <w:r>
+        <w:t xml:space="preserve"> </w:t>
+      </w:r>
+      <w:r>
+        <w:t xml:space="preserve">gives the</w:t>
+      </w:r>
+      <w:r>
+        <w:t xml:space="preserve"> </w:t>
+      </w:r>
+      <w:r>
+        <w:t xml:space="preserve">exclusions and the two parsing traps. A capture proves presence and never absence, so both units err</w:t>
+      </w:r>
+      <w:r>
+        <w:t xml:space="preserve"> </w:t>
+      </w:r>
+      <w:r>
+        <w:t xml:space="preserve">toward omission.</w:t>
       </w:r>
     </w:p>
     <w:p>
@@ -2040,10 +1665,19 @@
           <w:b/>
           <w:bCs/>
         </w:rPr>
-        <w:t xml:space="preserve">One class is new</w:t>
-      </w:r>
-      <w:r>
-        <w:t xml:space="preserve">, a server writing its own name: the</w:t>
+        <w:t xml:space="preserve">No agent writes to the store and no agent assigns a year.</w:t>
+      </w:r>
+      <w:r>
+        <w:t xml:space="preserve"> </w:t>
+      </w:r>
+      <w:r>
+        <w:t xml:space="preserve">The research harness proposes and</w:t>
+      </w:r>
+      <w:r>
+        <w:t xml:space="preserve"> </w:t>
+      </w:r>
+      <w:r>
+        <w:t xml:space="preserve">prices sources autonomously, a separate admitter re-derives every figure before anything banks, and</w:t>
       </w:r>
       <w:r>
         <w:t xml:space="preserve"> </w:t>
@@ -2052,133 +1686,29 @@
         <w:rPr>
           <w:rStyle w:val="VerbatimChar"/>
         </w:rPr>
-        <w:t xml:space="preserve">Received: ... by &lt;host&gt;</w:t>
-      </w:r>
-      <w:r>
-        <w:t xml:space="preserve"> </w:t>
-      </w:r>
-      <w:r>
-        <w:t xml:space="preserve">clause a</w:t>
-      </w:r>
-      <w:r>
-        <w:t xml:space="preserve"> </w:t>
-      </w:r>
-      <w:r>
-        <w:t xml:space="preserve">receiving mail server writes about itself, and the</w:t>
-      </w:r>
-      <w:r>
-        <w:t xml:space="preserve"> </w:t>
-      </w:r>
-      <w:r>
-        <w:rPr>
-          <w:rStyle w:val="VerbatimChar"/>
-        </w:rPr>
-        <w:t xml:space="preserve">Path:</w:t>
-      </w:r>
-      <w:r>
-        <w:t xml:space="preserve">,</w:t>
-      </w:r>
-      <w:r>
-        <w:t xml:space="preserve"> </w:t>
-      </w:r>
-      <w:r>
-        <w:rPr>
-          <w:rStyle w:val="VerbatimChar"/>
-        </w:rPr>
-        <w:t xml:space="preserve">X-Trace:</w:t>
-      </w:r>
-      <w:r>
-        <w:t xml:space="preserve"> </w:t>
-      </w:r>
-      <w:r>
-        <w:t xml:space="preserve">and</w:t>
-      </w:r>
-      <w:r>
-        <w:t xml:space="preserve"> </w:t>
-      </w:r>
-      <w:r>
-        <w:rPr>
-          <w:rStyle w:val="VerbatimChar"/>
-        </w:rPr>
-        <w:t xml:space="preserve">NNTP-Posting-Host:</w:t>
-      </w:r>
-      <w:r>
-        <w:t xml:space="preserve"> </w:t>
-      </w:r>
-      <w:r>
-        <w:t xml:space="preserve">headers a news server writes about a transaction it completed. No sender-supplied field is read.</w:t>
-      </w:r>
-      <w:r>
-        <w:t xml:space="preserve"> </w:t>
-      </w:r>
-      <w:r>
-        <w:rPr>
-          <w:rStyle w:val="VerbatimChar"/>
-        </w:rPr>
-        <w:t xml:space="preserve">findings.md</w:t>
-      </w:r>
-      <w:r>
-        <w:t xml:space="preserve"> </w:t>
-      </w:r>
-      <w:r>
-        <w:t xml:space="preserve">gives the exclusions and the two parsing traps caught first. A capture proves</w:t>
-      </w:r>
-      <w:r>
-        <w:t xml:space="preserve"> </w:t>
-      </w:r>
-      <w:r>
-        <w:t xml:space="preserve">presence and never absence, and a header attests its own message's year and no other, so both err</w:t>
-      </w:r>
-      <w:r>
-        <w:t xml:space="preserve"> </w:t>
-      </w:r>
-      <w:r>
-        <w:t xml:space="preserve">toward omission.</w:t>
+        <w:t xml:space="preserve">ark ingest</w:t>
+      </w:r>
+      <w:r>
+        <w:t xml:space="preserve"> </w:t>
+      </w:r>
+      <w:r>
+        <w:t xml:space="preserve">refuses an evidence class with no written decision, twice this round. Eighteen</w:t>
+      </w:r>
+      <w:r>
+        <w:t xml:space="preserve"> </w:t>
+      </w:r>
+      <w:r>
+        <w:t xml:space="preserve">invariants run before every commit and again inside this archive.</w:t>
       </w:r>
     </w:p>
     <w:bookmarkEnd w:id="10"/>
-    <w:bookmarkStart w:id="11" w:name="the-candidate-track-counted-the-same-way"/>
+    <w:bookmarkStart w:id="11" w:name="merge-overlap-and-reconciliation-d3"/>
     <w:p>
       <w:pPr>
         <w:pStyle w:val="Heading2"/>
       </w:pPr>
       <w:r>
-        <w:t xml:space="preserve">3. The candidate track, counted the same way</w:t>
-      </w:r>
-    </w:p>
-    <w:p>
-      <w:pPr>
-        <w:pStyle w:val="FirstParagraph"/>
-      </w:pPr>
-      <w:r>
-        <w:t xml:space="preserve">You score candidates separately, at the same rate, over the same denominator, so this is a</w:t>
-      </w:r>
-      <w:r>
-        <w:t xml:space="preserve"> </w:t>
-      </w:r>
-      <w:r>
-        <w:t xml:space="preserve">contribution and is held to the annual standard: every collection we hold unioned into one pool,</w:t>
-      </w:r>
-      <w:r>
-        <w:t xml:space="preserve"> </w:t>
-      </w:r>
-      <w:r>
-        <w:t xml:space="preserve">then diffed against your</w:t>
-      </w:r>
-      <w:r>
-        <w:t xml:space="preserve"> </w:t>
-      </w:r>
-      <w:r>
-        <w:rPr>
-          <w:rStyle w:val="VerbatimChar"/>
-        </w:rPr>
-        <w:t xml:space="preserve">candidate_pool.txt</w:t>
-      </w:r>
-      <w:r>
-        <w:t xml:space="preserve"> </w:t>
-      </w:r>
-      <w:r>
-        <w:t xml:space="preserve">and all six annual files.</w:t>
+        <w:t xml:space="preserve">3. Merge, overlap and reconciliation (D3)</w:t>
       </w:r>
     </w:p>
     <w:tbl>
@@ -2212,19 +1742,19 @@
               <w:jc w:val="right"/>
             </w:pPr>
             <w:r>
-              <w:t xml:space="preserve">Names</w:t>
-            </w:r>
-          </w:p>
-        </w:tc>
-        <w:tc>
-          <w:tcPr/>
-          <w:p>
-            <w:pPr>
-              <w:pStyle w:val="Compact"/>
-              <w:jc w:val="right"/>
-            </w:pPr>
-            <w:r>
-              <w:t xml:space="preserve">Equivalent-English</w:t>
+              <w:t xml:space="preserve">records</w:t>
+            </w:r>
+          </w:p>
+        </w:tc>
+        <w:tc>
+          <w:tcPr/>
+          <w:p>
+            <w:pPr>
+              <w:pStyle w:val="Compact"/>
+              <w:jc w:val="right"/>
+            </w:pPr>
+            <w:r>
+              <w:t xml:space="preserve">equivalent-English</w:t>
             </w:r>
           </w:p>
         </w:tc>
@@ -2237,31 +1767,40 @@
               <w:pStyle w:val="Compact"/>
             </w:pPr>
             <w:r>
-              <w:t xml:space="preserve">registrable domains</w:t>
-            </w:r>
-          </w:p>
-        </w:tc>
-        <w:tc>
-          <w:tcPr/>
-          <w:p>
-            <w:pPr>
-              <w:pStyle w:val="Compact"/>
-              <w:jc w:val="right"/>
-            </w:pPr>
-            <w:r>
-              <w:t xml:space="preserve">29,327</w:t>
-            </w:r>
-          </w:p>
-        </w:tc>
-        <w:tc>
-          <w:tcPr/>
-          <w:p>
-            <w:pPr>
-              <w:pStyle w:val="Compact"/>
-              <w:jc w:val="right"/>
-            </w:pPr>
-            <w:r>
-              <w:t xml:space="preserve">4,237.1081</w:t>
+              <w:t xml:space="preserve">baseline</w:t>
+            </w:r>
+            <w:r>
+              <w:t xml:space="preserve"> </w:t>
+            </w:r>
+            <w:r>
+              <w:rPr>
+                <w:rStyle w:val="VerbatimChar"/>
+              </w:rPr>
+              <w:t xml:space="preserve">merged260908</w:t>
+            </w:r>
+          </w:p>
+        </w:tc>
+        <w:tc>
+          <w:tcPr/>
+          <w:p>
+            <w:pPr>
+              <w:pStyle w:val="Compact"/>
+              <w:jc w:val="right"/>
+            </w:pPr>
+            <w:r>
+              <w:t xml:space="preserve">65,313,842</w:t>
+            </w:r>
+          </w:p>
+        </w:tc>
+        <w:tc>
+          <w:tcPr/>
+          <w:p>
+            <w:pPr>
+              <w:pStyle w:val="Compact"/>
+              <w:jc w:val="right"/>
+            </w:pPr>
+            <w:r>
+              <w:t xml:space="preserve">34,887,095.7393</w:t>
             </w:r>
           </w:p>
         </w:tc>
@@ -2274,31 +1813,43 @@
               <w:pStyle w:val="Compact"/>
             </w:pPr>
             <w:r>
-              <w:t xml:space="preserve">exact hostnames</w:t>
-            </w:r>
-          </w:p>
-        </w:tc>
-        <w:tc>
-          <w:tcPr/>
-          <w:p>
-            <w:pPr>
-              <w:pStyle w:val="Compact"/>
-              <w:jc w:val="right"/>
-            </w:pPr>
-            <w:r>
-              <w:t xml:space="preserve">13,109,834</w:t>
-            </w:r>
-          </w:p>
-        </w:tc>
-        <w:tc>
-          <w:tcPr/>
-          <w:p>
-            <w:pPr>
-              <w:pStyle w:val="Compact"/>
-              <w:jc w:val="right"/>
-            </w:pPr>
-            <w:r>
-              <w:t xml:space="preserve">6,691,826.9522</w:t>
+              <w:rPr>
+                <w:b/>
+                <w:bCs/>
+              </w:rPr>
+              <w:t xml:space="preserve">accepted increment</w:t>
+            </w:r>
+          </w:p>
+        </w:tc>
+        <w:tc>
+          <w:tcPr/>
+          <w:p>
+            <w:pPr>
+              <w:pStyle w:val="Compact"/>
+              <w:jc w:val="right"/>
+            </w:pPr>
+            <w:r>
+              <w:rPr>
+                <w:b/>
+                <w:bCs/>
+              </w:rPr>
+              <w:t xml:space="preserve">3,399,258</w:t>
+            </w:r>
+          </w:p>
+        </w:tc>
+        <w:tc>
+          <w:tcPr/>
+          <w:p>
+            <w:pPr>
+              <w:pStyle w:val="Compact"/>
+              <w:jc w:val="right"/>
+            </w:pPr>
+            <w:r>
+              <w:rPr>
+                <w:b/>
+                <w:bCs/>
+              </w:rPr>
+              <w:t xml:space="preserve">1,874,979.2367</w:t>
             </w:r>
           </w:p>
         </w:tc>
@@ -2311,44 +1862,31 @@
               <w:pStyle w:val="Compact"/>
             </w:pPr>
             <w:r>
-              <w:rPr>
-                <w:rStyle w:val="VerbatimChar"/>
-                <w:b/>
-                <w:bCs/>
-              </w:rPr>
-              <w:t xml:space="preserve">candidate_additions.txt</w:t>
-            </w:r>
-          </w:p>
-        </w:tc>
-        <w:tc>
-          <w:tcPr/>
-          <w:p>
-            <w:pPr>
-              <w:pStyle w:val="Compact"/>
-              <w:jc w:val="right"/>
-            </w:pPr>
-            <w:r>
-              <w:rPr>
-                <w:b/>
-                <w:bCs/>
-              </w:rPr>
-              <w:t xml:space="preserve">13,139,161</w:t>
-            </w:r>
-          </w:p>
-        </w:tc>
-        <w:tc>
-          <w:tcPr/>
-          <w:p>
-            <w:pPr>
-              <w:pStyle w:val="Compact"/>
-              <w:jc w:val="right"/>
-            </w:pPr>
-            <w:r>
-              <w:rPr>
-                <w:b/>
-                <w:bCs/>
-              </w:rPr>
-              <w:t xml:space="preserve">6,696,064.0603</w:t>
+              <w:t xml:space="preserve">post-merge total</w:t>
+            </w:r>
+          </w:p>
+        </w:tc>
+        <w:tc>
+          <w:tcPr/>
+          <w:p>
+            <w:pPr>
+              <w:pStyle w:val="Compact"/>
+              <w:jc w:val="right"/>
+            </w:pPr>
+            <w:r>
+              <w:t xml:space="preserve">68,713,100</w:t>
+            </w:r>
+          </w:p>
+        </w:tc>
+        <w:tc>
+          <w:tcPr/>
+          <w:p>
+            <w:pPr>
+              <w:pStyle w:val="Compact"/>
+              <w:jc w:val="right"/>
+            </w:pPr>
+            <w:r>
+              <w:t xml:space="preserve">36,762,074.9760</w:t>
             </w:r>
           </w:p>
         </w:tc>
@@ -2363,33 +1901,10 @@
           <w:b/>
           <w:bCs/>
         </w:rPr>
-        <w:t xml:space="preserve">19.1935%</w:t>
-      </w:r>
-      <w:r>
-        <w:t xml:space="preserve"> </w:t>
-      </w:r>
-      <w:r>
-        <w:t xml:space="preserve">of the same denominator as section 1, never added to it.</w:t>
-      </w:r>
-    </w:p>
-    <w:p>
-      <w:pPr>
-        <w:pStyle w:val="BodyText"/>
-      </w:pPr>
-      <w:r>
-        <w:t xml:space="preserve">The hostnames are the ISC Internet Domain Survey of 1996-1997, dated by each edition's own code:</w:t>
-      </w:r>
-      <w:r>
-        <w:t xml:space="preserve"> </w:t>
-      </w:r>
-      <w:r>
-        <w:t xml:space="preserve">a DNS observation, which your 0905 ruling makes candidate-only and promotable one host at a time on</w:t>
-      </w:r>
-      <w:r>
-        <w:t xml:space="preserve"> </w:t>
-      </w:r>
-      <w:r>
-        <w:t xml:space="preserve">exact-host web evidence. The registrables are names our lanes found without a year we could defend.</w:t>
+        <w:t xml:space="preserve">Not one of the 3,399,258 records submitted is already in the baseline</w:t>
+      </w:r>
+      <w:r>
+        <w:t xml:space="preserve">, so every one of them counts exactly once: the export diffs each shipped list against your own annual files before it writes them.</w:t>
       </w:r>
       <w:r>
         <w:t xml:space="preserve"> </w:t>
@@ -2399,10 +1914,10 @@
           <w:b/>
           <w:bCs/>
         </w:rPr>
-        <w:t xml:space="preserve">Provenance is per name and not in this list</w:t>
-      </w:r>
-      <w:r>
-        <w:t xml:space="preserve">:</w:t>
+        <w:t xml:space="preserve">28 of 28 reconciliation checks pass</w:t>
+      </w:r>
+      <w:r>
+        <w:t xml:space="preserve">.</w:t>
       </w:r>
       <w:r>
         <w:t xml:space="preserve"> </w:t>
@@ -2411,19 +1926,13 @@
         <w:rPr>
           <w:rStyle w:val="VerbatimChar"/>
         </w:rPr>
-        <w:t xml:space="preserve">provenance/</w:t>
-      </w:r>
-      <w:r>
-        <w:t xml:space="preserve"> </w:t>
-      </w:r>
-      <w:r>
-        <w:t xml:space="preserve">joins each name to its evidence row,</w:t>
-      </w:r>
-      <w:r>
-        <w:t xml:space="preserve"> </w:t>
-      </w:r>
-      <w:r>
-        <w:t xml:space="preserve">and</w:t>
+        <w:t xml:space="preserve">merge_against_baseline.py</w:t>
+      </w:r>
+      <w:r>
+        <w:t xml:space="preserve"> </w:t>
+      </w:r>
+      <w:r>
+        <w:t xml:space="preserve">unions both units into the baseline, deduplicates on the lowercased line within each year and scores every file with your own calculator; the per-check verdicts are in</w:t>
       </w:r>
       <w:r>
         <w:t xml:space="preserve"> </w:t>
@@ -2432,61 +1941,35 @@
         <w:rPr>
           <w:rStyle w:val="VerbatimChar"/>
         </w:rPr>
-        <w:t xml:space="preserve">isc_survey_hostnames/isc_survey_provenance.csv</w:t>
-      </w:r>
-      <w:r>
-        <w:t xml:space="preserve"> </w:t>
-      </w:r>
-      <w:r>
-        <w:t xml:space="preserve">carries the survey edition, source file,</w:t>
-      </w:r>
-      <w:r>
-        <w:t xml:space="preserve"> </w:t>
-      </w:r>
-      <w:r>
-        <w:t xml:space="preserve">recovery URL, record location, extraction method and year for every hostname, the shape you</w:t>
-      </w:r>
-      <w:r>
-        <w:t xml:space="preserve"> </w:t>
-      </w:r>
-      <w:r>
-        <w:t xml:space="preserve">specified on 2026-09-06. That folder still ships; its names are inside the pool and not counted</w:t>
-      </w:r>
-      <w:r>
-        <w:t xml:space="preserve"> </w:t>
-      </w:r>
-      <w:r>
-        <w:t xml:space="preserve">twice.</w:t>
-      </w:r>
-    </w:p>
-    <w:p>
-      <w:pPr>
-        <w:pStyle w:val="BodyText"/>
-      </w:pPr>
-      <w:r>
-        <w:t xml:space="preserve">One measurement worth passing on: our working pool holds 2,279,755 undated names, of which</w:t>
-      </w:r>
-      <w:r>
-        <w:t xml:space="preserve"> </w:t>
-      </w:r>
-      <w:r>
-        <w:t xml:space="preserve">29,327 are absent from your files. Shipping a working set as a contribution would have</w:t>
-      </w:r>
-      <w:r>
-        <w:t xml:space="preserve"> </w:t>
-      </w:r>
-      <w:r>
-        <w:t xml:space="preserve">overstated that half of the track by 78x.</w:t>
+        <w:t xml:space="preserve">audit/merge_audit_ark_*.json</w:t>
+      </w:r>
+      <w:r>
+        <w:t xml:space="preserve"> </w:t>
+      </w:r>
+      <w:r>
+        <w:t xml:space="preserve">and the per-year form in</w:t>
+      </w:r>
+      <w:r>
+        <w:t xml:space="preserve"> </w:t>
+      </w:r>
+      <w:r>
+        <w:rPr>
+          <w:rStyle w:val="VerbatimChar"/>
+        </w:rPr>
+        <w:t xml:space="preserve">audit/merge_stats_ark_*.csv</w:t>
+      </w:r>
+      <w:r>
+        <w:t xml:space="preserve">, in your column names.</w:t>
       </w:r>
     </w:p>
     <w:bookmarkEnd w:id="11"/>
-    <w:bookmarkStart w:id="12" w:name="how-the-work-runs-and-where-it-goes-next"/>
+    <w:bookmarkStart w:id="12" w:name="X25b3b145b5009638000b79a822d74121fbf0601"/>
     <w:p>
       <w:pPr>
         <w:pStyle w:val="Heading2"/>
       </w:pPr>
       <w:r>
-        <w:t xml:space="preserve">4. How the work runs, and where it goes next</w:t>
+        <w:t xml:space="preserve">4. Reproduction, and where the rest is documented</w:t>
       </w:r>
     </w:p>
     <w:p>
@@ -2494,82 +1977,7 @@
         <w:pStyle w:val="FirstParagraph"/>
       </w:pPr>
       <w:r>
-        <w:t xml:space="preserve">Two archive clients at most, ever, with an honest User-Agent naming the project and a contact, and</w:t>
-      </w:r>
-      <w:r>
-        <w:t xml:space="preserve"> </w:t>
-      </w:r>
-      <w:r>
-        <w:t xml:space="preserve">they hold the CDX channel exclusively. An autonomous research harness runs beside them on a</w:t>
-      </w:r>
-      <w:r>
-        <w:t xml:space="preserve"> </w:t>
-      </w:r>
-      <w:r>
-        <w:t xml:space="preserve">self-hosted runner: one lane proposes sources, one prices each against a snapshot of the store, a</w:t>
-      </w:r>
-      <w:r>
-        <w:t xml:space="preserve"> </w:t>
-      </w:r>
-      <w:r>
-        <w:t xml:space="preserve">separate admitter re-derives every figure locally before anything is banked, and a re-opener</w:t>
-      </w:r>
-      <w:r>
-        <w:t xml:space="preserve"> </w:t>
-      </w:r>
-      <w:r>
-        <w:t xml:space="preserve">re-tests closed verdicts whenever a measurement screen retires.</w:t>
-      </w:r>
-      <w:r>
-        <w:t xml:space="preserve"> </w:t>
-      </w:r>
-      <w:r>
-        <w:rPr>
-          <w:b/>
-          <w:bCs/>
-        </w:rPr>
-        <w:t xml:space="preserve">The research lanes cannot write</w:t>
-      </w:r>
-      <w:r>
-        <w:rPr>
-          <w:b/>
-          <w:bCs/>
-        </w:rPr>
-        <w:t xml:space="preserve"> </w:t>
-      </w:r>
-      <w:r>
-        <w:rPr>
-          <w:b/>
-          <w:bCs/>
-        </w:rPr>
-        <w:t xml:space="preserve">to the store</w:t>
-      </w:r>
-      <w:r>
-        <w:t xml:space="preserve">, which is why an agent's own figure has never decided a record.</w:t>
-      </w:r>
-    </w:p>
-    <w:p>
-      <w:pPr>
-        <w:pStyle w:val="BodyText"/>
-      </w:pPr>
-      <w:r>
-        <w:rPr>
-          <w:b/>
-          <w:bCs/>
-        </w:rPr>
-        <w:t xml:space="preserve">No agent assigns a year, and no source reaches an annual file without a written decision.</w:t>
-      </w:r>
-      <w:r>
-        <w:t xml:space="preserve"> </w:t>
-      </w:r>
-      <w:r>
-        <w:t xml:space="preserve">A</w:t>
-      </w:r>
-      <w:r>
-        <w:t xml:space="preserve"> </w:t>
-      </w:r>
-      <w:r>
-        <w:t xml:space="preserve">year comes from a machine-written stamp inside the artifact;</w:t>
+        <w:t xml:space="preserve">Before sending, a fresh extraction of this archive was put through that route: all eleven</w:t>
       </w:r>
       <w:r>
         <w:t xml:space="preserve"> </w:t>
@@ -2578,13 +1986,13 @@
         <w:rPr>
           <w:rStyle w:val="VerbatimChar"/>
         </w:rPr>
-        <w:t xml:space="preserve">ark ingest</w:t>
-      </w:r>
-      <w:r>
-        <w:t xml:space="preserve"> </w:t>
-      </w:r>
-      <w:r>
-        <w:t xml:space="preserve">refuses any class with no</w:t>
+        <w:t xml:space="preserve">verify.sh</w:t>
+      </w:r>
+      <w:r>
+        <w:t xml:space="preserve"> </w:t>
+      </w:r>
+      <w:r>
+        <w:t xml:space="preserve">checks pass, and the tier-2 rebuild from</w:t>
       </w:r>
       <w:r>
         <w:t xml:space="preserve"> </w:t>
@@ -2593,45 +2001,13 @@
         <w:rPr>
           <w:rStyle w:val="VerbatimChar"/>
         </w:rPr>
-        <w:t xml:space="preserve">Decision:</w:t>
-      </w:r>
-      <w:r>
-        <w:t xml:space="preserve"> </w:t>
-      </w:r>
-      <w:r>
-        <w:t xml:space="preserve">line and refused twice this round until one existed. Eighteen invariants run before</w:t>
-      </w:r>
-      <w:r>
-        <w:t xml:space="preserve"> </w:t>
-      </w:r>
-      <w:r>
-        <w:t xml:space="preserve">every commit and again inside this archive.</w:t>
-      </w:r>
-    </w:p>
-    <w:p>
-      <w:pPr>
-        <w:pStyle w:val="BodyText"/>
-      </w:pPr>
-      <w:r>
-        <w:t xml:space="preserve">Next, in the order we would spend the hours: the server-header class at the archives it has not</w:t>
-      </w:r>
-      <w:r>
-        <w:t xml:space="preserve"> </w:t>
-      </w:r>
-      <w:r>
-        <w:t xml:space="preserve">been run against, which needs no new bandwidth; the ISP Usenet hierarchies, where the customer host</w:t>
-      </w:r>
-      <w:r>
-        <w:t xml:space="preserve"> </w:t>
-      </w:r>
-      <w:r>
-        <w:t xml:space="preserve">appears rather than the news server; sibling national ccTLD extractions of the shape the Poland</w:t>
-      </w:r>
-      <w:r>
-        <w:t xml:space="preserve"> </w:t>
-      </w:r>
-      <w:r>
-        <w:t xml:space="preserve">index has; second-level suffix namespaces at hostname grain, where</w:t>
+        <w:t xml:space="preserve">provenance/</w:t>
+      </w:r>
+      <w:r>
+        <w:t xml:space="preserve"> </w:t>
+      </w:r>
+      <w:r>
+        <w:t xml:space="preserve">reproduces every per-year count, passes the seventeen invariants and returns all twenty-one result files byte-identical to the ones shipped. Tier 3, the full replay, was not run: about 50 GB, with eight journal sets held out of the archive on size.</w:t>
       </w:r>
       <w:r>
         <w:t xml:space="preserve"> </w:t>
@@ -2640,47 +2016,25 @@
         <w:rPr>
           <w:rStyle w:val="VerbatimChar"/>
         </w:rPr>
-        <w:t xml:space="preserve">co.uk</w:t>
-      </w:r>
-      <w:r>
-        <w:t xml:space="preserve"> </w:t>
-      </w:r>
-      <w:r>
-        <w:t xml:space="preserve">alone is 3.39M index</w:t>
-      </w:r>
-      <w:r>
-        <w:t xml:space="preserve"> </w:t>
-      </w:r>
-      <w:r>
-        <w:t xml:space="preserve">blocks and 1.2% walked; and promoting ISC candidates as exact-host web evidence arrives, the one</w:t>
-      </w:r>
-      <w:r>
-        <w:t xml:space="preserve"> </w:t>
-      </w:r>
-      <w:r>
-        <w:t xml:space="preserve">route that turns 6,691,826.9522 candidate equivalent-English into annual records.</w:t>
-      </w:r>
-    </w:p>
-    <w:bookmarkEnd w:id="12"/>
-    <w:bookmarkStart w:id="13" w:name="merge-overlap-and-reconciliation-d3"/>
-    <w:p>
-      <w:pPr>
-        <w:pStyle w:val="Heading2"/>
-      </w:pPr>
-      <w:r>
-        <w:t xml:space="preserve">5. Merge, overlap and reconciliation (D3)</w:t>
+        <w:t xml:space="preserve">README.md</w:t>
+      </w:r>
+      <w:r>
+        <w:t xml:space="preserve"> </w:t>
+      </w:r>
+      <w:r>
+        <w:t xml:space="preserve">gives the route and the file map.</w:t>
       </w:r>
     </w:p>
     <w:tbl>
       <w:tblPr>
         <w:tblStyle w:val="Table"/>
-        <w:tblW w:type="auto" w:w="0"/>
+        <w:tblW w:type="pct" w:w="5000"/>
+        <w:tblLayout w:type="fixed"/>
         <w:tblLook w:firstRow="1" w:lastRow="0" w:firstColumn="0" w:lastColumn="0" w:noHBand="0" w:noVBand="0" w:val="0020"/>
       </w:tblPr>
       <w:tblGrid>
-        <w:gridCol w:w="2640"/>
-        <w:gridCol w:w="2640"/>
-        <w:gridCol w:w="2640"/>
+        <w:gridCol w:w="3960"/>
+        <w:gridCol w:w="3960"/>
       </w:tblGrid>
       <w:tr>
         <w:trPr>
@@ -2692,29 +2046,19 @@
             <w:pPr>
               <w:pStyle w:val="Compact"/>
             </w:pPr>
-          </w:p>
-        </w:tc>
-        <w:tc>
-          <w:tcPr/>
-          <w:p>
-            <w:pPr>
-              <w:pStyle w:val="Compact"/>
-              <w:jc w:val="right"/>
-            </w:pPr>
-            <w:r>
-              <w:t xml:space="preserve">records</w:t>
-            </w:r>
-          </w:p>
-        </w:tc>
-        <w:tc>
-          <w:tcPr/>
-          <w:p>
-            <w:pPr>
-              <w:pStyle w:val="Compact"/>
-              <w:jc w:val="right"/>
-            </w:pPr>
-            <w:r>
-              <w:t xml:space="preserve">equivalent-English</w:t>
+            <w:r>
+              <w:t xml:space="preserve">what you asked to see documented</w:t>
+            </w:r>
+          </w:p>
+        </w:tc>
+        <w:tc>
+          <w:tcPr/>
+          <w:p>
+            <w:pPr>
+              <w:pStyle w:val="Compact"/>
+            </w:pPr>
+            <w:r>
+              <w:t xml:space="preserve">where it is</w:t>
             </w:r>
           </w:p>
         </w:tc>
@@ -2727,7 +2071,24 @@
               <w:pStyle w:val="Compact"/>
             </w:pPr>
             <w:r>
-              <w:t xml:space="preserve">baseline</w:t>
+              <w:t xml:space="preserve">counting unit, normalisation, registrable extraction, the metric</w:t>
+            </w:r>
+          </w:p>
+        </w:tc>
+        <w:tc>
+          <w:tcPr/>
+          <w:p>
+            <w:pPr>
+              <w:pStyle w:val="Compact"/>
+            </w:pPr>
+            <w:r>
+              <w:rPr>
+                <w:rStyle w:val="VerbatimChar"/>
+              </w:rPr>
+              <w:t xml:space="preserve">metric-explained.md</w:t>
+            </w:r>
+            <w:r>
+              <w:t xml:space="preserve">;</w:t>
             </w:r>
             <w:r>
               <w:t xml:space="preserve"> </w:t>
@@ -2736,31 +2097,20 @@
               <w:rPr>
                 <w:rStyle w:val="VerbatimChar"/>
               </w:rPr>
-              <w:t xml:space="preserve">merged260908</w:t>
-            </w:r>
-          </w:p>
-        </w:tc>
-        <w:tc>
-          <w:tcPr/>
-          <w:p>
-            <w:pPr>
-              <w:pStyle w:val="Compact"/>
-              <w:jc w:val="right"/>
-            </w:pPr>
-            <w:r>
-              <w:t xml:space="preserve">65,313,842</w:t>
-            </w:r>
-          </w:p>
-        </w:tc>
-        <w:tc>
-          <w:tcPr/>
-          <w:p>
-            <w:pPr>
-              <w:pStyle w:val="Compact"/>
-              <w:jc w:val="right"/>
-            </w:pPr>
-            <w:r>
-              <w:t xml:space="preserve">34,887,095.7393</w:t>
+              <w:t xml:space="preserve">equivalent_english_domain_calculator/</w:t>
+            </w:r>
+            <w:r>
+              <w:t xml:space="preserve">, your program vendored unmodified (</w:t>
+            </w:r>
+            <w:r>
+              <w:rPr>
+                <w:b/>
+                <w:bCs/>
+              </w:rPr>
+              <w:t xml:space="preserve">D4</w:t>
+            </w:r>
+            <w:r>
+              <w:t xml:space="preserve">)</w:t>
             </w:r>
           </w:p>
         </w:tc>
@@ -2773,43 +2123,207 @@
               <w:pStyle w:val="Compact"/>
             </w:pPr>
             <w:r>
+              <w:t xml:space="preserve">validity and salvage rules, dedup process, dropped-domain statistics</w:t>
+            </w:r>
+          </w:p>
+        </w:tc>
+        <w:tc>
+          <w:tcPr/>
+          <w:p>
+            <w:pPr>
+              <w:pStyle w:val="Compact"/>
+            </w:pPr>
+            <w:r>
+              <w:rPr>
+                <w:rStyle w:val="VerbatimChar"/>
+              </w:rPr>
+              <w:t xml:space="preserve">README.md</w:t>
+            </w:r>
+            <w:r>
+              <w:t xml:space="preserve">,</w:t>
+            </w:r>
+            <w:r>
+              <w:t xml:space="preserve"> </w:t>
+            </w:r>
+            <w:r>
+              <w:rPr>
+                <w:rStyle w:val="VerbatimChar"/>
+              </w:rPr>
+              <w:t xml:space="preserve">dropped_domains.txt</w:t>
+            </w:r>
+            <w:r>
+              <w:t xml:space="preserve">,</w:t>
+            </w:r>
+            <w:r>
+              <w:t xml:space="preserve"> </w:t>
+            </w:r>
+            <w:r>
+              <w:rPr>
+                <w:rStyle w:val="VerbatimChar"/>
+              </w:rPr>
+              <w:t xml:space="preserve">audit/</w:t>
+            </w:r>
+            <w:r>
+              <w:t xml:space="preserve"> </w:t>
+            </w:r>
+            <w:r>
+              <w:t xml:space="preserve">(</w:t>
+            </w:r>
+            <w:r>
               <w:rPr>
                 <w:b/>
                 <w:bCs/>
               </w:rPr>
-              <w:t xml:space="preserve">accepted increment</w:t>
-            </w:r>
-          </w:p>
-        </w:tc>
-        <w:tc>
-          <w:tcPr/>
-          <w:p>
-            <w:pPr>
-              <w:pStyle w:val="Compact"/>
-              <w:jc w:val="right"/>
-            </w:pPr>
+              <w:t xml:space="preserve">D3</w:t>
+            </w:r>
+            <w:r>
+              <w:t xml:space="preserve">)</w:t>
+            </w:r>
+          </w:p>
+        </w:tc>
+      </w:tr>
+      <w:tr>
+        <w:tc>
+          <w:tcPr/>
+          <w:p>
+            <w:pPr>
+              <w:pStyle w:val="Compact"/>
+            </w:pPr>
+            <w:r>
+              <w:t xml:space="preserve">source contributions, annual and candidate counted separately</w:t>
+            </w:r>
+          </w:p>
+        </w:tc>
+        <w:tc>
+          <w:tcPr/>
+          <w:p>
+            <w:pPr>
+              <w:pStyle w:val="Compact"/>
+            </w:pPr>
+            <w:r>
+              <w:t xml:space="preserve">section 1 and 2,</w:t>
+            </w:r>
+            <w:r>
+              <w:t xml:space="preserve"> </w:t>
+            </w:r>
+            <w:r>
+              <w:rPr>
+                <w:rStyle w:val="VerbatimChar"/>
+              </w:rPr>
+              <w:t xml:space="preserve">audit/source_contribution.csv</w:t>
+            </w:r>
+            <w:r>
+              <w:t xml:space="preserve">,</w:t>
+            </w:r>
+            <w:r>
+              <w:t xml:space="preserve"> </w:t>
+            </w:r>
+            <w:r>
+              <w:rPr>
+                <w:rStyle w:val="VerbatimChar"/>
+              </w:rPr>
+              <w:t xml:space="preserve">sources.md</w:t>
+            </w:r>
+          </w:p>
+        </w:tc>
+      </w:tr>
+      <w:tr>
+        <w:tc>
+          <w:tcPr/>
+          <w:p>
+            <w:pPr>
+              <w:pStyle w:val="Compact"/>
+            </w:pPr>
+            <w:r>
+              <w:t xml:space="preserve">CDX tools, retrieval strategy, errors and how they were handled</w:t>
+            </w:r>
+          </w:p>
+        </w:tc>
+        <w:tc>
+          <w:tcPr/>
+          <w:p>
+            <w:pPr>
+              <w:pStyle w:val="Compact"/>
+            </w:pPr>
+            <w:r>
+              <w:rPr>
+                <w:rStyle w:val="VerbatimChar"/>
+              </w:rPr>
+              <w:t xml:space="preserve">experience-summary.md</w:t>
+            </w:r>
+            <w:r>
+              <w:t xml:space="preserve"> </w:t>
+            </w:r>
+            <w:r>
+              <w:t xml:space="preserve">(</w:t>
+            </w:r>
             <w:r>
               <w:rPr>
                 <w:b/>
                 <w:bCs/>
               </w:rPr>
-              <w:t xml:space="preserve">3,399,258</w:t>
-            </w:r>
-          </w:p>
-        </w:tc>
-        <w:tc>
-          <w:tcPr/>
-          <w:p>
-            <w:pPr>
-              <w:pStyle w:val="Compact"/>
-              <w:jc w:val="right"/>
-            </w:pPr>
+              <w:t xml:space="preserve">D2</w:t>
+            </w:r>
+            <w:r>
+              <w:t xml:space="preserve">)</w:t>
+            </w:r>
+          </w:p>
+        </w:tc>
+      </w:tr>
+      <w:tr>
+        <w:tc>
+          <w:tcPr/>
+          <w:p>
+            <w:pPr>
+              <w:pStyle w:val="Compact"/>
+            </w:pPr>
+            <w:r>
+              <w:t xml:space="preserve">newly identified methods, yields, limitations, what is worth expanding</w:t>
+            </w:r>
+          </w:p>
+        </w:tc>
+        <w:tc>
+          <w:tcPr/>
+          <w:p>
+            <w:pPr>
+              <w:pStyle w:val="Compact"/>
+            </w:pPr>
+            <w:r>
+              <w:rPr>
+                <w:rStyle w:val="VerbatimChar"/>
+              </w:rPr>
+              <w:t xml:space="preserve">findings.md</w:t>
+            </w:r>
+            <w:r>
+              <w:t xml:space="preserve"> </w:t>
+            </w:r>
+            <w:r>
+              <w:t xml:space="preserve">and</w:t>
+            </w:r>
+            <w:r>
+              <w:t xml:space="preserve"> </w:t>
+            </w:r>
+            <w:r>
+              <w:rPr>
+                <w:rStyle w:val="VerbatimChar"/>
+              </w:rPr>
+              <w:t xml:space="preserve">experience-summary.md</w:t>
+            </w:r>
+            <w:r>
+              <w:t xml:space="preserve"> </w:t>
+            </w:r>
+            <w:r>
+              <w:t xml:space="preserve">(</w:t>
+            </w:r>
             <w:r>
               <w:rPr>
                 <w:b/>
                 <w:bCs/>
               </w:rPr>
-              <w:t xml:space="preserve">1,874,979.2367</w:t>
+              <w:t xml:space="preserve">D2</w:t>
+            </w:r>
+            <w:r>
+              <w:t xml:space="preserve">)</w:t>
             </w:r>
           </w:p>
         </w:tc>
@@ -2822,31 +2336,64 @@
               <w:pStyle w:val="Compact"/>
             </w:pPr>
             <w:r>
-              <w:t xml:space="preserve">post-merge total</w:t>
-            </w:r>
-          </w:p>
-        </w:tc>
-        <w:tc>
-          <w:tcPr/>
-          <w:p>
-            <w:pPr>
-              <w:pStyle w:val="Compact"/>
-              <w:jc w:val="right"/>
-            </w:pPr>
-            <w:r>
-              <w:t xml:space="preserve">68,713,100</w:t>
-            </w:r>
-          </w:p>
-        </w:tc>
-        <w:tc>
-          <w:tcPr/>
-          <w:p>
-            <w:pPr>
-              <w:pStyle w:val="Compact"/>
-              <w:jc w:val="right"/>
-            </w:pPr>
-            <w:r>
-              <w:t xml:space="preserve">36,762,074.9760</w:t>
+              <w:t xml:space="preserve">code and instructions to reproduce the workflow</w:t>
+            </w:r>
+          </w:p>
+        </w:tc>
+        <w:tc>
+          <w:tcPr/>
+          <w:p>
+            <w:pPr>
+              <w:pStyle w:val="Compact"/>
+            </w:pPr>
+            <w:r>
+              <w:rPr>
+                <w:rStyle w:val="VerbatimChar"/>
+              </w:rPr>
+              <w:t xml:space="preserve">source/source.tar.gz</w:t>
+            </w:r>
+            <w:r>
+              <w:t xml:space="preserve"> </w:t>
+            </w:r>
+            <w:r>
+              <w:t xml:space="preserve">at</w:t>
+            </w:r>
+            <w:r>
+              <w:t xml:space="preserve"> </w:t>
+            </w:r>
+            <w:r>
+              <w:rPr>
+                <w:rStyle w:val="VerbatimChar"/>
+              </w:rPr>
+              <w:t xml:space="preserve">source/COMMIT.txt</w:t>
+            </w:r>
+            <w:r>
+              <w:t xml:space="preserve">, the autonomous harness as</w:t>
+            </w:r>
+            <w:r>
+              <w:t xml:space="preserve"> </w:t>
+            </w:r>
+            <w:r>
+              <w:rPr>
+                <w:rStyle w:val="VerbatimChar"/>
+              </w:rPr>
+              <w:t xml:space="preserve">source/fleet.tar.gz</w:t>
+            </w:r>
+            <w:r>
+              <w:t xml:space="preserve"> </w:t>
+            </w:r>
+            <w:r>
+              <w:t xml:space="preserve">(</w:t>
+            </w:r>
+            <w:r>
+              <w:rPr>
+                <w:b/>
+                <w:bCs/>
+              </w:rPr>
+              <w:t xml:space="preserve">D1</w:t>
+            </w:r>
+            <w:r>
+              <w:t xml:space="preserve">)</w:t>
             </w:r>
           </w:p>
         </w:tc>
@@ -2857,241 +2404,31 @@
         <w:pStyle w:val="BodyText"/>
       </w:pPr>
       <w:r>
-        <w:rPr>
-          <w:b/>
-          <w:bCs/>
-        </w:rPr>
-        <w:t xml:space="preserve">Not one of the 3,399,258 records submitted is already in the baseline</w:t>
-      </w:r>
-      <w:r>
-        <w:t xml:space="preserve">, so every one of them counts exactly once: the export diffs each shipped list against your own annual files before it writes them.</w:t>
-      </w:r>
-      <w:r>
-        <w:t xml:space="preserve"> </w:t>
-      </w:r>
-      <w:r>
-        <w:rPr>
-          <w:b/>
-          <w:bCs/>
-        </w:rPr>
-        <w:t xml:space="preserve">28 of 28 reconciliation checks pass</w:t>
-      </w:r>
-      <w:r>
-        <w:t xml:space="preserve">.</w:t>
-      </w:r>
-      <w:r>
-        <w:t xml:space="preserve"> </w:t>
-      </w:r>
-      <w:r>
-        <w:rPr>
-          <w:rStyle w:val="VerbatimChar"/>
-        </w:rPr>
-        <w:t xml:space="preserve">merge_against_baseline.py</w:t>
-      </w:r>
-      <w:r>
-        <w:t xml:space="preserve"> </w:t>
-      </w:r>
-      <w:r>
-        <w:t xml:space="preserve">unions both units into the baseline, deduplicates on the lowercased line within each year and scores every file with your own calculator; the per-check verdicts are in</w:t>
-      </w:r>
-      <w:r>
-        <w:t xml:space="preserve"> </w:t>
-      </w:r>
-      <w:r>
-        <w:rPr>
-          <w:rStyle w:val="VerbatimChar"/>
-        </w:rPr>
-        <w:t xml:space="preserve">audit/merge_audit_ark_*.json</w:t>
-      </w:r>
-      <w:r>
-        <w:t xml:space="preserve"> </w:t>
-      </w:r>
-      <w:r>
-        <w:t xml:space="preserve">and the per-year form in</w:t>
-      </w:r>
-      <w:r>
-        <w:t xml:space="preserve"> </w:t>
-      </w:r>
-      <w:r>
-        <w:rPr>
-          <w:rStyle w:val="VerbatimChar"/>
-        </w:rPr>
-        <w:t xml:space="preserve">audit/merge_stats_ark_*.csv</w:t>
-      </w:r>
-      <w:r>
-        <w:t xml:space="preserve">, in your column names.</w:t>
-      </w:r>
-    </w:p>
-    <w:bookmarkEnd w:id="13"/>
-    <w:bookmarkStart w:id="14" w:name="reproduction-and-the-four-deliverables"/>
-    <w:p>
-      <w:pPr>
-        <w:pStyle w:val="Heading2"/>
-      </w:pPr>
-      <w:r>
-        <w:t xml:space="preserve">6. Reproduction, and the four deliverables</w:t>
-      </w:r>
-    </w:p>
-    <w:p>
-      <w:pPr>
-        <w:pStyle w:val="FirstParagraph"/>
-      </w:pPr>
-      <w:r>
-        <w:rPr>
-          <w:rStyle w:val="VerbatimChar"/>
-        </w:rPr>
-        <w:t xml:space="preserve">README.md</w:t>
-      </w:r>
-      <w:r>
-        <w:t xml:space="preserve"> </w:t>
-      </w:r>
-      <w:r>
-        <w:t xml:space="preserve">in the archive gives the route and the file map. Every evidence row names its source,</w:t>
-      </w:r>
-      <w:r>
-        <w:t xml:space="preserve"> </w:t>
-      </w:r>
-      <w:r>
-        <w:t xml:space="preserve">evidence type, dated value, URL and extraction method;</w:t>
-      </w:r>
-      <w:r>
-        <w:t xml:space="preserve"> </w:t>
-      </w:r>
-      <w:r>
-        <w:rPr>
-          <w:rStyle w:val="VerbatimChar"/>
-        </w:rPr>
-        <w:t xml:space="preserve">additions/evidence_manifest.csv</w:t>
-      </w:r>
-      <w:r>
-        <w:t xml:space="preserve"> </w:t>
-      </w:r>
-      <w:r>
-        <w:t xml:space="preserve">and</w:t>
-      </w:r>
-      <w:r>
-        <w:t xml:space="preserve"> </w:t>
-      </w:r>
-      <w:r>
-        <w:rPr>
-          <w:rStyle w:val="VerbatimChar"/>
-        </w:rPr>
-        <w:t xml:space="preserve">hostnames/hostnames_evidence_manifest.csv</w:t>
-      </w:r>
-      <w:r>
-        <w:t xml:space="preserve"> </w:t>
-      </w:r>
-      <w:r>
-        <w:t xml:space="preserve">repeat those columns per record. Before sending, a fresh extraction of this archive was put through that route: all eleven</w:t>
-      </w:r>
-      <w:r>
-        <w:t xml:space="preserve"> </w:t>
-      </w:r>
-      <w:r>
-        <w:rPr>
-          <w:rStyle w:val="VerbatimChar"/>
-        </w:rPr>
-        <w:t xml:space="preserve">verify.sh</w:t>
-      </w:r>
-      <w:r>
-        <w:t xml:space="preserve"> </w:t>
-      </w:r>
-      <w:r>
-        <w:t xml:space="preserve">checks pass, and the tier-2 rebuild from</w:t>
-      </w:r>
-      <w:r>
-        <w:t xml:space="preserve"> </w:t>
-      </w:r>
-      <w:r>
-        <w:rPr>
-          <w:rStyle w:val="VerbatimChar"/>
-        </w:rPr>
-        <w:t xml:space="preserve">provenance/</w:t>
-      </w:r>
-      <w:r>
-        <w:t xml:space="preserve"> </w:t>
-      </w:r>
-      <w:r>
-        <w:t xml:space="preserve">reproduces every per-year count, passes the seventeen invariants and returns all twenty-one result files byte-identical to the ones shipped. Tier 3, the full replay, was not run: about 50 GB, with eight journal sets held out of the archive on size.</w:t>
-      </w:r>
-    </w:p>
-    <w:p>
-      <w:pPr>
-        <w:pStyle w:val="BodyText"/>
-      </w:pPr>
-      <w:r>
-        <w:rPr>
-          <w:b/>
-          <w:bCs/>
-        </w:rPr>
-        <w:t xml:space="preserve">D1</w:t>
-      </w:r>
-      <w:r>
-        <w:t xml:space="preserve"> </w:t>
-      </w:r>
-      <w:r>
-        <w:t xml:space="preserve">code and instructions:</w:t>
-      </w:r>
-      <w:r>
-        <w:t xml:space="preserve"> </w:t>
-      </w:r>
-      <w:r>
-        <w:rPr>
-          <w:rStyle w:val="VerbatimChar"/>
-        </w:rPr>
-        <w:t xml:space="preserve">source/source.tar.gz</w:t>
-      </w:r>
-      <w:r>
-        <w:t xml:space="preserve"> </w:t>
-      </w:r>
-      <w:r>
-        <w:t xml:space="preserve">at</w:t>
-      </w:r>
-      <w:r>
-        <w:t xml:space="preserve"> </w:t>
-      </w:r>
-      <w:r>
-        <w:rPr>
-          <w:rStyle w:val="VerbatimChar"/>
-        </w:rPr>
-        <w:t xml:space="preserve">source/COMMIT.txt</w:t>
-      </w:r>
-      <w:r>
-        <w:t xml:space="preserve">, with the autonomous</w:t>
-      </w:r>
-      <w:r>
-        <w:t xml:space="preserve"> </w:t>
-      </w:r>
-      <w:r>
-        <w:t xml:space="preserve">research loop as</w:t>
-      </w:r>
-      <w:r>
-        <w:t xml:space="preserve"> </w:t>
-      </w:r>
-      <w:r>
-        <w:rPr>
-          <w:rStyle w:val="VerbatimChar"/>
-        </w:rPr>
-        <w:t xml:space="preserve">source/fleet.tar.gz</w:t>
-      </w:r>
-      <w:r>
-        <w:t xml:space="preserve">.</w:t>
-      </w:r>
-      <w:r>
-        <w:t xml:space="preserve"> </w:t>
-      </w:r>
-      <w:r>
-        <w:rPr>
-          <w:b/>
-          <w:bCs/>
-        </w:rPr>
-        <w:t xml:space="preserve">D2</w:t>
-      </w:r>
-      <w:r>
-        <w:t xml:space="preserve"> </w:t>
-      </w:r>
-      <w:r>
-        <w:t xml:space="preserve">experience summary:</w:t>
+        <w:t xml:space="preserve">Worth the next hours, in this order: the server-header class at the archives it has not been run</w:t>
+      </w:r>
+      <w:r>
+        <w:t xml:space="preserve"> </w:t>
+      </w:r>
+      <w:r>
+        <w:t xml:space="preserve">against, which needs no new bandwidth; the ISP Usenet hierarchies, where the customer host appears</w:t>
+      </w:r>
+      <w:r>
+        <w:t xml:space="preserve"> </w:t>
+      </w:r>
+      <w:r>
+        <w:t xml:space="preserve">rather than the news server; sibling national ccTLD extractions of the shape the Poland index has;</w:t>
+      </w:r>
+      <w:r>
+        <w:t xml:space="preserve"> </w:t>
+      </w:r>
+      <w:r>
+        <w:t xml:space="preserve">and promoting ISC candidates as exact-host evidence arrives, the one route that turns</w:t>
+      </w:r>
+      <w:r>
+        <w:t xml:space="preserve"> </w:t>
+      </w:r>
+      <w:r>
+        <w:t xml:space="preserve">6,691,826.9522 candidate EE into annual records.</w:t>
       </w:r>
       <w:r>
         <w:t xml:space="preserve"> </w:t>
@@ -3103,109 +2440,14 @@
         <w:t xml:space="preserve">experience-summary.md</w:t>
       </w:r>
       <w:r>
-        <w:t xml:space="preserve">, with</w:t>
-      </w:r>
-      <w:r>
-        <w:t xml:space="preserve"> </w:t>
-      </w:r>
-      <w:r>
-        <w:t xml:space="preserve">this round's findings in</w:t>
-      </w:r>
-      <w:r>
-        <w:t xml:space="preserve"> </w:t>
-      </w:r>
-      <w:r>
-        <w:rPr>
-          <w:rStyle w:val="VerbatimChar"/>
-        </w:rPr>
-        <w:t xml:space="preserve">findings.md</w:t>
-      </w:r>
-      <w:r>
-        <w:t xml:space="preserve">.</w:t>
-      </w:r>
-      <w:r>
-        <w:t xml:space="preserve"> </w:t>
-      </w:r>
-      <w:r>
-        <w:rPr>
-          <w:b/>
-          <w:bCs/>
-        </w:rPr>
-        <w:t xml:space="preserve">D3</w:t>
-      </w:r>
-      <w:r>
-        <w:t xml:space="preserve"> </w:t>
-      </w:r>
-      <w:r>
-        <w:t xml:space="preserve">merge and dedup code, overlap and reconciliation:</w:t>
-      </w:r>
-      <w:r>
-        <w:t xml:space="preserve"> </w:t>
-      </w:r>
-      <w:r>
-        <w:t xml:space="preserve">section 5 and</w:t>
-      </w:r>
-      <w:r>
-        <w:t xml:space="preserve"> </w:t>
-      </w:r>
-      <w:r>
-        <w:rPr>
-          <w:rStyle w:val="VerbatimChar"/>
-        </w:rPr>
-        <w:t xml:space="preserve">audit/</w:t>
-      </w:r>
-      <w:r>
-        <w:t xml:space="preserve">.</w:t>
-      </w:r>
-      <w:r>
-        <w:t xml:space="preserve"> </w:t>
-      </w:r>
-      <w:r>
-        <w:rPr>
-          <w:b/>
-          <w:bCs/>
-        </w:rPr>
-        <w:t xml:space="preserve">D4</w:t>
-      </w:r>
-      <w:r>
-        <w:t xml:space="preserve"> </w:t>
-      </w:r>
-      <w:r>
-        <w:t xml:space="preserve">runnable metric code:</w:t>
-      </w:r>
-      <w:r>
-        <w:t xml:space="preserve"> </w:t>
-      </w:r>
-      <w:r>
-        <w:rPr>
-          <w:rStyle w:val="VerbatimChar"/>
-        </w:rPr>
-        <w:t xml:space="preserve">equivalent_english_domain_calculator/</w:t>
-      </w:r>
-      <w:r>
-        <w:t xml:space="preserve">, your</w:t>
-      </w:r>
-      <w:r>
-        <w:t xml:space="preserve"> </w:t>
-      </w:r>
-      <w:r>
-        <w:t xml:space="preserve">program vendored unmodified and explained in</w:t>
-      </w:r>
-      <w:r>
-        <w:t xml:space="preserve"> </w:t>
-      </w:r>
-      <w:r>
-        <w:rPr>
-          <w:rStyle w:val="VerbatimChar"/>
-        </w:rPr>
-        <w:t xml:space="preserve">metric-explained.md</w:t>
-      </w:r>
-      <w:r>
-        <w:t xml:space="preserve">.</w:t>
+        <w:t xml:space="preserve"> </w:t>
+      </w:r>
+      <w:r>
+        <w:t xml:space="preserve">prices each.</w:t>
       </w:r>
     </w:p>
-    <w:bookmarkEnd w:id="14"/>
-    <w:bookmarkEnd w:id="15"/>
+    <w:bookmarkEnd w:id="12"/>
+    <w:bookmarkEnd w:id="13"/>
     <w:sectPr>
       <w:pgMar w:bottom="1080" w:footer="720" w:gutter="0" w:header="720" w:left="1080" w:right="1080" w:top="1080"/>
       <w:footnotePr>

</xml_diff>

<commit_message>
The score sentence is his own arithmetic, and both tracks are scored
He writes one score per round and sets each track out as S = 10 x (p / t), so the
report now sums the three scores he has quoted, 6.88 + 6.302372 + 5.687792, rather
than our model of them: round 6 computes 6.884530 and he wrote 6.88, and a total
four thousandths off his own is a total he has to reconcile. Rounds 6 and 7 carry
his figures in the round data beside round 8's.

This round is stated as the two lines he would write himself, the domain-year score
and the candidate-pool score, over the same divisor. The candidate paragraph drops
the working-pool aside: it argued a point about our method, not about the claim.

Packaging keeps the unparsed pool in output/netnew/ and rebuilds it only when a
journal is newer than it. The scan is exhaustive by design and that now means
reading 226 GB of gzip, 25 minutes of every run, repeated whenever a report line
changed.
</commit_message>
<xml_diff>
--- a/docs/report.docx
+++ b/docs/report.docx
@@ -756,19 +756,7 @@
         <w:t xml:space="preserve"> </w:t>
       </w:r>
       <w:r>
-        <w:t xml:space="preserve">hostnames, dated by each edition's own code and candidate-only under your 0905 ruling; 29,327 are</w:t>
-      </w:r>
-      <w:r>
-        <w:t xml:space="preserve"> </w:t>
-      </w:r>
-      <w:r>
-        <w:t xml:space="preserve">registrables our lanes found without a year we could defend, out of 2,279,755 undated names in</w:t>
-      </w:r>
-      <w:r>
-        <w:t xml:space="preserve"> </w:t>
-      </w:r>
-      <w:r>
-        <w:t xml:space="preserve">the working pool, so shipping the pool itself would have overstated that half 78-fold. Provenance is</w:t>
+        <w:t xml:space="preserve">hostnames, dated by each edition's own code and candidate-only under your 0905 ruling. Provenance is</w:t>
       </w:r>
       <w:r>
         <w:t xml:space="preserve"> </w:t>
@@ -815,7 +803,7 @@
         <w:pStyle w:val="BodyText"/>
       </w:pPr>
       <w:r>
-        <w:t xml:space="preserve">Cumulative verified percentage 80.5097%, this round at its own unverified 5.3744% and round 1 on records. Time-weighted score 18.874694 over the three rounds you scored, your own figure where you stated one. Under your 0903 rule, from the origin your round 8 divisor implies (2026-09-04 less 33 days), this round is t = 39 and adds 1.378057.</w:t>
+        <w:t xml:space="preserve">Cumulative verified percentage 80.5097%, this round at its own unverified 5.3744% and round 1 on records. Time-weighted score 6.88 + 6.302372 + 5.687792 = 18.870164, your own scores for rounds 6, 7 and 8. Under your 0903 rule, from the origin your round 8 divisor implies (2026-09-04 less 33 days), this round is t = 39. Domain-Year Score: S = 10 x (5.374421 / 39) = 1.378057. Candidate-Pool Score: S = 10 x (19.193527 / 39) = 4.921417.</w:t>
       </w:r>
     </w:p>
     <w:bookmarkEnd w:id="9"/>
@@ -2404,7 +2392,7 @@
         <w:pStyle w:val="BodyText"/>
       </w:pPr>
       <w:r>
-        <w:t xml:space="preserve">Worth the next hours, in this order: the server-header class at the archives it has not been run</w:t>
+        <w:t xml:space="preserve">Promising work I am taking up next, in this order: the server-header class at the archives it has not been run</w:t>
       </w:r>
       <w:r>
         <w:t xml:space="preserve"> </w:t>

</xml_diff>

<commit_message>
Round 9 is sent, so it takes its row in the ledger
The report and the reproduction note carry what the fresh extraction actually
proved: twelve verify checks, the tier-2 rebuild from provenance alone, and 32
of 32 shipped files byte-identical. Tier 3 was not run and the note says so.

The ledger row records what was sent, not what was credited: his feedback has
not arrived, so the credited columns stay pending and the archive's build time
stands for the send time until he answers.
</commit_message>
<xml_diff>
--- a/docs/report.docx
+++ b/docs/report.docx
@@ -1965,7 +1965,7 @@
         <w:pStyle w:val="FirstParagraph"/>
       </w:pPr>
       <w:r>
-        <w:t xml:space="preserve">Before sending, a fresh extraction of this archive was put through that route: all eleven</w:t>
+        <w:t xml:space="preserve">Before sending, a fresh extraction of this archive was put through that route: the checksum beside the archive verifies, all twelve</w:t>
       </w:r>
       <w:r>
         <w:t xml:space="preserve"> </w:t>
@@ -1995,7 +1995,7 @@
         <w:t xml:space="preserve"> </w:t>
       </w:r>
       <w:r>
-        <w:t xml:space="preserve">reproduces every per-year count, passes the seventeen invariants and returns all twenty-one result files byte-identical to the ones shipped. Tier 3, the full replay, was not run: about 50 GB, with eight journal sets held out of the archive on size.</w:t>
+        <w:t xml:space="preserve">alone reproduces every per-year count, passes the eighteen invariants and returns all 32 shipped files byte-identical to the ones here. Tier 3, the full replay, was not run: about 50 GB, with eight journal sets held out of the archive on size.</w:t>
       </w:r>
       <w:r>
         <w:t xml:space="preserve"> </w:t>

</xml_diff>